<commit_message>
feat: melhora formatação da documentação
</commit_message>
<xml_diff>
--- a/Documentação.docx
+++ b/Documentação.docx
@@ -1,6 +1,6 @@
 
 <file path=word/document.xml><?xml version="1.0" encoding="utf-8"?>
-<w:document xmlns:wpc="http://schemas.microsoft.com/office/word/2010/wordprocessingCanvas" xmlns:cx="http://schemas.microsoft.com/office/drawing/2014/chartex" xmlns:cx1="http://schemas.microsoft.com/office/drawing/2015/9/8/chartex" xmlns:cx2="http://schemas.microsoft.com/office/drawing/2015/10/21/chartex" xmlns:cx3="http://schemas.microsoft.com/office/drawing/2016/5/9/chartex" xmlns:cx4="http://schemas.microsoft.com/office/drawing/2016/5/10/chartex" xmlns:cx5="http://schemas.microsoft.com/office/drawing/2016/5/11/chartex" xmlns:cx6="http://schemas.microsoft.com/office/drawing/2016/5/12/chartex" xmlns:cx7="http://schemas.microsoft.com/office/drawing/2016/5/13/chartex" xmlns:cx8="http://schemas.microsoft.com/office/drawing/2016/5/14/chartex" xmlns:mc="http://schemas.openxmlformats.org/markup-compatibility/2006" xmlns:aink="http://schemas.microsoft.com/office/drawing/2016/ink" xmlns:am3d="http://schemas.microsoft.com/office/drawing/2017/model3d" xmlns:o="urn:schemas-microsoft-com:office:office" xmlns:r="http://schemas.openxmlformats.org/officeDocument/2006/relationships" xmlns:m="http://schemas.openxmlformats.org/officeDocument/2006/math" xmlns:v="urn:schemas-microsoft-com:vml" xmlns:wp14="http://schemas.microsoft.com/office/word/2010/wordprocessingDrawing" xmlns:wp="http://schemas.openxmlformats.org/drawingml/2006/wordprocessingDrawing" xmlns:w10="urn:schemas-microsoft-com:office:word" xmlns:w="http://schemas.openxmlformats.org/wordprocessingml/2006/main" xmlns:w14="http://schemas.microsoft.com/office/word/2010/wordml" xmlns:w15="http://schemas.microsoft.com/office/word/2012/wordml" xmlns:w16cid="http://schemas.microsoft.com/office/word/2016/wordml/cid" xmlns:w16se="http://schemas.microsoft.com/office/word/2015/wordml/symex" xmlns:wpg="http://schemas.microsoft.com/office/word/2010/wordprocessingGroup" xmlns:wpi="http://schemas.microsoft.com/office/word/2010/wordprocessingInk" xmlns:wne="http://schemas.microsoft.com/office/word/2006/wordml" xmlns:wps="http://schemas.microsoft.com/office/word/2010/wordprocessingShape" mc:Ignorable="w14 w15 w16se w16cid wp14">
+<w:document xmlns:wpc="http://schemas.microsoft.com/office/word/2010/wordprocessingCanvas" xmlns:cx="http://schemas.microsoft.com/office/drawing/2014/chartex" xmlns:mc="http://schemas.openxmlformats.org/markup-compatibility/2006" xmlns:o="urn:schemas-microsoft-com:office:office" xmlns:r="http://schemas.openxmlformats.org/officeDocument/2006/relationships" xmlns:m="http://schemas.openxmlformats.org/officeDocument/2006/math" xmlns:v="urn:schemas-microsoft-com:vml" xmlns:wp14="http://schemas.microsoft.com/office/word/2010/wordprocessingDrawing" xmlns:wp="http://schemas.openxmlformats.org/drawingml/2006/wordprocessingDrawing" xmlns:w10="urn:schemas-microsoft-com:office:word" xmlns:w="http://schemas.openxmlformats.org/wordprocessingml/2006/main" xmlns:w14="http://schemas.microsoft.com/office/word/2010/wordml" xmlns:w15="http://schemas.microsoft.com/office/word/2012/wordml" xmlns:w16se="http://schemas.microsoft.com/office/word/2015/wordml/symex" xmlns:wpg="http://schemas.microsoft.com/office/word/2010/wordprocessingGroup" xmlns:wpi="http://schemas.microsoft.com/office/word/2010/wordprocessingInk" xmlns:wne="http://schemas.microsoft.com/office/word/2006/wordml" xmlns:wps="http://schemas.microsoft.com/office/word/2010/wordprocessingShape" mc:Ignorable="w14 w15 w16se wp14">
   <w:body>
     <w:p>
       <w:pPr>
@@ -51,6 +51,7 @@
     </w:p>
     <w:p>
       <w:pPr>
+        <w:jc w:val="both"/>
         <w:rPr>
           <w:rFonts w:ascii="Arial" w:hAnsi="Arial" w:cs="Arial"/>
           <w:sz w:val="24"/>
@@ -96,6 +97,7 @@
     </w:p>
     <w:p>
       <w:pPr>
+        <w:jc w:val="both"/>
         <w:rPr>
           <w:rFonts w:ascii="Arial" w:hAnsi="Arial" w:cs="Arial"/>
           <w:sz w:val="24"/>
@@ -157,19 +159,11 @@
     </w:p>
     <w:p>
       <w:pPr>
-        <w:ind w:left="360"/>
-        <w:rPr>
-          <w:rFonts w:ascii="Arial" w:hAnsi="Arial" w:cs="Arial"/>
-          <w:sz w:val="24"/>
-        </w:rPr>
-      </w:pPr>
-      <w:r>
-        <w:rPr>
-          <w:rFonts w:ascii="Arial" w:hAnsi="Arial" w:cs="Arial"/>
-          <w:sz w:val="24"/>
-        </w:rPr>
-        <w:t xml:space="preserve">- </w:t>
-      </w:r>
+        <w:rPr>
+          <w:rFonts w:ascii="Arial" w:hAnsi="Arial" w:cs="Arial"/>
+          <w:sz w:val="24"/>
+        </w:rPr>
+      </w:pPr>
       <w:r>
         <w:rPr>
           <w:rFonts w:ascii="Arial" w:hAnsi="Arial" w:cs="Arial"/>
@@ -177,6 +171,19 @@
         </w:rPr>
         <w:t xml:space="preserve">Artigo sobre como a gamificação influencia no aprendizado de alunos com TEA: </w:t>
       </w:r>
+    </w:p>
+    <w:p>
+      <w:pPr>
+        <w:pStyle w:val="PargrafodaLista"/>
+        <w:numPr>
+          <w:ilvl w:val="0"/>
+          <w:numId w:val="12"/>
+        </w:numPr>
+        <w:rPr>
+          <w:rFonts w:ascii="Arial" w:hAnsi="Arial" w:cs="Arial"/>
+          <w:sz w:val="24"/>
+        </w:rPr>
+      </w:pPr>
       <w:hyperlink r:id="rId5" w:history="1">
         <w:r>
           <w:rPr>
@@ -184,39 +191,61 @@
             <w:rFonts w:ascii="Arial" w:hAnsi="Arial" w:cs="Arial"/>
             <w:sz w:val="24"/>
           </w:rPr>
-          <w:t>https://repositorio.ifes.edu.br/server/api/core/bitstreams/17459002-d123-4b2d-aebd-23e19491cef3/content</w:t>
+          <w:t>https://repositorio.ifes.edu.b</w:t>
+        </w:r>
+        <w:r>
+          <w:rPr>
+            <w:rStyle w:val="Hyperlink"/>
+            <w:rFonts w:ascii="Arial" w:hAnsi="Arial" w:cs="Arial"/>
+            <w:sz w:val="24"/>
+          </w:rPr>
+          <w:t>r</w:t>
+        </w:r>
+        <w:r>
+          <w:rPr>
+            <w:rStyle w:val="Hyperlink"/>
+            <w:rFonts w:ascii="Arial" w:hAnsi="Arial" w:cs="Arial"/>
+            <w:sz w:val="24"/>
+          </w:rPr>
+          <w:t>/server/api/core/bitstreams/17459002-</w:t>
+        </w:r>
+        <w:r>
+          <w:rPr>
+            <w:rStyle w:val="Hyperlink"/>
+            <w:rFonts w:ascii="Arial" w:hAnsi="Arial" w:cs="Arial"/>
+            <w:sz w:val="24"/>
+          </w:rPr>
+          <w:t>d123-4b2d-aebd-23e19491cef3/content</w:t>
         </w:r>
       </w:hyperlink>
-      <w:r>
-        <w:rPr>
-          <w:rFonts w:ascii="Arial" w:hAnsi="Arial" w:cs="Arial"/>
-          <w:sz w:val="24"/>
-        </w:rPr>
-        <w:t xml:space="preserve"> </w:t>
-      </w:r>
-    </w:p>
-    <w:p>
-      <w:pPr>
-        <w:ind w:left="360"/>
-        <w:rPr>
-          <w:rFonts w:ascii="Arial" w:hAnsi="Arial" w:cs="Arial"/>
-          <w:sz w:val="24"/>
-        </w:rPr>
-      </w:pPr>
-      <w:r>
-        <w:rPr>
-          <w:rFonts w:ascii="Arial" w:hAnsi="Arial" w:cs="Arial"/>
-          <w:sz w:val="24"/>
-        </w:rPr>
-        <w:t xml:space="preserve">- </w:t>
-      </w:r>
-      <w:r>
-        <w:rPr>
-          <w:rFonts w:ascii="Arial" w:hAnsi="Arial" w:cs="Arial"/>
-          <w:sz w:val="24"/>
-        </w:rPr>
-        <w:t xml:space="preserve">Como adaptar materiais: </w:t>
-      </w:r>
+    </w:p>
+    <w:p>
+      <w:pPr>
+        <w:rPr>
+          <w:rFonts w:ascii="Arial" w:hAnsi="Arial" w:cs="Arial"/>
+          <w:sz w:val="24"/>
+        </w:rPr>
+      </w:pPr>
+      <w:r>
+        <w:rPr>
+          <w:rFonts w:ascii="Arial" w:hAnsi="Arial" w:cs="Arial"/>
+          <w:sz w:val="24"/>
+        </w:rPr>
+        <w:t>Como adaptar materiais:</w:t>
+      </w:r>
+    </w:p>
+    <w:p>
+      <w:pPr>
+        <w:pStyle w:val="PargrafodaLista"/>
+        <w:numPr>
+          <w:ilvl w:val="0"/>
+          <w:numId w:val="11"/>
+        </w:numPr>
+        <w:rPr>
+          <w:rFonts w:ascii="Arial" w:hAnsi="Arial" w:cs="Arial"/>
+          <w:sz w:val="24"/>
+        </w:rPr>
+      </w:pPr>
       <w:hyperlink r:id="rId6" w:history="1">
         <w:r>
           <w:rPr>
@@ -237,26 +266,31 @@
     </w:p>
     <w:p>
       <w:pPr>
-        <w:ind w:left="360"/>
-        <w:rPr>
-          <w:rFonts w:ascii="Arial" w:hAnsi="Arial" w:cs="Arial"/>
-          <w:sz w:val="24"/>
-        </w:rPr>
-      </w:pPr>
-      <w:r>
-        <w:rPr>
-          <w:rFonts w:ascii="Arial" w:hAnsi="Arial" w:cs="Arial"/>
-          <w:sz w:val="24"/>
-        </w:rPr>
-        <w:t xml:space="preserve">- </w:t>
-      </w:r>
-      <w:r>
-        <w:rPr>
-          <w:rFonts w:ascii="Arial" w:hAnsi="Arial" w:cs="Arial"/>
-          <w:sz w:val="24"/>
-        </w:rPr>
-        <w:t xml:space="preserve">IA que reconhece arquivos: </w:t>
-      </w:r>
+        <w:rPr>
+          <w:rFonts w:ascii="Arial" w:hAnsi="Arial" w:cs="Arial"/>
+          <w:sz w:val="24"/>
+        </w:rPr>
+      </w:pPr>
+      <w:r>
+        <w:rPr>
+          <w:rFonts w:ascii="Arial" w:hAnsi="Arial" w:cs="Arial"/>
+          <w:sz w:val="24"/>
+        </w:rPr>
+        <w:t>IA que reconhece arquivos:</w:t>
+      </w:r>
+    </w:p>
+    <w:p>
+      <w:pPr>
+        <w:pStyle w:val="PargrafodaLista"/>
+        <w:numPr>
+          <w:ilvl w:val="0"/>
+          <w:numId w:val="10"/>
+        </w:numPr>
+        <w:rPr>
+          <w:rFonts w:ascii="Arial" w:hAnsi="Arial" w:cs="Arial"/>
+          <w:sz w:val="24"/>
+        </w:rPr>
+      </w:pPr>
       <w:hyperlink r:id="rId7" w:history="1">
         <w:r>
           <w:rPr>
@@ -277,26 +311,38 @@
     </w:p>
     <w:p>
       <w:pPr>
-        <w:ind w:left="360"/>
-        <w:rPr>
-          <w:rFonts w:ascii="Arial" w:hAnsi="Arial" w:cs="Arial"/>
-          <w:sz w:val="24"/>
-        </w:rPr>
-      </w:pPr>
-      <w:r>
-        <w:rPr>
-          <w:rFonts w:ascii="Arial" w:hAnsi="Arial" w:cs="Arial"/>
-          <w:sz w:val="24"/>
-        </w:rPr>
-        <w:t xml:space="preserve">- </w:t>
-      </w:r>
-      <w:r>
-        <w:rPr>
-          <w:rFonts w:ascii="Arial" w:hAnsi="Arial" w:cs="Arial"/>
-          <w:sz w:val="24"/>
-        </w:rPr>
-        <w:t xml:space="preserve">3 dicas para adaptar os materiais: </w:t>
-      </w:r>
+        <w:rPr>
+          <w:rFonts w:ascii="Arial" w:hAnsi="Arial" w:cs="Arial"/>
+          <w:sz w:val="24"/>
+        </w:rPr>
+      </w:pPr>
+      <w:r>
+        <w:rPr>
+          <w:rFonts w:ascii="Arial" w:hAnsi="Arial" w:cs="Arial"/>
+          <w:sz w:val="24"/>
+        </w:rPr>
+        <w:t>3 d</w:t>
+      </w:r>
+      <w:r>
+        <w:rPr>
+          <w:rFonts w:ascii="Arial" w:hAnsi="Arial" w:cs="Arial"/>
+          <w:sz w:val="24"/>
+        </w:rPr>
+        <w:t>icas para adaptar os materiais:</w:t>
+      </w:r>
+    </w:p>
+    <w:p>
+      <w:pPr>
+        <w:pStyle w:val="PargrafodaLista"/>
+        <w:numPr>
+          <w:ilvl w:val="0"/>
+          <w:numId w:val="9"/>
+        </w:numPr>
+        <w:rPr>
+          <w:rFonts w:ascii="Arial" w:hAnsi="Arial" w:cs="Arial"/>
+          <w:sz w:val="24"/>
+        </w:rPr>
+      </w:pPr>
       <w:hyperlink r:id="rId8" w:history="1">
         <w:r>
           <w:rPr>
@@ -317,18 +363,17 @@
     </w:p>
     <w:p>
       <w:pPr>
-        <w:ind w:left="360"/>
-        <w:rPr>
-          <w:rFonts w:ascii="Arial" w:hAnsi="Arial" w:cs="Arial"/>
-          <w:sz w:val="24"/>
-        </w:rPr>
-      </w:pPr>
-      <w:r>
-        <w:rPr>
-          <w:rFonts w:ascii="Arial" w:hAnsi="Arial" w:cs="Arial"/>
-          <w:sz w:val="24"/>
-        </w:rPr>
-        <w:t>- TEACCH</w:t>
+        <w:rPr>
+          <w:rFonts w:ascii="Arial" w:hAnsi="Arial" w:cs="Arial"/>
+          <w:sz w:val="24"/>
+        </w:rPr>
+      </w:pPr>
+      <w:r>
+        <w:rPr>
+          <w:rFonts w:ascii="Arial" w:hAnsi="Arial" w:cs="Arial"/>
+          <w:sz w:val="24"/>
+        </w:rPr>
+        <w:t>TEACCH</w:t>
       </w:r>
       <w:r>
         <w:rPr>
@@ -340,7 +385,11 @@
     </w:p>
     <w:p>
       <w:pPr>
-        <w:ind w:left="360"/>
+        <w:pStyle w:val="PargrafodaLista"/>
+        <w:numPr>
+          <w:ilvl w:val="0"/>
+          <w:numId w:val="6"/>
+        </w:numPr>
         <w:rPr>
           <w:rFonts w:ascii="Arial" w:hAnsi="Arial" w:cs="Arial"/>
           <w:sz w:val="24"/>
@@ -366,19 +415,31 @@
     </w:p>
     <w:p>
       <w:pPr>
-        <w:ind w:left="360"/>
-        <w:rPr>
-          <w:rFonts w:ascii="Arial" w:hAnsi="Arial" w:cs="Arial"/>
-          <w:sz w:val="24"/>
-        </w:rPr>
-      </w:pPr>
-      <w:r>
-        <w:rPr>
-          <w:rFonts w:ascii="Arial" w:hAnsi="Arial" w:cs="Arial"/>
-          <w:sz w:val="24"/>
-        </w:rPr>
-        <w:t xml:space="preserve">- O que é TEA e seus níveis: </w:t>
-      </w:r>
+        <w:rPr>
+          <w:rFonts w:ascii="Arial" w:hAnsi="Arial" w:cs="Arial"/>
+          <w:sz w:val="24"/>
+        </w:rPr>
+      </w:pPr>
+      <w:r>
+        <w:rPr>
+          <w:rFonts w:ascii="Arial" w:hAnsi="Arial" w:cs="Arial"/>
+          <w:sz w:val="24"/>
+        </w:rPr>
+        <w:t>O que é TEA e seus níveis:</w:t>
+      </w:r>
+    </w:p>
+    <w:p>
+      <w:pPr>
+        <w:pStyle w:val="PargrafodaLista"/>
+        <w:numPr>
+          <w:ilvl w:val="0"/>
+          <w:numId w:val="5"/>
+        </w:numPr>
+        <w:rPr>
+          <w:rFonts w:ascii="Arial" w:hAnsi="Arial" w:cs="Arial"/>
+          <w:sz w:val="24"/>
+        </w:rPr>
+      </w:pPr>
       <w:hyperlink r:id="rId10" w:history="1">
         <w:r>
           <w:rPr>
@@ -386,23 +447,7 @@
             <w:rFonts w:ascii="Arial" w:hAnsi="Arial" w:cs="Arial"/>
             <w:sz w:val="24"/>
           </w:rPr>
-          <w:t>https://alta</w:t>
-        </w:r>
-        <w:r>
-          <w:rPr>
-            <w:rStyle w:val="Hyperlink"/>
-            <w:rFonts w:ascii="Arial" w:hAnsi="Arial" w:cs="Arial"/>
-            <w:sz w:val="24"/>
-          </w:rPr>
-          <w:t>d</w:t>
-        </w:r>
-        <w:r>
-          <w:rPr>
-            <w:rStyle w:val="Hyperlink"/>
-            <w:rFonts w:ascii="Arial" w:hAnsi="Arial" w:cs="Arial"/>
-            <w:sz w:val="24"/>
-          </w:rPr>
-          <w:t>iagnosticos.com.br/saude/espectro-autista/</w:t>
+          <w:t>https://altadiagnosticos.com.br/saude/espectro-autista/</w:t>
         </w:r>
       </w:hyperlink>
       <w:r>
@@ -415,7 +460,11 @@
     </w:p>
     <w:p>
       <w:pPr>
-        <w:ind w:left="360"/>
+        <w:pStyle w:val="PargrafodaLista"/>
+        <w:numPr>
+          <w:ilvl w:val="0"/>
+          <w:numId w:val="5"/>
+        </w:numPr>
         <w:rPr>
           <w:rFonts w:ascii="Arial" w:hAnsi="Arial" w:cs="Arial"/>
           <w:sz w:val="24"/>
@@ -428,23 +477,7 @@
             <w:rFonts w:ascii="Arial" w:hAnsi="Arial" w:cs="Arial"/>
             <w:sz w:val="24"/>
           </w:rPr>
-          <w:t>https://observatoriodoautista.com.br/2</w:t>
-        </w:r>
-        <w:r>
-          <w:rPr>
-            <w:rStyle w:val="Hyperlink"/>
-            <w:rFonts w:ascii="Arial" w:hAnsi="Arial" w:cs="Arial"/>
-            <w:sz w:val="24"/>
-          </w:rPr>
-          <w:t>0</w:t>
-        </w:r>
-        <w:r>
-          <w:rPr>
-            <w:rStyle w:val="Hyperlink"/>
-            <w:rFonts w:ascii="Arial" w:hAnsi="Arial" w:cs="Arial"/>
-            <w:sz w:val="24"/>
-          </w:rPr>
-          <w:t>23/04/28/niveis-do-autismo-entenda/</w:t>
+          <w:t>https://observatoriodoautista.com.br/2023/04/28/niveis-do-autismo-entenda/</w:t>
         </w:r>
       </w:hyperlink>
       <w:r>
@@ -457,19 +490,31 @@
     </w:p>
     <w:p>
       <w:pPr>
-        <w:ind w:left="360"/>
-        <w:rPr>
-          <w:rFonts w:ascii="Arial" w:hAnsi="Arial" w:cs="Arial"/>
-          <w:sz w:val="24"/>
-        </w:rPr>
-      </w:pPr>
-      <w:r>
-        <w:rPr>
-          <w:rFonts w:ascii="Arial" w:hAnsi="Arial" w:cs="Arial"/>
-          <w:sz w:val="24"/>
-        </w:rPr>
-        <w:t xml:space="preserve">- O que é ABA e como funciona: </w:t>
-      </w:r>
+        <w:rPr>
+          <w:rFonts w:ascii="Arial" w:hAnsi="Arial" w:cs="Arial"/>
+          <w:sz w:val="24"/>
+        </w:rPr>
+      </w:pPr>
+      <w:r>
+        <w:rPr>
+          <w:rFonts w:ascii="Arial" w:hAnsi="Arial" w:cs="Arial"/>
+          <w:sz w:val="24"/>
+        </w:rPr>
+        <w:t>O que é ABA e como funciona:</w:t>
+      </w:r>
+    </w:p>
+    <w:p>
+      <w:pPr>
+        <w:pStyle w:val="PargrafodaLista"/>
+        <w:numPr>
+          <w:ilvl w:val="0"/>
+          <w:numId w:val="13"/>
+        </w:numPr>
+        <w:rPr>
+          <w:rFonts w:ascii="Arial" w:hAnsi="Arial" w:cs="Arial"/>
+          <w:sz w:val="24"/>
+        </w:rPr>
+      </w:pPr>
       <w:hyperlink r:id="rId12" w:history="1">
         <w:r>
           <w:rPr>
@@ -490,7 +535,11 @@
     </w:p>
     <w:p>
       <w:pPr>
-        <w:ind w:left="360"/>
+        <w:pStyle w:val="PargrafodaLista"/>
+        <w:numPr>
+          <w:ilvl w:val="0"/>
+          <w:numId w:val="13"/>
+        </w:numPr>
         <w:rPr>
           <w:rFonts w:ascii="Arial" w:hAnsi="Arial" w:cs="Arial"/>
           <w:sz w:val="24"/>
@@ -516,19 +565,32 @@
     </w:p>
     <w:p>
       <w:pPr>
-        <w:ind w:left="360"/>
-        <w:rPr>
-          <w:rFonts w:ascii="Arial" w:hAnsi="Arial" w:cs="Arial"/>
-          <w:sz w:val="24"/>
-        </w:rPr>
-      </w:pPr>
-      <w:r>
-        <w:rPr>
-          <w:rFonts w:ascii="Arial" w:hAnsi="Arial" w:cs="Arial"/>
-          <w:sz w:val="24"/>
-        </w:rPr>
-        <w:t xml:space="preserve">- DI: </w:t>
-      </w:r>
+        <w:rPr>
+          <w:rFonts w:ascii="Arial" w:hAnsi="Arial" w:cs="Arial"/>
+          <w:sz w:val="24"/>
+        </w:rPr>
+      </w:pPr>
+      <w:r>
+        <w:rPr>
+          <w:rFonts w:ascii="Arial" w:hAnsi="Arial" w:cs="Arial"/>
+          <w:sz w:val="24"/>
+        </w:rPr>
+        <w:lastRenderedPageBreak/>
+        <w:t>DI:</w:t>
+      </w:r>
+    </w:p>
+    <w:p>
+      <w:pPr>
+        <w:pStyle w:val="PargrafodaLista"/>
+        <w:numPr>
+          <w:ilvl w:val="0"/>
+          <w:numId w:val="14"/>
+        </w:numPr>
+        <w:rPr>
+          <w:rFonts w:ascii="Arial" w:hAnsi="Arial" w:cs="Arial"/>
+          <w:sz w:val="24"/>
+        </w:rPr>
+      </w:pPr>
       <w:hyperlink r:id="rId14" w:history="1">
         <w:r>
           <w:rPr>
@@ -575,12 +637,12 @@
           <w:b/>
           <w:sz w:val="24"/>
         </w:rPr>
-        <w:lastRenderedPageBreak/>
         <w:t>Problema</w:t>
       </w:r>
     </w:p>
     <w:p>
       <w:pPr>
+        <w:jc w:val="both"/>
         <w:rPr>
           <w:rFonts w:ascii="Arial" w:hAnsi="Arial" w:cs="Arial"/>
           <w:sz w:val="24"/>
@@ -635,7 +697,7 @@
     </w:p>
     <w:p>
       <w:pPr>
-        <w:ind w:left="360"/>
+        <w:jc w:val="both"/>
         <w:rPr>
           <w:rFonts w:ascii="Arial" w:hAnsi="Arial" w:cs="Arial"/>
           <w:sz w:val="24"/>
@@ -656,6 +718,7 @@
           <w:ilvl w:val="0"/>
           <w:numId w:val="4"/>
         </w:numPr>
+        <w:jc w:val="both"/>
         <w:rPr>
           <w:rFonts w:ascii="Arial" w:hAnsi="Arial" w:cs="Arial"/>
           <w:sz w:val="24"/>
@@ -676,6 +739,7 @@
           <w:ilvl w:val="0"/>
           <w:numId w:val="4"/>
         </w:numPr>
+        <w:jc w:val="both"/>
         <w:rPr>
           <w:rFonts w:ascii="Arial" w:hAnsi="Arial" w:cs="Arial"/>
           <w:sz w:val="24"/>
@@ -696,6 +760,7 @@
           <w:ilvl w:val="0"/>
           <w:numId w:val="4"/>
         </w:numPr>
+        <w:jc w:val="both"/>
         <w:rPr>
           <w:rFonts w:ascii="Arial" w:hAnsi="Arial" w:cs="Arial"/>
           <w:sz w:val="24"/>
@@ -716,6 +781,7 @@
           <w:ilvl w:val="0"/>
           <w:numId w:val="4"/>
         </w:numPr>
+        <w:jc w:val="both"/>
         <w:rPr>
           <w:rFonts w:ascii="Arial" w:hAnsi="Arial" w:cs="Arial"/>
           <w:sz w:val="24"/>
@@ -728,9 +794,12 @@
         </w:rPr>
         <w:t>baixa estruturação visual</w:t>
       </w:r>
-    </w:p>
-    <w:p>
-      <w:pPr>
+      <w:bookmarkStart w:id="0" w:name="_GoBack"/>
+      <w:bookmarkEnd w:id="0"/>
+    </w:p>
+    <w:p>
+      <w:pPr>
+        <w:jc w:val="both"/>
         <w:rPr>
           <w:rFonts w:ascii="Arial" w:hAnsi="Arial" w:cs="Arial"/>
           <w:sz w:val="24"/>
@@ -758,6 +827,7 @@
           <w:ilvl w:val="0"/>
           <w:numId w:val="4"/>
         </w:numPr>
+        <w:jc w:val="both"/>
         <w:rPr>
           <w:rFonts w:ascii="Arial" w:hAnsi="Arial" w:cs="Arial"/>
           <w:sz w:val="24"/>
@@ -778,6 +848,7 @@
           <w:ilvl w:val="0"/>
           <w:numId w:val="4"/>
         </w:numPr>
+        <w:jc w:val="both"/>
         <w:rPr>
           <w:rFonts w:ascii="Arial" w:hAnsi="Arial" w:cs="Arial"/>
           <w:sz w:val="24"/>
@@ -798,6 +869,7 @@
           <w:ilvl w:val="0"/>
           <w:numId w:val="4"/>
         </w:numPr>
+        <w:jc w:val="both"/>
         <w:rPr>
           <w:rFonts w:ascii="Arial" w:hAnsi="Arial" w:cs="Arial"/>
           <w:sz w:val="24"/>
@@ -813,6 +885,7 @@
     </w:p>
     <w:p>
       <w:pPr>
+        <w:jc w:val="both"/>
         <w:rPr>
           <w:rFonts w:ascii="Arial" w:hAnsi="Arial" w:cs="Arial"/>
           <w:sz w:val="24"/>
@@ -858,6 +931,7 @@
     </w:p>
     <w:p>
       <w:pPr>
+        <w:jc w:val="both"/>
         <w:rPr>
           <w:rFonts w:ascii="Arial" w:hAnsi="Arial" w:cs="Arial"/>
           <w:sz w:val="24"/>
@@ -903,6 +977,7 @@
     </w:p>
     <w:p>
       <w:pPr>
+        <w:jc w:val="both"/>
         <w:rPr>
           <w:rFonts w:ascii="Arial" w:hAnsi="Arial" w:cs="Arial"/>
           <w:sz w:val="24"/>
@@ -918,6 +993,7 @@
     </w:p>
     <w:p>
       <w:pPr>
+        <w:jc w:val="both"/>
         <w:rPr>
           <w:rFonts w:ascii="Arial" w:hAnsi="Arial" w:cs="Arial"/>
           <w:sz w:val="24"/>
@@ -931,8 +1007,6 @@
         </w:rPr>
         <w:t>Nosso foco está em Língua Portuguesa, Literatura, História, Geografia, Sociologia e Filosofia</w:t>
       </w:r>
-      <w:bookmarkStart w:id="0" w:name="_GoBack"/>
-      <w:bookmarkEnd w:id="0"/>
     </w:p>
     <w:sectPr>
       <w:pgSz w:w="11906" w:h="16838"/>
@@ -945,11 +1019,11 @@
 </file>
 
 <file path=word/numbering.xml><?xml version="1.0" encoding="utf-8"?>
-<w:numbering xmlns:wpc="http://schemas.microsoft.com/office/word/2010/wordprocessingCanvas" xmlns:cx="http://schemas.microsoft.com/office/drawing/2014/chartex" xmlns:cx1="http://schemas.microsoft.com/office/drawing/2015/9/8/chartex" xmlns:cx2="http://schemas.microsoft.com/office/drawing/2015/10/21/chartex" xmlns:cx3="http://schemas.microsoft.com/office/drawing/2016/5/9/chartex" xmlns:cx4="http://schemas.microsoft.com/office/drawing/2016/5/10/chartex" xmlns:cx5="http://schemas.microsoft.com/office/drawing/2016/5/11/chartex" xmlns:cx6="http://schemas.microsoft.com/office/drawing/2016/5/12/chartex" xmlns:cx7="http://schemas.microsoft.com/office/drawing/2016/5/13/chartex" xmlns:cx8="http://schemas.microsoft.com/office/drawing/2016/5/14/chartex" xmlns:mc="http://schemas.openxmlformats.org/markup-compatibility/2006" xmlns:aink="http://schemas.microsoft.com/office/drawing/2016/ink" xmlns:am3d="http://schemas.microsoft.com/office/drawing/2017/model3d" xmlns:o="urn:schemas-microsoft-com:office:office" xmlns:r="http://schemas.openxmlformats.org/officeDocument/2006/relationships" xmlns:m="http://schemas.openxmlformats.org/officeDocument/2006/math" xmlns:v="urn:schemas-microsoft-com:vml" xmlns:wp14="http://schemas.microsoft.com/office/word/2010/wordprocessingDrawing" xmlns:wp="http://schemas.openxmlformats.org/drawingml/2006/wordprocessingDrawing" xmlns:w10="urn:schemas-microsoft-com:office:word" xmlns:w="http://schemas.openxmlformats.org/wordprocessingml/2006/main" xmlns:w14="http://schemas.microsoft.com/office/word/2010/wordml" xmlns:w15="http://schemas.microsoft.com/office/word/2012/wordml" xmlns:w16cid="http://schemas.microsoft.com/office/word/2016/wordml/cid" xmlns:w16se="http://schemas.microsoft.com/office/word/2015/wordml/symex" xmlns:wpg="http://schemas.microsoft.com/office/word/2010/wordprocessingGroup" xmlns:wpi="http://schemas.microsoft.com/office/word/2010/wordprocessingInk" xmlns:wne="http://schemas.microsoft.com/office/word/2006/wordml" xmlns:wps="http://schemas.microsoft.com/office/word/2010/wordprocessingShape" mc:Ignorable="w14 w15 w16se w16cid wp14">
+<w:numbering xmlns:wpc="http://schemas.microsoft.com/office/word/2010/wordprocessingCanvas" xmlns:cx="http://schemas.microsoft.com/office/drawing/2014/chartex" xmlns:mc="http://schemas.openxmlformats.org/markup-compatibility/2006" xmlns:o="urn:schemas-microsoft-com:office:office" xmlns:r="http://schemas.openxmlformats.org/officeDocument/2006/relationships" xmlns:m="http://schemas.openxmlformats.org/officeDocument/2006/math" xmlns:v="urn:schemas-microsoft-com:vml" xmlns:wp14="http://schemas.microsoft.com/office/word/2010/wordprocessingDrawing" xmlns:wp="http://schemas.openxmlformats.org/drawingml/2006/wordprocessingDrawing" xmlns:w10="urn:schemas-microsoft-com:office:word" xmlns:w="http://schemas.openxmlformats.org/wordprocessingml/2006/main" xmlns:w14="http://schemas.microsoft.com/office/word/2010/wordml" xmlns:w15="http://schemas.microsoft.com/office/word/2012/wordml" xmlns:w16se="http://schemas.microsoft.com/office/word/2015/wordml/symex" xmlns:wpg="http://schemas.microsoft.com/office/word/2010/wordprocessingGroup" xmlns:wpi="http://schemas.microsoft.com/office/word/2010/wordprocessingInk" xmlns:wne="http://schemas.microsoft.com/office/word/2006/wordml" xmlns:wps="http://schemas.microsoft.com/office/word/2010/wordprocessingShape" mc:Ignorable="w14 w15 w16se wp14">
   <w:abstractNum w:abstractNumId="0" w15:restartNumberingAfterBreak="0">
     <w:nsid w:val="089D108D"/>
     <w:multiLevelType w:val="hybridMultilevel"/>
-    <w:tmpl w:val="6986A12E"/>
+    <w:tmpl w:val="1A8600BE"/>
     <w:lvl w:ilvl="0" w:tplc="0416000F">
       <w:start w:val="1"/>
       <w:numFmt w:val="decimal"/>
@@ -1033,6 +1107,119 @@
     </w:lvl>
   </w:abstractNum>
   <w:abstractNum w:abstractNumId="1" w15:restartNumberingAfterBreak="0">
+    <w:nsid w:val="0A1A2C29"/>
+    <w:multiLevelType w:val="hybridMultilevel"/>
+    <w:tmpl w:val="98185F1E"/>
+    <w:lvl w:ilvl="0" w:tplc="04160001">
+      <w:start w:val="1"/>
+      <w:numFmt w:val="bullet"/>
+      <w:lvlText w:val=""/>
+      <w:lvlJc w:val="left"/>
+      <w:pPr>
+        <w:ind w:left="720" w:hanging="360"/>
+      </w:pPr>
+      <w:rPr>
+        <w:rFonts w:ascii="Symbol" w:hAnsi="Symbol" w:hint="default"/>
+      </w:rPr>
+    </w:lvl>
+    <w:lvl w:ilvl="1" w:tplc="04160003" w:tentative="1">
+      <w:start w:val="1"/>
+      <w:numFmt w:val="bullet"/>
+      <w:lvlText w:val="o"/>
+      <w:lvlJc w:val="left"/>
+      <w:pPr>
+        <w:ind w:left="1440" w:hanging="360"/>
+      </w:pPr>
+      <w:rPr>
+        <w:rFonts w:ascii="Courier New" w:hAnsi="Courier New" w:cs="Courier New" w:hint="default"/>
+      </w:rPr>
+    </w:lvl>
+    <w:lvl w:ilvl="2" w:tplc="04160005" w:tentative="1">
+      <w:start w:val="1"/>
+      <w:numFmt w:val="bullet"/>
+      <w:lvlText w:val=""/>
+      <w:lvlJc w:val="left"/>
+      <w:pPr>
+        <w:ind w:left="2160" w:hanging="360"/>
+      </w:pPr>
+      <w:rPr>
+        <w:rFonts w:ascii="Wingdings" w:hAnsi="Wingdings" w:hint="default"/>
+      </w:rPr>
+    </w:lvl>
+    <w:lvl w:ilvl="3" w:tplc="04160001" w:tentative="1">
+      <w:start w:val="1"/>
+      <w:numFmt w:val="bullet"/>
+      <w:lvlText w:val=""/>
+      <w:lvlJc w:val="left"/>
+      <w:pPr>
+        <w:ind w:left="2880" w:hanging="360"/>
+      </w:pPr>
+      <w:rPr>
+        <w:rFonts w:ascii="Symbol" w:hAnsi="Symbol" w:hint="default"/>
+      </w:rPr>
+    </w:lvl>
+    <w:lvl w:ilvl="4" w:tplc="04160003" w:tentative="1">
+      <w:start w:val="1"/>
+      <w:numFmt w:val="bullet"/>
+      <w:lvlText w:val="o"/>
+      <w:lvlJc w:val="left"/>
+      <w:pPr>
+        <w:ind w:left="3600" w:hanging="360"/>
+      </w:pPr>
+      <w:rPr>
+        <w:rFonts w:ascii="Courier New" w:hAnsi="Courier New" w:cs="Courier New" w:hint="default"/>
+      </w:rPr>
+    </w:lvl>
+    <w:lvl w:ilvl="5" w:tplc="04160005" w:tentative="1">
+      <w:start w:val="1"/>
+      <w:numFmt w:val="bullet"/>
+      <w:lvlText w:val=""/>
+      <w:lvlJc w:val="left"/>
+      <w:pPr>
+        <w:ind w:left="4320" w:hanging="360"/>
+      </w:pPr>
+      <w:rPr>
+        <w:rFonts w:ascii="Wingdings" w:hAnsi="Wingdings" w:hint="default"/>
+      </w:rPr>
+    </w:lvl>
+    <w:lvl w:ilvl="6" w:tplc="04160001" w:tentative="1">
+      <w:start w:val="1"/>
+      <w:numFmt w:val="bullet"/>
+      <w:lvlText w:val=""/>
+      <w:lvlJc w:val="left"/>
+      <w:pPr>
+        <w:ind w:left="5040" w:hanging="360"/>
+      </w:pPr>
+      <w:rPr>
+        <w:rFonts w:ascii="Symbol" w:hAnsi="Symbol" w:hint="default"/>
+      </w:rPr>
+    </w:lvl>
+    <w:lvl w:ilvl="7" w:tplc="04160003" w:tentative="1">
+      <w:start w:val="1"/>
+      <w:numFmt w:val="bullet"/>
+      <w:lvlText w:val="o"/>
+      <w:lvlJc w:val="left"/>
+      <w:pPr>
+        <w:ind w:left="5760" w:hanging="360"/>
+      </w:pPr>
+      <w:rPr>
+        <w:rFonts w:ascii="Courier New" w:hAnsi="Courier New" w:cs="Courier New" w:hint="default"/>
+      </w:rPr>
+    </w:lvl>
+    <w:lvl w:ilvl="8" w:tplc="04160005" w:tentative="1">
+      <w:start w:val="1"/>
+      <w:numFmt w:val="bullet"/>
+      <w:lvlText w:val=""/>
+      <w:lvlJc w:val="left"/>
+      <w:pPr>
+        <w:ind w:left="6480" w:hanging="360"/>
+      </w:pPr>
+      <w:rPr>
+        <w:rFonts w:ascii="Wingdings" w:hAnsi="Wingdings" w:hint="default"/>
+      </w:rPr>
+    </w:lvl>
+  </w:abstractNum>
+  <w:abstractNum w:abstractNumId="2" w15:restartNumberingAfterBreak="0">
     <w:nsid w:val="1058421C"/>
     <w:multiLevelType w:val="hybridMultilevel"/>
     <w:tmpl w:val="C54C91CC"/>
@@ -1145,7 +1332,346 @@
       </w:rPr>
     </w:lvl>
   </w:abstractNum>
-  <w:abstractNum w:abstractNumId="2" w15:restartNumberingAfterBreak="0">
+  <w:abstractNum w:abstractNumId="3" w15:restartNumberingAfterBreak="0">
+    <w:nsid w:val="10623B9D"/>
+    <w:multiLevelType w:val="hybridMultilevel"/>
+    <w:tmpl w:val="8D989FA2"/>
+    <w:lvl w:ilvl="0" w:tplc="04160001">
+      <w:start w:val="1"/>
+      <w:numFmt w:val="bullet"/>
+      <w:lvlText w:val=""/>
+      <w:lvlJc w:val="left"/>
+      <w:pPr>
+        <w:ind w:left="720" w:hanging="360"/>
+      </w:pPr>
+      <w:rPr>
+        <w:rFonts w:ascii="Symbol" w:hAnsi="Symbol" w:hint="default"/>
+      </w:rPr>
+    </w:lvl>
+    <w:lvl w:ilvl="1" w:tplc="04160003" w:tentative="1">
+      <w:start w:val="1"/>
+      <w:numFmt w:val="bullet"/>
+      <w:lvlText w:val="o"/>
+      <w:lvlJc w:val="left"/>
+      <w:pPr>
+        <w:ind w:left="1440" w:hanging="360"/>
+      </w:pPr>
+      <w:rPr>
+        <w:rFonts w:ascii="Courier New" w:hAnsi="Courier New" w:cs="Courier New" w:hint="default"/>
+      </w:rPr>
+    </w:lvl>
+    <w:lvl w:ilvl="2" w:tplc="04160005" w:tentative="1">
+      <w:start w:val="1"/>
+      <w:numFmt w:val="bullet"/>
+      <w:lvlText w:val=""/>
+      <w:lvlJc w:val="left"/>
+      <w:pPr>
+        <w:ind w:left="2160" w:hanging="360"/>
+      </w:pPr>
+      <w:rPr>
+        <w:rFonts w:ascii="Wingdings" w:hAnsi="Wingdings" w:hint="default"/>
+      </w:rPr>
+    </w:lvl>
+    <w:lvl w:ilvl="3" w:tplc="04160001" w:tentative="1">
+      <w:start w:val="1"/>
+      <w:numFmt w:val="bullet"/>
+      <w:lvlText w:val=""/>
+      <w:lvlJc w:val="left"/>
+      <w:pPr>
+        <w:ind w:left="2880" w:hanging="360"/>
+      </w:pPr>
+      <w:rPr>
+        <w:rFonts w:ascii="Symbol" w:hAnsi="Symbol" w:hint="default"/>
+      </w:rPr>
+    </w:lvl>
+    <w:lvl w:ilvl="4" w:tplc="04160003" w:tentative="1">
+      <w:start w:val="1"/>
+      <w:numFmt w:val="bullet"/>
+      <w:lvlText w:val="o"/>
+      <w:lvlJc w:val="left"/>
+      <w:pPr>
+        <w:ind w:left="3600" w:hanging="360"/>
+      </w:pPr>
+      <w:rPr>
+        <w:rFonts w:ascii="Courier New" w:hAnsi="Courier New" w:cs="Courier New" w:hint="default"/>
+      </w:rPr>
+    </w:lvl>
+    <w:lvl w:ilvl="5" w:tplc="04160005" w:tentative="1">
+      <w:start w:val="1"/>
+      <w:numFmt w:val="bullet"/>
+      <w:lvlText w:val=""/>
+      <w:lvlJc w:val="left"/>
+      <w:pPr>
+        <w:ind w:left="4320" w:hanging="360"/>
+      </w:pPr>
+      <w:rPr>
+        <w:rFonts w:ascii="Wingdings" w:hAnsi="Wingdings" w:hint="default"/>
+      </w:rPr>
+    </w:lvl>
+    <w:lvl w:ilvl="6" w:tplc="04160001" w:tentative="1">
+      <w:start w:val="1"/>
+      <w:numFmt w:val="bullet"/>
+      <w:lvlText w:val=""/>
+      <w:lvlJc w:val="left"/>
+      <w:pPr>
+        <w:ind w:left="5040" w:hanging="360"/>
+      </w:pPr>
+      <w:rPr>
+        <w:rFonts w:ascii="Symbol" w:hAnsi="Symbol" w:hint="default"/>
+      </w:rPr>
+    </w:lvl>
+    <w:lvl w:ilvl="7" w:tplc="04160003" w:tentative="1">
+      <w:start w:val="1"/>
+      <w:numFmt w:val="bullet"/>
+      <w:lvlText w:val="o"/>
+      <w:lvlJc w:val="left"/>
+      <w:pPr>
+        <w:ind w:left="5760" w:hanging="360"/>
+      </w:pPr>
+      <w:rPr>
+        <w:rFonts w:ascii="Courier New" w:hAnsi="Courier New" w:cs="Courier New" w:hint="default"/>
+      </w:rPr>
+    </w:lvl>
+    <w:lvl w:ilvl="8" w:tplc="04160005" w:tentative="1">
+      <w:start w:val="1"/>
+      <w:numFmt w:val="bullet"/>
+      <w:lvlText w:val=""/>
+      <w:lvlJc w:val="left"/>
+      <w:pPr>
+        <w:ind w:left="6480" w:hanging="360"/>
+      </w:pPr>
+      <w:rPr>
+        <w:rFonts w:ascii="Wingdings" w:hAnsi="Wingdings" w:hint="default"/>
+      </w:rPr>
+    </w:lvl>
+  </w:abstractNum>
+  <w:abstractNum w:abstractNumId="4" w15:restartNumberingAfterBreak="0">
+    <w:nsid w:val="1BFC42E1"/>
+    <w:multiLevelType w:val="hybridMultilevel"/>
+    <w:tmpl w:val="FD1259FA"/>
+    <w:lvl w:ilvl="0" w:tplc="04160001">
+      <w:start w:val="1"/>
+      <w:numFmt w:val="bullet"/>
+      <w:lvlText w:val=""/>
+      <w:lvlJc w:val="left"/>
+      <w:pPr>
+        <w:ind w:left="720" w:hanging="360"/>
+      </w:pPr>
+      <w:rPr>
+        <w:rFonts w:ascii="Symbol" w:hAnsi="Symbol" w:hint="default"/>
+      </w:rPr>
+    </w:lvl>
+    <w:lvl w:ilvl="1" w:tplc="04160003" w:tentative="1">
+      <w:start w:val="1"/>
+      <w:numFmt w:val="bullet"/>
+      <w:lvlText w:val="o"/>
+      <w:lvlJc w:val="left"/>
+      <w:pPr>
+        <w:ind w:left="1440" w:hanging="360"/>
+      </w:pPr>
+      <w:rPr>
+        <w:rFonts w:ascii="Courier New" w:hAnsi="Courier New" w:cs="Courier New" w:hint="default"/>
+      </w:rPr>
+    </w:lvl>
+    <w:lvl w:ilvl="2" w:tplc="04160005" w:tentative="1">
+      <w:start w:val="1"/>
+      <w:numFmt w:val="bullet"/>
+      <w:lvlText w:val=""/>
+      <w:lvlJc w:val="left"/>
+      <w:pPr>
+        <w:ind w:left="2160" w:hanging="360"/>
+      </w:pPr>
+      <w:rPr>
+        <w:rFonts w:ascii="Wingdings" w:hAnsi="Wingdings" w:hint="default"/>
+      </w:rPr>
+    </w:lvl>
+    <w:lvl w:ilvl="3" w:tplc="04160001" w:tentative="1">
+      <w:start w:val="1"/>
+      <w:numFmt w:val="bullet"/>
+      <w:lvlText w:val=""/>
+      <w:lvlJc w:val="left"/>
+      <w:pPr>
+        <w:ind w:left="2880" w:hanging="360"/>
+      </w:pPr>
+      <w:rPr>
+        <w:rFonts w:ascii="Symbol" w:hAnsi="Symbol" w:hint="default"/>
+      </w:rPr>
+    </w:lvl>
+    <w:lvl w:ilvl="4" w:tplc="04160003" w:tentative="1">
+      <w:start w:val="1"/>
+      <w:numFmt w:val="bullet"/>
+      <w:lvlText w:val="o"/>
+      <w:lvlJc w:val="left"/>
+      <w:pPr>
+        <w:ind w:left="3600" w:hanging="360"/>
+      </w:pPr>
+      <w:rPr>
+        <w:rFonts w:ascii="Courier New" w:hAnsi="Courier New" w:cs="Courier New" w:hint="default"/>
+      </w:rPr>
+    </w:lvl>
+    <w:lvl w:ilvl="5" w:tplc="04160005" w:tentative="1">
+      <w:start w:val="1"/>
+      <w:numFmt w:val="bullet"/>
+      <w:lvlText w:val=""/>
+      <w:lvlJc w:val="left"/>
+      <w:pPr>
+        <w:ind w:left="4320" w:hanging="360"/>
+      </w:pPr>
+      <w:rPr>
+        <w:rFonts w:ascii="Wingdings" w:hAnsi="Wingdings" w:hint="default"/>
+      </w:rPr>
+    </w:lvl>
+    <w:lvl w:ilvl="6" w:tplc="04160001" w:tentative="1">
+      <w:start w:val="1"/>
+      <w:numFmt w:val="bullet"/>
+      <w:lvlText w:val=""/>
+      <w:lvlJc w:val="left"/>
+      <w:pPr>
+        <w:ind w:left="5040" w:hanging="360"/>
+      </w:pPr>
+      <w:rPr>
+        <w:rFonts w:ascii="Symbol" w:hAnsi="Symbol" w:hint="default"/>
+      </w:rPr>
+    </w:lvl>
+    <w:lvl w:ilvl="7" w:tplc="04160003" w:tentative="1">
+      <w:start w:val="1"/>
+      <w:numFmt w:val="bullet"/>
+      <w:lvlText w:val="o"/>
+      <w:lvlJc w:val="left"/>
+      <w:pPr>
+        <w:ind w:left="5760" w:hanging="360"/>
+      </w:pPr>
+      <w:rPr>
+        <w:rFonts w:ascii="Courier New" w:hAnsi="Courier New" w:cs="Courier New" w:hint="default"/>
+      </w:rPr>
+    </w:lvl>
+    <w:lvl w:ilvl="8" w:tplc="04160005" w:tentative="1">
+      <w:start w:val="1"/>
+      <w:numFmt w:val="bullet"/>
+      <w:lvlText w:val=""/>
+      <w:lvlJc w:val="left"/>
+      <w:pPr>
+        <w:ind w:left="6480" w:hanging="360"/>
+      </w:pPr>
+      <w:rPr>
+        <w:rFonts w:ascii="Wingdings" w:hAnsi="Wingdings" w:hint="default"/>
+      </w:rPr>
+    </w:lvl>
+  </w:abstractNum>
+  <w:abstractNum w:abstractNumId="5" w15:restartNumberingAfterBreak="0">
+    <w:nsid w:val="1EAE2F3B"/>
+    <w:multiLevelType w:val="hybridMultilevel"/>
+    <w:tmpl w:val="3506852E"/>
+    <w:lvl w:ilvl="0" w:tplc="04160001">
+      <w:start w:val="1"/>
+      <w:numFmt w:val="bullet"/>
+      <w:lvlText w:val=""/>
+      <w:lvlJc w:val="left"/>
+      <w:pPr>
+        <w:ind w:left="720" w:hanging="360"/>
+      </w:pPr>
+      <w:rPr>
+        <w:rFonts w:ascii="Symbol" w:hAnsi="Symbol" w:hint="default"/>
+      </w:rPr>
+    </w:lvl>
+    <w:lvl w:ilvl="1" w:tplc="04160003" w:tentative="1">
+      <w:start w:val="1"/>
+      <w:numFmt w:val="bullet"/>
+      <w:lvlText w:val="o"/>
+      <w:lvlJc w:val="left"/>
+      <w:pPr>
+        <w:ind w:left="1440" w:hanging="360"/>
+      </w:pPr>
+      <w:rPr>
+        <w:rFonts w:ascii="Courier New" w:hAnsi="Courier New" w:cs="Courier New" w:hint="default"/>
+      </w:rPr>
+    </w:lvl>
+    <w:lvl w:ilvl="2" w:tplc="04160005" w:tentative="1">
+      <w:start w:val="1"/>
+      <w:numFmt w:val="bullet"/>
+      <w:lvlText w:val=""/>
+      <w:lvlJc w:val="left"/>
+      <w:pPr>
+        <w:ind w:left="2160" w:hanging="360"/>
+      </w:pPr>
+      <w:rPr>
+        <w:rFonts w:ascii="Wingdings" w:hAnsi="Wingdings" w:hint="default"/>
+      </w:rPr>
+    </w:lvl>
+    <w:lvl w:ilvl="3" w:tplc="04160001" w:tentative="1">
+      <w:start w:val="1"/>
+      <w:numFmt w:val="bullet"/>
+      <w:lvlText w:val=""/>
+      <w:lvlJc w:val="left"/>
+      <w:pPr>
+        <w:ind w:left="2880" w:hanging="360"/>
+      </w:pPr>
+      <w:rPr>
+        <w:rFonts w:ascii="Symbol" w:hAnsi="Symbol" w:hint="default"/>
+      </w:rPr>
+    </w:lvl>
+    <w:lvl w:ilvl="4" w:tplc="04160003" w:tentative="1">
+      <w:start w:val="1"/>
+      <w:numFmt w:val="bullet"/>
+      <w:lvlText w:val="o"/>
+      <w:lvlJc w:val="left"/>
+      <w:pPr>
+        <w:ind w:left="3600" w:hanging="360"/>
+      </w:pPr>
+      <w:rPr>
+        <w:rFonts w:ascii="Courier New" w:hAnsi="Courier New" w:cs="Courier New" w:hint="default"/>
+      </w:rPr>
+    </w:lvl>
+    <w:lvl w:ilvl="5" w:tplc="04160005" w:tentative="1">
+      <w:start w:val="1"/>
+      <w:numFmt w:val="bullet"/>
+      <w:lvlText w:val=""/>
+      <w:lvlJc w:val="left"/>
+      <w:pPr>
+        <w:ind w:left="4320" w:hanging="360"/>
+      </w:pPr>
+      <w:rPr>
+        <w:rFonts w:ascii="Wingdings" w:hAnsi="Wingdings" w:hint="default"/>
+      </w:rPr>
+    </w:lvl>
+    <w:lvl w:ilvl="6" w:tplc="04160001" w:tentative="1">
+      <w:start w:val="1"/>
+      <w:numFmt w:val="bullet"/>
+      <w:lvlText w:val=""/>
+      <w:lvlJc w:val="left"/>
+      <w:pPr>
+        <w:ind w:left="5040" w:hanging="360"/>
+      </w:pPr>
+      <w:rPr>
+        <w:rFonts w:ascii="Symbol" w:hAnsi="Symbol" w:hint="default"/>
+      </w:rPr>
+    </w:lvl>
+    <w:lvl w:ilvl="7" w:tplc="04160003" w:tentative="1">
+      <w:start w:val="1"/>
+      <w:numFmt w:val="bullet"/>
+      <w:lvlText w:val="o"/>
+      <w:lvlJc w:val="left"/>
+      <w:pPr>
+        <w:ind w:left="5760" w:hanging="360"/>
+      </w:pPr>
+      <w:rPr>
+        <w:rFonts w:ascii="Courier New" w:hAnsi="Courier New" w:cs="Courier New" w:hint="default"/>
+      </w:rPr>
+    </w:lvl>
+    <w:lvl w:ilvl="8" w:tplc="04160005" w:tentative="1">
+      <w:start w:val="1"/>
+      <w:numFmt w:val="bullet"/>
+      <w:lvlText w:val=""/>
+      <w:lvlJc w:val="left"/>
+      <w:pPr>
+        <w:ind w:left="6480" w:hanging="360"/>
+      </w:pPr>
+      <w:rPr>
+        <w:rFonts w:ascii="Wingdings" w:hAnsi="Wingdings" w:hint="default"/>
+      </w:rPr>
+    </w:lvl>
+  </w:abstractNum>
+  <w:abstractNum w:abstractNumId="6" w15:restartNumberingAfterBreak="0">
     <w:nsid w:val="2753510E"/>
     <w:multiLevelType w:val="hybridMultilevel"/>
     <w:tmpl w:val="720E1EBE"/>
@@ -1258,7 +1784,120 @@
       </w:rPr>
     </w:lvl>
   </w:abstractNum>
-  <w:abstractNum w:abstractNumId="3" w15:restartNumberingAfterBreak="0">
+  <w:abstractNum w:abstractNumId="7" w15:restartNumberingAfterBreak="0">
+    <w:nsid w:val="2AB93503"/>
+    <w:multiLevelType w:val="hybridMultilevel"/>
+    <w:tmpl w:val="D47C3932"/>
+    <w:lvl w:ilvl="0" w:tplc="04160001">
+      <w:start w:val="1"/>
+      <w:numFmt w:val="bullet"/>
+      <w:lvlText w:val=""/>
+      <w:lvlJc w:val="left"/>
+      <w:pPr>
+        <w:ind w:left="720" w:hanging="360"/>
+      </w:pPr>
+      <w:rPr>
+        <w:rFonts w:ascii="Symbol" w:hAnsi="Symbol" w:hint="default"/>
+      </w:rPr>
+    </w:lvl>
+    <w:lvl w:ilvl="1" w:tplc="04160003" w:tentative="1">
+      <w:start w:val="1"/>
+      <w:numFmt w:val="bullet"/>
+      <w:lvlText w:val="o"/>
+      <w:lvlJc w:val="left"/>
+      <w:pPr>
+        <w:ind w:left="1440" w:hanging="360"/>
+      </w:pPr>
+      <w:rPr>
+        <w:rFonts w:ascii="Courier New" w:hAnsi="Courier New" w:cs="Courier New" w:hint="default"/>
+      </w:rPr>
+    </w:lvl>
+    <w:lvl w:ilvl="2" w:tplc="04160005" w:tentative="1">
+      <w:start w:val="1"/>
+      <w:numFmt w:val="bullet"/>
+      <w:lvlText w:val=""/>
+      <w:lvlJc w:val="left"/>
+      <w:pPr>
+        <w:ind w:left="2160" w:hanging="360"/>
+      </w:pPr>
+      <w:rPr>
+        <w:rFonts w:ascii="Wingdings" w:hAnsi="Wingdings" w:hint="default"/>
+      </w:rPr>
+    </w:lvl>
+    <w:lvl w:ilvl="3" w:tplc="04160001" w:tentative="1">
+      <w:start w:val="1"/>
+      <w:numFmt w:val="bullet"/>
+      <w:lvlText w:val=""/>
+      <w:lvlJc w:val="left"/>
+      <w:pPr>
+        <w:ind w:left="2880" w:hanging="360"/>
+      </w:pPr>
+      <w:rPr>
+        <w:rFonts w:ascii="Symbol" w:hAnsi="Symbol" w:hint="default"/>
+      </w:rPr>
+    </w:lvl>
+    <w:lvl w:ilvl="4" w:tplc="04160003" w:tentative="1">
+      <w:start w:val="1"/>
+      <w:numFmt w:val="bullet"/>
+      <w:lvlText w:val="o"/>
+      <w:lvlJc w:val="left"/>
+      <w:pPr>
+        <w:ind w:left="3600" w:hanging="360"/>
+      </w:pPr>
+      <w:rPr>
+        <w:rFonts w:ascii="Courier New" w:hAnsi="Courier New" w:cs="Courier New" w:hint="default"/>
+      </w:rPr>
+    </w:lvl>
+    <w:lvl w:ilvl="5" w:tplc="04160005" w:tentative="1">
+      <w:start w:val="1"/>
+      <w:numFmt w:val="bullet"/>
+      <w:lvlText w:val=""/>
+      <w:lvlJc w:val="left"/>
+      <w:pPr>
+        <w:ind w:left="4320" w:hanging="360"/>
+      </w:pPr>
+      <w:rPr>
+        <w:rFonts w:ascii="Wingdings" w:hAnsi="Wingdings" w:hint="default"/>
+      </w:rPr>
+    </w:lvl>
+    <w:lvl w:ilvl="6" w:tplc="04160001" w:tentative="1">
+      <w:start w:val="1"/>
+      <w:numFmt w:val="bullet"/>
+      <w:lvlText w:val=""/>
+      <w:lvlJc w:val="left"/>
+      <w:pPr>
+        <w:ind w:left="5040" w:hanging="360"/>
+      </w:pPr>
+      <w:rPr>
+        <w:rFonts w:ascii="Symbol" w:hAnsi="Symbol" w:hint="default"/>
+      </w:rPr>
+    </w:lvl>
+    <w:lvl w:ilvl="7" w:tplc="04160003" w:tentative="1">
+      <w:start w:val="1"/>
+      <w:numFmt w:val="bullet"/>
+      <w:lvlText w:val="o"/>
+      <w:lvlJc w:val="left"/>
+      <w:pPr>
+        <w:ind w:left="5760" w:hanging="360"/>
+      </w:pPr>
+      <w:rPr>
+        <w:rFonts w:ascii="Courier New" w:hAnsi="Courier New" w:cs="Courier New" w:hint="default"/>
+      </w:rPr>
+    </w:lvl>
+    <w:lvl w:ilvl="8" w:tplc="04160005" w:tentative="1">
+      <w:start w:val="1"/>
+      <w:numFmt w:val="bullet"/>
+      <w:lvlText w:val=""/>
+      <w:lvlJc w:val="left"/>
+      <w:pPr>
+        <w:ind w:left="6480" w:hanging="360"/>
+      </w:pPr>
+      <w:rPr>
+        <w:rFonts w:ascii="Wingdings" w:hAnsi="Wingdings" w:hint="default"/>
+      </w:rPr>
+    </w:lvl>
+  </w:abstractNum>
+  <w:abstractNum w:abstractNumId="8" w15:restartNumberingAfterBreak="0">
     <w:nsid w:val="329F3BA7"/>
     <w:multiLevelType w:val="hybridMultilevel"/>
     <w:tmpl w:val="77D48C54"/>
@@ -1371,23 +2010,618 @@
       </w:rPr>
     </w:lvl>
   </w:abstractNum>
+  <w:abstractNum w:abstractNumId="9" w15:restartNumberingAfterBreak="0">
+    <w:nsid w:val="34571A1B"/>
+    <w:multiLevelType w:val="hybridMultilevel"/>
+    <w:tmpl w:val="522E43AC"/>
+    <w:lvl w:ilvl="0" w:tplc="04160001">
+      <w:start w:val="1"/>
+      <w:numFmt w:val="bullet"/>
+      <w:lvlText w:val=""/>
+      <w:lvlJc w:val="left"/>
+      <w:pPr>
+        <w:ind w:left="720" w:hanging="360"/>
+      </w:pPr>
+      <w:rPr>
+        <w:rFonts w:ascii="Symbol" w:hAnsi="Symbol" w:hint="default"/>
+      </w:rPr>
+    </w:lvl>
+    <w:lvl w:ilvl="1" w:tplc="04160003" w:tentative="1">
+      <w:start w:val="1"/>
+      <w:numFmt w:val="bullet"/>
+      <w:lvlText w:val="o"/>
+      <w:lvlJc w:val="left"/>
+      <w:pPr>
+        <w:ind w:left="1440" w:hanging="360"/>
+      </w:pPr>
+      <w:rPr>
+        <w:rFonts w:ascii="Courier New" w:hAnsi="Courier New" w:cs="Courier New" w:hint="default"/>
+      </w:rPr>
+    </w:lvl>
+    <w:lvl w:ilvl="2" w:tplc="04160005" w:tentative="1">
+      <w:start w:val="1"/>
+      <w:numFmt w:val="bullet"/>
+      <w:lvlText w:val=""/>
+      <w:lvlJc w:val="left"/>
+      <w:pPr>
+        <w:ind w:left="2160" w:hanging="360"/>
+      </w:pPr>
+      <w:rPr>
+        <w:rFonts w:ascii="Wingdings" w:hAnsi="Wingdings" w:hint="default"/>
+      </w:rPr>
+    </w:lvl>
+    <w:lvl w:ilvl="3" w:tplc="04160001" w:tentative="1">
+      <w:start w:val="1"/>
+      <w:numFmt w:val="bullet"/>
+      <w:lvlText w:val=""/>
+      <w:lvlJc w:val="left"/>
+      <w:pPr>
+        <w:ind w:left="2880" w:hanging="360"/>
+      </w:pPr>
+      <w:rPr>
+        <w:rFonts w:ascii="Symbol" w:hAnsi="Symbol" w:hint="default"/>
+      </w:rPr>
+    </w:lvl>
+    <w:lvl w:ilvl="4" w:tplc="04160003" w:tentative="1">
+      <w:start w:val="1"/>
+      <w:numFmt w:val="bullet"/>
+      <w:lvlText w:val="o"/>
+      <w:lvlJc w:val="left"/>
+      <w:pPr>
+        <w:ind w:left="3600" w:hanging="360"/>
+      </w:pPr>
+      <w:rPr>
+        <w:rFonts w:ascii="Courier New" w:hAnsi="Courier New" w:cs="Courier New" w:hint="default"/>
+      </w:rPr>
+    </w:lvl>
+    <w:lvl w:ilvl="5" w:tplc="04160005" w:tentative="1">
+      <w:start w:val="1"/>
+      <w:numFmt w:val="bullet"/>
+      <w:lvlText w:val=""/>
+      <w:lvlJc w:val="left"/>
+      <w:pPr>
+        <w:ind w:left="4320" w:hanging="360"/>
+      </w:pPr>
+      <w:rPr>
+        <w:rFonts w:ascii="Wingdings" w:hAnsi="Wingdings" w:hint="default"/>
+      </w:rPr>
+    </w:lvl>
+    <w:lvl w:ilvl="6" w:tplc="04160001" w:tentative="1">
+      <w:start w:val="1"/>
+      <w:numFmt w:val="bullet"/>
+      <w:lvlText w:val=""/>
+      <w:lvlJc w:val="left"/>
+      <w:pPr>
+        <w:ind w:left="5040" w:hanging="360"/>
+      </w:pPr>
+      <w:rPr>
+        <w:rFonts w:ascii="Symbol" w:hAnsi="Symbol" w:hint="default"/>
+      </w:rPr>
+    </w:lvl>
+    <w:lvl w:ilvl="7" w:tplc="04160003" w:tentative="1">
+      <w:start w:val="1"/>
+      <w:numFmt w:val="bullet"/>
+      <w:lvlText w:val="o"/>
+      <w:lvlJc w:val="left"/>
+      <w:pPr>
+        <w:ind w:left="5760" w:hanging="360"/>
+      </w:pPr>
+      <w:rPr>
+        <w:rFonts w:ascii="Courier New" w:hAnsi="Courier New" w:cs="Courier New" w:hint="default"/>
+      </w:rPr>
+    </w:lvl>
+    <w:lvl w:ilvl="8" w:tplc="04160005" w:tentative="1">
+      <w:start w:val="1"/>
+      <w:numFmt w:val="bullet"/>
+      <w:lvlText w:val=""/>
+      <w:lvlJc w:val="left"/>
+      <w:pPr>
+        <w:ind w:left="6480" w:hanging="360"/>
+      </w:pPr>
+      <w:rPr>
+        <w:rFonts w:ascii="Wingdings" w:hAnsi="Wingdings" w:hint="default"/>
+      </w:rPr>
+    </w:lvl>
+  </w:abstractNum>
+  <w:abstractNum w:abstractNumId="10" w15:restartNumberingAfterBreak="0">
+    <w:nsid w:val="551F5949"/>
+    <w:multiLevelType w:val="hybridMultilevel"/>
+    <w:tmpl w:val="2C10AE98"/>
+    <w:lvl w:ilvl="0" w:tplc="04160001">
+      <w:start w:val="1"/>
+      <w:numFmt w:val="bullet"/>
+      <w:lvlText w:val=""/>
+      <w:lvlJc w:val="left"/>
+      <w:pPr>
+        <w:ind w:left="720" w:hanging="360"/>
+      </w:pPr>
+      <w:rPr>
+        <w:rFonts w:ascii="Symbol" w:hAnsi="Symbol" w:hint="default"/>
+      </w:rPr>
+    </w:lvl>
+    <w:lvl w:ilvl="1" w:tplc="04160003" w:tentative="1">
+      <w:start w:val="1"/>
+      <w:numFmt w:val="bullet"/>
+      <w:lvlText w:val="o"/>
+      <w:lvlJc w:val="left"/>
+      <w:pPr>
+        <w:ind w:left="1440" w:hanging="360"/>
+      </w:pPr>
+      <w:rPr>
+        <w:rFonts w:ascii="Courier New" w:hAnsi="Courier New" w:cs="Courier New" w:hint="default"/>
+      </w:rPr>
+    </w:lvl>
+    <w:lvl w:ilvl="2" w:tplc="04160005" w:tentative="1">
+      <w:start w:val="1"/>
+      <w:numFmt w:val="bullet"/>
+      <w:lvlText w:val=""/>
+      <w:lvlJc w:val="left"/>
+      <w:pPr>
+        <w:ind w:left="2160" w:hanging="360"/>
+      </w:pPr>
+      <w:rPr>
+        <w:rFonts w:ascii="Wingdings" w:hAnsi="Wingdings" w:hint="default"/>
+      </w:rPr>
+    </w:lvl>
+    <w:lvl w:ilvl="3" w:tplc="04160001" w:tentative="1">
+      <w:start w:val="1"/>
+      <w:numFmt w:val="bullet"/>
+      <w:lvlText w:val=""/>
+      <w:lvlJc w:val="left"/>
+      <w:pPr>
+        <w:ind w:left="2880" w:hanging="360"/>
+      </w:pPr>
+      <w:rPr>
+        <w:rFonts w:ascii="Symbol" w:hAnsi="Symbol" w:hint="default"/>
+      </w:rPr>
+    </w:lvl>
+    <w:lvl w:ilvl="4" w:tplc="04160003" w:tentative="1">
+      <w:start w:val="1"/>
+      <w:numFmt w:val="bullet"/>
+      <w:lvlText w:val="o"/>
+      <w:lvlJc w:val="left"/>
+      <w:pPr>
+        <w:ind w:left="3600" w:hanging="360"/>
+      </w:pPr>
+      <w:rPr>
+        <w:rFonts w:ascii="Courier New" w:hAnsi="Courier New" w:cs="Courier New" w:hint="default"/>
+      </w:rPr>
+    </w:lvl>
+    <w:lvl w:ilvl="5" w:tplc="04160005" w:tentative="1">
+      <w:start w:val="1"/>
+      <w:numFmt w:val="bullet"/>
+      <w:lvlText w:val=""/>
+      <w:lvlJc w:val="left"/>
+      <w:pPr>
+        <w:ind w:left="4320" w:hanging="360"/>
+      </w:pPr>
+      <w:rPr>
+        <w:rFonts w:ascii="Wingdings" w:hAnsi="Wingdings" w:hint="default"/>
+      </w:rPr>
+    </w:lvl>
+    <w:lvl w:ilvl="6" w:tplc="04160001" w:tentative="1">
+      <w:start w:val="1"/>
+      <w:numFmt w:val="bullet"/>
+      <w:lvlText w:val=""/>
+      <w:lvlJc w:val="left"/>
+      <w:pPr>
+        <w:ind w:left="5040" w:hanging="360"/>
+      </w:pPr>
+      <w:rPr>
+        <w:rFonts w:ascii="Symbol" w:hAnsi="Symbol" w:hint="default"/>
+      </w:rPr>
+    </w:lvl>
+    <w:lvl w:ilvl="7" w:tplc="04160003" w:tentative="1">
+      <w:start w:val="1"/>
+      <w:numFmt w:val="bullet"/>
+      <w:lvlText w:val="o"/>
+      <w:lvlJc w:val="left"/>
+      <w:pPr>
+        <w:ind w:left="5760" w:hanging="360"/>
+      </w:pPr>
+      <w:rPr>
+        <w:rFonts w:ascii="Courier New" w:hAnsi="Courier New" w:cs="Courier New" w:hint="default"/>
+      </w:rPr>
+    </w:lvl>
+    <w:lvl w:ilvl="8" w:tplc="04160005" w:tentative="1">
+      <w:start w:val="1"/>
+      <w:numFmt w:val="bullet"/>
+      <w:lvlText w:val=""/>
+      <w:lvlJc w:val="left"/>
+      <w:pPr>
+        <w:ind w:left="6480" w:hanging="360"/>
+      </w:pPr>
+      <w:rPr>
+        <w:rFonts w:ascii="Wingdings" w:hAnsi="Wingdings" w:hint="default"/>
+      </w:rPr>
+    </w:lvl>
+  </w:abstractNum>
+  <w:abstractNum w:abstractNumId="11" w15:restartNumberingAfterBreak="0">
+    <w:nsid w:val="61FF3F26"/>
+    <w:multiLevelType w:val="hybridMultilevel"/>
+    <w:tmpl w:val="C43CD392"/>
+    <w:lvl w:ilvl="0" w:tplc="04160001">
+      <w:start w:val="1"/>
+      <w:numFmt w:val="bullet"/>
+      <w:lvlText w:val=""/>
+      <w:lvlJc w:val="left"/>
+      <w:pPr>
+        <w:ind w:left="720" w:hanging="360"/>
+      </w:pPr>
+      <w:rPr>
+        <w:rFonts w:ascii="Symbol" w:hAnsi="Symbol" w:hint="default"/>
+      </w:rPr>
+    </w:lvl>
+    <w:lvl w:ilvl="1" w:tplc="04160003" w:tentative="1">
+      <w:start w:val="1"/>
+      <w:numFmt w:val="bullet"/>
+      <w:lvlText w:val="o"/>
+      <w:lvlJc w:val="left"/>
+      <w:pPr>
+        <w:ind w:left="1440" w:hanging="360"/>
+      </w:pPr>
+      <w:rPr>
+        <w:rFonts w:ascii="Courier New" w:hAnsi="Courier New" w:cs="Courier New" w:hint="default"/>
+      </w:rPr>
+    </w:lvl>
+    <w:lvl w:ilvl="2" w:tplc="04160005" w:tentative="1">
+      <w:start w:val="1"/>
+      <w:numFmt w:val="bullet"/>
+      <w:lvlText w:val=""/>
+      <w:lvlJc w:val="left"/>
+      <w:pPr>
+        <w:ind w:left="2160" w:hanging="360"/>
+      </w:pPr>
+      <w:rPr>
+        <w:rFonts w:ascii="Wingdings" w:hAnsi="Wingdings" w:hint="default"/>
+      </w:rPr>
+    </w:lvl>
+    <w:lvl w:ilvl="3" w:tplc="04160001" w:tentative="1">
+      <w:start w:val="1"/>
+      <w:numFmt w:val="bullet"/>
+      <w:lvlText w:val=""/>
+      <w:lvlJc w:val="left"/>
+      <w:pPr>
+        <w:ind w:left="2880" w:hanging="360"/>
+      </w:pPr>
+      <w:rPr>
+        <w:rFonts w:ascii="Symbol" w:hAnsi="Symbol" w:hint="default"/>
+      </w:rPr>
+    </w:lvl>
+    <w:lvl w:ilvl="4" w:tplc="04160003" w:tentative="1">
+      <w:start w:val="1"/>
+      <w:numFmt w:val="bullet"/>
+      <w:lvlText w:val="o"/>
+      <w:lvlJc w:val="left"/>
+      <w:pPr>
+        <w:ind w:left="3600" w:hanging="360"/>
+      </w:pPr>
+      <w:rPr>
+        <w:rFonts w:ascii="Courier New" w:hAnsi="Courier New" w:cs="Courier New" w:hint="default"/>
+      </w:rPr>
+    </w:lvl>
+    <w:lvl w:ilvl="5" w:tplc="04160005" w:tentative="1">
+      <w:start w:val="1"/>
+      <w:numFmt w:val="bullet"/>
+      <w:lvlText w:val=""/>
+      <w:lvlJc w:val="left"/>
+      <w:pPr>
+        <w:ind w:left="4320" w:hanging="360"/>
+      </w:pPr>
+      <w:rPr>
+        <w:rFonts w:ascii="Wingdings" w:hAnsi="Wingdings" w:hint="default"/>
+      </w:rPr>
+    </w:lvl>
+    <w:lvl w:ilvl="6" w:tplc="04160001" w:tentative="1">
+      <w:start w:val="1"/>
+      <w:numFmt w:val="bullet"/>
+      <w:lvlText w:val=""/>
+      <w:lvlJc w:val="left"/>
+      <w:pPr>
+        <w:ind w:left="5040" w:hanging="360"/>
+      </w:pPr>
+      <w:rPr>
+        <w:rFonts w:ascii="Symbol" w:hAnsi="Symbol" w:hint="default"/>
+      </w:rPr>
+    </w:lvl>
+    <w:lvl w:ilvl="7" w:tplc="04160003" w:tentative="1">
+      <w:start w:val="1"/>
+      <w:numFmt w:val="bullet"/>
+      <w:lvlText w:val="o"/>
+      <w:lvlJc w:val="left"/>
+      <w:pPr>
+        <w:ind w:left="5760" w:hanging="360"/>
+      </w:pPr>
+      <w:rPr>
+        <w:rFonts w:ascii="Courier New" w:hAnsi="Courier New" w:cs="Courier New" w:hint="default"/>
+      </w:rPr>
+    </w:lvl>
+    <w:lvl w:ilvl="8" w:tplc="04160005" w:tentative="1">
+      <w:start w:val="1"/>
+      <w:numFmt w:val="bullet"/>
+      <w:lvlText w:val=""/>
+      <w:lvlJc w:val="left"/>
+      <w:pPr>
+        <w:ind w:left="6480" w:hanging="360"/>
+      </w:pPr>
+      <w:rPr>
+        <w:rFonts w:ascii="Wingdings" w:hAnsi="Wingdings" w:hint="default"/>
+      </w:rPr>
+    </w:lvl>
+  </w:abstractNum>
+  <w:abstractNum w:abstractNumId="12" w15:restartNumberingAfterBreak="0">
+    <w:nsid w:val="63161AE0"/>
+    <w:multiLevelType w:val="hybridMultilevel"/>
+    <w:tmpl w:val="93E65638"/>
+    <w:lvl w:ilvl="0" w:tplc="04160001">
+      <w:start w:val="1"/>
+      <w:numFmt w:val="bullet"/>
+      <w:lvlText w:val=""/>
+      <w:lvlJc w:val="left"/>
+      <w:pPr>
+        <w:ind w:left="720" w:hanging="360"/>
+      </w:pPr>
+      <w:rPr>
+        <w:rFonts w:ascii="Symbol" w:hAnsi="Symbol" w:hint="default"/>
+      </w:rPr>
+    </w:lvl>
+    <w:lvl w:ilvl="1" w:tplc="04160003" w:tentative="1">
+      <w:start w:val="1"/>
+      <w:numFmt w:val="bullet"/>
+      <w:lvlText w:val="o"/>
+      <w:lvlJc w:val="left"/>
+      <w:pPr>
+        <w:ind w:left="1440" w:hanging="360"/>
+      </w:pPr>
+      <w:rPr>
+        <w:rFonts w:ascii="Courier New" w:hAnsi="Courier New" w:cs="Courier New" w:hint="default"/>
+      </w:rPr>
+    </w:lvl>
+    <w:lvl w:ilvl="2" w:tplc="04160005" w:tentative="1">
+      <w:start w:val="1"/>
+      <w:numFmt w:val="bullet"/>
+      <w:lvlText w:val=""/>
+      <w:lvlJc w:val="left"/>
+      <w:pPr>
+        <w:ind w:left="2160" w:hanging="360"/>
+      </w:pPr>
+      <w:rPr>
+        <w:rFonts w:ascii="Wingdings" w:hAnsi="Wingdings" w:hint="default"/>
+      </w:rPr>
+    </w:lvl>
+    <w:lvl w:ilvl="3" w:tplc="04160001" w:tentative="1">
+      <w:start w:val="1"/>
+      <w:numFmt w:val="bullet"/>
+      <w:lvlText w:val=""/>
+      <w:lvlJc w:val="left"/>
+      <w:pPr>
+        <w:ind w:left="2880" w:hanging="360"/>
+      </w:pPr>
+      <w:rPr>
+        <w:rFonts w:ascii="Symbol" w:hAnsi="Symbol" w:hint="default"/>
+      </w:rPr>
+    </w:lvl>
+    <w:lvl w:ilvl="4" w:tplc="04160003" w:tentative="1">
+      <w:start w:val="1"/>
+      <w:numFmt w:val="bullet"/>
+      <w:lvlText w:val="o"/>
+      <w:lvlJc w:val="left"/>
+      <w:pPr>
+        <w:ind w:left="3600" w:hanging="360"/>
+      </w:pPr>
+      <w:rPr>
+        <w:rFonts w:ascii="Courier New" w:hAnsi="Courier New" w:cs="Courier New" w:hint="default"/>
+      </w:rPr>
+    </w:lvl>
+    <w:lvl w:ilvl="5" w:tplc="04160005" w:tentative="1">
+      <w:start w:val="1"/>
+      <w:numFmt w:val="bullet"/>
+      <w:lvlText w:val=""/>
+      <w:lvlJc w:val="left"/>
+      <w:pPr>
+        <w:ind w:left="4320" w:hanging="360"/>
+      </w:pPr>
+      <w:rPr>
+        <w:rFonts w:ascii="Wingdings" w:hAnsi="Wingdings" w:hint="default"/>
+      </w:rPr>
+    </w:lvl>
+    <w:lvl w:ilvl="6" w:tplc="04160001" w:tentative="1">
+      <w:start w:val="1"/>
+      <w:numFmt w:val="bullet"/>
+      <w:lvlText w:val=""/>
+      <w:lvlJc w:val="left"/>
+      <w:pPr>
+        <w:ind w:left="5040" w:hanging="360"/>
+      </w:pPr>
+      <w:rPr>
+        <w:rFonts w:ascii="Symbol" w:hAnsi="Symbol" w:hint="default"/>
+      </w:rPr>
+    </w:lvl>
+    <w:lvl w:ilvl="7" w:tplc="04160003" w:tentative="1">
+      <w:start w:val="1"/>
+      <w:numFmt w:val="bullet"/>
+      <w:lvlText w:val="o"/>
+      <w:lvlJc w:val="left"/>
+      <w:pPr>
+        <w:ind w:left="5760" w:hanging="360"/>
+      </w:pPr>
+      <w:rPr>
+        <w:rFonts w:ascii="Courier New" w:hAnsi="Courier New" w:cs="Courier New" w:hint="default"/>
+      </w:rPr>
+    </w:lvl>
+    <w:lvl w:ilvl="8" w:tplc="04160005" w:tentative="1">
+      <w:start w:val="1"/>
+      <w:numFmt w:val="bullet"/>
+      <w:lvlText w:val=""/>
+      <w:lvlJc w:val="left"/>
+      <w:pPr>
+        <w:ind w:left="6480" w:hanging="360"/>
+      </w:pPr>
+      <w:rPr>
+        <w:rFonts w:ascii="Wingdings" w:hAnsi="Wingdings" w:hint="default"/>
+      </w:rPr>
+    </w:lvl>
+  </w:abstractNum>
+  <w:abstractNum w:abstractNumId="13" w15:restartNumberingAfterBreak="0">
+    <w:nsid w:val="7C522888"/>
+    <w:multiLevelType w:val="hybridMultilevel"/>
+    <w:tmpl w:val="51AEF66A"/>
+    <w:lvl w:ilvl="0" w:tplc="04160001">
+      <w:start w:val="1"/>
+      <w:numFmt w:val="bullet"/>
+      <w:lvlText w:val=""/>
+      <w:lvlJc w:val="left"/>
+      <w:pPr>
+        <w:ind w:left="720" w:hanging="360"/>
+      </w:pPr>
+      <w:rPr>
+        <w:rFonts w:ascii="Symbol" w:hAnsi="Symbol" w:hint="default"/>
+      </w:rPr>
+    </w:lvl>
+    <w:lvl w:ilvl="1" w:tplc="04160003" w:tentative="1">
+      <w:start w:val="1"/>
+      <w:numFmt w:val="bullet"/>
+      <w:lvlText w:val="o"/>
+      <w:lvlJc w:val="left"/>
+      <w:pPr>
+        <w:ind w:left="1440" w:hanging="360"/>
+      </w:pPr>
+      <w:rPr>
+        <w:rFonts w:ascii="Courier New" w:hAnsi="Courier New" w:cs="Courier New" w:hint="default"/>
+      </w:rPr>
+    </w:lvl>
+    <w:lvl w:ilvl="2" w:tplc="04160005" w:tentative="1">
+      <w:start w:val="1"/>
+      <w:numFmt w:val="bullet"/>
+      <w:lvlText w:val=""/>
+      <w:lvlJc w:val="left"/>
+      <w:pPr>
+        <w:ind w:left="2160" w:hanging="360"/>
+      </w:pPr>
+      <w:rPr>
+        <w:rFonts w:ascii="Wingdings" w:hAnsi="Wingdings" w:hint="default"/>
+      </w:rPr>
+    </w:lvl>
+    <w:lvl w:ilvl="3" w:tplc="04160001" w:tentative="1">
+      <w:start w:val="1"/>
+      <w:numFmt w:val="bullet"/>
+      <w:lvlText w:val=""/>
+      <w:lvlJc w:val="left"/>
+      <w:pPr>
+        <w:ind w:left="2880" w:hanging="360"/>
+      </w:pPr>
+      <w:rPr>
+        <w:rFonts w:ascii="Symbol" w:hAnsi="Symbol" w:hint="default"/>
+      </w:rPr>
+    </w:lvl>
+    <w:lvl w:ilvl="4" w:tplc="04160003" w:tentative="1">
+      <w:start w:val="1"/>
+      <w:numFmt w:val="bullet"/>
+      <w:lvlText w:val="o"/>
+      <w:lvlJc w:val="left"/>
+      <w:pPr>
+        <w:ind w:left="3600" w:hanging="360"/>
+      </w:pPr>
+      <w:rPr>
+        <w:rFonts w:ascii="Courier New" w:hAnsi="Courier New" w:cs="Courier New" w:hint="default"/>
+      </w:rPr>
+    </w:lvl>
+    <w:lvl w:ilvl="5" w:tplc="04160005" w:tentative="1">
+      <w:start w:val="1"/>
+      <w:numFmt w:val="bullet"/>
+      <w:lvlText w:val=""/>
+      <w:lvlJc w:val="left"/>
+      <w:pPr>
+        <w:ind w:left="4320" w:hanging="360"/>
+      </w:pPr>
+      <w:rPr>
+        <w:rFonts w:ascii="Wingdings" w:hAnsi="Wingdings" w:hint="default"/>
+      </w:rPr>
+    </w:lvl>
+    <w:lvl w:ilvl="6" w:tplc="04160001" w:tentative="1">
+      <w:start w:val="1"/>
+      <w:numFmt w:val="bullet"/>
+      <w:lvlText w:val=""/>
+      <w:lvlJc w:val="left"/>
+      <w:pPr>
+        <w:ind w:left="5040" w:hanging="360"/>
+      </w:pPr>
+      <w:rPr>
+        <w:rFonts w:ascii="Symbol" w:hAnsi="Symbol" w:hint="default"/>
+      </w:rPr>
+    </w:lvl>
+    <w:lvl w:ilvl="7" w:tplc="04160003" w:tentative="1">
+      <w:start w:val="1"/>
+      <w:numFmt w:val="bullet"/>
+      <w:lvlText w:val="o"/>
+      <w:lvlJc w:val="left"/>
+      <w:pPr>
+        <w:ind w:left="5760" w:hanging="360"/>
+      </w:pPr>
+      <w:rPr>
+        <w:rFonts w:ascii="Courier New" w:hAnsi="Courier New" w:cs="Courier New" w:hint="default"/>
+      </w:rPr>
+    </w:lvl>
+    <w:lvl w:ilvl="8" w:tplc="04160005" w:tentative="1">
+      <w:start w:val="1"/>
+      <w:numFmt w:val="bullet"/>
+      <w:lvlText w:val=""/>
+      <w:lvlJc w:val="left"/>
+      <w:pPr>
+        <w:ind w:left="6480" w:hanging="360"/>
+      </w:pPr>
+      <w:rPr>
+        <w:rFonts w:ascii="Wingdings" w:hAnsi="Wingdings" w:hint="default"/>
+      </w:rPr>
+    </w:lvl>
+  </w:abstractNum>
   <w:num w:numId="1">
     <w:abstractNumId w:val="0"/>
   </w:num>
   <w:num w:numId="2">
+    <w:abstractNumId w:val="2"/>
+  </w:num>
+  <w:num w:numId="3">
+    <w:abstractNumId w:val="6"/>
+  </w:num>
+  <w:num w:numId="4">
+    <w:abstractNumId w:val="8"/>
+  </w:num>
+  <w:num w:numId="5">
     <w:abstractNumId w:val="1"/>
   </w:num>
-  <w:num w:numId="3">
-    <w:abstractNumId w:val="2"/>
+  <w:num w:numId="6">
+    <w:abstractNumId w:val="9"/>
   </w:num>
-  <w:num w:numId="4">
+  <w:num w:numId="7">
+    <w:abstractNumId w:val="7"/>
+  </w:num>
+  <w:num w:numId="8">
+    <w:abstractNumId w:val="5"/>
+  </w:num>
+  <w:num w:numId="9">
+    <w:abstractNumId w:val="13"/>
+  </w:num>
+  <w:num w:numId="10">
+    <w:abstractNumId w:val="12"/>
+  </w:num>
+  <w:num w:numId="11">
+    <w:abstractNumId w:val="10"/>
+  </w:num>
+  <w:num w:numId="12">
     <w:abstractNumId w:val="3"/>
+  </w:num>
+  <w:num w:numId="13">
+    <w:abstractNumId w:val="4"/>
+  </w:num>
+  <w:num w:numId="14">
+    <w:abstractNumId w:val="11"/>
   </w:num>
 </w:numbering>
 </file>
 
 <file path=word/styles.xml><?xml version="1.0" encoding="utf-8"?>
-<w:styles xmlns:mc="http://schemas.openxmlformats.org/markup-compatibility/2006" xmlns:r="http://schemas.openxmlformats.org/officeDocument/2006/relationships" xmlns:w="http://schemas.openxmlformats.org/wordprocessingml/2006/main" xmlns:w14="http://schemas.microsoft.com/office/word/2010/wordml" xmlns:w15="http://schemas.microsoft.com/office/word/2012/wordml" xmlns:w16cid="http://schemas.microsoft.com/office/word/2016/wordml/cid" xmlns:w16se="http://schemas.microsoft.com/office/word/2015/wordml/symex" mc:Ignorable="w14 w15 w16se w16cid">
+<w:styles xmlns:mc="http://schemas.openxmlformats.org/markup-compatibility/2006" xmlns:r="http://schemas.openxmlformats.org/officeDocument/2006/relationships" xmlns:w="http://schemas.openxmlformats.org/wordprocessingml/2006/main" xmlns:w14="http://schemas.microsoft.com/office/word/2010/wordml" xmlns:w15="http://schemas.microsoft.com/office/word/2012/wordml" xmlns:w16se="http://schemas.microsoft.com/office/word/2015/wordml/symex" mc:Ignorable="w14 w15 w16se">
   <w:docDefaults>
     <w:rPrDefault>
       <w:rPr>
@@ -1403,7 +2637,7 @@
       </w:pPr>
     </w:pPrDefault>
   </w:docDefaults>
-  <w:latentStyles w:defLockedState="0" w:defUIPriority="99" w:defSemiHidden="0" w:defUnhideWhenUsed="0" w:defQFormat="0" w:count="375">
+  <w:latentStyles w:defLockedState="0" w:defUIPriority="99" w:defSemiHidden="0" w:defUnhideWhenUsed="0" w:defQFormat="0" w:count="371">
     <w:lsdException w:name="Normal" w:uiPriority="0" w:qFormat="1"/>
     <w:lsdException w:name="heading 1" w:uiPriority="9" w:qFormat="1"/>
     <w:lsdException w:name="heading 2" w:semiHidden="1" w:uiPriority="9" w:unhideWhenUsed="1" w:qFormat="1"/>
@@ -1775,10 +3009,6 @@
     <w:lsdException w:name="List Table 5 Dark Accent 6" w:uiPriority="50"/>
     <w:lsdException w:name="List Table 6 Colorful Accent 6" w:uiPriority="51"/>
     <w:lsdException w:name="List Table 7 Colorful Accent 6" w:uiPriority="52"/>
-    <w:lsdException w:name="Mention" w:semiHidden="1" w:unhideWhenUsed="1"/>
-    <w:lsdException w:name="Smart Hyperlink" w:semiHidden="1" w:unhideWhenUsed="1"/>
-    <w:lsdException w:name="Hashtag" w:semiHidden="1" w:unhideWhenUsed="1"/>
-    <w:lsdException w:name="Unresolved Mention" w:semiHidden="1" w:unhideWhenUsed="1"/>
   </w:latentStyles>
   <w:style w:type="paragraph" w:default="1" w:styleId="Normal">
     <w:name w:val="Normal"/>
@@ -1833,7 +3063,7 @@
       <w:u w:val="single"/>
     </w:rPr>
   </w:style>
-  <w:style w:type="character" w:styleId="MenoPendente">
+  <w:style w:type="character" w:customStyle="1" w:styleId="UnresolvedMention">
     <w:name w:val="Unresolved Mention"/>
     <w:basedOn w:val="Fontepargpadro"/>
     <w:uiPriority w:val="99"/>

</xml_diff>

<commit_message>
feat: adiciona formtação adequada para a capa e folha de rosto
</commit_message>
<xml_diff>
--- a/Documentação.docx
+++ b/Documentação.docx
@@ -1,6 +1,6 @@
 
 <file path=word/document.xml><?xml version="1.0" encoding="utf-8"?>
-<w:document xmlns:wpc="http://schemas.microsoft.com/office/word/2010/wordprocessingCanvas" xmlns:cx="http://schemas.microsoft.com/office/drawing/2014/chartex" xmlns:cx1="http://schemas.microsoft.com/office/drawing/2015/9/8/chartex" xmlns:cx2="http://schemas.microsoft.com/office/drawing/2015/10/21/chartex" xmlns:cx3="http://schemas.microsoft.com/office/drawing/2016/5/9/chartex" xmlns:cx4="http://schemas.microsoft.com/office/drawing/2016/5/10/chartex" xmlns:cx5="http://schemas.microsoft.com/office/drawing/2016/5/11/chartex" xmlns:cx6="http://schemas.microsoft.com/office/drawing/2016/5/12/chartex" xmlns:cx7="http://schemas.microsoft.com/office/drawing/2016/5/13/chartex" xmlns:cx8="http://schemas.microsoft.com/office/drawing/2016/5/14/chartex" xmlns:mc="http://schemas.openxmlformats.org/markup-compatibility/2006" xmlns:aink="http://schemas.microsoft.com/office/drawing/2016/ink" xmlns:am3d="http://schemas.microsoft.com/office/drawing/2017/model3d" xmlns:o="urn:schemas-microsoft-com:office:office" xmlns:r="http://schemas.openxmlformats.org/officeDocument/2006/relationships" xmlns:m="http://schemas.openxmlformats.org/officeDocument/2006/math" xmlns:v="urn:schemas-microsoft-com:vml" xmlns:wp14="http://schemas.microsoft.com/office/word/2010/wordprocessingDrawing" xmlns:wp="http://schemas.openxmlformats.org/drawingml/2006/wordprocessingDrawing" xmlns:w10="urn:schemas-microsoft-com:office:word" xmlns:w="http://schemas.openxmlformats.org/wordprocessingml/2006/main" xmlns:w14="http://schemas.microsoft.com/office/word/2010/wordml" xmlns:w15="http://schemas.microsoft.com/office/word/2012/wordml" xmlns:w16cid="http://schemas.microsoft.com/office/word/2016/wordml/cid" xmlns:w16se="http://schemas.microsoft.com/office/word/2015/wordml/symex" xmlns:wpg="http://schemas.microsoft.com/office/word/2010/wordprocessingGroup" xmlns:wpi="http://schemas.microsoft.com/office/word/2010/wordprocessingInk" xmlns:wne="http://schemas.microsoft.com/office/word/2006/wordml" xmlns:wps="http://schemas.microsoft.com/office/word/2010/wordprocessingShape" mc:Ignorable="w14 w15 w16se w16cid wp14">
+<w:document xmlns:wpc="http://schemas.microsoft.com/office/word/2010/wordprocessingCanvas" xmlns:cx="http://schemas.microsoft.com/office/drawing/2014/chartex" xmlns:cx1="http://schemas.microsoft.com/office/drawing/2015/9/8/chartex" xmlns:cx2="http://schemas.microsoft.com/office/drawing/2015/10/21/chartex" xmlns:cx3="http://schemas.microsoft.com/office/drawing/2016/5/9/chartex" xmlns:cx4="http://schemas.microsoft.com/office/drawing/2016/5/10/chartex" xmlns:cx5="http://schemas.microsoft.com/office/drawing/2016/5/11/chartex" xmlns:cx6="http://schemas.microsoft.com/office/drawing/2016/5/12/chartex" xmlns:cx7="http://schemas.microsoft.com/office/drawing/2016/5/13/chartex" xmlns:cx8="http://schemas.microsoft.com/office/drawing/2016/5/14/chartex" xmlns:mc="http://schemas.openxmlformats.org/markup-compatibility/2006" xmlns:aink="http://schemas.microsoft.com/office/drawing/2016/ink" xmlns:am3d="http://schemas.microsoft.com/office/drawing/2017/model3d" xmlns:o="urn:schemas-microsoft-com:office:office" xmlns:oel="http://schemas.microsoft.com/office/2019/extlst" xmlns:r="http://schemas.openxmlformats.org/officeDocument/2006/relationships" xmlns:m="http://schemas.openxmlformats.org/officeDocument/2006/math" xmlns:v="urn:schemas-microsoft-com:vml" xmlns:wp14="http://schemas.microsoft.com/office/word/2010/wordprocessingDrawing" xmlns:wp="http://schemas.openxmlformats.org/drawingml/2006/wordprocessingDrawing" xmlns:w10="urn:schemas-microsoft-com:office:word" xmlns:w="http://schemas.openxmlformats.org/wordprocessingml/2006/main" xmlns:w14="http://schemas.microsoft.com/office/word/2010/wordml" xmlns:w15="http://schemas.microsoft.com/office/word/2012/wordml" xmlns:w16cex="http://schemas.microsoft.com/office/word/2018/wordml/cex" xmlns:w16cid="http://schemas.microsoft.com/office/word/2016/wordml/cid" xmlns:w16="http://schemas.microsoft.com/office/word/2018/wordml" xmlns:w16sdtdh="http://schemas.microsoft.com/office/word/2020/wordml/sdtdatahash" xmlns:w16se="http://schemas.microsoft.com/office/word/2015/wordml/symex" xmlns:wpg="http://schemas.microsoft.com/office/word/2010/wordprocessingGroup" xmlns:wpi="http://schemas.microsoft.com/office/word/2010/wordprocessingInk" xmlns:wne="http://schemas.microsoft.com/office/word/2006/wordml" xmlns:wps="http://schemas.microsoft.com/office/word/2010/wordprocessingShape" mc:Ignorable="w14 w15 w16se w16cid w16 w16cex w16sdtdh wp14">
   <w:body>
     <w:p>
       <w:pPr>
@@ -9,37 +9,132 @@
         <w:rPr>
           <w:rFonts w:ascii="Arial" w:hAnsi="Arial" w:cs="Arial"/>
           <w:b/>
-          <w:sz w:val="28"/>
-          <w:szCs w:val="28"/>
+          <w:sz w:val="24"/>
+          <w:szCs w:val="24"/>
         </w:rPr>
       </w:pPr>
       <w:r>
         <w:rPr>
           <w:rFonts w:ascii="Arial" w:hAnsi="Arial" w:cs="Arial"/>
           <w:b/>
-          <w:sz w:val="28"/>
-          <w:szCs w:val="28"/>
-        </w:rPr>
-        <w:t>CENTRO PAUL</w:t>
+          <w:sz w:val="24"/>
+          <w:szCs w:val="24"/>
+        </w:rPr>
+        <w:t xml:space="preserve">ETEC </w:t>
       </w:r>
       <w:r>
         <w:rPr>
           <w:rFonts w:ascii="Arial" w:hAnsi="Arial" w:cs="Arial"/>
           <w:b/>
-          <w:sz w:val="28"/>
-          <w:szCs w:val="28"/>
-        </w:rPr>
-        <w:t>A</w:t>
-      </w:r>
-      <w:r>
+          <w:sz w:val="24"/>
+          <w:szCs w:val="24"/>
+        </w:rPr>
+        <w:t>PROFESSOR CAMARGO ARANHA</w:t>
+      </w:r>
+    </w:p>
+    <w:p>
+      <w:pPr>
+        <w:spacing w:after="0" w:line="360" w:lineRule="auto"/>
+        <w:jc w:val="center"/>
+        <w:rPr>
+          <w:rFonts w:ascii="Arial" w:hAnsi="Arial" w:cs="Arial"/>
+          <w:bCs/>
+          <w:sz w:val="24"/>
+          <w:szCs w:val="24"/>
+        </w:rPr>
+      </w:pPr>
+      <w:r>
+        <w:rPr>
+          <w:rFonts w:ascii="Arial" w:hAnsi="Arial" w:cs="Arial"/>
+          <w:bCs/>
+          <w:sz w:val="24"/>
+          <w:szCs w:val="24"/>
+        </w:rPr>
+        <w:t>DESENVOLVIMENTO DE SISTEMAS</w:t>
+      </w:r>
+    </w:p>
+    <w:p>
+      <w:pPr>
+        <w:spacing w:after="0" w:line="360" w:lineRule="auto"/>
+        <w:jc w:val="center"/>
+        <w:rPr>
+          <w:rFonts w:ascii="Arial" w:hAnsi="Arial" w:cs="Arial"/>
+          <w:sz w:val="24"/>
+          <w:szCs w:val="24"/>
+        </w:rPr>
+      </w:pPr>
+    </w:p>
+    <w:p>
+      <w:pPr>
+        <w:spacing w:after="0" w:line="360" w:lineRule="auto"/>
+        <w:jc w:val="center"/>
         <w:rPr>
           <w:rFonts w:ascii="Arial" w:hAnsi="Arial" w:cs="Arial"/>
           <w:b/>
-          <w:sz w:val="28"/>
-          <w:szCs w:val="28"/>
-        </w:rPr>
-        <w:t xml:space="preserve"> SOUZA</w:t>
-      </w:r>
+          <w:sz w:val="24"/>
+          <w:szCs w:val="24"/>
+        </w:rPr>
+      </w:pPr>
+    </w:p>
+    <w:p>
+      <w:pPr>
+        <w:spacing w:after="0" w:line="360" w:lineRule="auto"/>
+        <w:jc w:val="center"/>
+        <w:rPr>
+          <w:rFonts w:ascii="Arial" w:hAnsi="Arial" w:cs="Arial"/>
+          <w:bCs/>
+          <w:sz w:val="24"/>
+          <w:szCs w:val="24"/>
+        </w:rPr>
+      </w:pPr>
+    </w:p>
+    <w:p>
+      <w:pPr>
+        <w:spacing w:after="0" w:line="360" w:lineRule="auto"/>
+        <w:jc w:val="center"/>
+        <w:rPr>
+          <w:rFonts w:ascii="Arial" w:hAnsi="Arial" w:cs="Arial"/>
+          <w:bCs/>
+          <w:sz w:val="24"/>
+          <w:szCs w:val="24"/>
+        </w:rPr>
+      </w:pPr>
+    </w:p>
+    <w:p>
+      <w:pPr>
+        <w:spacing w:after="0" w:line="360" w:lineRule="auto"/>
+        <w:jc w:val="center"/>
+        <w:rPr>
+          <w:rFonts w:ascii="Arial" w:hAnsi="Arial" w:cs="Arial"/>
+          <w:bCs/>
+          <w:sz w:val="24"/>
+          <w:szCs w:val="24"/>
+        </w:rPr>
+      </w:pPr>
+    </w:p>
+    <w:p>
+      <w:pPr>
+        <w:spacing w:after="0" w:line="360" w:lineRule="auto"/>
+        <w:jc w:val="center"/>
+        <w:rPr>
+          <w:rFonts w:ascii="Arial" w:hAnsi="Arial" w:cs="Arial"/>
+          <w:bCs/>
+          <w:sz w:val="24"/>
+          <w:szCs w:val="24"/>
+        </w:rPr>
+      </w:pPr>
+    </w:p>
+    <w:p>
+      <w:pPr>
+        <w:spacing w:after="0" w:line="360" w:lineRule="auto"/>
+        <w:jc w:val="center"/>
+        <w:rPr>
+          <w:rFonts w:ascii="Arial" w:hAnsi="Arial" w:cs="Arial"/>
+          <w:bCs/>
+          <w:sz w:val="24"/>
+          <w:szCs w:val="24"/>
+        </w:rPr>
+      </w:pPr>
     </w:p>
     <w:p>
       <w:pPr>
@@ -48,28 +143,179 @@
         <w:rPr>
           <w:rFonts w:ascii="Arial" w:hAnsi="Arial" w:cs="Arial"/>
           <w:b/>
-          <w:sz w:val="28"/>
-          <w:szCs w:val="28"/>
-        </w:rPr>
-      </w:pPr>
+          <w:sz w:val="24"/>
+          <w:szCs w:val="24"/>
+        </w:rPr>
+      </w:pPr>
+      <w:r>
+        <w:rPr>
+          <w:rFonts w:ascii="Arial" w:hAnsi="Arial" w:cs="Arial"/>
+          <w:bCs/>
+          <w:sz w:val="24"/>
+          <w:szCs w:val="24"/>
+        </w:rPr>
+        <w:t xml:space="preserve">Bryan Diego Vino </w:t>
+      </w:r>
+      <w:proofErr w:type="spellStart"/>
+      <w:r>
+        <w:rPr>
+          <w:rFonts w:ascii="Arial" w:hAnsi="Arial" w:cs="Arial"/>
+          <w:bCs/>
+          <w:sz w:val="24"/>
+          <w:szCs w:val="24"/>
+        </w:rPr>
+        <w:t>Lustri</w:t>
+      </w:r>
+      <w:proofErr w:type="spellEnd"/>
+      <w:r>
+        <w:rPr>
+          <w:rFonts w:ascii="Arial" w:hAnsi="Arial" w:cs="Arial"/>
+          <w:bCs/>
+          <w:sz w:val="24"/>
+          <w:szCs w:val="24"/>
+        </w:rPr>
+        <w:br/>
+      </w:r>
+      <w:r>
+        <w:rPr>
+          <w:rFonts w:ascii="Arial" w:hAnsi="Arial" w:cs="Arial"/>
+          <w:bCs/>
+          <w:sz w:val="24"/>
+          <w:szCs w:val="24"/>
+        </w:rPr>
+        <w:t>Davi Tavares Nascimento Bess</w:t>
+      </w:r>
+      <w:r>
+        <w:rPr>
+          <w:rFonts w:ascii="Arial" w:hAnsi="Arial" w:cs="Arial"/>
+          <w:bCs/>
+          <w:sz w:val="24"/>
+          <w:szCs w:val="24"/>
+        </w:rPr>
+        <w:t>a</w:t>
+      </w:r>
+      <w:r>
+        <w:rPr>
+          <w:rFonts w:ascii="Arial" w:hAnsi="Arial" w:cs="Arial"/>
+          <w:bCs/>
+          <w:sz w:val="24"/>
+          <w:szCs w:val="24"/>
+        </w:rPr>
+        <w:br/>
+      </w:r>
+      <w:r>
+        <w:rPr>
+          <w:rFonts w:ascii="Arial" w:hAnsi="Arial" w:cs="Arial"/>
+          <w:bCs/>
+          <w:sz w:val="24"/>
+          <w:szCs w:val="24"/>
+        </w:rPr>
+        <w:t>Felipe Rocha Gomes</w:t>
+      </w:r>
+      <w:r>
+        <w:rPr>
+          <w:rFonts w:ascii="Arial" w:hAnsi="Arial" w:cs="Arial"/>
+          <w:bCs/>
+          <w:sz w:val="24"/>
+          <w:szCs w:val="24"/>
+        </w:rPr>
+        <w:br/>
+      </w:r>
+      <w:r>
+        <w:rPr>
+          <w:rFonts w:ascii="Arial" w:hAnsi="Arial" w:cs="Arial"/>
+          <w:bCs/>
+          <w:sz w:val="24"/>
+          <w:szCs w:val="24"/>
+        </w:rPr>
+        <w:t>Fernando Fiani de Pina Saraiva</w:t>
+      </w:r>
+      <w:r>
+        <w:rPr>
+          <w:rFonts w:ascii="Arial" w:hAnsi="Arial" w:cs="Arial"/>
+          <w:bCs/>
+          <w:sz w:val="24"/>
+          <w:szCs w:val="24"/>
+        </w:rPr>
+        <w:t xml:space="preserve"> </w:t>
+      </w:r>
+      <w:r>
+        <w:rPr>
+          <w:rFonts w:ascii="Arial" w:hAnsi="Arial" w:cs="Arial"/>
+          <w:bCs/>
+          <w:sz w:val="24"/>
+          <w:szCs w:val="24"/>
+        </w:rPr>
+        <w:br/>
+      </w:r>
+      <w:r>
+        <w:rPr>
+          <w:rFonts w:ascii="Arial" w:hAnsi="Arial" w:cs="Arial"/>
+          <w:bCs/>
+          <w:sz w:val="24"/>
+          <w:szCs w:val="24"/>
+        </w:rPr>
+        <w:t>João Vitor Vale de Jesus</w:t>
+      </w:r>
+      <w:r>
+        <w:rPr>
+          <w:rFonts w:ascii="Arial" w:hAnsi="Arial" w:cs="Arial"/>
+          <w:bCs/>
+          <w:sz w:val="24"/>
+          <w:szCs w:val="24"/>
+        </w:rPr>
+        <w:br/>
+      </w:r>
+      <w:r>
+        <w:rPr>
+          <w:rFonts w:ascii="Arial" w:hAnsi="Arial" w:cs="Arial"/>
+          <w:bCs/>
+          <w:sz w:val="24"/>
+          <w:szCs w:val="24"/>
+        </w:rPr>
+        <w:t xml:space="preserve">Leonardo </w:t>
+      </w:r>
+      <w:proofErr w:type="spellStart"/>
+      <w:r>
+        <w:rPr>
+          <w:rFonts w:ascii="Arial" w:hAnsi="Arial" w:cs="Arial"/>
+          <w:bCs/>
+          <w:sz w:val="24"/>
+          <w:szCs w:val="24"/>
+        </w:rPr>
+        <w:t>Buso</w:t>
+      </w:r>
+      <w:proofErr w:type="spellEnd"/>
+      <w:r>
+        <w:rPr>
+          <w:rFonts w:ascii="Arial" w:hAnsi="Arial" w:cs="Arial"/>
+          <w:bCs/>
+          <w:sz w:val="24"/>
+          <w:szCs w:val="24"/>
+        </w:rPr>
+        <w:t xml:space="preserve"> de Sousa </w:t>
+      </w:r>
       <w:r>
         <w:rPr>
           <w:rFonts w:ascii="Arial" w:hAnsi="Arial" w:cs="Arial"/>
           <w:b/>
-          <w:sz w:val="28"/>
-          <w:szCs w:val="28"/>
-        </w:rPr>
-        <w:t xml:space="preserve">ETEC </w:t>
-      </w:r>
-      <w:r>
+          <w:sz w:val="24"/>
+          <w:szCs w:val="24"/>
+        </w:rPr>
+        <w:br/>
+      </w:r>
+    </w:p>
+    <w:p>
+      <w:pPr>
+        <w:spacing w:after="0" w:line="360" w:lineRule="auto"/>
+        <w:jc w:val="center"/>
         <w:rPr>
           <w:rFonts w:ascii="Arial" w:hAnsi="Arial" w:cs="Arial"/>
           <w:b/>
-          <w:sz w:val="28"/>
-          <w:szCs w:val="28"/>
-        </w:rPr>
-        <w:t>PROFESSOR CAMARGO ARANHA</w:t>
-      </w:r>
+          <w:sz w:val="24"/>
+          <w:szCs w:val="24"/>
+        </w:rPr>
+      </w:pPr>
     </w:p>
     <w:p>
       <w:pPr>
@@ -78,46 +324,55 @@
         <w:rPr>
           <w:rFonts w:ascii="Arial" w:hAnsi="Arial" w:cs="Arial"/>
           <w:b/>
-          <w:sz w:val="28"/>
-          <w:szCs w:val="28"/>
-        </w:rPr>
-      </w:pPr>
-      <w:r>
+          <w:sz w:val="24"/>
+          <w:szCs w:val="24"/>
+        </w:rPr>
+      </w:pPr>
+    </w:p>
+    <w:p>
+      <w:pPr>
+        <w:spacing w:after="0" w:line="360" w:lineRule="auto"/>
+        <w:jc w:val="center"/>
         <w:rPr>
           <w:rFonts w:ascii="Arial" w:hAnsi="Arial" w:cs="Arial"/>
           <w:b/>
-          <w:sz w:val="28"/>
-          <w:szCs w:val="28"/>
-        </w:rPr>
-        <w:t>Curso</w:t>
-      </w:r>
-      <w:r>
+          <w:sz w:val="24"/>
+          <w:szCs w:val="24"/>
+        </w:rPr>
+      </w:pPr>
+    </w:p>
+    <w:p>
+      <w:pPr>
+        <w:spacing w:after="0" w:line="360" w:lineRule="auto"/>
+        <w:jc w:val="center"/>
         <w:rPr>
           <w:rFonts w:ascii="Arial" w:hAnsi="Arial" w:cs="Arial"/>
           <w:b/>
-          <w:sz w:val="28"/>
-          <w:szCs w:val="28"/>
-        </w:rPr>
-        <w:t xml:space="preserve"> técnico em</w:t>
-      </w:r>
-      <w:r>
+          <w:sz w:val="24"/>
+          <w:szCs w:val="24"/>
+        </w:rPr>
+      </w:pPr>
+      <w:commentRangeStart w:id="0"/>
+      <w:commentRangeEnd w:id="0"/>
+      <w:r>
+        <w:rPr>
+          <w:rStyle w:val="Refdecomentrio"/>
+          <w:rFonts w:ascii="Arial" w:hAnsi="Arial" w:cs="Arial"/>
+          <w:sz w:val="24"/>
+          <w:szCs w:val="24"/>
+        </w:rPr>
+        <w:commentReference w:id="0"/>
+      </w:r>
+    </w:p>
+    <w:p>
+      <w:pPr>
+        <w:spacing w:after="0" w:line="360" w:lineRule="auto"/>
+        <w:jc w:val="center"/>
         <w:rPr>
           <w:rFonts w:ascii="Arial" w:hAnsi="Arial" w:cs="Arial"/>
           <w:b/>
-          <w:sz w:val="28"/>
-          <w:szCs w:val="28"/>
-        </w:rPr>
-        <w:t xml:space="preserve"> desenvolvimento de sistemas</w:t>
-      </w:r>
-    </w:p>
-    <w:p>
-      <w:pPr>
-        <w:spacing w:after="0" w:line="360" w:lineRule="auto"/>
-        <w:jc w:val="center"/>
-        <w:rPr>
-          <w:rFonts w:ascii="Arial" w:hAnsi="Arial" w:cs="Arial"/>
-          <w:sz w:val="28"/>
-          <w:szCs w:val="28"/>
+          <w:sz w:val="24"/>
+          <w:szCs w:val="24"/>
         </w:rPr>
       </w:pPr>
     </w:p>
@@ -128,8 +383,8 @@
         <w:rPr>
           <w:rFonts w:ascii="Arial" w:hAnsi="Arial" w:cs="Arial"/>
           <w:b/>
-          <w:sz w:val="28"/>
-          <w:szCs w:val="28"/>
+          <w:sz w:val="24"/>
+          <w:szCs w:val="24"/>
         </w:rPr>
       </w:pPr>
     </w:p>
@@ -140,48 +395,786 @@
         <w:rPr>
           <w:rFonts w:ascii="Arial" w:hAnsi="Arial" w:cs="Arial"/>
           <w:b/>
-          <w:sz w:val="28"/>
-          <w:szCs w:val="28"/>
-        </w:rPr>
-      </w:pPr>
-    </w:p>
-    <w:p>
-      <w:pPr>
-        <w:spacing w:after="0" w:line="360" w:lineRule="auto"/>
-        <w:jc w:val="center"/>
+          <w:sz w:val="24"/>
+          <w:szCs w:val="24"/>
+        </w:rPr>
+      </w:pPr>
+      <w:r>
         <w:rPr>
           <w:rFonts w:ascii="Arial" w:hAnsi="Arial" w:cs="Arial"/>
           <w:b/>
-          <w:sz w:val="28"/>
-          <w:szCs w:val="28"/>
-        </w:rPr>
-      </w:pPr>
+          <w:sz w:val="24"/>
+          <w:szCs w:val="24"/>
+        </w:rPr>
+        <w:t xml:space="preserve">TEA </w:t>
+      </w:r>
       <w:r>
         <w:rPr>
           <w:rFonts w:ascii="Arial" w:hAnsi="Arial" w:cs="Arial"/>
           <w:b/>
-          <w:sz w:val="28"/>
-          <w:szCs w:val="28"/>
-        </w:rPr>
-        <w:t xml:space="preserve">Bryan Diego </w:t>
+          <w:sz w:val="24"/>
+          <w:szCs w:val="24"/>
+        </w:rPr>
+        <w:t>LEARN</w:t>
+      </w:r>
+    </w:p>
+    <w:p>
+      <w:pPr>
+        <w:spacing w:after="0" w:line="360" w:lineRule="auto"/>
+        <w:jc w:val="center"/>
+        <w:rPr>
+          <w:rFonts w:ascii="Arial" w:hAnsi="Arial" w:cs="Arial"/>
+          <w:bCs/>
+          <w:sz w:val="24"/>
+          <w:szCs w:val="24"/>
+        </w:rPr>
+      </w:pPr>
+      <w:r>
+        <w:rPr>
+          <w:rFonts w:ascii="Arial" w:hAnsi="Arial" w:cs="Arial"/>
+          <w:bCs/>
+          <w:sz w:val="24"/>
+          <w:szCs w:val="24"/>
+        </w:rPr>
+        <w:t>PLATAFORMA DE ADAPTAÇÃO DIDÁTICA COM IA PARA ALUNOS COM TEA</w:t>
+      </w:r>
+    </w:p>
+    <w:p>
+      <w:pPr>
+        <w:spacing w:after="0" w:line="360" w:lineRule="auto"/>
+        <w:jc w:val="center"/>
+        <w:rPr>
+          <w:rFonts w:ascii="Arial" w:hAnsi="Arial" w:cs="Arial"/>
+          <w:sz w:val="24"/>
+          <w:szCs w:val="24"/>
+        </w:rPr>
+      </w:pPr>
+    </w:p>
+    <w:p>
+      <w:pPr>
+        <w:spacing w:after="0" w:line="360" w:lineRule="auto"/>
+        <w:jc w:val="center"/>
+        <w:rPr>
+          <w:rFonts w:ascii="Arial" w:hAnsi="Arial" w:cs="Arial"/>
+          <w:sz w:val="24"/>
+          <w:szCs w:val="24"/>
+        </w:rPr>
+      </w:pPr>
+    </w:p>
+    <w:p>
+      <w:pPr>
+        <w:spacing w:after="0" w:line="360" w:lineRule="auto"/>
+        <w:jc w:val="center"/>
+        <w:rPr>
+          <w:rFonts w:ascii="Arial" w:hAnsi="Arial" w:cs="Arial"/>
+          <w:sz w:val="24"/>
+          <w:szCs w:val="24"/>
+        </w:rPr>
+      </w:pPr>
+    </w:p>
+    <w:p>
+      <w:pPr>
+        <w:spacing w:after="0" w:line="360" w:lineRule="auto"/>
+        <w:jc w:val="center"/>
+        <w:rPr>
+          <w:rFonts w:ascii="Arial" w:hAnsi="Arial" w:cs="Arial"/>
+          <w:b/>
+          <w:sz w:val="24"/>
+          <w:szCs w:val="24"/>
+        </w:rPr>
+      </w:pPr>
+    </w:p>
+    <w:p>
+      <w:pPr>
+        <w:spacing w:after="0" w:line="360" w:lineRule="auto"/>
+        <w:jc w:val="center"/>
+        <w:rPr>
+          <w:rFonts w:ascii="Arial" w:hAnsi="Arial" w:cs="Arial"/>
+          <w:b/>
+          <w:sz w:val="24"/>
+          <w:szCs w:val="24"/>
+        </w:rPr>
+      </w:pPr>
+    </w:p>
+    <w:p>
+      <w:pPr>
+        <w:spacing w:after="0" w:line="360" w:lineRule="auto"/>
+        <w:jc w:val="center"/>
+        <w:rPr>
+          <w:rFonts w:ascii="Arial" w:hAnsi="Arial" w:cs="Arial"/>
+          <w:b/>
+          <w:sz w:val="24"/>
+          <w:szCs w:val="24"/>
+        </w:rPr>
+      </w:pPr>
+    </w:p>
+    <w:p>
+      <w:pPr>
+        <w:spacing w:after="0" w:line="360" w:lineRule="auto"/>
+        <w:jc w:val="center"/>
+        <w:rPr>
+          <w:rFonts w:ascii="Arial" w:hAnsi="Arial" w:cs="Arial"/>
+          <w:b/>
+          <w:sz w:val="24"/>
+          <w:szCs w:val="24"/>
+        </w:rPr>
+      </w:pPr>
+    </w:p>
+    <w:p>
+      <w:pPr>
+        <w:spacing w:after="0" w:line="360" w:lineRule="auto"/>
+        <w:jc w:val="center"/>
+        <w:rPr>
+          <w:rFonts w:ascii="Arial" w:hAnsi="Arial" w:cs="Arial"/>
+          <w:b/>
+          <w:sz w:val="24"/>
+          <w:szCs w:val="24"/>
+        </w:rPr>
+      </w:pPr>
+    </w:p>
+    <w:p>
+      <w:pPr>
+        <w:spacing w:after="0" w:line="360" w:lineRule="auto"/>
+        <w:jc w:val="center"/>
+        <w:rPr>
+          <w:rFonts w:ascii="Arial" w:hAnsi="Arial" w:cs="Arial"/>
+          <w:bCs/>
+          <w:sz w:val="24"/>
+          <w:szCs w:val="24"/>
+        </w:rPr>
+      </w:pPr>
+      <w:r>
+        <w:rPr>
+          <w:rFonts w:ascii="Arial" w:hAnsi="Arial" w:cs="Arial"/>
+          <w:bCs/>
+          <w:sz w:val="24"/>
+          <w:szCs w:val="24"/>
+        </w:rPr>
+        <w:t>S</w:t>
+      </w:r>
+      <w:r>
+        <w:rPr>
+          <w:rFonts w:ascii="Arial" w:hAnsi="Arial" w:cs="Arial"/>
+          <w:bCs/>
+          <w:sz w:val="24"/>
+          <w:szCs w:val="24"/>
+        </w:rPr>
+        <w:t>ÃO PAULO - SP</w:t>
+      </w:r>
+    </w:p>
+    <w:p>
+      <w:pPr>
+        <w:spacing w:after="0" w:line="360" w:lineRule="auto"/>
+        <w:jc w:val="center"/>
+        <w:rPr>
+          <w:rFonts w:ascii="Arial" w:hAnsi="Arial" w:cs="Arial"/>
+          <w:bCs/>
+          <w:sz w:val="24"/>
+          <w:szCs w:val="24"/>
+        </w:rPr>
+      </w:pPr>
+      <w:r>
+        <w:rPr>
+          <w:rFonts w:ascii="Arial" w:hAnsi="Arial" w:cs="Arial"/>
+          <w:bCs/>
+          <w:sz w:val="24"/>
+          <w:szCs w:val="24"/>
+        </w:rPr>
+        <w:t>2026</w:t>
+      </w:r>
+    </w:p>
+    <w:p>
+      <w:pPr>
+        <w:spacing w:after="0" w:line="360" w:lineRule="auto"/>
+        <w:jc w:val="center"/>
+        <w:rPr>
+          <w:rFonts w:ascii="Arial" w:hAnsi="Arial" w:cs="Arial"/>
+          <w:bCs/>
+          <w:sz w:val="24"/>
+          <w:szCs w:val="24"/>
+        </w:rPr>
+      </w:pPr>
+      <w:r>
+        <w:rPr>
+          <w:rFonts w:ascii="Arial" w:hAnsi="Arial" w:cs="Arial"/>
+          <w:bCs/>
+          <w:sz w:val="24"/>
+          <w:szCs w:val="24"/>
+        </w:rPr>
+        <w:lastRenderedPageBreak/>
+        <w:t xml:space="preserve">Bryan Diego Vino </w:t>
       </w:r>
       <w:proofErr w:type="spellStart"/>
       <w:r>
         <w:rPr>
           <w:rFonts w:ascii="Arial" w:hAnsi="Arial" w:cs="Arial"/>
+          <w:bCs/>
+          <w:sz w:val="24"/>
+          <w:szCs w:val="24"/>
+        </w:rPr>
+        <w:t>Lustri</w:t>
+      </w:r>
+      <w:proofErr w:type="spellEnd"/>
+      <w:r>
+        <w:rPr>
+          <w:rFonts w:ascii="Arial" w:hAnsi="Arial" w:cs="Arial"/>
+          <w:bCs/>
+          <w:sz w:val="24"/>
+          <w:szCs w:val="24"/>
+        </w:rPr>
+        <w:br/>
+        <w:t>Davi Tavares Nascimento Bessa</w:t>
+      </w:r>
+      <w:r>
+        <w:rPr>
+          <w:rFonts w:ascii="Arial" w:hAnsi="Arial" w:cs="Arial"/>
+          <w:bCs/>
+          <w:sz w:val="24"/>
+          <w:szCs w:val="24"/>
+        </w:rPr>
+        <w:br/>
+        <w:t>Felipe Rocha Gomes</w:t>
+      </w:r>
+      <w:r>
+        <w:rPr>
+          <w:rFonts w:ascii="Arial" w:hAnsi="Arial" w:cs="Arial"/>
+          <w:bCs/>
+          <w:sz w:val="24"/>
+          <w:szCs w:val="24"/>
+        </w:rPr>
+        <w:br/>
+        <w:t xml:space="preserve">Fernando Fiani de Pina Saraiva </w:t>
+      </w:r>
+      <w:r>
+        <w:rPr>
+          <w:rFonts w:ascii="Arial" w:hAnsi="Arial" w:cs="Arial"/>
+          <w:bCs/>
+          <w:sz w:val="24"/>
+          <w:szCs w:val="24"/>
+        </w:rPr>
+        <w:br/>
+        <w:t>João Vitor Vale de Jesus</w:t>
+      </w:r>
+      <w:r>
+        <w:rPr>
+          <w:rFonts w:ascii="Arial" w:hAnsi="Arial" w:cs="Arial"/>
+          <w:bCs/>
+          <w:sz w:val="24"/>
+          <w:szCs w:val="24"/>
+        </w:rPr>
+        <w:br/>
+        <w:t xml:space="preserve">Leonardo </w:t>
+      </w:r>
+      <w:proofErr w:type="spellStart"/>
+      <w:r>
+        <w:rPr>
+          <w:rFonts w:ascii="Arial" w:hAnsi="Arial" w:cs="Arial"/>
+          <w:bCs/>
+          <w:sz w:val="24"/>
+          <w:szCs w:val="24"/>
+        </w:rPr>
+        <w:t>Buso</w:t>
+      </w:r>
+      <w:proofErr w:type="spellEnd"/>
+      <w:r>
+        <w:rPr>
+          <w:rFonts w:ascii="Arial" w:hAnsi="Arial" w:cs="Arial"/>
+          <w:bCs/>
+          <w:sz w:val="24"/>
+          <w:szCs w:val="24"/>
+        </w:rPr>
+        <w:t xml:space="preserve"> de Sousa</w:t>
+      </w:r>
+    </w:p>
+    <w:p>
+      <w:pPr>
+        <w:spacing w:after="0" w:line="360" w:lineRule="auto"/>
+        <w:jc w:val="center"/>
+        <w:rPr>
+          <w:rFonts w:ascii="Arial" w:hAnsi="Arial" w:cs="Arial"/>
+          <w:bCs/>
+          <w:sz w:val="24"/>
+          <w:szCs w:val="24"/>
+        </w:rPr>
+      </w:pPr>
+    </w:p>
+    <w:p>
+      <w:pPr>
+        <w:spacing w:after="0" w:line="360" w:lineRule="auto"/>
+        <w:jc w:val="center"/>
+        <w:rPr>
+          <w:rFonts w:ascii="Arial" w:hAnsi="Arial" w:cs="Arial"/>
+          <w:sz w:val="24"/>
+          <w:szCs w:val="24"/>
+        </w:rPr>
+      </w:pPr>
+    </w:p>
+    <w:p>
+      <w:pPr>
+        <w:spacing w:after="0" w:line="360" w:lineRule="auto"/>
+        <w:jc w:val="center"/>
+        <w:rPr>
+          <w:rFonts w:ascii="Arial" w:hAnsi="Arial" w:cs="Arial"/>
           <w:b/>
-          <w:sz w:val="28"/>
-          <w:szCs w:val="28"/>
-        </w:rPr>
-        <w:t>Vino</w:t>
+          <w:sz w:val="24"/>
+          <w:szCs w:val="24"/>
+        </w:rPr>
+      </w:pPr>
+    </w:p>
+    <w:p>
+      <w:pPr>
+        <w:spacing w:after="0" w:line="360" w:lineRule="auto"/>
+        <w:jc w:val="center"/>
+        <w:rPr>
+          <w:rFonts w:ascii="Arial" w:hAnsi="Arial" w:cs="Arial"/>
+          <w:bCs/>
+          <w:sz w:val="24"/>
+          <w:szCs w:val="24"/>
+        </w:rPr>
+      </w:pPr>
+    </w:p>
+    <w:p>
+      <w:pPr>
+        <w:spacing w:after="0" w:line="360" w:lineRule="auto"/>
+        <w:jc w:val="center"/>
+        <w:rPr>
+          <w:rFonts w:ascii="Arial" w:hAnsi="Arial" w:cs="Arial"/>
+          <w:bCs/>
+          <w:sz w:val="24"/>
+          <w:szCs w:val="24"/>
+        </w:rPr>
+      </w:pPr>
+    </w:p>
+    <w:p>
+      <w:pPr>
+        <w:spacing w:after="0" w:line="360" w:lineRule="auto"/>
+        <w:jc w:val="center"/>
+        <w:rPr>
+          <w:rFonts w:ascii="Arial" w:hAnsi="Arial" w:cs="Arial"/>
+          <w:bCs/>
+          <w:sz w:val="24"/>
+          <w:szCs w:val="24"/>
+        </w:rPr>
+      </w:pPr>
+    </w:p>
+    <w:p>
+      <w:pPr>
+        <w:spacing w:after="0" w:line="360" w:lineRule="auto"/>
+        <w:jc w:val="center"/>
+        <w:rPr>
+          <w:rFonts w:ascii="Arial" w:hAnsi="Arial" w:cs="Arial"/>
+          <w:bCs/>
+          <w:sz w:val="24"/>
+          <w:szCs w:val="24"/>
+        </w:rPr>
+      </w:pPr>
+    </w:p>
+    <w:p>
+      <w:pPr>
+        <w:spacing w:after="0" w:line="360" w:lineRule="auto"/>
+        <w:jc w:val="center"/>
+        <w:rPr>
+          <w:rFonts w:ascii="Arial" w:hAnsi="Arial" w:cs="Arial"/>
+          <w:b/>
+          <w:sz w:val="24"/>
+          <w:szCs w:val="24"/>
+        </w:rPr>
+      </w:pPr>
+      <w:r>
+        <w:rPr>
+          <w:rFonts w:ascii="Arial" w:hAnsi="Arial" w:cs="Arial"/>
+          <w:b/>
+          <w:sz w:val="24"/>
+          <w:szCs w:val="24"/>
+        </w:rPr>
+        <w:t xml:space="preserve">TEA </w:t>
+      </w:r>
+      <w:r>
+        <w:rPr>
+          <w:rFonts w:ascii="Arial" w:hAnsi="Arial" w:cs="Arial"/>
+          <w:b/>
+          <w:sz w:val="24"/>
+          <w:szCs w:val="24"/>
+        </w:rPr>
+        <w:t>LEARN</w:t>
+      </w:r>
+    </w:p>
+    <w:p>
+      <w:pPr>
+        <w:spacing w:after="0" w:line="360" w:lineRule="auto"/>
+        <w:jc w:val="center"/>
+        <w:rPr>
+          <w:rFonts w:ascii="Arial" w:hAnsi="Arial" w:cs="Arial"/>
+          <w:bCs/>
+          <w:sz w:val="24"/>
+          <w:szCs w:val="24"/>
+        </w:rPr>
+      </w:pPr>
+      <w:r>
+        <w:rPr>
+          <w:rFonts w:ascii="Arial" w:hAnsi="Arial" w:cs="Arial"/>
+          <w:bCs/>
+          <w:sz w:val="24"/>
+          <w:szCs w:val="24"/>
+        </w:rPr>
+        <w:t>PLATAFORMA DE ADAPTAÇÃO DIDÁTICA COM IA PARA ALUNOS COM TEA</w:t>
+      </w:r>
+    </w:p>
+    <w:p>
+      <w:pPr>
+        <w:spacing w:after="0" w:line="360" w:lineRule="auto"/>
+        <w:jc w:val="center"/>
+        <w:rPr>
+          <w:rFonts w:ascii="Arial" w:hAnsi="Arial" w:cs="Arial"/>
+          <w:bCs/>
+          <w:sz w:val="24"/>
+          <w:szCs w:val="24"/>
+        </w:rPr>
+      </w:pPr>
+    </w:p>
+    <w:p>
+      <w:pPr>
+        <w:spacing w:after="0" w:line="360" w:lineRule="auto"/>
+        <w:jc w:val="center"/>
+        <w:rPr>
+          <w:rFonts w:ascii="Arial" w:hAnsi="Arial" w:cs="Arial"/>
+          <w:bCs/>
+          <w:sz w:val="24"/>
+          <w:szCs w:val="24"/>
+        </w:rPr>
+      </w:pPr>
+    </w:p>
+    <w:p>
+      <w:pPr>
+        <w:spacing w:after="0" w:line="360" w:lineRule="auto"/>
+        <w:jc w:val="center"/>
+        <w:rPr>
+          <w:rFonts w:ascii="Arial" w:hAnsi="Arial" w:cs="Arial"/>
+          <w:bCs/>
+          <w:sz w:val="24"/>
+          <w:szCs w:val="24"/>
+        </w:rPr>
+      </w:pPr>
+    </w:p>
+    <w:p>
+      <w:pPr>
+        <w:spacing w:after="0" w:line="360" w:lineRule="auto"/>
+        <w:jc w:val="center"/>
+        <w:rPr>
+          <w:rFonts w:ascii="Arial" w:hAnsi="Arial" w:cs="Arial"/>
+          <w:bCs/>
+          <w:sz w:val="24"/>
+          <w:szCs w:val="24"/>
+        </w:rPr>
+      </w:pPr>
+    </w:p>
+    <w:p>
+      <w:pPr>
+        <w:spacing w:after="0" w:line="360" w:lineRule="auto"/>
+        <w:jc w:val="center"/>
+        <w:rPr>
+          <w:rFonts w:ascii="Arial" w:hAnsi="Arial" w:cs="Arial"/>
+          <w:bCs/>
+          <w:sz w:val="24"/>
+          <w:szCs w:val="24"/>
+        </w:rPr>
+      </w:pPr>
+    </w:p>
+    <w:p>
+      <w:pPr>
+        <w:spacing w:after="0" w:line="360" w:lineRule="auto"/>
+        <w:jc w:val="center"/>
+        <w:rPr>
+          <w:rFonts w:ascii="Arial" w:hAnsi="Arial" w:cs="Arial"/>
+          <w:bCs/>
+          <w:sz w:val="24"/>
+          <w:szCs w:val="24"/>
+        </w:rPr>
+      </w:pPr>
+    </w:p>
+    <w:p>
+      <w:pPr>
+        <w:spacing w:after="0" w:line="240" w:lineRule="auto"/>
+        <w:ind w:left="4536"/>
+        <w:jc w:val="both"/>
+        <w:rPr>
+          <w:rFonts w:ascii="Arial" w:hAnsi="Arial" w:cs="Arial"/>
+          <w:bCs/>
+          <w:sz w:val="20"/>
+          <w:szCs w:val="20"/>
+        </w:rPr>
+      </w:pPr>
+      <w:r>
+        <w:rPr>
+          <w:rFonts w:ascii="Arial" w:hAnsi="Arial" w:cs="Arial"/>
+          <w:bCs/>
+          <w:sz w:val="20"/>
+          <w:szCs w:val="20"/>
+        </w:rPr>
+        <w:t>Trabalho de conclusão de curso apresentado à ETEC Professor Camargo Aranha, como requisito para o recebimento do diploma de técnico em Desenvolvimento de Sistemas.</w:t>
+      </w:r>
+    </w:p>
+    <w:p>
+      <w:pPr>
+        <w:spacing w:after="0" w:line="240" w:lineRule="auto"/>
+        <w:ind w:left="4536"/>
+        <w:jc w:val="both"/>
+        <w:rPr>
+          <w:rFonts w:ascii="Arial" w:hAnsi="Arial" w:cs="Arial"/>
+          <w:bCs/>
+          <w:sz w:val="20"/>
+          <w:szCs w:val="20"/>
+        </w:rPr>
+      </w:pPr>
+    </w:p>
+    <w:p>
+      <w:pPr>
+        <w:spacing w:after="0" w:line="240" w:lineRule="auto"/>
+        <w:ind w:left="4536"/>
+        <w:jc w:val="both"/>
+        <w:rPr>
+          <w:rFonts w:ascii="Arial" w:hAnsi="Arial" w:cs="Arial"/>
+          <w:bCs/>
+          <w:sz w:val="20"/>
+          <w:szCs w:val="20"/>
+        </w:rPr>
+      </w:pPr>
+    </w:p>
+    <w:p>
+      <w:pPr>
+        <w:spacing w:after="0" w:line="240" w:lineRule="auto"/>
+        <w:ind w:left="4536"/>
+        <w:jc w:val="both"/>
+        <w:rPr>
+          <w:rFonts w:ascii="Arial" w:hAnsi="Arial" w:cs="Arial"/>
+          <w:bCs/>
+          <w:sz w:val="20"/>
+          <w:szCs w:val="20"/>
+        </w:rPr>
+      </w:pPr>
+      <w:r>
+        <w:rPr>
+          <w:rFonts w:ascii="Arial" w:hAnsi="Arial" w:cs="Arial"/>
+          <w:bCs/>
+          <w:sz w:val="20"/>
+          <w:szCs w:val="20"/>
+        </w:rPr>
+        <w:t xml:space="preserve">Orientador: </w:t>
+      </w:r>
+      <w:r>
+        <w:rPr>
+          <w:rFonts w:ascii="Arial" w:hAnsi="Arial" w:cs="Arial"/>
+          <w:bCs/>
+          <w:sz w:val="20"/>
+          <w:szCs w:val="20"/>
+        </w:rPr>
+        <w:t xml:space="preserve">Prof. </w:t>
+      </w:r>
+      <w:r>
+        <w:rPr>
+          <w:rFonts w:ascii="Arial" w:hAnsi="Arial" w:cs="Arial"/>
+          <w:bCs/>
+          <w:sz w:val="20"/>
+          <w:szCs w:val="20"/>
+        </w:rPr>
+        <w:t>Davi Vilar</w:t>
+      </w:r>
+    </w:p>
+    <w:p>
+      <w:pPr>
+        <w:spacing w:after="0" w:line="360" w:lineRule="auto"/>
+        <w:jc w:val="center"/>
+        <w:rPr>
+          <w:rFonts w:ascii="Arial" w:hAnsi="Arial" w:cs="Arial"/>
+          <w:b/>
+          <w:sz w:val="24"/>
+          <w:szCs w:val="24"/>
+        </w:rPr>
+      </w:pPr>
+    </w:p>
+    <w:p>
+      <w:pPr>
+        <w:spacing w:after="0" w:line="360" w:lineRule="auto"/>
+        <w:jc w:val="center"/>
+        <w:rPr>
+          <w:rFonts w:ascii="Arial" w:hAnsi="Arial" w:cs="Arial"/>
+          <w:b/>
+          <w:sz w:val="24"/>
+          <w:szCs w:val="24"/>
+        </w:rPr>
+      </w:pPr>
+    </w:p>
+    <w:p>
+      <w:pPr>
+        <w:spacing w:after="0" w:line="360" w:lineRule="auto"/>
+        <w:jc w:val="center"/>
+        <w:rPr>
+          <w:rFonts w:ascii="Arial" w:hAnsi="Arial" w:cs="Arial"/>
+          <w:sz w:val="24"/>
+          <w:szCs w:val="24"/>
+        </w:rPr>
+      </w:pPr>
+    </w:p>
+    <w:p>
+      <w:pPr>
+        <w:spacing w:after="0" w:line="360" w:lineRule="auto"/>
+        <w:jc w:val="center"/>
+        <w:rPr>
+          <w:rFonts w:ascii="Arial" w:hAnsi="Arial" w:cs="Arial"/>
+          <w:sz w:val="24"/>
+          <w:szCs w:val="24"/>
+        </w:rPr>
+      </w:pPr>
+    </w:p>
+    <w:p>
+      <w:pPr>
+        <w:spacing w:after="0" w:line="360" w:lineRule="auto"/>
+        <w:jc w:val="center"/>
+        <w:rPr>
+          <w:rFonts w:ascii="Arial" w:hAnsi="Arial" w:cs="Arial"/>
+          <w:sz w:val="24"/>
+          <w:szCs w:val="24"/>
+        </w:rPr>
+      </w:pPr>
+    </w:p>
+    <w:p>
+      <w:pPr>
+        <w:spacing w:after="0" w:line="360" w:lineRule="auto"/>
+        <w:jc w:val="center"/>
+        <w:rPr>
+          <w:rFonts w:ascii="Arial" w:hAnsi="Arial" w:cs="Arial"/>
+          <w:sz w:val="24"/>
+          <w:szCs w:val="24"/>
+        </w:rPr>
+      </w:pPr>
+    </w:p>
+    <w:p>
+      <w:pPr>
+        <w:spacing w:after="0" w:line="360" w:lineRule="auto"/>
+        <w:jc w:val="center"/>
+        <w:rPr>
+          <w:rFonts w:ascii="Arial" w:hAnsi="Arial" w:cs="Arial"/>
+          <w:sz w:val="24"/>
+          <w:szCs w:val="24"/>
+        </w:rPr>
+      </w:pPr>
+    </w:p>
+    <w:p>
+      <w:pPr>
+        <w:spacing w:after="0" w:line="360" w:lineRule="auto"/>
+        <w:jc w:val="center"/>
+        <w:rPr>
+          <w:rFonts w:ascii="Arial" w:hAnsi="Arial" w:cs="Arial"/>
+          <w:sz w:val="24"/>
+          <w:szCs w:val="24"/>
+        </w:rPr>
+      </w:pPr>
+      <w:r>
+        <w:rPr>
+          <w:rFonts w:ascii="Arial" w:hAnsi="Arial" w:cs="Arial"/>
+          <w:sz w:val="24"/>
+          <w:szCs w:val="24"/>
+        </w:rPr>
+        <w:t>SÃO PAULO - SP</w:t>
+      </w:r>
+    </w:p>
+    <w:p>
+      <w:pPr>
+        <w:spacing w:after="0" w:line="360" w:lineRule="auto"/>
+        <w:jc w:val="center"/>
+        <w:rPr>
+          <w:rFonts w:ascii="Arial" w:hAnsi="Arial" w:cs="Arial"/>
+          <w:sz w:val="24"/>
+          <w:szCs w:val="24"/>
+        </w:rPr>
+      </w:pPr>
+      <w:r>
+        <w:rPr>
+          <w:rFonts w:ascii="Arial" w:hAnsi="Arial" w:cs="Arial"/>
+          <w:sz w:val="24"/>
+          <w:szCs w:val="24"/>
+        </w:rPr>
+        <w:t>2026</w:t>
+      </w:r>
+    </w:p>
+    <w:p>
+      <w:pPr>
+        <w:spacing w:after="0" w:line="360" w:lineRule="auto"/>
+        <w:jc w:val="center"/>
+        <w:rPr>
+          <w:rFonts w:ascii="Arial" w:hAnsi="Arial" w:cs="Arial"/>
+          <w:b/>
+          <w:bCs/>
+          <w:sz w:val="24"/>
+          <w:szCs w:val="24"/>
+        </w:rPr>
+      </w:pPr>
+      <w:r>
+        <w:rPr>
+          <w:rFonts w:ascii="Arial" w:hAnsi="Arial" w:cs="Arial"/>
+          <w:b/>
+          <w:bCs/>
+          <w:sz w:val="24"/>
+          <w:szCs w:val="24"/>
+        </w:rPr>
+        <w:lastRenderedPageBreak/>
+        <w:t>RESUMO</w:t>
+      </w:r>
+    </w:p>
+    <w:p>
+      <w:pPr>
+        <w:spacing w:after="0" w:line="360" w:lineRule="auto"/>
+        <w:jc w:val="center"/>
+        <w:rPr>
+          <w:rFonts w:ascii="Arial" w:hAnsi="Arial" w:cs="Arial"/>
+          <w:sz w:val="24"/>
+          <w:szCs w:val="24"/>
+        </w:rPr>
+      </w:pPr>
+    </w:p>
+    <w:p>
+      <w:pPr>
+        <w:spacing w:after="0" w:line="360" w:lineRule="auto"/>
+        <w:jc w:val="both"/>
+        <w:rPr>
+          <w:rFonts w:ascii="Arial" w:hAnsi="Arial" w:cs="Arial"/>
+          <w:sz w:val="24"/>
+          <w:szCs w:val="24"/>
+        </w:rPr>
+      </w:pPr>
+      <w:proofErr w:type="spellStart"/>
+      <w:r>
+        <w:rPr>
+          <w:rFonts w:ascii="Arial" w:hAnsi="Arial" w:cs="Arial"/>
+          <w:sz w:val="24"/>
+          <w:szCs w:val="24"/>
+        </w:rPr>
+        <w:t>Lorem</w:t>
       </w:r>
       <w:proofErr w:type="spellEnd"/>
       <w:r>
         <w:rPr>
           <w:rFonts w:ascii="Arial" w:hAnsi="Arial" w:cs="Arial"/>
-          <w:b/>
-          <w:sz w:val="28"/>
-          <w:szCs w:val="28"/>
+          <w:sz w:val="24"/>
+          <w:szCs w:val="24"/>
+        </w:rPr>
+        <w:t xml:space="preserve"> ipsum </w:t>
+      </w:r>
+      <w:proofErr w:type="spellStart"/>
+      <w:r>
+        <w:rPr>
+          <w:rFonts w:ascii="Arial" w:hAnsi="Arial" w:cs="Arial"/>
+          <w:sz w:val="24"/>
+          <w:szCs w:val="24"/>
+        </w:rPr>
+        <w:t>dolor</w:t>
+      </w:r>
+      <w:proofErr w:type="spellEnd"/>
+      <w:r>
+        <w:rPr>
+          <w:rFonts w:ascii="Arial" w:hAnsi="Arial" w:cs="Arial"/>
+          <w:sz w:val="24"/>
+          <w:szCs w:val="24"/>
         </w:rPr>
         <w:t xml:space="preserve"> </w:t>
       </w:r>
@@ -189,399 +1182,595 @@
       <w:r>
         <w:rPr>
           <w:rFonts w:ascii="Arial" w:hAnsi="Arial" w:cs="Arial"/>
-          <w:b/>
-          <w:sz w:val="28"/>
-          <w:szCs w:val="28"/>
-        </w:rPr>
-        <w:t>Lustri</w:t>
+          <w:sz w:val="24"/>
+          <w:szCs w:val="24"/>
+        </w:rPr>
+        <w:t>sit</w:t>
       </w:r>
       <w:proofErr w:type="spellEnd"/>
       <w:r>
         <w:rPr>
           <w:rFonts w:ascii="Arial" w:hAnsi="Arial" w:cs="Arial"/>
-          <w:b/>
-          <w:sz w:val="28"/>
-          <w:szCs w:val="28"/>
-        </w:rPr>
-        <w:br/>
-      </w:r>
-      <w:r>
-        <w:rPr>
-          <w:rFonts w:ascii="Arial" w:hAnsi="Arial" w:cs="Arial"/>
-          <w:b/>
-          <w:sz w:val="28"/>
-          <w:szCs w:val="28"/>
-        </w:rPr>
-        <w:t>Davi Tavares Nascimento Bess</w:t>
-      </w:r>
-      <w:r>
-        <w:rPr>
-          <w:rFonts w:ascii="Arial" w:hAnsi="Arial" w:cs="Arial"/>
-          <w:b/>
-          <w:sz w:val="28"/>
-          <w:szCs w:val="28"/>
-        </w:rPr>
-        <w:t>a</w:t>
-      </w:r>
-      <w:r>
-        <w:rPr>
-          <w:rFonts w:ascii="Arial" w:hAnsi="Arial" w:cs="Arial"/>
-          <w:b/>
-          <w:sz w:val="28"/>
-          <w:szCs w:val="28"/>
-        </w:rPr>
-        <w:br/>
-      </w:r>
-      <w:r>
-        <w:rPr>
-          <w:rFonts w:ascii="Arial" w:hAnsi="Arial" w:cs="Arial"/>
-          <w:b/>
-          <w:sz w:val="28"/>
-          <w:szCs w:val="28"/>
-        </w:rPr>
-        <w:t>Felipe Rocha Gomes</w:t>
-      </w:r>
-      <w:r>
-        <w:rPr>
-          <w:rFonts w:ascii="Arial" w:hAnsi="Arial" w:cs="Arial"/>
-          <w:b/>
-          <w:sz w:val="28"/>
-          <w:szCs w:val="28"/>
-        </w:rPr>
-        <w:br/>
-      </w:r>
-      <w:r>
-        <w:rPr>
-          <w:rFonts w:ascii="Arial" w:hAnsi="Arial" w:cs="Arial"/>
-          <w:b/>
-          <w:sz w:val="28"/>
-          <w:szCs w:val="28"/>
-        </w:rPr>
-        <w:t xml:space="preserve">Fernando </w:t>
+          <w:sz w:val="24"/>
+          <w:szCs w:val="24"/>
+        </w:rPr>
+        <w:t xml:space="preserve"> </w:t>
       </w:r>
       <w:proofErr w:type="spellStart"/>
       <w:r>
         <w:rPr>
           <w:rFonts w:ascii="Arial" w:hAnsi="Arial" w:cs="Arial"/>
-          <w:b/>
-          <w:sz w:val="28"/>
-          <w:szCs w:val="28"/>
-        </w:rPr>
-        <w:t>Fiani</w:t>
+          <w:sz w:val="24"/>
+          <w:szCs w:val="24"/>
+        </w:rPr>
+        <w:t>amet</w:t>
       </w:r>
       <w:proofErr w:type="spellEnd"/>
       <w:r>
         <w:rPr>
           <w:rFonts w:ascii="Arial" w:hAnsi="Arial" w:cs="Arial"/>
-          <w:b/>
-          <w:sz w:val="28"/>
-          <w:szCs w:val="28"/>
-        </w:rPr>
-        <w:t xml:space="preserve"> de Pina Saraiva</w:t>
-      </w:r>
-      <w:r>
-        <w:rPr>
-          <w:rFonts w:ascii="Arial" w:hAnsi="Arial" w:cs="Arial"/>
-          <w:b/>
-          <w:sz w:val="28"/>
-          <w:szCs w:val="28"/>
+          <w:sz w:val="24"/>
+          <w:szCs w:val="24"/>
+        </w:rPr>
+        <w:t xml:space="preserve">, </w:t>
+      </w:r>
+      <w:proofErr w:type="spellStart"/>
+      <w:r>
+        <w:rPr>
+          <w:rFonts w:ascii="Arial" w:hAnsi="Arial" w:cs="Arial"/>
+          <w:sz w:val="24"/>
+          <w:szCs w:val="24"/>
+        </w:rPr>
+        <w:t>consectetur</w:t>
+      </w:r>
+      <w:proofErr w:type="spellEnd"/>
+      <w:r>
+        <w:rPr>
+          <w:rFonts w:ascii="Arial" w:hAnsi="Arial" w:cs="Arial"/>
+          <w:sz w:val="24"/>
+          <w:szCs w:val="24"/>
         </w:rPr>
         <w:t xml:space="preserve"> </w:t>
       </w:r>
-      <w:r>
-        <w:rPr>
-          <w:rFonts w:ascii="Arial" w:hAnsi="Arial" w:cs="Arial"/>
-          <w:b/>
-          <w:sz w:val="28"/>
-          <w:szCs w:val="28"/>
-        </w:rPr>
-        <w:br/>
-      </w:r>
-      <w:r>
-        <w:rPr>
-          <w:rFonts w:ascii="Arial" w:hAnsi="Arial" w:cs="Arial"/>
-          <w:b/>
-          <w:sz w:val="28"/>
-          <w:szCs w:val="28"/>
-        </w:rPr>
-        <w:t>João Vitor Vale de Jesus</w:t>
-      </w:r>
-      <w:r>
-        <w:rPr>
-          <w:rFonts w:ascii="Arial" w:hAnsi="Arial" w:cs="Arial"/>
-          <w:b/>
-          <w:sz w:val="28"/>
-          <w:szCs w:val="28"/>
-        </w:rPr>
-        <w:br/>
-      </w:r>
-      <w:r>
-        <w:rPr>
-          <w:rFonts w:ascii="Arial" w:hAnsi="Arial" w:cs="Arial"/>
-          <w:b/>
-          <w:sz w:val="28"/>
-          <w:szCs w:val="28"/>
-        </w:rPr>
-        <w:t xml:space="preserve">Leonardo </w:t>
-      </w:r>
       <w:proofErr w:type="spellStart"/>
       <w:r>
         <w:rPr>
           <w:rFonts w:ascii="Arial" w:hAnsi="Arial" w:cs="Arial"/>
-          <w:b/>
-          <w:sz w:val="28"/>
-          <w:szCs w:val="28"/>
-        </w:rPr>
-        <w:t>Buso</w:t>
+          <w:sz w:val="24"/>
+          <w:szCs w:val="24"/>
+        </w:rPr>
+        <w:t>adipiscing</w:t>
       </w:r>
       <w:proofErr w:type="spellEnd"/>
       <w:r>
         <w:rPr>
           <w:rFonts w:ascii="Arial" w:hAnsi="Arial" w:cs="Arial"/>
-          <w:b/>
-          <w:sz w:val="28"/>
-          <w:szCs w:val="28"/>
-        </w:rPr>
-        <w:t xml:space="preserve"> de Sousa </w:t>
-      </w:r>
-      <w:r>
-        <w:rPr>
-          <w:rFonts w:ascii="Arial" w:hAnsi="Arial" w:cs="Arial"/>
-          <w:b/>
-          <w:sz w:val="28"/>
-          <w:szCs w:val="28"/>
-        </w:rPr>
-        <w:br/>
-      </w:r>
-    </w:p>
-    <w:p>
-      <w:pPr>
-        <w:spacing w:after="0" w:line="360" w:lineRule="auto"/>
-        <w:rPr>
-          <w:rFonts w:ascii="Arial" w:hAnsi="Arial" w:cs="Arial"/>
-          <w:sz w:val="28"/>
-          <w:szCs w:val="28"/>
-        </w:rPr>
-      </w:pPr>
-    </w:p>
-    <w:p>
-      <w:pPr>
-        <w:spacing w:after="0" w:line="360" w:lineRule="auto"/>
-        <w:jc w:val="center"/>
-        <w:rPr>
-          <w:rFonts w:ascii="Arial" w:hAnsi="Arial" w:cs="Arial"/>
-          <w:b/>
-          <w:sz w:val="28"/>
-          <w:szCs w:val="28"/>
-        </w:rPr>
-      </w:pPr>
-    </w:p>
-    <w:p>
-      <w:pPr>
-        <w:spacing w:after="0" w:line="360" w:lineRule="auto"/>
-        <w:jc w:val="center"/>
-        <w:rPr>
-          <w:rFonts w:ascii="Arial" w:hAnsi="Arial" w:cs="Arial"/>
-          <w:b/>
-          <w:sz w:val="28"/>
-          <w:szCs w:val="28"/>
-        </w:rPr>
-      </w:pPr>
-      <w:r>
-        <w:rPr>
-          <w:rStyle w:val="Refdecomentrio"/>
-        </w:rPr>
-        <w:commentReference w:id="0"/>
-      </w:r>
-    </w:p>
-    <w:p>
-      <w:pPr>
-        <w:spacing w:after="0" w:line="360" w:lineRule="auto"/>
-        <w:jc w:val="center"/>
-        <w:rPr>
-          <w:rFonts w:ascii="Arial" w:hAnsi="Arial" w:cs="Arial"/>
-          <w:b/>
-          <w:sz w:val="28"/>
-          <w:szCs w:val="28"/>
-        </w:rPr>
-      </w:pPr>
-    </w:p>
-    <w:p>
-      <w:pPr>
-        <w:spacing w:after="0" w:line="360" w:lineRule="auto"/>
-        <w:jc w:val="center"/>
-        <w:rPr>
-          <w:rFonts w:ascii="Arial" w:hAnsi="Arial" w:cs="Arial"/>
-          <w:b/>
-          <w:sz w:val="28"/>
-          <w:szCs w:val="28"/>
-        </w:rPr>
-      </w:pPr>
-      <w:r>
-        <w:rPr>
-          <w:rFonts w:ascii="Arial" w:hAnsi="Arial" w:cs="Arial"/>
-          <w:b/>
-          <w:sz w:val="28"/>
-          <w:szCs w:val="28"/>
-        </w:rPr>
-        <w:t>NEUROLEARN</w:t>
-      </w:r>
-      <w:r>
-        <w:rPr>
-          <w:rFonts w:ascii="Arial" w:hAnsi="Arial" w:cs="Arial"/>
-          <w:b/>
-          <w:sz w:val="28"/>
-          <w:szCs w:val="28"/>
-        </w:rPr>
-        <w:t>:</w:t>
-      </w:r>
-      <w:r>
-        <w:rPr>
-          <w:rFonts w:ascii="Arial" w:hAnsi="Arial" w:cs="Arial"/>
-          <w:b/>
-          <w:sz w:val="28"/>
-          <w:szCs w:val="28"/>
-        </w:rPr>
-        <w:t xml:space="preserve"> PLATAFORMA DE ADAPTAÇÃO DIDÁTICA COM IA PARA ALUNOS COM TEA</w:t>
-      </w:r>
-    </w:p>
-    <w:p>
-      <w:pPr>
-        <w:spacing w:after="0" w:line="360" w:lineRule="auto"/>
-        <w:jc w:val="center"/>
-        <w:rPr>
-          <w:rFonts w:ascii="Arial" w:hAnsi="Arial" w:cs="Arial"/>
-          <w:sz w:val="28"/>
-          <w:szCs w:val="28"/>
-        </w:rPr>
-      </w:pPr>
-    </w:p>
-    <w:p>
-      <w:pPr>
-        <w:spacing w:after="0" w:line="360" w:lineRule="auto"/>
-        <w:jc w:val="center"/>
-        <w:rPr>
-          <w:rFonts w:ascii="Arial" w:hAnsi="Arial" w:cs="Arial"/>
-          <w:sz w:val="28"/>
-          <w:szCs w:val="28"/>
-        </w:rPr>
-      </w:pPr>
-    </w:p>
-    <w:p>
-      <w:pPr>
-        <w:spacing w:after="0" w:line="360" w:lineRule="auto"/>
-        <w:jc w:val="center"/>
-        <w:rPr>
-          <w:rFonts w:ascii="Arial" w:hAnsi="Arial" w:cs="Arial"/>
-          <w:sz w:val="28"/>
-          <w:szCs w:val="28"/>
-        </w:rPr>
-      </w:pPr>
-    </w:p>
-    <w:p>
-      <w:pPr>
-        <w:spacing w:after="0" w:line="360" w:lineRule="auto"/>
-        <w:jc w:val="center"/>
-        <w:rPr>
-          <w:rFonts w:ascii="Arial" w:hAnsi="Arial" w:cs="Arial"/>
-          <w:sz w:val="28"/>
-          <w:szCs w:val="28"/>
-        </w:rPr>
-      </w:pPr>
-    </w:p>
-    <w:p>
-      <w:pPr>
-        <w:spacing w:after="0" w:line="360" w:lineRule="auto"/>
-        <w:jc w:val="center"/>
-        <w:rPr>
-          <w:rFonts w:ascii="Arial" w:hAnsi="Arial" w:cs="Arial"/>
-          <w:sz w:val="28"/>
-          <w:szCs w:val="28"/>
-        </w:rPr>
-      </w:pPr>
-    </w:p>
-    <w:p>
-      <w:pPr>
-        <w:spacing w:after="0" w:line="360" w:lineRule="auto"/>
-        <w:jc w:val="center"/>
-        <w:rPr>
-          <w:rFonts w:ascii="Arial" w:hAnsi="Arial" w:cs="Arial"/>
-          <w:sz w:val="28"/>
-          <w:szCs w:val="28"/>
-        </w:rPr>
-      </w:pPr>
-      <w:r>
-        <w:rPr>
-          <w:rFonts w:ascii="Arial" w:hAnsi="Arial" w:cs="Arial"/>
-          <w:sz w:val="28"/>
-          <w:szCs w:val="28"/>
-        </w:rPr>
-        <w:t>,</w:t>
-      </w:r>
-    </w:p>
-    <w:p>
-      <w:pPr>
-        <w:spacing w:after="0" w:line="360" w:lineRule="auto"/>
-        <w:rPr>
-          <w:rFonts w:ascii="Arial" w:hAnsi="Arial" w:cs="Arial"/>
-          <w:b/>
-          <w:sz w:val="28"/>
-          <w:szCs w:val="28"/>
-        </w:rPr>
-      </w:pPr>
-    </w:p>
-    <w:p>
-      <w:pPr>
-        <w:spacing w:after="0" w:line="360" w:lineRule="auto"/>
-        <w:jc w:val="center"/>
-        <w:rPr>
-          <w:rFonts w:ascii="Arial" w:hAnsi="Arial" w:cs="Arial"/>
-          <w:b/>
-          <w:sz w:val="28"/>
-          <w:szCs w:val="28"/>
-        </w:rPr>
-      </w:pPr>
-    </w:p>
-    <w:p>
-      <w:pPr>
-        <w:spacing w:after="0" w:line="360" w:lineRule="auto"/>
-        <w:jc w:val="center"/>
-        <w:rPr>
-          <w:rFonts w:ascii="Arial" w:hAnsi="Arial" w:cs="Arial"/>
-          <w:b/>
-          <w:sz w:val="28"/>
-          <w:szCs w:val="28"/>
-        </w:rPr>
-      </w:pPr>
-      <w:r>
-        <w:rPr>
-          <w:rFonts w:ascii="Arial" w:hAnsi="Arial" w:cs="Arial"/>
-          <w:b/>
-          <w:sz w:val="28"/>
-          <w:szCs w:val="28"/>
-        </w:rPr>
-        <w:t>São Paulo</w:t>
-      </w:r>
-    </w:p>
-    <w:p>
-      <w:pPr>
-        <w:spacing w:after="0" w:line="360" w:lineRule="auto"/>
-        <w:jc w:val="center"/>
-        <w:rPr>
-          <w:rFonts w:ascii="Arial" w:hAnsi="Arial" w:cs="Arial"/>
-          <w:b/>
-          <w:sz w:val="28"/>
-          <w:szCs w:val="28"/>
-        </w:rPr>
-      </w:pPr>
-      <w:r>
-        <w:rPr>
-          <w:rFonts w:ascii="Arial" w:hAnsi="Arial" w:cs="Arial"/>
-          <w:b/>
-          <w:sz w:val="28"/>
-          <w:szCs w:val="28"/>
-        </w:rPr>
-        <w:t>2026</w:t>
+          <w:sz w:val="24"/>
+          <w:szCs w:val="24"/>
+        </w:rPr>
+        <w:t xml:space="preserve"> </w:t>
+      </w:r>
+      <w:proofErr w:type="spellStart"/>
+      <w:r>
+        <w:rPr>
+          <w:rFonts w:ascii="Arial" w:hAnsi="Arial" w:cs="Arial"/>
+          <w:sz w:val="24"/>
+          <w:szCs w:val="24"/>
+        </w:rPr>
+        <w:t>elit</w:t>
+      </w:r>
+      <w:proofErr w:type="spellEnd"/>
+      <w:r>
+        <w:rPr>
+          <w:rFonts w:ascii="Arial" w:hAnsi="Arial" w:cs="Arial"/>
+          <w:sz w:val="24"/>
+          <w:szCs w:val="24"/>
+        </w:rPr>
+        <w:t xml:space="preserve">. Etiam </w:t>
+      </w:r>
+      <w:proofErr w:type="spellStart"/>
+      <w:r>
+        <w:rPr>
+          <w:rFonts w:ascii="Arial" w:hAnsi="Arial" w:cs="Arial"/>
+          <w:sz w:val="24"/>
+          <w:szCs w:val="24"/>
+        </w:rPr>
+        <w:t>eget</w:t>
+      </w:r>
+      <w:proofErr w:type="spellEnd"/>
+      <w:r>
+        <w:rPr>
+          <w:rFonts w:ascii="Arial" w:hAnsi="Arial" w:cs="Arial"/>
+          <w:sz w:val="24"/>
+          <w:szCs w:val="24"/>
+        </w:rPr>
+        <w:t xml:space="preserve"> </w:t>
+      </w:r>
+      <w:proofErr w:type="spellStart"/>
+      <w:r>
+        <w:rPr>
+          <w:rFonts w:ascii="Arial" w:hAnsi="Arial" w:cs="Arial"/>
+          <w:sz w:val="24"/>
+          <w:szCs w:val="24"/>
+        </w:rPr>
+        <w:t>ligula</w:t>
+      </w:r>
+      <w:proofErr w:type="spellEnd"/>
+      <w:r>
+        <w:rPr>
+          <w:rFonts w:ascii="Arial" w:hAnsi="Arial" w:cs="Arial"/>
+          <w:sz w:val="24"/>
+          <w:szCs w:val="24"/>
+        </w:rPr>
+        <w:t xml:space="preserve"> eu </w:t>
+      </w:r>
+      <w:proofErr w:type="spellStart"/>
+      <w:r>
+        <w:rPr>
+          <w:rFonts w:ascii="Arial" w:hAnsi="Arial" w:cs="Arial"/>
+          <w:sz w:val="24"/>
+          <w:szCs w:val="24"/>
+        </w:rPr>
+        <w:t>lectus</w:t>
+      </w:r>
+      <w:proofErr w:type="spellEnd"/>
+      <w:r>
+        <w:rPr>
+          <w:rFonts w:ascii="Arial" w:hAnsi="Arial" w:cs="Arial"/>
+          <w:sz w:val="24"/>
+          <w:szCs w:val="24"/>
+        </w:rPr>
+        <w:t xml:space="preserve"> </w:t>
+      </w:r>
+      <w:proofErr w:type="spellStart"/>
+      <w:r>
+        <w:rPr>
+          <w:rFonts w:ascii="Arial" w:hAnsi="Arial" w:cs="Arial"/>
+          <w:sz w:val="24"/>
+          <w:szCs w:val="24"/>
+        </w:rPr>
+        <w:t>lobortis</w:t>
+      </w:r>
+      <w:proofErr w:type="spellEnd"/>
+      <w:r>
+        <w:rPr>
+          <w:rFonts w:ascii="Arial" w:hAnsi="Arial" w:cs="Arial"/>
+          <w:sz w:val="24"/>
+          <w:szCs w:val="24"/>
+        </w:rPr>
+        <w:t xml:space="preserve"> </w:t>
+      </w:r>
+      <w:proofErr w:type="spellStart"/>
+      <w:r>
+        <w:rPr>
+          <w:rFonts w:ascii="Arial" w:hAnsi="Arial" w:cs="Arial"/>
+          <w:sz w:val="24"/>
+          <w:szCs w:val="24"/>
+        </w:rPr>
+        <w:t>condimentum</w:t>
+      </w:r>
+      <w:proofErr w:type="spellEnd"/>
+      <w:r>
+        <w:rPr>
+          <w:rFonts w:ascii="Arial" w:hAnsi="Arial" w:cs="Arial"/>
+          <w:sz w:val="24"/>
+          <w:szCs w:val="24"/>
+        </w:rPr>
+        <w:t xml:space="preserve">. </w:t>
+      </w:r>
+      <w:proofErr w:type="spellStart"/>
+      <w:r>
+        <w:rPr>
+          <w:rFonts w:ascii="Arial" w:hAnsi="Arial" w:cs="Arial"/>
+          <w:sz w:val="24"/>
+          <w:szCs w:val="24"/>
+        </w:rPr>
+        <w:t>Aliquam</w:t>
+      </w:r>
+      <w:proofErr w:type="spellEnd"/>
+      <w:r>
+        <w:rPr>
+          <w:rFonts w:ascii="Arial" w:hAnsi="Arial" w:cs="Arial"/>
+          <w:sz w:val="24"/>
+          <w:szCs w:val="24"/>
+        </w:rPr>
+        <w:t xml:space="preserve"> </w:t>
+      </w:r>
+      <w:proofErr w:type="spellStart"/>
+      <w:r>
+        <w:rPr>
+          <w:rFonts w:ascii="Arial" w:hAnsi="Arial" w:cs="Arial"/>
+          <w:sz w:val="24"/>
+          <w:szCs w:val="24"/>
+        </w:rPr>
+        <w:t>nonummy</w:t>
+      </w:r>
+      <w:proofErr w:type="spellEnd"/>
+      <w:r>
+        <w:rPr>
+          <w:rFonts w:ascii="Arial" w:hAnsi="Arial" w:cs="Arial"/>
+          <w:sz w:val="24"/>
+          <w:szCs w:val="24"/>
+        </w:rPr>
+        <w:t xml:space="preserve"> </w:t>
+      </w:r>
+      <w:proofErr w:type="spellStart"/>
+      <w:r>
+        <w:rPr>
+          <w:rFonts w:ascii="Arial" w:hAnsi="Arial" w:cs="Arial"/>
+          <w:sz w:val="24"/>
+          <w:szCs w:val="24"/>
+        </w:rPr>
+        <w:t>auctor</w:t>
+      </w:r>
+      <w:proofErr w:type="spellEnd"/>
+      <w:r>
+        <w:rPr>
+          <w:rFonts w:ascii="Arial" w:hAnsi="Arial" w:cs="Arial"/>
+          <w:sz w:val="24"/>
+          <w:szCs w:val="24"/>
+        </w:rPr>
+        <w:t xml:space="preserve"> massa. </w:t>
+      </w:r>
+      <w:proofErr w:type="spellStart"/>
+      <w:r>
+        <w:rPr>
+          <w:rFonts w:ascii="Arial" w:hAnsi="Arial" w:cs="Arial"/>
+          <w:sz w:val="24"/>
+          <w:szCs w:val="24"/>
+        </w:rPr>
+        <w:t>Pellentesque</w:t>
+      </w:r>
+      <w:proofErr w:type="spellEnd"/>
+      <w:r>
+        <w:rPr>
+          <w:rFonts w:ascii="Arial" w:hAnsi="Arial" w:cs="Arial"/>
+          <w:sz w:val="24"/>
+          <w:szCs w:val="24"/>
+        </w:rPr>
+        <w:t xml:space="preserve"> </w:t>
+      </w:r>
+      <w:proofErr w:type="spellStart"/>
+      <w:r>
+        <w:rPr>
+          <w:rFonts w:ascii="Arial" w:hAnsi="Arial" w:cs="Arial"/>
+          <w:sz w:val="24"/>
+          <w:szCs w:val="24"/>
+        </w:rPr>
+        <w:t>habitant</w:t>
+      </w:r>
+      <w:proofErr w:type="spellEnd"/>
+      <w:r>
+        <w:rPr>
+          <w:rFonts w:ascii="Arial" w:hAnsi="Arial" w:cs="Arial"/>
+          <w:sz w:val="24"/>
+          <w:szCs w:val="24"/>
+        </w:rPr>
+        <w:t xml:space="preserve"> </w:t>
+      </w:r>
+      <w:proofErr w:type="spellStart"/>
+      <w:r>
+        <w:rPr>
+          <w:rFonts w:ascii="Arial" w:hAnsi="Arial" w:cs="Arial"/>
+          <w:sz w:val="24"/>
+          <w:szCs w:val="24"/>
+        </w:rPr>
+        <w:t>morbi</w:t>
+      </w:r>
+      <w:proofErr w:type="spellEnd"/>
+      <w:r>
+        <w:rPr>
+          <w:rFonts w:ascii="Arial" w:hAnsi="Arial" w:cs="Arial"/>
+          <w:sz w:val="24"/>
+          <w:szCs w:val="24"/>
+        </w:rPr>
+        <w:t xml:space="preserve"> </w:t>
+      </w:r>
+      <w:proofErr w:type="spellStart"/>
+      <w:r>
+        <w:rPr>
+          <w:rFonts w:ascii="Arial" w:hAnsi="Arial" w:cs="Arial"/>
+          <w:sz w:val="24"/>
+          <w:szCs w:val="24"/>
+        </w:rPr>
+        <w:t>tristique</w:t>
+      </w:r>
+      <w:proofErr w:type="spellEnd"/>
+      <w:r>
+        <w:rPr>
+          <w:rFonts w:ascii="Arial" w:hAnsi="Arial" w:cs="Arial"/>
+          <w:sz w:val="24"/>
+          <w:szCs w:val="24"/>
+        </w:rPr>
+        <w:t xml:space="preserve"> </w:t>
+      </w:r>
+      <w:proofErr w:type="spellStart"/>
+      <w:r>
+        <w:rPr>
+          <w:rFonts w:ascii="Arial" w:hAnsi="Arial" w:cs="Arial"/>
+          <w:sz w:val="24"/>
+          <w:szCs w:val="24"/>
+        </w:rPr>
+        <w:t>senectus</w:t>
+      </w:r>
+      <w:proofErr w:type="spellEnd"/>
+      <w:r>
+        <w:rPr>
+          <w:rFonts w:ascii="Arial" w:hAnsi="Arial" w:cs="Arial"/>
+          <w:sz w:val="24"/>
+          <w:szCs w:val="24"/>
+        </w:rPr>
+        <w:t xml:space="preserve"> et </w:t>
+      </w:r>
+      <w:proofErr w:type="spellStart"/>
+      <w:r>
+        <w:rPr>
+          <w:rFonts w:ascii="Arial" w:hAnsi="Arial" w:cs="Arial"/>
+          <w:sz w:val="24"/>
+          <w:szCs w:val="24"/>
+        </w:rPr>
+        <w:t>netus</w:t>
+      </w:r>
+      <w:proofErr w:type="spellEnd"/>
+      <w:r>
+        <w:rPr>
+          <w:rFonts w:ascii="Arial" w:hAnsi="Arial" w:cs="Arial"/>
+          <w:sz w:val="24"/>
+          <w:szCs w:val="24"/>
+        </w:rPr>
+        <w:t xml:space="preserve"> et </w:t>
+      </w:r>
+      <w:proofErr w:type="spellStart"/>
+      <w:r>
+        <w:rPr>
+          <w:rFonts w:ascii="Arial" w:hAnsi="Arial" w:cs="Arial"/>
+          <w:sz w:val="24"/>
+          <w:szCs w:val="24"/>
+        </w:rPr>
+        <w:t>malesuada</w:t>
+      </w:r>
+      <w:proofErr w:type="spellEnd"/>
+      <w:r>
+        <w:rPr>
+          <w:rFonts w:ascii="Arial" w:hAnsi="Arial" w:cs="Arial"/>
+          <w:sz w:val="24"/>
+          <w:szCs w:val="24"/>
+        </w:rPr>
+        <w:t xml:space="preserve"> fames ac </w:t>
+      </w:r>
+      <w:proofErr w:type="spellStart"/>
+      <w:r>
+        <w:rPr>
+          <w:rFonts w:ascii="Arial" w:hAnsi="Arial" w:cs="Arial"/>
+          <w:sz w:val="24"/>
+          <w:szCs w:val="24"/>
+        </w:rPr>
+        <w:t>turpis</w:t>
+      </w:r>
+      <w:proofErr w:type="spellEnd"/>
+      <w:r>
+        <w:rPr>
+          <w:rFonts w:ascii="Arial" w:hAnsi="Arial" w:cs="Arial"/>
+          <w:sz w:val="24"/>
+          <w:szCs w:val="24"/>
+        </w:rPr>
+        <w:t xml:space="preserve"> </w:t>
+      </w:r>
+      <w:proofErr w:type="spellStart"/>
+      <w:r>
+        <w:rPr>
+          <w:rFonts w:ascii="Arial" w:hAnsi="Arial" w:cs="Arial"/>
+          <w:sz w:val="24"/>
+          <w:szCs w:val="24"/>
+        </w:rPr>
+        <w:t>egestas</w:t>
+      </w:r>
+      <w:proofErr w:type="spellEnd"/>
+      <w:r>
+        <w:rPr>
+          <w:rFonts w:ascii="Arial" w:hAnsi="Arial" w:cs="Arial"/>
+          <w:sz w:val="24"/>
+          <w:szCs w:val="24"/>
+        </w:rPr>
+        <w:t xml:space="preserve">. </w:t>
+      </w:r>
+      <w:proofErr w:type="spellStart"/>
+      <w:r>
+        <w:rPr>
+          <w:rFonts w:ascii="Arial" w:hAnsi="Arial" w:cs="Arial"/>
+          <w:sz w:val="24"/>
+          <w:szCs w:val="24"/>
+        </w:rPr>
+        <w:t>Nulla</w:t>
+      </w:r>
+      <w:proofErr w:type="spellEnd"/>
+      <w:r>
+        <w:rPr>
+          <w:rFonts w:ascii="Arial" w:hAnsi="Arial" w:cs="Arial"/>
+          <w:sz w:val="24"/>
+          <w:szCs w:val="24"/>
+        </w:rPr>
+        <w:t xml:space="preserve"> </w:t>
+      </w:r>
+      <w:proofErr w:type="spellStart"/>
+      <w:r>
+        <w:rPr>
+          <w:rFonts w:ascii="Arial" w:hAnsi="Arial" w:cs="Arial"/>
+          <w:sz w:val="24"/>
+          <w:szCs w:val="24"/>
+        </w:rPr>
+        <w:t>at</w:t>
+      </w:r>
+      <w:proofErr w:type="spellEnd"/>
+      <w:r>
+        <w:rPr>
+          <w:rFonts w:ascii="Arial" w:hAnsi="Arial" w:cs="Arial"/>
+          <w:sz w:val="24"/>
+          <w:szCs w:val="24"/>
+        </w:rPr>
+        <w:t xml:space="preserve"> </w:t>
+      </w:r>
+      <w:proofErr w:type="spellStart"/>
+      <w:r>
+        <w:rPr>
+          <w:rFonts w:ascii="Arial" w:hAnsi="Arial" w:cs="Arial"/>
+          <w:sz w:val="24"/>
+          <w:szCs w:val="24"/>
+        </w:rPr>
+        <w:t>risus</w:t>
+      </w:r>
+      <w:proofErr w:type="spellEnd"/>
+      <w:r>
+        <w:rPr>
+          <w:rFonts w:ascii="Arial" w:hAnsi="Arial" w:cs="Arial"/>
+          <w:sz w:val="24"/>
+          <w:szCs w:val="24"/>
+        </w:rPr>
+        <w:t xml:space="preserve">. </w:t>
+      </w:r>
+      <w:proofErr w:type="spellStart"/>
+      <w:r>
+        <w:rPr>
+          <w:rFonts w:ascii="Arial" w:hAnsi="Arial" w:cs="Arial"/>
+          <w:sz w:val="24"/>
+          <w:szCs w:val="24"/>
+        </w:rPr>
+        <w:t>Quisque</w:t>
+      </w:r>
+      <w:proofErr w:type="spellEnd"/>
+      <w:r>
+        <w:rPr>
+          <w:rFonts w:ascii="Arial" w:hAnsi="Arial" w:cs="Arial"/>
+          <w:sz w:val="24"/>
+          <w:szCs w:val="24"/>
+        </w:rPr>
+        <w:t xml:space="preserve"> </w:t>
+      </w:r>
+      <w:proofErr w:type="spellStart"/>
+      <w:r>
+        <w:rPr>
+          <w:rFonts w:ascii="Arial" w:hAnsi="Arial" w:cs="Arial"/>
+          <w:sz w:val="24"/>
+          <w:szCs w:val="24"/>
+        </w:rPr>
+        <w:t>purus</w:t>
+      </w:r>
+      <w:proofErr w:type="spellEnd"/>
+      <w:r>
+        <w:rPr>
+          <w:rFonts w:ascii="Arial" w:hAnsi="Arial" w:cs="Arial"/>
+          <w:sz w:val="24"/>
+          <w:szCs w:val="24"/>
+        </w:rPr>
+        <w:t xml:space="preserve"> magna, </w:t>
+      </w:r>
+      <w:proofErr w:type="spellStart"/>
+      <w:r>
+        <w:rPr>
+          <w:rFonts w:ascii="Arial" w:hAnsi="Arial" w:cs="Arial"/>
+          <w:sz w:val="24"/>
+          <w:szCs w:val="24"/>
+        </w:rPr>
+        <w:t>auctor</w:t>
+      </w:r>
+      <w:proofErr w:type="spellEnd"/>
+      <w:r>
+        <w:rPr>
+          <w:rFonts w:ascii="Arial" w:hAnsi="Arial" w:cs="Arial"/>
+          <w:sz w:val="24"/>
+          <w:szCs w:val="24"/>
+        </w:rPr>
+        <w:t xml:space="preserve"> et, </w:t>
+      </w:r>
+      <w:proofErr w:type="spellStart"/>
+      <w:r>
+        <w:rPr>
+          <w:rFonts w:ascii="Arial" w:hAnsi="Arial" w:cs="Arial"/>
+          <w:sz w:val="24"/>
+          <w:szCs w:val="24"/>
+        </w:rPr>
+        <w:t>sagittis</w:t>
+      </w:r>
+      <w:proofErr w:type="spellEnd"/>
+      <w:r>
+        <w:rPr>
+          <w:rFonts w:ascii="Arial" w:hAnsi="Arial" w:cs="Arial"/>
+          <w:sz w:val="24"/>
+          <w:szCs w:val="24"/>
+        </w:rPr>
+        <w:t xml:space="preserve"> ac, </w:t>
+      </w:r>
+      <w:proofErr w:type="spellStart"/>
+      <w:r>
+        <w:rPr>
+          <w:rFonts w:ascii="Arial" w:hAnsi="Arial" w:cs="Arial"/>
+          <w:sz w:val="24"/>
+          <w:szCs w:val="24"/>
+        </w:rPr>
+        <w:t>posuere</w:t>
+      </w:r>
+      <w:proofErr w:type="spellEnd"/>
+      <w:r>
+        <w:rPr>
+          <w:rFonts w:ascii="Arial" w:hAnsi="Arial" w:cs="Arial"/>
+          <w:sz w:val="24"/>
+          <w:szCs w:val="24"/>
+        </w:rPr>
+        <w:t xml:space="preserve"> eu, </w:t>
+      </w:r>
+      <w:proofErr w:type="spellStart"/>
+      <w:r>
+        <w:rPr>
+          <w:rFonts w:ascii="Arial" w:hAnsi="Arial" w:cs="Arial"/>
+          <w:sz w:val="24"/>
+          <w:szCs w:val="24"/>
+        </w:rPr>
+        <w:t>lectus</w:t>
+      </w:r>
+      <w:proofErr w:type="spellEnd"/>
+      <w:r>
+        <w:rPr>
+          <w:rFonts w:ascii="Arial" w:hAnsi="Arial" w:cs="Arial"/>
+          <w:sz w:val="24"/>
+          <w:szCs w:val="24"/>
+        </w:rPr>
+        <w:t xml:space="preserve">. Nam </w:t>
+      </w:r>
+      <w:proofErr w:type="spellStart"/>
+      <w:r>
+        <w:rPr>
+          <w:rFonts w:ascii="Arial" w:hAnsi="Arial" w:cs="Arial"/>
+          <w:sz w:val="24"/>
+          <w:szCs w:val="24"/>
+        </w:rPr>
+        <w:t>mattis</w:t>
+      </w:r>
+      <w:proofErr w:type="spellEnd"/>
+      <w:r>
+        <w:rPr>
+          <w:rFonts w:ascii="Arial" w:hAnsi="Arial" w:cs="Arial"/>
+          <w:sz w:val="24"/>
+          <w:szCs w:val="24"/>
+        </w:rPr>
+        <w:t xml:space="preserve">, felis ut </w:t>
+      </w:r>
+      <w:proofErr w:type="spellStart"/>
+      <w:r>
+        <w:rPr>
+          <w:rFonts w:ascii="Arial" w:hAnsi="Arial" w:cs="Arial"/>
+          <w:sz w:val="24"/>
+          <w:szCs w:val="24"/>
+        </w:rPr>
+        <w:t>adipiscing</w:t>
+      </w:r>
+      <w:proofErr w:type="spellEnd"/>
+      <w:r>
+        <w:rPr>
+          <w:rFonts w:ascii="Arial" w:hAnsi="Arial" w:cs="Arial"/>
+          <w:sz w:val="24"/>
+          <w:szCs w:val="24"/>
+        </w:rPr>
+        <w:t>.</w:t>
       </w:r>
     </w:p>
     <w:p>
@@ -590,368 +1779,347 @@
         <w:jc w:val="both"/>
         <w:rPr>
           <w:rFonts w:ascii="Arial" w:hAnsi="Arial" w:cs="Arial"/>
-          <w:b/>
-          <w:sz w:val="28"/>
-          <w:szCs w:val="28"/>
-        </w:rPr>
-      </w:pPr>
-      <w:r>
-        <w:rPr>
-          <w:rFonts w:ascii="Arial" w:hAnsi="Arial" w:cs="Arial"/>
-          <w:b/>
-          <w:sz w:val="28"/>
-          <w:szCs w:val="28"/>
-        </w:rPr>
-        <w:lastRenderedPageBreak/>
-        <w:t xml:space="preserve">      </w:t>
-      </w:r>
-      <w:bookmarkStart w:id="1" w:name="_GoBack"/>
-      <w:bookmarkEnd w:id="1"/>
-    </w:p>
-    <w:p>
-      <w:pPr>
-        <w:spacing w:after="0" w:line="360" w:lineRule="auto"/>
-        <w:jc w:val="center"/>
-        <w:rPr>
-          <w:rFonts w:ascii="Arial" w:hAnsi="Arial" w:cs="Arial"/>
-          <w:sz w:val="24"/>
-        </w:rPr>
-      </w:pPr>
-    </w:p>
-    <w:p>
-      <w:pPr>
-        <w:spacing w:after="0" w:line="360" w:lineRule="auto"/>
-        <w:jc w:val="center"/>
-        <w:rPr>
-          <w:rFonts w:ascii="Arial" w:hAnsi="Arial" w:cs="Arial"/>
-          <w:sz w:val="24"/>
-        </w:rPr>
-      </w:pPr>
-    </w:p>
-    <w:p>
-      <w:pPr>
-        <w:spacing w:after="0" w:line="360" w:lineRule="auto"/>
-        <w:jc w:val="center"/>
-        <w:rPr>
-          <w:rFonts w:ascii="Arial" w:hAnsi="Arial" w:cs="Arial"/>
-          <w:sz w:val="24"/>
-        </w:rPr>
-      </w:pPr>
-    </w:p>
-    <w:p>
-      <w:pPr>
-        <w:spacing w:after="0" w:line="360" w:lineRule="auto"/>
-        <w:jc w:val="center"/>
-        <w:rPr>
-          <w:rFonts w:ascii="Arial" w:hAnsi="Arial" w:cs="Arial"/>
-          <w:sz w:val="24"/>
-        </w:rPr>
-      </w:pPr>
-    </w:p>
-    <w:p>
-      <w:pPr>
-        <w:spacing w:after="0" w:line="360" w:lineRule="auto"/>
-        <w:jc w:val="center"/>
-        <w:rPr>
-          <w:rFonts w:ascii="Arial" w:hAnsi="Arial" w:cs="Arial"/>
-          <w:sz w:val="24"/>
-        </w:rPr>
-      </w:pPr>
-    </w:p>
-    <w:p>
-      <w:pPr>
-        <w:spacing w:after="0" w:line="360" w:lineRule="auto"/>
-        <w:jc w:val="center"/>
-        <w:rPr>
-          <w:rFonts w:ascii="Arial" w:hAnsi="Arial" w:cs="Arial"/>
-          <w:sz w:val="24"/>
-        </w:rPr>
-      </w:pPr>
-    </w:p>
-    <w:p>
-      <w:pPr>
-        <w:spacing w:after="0" w:line="360" w:lineRule="auto"/>
-        <w:jc w:val="center"/>
-        <w:rPr>
-          <w:rFonts w:ascii="Arial" w:hAnsi="Arial" w:cs="Arial"/>
-          <w:sz w:val="24"/>
-        </w:rPr>
-      </w:pPr>
-    </w:p>
-    <w:p>
-      <w:pPr>
-        <w:spacing w:after="0" w:line="360" w:lineRule="auto"/>
-        <w:jc w:val="center"/>
-        <w:rPr>
-          <w:rFonts w:ascii="Arial" w:hAnsi="Arial" w:cs="Arial"/>
-          <w:sz w:val="24"/>
-        </w:rPr>
-      </w:pPr>
-    </w:p>
-    <w:p>
-      <w:pPr>
-        <w:spacing w:after="0" w:line="360" w:lineRule="auto"/>
-        <w:jc w:val="center"/>
-        <w:rPr>
-          <w:rFonts w:ascii="Arial" w:hAnsi="Arial" w:cs="Arial"/>
-          <w:sz w:val="24"/>
-        </w:rPr>
-      </w:pPr>
-    </w:p>
-    <w:p>
-      <w:pPr>
-        <w:spacing w:after="0" w:line="360" w:lineRule="auto"/>
-        <w:jc w:val="center"/>
-        <w:rPr>
-          <w:rFonts w:ascii="Arial" w:hAnsi="Arial" w:cs="Arial"/>
-          <w:sz w:val="24"/>
-        </w:rPr>
-      </w:pPr>
-    </w:p>
-    <w:p>
-      <w:pPr>
-        <w:spacing w:after="0" w:line="360" w:lineRule="auto"/>
-        <w:jc w:val="center"/>
-        <w:rPr>
-          <w:rFonts w:ascii="Arial" w:hAnsi="Arial" w:cs="Arial"/>
-          <w:sz w:val="24"/>
-        </w:rPr>
-      </w:pPr>
-    </w:p>
-    <w:p>
-      <w:pPr>
-        <w:spacing w:after="0" w:line="360" w:lineRule="auto"/>
-        <w:jc w:val="center"/>
-        <w:rPr>
-          <w:rFonts w:ascii="Arial" w:hAnsi="Arial" w:cs="Arial"/>
-          <w:sz w:val="24"/>
-        </w:rPr>
-      </w:pPr>
-    </w:p>
-    <w:p>
-      <w:pPr>
-        <w:spacing w:after="0" w:line="360" w:lineRule="auto"/>
-        <w:jc w:val="center"/>
-        <w:rPr>
-          <w:rFonts w:ascii="Arial" w:hAnsi="Arial" w:cs="Arial"/>
-          <w:sz w:val="24"/>
-        </w:rPr>
-      </w:pPr>
-    </w:p>
-    <w:p>
-      <w:pPr>
-        <w:spacing w:after="0" w:line="360" w:lineRule="auto"/>
-        <w:jc w:val="center"/>
-        <w:rPr>
-          <w:rFonts w:ascii="Arial" w:hAnsi="Arial" w:cs="Arial"/>
-          <w:sz w:val="24"/>
-        </w:rPr>
-      </w:pPr>
-    </w:p>
-    <w:p>
-      <w:pPr>
-        <w:spacing w:after="0" w:line="360" w:lineRule="auto"/>
-        <w:jc w:val="center"/>
-        <w:rPr>
-          <w:rFonts w:ascii="Arial" w:hAnsi="Arial" w:cs="Arial"/>
-          <w:sz w:val="24"/>
-        </w:rPr>
-      </w:pPr>
-    </w:p>
-    <w:p>
-      <w:pPr>
-        <w:spacing w:after="0" w:line="360" w:lineRule="auto"/>
-        <w:jc w:val="center"/>
-        <w:rPr>
-          <w:rFonts w:ascii="Arial" w:hAnsi="Arial" w:cs="Arial"/>
-          <w:sz w:val="24"/>
-        </w:rPr>
-      </w:pPr>
-    </w:p>
-    <w:p>
-      <w:pPr>
-        <w:spacing w:after="0" w:line="360" w:lineRule="auto"/>
-        <w:jc w:val="center"/>
-        <w:rPr>
-          <w:rFonts w:ascii="Arial" w:hAnsi="Arial" w:cs="Arial"/>
-          <w:sz w:val="24"/>
-        </w:rPr>
-      </w:pPr>
-    </w:p>
-    <w:p>
-      <w:pPr>
-        <w:spacing w:after="0" w:line="360" w:lineRule="auto"/>
-        <w:jc w:val="center"/>
-        <w:rPr>
-          <w:rFonts w:ascii="Arial" w:hAnsi="Arial" w:cs="Arial"/>
-          <w:sz w:val="24"/>
-        </w:rPr>
-      </w:pPr>
-    </w:p>
-    <w:p>
-      <w:pPr>
-        <w:spacing w:after="0" w:line="360" w:lineRule="auto"/>
-        <w:jc w:val="center"/>
-        <w:rPr>
-          <w:rFonts w:ascii="Arial" w:hAnsi="Arial" w:cs="Arial"/>
-          <w:sz w:val="24"/>
-        </w:rPr>
-      </w:pPr>
-    </w:p>
-    <w:p>
-      <w:pPr>
-        <w:spacing w:after="0" w:line="360" w:lineRule="auto"/>
-        <w:jc w:val="center"/>
-        <w:rPr>
-          <w:rFonts w:ascii="Arial" w:hAnsi="Arial" w:cs="Arial"/>
-          <w:sz w:val="24"/>
-        </w:rPr>
-      </w:pPr>
-    </w:p>
-    <w:p>
-      <w:pPr>
-        <w:spacing w:after="0" w:line="360" w:lineRule="auto"/>
-        <w:jc w:val="center"/>
-        <w:rPr>
-          <w:rFonts w:ascii="Arial" w:hAnsi="Arial" w:cs="Arial"/>
-          <w:sz w:val="24"/>
-        </w:rPr>
-      </w:pPr>
-    </w:p>
-    <w:p>
-      <w:pPr>
-        <w:spacing w:after="0" w:line="360" w:lineRule="auto"/>
-        <w:jc w:val="center"/>
-        <w:rPr>
-          <w:rFonts w:ascii="Arial" w:hAnsi="Arial" w:cs="Arial"/>
-          <w:sz w:val="24"/>
-        </w:rPr>
-      </w:pPr>
-    </w:p>
-    <w:p>
-      <w:pPr>
-        <w:spacing w:after="0" w:line="360" w:lineRule="auto"/>
-        <w:jc w:val="center"/>
-        <w:rPr>
-          <w:rFonts w:ascii="Arial" w:hAnsi="Arial" w:cs="Arial"/>
-          <w:sz w:val="24"/>
-        </w:rPr>
-      </w:pPr>
-    </w:p>
-    <w:p>
-      <w:pPr>
-        <w:spacing w:after="0" w:line="360" w:lineRule="auto"/>
-        <w:jc w:val="center"/>
-        <w:rPr>
-          <w:rFonts w:ascii="Arial" w:hAnsi="Arial" w:cs="Arial"/>
-          <w:sz w:val="24"/>
-        </w:rPr>
-      </w:pPr>
-    </w:p>
-    <w:p>
-      <w:pPr>
-        <w:spacing w:after="0" w:line="360" w:lineRule="auto"/>
-        <w:jc w:val="center"/>
-        <w:rPr>
-          <w:rFonts w:ascii="Arial" w:hAnsi="Arial" w:cs="Arial"/>
-          <w:sz w:val="24"/>
-        </w:rPr>
-      </w:pPr>
-    </w:p>
-    <w:p>
-      <w:pPr>
-        <w:spacing w:after="0" w:line="360" w:lineRule="auto"/>
-        <w:jc w:val="center"/>
-        <w:rPr>
-          <w:rFonts w:ascii="Arial" w:hAnsi="Arial" w:cs="Arial"/>
-          <w:sz w:val="24"/>
-        </w:rPr>
-      </w:pPr>
-    </w:p>
-    <w:p>
-      <w:pPr>
-        <w:spacing w:after="0" w:line="360" w:lineRule="auto"/>
-        <w:jc w:val="center"/>
-        <w:rPr>
-          <w:rFonts w:ascii="Arial" w:hAnsi="Arial" w:cs="Arial"/>
-          <w:sz w:val="24"/>
-        </w:rPr>
-      </w:pPr>
-    </w:p>
-    <w:p>
-      <w:pPr>
-        <w:spacing w:after="0" w:line="360" w:lineRule="auto"/>
-        <w:jc w:val="center"/>
-        <w:rPr>
-          <w:rFonts w:ascii="Arial" w:hAnsi="Arial" w:cs="Arial"/>
-          <w:sz w:val="24"/>
-        </w:rPr>
-      </w:pPr>
-    </w:p>
-    <w:p>
-      <w:pPr>
-        <w:spacing w:after="0" w:line="360" w:lineRule="auto"/>
-        <w:jc w:val="center"/>
-        <w:rPr>
-          <w:rFonts w:ascii="Arial" w:hAnsi="Arial" w:cs="Arial"/>
-          <w:sz w:val="24"/>
-        </w:rPr>
-      </w:pPr>
-    </w:p>
-    <w:p>
-      <w:pPr>
-        <w:spacing w:after="0" w:line="360" w:lineRule="auto"/>
-        <w:jc w:val="center"/>
-        <w:rPr>
-          <w:rFonts w:ascii="Arial" w:hAnsi="Arial" w:cs="Arial"/>
-          <w:sz w:val="24"/>
-        </w:rPr>
-      </w:pPr>
-    </w:p>
-    <w:p>
-      <w:pPr>
-        <w:spacing w:after="0" w:line="360" w:lineRule="auto"/>
-        <w:jc w:val="center"/>
-        <w:rPr>
-          <w:rFonts w:ascii="Arial" w:hAnsi="Arial" w:cs="Arial"/>
-          <w:sz w:val="24"/>
-        </w:rPr>
-      </w:pPr>
-    </w:p>
-    <w:p>
-      <w:pPr>
-        <w:spacing w:after="0" w:line="360" w:lineRule="auto"/>
-        <w:jc w:val="center"/>
-        <w:rPr>
-          <w:rFonts w:ascii="Arial" w:hAnsi="Arial" w:cs="Arial"/>
-          <w:sz w:val="24"/>
-        </w:rPr>
-      </w:pPr>
-    </w:p>
-    <w:p>
-      <w:pPr>
-        <w:spacing w:after="0" w:line="360" w:lineRule="auto"/>
-        <w:jc w:val="center"/>
-        <w:rPr>
-          <w:rFonts w:ascii="Arial" w:hAnsi="Arial" w:cs="Arial"/>
-          <w:sz w:val="24"/>
-        </w:rPr>
-      </w:pPr>
-      <w:r>
-        <w:rPr>
-          <w:rFonts w:ascii="Arial" w:hAnsi="Arial" w:cs="Arial"/>
-          <w:sz w:val="24"/>
-        </w:rPr>
-        <w:lastRenderedPageBreak/>
-        <w:t>TEA LEARN</w:t>
-      </w:r>
-    </w:p>
-    <w:p>
-      <w:pPr>
-        <w:jc w:val="center"/>
-        <w:rPr>
-          <w:rFonts w:ascii="Arial" w:hAnsi="Arial" w:cs="Arial"/>
-          <w:sz w:val="24"/>
+          <w:sz w:val="24"/>
+          <w:szCs w:val="24"/>
+        </w:rPr>
+      </w:pPr>
+    </w:p>
+    <w:p>
+      <w:pPr>
+        <w:spacing w:after="0" w:line="360" w:lineRule="auto"/>
+        <w:jc w:val="center"/>
+        <w:rPr>
+          <w:rFonts w:ascii="Arial" w:hAnsi="Arial" w:cs="Arial"/>
+          <w:sz w:val="24"/>
+          <w:szCs w:val="24"/>
+        </w:rPr>
+      </w:pPr>
+    </w:p>
+    <w:p>
+      <w:pPr>
+        <w:spacing w:after="0" w:line="360" w:lineRule="auto"/>
+        <w:jc w:val="center"/>
+        <w:rPr>
+          <w:rFonts w:ascii="Arial" w:hAnsi="Arial" w:cs="Arial"/>
+          <w:sz w:val="24"/>
+          <w:szCs w:val="24"/>
+        </w:rPr>
+      </w:pPr>
+    </w:p>
+    <w:p>
+      <w:pPr>
+        <w:spacing w:after="0" w:line="360" w:lineRule="auto"/>
+        <w:jc w:val="center"/>
+        <w:rPr>
+          <w:rFonts w:ascii="Arial" w:hAnsi="Arial" w:cs="Arial"/>
+          <w:sz w:val="24"/>
+          <w:szCs w:val="24"/>
+        </w:rPr>
+      </w:pPr>
+    </w:p>
+    <w:p>
+      <w:pPr>
+        <w:spacing w:after="0" w:line="360" w:lineRule="auto"/>
+        <w:jc w:val="center"/>
+        <w:rPr>
+          <w:rFonts w:ascii="Arial" w:hAnsi="Arial" w:cs="Arial"/>
+          <w:sz w:val="24"/>
+          <w:szCs w:val="24"/>
+        </w:rPr>
+      </w:pPr>
+    </w:p>
+    <w:p>
+      <w:pPr>
+        <w:spacing w:after="0" w:line="360" w:lineRule="auto"/>
+        <w:jc w:val="center"/>
+        <w:rPr>
+          <w:rFonts w:ascii="Arial" w:hAnsi="Arial" w:cs="Arial"/>
+          <w:sz w:val="24"/>
+          <w:szCs w:val="24"/>
+        </w:rPr>
+      </w:pPr>
+    </w:p>
+    <w:p>
+      <w:pPr>
+        <w:spacing w:after="0" w:line="360" w:lineRule="auto"/>
+        <w:jc w:val="center"/>
+        <w:rPr>
+          <w:rFonts w:ascii="Arial" w:hAnsi="Arial" w:cs="Arial"/>
+          <w:sz w:val="24"/>
+          <w:szCs w:val="24"/>
+        </w:rPr>
+      </w:pPr>
+    </w:p>
+    <w:p>
+      <w:pPr>
+        <w:spacing w:after="0" w:line="360" w:lineRule="auto"/>
+        <w:jc w:val="center"/>
+        <w:rPr>
+          <w:rFonts w:ascii="Arial" w:hAnsi="Arial" w:cs="Arial"/>
+          <w:sz w:val="24"/>
+          <w:szCs w:val="24"/>
+        </w:rPr>
+      </w:pPr>
+    </w:p>
+    <w:p>
+      <w:pPr>
+        <w:spacing w:after="0" w:line="360" w:lineRule="auto"/>
+        <w:jc w:val="center"/>
+        <w:rPr>
+          <w:rFonts w:ascii="Arial" w:hAnsi="Arial" w:cs="Arial"/>
+          <w:sz w:val="24"/>
+          <w:szCs w:val="24"/>
+        </w:rPr>
+      </w:pPr>
+    </w:p>
+    <w:p>
+      <w:pPr>
+        <w:spacing w:after="0" w:line="360" w:lineRule="auto"/>
+        <w:jc w:val="center"/>
+        <w:rPr>
+          <w:rFonts w:ascii="Arial" w:hAnsi="Arial" w:cs="Arial"/>
+          <w:sz w:val="24"/>
+          <w:szCs w:val="24"/>
+        </w:rPr>
+      </w:pPr>
+    </w:p>
+    <w:p>
+      <w:pPr>
+        <w:spacing w:after="0" w:line="360" w:lineRule="auto"/>
+        <w:jc w:val="center"/>
+        <w:rPr>
+          <w:rFonts w:ascii="Arial" w:hAnsi="Arial" w:cs="Arial"/>
+          <w:sz w:val="24"/>
+          <w:szCs w:val="24"/>
+        </w:rPr>
+      </w:pPr>
+    </w:p>
+    <w:p>
+      <w:pPr>
+        <w:spacing w:after="0" w:line="360" w:lineRule="auto"/>
+        <w:jc w:val="center"/>
+        <w:rPr>
+          <w:rFonts w:ascii="Arial" w:hAnsi="Arial" w:cs="Arial"/>
+          <w:sz w:val="24"/>
+          <w:szCs w:val="24"/>
+        </w:rPr>
+      </w:pPr>
+    </w:p>
+    <w:p>
+      <w:pPr>
+        <w:spacing w:after="0" w:line="360" w:lineRule="auto"/>
+        <w:jc w:val="center"/>
+        <w:rPr>
+          <w:rFonts w:ascii="Arial" w:hAnsi="Arial" w:cs="Arial"/>
+          <w:sz w:val="24"/>
+          <w:szCs w:val="24"/>
+        </w:rPr>
+      </w:pPr>
+    </w:p>
+    <w:p>
+      <w:pPr>
+        <w:spacing w:after="0" w:line="360" w:lineRule="auto"/>
+        <w:jc w:val="center"/>
+        <w:rPr>
+          <w:rFonts w:ascii="Arial" w:hAnsi="Arial" w:cs="Arial"/>
+          <w:sz w:val="24"/>
+          <w:szCs w:val="24"/>
+        </w:rPr>
+      </w:pPr>
+    </w:p>
+    <w:p>
+      <w:pPr>
+        <w:spacing w:after="0" w:line="360" w:lineRule="auto"/>
+        <w:jc w:val="center"/>
+        <w:rPr>
+          <w:rFonts w:ascii="Arial" w:hAnsi="Arial" w:cs="Arial"/>
+          <w:sz w:val="24"/>
+          <w:szCs w:val="24"/>
+        </w:rPr>
+      </w:pPr>
+    </w:p>
+    <w:p>
+      <w:pPr>
+        <w:spacing w:after="0" w:line="360" w:lineRule="auto"/>
+        <w:jc w:val="center"/>
+        <w:rPr>
+          <w:rFonts w:ascii="Arial" w:hAnsi="Arial" w:cs="Arial"/>
+          <w:sz w:val="24"/>
+          <w:szCs w:val="24"/>
+        </w:rPr>
+      </w:pPr>
+    </w:p>
+    <w:p>
+      <w:pPr>
+        <w:spacing w:after="0" w:line="360" w:lineRule="auto"/>
+        <w:jc w:val="center"/>
+        <w:rPr>
+          <w:rFonts w:ascii="Arial" w:hAnsi="Arial" w:cs="Arial"/>
+          <w:sz w:val="24"/>
+          <w:szCs w:val="24"/>
+        </w:rPr>
+      </w:pPr>
+    </w:p>
+    <w:p>
+      <w:pPr>
+        <w:spacing w:after="0" w:line="360" w:lineRule="auto"/>
+        <w:jc w:val="center"/>
+        <w:rPr>
+          <w:rFonts w:ascii="Arial" w:hAnsi="Arial" w:cs="Arial"/>
+          <w:sz w:val="24"/>
+          <w:szCs w:val="24"/>
+        </w:rPr>
+      </w:pPr>
+    </w:p>
+    <w:p>
+      <w:pPr>
+        <w:spacing w:after="0" w:line="360" w:lineRule="auto"/>
+        <w:jc w:val="center"/>
+        <w:rPr>
+          <w:rFonts w:ascii="Arial" w:hAnsi="Arial" w:cs="Arial"/>
+          <w:sz w:val="24"/>
+          <w:szCs w:val="24"/>
+        </w:rPr>
+      </w:pPr>
+    </w:p>
+    <w:p>
+      <w:pPr>
+        <w:spacing w:after="0" w:line="360" w:lineRule="auto"/>
+        <w:jc w:val="center"/>
+        <w:rPr>
+          <w:rFonts w:ascii="Arial" w:hAnsi="Arial" w:cs="Arial"/>
+          <w:sz w:val="24"/>
+          <w:szCs w:val="24"/>
+        </w:rPr>
+      </w:pPr>
+    </w:p>
+    <w:p>
+      <w:pPr>
+        <w:spacing w:after="0" w:line="360" w:lineRule="auto"/>
+        <w:jc w:val="center"/>
+        <w:rPr>
+          <w:rFonts w:ascii="Arial" w:hAnsi="Arial" w:cs="Arial"/>
+          <w:sz w:val="24"/>
+          <w:szCs w:val="24"/>
+        </w:rPr>
+      </w:pPr>
+    </w:p>
+    <w:p>
+      <w:pPr>
+        <w:spacing w:after="0" w:line="360" w:lineRule="auto"/>
+        <w:jc w:val="center"/>
+        <w:rPr>
+          <w:rFonts w:ascii="Arial" w:hAnsi="Arial" w:cs="Arial"/>
+          <w:sz w:val="24"/>
+          <w:szCs w:val="24"/>
+        </w:rPr>
+      </w:pPr>
+    </w:p>
+    <w:p>
+      <w:pPr>
+        <w:spacing w:after="0" w:line="360" w:lineRule="auto"/>
+        <w:jc w:val="center"/>
+        <w:rPr>
+          <w:rFonts w:ascii="Arial" w:hAnsi="Arial" w:cs="Arial"/>
+          <w:sz w:val="24"/>
+          <w:szCs w:val="24"/>
+        </w:rPr>
+      </w:pPr>
+    </w:p>
+    <w:p>
+      <w:pPr>
+        <w:spacing w:after="0" w:line="360" w:lineRule="auto"/>
+        <w:jc w:val="center"/>
+        <w:rPr>
+          <w:rFonts w:ascii="Arial" w:hAnsi="Arial" w:cs="Arial"/>
+          <w:sz w:val="24"/>
+          <w:szCs w:val="24"/>
+        </w:rPr>
+      </w:pPr>
+    </w:p>
+    <w:p>
+      <w:pPr>
+        <w:spacing w:after="0" w:line="360" w:lineRule="auto"/>
+        <w:jc w:val="center"/>
+        <w:rPr>
+          <w:rFonts w:ascii="Arial" w:hAnsi="Arial" w:cs="Arial"/>
+          <w:sz w:val="24"/>
+          <w:szCs w:val="24"/>
+        </w:rPr>
+      </w:pPr>
+    </w:p>
+    <w:p>
+      <w:pPr>
+        <w:spacing w:after="0" w:line="360" w:lineRule="auto"/>
+        <w:jc w:val="center"/>
+        <w:rPr>
+          <w:rFonts w:ascii="Arial" w:hAnsi="Arial" w:cs="Arial"/>
+          <w:sz w:val="24"/>
+          <w:szCs w:val="24"/>
+        </w:rPr>
+      </w:pPr>
+    </w:p>
+    <w:p>
+      <w:pPr>
+        <w:spacing w:after="0" w:line="360" w:lineRule="auto"/>
+        <w:jc w:val="center"/>
+        <w:rPr>
+          <w:rFonts w:ascii="Arial" w:hAnsi="Arial" w:cs="Arial"/>
+          <w:sz w:val="24"/>
+          <w:szCs w:val="24"/>
+        </w:rPr>
+      </w:pPr>
+    </w:p>
+    <w:p>
+      <w:pPr>
+        <w:spacing w:after="0" w:line="360" w:lineRule="auto"/>
+        <w:jc w:val="center"/>
+        <w:rPr>
+          <w:rFonts w:ascii="Arial" w:hAnsi="Arial" w:cs="Arial"/>
+          <w:sz w:val="24"/>
+          <w:szCs w:val="24"/>
+        </w:rPr>
+      </w:pPr>
+    </w:p>
+    <w:p>
+      <w:pPr>
+        <w:spacing w:after="0" w:line="360" w:lineRule="auto"/>
+        <w:jc w:val="center"/>
+        <w:rPr>
+          <w:rFonts w:ascii="Arial" w:hAnsi="Arial" w:cs="Arial"/>
+          <w:sz w:val="24"/>
+          <w:szCs w:val="24"/>
+        </w:rPr>
+      </w:pPr>
+    </w:p>
+    <w:p>
+      <w:pPr>
+        <w:spacing w:after="0" w:line="360" w:lineRule="auto"/>
+        <w:jc w:val="center"/>
+        <w:rPr>
+          <w:rFonts w:ascii="Arial" w:hAnsi="Arial" w:cs="Arial"/>
+          <w:sz w:val="24"/>
+          <w:szCs w:val="24"/>
+        </w:rPr>
+      </w:pPr>
+    </w:p>
+    <w:p>
+      <w:pPr>
+        <w:jc w:val="center"/>
+        <w:rPr>
+          <w:rFonts w:ascii="Arial" w:hAnsi="Arial" w:cs="Arial"/>
+          <w:sz w:val="24"/>
+          <w:szCs w:val="24"/>
+        </w:rPr>
+      </w:pPr>
+    </w:p>
+    <w:p>
+      <w:pPr>
+        <w:jc w:val="center"/>
+        <w:rPr>
+          <w:rFonts w:ascii="Arial" w:hAnsi="Arial" w:cs="Arial"/>
+          <w:sz w:val="24"/>
+          <w:szCs w:val="24"/>
         </w:rPr>
       </w:pPr>
     </w:p>
@@ -966,6 +2134,7 @@
           <w:rFonts w:ascii="Arial" w:hAnsi="Arial" w:cs="Arial"/>
           <w:b/>
           <w:sz w:val="24"/>
+          <w:szCs w:val="24"/>
         </w:rPr>
       </w:pPr>
       <w:r>
@@ -973,6 +2142,7 @@
           <w:rFonts w:ascii="Arial" w:hAnsi="Arial" w:cs="Arial"/>
           <w:b/>
           <w:sz w:val="24"/>
+          <w:szCs w:val="24"/>
         </w:rPr>
         <w:t>Objetivo</w:t>
       </w:r>
@@ -983,12 +2153,14 @@
         <w:rPr>
           <w:rFonts w:ascii="Arial" w:hAnsi="Arial" w:cs="Arial"/>
           <w:sz w:val="24"/>
-        </w:rPr>
-      </w:pPr>
-      <w:r>
-        <w:rPr>
-          <w:rFonts w:ascii="Arial" w:hAnsi="Arial" w:cs="Arial"/>
-          <w:sz w:val="24"/>
+          <w:szCs w:val="24"/>
+        </w:rPr>
+      </w:pPr>
+      <w:r>
+        <w:rPr>
+          <w:rFonts w:ascii="Arial" w:hAnsi="Arial" w:cs="Arial"/>
+          <w:sz w:val="24"/>
+          <w:szCs w:val="24"/>
         </w:rPr>
         <w:t>O objetivo do sistema é adaptar automaticamente conteúdos didáticos do ensino médio para estudantes com TEA nível 1, utilizando Inteligência Artificial, os princípios do Desenho Universal para Aprendizagem (DUA) e o modelo instrucional ADDIE.</w:t>
       </w:r>
@@ -998,6 +2170,7 @@
         <w:rPr>
           <w:rFonts w:ascii="Arial" w:hAnsi="Arial" w:cs="Arial"/>
           <w:sz w:val="24"/>
+          <w:szCs w:val="24"/>
         </w:rPr>
       </w:pPr>
     </w:p>
@@ -1012,6 +2185,7 @@
           <w:rFonts w:ascii="Arial" w:hAnsi="Arial" w:cs="Arial"/>
           <w:b/>
           <w:sz w:val="24"/>
+          <w:szCs w:val="24"/>
         </w:rPr>
       </w:pPr>
       <w:r>
@@ -1019,6 +2193,7 @@
           <w:rFonts w:ascii="Arial" w:hAnsi="Arial" w:cs="Arial"/>
           <w:b/>
           <w:sz w:val="24"/>
+          <w:szCs w:val="24"/>
         </w:rPr>
         <w:t>Metodologia</w:t>
       </w:r>
@@ -1029,12 +2204,14 @@
         <w:rPr>
           <w:rFonts w:ascii="Arial" w:hAnsi="Arial" w:cs="Arial"/>
           <w:sz w:val="24"/>
-        </w:rPr>
-      </w:pPr>
-      <w:r>
-        <w:rPr>
-          <w:rFonts w:ascii="Arial" w:hAnsi="Arial" w:cs="Arial"/>
-          <w:sz w:val="24"/>
+          <w:szCs w:val="24"/>
+        </w:rPr>
+      </w:pPr>
+      <w:r>
+        <w:rPr>
+          <w:rFonts w:ascii="Arial" w:hAnsi="Arial" w:cs="Arial"/>
+          <w:sz w:val="24"/>
+          <w:szCs w:val="24"/>
         </w:rPr>
         <w:t xml:space="preserve">ADDIE, DUA, Pesquisas de Campo na Clínica </w:t>
       </w:r>
@@ -1043,6 +2220,7 @@
         <w:rPr>
           <w:rFonts w:ascii="Arial" w:hAnsi="Arial" w:cs="Arial"/>
           <w:sz w:val="24"/>
+          <w:szCs w:val="24"/>
         </w:rPr>
         <w:t>Movthera</w:t>
       </w:r>
@@ -1051,6 +2229,7 @@
         <w:rPr>
           <w:rFonts w:ascii="Arial" w:hAnsi="Arial" w:cs="Arial"/>
           <w:sz w:val="24"/>
+          <w:szCs w:val="24"/>
         </w:rPr>
         <w:t xml:space="preserve">, Pesquisas online (sites e artigos), Scrum </w:t>
       </w:r>
@@ -1060,6 +2239,7 @@
         <w:rPr>
           <w:rFonts w:ascii="Arial" w:hAnsi="Arial" w:cs="Arial"/>
           <w:sz w:val="24"/>
+          <w:szCs w:val="24"/>
         </w:rPr>
       </w:pPr>
     </w:p>
@@ -1074,6 +2254,7 @@
           <w:rFonts w:ascii="Arial" w:hAnsi="Arial" w:cs="Arial"/>
           <w:b/>
           <w:sz w:val="24"/>
+          <w:szCs w:val="24"/>
         </w:rPr>
       </w:pPr>
       <w:r>
@@ -1081,6 +2262,7 @@
           <w:rFonts w:ascii="Arial" w:hAnsi="Arial" w:cs="Arial"/>
           <w:b/>
           <w:sz w:val="24"/>
+          <w:szCs w:val="24"/>
         </w:rPr>
         <w:t>Pesquisas</w:t>
       </w:r>
@@ -1090,12 +2272,14 @@
         <w:rPr>
           <w:rFonts w:ascii="Arial" w:hAnsi="Arial" w:cs="Arial"/>
           <w:sz w:val="24"/>
-        </w:rPr>
-      </w:pPr>
-      <w:r>
-        <w:rPr>
-          <w:rFonts w:ascii="Arial" w:hAnsi="Arial" w:cs="Arial"/>
-          <w:sz w:val="24"/>
+          <w:szCs w:val="24"/>
+        </w:rPr>
+      </w:pPr>
+      <w:r>
+        <w:rPr>
+          <w:rFonts w:ascii="Arial" w:hAnsi="Arial" w:cs="Arial"/>
+          <w:sz w:val="24"/>
+          <w:szCs w:val="24"/>
         </w:rPr>
         <w:t xml:space="preserve">Artigo sobre como a gamificação influencia no aprendizado de alunos com TEA: </w:t>
       </w:r>
@@ -1110,44 +2294,7 @@
         <w:rPr>
           <w:rFonts w:ascii="Arial" w:hAnsi="Arial" w:cs="Arial"/>
           <w:sz w:val="24"/>
-        </w:rPr>
-      </w:pPr>
-      <w:hyperlink r:id="rId8" w:history="1">
-        <w:r>
-          <w:rPr>
-            <w:rStyle w:val="Hyperlink"/>
-            <w:rFonts w:ascii="Arial" w:hAnsi="Arial" w:cs="Arial"/>
-            <w:sz w:val="24"/>
-          </w:rPr>
-          <w:t>https://repositorio.ifes.edu.br/server/api/core/bitstreams/17459002-d123-4b2d-aebd-23e19491cef3/content</w:t>
-        </w:r>
-      </w:hyperlink>
-    </w:p>
-    <w:p>
-      <w:pPr>
-        <w:rPr>
-          <w:rFonts w:ascii="Arial" w:hAnsi="Arial" w:cs="Arial"/>
-          <w:sz w:val="24"/>
-        </w:rPr>
-      </w:pPr>
-      <w:r>
-        <w:rPr>
-          <w:rFonts w:ascii="Arial" w:hAnsi="Arial" w:cs="Arial"/>
-          <w:sz w:val="24"/>
-        </w:rPr>
-        <w:t>Como adaptar materiais:</w:t>
-      </w:r>
-    </w:p>
-    <w:p>
-      <w:pPr>
-        <w:pStyle w:val="PargrafodaLista"/>
-        <w:numPr>
-          <w:ilvl w:val="0"/>
-          <w:numId w:val="11"/>
-        </w:numPr>
-        <w:rPr>
-          <w:rFonts w:ascii="Arial" w:hAnsi="Arial" w:cs="Arial"/>
-          <w:sz w:val="24"/>
+          <w:szCs w:val="24"/>
         </w:rPr>
       </w:pPr>
       <w:hyperlink r:id="rId9" w:history="1">
@@ -1156,31 +2303,27 @@
             <w:rStyle w:val="Hyperlink"/>
             <w:rFonts w:ascii="Arial" w:hAnsi="Arial" w:cs="Arial"/>
             <w:sz w:val="24"/>
+            <w:szCs w:val="24"/>
           </w:rPr>
-          <w:t>https://www.youtube.com/watch?v=O4MnZjmLzmQ</w:t>
+          <w:t>https://repositorio.ifes.edu.br/server/api/core/bitstreams/17459002-d123-4b2d-aebd-23e19491cef3/content</w:t>
         </w:r>
       </w:hyperlink>
-      <w:r>
-        <w:rPr>
-          <w:rFonts w:ascii="Arial" w:hAnsi="Arial" w:cs="Arial"/>
-          <w:sz w:val="24"/>
-        </w:rPr>
-        <w:t xml:space="preserve"> </w:t>
-      </w:r>
-    </w:p>
-    <w:p>
-      <w:pPr>
-        <w:rPr>
-          <w:rFonts w:ascii="Arial" w:hAnsi="Arial" w:cs="Arial"/>
-          <w:sz w:val="24"/>
-        </w:rPr>
-      </w:pPr>
-      <w:r>
-        <w:rPr>
-          <w:rFonts w:ascii="Arial" w:hAnsi="Arial" w:cs="Arial"/>
-          <w:sz w:val="24"/>
-        </w:rPr>
-        <w:t>IA que reconhece arquivos:</w:t>
+    </w:p>
+    <w:p>
+      <w:pPr>
+        <w:rPr>
+          <w:rFonts w:ascii="Arial" w:hAnsi="Arial" w:cs="Arial"/>
+          <w:sz w:val="24"/>
+          <w:szCs w:val="24"/>
+        </w:rPr>
+      </w:pPr>
+      <w:r>
+        <w:rPr>
+          <w:rFonts w:ascii="Arial" w:hAnsi="Arial" w:cs="Arial"/>
+          <w:sz w:val="24"/>
+          <w:szCs w:val="24"/>
+        </w:rPr>
+        <w:t>Como adaptar materiais:</w:t>
       </w:r>
     </w:p>
     <w:p>
@@ -1188,11 +2331,12 @@
         <w:pStyle w:val="PargrafodaLista"/>
         <w:numPr>
           <w:ilvl w:val="0"/>
-          <w:numId w:val="10"/>
+          <w:numId w:val="11"/>
         </w:numPr>
         <w:rPr>
           <w:rFonts w:ascii="Arial" w:hAnsi="Arial" w:cs="Arial"/>
           <w:sz w:val="24"/>
+          <w:szCs w:val="24"/>
         </w:rPr>
       </w:pPr>
       <w:hyperlink r:id="rId10" w:history="1">
@@ -1201,14 +2345,16 @@
             <w:rStyle w:val="Hyperlink"/>
             <w:rFonts w:ascii="Arial" w:hAnsi="Arial" w:cs="Arial"/>
             <w:sz w:val="24"/>
+            <w:szCs w:val="24"/>
           </w:rPr>
-          <w:t>https://www.youtube.com/watch?v=RfNjmEUZyc0</w:t>
+          <w:t>https://www.youtube.com/watch?v=O4MnZjmLzmQ</w:t>
         </w:r>
       </w:hyperlink>
       <w:r>
         <w:rPr>
           <w:rFonts w:ascii="Arial" w:hAnsi="Arial" w:cs="Arial"/>
           <w:sz w:val="24"/>
+          <w:szCs w:val="24"/>
         </w:rPr>
         <w:t xml:space="preserve"> </w:t>
       </w:r>
@@ -1218,21 +2364,16 @@
         <w:rPr>
           <w:rFonts w:ascii="Arial" w:hAnsi="Arial" w:cs="Arial"/>
           <w:sz w:val="24"/>
-        </w:rPr>
-      </w:pPr>
-      <w:r>
-        <w:rPr>
-          <w:rFonts w:ascii="Arial" w:hAnsi="Arial" w:cs="Arial"/>
-          <w:sz w:val="24"/>
-        </w:rPr>
-        <w:t>3 d</w:t>
-      </w:r>
-      <w:r>
-        <w:rPr>
-          <w:rFonts w:ascii="Arial" w:hAnsi="Arial" w:cs="Arial"/>
-          <w:sz w:val="24"/>
-        </w:rPr>
-        <w:t>icas para adaptar os materiais:</w:t>
+          <w:szCs w:val="24"/>
+        </w:rPr>
+      </w:pPr>
+      <w:r>
+        <w:rPr>
+          <w:rFonts w:ascii="Arial" w:hAnsi="Arial" w:cs="Arial"/>
+          <w:sz w:val="24"/>
+          <w:szCs w:val="24"/>
+        </w:rPr>
+        <w:t>IA que reconhece arquivos:</w:t>
       </w:r>
     </w:p>
     <w:p>
@@ -1240,11 +2381,12 @@
         <w:pStyle w:val="PargrafodaLista"/>
         <w:numPr>
           <w:ilvl w:val="0"/>
-          <w:numId w:val="9"/>
+          <w:numId w:val="10"/>
         </w:numPr>
         <w:rPr>
           <w:rFonts w:ascii="Arial" w:hAnsi="Arial" w:cs="Arial"/>
           <w:sz w:val="24"/>
+          <w:szCs w:val="24"/>
         </w:rPr>
       </w:pPr>
       <w:hyperlink r:id="rId11" w:history="1">
@@ -1253,14 +2395,16 @@
             <w:rStyle w:val="Hyperlink"/>
             <w:rFonts w:ascii="Arial" w:hAnsi="Arial" w:cs="Arial"/>
             <w:sz w:val="24"/>
+            <w:szCs w:val="24"/>
           </w:rPr>
-          <w:t>https://www.youtube.com/watch?v=STwkzeHglbw</w:t>
+          <w:t>https://www.youtube.com/watch?v=RfNjmEUZyc0</w:t>
         </w:r>
       </w:hyperlink>
       <w:r>
         <w:rPr>
           <w:rFonts w:ascii="Arial" w:hAnsi="Arial" w:cs="Arial"/>
           <w:sz w:val="24"/>
+          <w:szCs w:val="24"/>
         </w:rPr>
         <w:t xml:space="preserve"> </w:t>
       </w:r>
@@ -1270,21 +2414,24 @@
         <w:rPr>
           <w:rFonts w:ascii="Arial" w:hAnsi="Arial" w:cs="Arial"/>
           <w:sz w:val="24"/>
-        </w:rPr>
-      </w:pPr>
-      <w:r>
-        <w:rPr>
-          <w:rFonts w:ascii="Arial" w:hAnsi="Arial" w:cs="Arial"/>
-          <w:sz w:val="24"/>
-        </w:rPr>
-        <w:t>TEACCH</w:t>
-      </w:r>
-      <w:r>
-        <w:rPr>
-          <w:rFonts w:ascii="Arial" w:hAnsi="Arial" w:cs="Arial"/>
-          <w:sz w:val="24"/>
-        </w:rPr>
-        <w:t>, o que é e como funciona:</w:t>
+          <w:szCs w:val="24"/>
+        </w:rPr>
+      </w:pPr>
+      <w:r>
+        <w:rPr>
+          <w:rFonts w:ascii="Arial" w:hAnsi="Arial" w:cs="Arial"/>
+          <w:sz w:val="24"/>
+          <w:szCs w:val="24"/>
+        </w:rPr>
+        <w:t>3 d</w:t>
+      </w:r>
+      <w:r>
+        <w:rPr>
+          <w:rFonts w:ascii="Arial" w:hAnsi="Arial" w:cs="Arial"/>
+          <w:sz w:val="24"/>
+          <w:szCs w:val="24"/>
+        </w:rPr>
+        <w:t>icas para adaptar os materiais:</w:t>
       </w:r>
     </w:p>
     <w:p>
@@ -1292,11 +2439,12 @@
         <w:pStyle w:val="PargrafodaLista"/>
         <w:numPr>
           <w:ilvl w:val="0"/>
-          <w:numId w:val="6"/>
+          <w:numId w:val="9"/>
         </w:numPr>
         <w:rPr>
           <w:rFonts w:ascii="Arial" w:hAnsi="Arial" w:cs="Arial"/>
           <w:sz w:val="24"/>
+          <w:szCs w:val="24"/>
         </w:rPr>
       </w:pPr>
       <w:hyperlink r:id="rId12" w:history="1">
@@ -1305,14 +2453,16 @@
             <w:rStyle w:val="Hyperlink"/>
             <w:rFonts w:ascii="Arial" w:hAnsi="Arial" w:cs="Arial"/>
             <w:sz w:val="24"/>
+            <w:szCs w:val="24"/>
           </w:rPr>
-          <w:t>https://neuroconecta.com.br/metodo-teacch-e-os-beneficios-para-os-autistas/</w:t>
+          <w:t>https://www.youtube.com/watch?v=STwkzeHglbw</w:t>
         </w:r>
       </w:hyperlink>
       <w:r>
         <w:rPr>
           <w:rFonts w:ascii="Arial" w:hAnsi="Arial" w:cs="Arial"/>
           <w:sz w:val="24"/>
+          <w:szCs w:val="24"/>
         </w:rPr>
         <w:t xml:space="preserve"> </w:t>
       </w:r>
@@ -1322,14 +2472,24 @@
         <w:rPr>
           <w:rFonts w:ascii="Arial" w:hAnsi="Arial" w:cs="Arial"/>
           <w:sz w:val="24"/>
-        </w:rPr>
-      </w:pPr>
-      <w:r>
-        <w:rPr>
-          <w:rFonts w:ascii="Arial" w:hAnsi="Arial" w:cs="Arial"/>
-          <w:sz w:val="24"/>
-        </w:rPr>
-        <w:t>O que é TEA e seus níveis:</w:t>
+          <w:szCs w:val="24"/>
+        </w:rPr>
+      </w:pPr>
+      <w:r>
+        <w:rPr>
+          <w:rFonts w:ascii="Arial" w:hAnsi="Arial" w:cs="Arial"/>
+          <w:sz w:val="24"/>
+          <w:szCs w:val="24"/>
+        </w:rPr>
+        <w:t>TEACCH</w:t>
+      </w:r>
+      <w:r>
+        <w:rPr>
+          <w:rFonts w:ascii="Arial" w:hAnsi="Arial" w:cs="Arial"/>
+          <w:sz w:val="24"/>
+          <w:szCs w:val="24"/>
+        </w:rPr>
+        <w:t>, o que é e como funciona:</w:t>
       </w:r>
     </w:p>
     <w:p>
@@ -1337,11 +2497,12 @@
         <w:pStyle w:val="PargrafodaLista"/>
         <w:numPr>
           <w:ilvl w:val="0"/>
-          <w:numId w:val="5"/>
+          <w:numId w:val="6"/>
         </w:numPr>
         <w:rPr>
           <w:rFonts w:ascii="Arial" w:hAnsi="Arial" w:cs="Arial"/>
           <w:sz w:val="24"/>
+          <w:szCs w:val="24"/>
         </w:rPr>
       </w:pPr>
       <w:hyperlink r:id="rId13" w:history="1">
@@ -1350,16 +2511,35 @@
             <w:rStyle w:val="Hyperlink"/>
             <w:rFonts w:ascii="Arial" w:hAnsi="Arial" w:cs="Arial"/>
             <w:sz w:val="24"/>
+            <w:szCs w:val="24"/>
           </w:rPr>
-          <w:t>https://altadiagnosticos.com.br/saude/espectro-autista/</w:t>
+          <w:t>https://neuroconecta.com.br/metodo-teacch-e-os-beneficios-para-os-autistas/</w:t>
         </w:r>
       </w:hyperlink>
       <w:r>
         <w:rPr>
           <w:rFonts w:ascii="Arial" w:hAnsi="Arial" w:cs="Arial"/>
           <w:sz w:val="24"/>
+          <w:szCs w:val="24"/>
         </w:rPr>
         <w:t xml:space="preserve"> </w:t>
+      </w:r>
+    </w:p>
+    <w:p>
+      <w:pPr>
+        <w:rPr>
+          <w:rFonts w:ascii="Arial" w:hAnsi="Arial" w:cs="Arial"/>
+          <w:sz w:val="24"/>
+          <w:szCs w:val="24"/>
+        </w:rPr>
+      </w:pPr>
+      <w:r>
+        <w:rPr>
+          <w:rFonts w:ascii="Arial" w:hAnsi="Arial" w:cs="Arial"/>
+          <w:sz w:val="24"/>
+          <w:szCs w:val="24"/>
+        </w:rPr>
+        <w:t>O que é TEA e seus níveis:</w:t>
       </w:r>
     </w:p>
     <w:p>
@@ -1372,6 +2552,7 @@
         <w:rPr>
           <w:rFonts w:ascii="Arial" w:hAnsi="Arial" w:cs="Arial"/>
           <w:sz w:val="24"/>
+          <w:szCs w:val="24"/>
         </w:rPr>
       </w:pPr>
       <w:hyperlink r:id="rId14" w:history="1">
@@ -1380,31 +2561,18 @@
             <w:rStyle w:val="Hyperlink"/>
             <w:rFonts w:ascii="Arial" w:hAnsi="Arial" w:cs="Arial"/>
             <w:sz w:val="24"/>
+            <w:szCs w:val="24"/>
           </w:rPr>
-          <w:t>https://observatoriodoautista.com.br/2023/04/28/niveis-do-autismo-entenda/</w:t>
+          <w:t>https://altadiagnosticos.com.br/saude/espectro-autista/</w:t>
         </w:r>
       </w:hyperlink>
       <w:r>
         <w:rPr>
           <w:rFonts w:ascii="Arial" w:hAnsi="Arial" w:cs="Arial"/>
           <w:sz w:val="24"/>
+          <w:szCs w:val="24"/>
         </w:rPr>
         <w:t xml:space="preserve"> </w:t>
-      </w:r>
-    </w:p>
-    <w:p>
-      <w:pPr>
-        <w:rPr>
-          <w:rFonts w:ascii="Arial" w:hAnsi="Arial" w:cs="Arial"/>
-          <w:sz w:val="24"/>
-        </w:rPr>
-      </w:pPr>
-      <w:r>
-        <w:rPr>
-          <w:rFonts w:ascii="Arial" w:hAnsi="Arial" w:cs="Arial"/>
-          <w:sz w:val="24"/>
-        </w:rPr>
-        <w:t>O que é ABA e como funciona:</w:t>
       </w:r>
     </w:p>
     <w:p>
@@ -1412,11 +2580,12 @@
         <w:pStyle w:val="PargrafodaLista"/>
         <w:numPr>
           <w:ilvl w:val="0"/>
-          <w:numId w:val="13"/>
+          <w:numId w:val="5"/>
         </w:numPr>
         <w:rPr>
           <w:rFonts w:ascii="Arial" w:hAnsi="Arial" w:cs="Arial"/>
           <w:sz w:val="24"/>
+          <w:szCs w:val="24"/>
         </w:rPr>
       </w:pPr>
       <w:hyperlink r:id="rId15" w:history="1">
@@ -1425,16 +2594,35 @@
             <w:rStyle w:val="Hyperlink"/>
             <w:rFonts w:ascii="Arial" w:hAnsi="Arial" w:cs="Arial"/>
             <w:sz w:val="24"/>
+            <w:szCs w:val="24"/>
           </w:rPr>
-          <w:t>https://institutopensi.org.br/terapia-aba-tratamento-autismo</w:t>
+          <w:t>https://observatoriodoautista.com.br/2023/04/28/niveis-do-autismo-entenda/</w:t>
         </w:r>
       </w:hyperlink>
       <w:r>
         <w:rPr>
           <w:rFonts w:ascii="Arial" w:hAnsi="Arial" w:cs="Arial"/>
           <w:sz w:val="24"/>
+          <w:szCs w:val="24"/>
         </w:rPr>
         <w:t xml:space="preserve"> </w:t>
+      </w:r>
+    </w:p>
+    <w:p>
+      <w:pPr>
+        <w:rPr>
+          <w:rFonts w:ascii="Arial" w:hAnsi="Arial" w:cs="Arial"/>
+          <w:sz w:val="24"/>
+          <w:szCs w:val="24"/>
+        </w:rPr>
+      </w:pPr>
+      <w:r>
+        <w:rPr>
+          <w:rFonts w:ascii="Arial" w:hAnsi="Arial" w:cs="Arial"/>
+          <w:sz w:val="24"/>
+          <w:szCs w:val="24"/>
+        </w:rPr>
+        <w:t>O que é ABA e como funciona:</w:t>
       </w:r>
     </w:p>
     <w:p>
@@ -1447,6 +2635,7 @@
         <w:rPr>
           <w:rFonts w:ascii="Arial" w:hAnsi="Arial" w:cs="Arial"/>
           <w:sz w:val="24"/>
+          <w:szCs w:val="24"/>
         </w:rPr>
       </w:pPr>
       <w:hyperlink r:id="rId16" w:history="1">
@@ -1455,31 +2644,18 @@
             <w:rStyle w:val="Hyperlink"/>
             <w:rFonts w:ascii="Arial" w:hAnsi="Arial" w:cs="Arial"/>
             <w:sz w:val="24"/>
+            <w:szCs w:val="24"/>
           </w:rPr>
-          <w:t>https://institutoneurosaber.com.br/artigos/o-que-e-aba-e-quais-sao-as-caracteristicas/</w:t>
+          <w:t>https://institutopensi.org.br/terapia-aba-tratamento-autismo</w:t>
         </w:r>
       </w:hyperlink>
       <w:r>
         <w:rPr>
           <w:rFonts w:ascii="Arial" w:hAnsi="Arial" w:cs="Arial"/>
           <w:sz w:val="24"/>
+          <w:szCs w:val="24"/>
         </w:rPr>
         <w:t xml:space="preserve"> </w:t>
-      </w:r>
-    </w:p>
-    <w:p>
-      <w:pPr>
-        <w:rPr>
-          <w:rFonts w:ascii="Arial" w:hAnsi="Arial" w:cs="Arial"/>
-          <w:sz w:val="24"/>
-        </w:rPr>
-      </w:pPr>
-      <w:r>
-        <w:rPr>
-          <w:rFonts w:ascii="Arial" w:hAnsi="Arial" w:cs="Arial"/>
-          <w:sz w:val="24"/>
-        </w:rPr>
-        <w:t>DI:</w:t>
       </w:r>
     </w:p>
     <w:p>
@@ -1487,11 +2663,12 @@
         <w:pStyle w:val="PargrafodaLista"/>
         <w:numPr>
           <w:ilvl w:val="0"/>
-          <w:numId w:val="14"/>
+          <w:numId w:val="13"/>
         </w:numPr>
         <w:rPr>
           <w:rFonts w:ascii="Arial" w:hAnsi="Arial" w:cs="Arial"/>
           <w:sz w:val="24"/>
+          <w:szCs w:val="24"/>
         </w:rPr>
       </w:pPr>
       <w:hyperlink r:id="rId17" w:history="1">
@@ -1500,6 +2677,58 @@
             <w:rStyle w:val="Hyperlink"/>
             <w:rFonts w:ascii="Arial" w:hAnsi="Arial" w:cs="Arial"/>
             <w:sz w:val="24"/>
+            <w:szCs w:val="24"/>
+          </w:rPr>
+          <w:t>https://institutoneurosaber.com.br/artigos/o-que-e-aba-e-quais-sao-as-caracteristicas/</w:t>
+        </w:r>
+      </w:hyperlink>
+      <w:r>
+        <w:rPr>
+          <w:rFonts w:ascii="Arial" w:hAnsi="Arial" w:cs="Arial"/>
+          <w:sz w:val="24"/>
+          <w:szCs w:val="24"/>
+        </w:rPr>
+        <w:t xml:space="preserve"> </w:t>
+      </w:r>
+    </w:p>
+    <w:p>
+      <w:pPr>
+        <w:rPr>
+          <w:rFonts w:ascii="Arial" w:hAnsi="Arial" w:cs="Arial"/>
+          <w:sz w:val="24"/>
+          <w:szCs w:val="24"/>
+        </w:rPr>
+      </w:pPr>
+      <w:r>
+        <w:rPr>
+          <w:rFonts w:ascii="Arial" w:hAnsi="Arial" w:cs="Arial"/>
+          <w:sz w:val="24"/>
+          <w:szCs w:val="24"/>
+        </w:rPr>
+        <w:lastRenderedPageBreak/>
+        <w:t>DI:</w:t>
+      </w:r>
+    </w:p>
+    <w:p>
+      <w:pPr>
+        <w:pStyle w:val="PargrafodaLista"/>
+        <w:numPr>
+          <w:ilvl w:val="0"/>
+          <w:numId w:val="14"/>
+        </w:numPr>
+        <w:rPr>
+          <w:rFonts w:ascii="Arial" w:hAnsi="Arial" w:cs="Arial"/>
+          <w:sz w:val="24"/>
+          <w:szCs w:val="24"/>
+        </w:rPr>
+      </w:pPr>
+      <w:hyperlink r:id="rId18" w:history="1">
+        <w:r>
+          <w:rPr>
+            <w:rStyle w:val="Hyperlink"/>
+            <w:rFonts w:ascii="Arial" w:hAnsi="Arial" w:cs="Arial"/>
+            <w:sz w:val="24"/>
+            <w:szCs w:val="24"/>
           </w:rPr>
           <w:t>https://institutoneurosaber.com.br/artigos/qual-a-diferenca-entre-autismo-e-deficiencia-intelectual/</w:t>
         </w:r>
@@ -1508,6 +2737,7 @@
         <w:rPr>
           <w:rFonts w:ascii="Arial" w:hAnsi="Arial" w:cs="Arial"/>
           <w:sz w:val="24"/>
+          <w:szCs w:val="24"/>
         </w:rPr>
         <w:t xml:space="preserve"> </w:t>
       </w:r>
@@ -1518,6 +2748,7 @@
         <w:rPr>
           <w:rFonts w:ascii="Arial" w:hAnsi="Arial" w:cs="Arial"/>
           <w:sz w:val="24"/>
+          <w:szCs w:val="24"/>
         </w:rPr>
       </w:pPr>
     </w:p>
@@ -1532,6 +2763,7 @@
           <w:rFonts w:ascii="Arial" w:hAnsi="Arial" w:cs="Arial"/>
           <w:b/>
           <w:sz w:val="24"/>
+          <w:szCs w:val="24"/>
         </w:rPr>
       </w:pPr>
       <w:r>
@@ -1539,6 +2771,7 @@
           <w:rFonts w:ascii="Arial" w:hAnsi="Arial" w:cs="Arial"/>
           <w:b/>
           <w:sz w:val="24"/>
+          <w:szCs w:val="24"/>
         </w:rPr>
         <w:t>Problema</w:t>
       </w:r>
@@ -1549,12 +2782,14 @@
         <w:rPr>
           <w:rFonts w:ascii="Arial" w:hAnsi="Arial" w:cs="Arial"/>
           <w:sz w:val="24"/>
-        </w:rPr>
-      </w:pPr>
-      <w:r>
-        <w:rPr>
-          <w:rFonts w:ascii="Arial" w:hAnsi="Arial" w:cs="Arial"/>
-          <w:sz w:val="24"/>
+          <w:szCs w:val="24"/>
+        </w:rPr>
+      </w:pPr>
+      <w:r>
+        <w:rPr>
+          <w:rFonts w:ascii="Arial" w:hAnsi="Arial" w:cs="Arial"/>
+          <w:sz w:val="24"/>
+          <w:szCs w:val="24"/>
         </w:rPr>
         <w:t xml:space="preserve">Com base em pesquisas realizadas com os professores da </w:t>
       </w:r>
@@ -1563,6 +2798,7 @@
         <w:rPr>
           <w:rFonts w:ascii="Arial" w:hAnsi="Arial" w:cs="Arial"/>
           <w:sz w:val="24"/>
+          <w:szCs w:val="24"/>
         </w:rPr>
         <w:t>Etec</w:t>
       </w:r>
@@ -1571,6 +2807,7 @@
         <w:rPr>
           <w:rFonts w:ascii="Arial" w:hAnsi="Arial" w:cs="Arial"/>
           <w:sz w:val="24"/>
+          <w:szCs w:val="24"/>
         </w:rPr>
         <w:t xml:space="preserve"> Professor Camargo Aranha (pegar cartas com os professores para comprovar), e com a Clínica </w:t>
       </w:r>
@@ -1579,6 +2816,7 @@
         <w:rPr>
           <w:rFonts w:ascii="Arial" w:hAnsi="Arial" w:cs="Arial"/>
           <w:sz w:val="24"/>
+          <w:szCs w:val="24"/>
         </w:rPr>
         <w:t>Movthera</w:t>
       </w:r>
@@ -1587,15 +2825,9 @@
         <w:rPr>
           <w:rFonts w:ascii="Arial" w:hAnsi="Arial" w:cs="Arial"/>
           <w:sz w:val="24"/>
-        </w:rPr>
-        <w:t>, e</w:t>
-      </w:r>
-      <w:r>
-        <w:rPr>
-          <w:rFonts w:ascii="Arial" w:hAnsi="Arial" w:cs="Arial"/>
-          <w:sz w:val="24"/>
-        </w:rPr>
-        <w:t>mbora a educação busque ser cada vez mais inclusiva, muitos estudantes com TEA nível 1 enfrentam dificuldades ao utilizar materiais didáticos tradicionais.</w:t>
+          <w:szCs w:val="24"/>
+        </w:rPr>
+        <w:t>, embora a educação busque ser cada vez mais inclusiva, muitos estudantes com TEA nível 1 enfrentam dificuldades ao utilizar materiais didáticos tradicionais.</w:t>
       </w:r>
     </w:p>
     <w:p>
@@ -1604,12 +2836,14 @@
         <w:rPr>
           <w:rFonts w:ascii="Arial" w:hAnsi="Arial" w:cs="Arial"/>
           <w:sz w:val="24"/>
-        </w:rPr>
-      </w:pPr>
-      <w:r>
-        <w:rPr>
-          <w:rFonts w:ascii="Arial" w:hAnsi="Arial" w:cs="Arial"/>
-          <w:sz w:val="24"/>
+          <w:szCs w:val="24"/>
+        </w:rPr>
+      </w:pPr>
+      <w:r>
+        <w:rPr>
+          <w:rFonts w:ascii="Arial" w:hAnsi="Arial" w:cs="Arial"/>
+          <w:sz w:val="24"/>
+          <w:szCs w:val="24"/>
         </w:rPr>
         <w:t>Entre os principais desafios estão:</w:t>
       </w:r>
@@ -1625,12 +2859,14 @@
         <w:rPr>
           <w:rFonts w:ascii="Arial" w:hAnsi="Arial" w:cs="Arial"/>
           <w:sz w:val="24"/>
-        </w:rPr>
-      </w:pPr>
-      <w:r>
-        <w:rPr>
-          <w:rFonts w:ascii="Arial" w:hAnsi="Arial" w:cs="Arial"/>
-          <w:sz w:val="24"/>
+          <w:szCs w:val="24"/>
+        </w:rPr>
+      </w:pPr>
+      <w:r>
+        <w:rPr>
+          <w:rFonts w:ascii="Arial" w:hAnsi="Arial" w:cs="Arial"/>
+          <w:sz w:val="24"/>
+          <w:szCs w:val="24"/>
         </w:rPr>
         <w:t>textos longos e complexos</w:t>
       </w:r>
@@ -1646,12 +2882,14 @@
         <w:rPr>
           <w:rFonts w:ascii="Arial" w:hAnsi="Arial" w:cs="Arial"/>
           <w:sz w:val="24"/>
-        </w:rPr>
-      </w:pPr>
-      <w:r>
-        <w:rPr>
-          <w:rFonts w:ascii="Arial" w:hAnsi="Arial" w:cs="Arial"/>
-          <w:sz w:val="24"/>
+          <w:szCs w:val="24"/>
+        </w:rPr>
+      </w:pPr>
+      <w:r>
+        <w:rPr>
+          <w:rFonts w:ascii="Arial" w:hAnsi="Arial" w:cs="Arial"/>
+          <w:sz w:val="24"/>
+          <w:szCs w:val="24"/>
         </w:rPr>
         <w:t>linguagem abstrata ou metafórica</w:t>
       </w:r>
@@ -1667,12 +2905,14 @@
         <w:rPr>
           <w:rFonts w:ascii="Arial" w:hAnsi="Arial" w:cs="Arial"/>
           <w:sz w:val="24"/>
-        </w:rPr>
-      </w:pPr>
-      <w:r>
-        <w:rPr>
-          <w:rFonts w:ascii="Arial" w:hAnsi="Arial" w:cs="Arial"/>
-          <w:sz w:val="24"/>
+          <w:szCs w:val="24"/>
+        </w:rPr>
+      </w:pPr>
+      <w:r>
+        <w:rPr>
+          <w:rFonts w:ascii="Arial" w:hAnsi="Arial" w:cs="Arial"/>
+          <w:sz w:val="24"/>
+          <w:szCs w:val="24"/>
         </w:rPr>
         <w:t>excesso de informações em um único conteúdo</w:t>
       </w:r>
@@ -1688,12 +2928,14 @@
         <w:rPr>
           <w:rFonts w:ascii="Arial" w:hAnsi="Arial" w:cs="Arial"/>
           <w:sz w:val="24"/>
-        </w:rPr>
-      </w:pPr>
-      <w:r>
-        <w:rPr>
-          <w:rFonts w:ascii="Arial" w:hAnsi="Arial" w:cs="Arial"/>
-          <w:sz w:val="24"/>
+          <w:szCs w:val="24"/>
+        </w:rPr>
+      </w:pPr>
+      <w:r>
+        <w:rPr>
+          <w:rFonts w:ascii="Arial" w:hAnsi="Arial" w:cs="Arial"/>
+          <w:sz w:val="24"/>
+          <w:szCs w:val="24"/>
         </w:rPr>
         <w:t>baixa estruturação visual</w:t>
       </w:r>
@@ -1704,21 +2946,16 @@
         <w:rPr>
           <w:rFonts w:ascii="Arial" w:hAnsi="Arial" w:cs="Arial"/>
           <w:sz w:val="24"/>
-        </w:rPr>
-      </w:pPr>
-      <w:r>
-        <w:rPr>
-          <w:rFonts w:ascii="Arial" w:hAnsi="Arial" w:cs="Arial"/>
-          <w:sz w:val="24"/>
-        </w:rPr>
-        <w:t>Além disso, muitos professores relatam dificuldades para adaptar conteúdos porque</w:t>
-      </w:r>
-      <w:r>
-        <w:rPr>
-          <w:rFonts w:ascii="Arial" w:hAnsi="Arial" w:cs="Arial"/>
-          <w:sz w:val="24"/>
-        </w:rPr>
-        <w:t>:</w:t>
+          <w:szCs w:val="24"/>
+        </w:rPr>
+      </w:pPr>
+      <w:r>
+        <w:rPr>
+          <w:rFonts w:ascii="Arial" w:hAnsi="Arial" w:cs="Arial"/>
+          <w:sz w:val="24"/>
+          <w:szCs w:val="24"/>
+        </w:rPr>
+        <w:t>Além disso, muitos professores relatam dificuldades para adaptar conteúdos porque:</w:t>
       </w:r>
     </w:p>
     <w:p>
@@ -1732,12 +2969,14 @@
         <w:rPr>
           <w:rFonts w:ascii="Arial" w:hAnsi="Arial" w:cs="Arial"/>
           <w:sz w:val="24"/>
-        </w:rPr>
-      </w:pPr>
-      <w:r>
-        <w:rPr>
-          <w:rFonts w:ascii="Arial" w:hAnsi="Arial" w:cs="Arial"/>
-          <w:sz w:val="24"/>
+          <w:szCs w:val="24"/>
+        </w:rPr>
+      </w:pPr>
+      <w:r>
+        <w:rPr>
+          <w:rFonts w:ascii="Arial" w:hAnsi="Arial" w:cs="Arial"/>
+          <w:sz w:val="24"/>
+          <w:szCs w:val="24"/>
         </w:rPr>
         <w:t>não possuem formação específica em educação inclusiva</w:t>
       </w:r>
@@ -1753,12 +2992,14 @@
         <w:rPr>
           <w:rFonts w:ascii="Arial" w:hAnsi="Arial" w:cs="Arial"/>
           <w:sz w:val="24"/>
-        </w:rPr>
-      </w:pPr>
-      <w:r>
-        <w:rPr>
-          <w:rFonts w:ascii="Arial" w:hAnsi="Arial" w:cs="Arial"/>
-          <w:sz w:val="24"/>
+          <w:szCs w:val="24"/>
+        </w:rPr>
+      </w:pPr>
+      <w:r>
+        <w:rPr>
+          <w:rFonts w:ascii="Arial" w:hAnsi="Arial" w:cs="Arial"/>
+          <w:sz w:val="24"/>
+          <w:szCs w:val="24"/>
         </w:rPr>
         <w:t>não dispõem de tempo para adaptar materiais manualmente</w:t>
       </w:r>
@@ -1774,12 +3015,14 @@
         <w:rPr>
           <w:rFonts w:ascii="Arial" w:hAnsi="Arial" w:cs="Arial"/>
           <w:sz w:val="24"/>
-        </w:rPr>
-      </w:pPr>
-      <w:r>
-        <w:rPr>
-          <w:rFonts w:ascii="Arial" w:hAnsi="Arial" w:cs="Arial"/>
-          <w:sz w:val="24"/>
+          <w:szCs w:val="24"/>
+        </w:rPr>
+      </w:pPr>
+      <w:r>
+        <w:rPr>
+          <w:rFonts w:ascii="Arial" w:hAnsi="Arial" w:cs="Arial"/>
+          <w:sz w:val="24"/>
+          <w:szCs w:val="24"/>
         </w:rPr>
         <w:t>precisam preparar aulas para turmas numerosas</w:t>
       </w:r>
@@ -1790,12 +3033,14 @@
         <w:rPr>
           <w:rFonts w:ascii="Arial" w:hAnsi="Arial" w:cs="Arial"/>
           <w:sz w:val="24"/>
-        </w:rPr>
-      </w:pPr>
-      <w:r>
-        <w:rPr>
-          <w:rFonts w:ascii="Arial" w:hAnsi="Arial" w:cs="Arial"/>
-          <w:sz w:val="24"/>
+          <w:szCs w:val="24"/>
+        </w:rPr>
+      </w:pPr>
+      <w:r>
+        <w:rPr>
+          <w:rFonts w:ascii="Arial" w:hAnsi="Arial" w:cs="Arial"/>
+          <w:sz w:val="24"/>
+          <w:szCs w:val="24"/>
         </w:rPr>
         <w:t>Isso pode dificultar a compreensão do conteúdo e a participação desses alunos em sala de aula.</w:t>
       </w:r>
@@ -1805,6 +3050,7 @@
         <w:rPr>
           <w:rFonts w:ascii="Arial" w:hAnsi="Arial" w:cs="Arial"/>
           <w:sz w:val="24"/>
+          <w:szCs w:val="24"/>
         </w:rPr>
       </w:pPr>
     </w:p>
@@ -1819,6 +3065,7 @@
           <w:rFonts w:ascii="Arial" w:hAnsi="Arial" w:cs="Arial"/>
           <w:b/>
           <w:sz w:val="24"/>
+          <w:szCs w:val="24"/>
         </w:rPr>
       </w:pPr>
       <w:r>
@@ -1826,6 +3073,7 @@
           <w:rFonts w:ascii="Arial" w:hAnsi="Arial" w:cs="Arial"/>
           <w:b/>
           <w:sz w:val="24"/>
+          <w:szCs w:val="24"/>
         </w:rPr>
         <w:t>Solução</w:t>
       </w:r>
@@ -1836,44 +3084,16 @@
         <w:rPr>
           <w:rFonts w:ascii="Arial" w:hAnsi="Arial" w:cs="Arial"/>
           <w:sz w:val="24"/>
-        </w:rPr>
-      </w:pPr>
-      <w:r>
-        <w:rPr>
-          <w:rFonts w:ascii="Arial" w:hAnsi="Arial" w:cs="Arial"/>
-          <w:sz w:val="24"/>
-        </w:rPr>
-        <w:t xml:space="preserve">O </w:t>
-      </w:r>
-      <w:r>
-        <w:rPr>
-          <w:rFonts w:ascii="Arial" w:hAnsi="Arial" w:cs="Arial"/>
-          <w:sz w:val="24"/>
-        </w:rPr>
-        <w:t xml:space="preserve">TEA </w:t>
-      </w:r>
-      <w:proofErr w:type="spellStart"/>
-      <w:r>
-        <w:rPr>
-          <w:rFonts w:ascii="Arial" w:hAnsi="Arial" w:cs="Arial"/>
-          <w:sz w:val="24"/>
-        </w:rPr>
-        <w:t>Lean</w:t>
-      </w:r>
-      <w:proofErr w:type="spellEnd"/>
-      <w:r>
-        <w:rPr>
-          <w:rFonts w:ascii="Arial" w:hAnsi="Arial" w:cs="Arial"/>
-          <w:sz w:val="24"/>
-        </w:rPr>
-        <w:t xml:space="preserve"> </w:t>
-      </w:r>
-      <w:r>
-        <w:rPr>
-          <w:rFonts w:ascii="Arial" w:hAnsi="Arial" w:cs="Arial"/>
-          <w:sz w:val="24"/>
-        </w:rPr>
-        <w:t>automatiza a adaptação pedagógica utilizando Inteligência Artificial.</w:t>
+          <w:szCs w:val="24"/>
+        </w:rPr>
+      </w:pPr>
+      <w:r>
+        <w:rPr>
+          <w:rFonts w:ascii="Arial" w:hAnsi="Arial" w:cs="Arial"/>
+          <w:sz w:val="24"/>
+          <w:szCs w:val="24"/>
+        </w:rPr>
+        <w:t>O TEA Lean automatiza a adaptação pedagógica utilizando Inteligência Artificial.</w:t>
       </w:r>
     </w:p>
     <w:p>
@@ -1882,12 +3102,14 @@
         <w:rPr>
           <w:rFonts w:ascii="Arial" w:hAnsi="Arial" w:cs="Arial"/>
           <w:sz w:val="24"/>
-        </w:rPr>
-      </w:pPr>
-      <w:r>
-        <w:rPr>
-          <w:rFonts w:ascii="Arial" w:hAnsi="Arial" w:cs="Arial"/>
-          <w:sz w:val="24"/>
+          <w:szCs w:val="24"/>
+        </w:rPr>
+      </w:pPr>
+      <w:r>
+        <w:rPr>
+          <w:rFonts w:ascii="Arial" w:hAnsi="Arial" w:cs="Arial"/>
+          <w:sz w:val="24"/>
+          <w:szCs w:val="24"/>
         </w:rPr>
         <w:t>A plataforma transforma materiais didáticos comuns em versões mais acessíveis para estudantes com TEA.</w:t>
       </w:r>
@@ -1898,6 +3120,7 @@
         <w:rPr>
           <w:rFonts w:ascii="Arial" w:hAnsi="Arial" w:cs="Arial"/>
           <w:sz w:val="24"/>
+          <w:szCs w:val="24"/>
           <w:u w:val="single"/>
         </w:rPr>
       </w:pPr>
@@ -1905,6 +3128,7 @@
         <w:rPr>
           <w:rFonts w:ascii="Arial" w:hAnsi="Arial" w:cs="Arial"/>
           <w:sz w:val="24"/>
+          <w:szCs w:val="24"/>
         </w:rPr>
         <w:t>Nosso foco está em Língua Portuguesa, Literatura, História, Geografia, Sociologia e Filosofia</w:t>
       </w:r>
@@ -1920,7 +3144,7 @@
 </file>
 
 <file path=word/comments.xml><?xml version="1.0" encoding="utf-8"?>
-<w:comments xmlns:wpc="http://schemas.microsoft.com/office/word/2010/wordprocessingCanvas" xmlns:cx="http://schemas.microsoft.com/office/drawing/2014/chartex" xmlns:cx1="http://schemas.microsoft.com/office/drawing/2015/9/8/chartex" xmlns:cx2="http://schemas.microsoft.com/office/drawing/2015/10/21/chartex" xmlns:cx3="http://schemas.microsoft.com/office/drawing/2016/5/9/chartex" xmlns:cx4="http://schemas.microsoft.com/office/drawing/2016/5/10/chartex" xmlns:cx5="http://schemas.microsoft.com/office/drawing/2016/5/11/chartex" xmlns:cx6="http://schemas.microsoft.com/office/drawing/2016/5/12/chartex" xmlns:cx7="http://schemas.microsoft.com/office/drawing/2016/5/13/chartex" xmlns:cx8="http://schemas.microsoft.com/office/drawing/2016/5/14/chartex" xmlns:mc="http://schemas.openxmlformats.org/markup-compatibility/2006" xmlns:aink="http://schemas.microsoft.com/office/drawing/2016/ink" xmlns:am3d="http://schemas.microsoft.com/office/drawing/2017/model3d" xmlns:o="urn:schemas-microsoft-com:office:office" xmlns:r="http://schemas.openxmlformats.org/officeDocument/2006/relationships" xmlns:m="http://schemas.openxmlformats.org/officeDocument/2006/math" xmlns:v="urn:schemas-microsoft-com:vml" xmlns:wp14="http://schemas.microsoft.com/office/word/2010/wordprocessingDrawing" xmlns:wp="http://schemas.openxmlformats.org/drawingml/2006/wordprocessingDrawing" xmlns:w10="urn:schemas-microsoft-com:office:word" xmlns:w="http://schemas.openxmlformats.org/wordprocessingml/2006/main" xmlns:w14="http://schemas.microsoft.com/office/word/2010/wordml" xmlns:w15="http://schemas.microsoft.com/office/word/2012/wordml" xmlns:w16cid="http://schemas.microsoft.com/office/word/2016/wordml/cid" xmlns:w16se="http://schemas.microsoft.com/office/word/2015/wordml/symex" xmlns:wpg="http://schemas.microsoft.com/office/word/2010/wordprocessingGroup" xmlns:wpi="http://schemas.microsoft.com/office/word/2010/wordprocessingInk" xmlns:wne="http://schemas.microsoft.com/office/word/2006/wordml" xmlns:wps="http://schemas.microsoft.com/office/word/2010/wordprocessingShape" mc:Ignorable="w14 w15 w16se w16cid wp14">
+<w:comments xmlns:wpc="http://schemas.microsoft.com/office/word/2010/wordprocessingCanvas" xmlns:cx="http://schemas.microsoft.com/office/drawing/2014/chartex" xmlns:cx1="http://schemas.microsoft.com/office/drawing/2015/9/8/chartex" xmlns:cx2="http://schemas.microsoft.com/office/drawing/2015/10/21/chartex" xmlns:cx3="http://schemas.microsoft.com/office/drawing/2016/5/9/chartex" xmlns:cx4="http://schemas.microsoft.com/office/drawing/2016/5/10/chartex" xmlns:cx5="http://schemas.microsoft.com/office/drawing/2016/5/11/chartex" xmlns:cx6="http://schemas.microsoft.com/office/drawing/2016/5/12/chartex" xmlns:cx7="http://schemas.microsoft.com/office/drawing/2016/5/13/chartex" xmlns:cx8="http://schemas.microsoft.com/office/drawing/2016/5/14/chartex" xmlns:mc="http://schemas.openxmlformats.org/markup-compatibility/2006" xmlns:aink="http://schemas.microsoft.com/office/drawing/2016/ink" xmlns:am3d="http://schemas.microsoft.com/office/drawing/2017/model3d" xmlns:o="urn:schemas-microsoft-com:office:office" xmlns:oel="http://schemas.microsoft.com/office/2019/extlst" xmlns:r="http://schemas.openxmlformats.org/officeDocument/2006/relationships" xmlns:m="http://schemas.openxmlformats.org/officeDocument/2006/math" xmlns:v="urn:schemas-microsoft-com:vml" xmlns:wp14="http://schemas.microsoft.com/office/word/2010/wordprocessingDrawing" xmlns:wp="http://schemas.openxmlformats.org/drawingml/2006/wordprocessingDrawing" xmlns:w10="urn:schemas-microsoft-com:office:word" xmlns:w="http://schemas.openxmlformats.org/wordprocessingml/2006/main" xmlns:w14="http://schemas.microsoft.com/office/word/2010/wordml" xmlns:w15="http://schemas.microsoft.com/office/word/2012/wordml" xmlns:w16cex="http://schemas.microsoft.com/office/word/2018/wordml/cex" xmlns:w16cid="http://schemas.microsoft.com/office/word/2016/wordml/cid" xmlns:w16="http://schemas.microsoft.com/office/word/2018/wordml" xmlns:w16sdtdh="http://schemas.microsoft.com/office/word/2020/wordml/sdtdatahash" xmlns:w16se="http://schemas.microsoft.com/office/word/2015/wordml/symex" xmlns:wpg="http://schemas.microsoft.com/office/word/2010/wordprocessingGroup" xmlns:wpi="http://schemas.microsoft.com/office/word/2010/wordprocessingInk" xmlns:wne="http://schemas.microsoft.com/office/word/2006/wordml" xmlns:wps="http://schemas.microsoft.com/office/word/2010/wordprocessingShape" mc:Ignorable="w14 w15 w16se w16cid w16 w16cex w16sdtdh wp14">
   <w:comment w:id="0" w:author="CAMARGO" w:date="2026-05-07T09:03:00Z" w:initials="C">
     <w:p>
       <w:pPr>
@@ -1952,13 +3176,19 @@
 </file>
 
 <file path=word/commentsExtended.xml><?xml version="1.0" encoding="utf-8"?>
-<w15:commentsEx xmlns:wpc="http://schemas.microsoft.com/office/word/2010/wordprocessingCanvas" xmlns:cx="http://schemas.microsoft.com/office/drawing/2014/chartex" xmlns:cx1="http://schemas.microsoft.com/office/drawing/2015/9/8/chartex" xmlns:cx2="http://schemas.microsoft.com/office/drawing/2015/10/21/chartex" xmlns:cx3="http://schemas.microsoft.com/office/drawing/2016/5/9/chartex" xmlns:cx4="http://schemas.microsoft.com/office/drawing/2016/5/10/chartex" xmlns:cx5="http://schemas.microsoft.com/office/drawing/2016/5/11/chartex" xmlns:cx6="http://schemas.microsoft.com/office/drawing/2016/5/12/chartex" xmlns:cx7="http://schemas.microsoft.com/office/drawing/2016/5/13/chartex" xmlns:cx8="http://schemas.microsoft.com/office/drawing/2016/5/14/chartex" xmlns:mc="http://schemas.openxmlformats.org/markup-compatibility/2006" xmlns:aink="http://schemas.microsoft.com/office/drawing/2016/ink" xmlns:am3d="http://schemas.microsoft.com/office/drawing/2017/model3d" xmlns:o="urn:schemas-microsoft-com:office:office" xmlns:r="http://schemas.openxmlformats.org/officeDocument/2006/relationships" xmlns:m="http://schemas.openxmlformats.org/officeDocument/2006/math" xmlns:v="urn:schemas-microsoft-com:vml" xmlns:wp14="http://schemas.microsoft.com/office/word/2010/wordprocessingDrawing" xmlns:wp="http://schemas.openxmlformats.org/drawingml/2006/wordprocessingDrawing" xmlns:w10="urn:schemas-microsoft-com:office:word" xmlns:w="http://schemas.openxmlformats.org/wordprocessingml/2006/main" xmlns:w14="http://schemas.microsoft.com/office/word/2010/wordml" xmlns:w15="http://schemas.microsoft.com/office/word/2012/wordml" xmlns:w16cid="http://schemas.microsoft.com/office/word/2016/wordml/cid" xmlns:w16se="http://schemas.microsoft.com/office/word/2015/wordml/symex" xmlns:wpg="http://schemas.microsoft.com/office/word/2010/wordprocessingGroup" xmlns:wpi="http://schemas.microsoft.com/office/word/2010/wordprocessingInk" xmlns:wne="http://schemas.microsoft.com/office/word/2006/wordml" xmlns:wps="http://schemas.microsoft.com/office/word/2010/wordprocessingShape" mc:Ignorable="w14 w15 w16se w16cid wp14">
+<w15:commentsEx xmlns:wpc="http://schemas.microsoft.com/office/word/2010/wordprocessingCanvas" xmlns:cx="http://schemas.microsoft.com/office/drawing/2014/chartex" xmlns:cx1="http://schemas.microsoft.com/office/drawing/2015/9/8/chartex" xmlns:cx2="http://schemas.microsoft.com/office/drawing/2015/10/21/chartex" xmlns:cx3="http://schemas.microsoft.com/office/drawing/2016/5/9/chartex" xmlns:cx4="http://schemas.microsoft.com/office/drawing/2016/5/10/chartex" xmlns:cx5="http://schemas.microsoft.com/office/drawing/2016/5/11/chartex" xmlns:cx6="http://schemas.microsoft.com/office/drawing/2016/5/12/chartex" xmlns:cx7="http://schemas.microsoft.com/office/drawing/2016/5/13/chartex" xmlns:cx8="http://schemas.microsoft.com/office/drawing/2016/5/14/chartex" xmlns:mc="http://schemas.openxmlformats.org/markup-compatibility/2006" xmlns:aink="http://schemas.microsoft.com/office/drawing/2016/ink" xmlns:am3d="http://schemas.microsoft.com/office/drawing/2017/model3d" xmlns:o="urn:schemas-microsoft-com:office:office" xmlns:oel="http://schemas.microsoft.com/office/2019/extlst" xmlns:r="http://schemas.openxmlformats.org/officeDocument/2006/relationships" xmlns:m="http://schemas.openxmlformats.org/officeDocument/2006/math" xmlns:v="urn:schemas-microsoft-com:vml" xmlns:wp14="http://schemas.microsoft.com/office/word/2010/wordprocessingDrawing" xmlns:wp="http://schemas.openxmlformats.org/drawingml/2006/wordprocessingDrawing" xmlns:w10="urn:schemas-microsoft-com:office:word" xmlns:w="http://schemas.openxmlformats.org/wordprocessingml/2006/main" xmlns:w14="http://schemas.microsoft.com/office/word/2010/wordml" xmlns:w15="http://schemas.microsoft.com/office/word/2012/wordml" xmlns:w16cex="http://schemas.microsoft.com/office/word/2018/wordml/cex" xmlns:w16cid="http://schemas.microsoft.com/office/word/2016/wordml/cid" xmlns:w16="http://schemas.microsoft.com/office/word/2018/wordml" xmlns:w16sdtdh="http://schemas.microsoft.com/office/word/2020/wordml/sdtdatahash" xmlns:w16se="http://schemas.microsoft.com/office/word/2015/wordml/symex" xmlns:wpg="http://schemas.microsoft.com/office/word/2010/wordprocessingGroup" xmlns:wpi="http://schemas.microsoft.com/office/word/2010/wordprocessingInk" xmlns:wne="http://schemas.microsoft.com/office/word/2006/wordml" xmlns:wps="http://schemas.microsoft.com/office/word/2010/wordprocessingShape" mc:Ignorable="w14 w15 w16se w16cid w16 w16cex w16sdtdh wp14">
   <w15:commentEx w15:paraId="6A553135" w15:done="0"/>
 </w15:commentsEx>
 </file>
 
+<file path=word/commentsIds.xml><?xml version="1.0" encoding="utf-8"?>
+<w16cid:commentsIds xmlns:wpc="http://schemas.microsoft.com/office/word/2010/wordprocessingCanvas" xmlns:cx="http://schemas.microsoft.com/office/drawing/2014/chartex" xmlns:cx1="http://schemas.microsoft.com/office/drawing/2015/9/8/chartex" xmlns:cx2="http://schemas.microsoft.com/office/drawing/2015/10/21/chartex" xmlns:cx3="http://schemas.microsoft.com/office/drawing/2016/5/9/chartex" xmlns:cx4="http://schemas.microsoft.com/office/drawing/2016/5/10/chartex" xmlns:cx5="http://schemas.microsoft.com/office/drawing/2016/5/11/chartex" xmlns:cx6="http://schemas.microsoft.com/office/drawing/2016/5/12/chartex" xmlns:cx7="http://schemas.microsoft.com/office/drawing/2016/5/13/chartex" xmlns:cx8="http://schemas.microsoft.com/office/drawing/2016/5/14/chartex" xmlns:mc="http://schemas.openxmlformats.org/markup-compatibility/2006" xmlns:aink="http://schemas.microsoft.com/office/drawing/2016/ink" xmlns:am3d="http://schemas.microsoft.com/office/drawing/2017/model3d" xmlns:o="urn:schemas-microsoft-com:office:office" xmlns:oel="http://schemas.microsoft.com/office/2019/extlst" xmlns:r="http://schemas.openxmlformats.org/officeDocument/2006/relationships" xmlns:m="http://schemas.openxmlformats.org/officeDocument/2006/math" xmlns:v="urn:schemas-microsoft-com:vml" xmlns:wp14="http://schemas.microsoft.com/office/word/2010/wordprocessingDrawing" xmlns:wp="http://schemas.openxmlformats.org/drawingml/2006/wordprocessingDrawing" xmlns:w10="urn:schemas-microsoft-com:office:word" xmlns:w="http://schemas.openxmlformats.org/wordprocessingml/2006/main" xmlns:w14="http://schemas.microsoft.com/office/word/2010/wordml" xmlns:w15="http://schemas.microsoft.com/office/word/2012/wordml" xmlns:w16cex="http://schemas.microsoft.com/office/word/2018/wordml/cex" xmlns:w16cid="http://schemas.microsoft.com/office/word/2016/wordml/cid" xmlns:w16="http://schemas.microsoft.com/office/word/2018/wordml" xmlns:w16sdtdh="http://schemas.microsoft.com/office/word/2020/wordml/sdtdatahash" xmlns:w16se="http://schemas.microsoft.com/office/word/2015/wordml/symex" xmlns:wpg="http://schemas.microsoft.com/office/word/2010/wordprocessingGroup" xmlns:wpi="http://schemas.microsoft.com/office/word/2010/wordprocessingInk" xmlns:wne="http://schemas.microsoft.com/office/word/2006/wordml" xmlns:wps="http://schemas.microsoft.com/office/word/2010/wordprocessingShape" mc:Ignorable="w14 w15 w16se w16cid w16 w16cex w16sdtdh wp14">
+  <w16cid:commentId w16cid:paraId="6A553135" w16cid:durableId="76222916"/>
+</w16cid:commentsIds>
+</file>
+
 <file path=word/numbering.xml><?xml version="1.0" encoding="utf-8"?>
-<w:numbering xmlns:wpc="http://schemas.microsoft.com/office/word/2010/wordprocessingCanvas" xmlns:cx="http://schemas.microsoft.com/office/drawing/2014/chartex" xmlns:cx1="http://schemas.microsoft.com/office/drawing/2015/9/8/chartex" xmlns:cx2="http://schemas.microsoft.com/office/drawing/2015/10/21/chartex" xmlns:cx3="http://schemas.microsoft.com/office/drawing/2016/5/9/chartex" xmlns:cx4="http://schemas.microsoft.com/office/drawing/2016/5/10/chartex" xmlns:cx5="http://schemas.microsoft.com/office/drawing/2016/5/11/chartex" xmlns:cx6="http://schemas.microsoft.com/office/drawing/2016/5/12/chartex" xmlns:cx7="http://schemas.microsoft.com/office/drawing/2016/5/13/chartex" xmlns:cx8="http://schemas.microsoft.com/office/drawing/2016/5/14/chartex" xmlns:mc="http://schemas.openxmlformats.org/markup-compatibility/2006" xmlns:aink="http://schemas.microsoft.com/office/drawing/2016/ink" xmlns:am3d="http://schemas.microsoft.com/office/drawing/2017/model3d" xmlns:o="urn:schemas-microsoft-com:office:office" xmlns:r="http://schemas.openxmlformats.org/officeDocument/2006/relationships" xmlns:m="http://schemas.openxmlformats.org/officeDocument/2006/math" xmlns:v="urn:schemas-microsoft-com:vml" xmlns:wp14="http://schemas.microsoft.com/office/word/2010/wordprocessingDrawing" xmlns:wp="http://schemas.openxmlformats.org/drawingml/2006/wordprocessingDrawing" xmlns:w10="urn:schemas-microsoft-com:office:word" xmlns:w="http://schemas.openxmlformats.org/wordprocessingml/2006/main" xmlns:w14="http://schemas.microsoft.com/office/word/2010/wordml" xmlns:w15="http://schemas.microsoft.com/office/word/2012/wordml" xmlns:w16cid="http://schemas.microsoft.com/office/word/2016/wordml/cid" xmlns:w16se="http://schemas.microsoft.com/office/word/2015/wordml/symex" xmlns:wpg="http://schemas.microsoft.com/office/word/2010/wordprocessingGroup" xmlns:wpi="http://schemas.microsoft.com/office/word/2010/wordprocessingInk" xmlns:wne="http://schemas.microsoft.com/office/word/2006/wordml" xmlns:wps="http://schemas.microsoft.com/office/word/2010/wordprocessingShape" mc:Ignorable="w14 w15 w16se w16cid wp14">
+<w:numbering xmlns:wpc="http://schemas.microsoft.com/office/word/2010/wordprocessingCanvas" xmlns:cx="http://schemas.microsoft.com/office/drawing/2014/chartex" xmlns:cx1="http://schemas.microsoft.com/office/drawing/2015/9/8/chartex" xmlns:cx2="http://schemas.microsoft.com/office/drawing/2015/10/21/chartex" xmlns:cx3="http://schemas.microsoft.com/office/drawing/2016/5/9/chartex" xmlns:cx4="http://schemas.microsoft.com/office/drawing/2016/5/10/chartex" xmlns:cx5="http://schemas.microsoft.com/office/drawing/2016/5/11/chartex" xmlns:cx6="http://schemas.microsoft.com/office/drawing/2016/5/12/chartex" xmlns:cx7="http://schemas.microsoft.com/office/drawing/2016/5/13/chartex" xmlns:cx8="http://schemas.microsoft.com/office/drawing/2016/5/14/chartex" xmlns:mc="http://schemas.openxmlformats.org/markup-compatibility/2006" xmlns:aink="http://schemas.microsoft.com/office/drawing/2016/ink" xmlns:am3d="http://schemas.microsoft.com/office/drawing/2017/model3d" xmlns:o="urn:schemas-microsoft-com:office:office" xmlns:oel="http://schemas.microsoft.com/office/2019/extlst" xmlns:r="http://schemas.openxmlformats.org/officeDocument/2006/relationships" xmlns:m="http://schemas.openxmlformats.org/officeDocument/2006/math" xmlns:v="urn:schemas-microsoft-com:vml" xmlns:wp14="http://schemas.microsoft.com/office/word/2010/wordprocessingDrawing" xmlns:wp="http://schemas.openxmlformats.org/drawingml/2006/wordprocessingDrawing" xmlns:w10="urn:schemas-microsoft-com:office:word" xmlns:w="http://schemas.openxmlformats.org/wordprocessingml/2006/main" xmlns:w14="http://schemas.microsoft.com/office/word/2010/wordml" xmlns:w15="http://schemas.microsoft.com/office/word/2012/wordml" xmlns:w16cex="http://schemas.microsoft.com/office/word/2018/wordml/cex" xmlns:w16cid="http://schemas.microsoft.com/office/word/2016/wordml/cid" xmlns:w16="http://schemas.microsoft.com/office/word/2018/wordml" xmlns:w16sdtdh="http://schemas.microsoft.com/office/word/2020/wordml/sdtdatahash" xmlns:w16se="http://schemas.microsoft.com/office/word/2015/wordml/symex" xmlns:wpg="http://schemas.microsoft.com/office/word/2010/wordprocessingGroup" xmlns:wpi="http://schemas.microsoft.com/office/word/2010/wordprocessingInk" xmlns:wne="http://schemas.microsoft.com/office/word/2006/wordml" xmlns:wps="http://schemas.microsoft.com/office/word/2010/wordprocessingShape" mc:Ignorable="w14 w15 w16se w16cid w16 w16cex w16sdtdh wp14">
   <w:abstractNum w:abstractNumId="0" w15:restartNumberingAfterBreak="0">
     <w:nsid w:val="089D108D"/>
     <w:multiLevelType w:val="hybridMultilevel"/>
@@ -3514,53 +4744,53 @@
       </w:rPr>
     </w:lvl>
   </w:abstractNum>
-  <w:num w:numId="1">
+  <w:num w:numId="1" w16cid:durableId="1422294349">
     <w:abstractNumId w:val="0"/>
   </w:num>
-  <w:num w:numId="2">
+  <w:num w:numId="2" w16cid:durableId="1601374199">
     <w:abstractNumId w:val="2"/>
   </w:num>
-  <w:num w:numId="3">
+  <w:num w:numId="3" w16cid:durableId="873811162">
     <w:abstractNumId w:val="6"/>
   </w:num>
-  <w:num w:numId="4">
+  <w:num w:numId="4" w16cid:durableId="1330517786">
     <w:abstractNumId w:val="8"/>
   </w:num>
-  <w:num w:numId="5">
+  <w:num w:numId="5" w16cid:durableId="6294332">
     <w:abstractNumId w:val="1"/>
   </w:num>
-  <w:num w:numId="6">
+  <w:num w:numId="6" w16cid:durableId="1523935522">
     <w:abstractNumId w:val="9"/>
   </w:num>
-  <w:num w:numId="7">
+  <w:num w:numId="7" w16cid:durableId="1103260503">
     <w:abstractNumId w:val="7"/>
   </w:num>
-  <w:num w:numId="8">
+  <w:num w:numId="8" w16cid:durableId="585846649">
     <w:abstractNumId w:val="5"/>
   </w:num>
-  <w:num w:numId="9">
+  <w:num w:numId="9" w16cid:durableId="1947813629">
     <w:abstractNumId w:val="13"/>
   </w:num>
-  <w:num w:numId="10">
+  <w:num w:numId="10" w16cid:durableId="763771483">
     <w:abstractNumId w:val="12"/>
   </w:num>
-  <w:num w:numId="11">
+  <w:num w:numId="11" w16cid:durableId="1015812131">
     <w:abstractNumId w:val="10"/>
   </w:num>
-  <w:num w:numId="12">
+  <w:num w:numId="12" w16cid:durableId="550774202">
     <w:abstractNumId w:val="3"/>
   </w:num>
-  <w:num w:numId="13">
+  <w:num w:numId="13" w16cid:durableId="190463341">
     <w:abstractNumId w:val="4"/>
   </w:num>
-  <w:num w:numId="14">
+  <w:num w:numId="14" w16cid:durableId="708188689">
     <w:abstractNumId w:val="11"/>
   </w:num>
 </w:numbering>
 </file>
 
 <file path=word/people.xml><?xml version="1.0" encoding="utf-8"?>
-<w15:people xmlns:wpc="http://schemas.microsoft.com/office/word/2010/wordprocessingCanvas" xmlns:cx="http://schemas.microsoft.com/office/drawing/2014/chartex" xmlns:cx1="http://schemas.microsoft.com/office/drawing/2015/9/8/chartex" xmlns:cx2="http://schemas.microsoft.com/office/drawing/2015/10/21/chartex" xmlns:cx3="http://schemas.microsoft.com/office/drawing/2016/5/9/chartex" xmlns:cx4="http://schemas.microsoft.com/office/drawing/2016/5/10/chartex" xmlns:cx5="http://schemas.microsoft.com/office/drawing/2016/5/11/chartex" xmlns:cx6="http://schemas.microsoft.com/office/drawing/2016/5/12/chartex" xmlns:cx7="http://schemas.microsoft.com/office/drawing/2016/5/13/chartex" xmlns:cx8="http://schemas.microsoft.com/office/drawing/2016/5/14/chartex" xmlns:mc="http://schemas.openxmlformats.org/markup-compatibility/2006" xmlns:aink="http://schemas.microsoft.com/office/drawing/2016/ink" xmlns:am3d="http://schemas.microsoft.com/office/drawing/2017/model3d" xmlns:o="urn:schemas-microsoft-com:office:office" xmlns:r="http://schemas.openxmlformats.org/officeDocument/2006/relationships" xmlns:m="http://schemas.openxmlformats.org/officeDocument/2006/math" xmlns:v="urn:schemas-microsoft-com:vml" xmlns:wp14="http://schemas.microsoft.com/office/word/2010/wordprocessingDrawing" xmlns:wp="http://schemas.openxmlformats.org/drawingml/2006/wordprocessingDrawing" xmlns:w10="urn:schemas-microsoft-com:office:word" xmlns:w="http://schemas.openxmlformats.org/wordprocessingml/2006/main" xmlns:w14="http://schemas.microsoft.com/office/word/2010/wordml" xmlns:w15="http://schemas.microsoft.com/office/word/2012/wordml" xmlns:w16cid="http://schemas.microsoft.com/office/word/2016/wordml/cid" xmlns:w16se="http://schemas.microsoft.com/office/word/2015/wordml/symex" xmlns:wpg="http://schemas.microsoft.com/office/word/2010/wordprocessingGroup" xmlns:wpi="http://schemas.microsoft.com/office/word/2010/wordprocessingInk" xmlns:wne="http://schemas.microsoft.com/office/word/2006/wordml" xmlns:wps="http://schemas.microsoft.com/office/word/2010/wordprocessingShape" mc:Ignorable="w14 w15 w16se w16cid wp14">
+<w15:people xmlns:wpc="http://schemas.microsoft.com/office/word/2010/wordprocessingCanvas" xmlns:cx="http://schemas.microsoft.com/office/drawing/2014/chartex" xmlns:cx1="http://schemas.microsoft.com/office/drawing/2015/9/8/chartex" xmlns:cx2="http://schemas.microsoft.com/office/drawing/2015/10/21/chartex" xmlns:cx3="http://schemas.microsoft.com/office/drawing/2016/5/9/chartex" xmlns:cx4="http://schemas.microsoft.com/office/drawing/2016/5/10/chartex" xmlns:cx5="http://schemas.microsoft.com/office/drawing/2016/5/11/chartex" xmlns:cx6="http://schemas.microsoft.com/office/drawing/2016/5/12/chartex" xmlns:cx7="http://schemas.microsoft.com/office/drawing/2016/5/13/chartex" xmlns:cx8="http://schemas.microsoft.com/office/drawing/2016/5/14/chartex" xmlns:mc="http://schemas.openxmlformats.org/markup-compatibility/2006" xmlns:aink="http://schemas.microsoft.com/office/drawing/2016/ink" xmlns:am3d="http://schemas.microsoft.com/office/drawing/2017/model3d" xmlns:o="urn:schemas-microsoft-com:office:office" xmlns:oel="http://schemas.microsoft.com/office/2019/extlst" xmlns:r="http://schemas.openxmlformats.org/officeDocument/2006/relationships" xmlns:m="http://schemas.openxmlformats.org/officeDocument/2006/math" xmlns:v="urn:schemas-microsoft-com:vml" xmlns:wp14="http://schemas.microsoft.com/office/word/2010/wordprocessingDrawing" xmlns:wp="http://schemas.openxmlformats.org/drawingml/2006/wordprocessingDrawing" xmlns:w10="urn:schemas-microsoft-com:office:word" xmlns:w="http://schemas.openxmlformats.org/wordprocessingml/2006/main" xmlns:w14="http://schemas.microsoft.com/office/word/2010/wordml" xmlns:w15="http://schemas.microsoft.com/office/word/2012/wordml" xmlns:w16cex="http://schemas.microsoft.com/office/word/2018/wordml/cex" xmlns:w16cid="http://schemas.microsoft.com/office/word/2016/wordml/cid" xmlns:w16="http://schemas.microsoft.com/office/word/2018/wordml" xmlns:w16sdtdh="http://schemas.microsoft.com/office/word/2020/wordml/sdtdatahash" xmlns:w16se="http://schemas.microsoft.com/office/word/2015/wordml/symex" xmlns:wpg="http://schemas.microsoft.com/office/word/2010/wordprocessingGroup" xmlns:wpi="http://schemas.microsoft.com/office/word/2010/wordprocessingInk" xmlns:wne="http://schemas.microsoft.com/office/word/2006/wordml" xmlns:wps="http://schemas.microsoft.com/office/word/2010/wordprocessingShape" mc:Ignorable="w14 w15 w16se w16cid w16 w16cex w16sdtdh wp14">
   <w15:person w15:author="CAMARGO">
     <w15:presenceInfo w15:providerId="None" w15:userId="CAMARGO"/>
   </w15:person>
@@ -3568,7 +4798,7 @@
 </file>
 
 <file path=word/styles.xml><?xml version="1.0" encoding="utf-8"?>
-<w:styles xmlns:mc="http://schemas.openxmlformats.org/markup-compatibility/2006" xmlns:r="http://schemas.openxmlformats.org/officeDocument/2006/relationships" xmlns:w="http://schemas.openxmlformats.org/wordprocessingml/2006/main" xmlns:w14="http://schemas.microsoft.com/office/word/2010/wordml" xmlns:w15="http://schemas.microsoft.com/office/word/2012/wordml" xmlns:w16cid="http://schemas.microsoft.com/office/word/2016/wordml/cid" xmlns:w16se="http://schemas.microsoft.com/office/word/2015/wordml/symex" mc:Ignorable="w14 w15 w16se w16cid">
+<w:styles xmlns:mc="http://schemas.openxmlformats.org/markup-compatibility/2006" xmlns:r="http://schemas.openxmlformats.org/officeDocument/2006/relationships" xmlns:w="http://schemas.openxmlformats.org/wordprocessingml/2006/main" xmlns:w14="http://schemas.microsoft.com/office/word/2010/wordml" xmlns:w15="http://schemas.microsoft.com/office/word/2012/wordml" xmlns:w16cex="http://schemas.microsoft.com/office/word/2018/wordml/cex" xmlns:w16cid="http://schemas.microsoft.com/office/word/2016/wordml/cid" xmlns:w16="http://schemas.microsoft.com/office/word/2018/wordml" xmlns:w16sdtdh="http://schemas.microsoft.com/office/word/2020/wordml/sdtdatahash" xmlns:w16se="http://schemas.microsoft.com/office/word/2015/wordml/symex" mc:Ignorable="w14 w15 w16se w16cid w16 w16cex w16sdtdh">
   <w:docDefaults>
     <w:rPrDefault>
       <w:rPr>
@@ -3584,7 +4814,7 @@
       </w:pPr>
     </w:pPrDefault>
   </w:docDefaults>
-  <w:latentStyles w:defLockedState="0" w:defUIPriority="99" w:defSemiHidden="0" w:defUnhideWhenUsed="0" w:defQFormat="0" w:count="375">
+  <w:latentStyles w:defLockedState="0" w:defUIPriority="99" w:defSemiHidden="0" w:defUnhideWhenUsed="0" w:defQFormat="0" w:count="376">
     <w:lsdException w:name="Normal" w:uiPriority="0" w:qFormat="1"/>
     <w:lsdException w:name="heading 1" w:uiPriority="9" w:qFormat="1"/>
     <w:lsdException w:name="heading 2" w:semiHidden="1" w:uiPriority="9" w:unhideWhenUsed="1" w:qFormat="1"/>
@@ -3690,6 +4920,7 @@
     <w:lsdException w:name="HTML Sample" w:semiHidden="1" w:unhideWhenUsed="1"/>
     <w:lsdException w:name="HTML Typewriter" w:semiHidden="1" w:unhideWhenUsed="1"/>
     <w:lsdException w:name="HTML Variable" w:semiHidden="1" w:unhideWhenUsed="1"/>
+    <w:lsdException w:name="Normal Table" w:semiHidden="1" w:unhideWhenUsed="1"/>
     <w:lsdException w:name="annotation subject" w:semiHidden="1" w:unhideWhenUsed="1"/>
     <w:lsdException w:name="No List" w:semiHidden="1" w:unhideWhenUsed="1"/>
     <w:lsdException w:name="Outline List 1" w:semiHidden="1" w:unhideWhenUsed="1"/>
@@ -3733,8 +4964,10 @@
     <w:lsdException w:name="Table Elegant" w:semiHidden="1" w:unhideWhenUsed="1"/>
     <w:lsdException w:name="Table Professional" w:semiHidden="1" w:unhideWhenUsed="1"/>
     <w:lsdException w:name="Table Subtle 1" w:semiHidden="1" w:unhideWhenUsed="1"/>
+    <w:lsdException w:name="Table Subtle 2" w:semiHidden="1" w:unhideWhenUsed="1"/>
     <w:lsdException w:name="Table Web 1" w:semiHidden="1" w:unhideWhenUsed="1"/>
     <w:lsdException w:name="Table Web 2" w:semiHidden="1" w:unhideWhenUsed="1"/>
+    <w:lsdException w:name="Table Web 3" w:semiHidden="1" w:unhideWhenUsed="1"/>
     <w:lsdException w:name="Balloon Text" w:semiHidden="1" w:unhideWhenUsed="1"/>
     <w:lsdException w:name="Table Grid" w:uiPriority="39"/>
     <w:lsdException w:name="Table Theme" w:semiHidden="1" w:unhideWhenUsed="1"/>
@@ -3957,6 +5190,7 @@
     <w:lsdException w:name="Smart Hyperlink" w:semiHidden="1" w:unhideWhenUsed="1"/>
     <w:lsdException w:name="Hashtag" w:semiHidden="1" w:unhideWhenUsed="1"/>
     <w:lsdException w:name="Unresolved Mention" w:semiHidden="1" w:unhideWhenUsed="1"/>
+    <w:lsdException w:name="Smart Link" w:semiHidden="1" w:unhideWhenUsed="1"/>
   </w:latentStyles>
   <w:style w:type="paragraph" w:default="1" w:styleId="Normal">
     <w:name w:val="Normal"/>

</xml_diff>

<commit_message>
feat: adiciona mais informações na documentação
</commit_message>
<xml_diff>
--- a/Documentação.docx
+++ b/Documentação.docx
@@ -1,6 +1,6 @@
 
 <file path=word/document.xml><?xml version="1.0" encoding="utf-8"?>
-<w:document xmlns:wpc="http://schemas.microsoft.com/office/word/2010/wordprocessingCanvas" xmlns:cx="http://schemas.microsoft.com/office/drawing/2014/chartex" xmlns:cx1="http://schemas.microsoft.com/office/drawing/2015/9/8/chartex" xmlns:cx2="http://schemas.microsoft.com/office/drawing/2015/10/21/chartex" xmlns:cx3="http://schemas.microsoft.com/office/drawing/2016/5/9/chartex" xmlns:cx4="http://schemas.microsoft.com/office/drawing/2016/5/10/chartex" xmlns:cx5="http://schemas.microsoft.com/office/drawing/2016/5/11/chartex" xmlns:cx6="http://schemas.microsoft.com/office/drawing/2016/5/12/chartex" xmlns:cx7="http://schemas.microsoft.com/office/drawing/2016/5/13/chartex" xmlns:cx8="http://schemas.microsoft.com/office/drawing/2016/5/14/chartex" xmlns:mc="http://schemas.openxmlformats.org/markup-compatibility/2006" xmlns:aink="http://schemas.microsoft.com/office/drawing/2016/ink" xmlns:am3d="http://schemas.microsoft.com/office/drawing/2017/model3d" xmlns:o="urn:schemas-microsoft-com:office:office" xmlns:oel="http://schemas.microsoft.com/office/2019/extlst" xmlns:r="http://schemas.openxmlformats.org/officeDocument/2006/relationships" xmlns:m="http://schemas.openxmlformats.org/officeDocument/2006/math" xmlns:v="urn:schemas-microsoft-com:vml" xmlns:wp14="http://schemas.microsoft.com/office/word/2010/wordprocessingDrawing" xmlns:wp="http://schemas.openxmlformats.org/drawingml/2006/wordprocessingDrawing" xmlns:w10="urn:schemas-microsoft-com:office:word" xmlns:w="http://schemas.openxmlformats.org/wordprocessingml/2006/main" xmlns:w14="http://schemas.microsoft.com/office/word/2010/wordml" xmlns:w15="http://schemas.microsoft.com/office/word/2012/wordml" xmlns:w16cex="http://schemas.microsoft.com/office/word/2018/wordml/cex" xmlns:w16cid="http://schemas.microsoft.com/office/word/2016/wordml/cid" xmlns:w16="http://schemas.microsoft.com/office/word/2018/wordml" xmlns:w16sdtdh="http://schemas.microsoft.com/office/word/2020/wordml/sdtdatahash" xmlns:w16se="http://schemas.microsoft.com/office/word/2015/wordml/symex" xmlns:wpg="http://schemas.microsoft.com/office/word/2010/wordprocessingGroup" xmlns:wpi="http://schemas.microsoft.com/office/word/2010/wordprocessingInk" xmlns:wne="http://schemas.microsoft.com/office/word/2006/wordml" xmlns:wps="http://schemas.microsoft.com/office/word/2010/wordprocessingShape" mc:Ignorable="w14 w15 w16se w16cid w16 w16cex w16sdtdh wp14">
+<w:document xmlns:wpc="http://schemas.microsoft.com/office/word/2010/wordprocessingCanvas" xmlns:cx="http://schemas.microsoft.com/office/drawing/2014/chartex" xmlns:cx1="http://schemas.microsoft.com/office/drawing/2015/9/8/chartex" xmlns:cx2="http://schemas.microsoft.com/office/drawing/2015/10/21/chartex" xmlns:cx3="http://schemas.microsoft.com/office/drawing/2016/5/9/chartex" xmlns:cx4="http://schemas.microsoft.com/office/drawing/2016/5/10/chartex" xmlns:cx5="http://schemas.microsoft.com/office/drawing/2016/5/11/chartex" xmlns:cx6="http://schemas.microsoft.com/office/drawing/2016/5/12/chartex" xmlns:cx7="http://schemas.microsoft.com/office/drawing/2016/5/13/chartex" xmlns:cx8="http://schemas.microsoft.com/office/drawing/2016/5/14/chartex" xmlns:mc="http://schemas.openxmlformats.org/markup-compatibility/2006" xmlns:aink="http://schemas.microsoft.com/office/drawing/2016/ink" xmlns:am3d="http://schemas.microsoft.com/office/drawing/2017/model3d" xmlns:o="urn:schemas-microsoft-com:office:office" xmlns:r="http://schemas.openxmlformats.org/officeDocument/2006/relationships" xmlns:m="http://schemas.openxmlformats.org/officeDocument/2006/math" xmlns:v="urn:schemas-microsoft-com:vml" xmlns:wp14="http://schemas.microsoft.com/office/word/2010/wordprocessingDrawing" xmlns:wp="http://schemas.openxmlformats.org/drawingml/2006/wordprocessingDrawing" xmlns:w10="urn:schemas-microsoft-com:office:word" xmlns:w="http://schemas.openxmlformats.org/wordprocessingml/2006/main" xmlns:w14="http://schemas.microsoft.com/office/word/2010/wordml" xmlns:w15="http://schemas.microsoft.com/office/word/2012/wordml" xmlns:w16cid="http://schemas.microsoft.com/office/word/2016/wordml/cid" xmlns:w16se="http://schemas.microsoft.com/office/word/2015/wordml/symex" xmlns:wpg="http://schemas.microsoft.com/office/word/2010/wordprocessingGroup" xmlns:wpi="http://schemas.microsoft.com/office/word/2010/wordprocessingInk" xmlns:wne="http://schemas.microsoft.com/office/word/2006/wordml" xmlns:wps="http://schemas.microsoft.com/office/word/2010/wordprocessingShape" mc:Ignorable="w14 w15 w16se w16cid wp14">
   <w:body>
     <w:p>
       <w:pPr>
@@ -154,7 +154,27 @@
           <w:sz w:val="24"/>
           <w:szCs w:val="24"/>
         </w:rPr>
-        <w:t xml:space="preserve">Bryan Diego Vino </w:t>
+        <w:t xml:space="preserve">Bryan Diego </w:t>
+      </w:r>
+      <w:proofErr w:type="spellStart"/>
+      <w:r>
+        <w:rPr>
+          <w:rFonts w:ascii="Arial" w:hAnsi="Arial" w:cs="Arial"/>
+          <w:bCs/>
+          <w:sz w:val="24"/>
+          <w:szCs w:val="24"/>
+        </w:rPr>
+        <w:t>Vino</w:t>
+      </w:r>
+      <w:proofErr w:type="spellEnd"/>
+      <w:r>
+        <w:rPr>
+          <w:rFonts w:ascii="Arial" w:hAnsi="Arial" w:cs="Arial"/>
+          <w:bCs/>
+          <w:sz w:val="24"/>
+          <w:szCs w:val="24"/>
+        </w:rPr>
+        <w:t xml:space="preserve"> </w:t>
       </w:r>
       <w:proofErr w:type="spellStart"/>
       <w:r>
@@ -602,7 +622,27 @@
           <w:szCs w:val="24"/>
         </w:rPr>
         <w:lastRenderedPageBreak/>
-        <w:t xml:space="preserve">Bryan Diego Vino </w:t>
+        <w:t xml:space="preserve">Bryan Diego </w:t>
+      </w:r>
+      <w:proofErr w:type="spellStart"/>
+      <w:r>
+        <w:rPr>
+          <w:rFonts w:ascii="Arial" w:hAnsi="Arial" w:cs="Arial"/>
+          <w:bCs/>
+          <w:sz w:val="24"/>
+          <w:szCs w:val="24"/>
+        </w:rPr>
+        <w:t>Vino</w:t>
+      </w:r>
+      <w:proofErr w:type="spellEnd"/>
+      <w:r>
+        <w:rPr>
+          <w:rFonts w:ascii="Arial" w:hAnsi="Arial" w:cs="Arial"/>
+          <w:bCs/>
+          <w:sz w:val="24"/>
+          <w:szCs w:val="24"/>
+        </w:rPr>
+        <w:t xml:space="preserve"> </w:t>
       </w:r>
       <w:proofErr w:type="spellStart"/>
       <w:r>
@@ -1752,7 +1792,7 @@
           <w:sz w:val="24"/>
           <w:szCs w:val="24"/>
         </w:rPr>
-        <w:t xml:space="preserve">, felis ut </w:t>
+        <w:t xml:space="preserve">, </w:t>
       </w:r>
       <w:proofErr w:type="spellStart"/>
       <w:r>
@@ -1761,6 +1801,24 @@
           <w:sz w:val="24"/>
           <w:szCs w:val="24"/>
         </w:rPr>
+        <w:t>felis</w:t>
+      </w:r>
+      <w:proofErr w:type="spellEnd"/>
+      <w:r>
+        <w:rPr>
+          <w:rFonts w:ascii="Arial" w:hAnsi="Arial" w:cs="Arial"/>
+          <w:sz w:val="24"/>
+          <w:szCs w:val="24"/>
+        </w:rPr>
+        <w:t xml:space="preserve"> ut </w:t>
+      </w:r>
+      <w:proofErr w:type="spellStart"/>
+      <w:r>
+        <w:rPr>
+          <w:rFonts w:ascii="Arial" w:hAnsi="Arial" w:cs="Arial"/>
+          <w:sz w:val="24"/>
+          <w:szCs w:val="24"/>
+        </w:rPr>
         <w:t>adipiscing</w:t>
       </w:r>
       <w:proofErr w:type="spellEnd"/>
@@ -1783,338 +1841,293 @@
           <w:szCs w:val="24"/>
         </w:rPr>
       </w:pPr>
-    </w:p>
-    <w:p>
-      <w:pPr>
-        <w:spacing w:after="0" w:line="360" w:lineRule="auto"/>
-        <w:jc w:val="center"/>
-        <w:rPr>
-          <w:rFonts w:ascii="Arial" w:hAnsi="Arial" w:cs="Arial"/>
-          <w:sz w:val="24"/>
-          <w:szCs w:val="24"/>
-        </w:rPr>
-      </w:pPr>
-    </w:p>
-    <w:p>
-      <w:pPr>
-        <w:spacing w:after="0" w:line="360" w:lineRule="auto"/>
-        <w:jc w:val="center"/>
-        <w:rPr>
-          <w:rFonts w:ascii="Arial" w:hAnsi="Arial" w:cs="Arial"/>
-          <w:sz w:val="24"/>
-          <w:szCs w:val="24"/>
-        </w:rPr>
-      </w:pPr>
-    </w:p>
-    <w:p>
-      <w:pPr>
-        <w:spacing w:after="0" w:line="360" w:lineRule="auto"/>
-        <w:jc w:val="center"/>
-        <w:rPr>
-          <w:rFonts w:ascii="Arial" w:hAnsi="Arial" w:cs="Arial"/>
-          <w:sz w:val="24"/>
-          <w:szCs w:val="24"/>
-        </w:rPr>
-      </w:pPr>
-    </w:p>
-    <w:p>
-      <w:pPr>
-        <w:spacing w:after="0" w:line="360" w:lineRule="auto"/>
-        <w:jc w:val="center"/>
-        <w:rPr>
-          <w:rFonts w:ascii="Arial" w:hAnsi="Arial" w:cs="Arial"/>
-          <w:sz w:val="24"/>
-          <w:szCs w:val="24"/>
-        </w:rPr>
-      </w:pPr>
-    </w:p>
-    <w:p>
-      <w:pPr>
-        <w:spacing w:after="0" w:line="360" w:lineRule="auto"/>
-        <w:jc w:val="center"/>
-        <w:rPr>
-          <w:rFonts w:ascii="Arial" w:hAnsi="Arial" w:cs="Arial"/>
-          <w:sz w:val="24"/>
-          <w:szCs w:val="24"/>
-        </w:rPr>
-      </w:pPr>
-    </w:p>
-    <w:p>
-      <w:pPr>
-        <w:spacing w:after="0" w:line="360" w:lineRule="auto"/>
-        <w:jc w:val="center"/>
-        <w:rPr>
-          <w:rFonts w:ascii="Arial" w:hAnsi="Arial" w:cs="Arial"/>
-          <w:sz w:val="24"/>
-          <w:szCs w:val="24"/>
-        </w:rPr>
-      </w:pPr>
-    </w:p>
-    <w:p>
-      <w:pPr>
-        <w:spacing w:after="0" w:line="360" w:lineRule="auto"/>
-        <w:jc w:val="center"/>
-        <w:rPr>
-          <w:rFonts w:ascii="Arial" w:hAnsi="Arial" w:cs="Arial"/>
-          <w:sz w:val="24"/>
-          <w:szCs w:val="24"/>
-        </w:rPr>
-      </w:pPr>
-    </w:p>
-    <w:p>
-      <w:pPr>
-        <w:spacing w:after="0" w:line="360" w:lineRule="auto"/>
-        <w:jc w:val="center"/>
-        <w:rPr>
-          <w:rFonts w:ascii="Arial" w:hAnsi="Arial" w:cs="Arial"/>
-          <w:sz w:val="24"/>
-          <w:szCs w:val="24"/>
-        </w:rPr>
-      </w:pPr>
-    </w:p>
-    <w:p>
-      <w:pPr>
-        <w:spacing w:after="0" w:line="360" w:lineRule="auto"/>
-        <w:jc w:val="center"/>
-        <w:rPr>
-          <w:rFonts w:ascii="Arial" w:hAnsi="Arial" w:cs="Arial"/>
-          <w:sz w:val="24"/>
-          <w:szCs w:val="24"/>
-        </w:rPr>
-      </w:pPr>
-    </w:p>
-    <w:p>
-      <w:pPr>
-        <w:spacing w:after="0" w:line="360" w:lineRule="auto"/>
-        <w:jc w:val="center"/>
-        <w:rPr>
-          <w:rFonts w:ascii="Arial" w:hAnsi="Arial" w:cs="Arial"/>
-          <w:sz w:val="24"/>
-          <w:szCs w:val="24"/>
-        </w:rPr>
-      </w:pPr>
-    </w:p>
-    <w:p>
-      <w:pPr>
-        <w:spacing w:after="0" w:line="360" w:lineRule="auto"/>
-        <w:jc w:val="center"/>
-        <w:rPr>
-          <w:rFonts w:ascii="Arial" w:hAnsi="Arial" w:cs="Arial"/>
-          <w:sz w:val="24"/>
-          <w:szCs w:val="24"/>
-        </w:rPr>
-      </w:pPr>
-    </w:p>
-    <w:p>
-      <w:pPr>
-        <w:spacing w:after="0" w:line="360" w:lineRule="auto"/>
-        <w:jc w:val="center"/>
-        <w:rPr>
-          <w:rFonts w:ascii="Arial" w:hAnsi="Arial" w:cs="Arial"/>
-          <w:sz w:val="24"/>
-          <w:szCs w:val="24"/>
-        </w:rPr>
-      </w:pPr>
-    </w:p>
-    <w:p>
-      <w:pPr>
-        <w:spacing w:after="0" w:line="360" w:lineRule="auto"/>
-        <w:jc w:val="center"/>
-        <w:rPr>
-          <w:rFonts w:ascii="Arial" w:hAnsi="Arial" w:cs="Arial"/>
-          <w:sz w:val="24"/>
-          <w:szCs w:val="24"/>
-        </w:rPr>
-      </w:pPr>
-    </w:p>
-    <w:p>
-      <w:pPr>
-        <w:spacing w:after="0" w:line="360" w:lineRule="auto"/>
-        <w:jc w:val="center"/>
-        <w:rPr>
-          <w:rFonts w:ascii="Arial" w:hAnsi="Arial" w:cs="Arial"/>
-          <w:sz w:val="24"/>
-          <w:szCs w:val="24"/>
-        </w:rPr>
-      </w:pPr>
-    </w:p>
-    <w:p>
-      <w:pPr>
-        <w:spacing w:after="0" w:line="360" w:lineRule="auto"/>
-        <w:jc w:val="center"/>
-        <w:rPr>
-          <w:rFonts w:ascii="Arial" w:hAnsi="Arial" w:cs="Arial"/>
-          <w:sz w:val="24"/>
-          <w:szCs w:val="24"/>
-        </w:rPr>
-      </w:pPr>
-    </w:p>
-    <w:p>
-      <w:pPr>
-        <w:spacing w:after="0" w:line="360" w:lineRule="auto"/>
-        <w:jc w:val="center"/>
-        <w:rPr>
-          <w:rFonts w:ascii="Arial" w:hAnsi="Arial" w:cs="Arial"/>
-          <w:sz w:val="24"/>
-          <w:szCs w:val="24"/>
-        </w:rPr>
-      </w:pPr>
-    </w:p>
-    <w:p>
-      <w:pPr>
-        <w:spacing w:after="0" w:line="360" w:lineRule="auto"/>
-        <w:jc w:val="center"/>
-        <w:rPr>
-          <w:rFonts w:ascii="Arial" w:hAnsi="Arial" w:cs="Arial"/>
-          <w:sz w:val="24"/>
-          <w:szCs w:val="24"/>
-        </w:rPr>
-      </w:pPr>
-    </w:p>
-    <w:p>
-      <w:pPr>
-        <w:spacing w:after="0" w:line="360" w:lineRule="auto"/>
-        <w:jc w:val="center"/>
-        <w:rPr>
-          <w:rFonts w:ascii="Arial" w:hAnsi="Arial" w:cs="Arial"/>
-          <w:sz w:val="24"/>
-          <w:szCs w:val="24"/>
-        </w:rPr>
-      </w:pPr>
-    </w:p>
-    <w:p>
-      <w:pPr>
-        <w:spacing w:after="0" w:line="360" w:lineRule="auto"/>
-        <w:jc w:val="center"/>
-        <w:rPr>
-          <w:rFonts w:ascii="Arial" w:hAnsi="Arial" w:cs="Arial"/>
-          <w:sz w:val="24"/>
-          <w:szCs w:val="24"/>
-        </w:rPr>
-      </w:pPr>
-    </w:p>
-    <w:p>
-      <w:pPr>
-        <w:spacing w:after="0" w:line="360" w:lineRule="auto"/>
-        <w:jc w:val="center"/>
-        <w:rPr>
-          <w:rFonts w:ascii="Arial" w:hAnsi="Arial" w:cs="Arial"/>
-          <w:sz w:val="24"/>
-          <w:szCs w:val="24"/>
-        </w:rPr>
-      </w:pPr>
-    </w:p>
-    <w:p>
-      <w:pPr>
-        <w:spacing w:after="0" w:line="360" w:lineRule="auto"/>
-        <w:jc w:val="center"/>
-        <w:rPr>
-          <w:rFonts w:ascii="Arial" w:hAnsi="Arial" w:cs="Arial"/>
-          <w:sz w:val="24"/>
-          <w:szCs w:val="24"/>
-        </w:rPr>
-      </w:pPr>
-    </w:p>
-    <w:p>
-      <w:pPr>
-        <w:spacing w:after="0" w:line="360" w:lineRule="auto"/>
-        <w:jc w:val="center"/>
-        <w:rPr>
-          <w:rFonts w:ascii="Arial" w:hAnsi="Arial" w:cs="Arial"/>
-          <w:sz w:val="24"/>
-          <w:szCs w:val="24"/>
-        </w:rPr>
-      </w:pPr>
-    </w:p>
-    <w:p>
-      <w:pPr>
-        <w:spacing w:after="0" w:line="360" w:lineRule="auto"/>
-        <w:jc w:val="center"/>
-        <w:rPr>
-          <w:rFonts w:ascii="Arial" w:hAnsi="Arial" w:cs="Arial"/>
-          <w:sz w:val="24"/>
-          <w:szCs w:val="24"/>
-        </w:rPr>
-      </w:pPr>
-    </w:p>
-    <w:p>
-      <w:pPr>
-        <w:spacing w:after="0" w:line="360" w:lineRule="auto"/>
-        <w:jc w:val="center"/>
-        <w:rPr>
-          <w:rFonts w:ascii="Arial" w:hAnsi="Arial" w:cs="Arial"/>
-          <w:sz w:val="24"/>
-          <w:szCs w:val="24"/>
-        </w:rPr>
-      </w:pPr>
-    </w:p>
-    <w:p>
-      <w:pPr>
-        <w:spacing w:after="0" w:line="360" w:lineRule="auto"/>
-        <w:jc w:val="center"/>
-        <w:rPr>
-          <w:rFonts w:ascii="Arial" w:hAnsi="Arial" w:cs="Arial"/>
-          <w:sz w:val="24"/>
-          <w:szCs w:val="24"/>
-        </w:rPr>
-      </w:pPr>
-    </w:p>
-    <w:p>
-      <w:pPr>
-        <w:spacing w:after="0" w:line="360" w:lineRule="auto"/>
-        <w:jc w:val="center"/>
-        <w:rPr>
-          <w:rFonts w:ascii="Arial" w:hAnsi="Arial" w:cs="Arial"/>
-          <w:sz w:val="24"/>
-          <w:szCs w:val="24"/>
-        </w:rPr>
-      </w:pPr>
-    </w:p>
-    <w:p>
-      <w:pPr>
-        <w:spacing w:after="0" w:line="360" w:lineRule="auto"/>
-        <w:jc w:val="center"/>
-        <w:rPr>
-          <w:rFonts w:ascii="Arial" w:hAnsi="Arial" w:cs="Arial"/>
-          <w:sz w:val="24"/>
-          <w:szCs w:val="24"/>
-        </w:rPr>
-      </w:pPr>
-    </w:p>
-    <w:p>
-      <w:pPr>
-        <w:spacing w:after="0" w:line="360" w:lineRule="auto"/>
-        <w:jc w:val="center"/>
-        <w:rPr>
-          <w:rFonts w:ascii="Arial" w:hAnsi="Arial" w:cs="Arial"/>
-          <w:sz w:val="24"/>
-          <w:szCs w:val="24"/>
-        </w:rPr>
-      </w:pPr>
-    </w:p>
-    <w:p>
-      <w:pPr>
-        <w:spacing w:after="0" w:line="360" w:lineRule="auto"/>
-        <w:jc w:val="center"/>
-        <w:rPr>
-          <w:rFonts w:ascii="Arial" w:hAnsi="Arial" w:cs="Arial"/>
-          <w:sz w:val="24"/>
-          <w:szCs w:val="24"/>
-        </w:rPr>
-      </w:pPr>
-    </w:p>
-    <w:p>
-      <w:pPr>
-        <w:jc w:val="center"/>
-        <w:rPr>
-          <w:rFonts w:ascii="Arial" w:hAnsi="Arial" w:cs="Arial"/>
-          <w:sz w:val="24"/>
-          <w:szCs w:val="24"/>
-        </w:rPr>
-      </w:pPr>
-    </w:p>
-    <w:p>
-      <w:pPr>
+      <w:r>
+        <w:rPr>
+          <w:rFonts w:ascii="Arial" w:hAnsi="Arial" w:cs="Arial"/>
+          <w:sz w:val="24"/>
+          <w:szCs w:val="24"/>
+        </w:rPr>
+        <w:t>Palavra Chave 1; Palavra Chave 2; Palavra Chave 3;</w:t>
+      </w:r>
+    </w:p>
+    <w:p>
+      <w:pPr>
+        <w:spacing w:after="0" w:line="360" w:lineRule="auto"/>
+        <w:jc w:val="center"/>
+        <w:rPr>
+          <w:rFonts w:ascii="Arial" w:hAnsi="Arial" w:cs="Arial"/>
+          <w:sz w:val="24"/>
+          <w:szCs w:val="24"/>
+        </w:rPr>
+      </w:pPr>
+    </w:p>
+    <w:p>
+      <w:pPr>
+        <w:spacing w:after="0" w:line="360" w:lineRule="auto"/>
+        <w:jc w:val="center"/>
+        <w:rPr>
+          <w:rFonts w:ascii="Arial" w:hAnsi="Arial" w:cs="Arial"/>
+          <w:sz w:val="24"/>
+          <w:szCs w:val="24"/>
+        </w:rPr>
+      </w:pPr>
+    </w:p>
+    <w:p>
+      <w:pPr>
+        <w:spacing w:after="0" w:line="360" w:lineRule="auto"/>
+        <w:jc w:val="center"/>
+        <w:rPr>
+          <w:rFonts w:ascii="Arial" w:hAnsi="Arial" w:cs="Arial"/>
+          <w:sz w:val="24"/>
+          <w:szCs w:val="24"/>
+        </w:rPr>
+      </w:pPr>
+    </w:p>
+    <w:p>
+      <w:pPr>
+        <w:spacing w:after="0" w:line="360" w:lineRule="auto"/>
+        <w:jc w:val="center"/>
+        <w:rPr>
+          <w:rFonts w:ascii="Arial" w:hAnsi="Arial" w:cs="Arial"/>
+          <w:sz w:val="24"/>
+          <w:szCs w:val="24"/>
+        </w:rPr>
+      </w:pPr>
+    </w:p>
+    <w:p>
+      <w:pPr>
+        <w:spacing w:after="0" w:line="360" w:lineRule="auto"/>
+        <w:jc w:val="center"/>
+        <w:rPr>
+          <w:rFonts w:ascii="Arial" w:hAnsi="Arial" w:cs="Arial"/>
+          <w:sz w:val="24"/>
+          <w:szCs w:val="24"/>
+        </w:rPr>
+      </w:pPr>
+    </w:p>
+    <w:p>
+      <w:pPr>
+        <w:spacing w:after="0" w:line="360" w:lineRule="auto"/>
+        <w:jc w:val="center"/>
+        <w:rPr>
+          <w:rFonts w:ascii="Arial" w:hAnsi="Arial" w:cs="Arial"/>
+          <w:sz w:val="24"/>
+          <w:szCs w:val="24"/>
+        </w:rPr>
+      </w:pPr>
+    </w:p>
+    <w:p>
+      <w:pPr>
+        <w:spacing w:after="0" w:line="360" w:lineRule="auto"/>
+        <w:jc w:val="center"/>
+        <w:rPr>
+          <w:rFonts w:ascii="Arial" w:hAnsi="Arial" w:cs="Arial"/>
+          <w:sz w:val="24"/>
+          <w:szCs w:val="24"/>
+        </w:rPr>
+      </w:pPr>
+    </w:p>
+    <w:p>
+      <w:pPr>
+        <w:spacing w:after="0" w:line="360" w:lineRule="auto"/>
+        <w:jc w:val="center"/>
+        <w:rPr>
+          <w:rFonts w:ascii="Arial" w:hAnsi="Arial" w:cs="Arial"/>
+          <w:sz w:val="24"/>
+          <w:szCs w:val="24"/>
+        </w:rPr>
+      </w:pPr>
+    </w:p>
+    <w:p>
+      <w:pPr>
+        <w:spacing w:after="0" w:line="360" w:lineRule="auto"/>
+        <w:jc w:val="center"/>
+        <w:rPr>
+          <w:rFonts w:ascii="Arial" w:hAnsi="Arial" w:cs="Arial"/>
+          <w:sz w:val="24"/>
+          <w:szCs w:val="24"/>
+        </w:rPr>
+      </w:pPr>
+    </w:p>
+    <w:p>
+      <w:pPr>
+        <w:spacing w:after="0" w:line="360" w:lineRule="auto"/>
+        <w:jc w:val="center"/>
+        <w:rPr>
+          <w:rFonts w:ascii="Arial" w:hAnsi="Arial" w:cs="Arial"/>
+          <w:sz w:val="24"/>
+          <w:szCs w:val="24"/>
+        </w:rPr>
+      </w:pPr>
+    </w:p>
+    <w:p>
+      <w:pPr>
+        <w:spacing w:after="0" w:line="360" w:lineRule="auto"/>
+        <w:jc w:val="center"/>
+        <w:rPr>
+          <w:rFonts w:ascii="Arial" w:hAnsi="Arial" w:cs="Arial"/>
+          <w:sz w:val="24"/>
+          <w:szCs w:val="24"/>
+        </w:rPr>
+      </w:pPr>
+    </w:p>
+    <w:p>
+      <w:pPr>
+        <w:spacing w:after="0" w:line="360" w:lineRule="auto"/>
+        <w:jc w:val="center"/>
+        <w:rPr>
+          <w:rFonts w:ascii="Arial" w:hAnsi="Arial" w:cs="Arial"/>
+          <w:sz w:val="24"/>
+          <w:szCs w:val="24"/>
+        </w:rPr>
+      </w:pPr>
+    </w:p>
+    <w:p>
+      <w:pPr>
+        <w:spacing w:after="0" w:line="360" w:lineRule="auto"/>
+        <w:jc w:val="center"/>
+        <w:rPr>
+          <w:rFonts w:ascii="Arial" w:hAnsi="Arial" w:cs="Arial"/>
+          <w:sz w:val="24"/>
+          <w:szCs w:val="24"/>
+        </w:rPr>
+      </w:pPr>
+    </w:p>
+    <w:p>
+      <w:pPr>
+        <w:spacing w:after="0" w:line="360" w:lineRule="auto"/>
+        <w:jc w:val="center"/>
+        <w:rPr>
+          <w:rFonts w:ascii="Arial" w:hAnsi="Arial" w:cs="Arial"/>
+          <w:sz w:val="24"/>
+          <w:szCs w:val="24"/>
+        </w:rPr>
+      </w:pPr>
+    </w:p>
+    <w:p>
+      <w:pPr>
+        <w:spacing w:after="0" w:line="360" w:lineRule="auto"/>
+        <w:jc w:val="center"/>
+        <w:rPr>
+          <w:rFonts w:ascii="Arial" w:hAnsi="Arial" w:cs="Arial"/>
+          <w:sz w:val="24"/>
+          <w:szCs w:val="24"/>
+        </w:rPr>
+      </w:pPr>
+    </w:p>
+    <w:p>
+      <w:pPr>
+        <w:spacing w:after="0" w:line="360" w:lineRule="auto"/>
+        <w:jc w:val="center"/>
+        <w:rPr>
+          <w:rFonts w:ascii="Arial" w:hAnsi="Arial" w:cs="Arial"/>
+          <w:sz w:val="24"/>
+          <w:szCs w:val="24"/>
+        </w:rPr>
+      </w:pPr>
+    </w:p>
+    <w:p>
+      <w:pPr>
+        <w:spacing w:after="0" w:line="360" w:lineRule="auto"/>
+        <w:jc w:val="center"/>
+        <w:rPr>
+          <w:rFonts w:ascii="Arial" w:hAnsi="Arial" w:cs="Arial"/>
+          <w:sz w:val="24"/>
+          <w:szCs w:val="24"/>
+        </w:rPr>
+      </w:pPr>
+    </w:p>
+    <w:p>
+      <w:pPr>
+        <w:spacing w:after="0" w:line="360" w:lineRule="auto"/>
+        <w:jc w:val="center"/>
+        <w:rPr>
+          <w:rFonts w:ascii="Arial" w:hAnsi="Arial" w:cs="Arial"/>
+          <w:sz w:val="24"/>
+          <w:szCs w:val="24"/>
+        </w:rPr>
+      </w:pPr>
+    </w:p>
+    <w:p>
+      <w:pPr>
+        <w:spacing w:after="0" w:line="360" w:lineRule="auto"/>
+        <w:jc w:val="center"/>
+        <w:rPr>
+          <w:rFonts w:ascii="Arial" w:hAnsi="Arial" w:cs="Arial"/>
+          <w:sz w:val="24"/>
+          <w:szCs w:val="24"/>
+        </w:rPr>
+      </w:pPr>
+    </w:p>
+    <w:p>
+      <w:pPr>
+        <w:spacing w:after="0" w:line="360" w:lineRule="auto"/>
+        <w:jc w:val="center"/>
+        <w:rPr>
+          <w:rFonts w:ascii="Arial" w:hAnsi="Arial" w:cs="Arial"/>
+          <w:sz w:val="24"/>
+          <w:szCs w:val="24"/>
+        </w:rPr>
+      </w:pPr>
+    </w:p>
+    <w:p>
+      <w:pPr>
+        <w:spacing w:after="0" w:line="360" w:lineRule="auto"/>
+        <w:jc w:val="center"/>
+        <w:rPr>
+          <w:rFonts w:ascii="Arial" w:hAnsi="Arial" w:cs="Arial"/>
+          <w:sz w:val="24"/>
+          <w:szCs w:val="24"/>
+        </w:rPr>
+      </w:pPr>
+    </w:p>
+    <w:p>
+      <w:pPr>
+        <w:spacing w:after="0" w:line="360" w:lineRule="auto"/>
+        <w:jc w:val="center"/>
+        <w:rPr>
+          <w:rFonts w:ascii="Arial" w:hAnsi="Arial" w:cs="Arial"/>
+          <w:sz w:val="24"/>
+          <w:szCs w:val="24"/>
+        </w:rPr>
+      </w:pPr>
+    </w:p>
+    <w:p>
+      <w:pPr>
+        <w:spacing w:after="0" w:line="360" w:lineRule="auto"/>
+        <w:jc w:val="center"/>
+        <w:rPr>
+          <w:rFonts w:ascii="Arial" w:hAnsi="Arial" w:cs="Arial"/>
+          <w:sz w:val="24"/>
+          <w:szCs w:val="24"/>
+        </w:rPr>
+      </w:pPr>
+    </w:p>
+    <w:p>
+      <w:pPr>
+        <w:spacing w:after="0" w:line="360" w:lineRule="auto"/>
+        <w:jc w:val="center"/>
+        <w:rPr>
+          <w:rFonts w:ascii="Arial" w:hAnsi="Arial" w:cs="Arial"/>
+          <w:sz w:val="24"/>
+          <w:szCs w:val="24"/>
+        </w:rPr>
+      </w:pPr>
+    </w:p>
+    <w:p>
+      <w:pPr>
+        <w:spacing w:after="0" w:line="360" w:lineRule="auto"/>
+        <w:jc w:val="center"/>
+        <w:rPr>
+          <w:rFonts w:ascii="Arial" w:hAnsi="Arial" w:cs="Arial"/>
+          <w:sz w:val="24"/>
+          <w:szCs w:val="24"/>
+        </w:rPr>
+      </w:pPr>
+    </w:p>
+    <w:p>
+      <w:pPr>
+        <w:spacing w:after="0" w:line="360" w:lineRule="auto"/>
         <w:jc w:val="center"/>
         <w:rPr>
           <w:rFonts w:ascii="Arial" w:hAnsi="Arial" w:cs="Arial"/>
@@ -2130,6 +2143,7 @@
           <w:ilvl w:val="0"/>
           <w:numId w:val="1"/>
         </w:numPr>
+        <w:spacing w:after="0" w:line="360" w:lineRule="auto"/>
         <w:rPr>
           <w:rFonts w:ascii="Arial" w:hAnsi="Arial" w:cs="Arial"/>
           <w:b/>
@@ -2144,7 +2158,8 @@
           <w:sz w:val="24"/>
           <w:szCs w:val="24"/>
         </w:rPr>
-        <w:t>Objetivo</w:t>
+        <w:lastRenderedPageBreak/>
+        <w:t>Problema</w:t>
       </w:r>
     </w:p>
     <w:p>
@@ -2162,7 +2177,298 @@
           <w:sz w:val="24"/>
           <w:szCs w:val="24"/>
         </w:rPr>
-        <w:t>O objetivo do sistema é adaptar automaticamente conteúdos didáticos do ensino médio para estudantes com TEA nível 1, utilizando Inteligência Artificial, os princípios do Desenho Universal para Aprendizagem (DUA) e o modelo instrucional ADDIE.</w:t>
+        <w:t>Com base em pesquisas</w:t>
+      </w:r>
+      <w:r>
+        <w:rPr>
+          <w:rFonts w:ascii="Arial" w:hAnsi="Arial" w:cs="Arial"/>
+          <w:sz w:val="24"/>
+          <w:szCs w:val="24"/>
+        </w:rPr>
+        <w:t xml:space="preserve"> de campo</w:t>
+      </w:r>
+      <w:r>
+        <w:rPr>
+          <w:rFonts w:ascii="Arial" w:hAnsi="Arial" w:cs="Arial"/>
+          <w:sz w:val="24"/>
+          <w:szCs w:val="24"/>
+        </w:rPr>
+        <w:t xml:space="preserve"> realizadas com os professores da E</w:t>
+      </w:r>
+      <w:r>
+        <w:rPr>
+          <w:rFonts w:ascii="Arial" w:hAnsi="Arial" w:cs="Arial"/>
+          <w:sz w:val="24"/>
+          <w:szCs w:val="24"/>
+        </w:rPr>
+        <w:t>TEC</w:t>
+      </w:r>
+      <w:r>
+        <w:rPr>
+          <w:rFonts w:ascii="Arial" w:hAnsi="Arial" w:cs="Arial"/>
+          <w:sz w:val="24"/>
+          <w:szCs w:val="24"/>
+        </w:rPr>
+        <w:t xml:space="preserve"> Professor Camargo Aranha, e com a Clínica </w:t>
+      </w:r>
+      <w:proofErr w:type="spellStart"/>
+      <w:r>
+        <w:rPr>
+          <w:rFonts w:ascii="Arial" w:hAnsi="Arial" w:cs="Arial"/>
+          <w:sz w:val="24"/>
+          <w:szCs w:val="24"/>
+        </w:rPr>
+        <w:t>Movthera</w:t>
+      </w:r>
+      <w:proofErr w:type="spellEnd"/>
+      <w:r>
+        <w:rPr>
+          <w:rFonts w:ascii="Arial" w:hAnsi="Arial" w:cs="Arial"/>
+          <w:sz w:val="24"/>
+          <w:szCs w:val="24"/>
+        </w:rPr>
+        <w:t>, embora a educação busque ser cada vez mais inclusiva, muitos estudantes com TEA nível 1 enfrentam dificuldades ao utilizar materiais didáticos tradicionais</w:t>
+      </w:r>
+      <w:r>
+        <w:rPr>
+          <w:rFonts w:ascii="Arial" w:hAnsi="Arial" w:cs="Arial"/>
+          <w:sz w:val="24"/>
+          <w:szCs w:val="24"/>
+        </w:rPr>
+        <w:t xml:space="preserve">. E isso pode ser visto na própria ETEC, onde vagas foram disponibilizadas para esses </w:t>
+      </w:r>
+      <w:proofErr w:type="gramStart"/>
+      <w:r>
+        <w:rPr>
+          <w:rFonts w:ascii="Arial" w:hAnsi="Arial" w:cs="Arial"/>
+          <w:sz w:val="24"/>
+          <w:szCs w:val="24"/>
+        </w:rPr>
+        <w:t>alunos</w:t>
+      </w:r>
+      <w:proofErr w:type="gramEnd"/>
+      <w:r>
+        <w:rPr>
+          <w:rFonts w:ascii="Arial" w:hAnsi="Arial" w:cs="Arial"/>
+          <w:sz w:val="24"/>
+          <w:szCs w:val="24"/>
+        </w:rPr>
+        <w:t xml:space="preserve"> mas os professores não receberam nenhum tipo de treinamento.</w:t>
+      </w:r>
+    </w:p>
+    <w:p>
+      <w:pPr>
+        <w:jc w:val="both"/>
+        <w:rPr>
+          <w:rFonts w:ascii="Arial" w:hAnsi="Arial" w:cs="Arial"/>
+          <w:sz w:val="24"/>
+          <w:szCs w:val="24"/>
+        </w:rPr>
+      </w:pPr>
+      <w:r>
+        <w:rPr>
+          <w:rFonts w:ascii="Arial" w:hAnsi="Arial" w:cs="Arial"/>
+          <w:sz w:val="24"/>
+          <w:szCs w:val="24"/>
+        </w:rPr>
+        <w:t>Entre os principais desafios estão:</w:t>
+      </w:r>
+    </w:p>
+    <w:p>
+      <w:pPr>
+        <w:pStyle w:val="PargrafodaLista"/>
+        <w:numPr>
+          <w:ilvl w:val="0"/>
+          <w:numId w:val="4"/>
+        </w:numPr>
+        <w:jc w:val="both"/>
+        <w:rPr>
+          <w:rFonts w:ascii="Arial" w:hAnsi="Arial" w:cs="Arial"/>
+          <w:sz w:val="24"/>
+          <w:szCs w:val="24"/>
+        </w:rPr>
+      </w:pPr>
+      <w:r>
+        <w:rPr>
+          <w:rFonts w:ascii="Arial" w:hAnsi="Arial" w:cs="Arial"/>
+          <w:sz w:val="24"/>
+          <w:szCs w:val="24"/>
+        </w:rPr>
+        <w:t>textos longos e complexos</w:t>
+      </w:r>
+    </w:p>
+    <w:p>
+      <w:pPr>
+        <w:pStyle w:val="PargrafodaLista"/>
+        <w:numPr>
+          <w:ilvl w:val="0"/>
+          <w:numId w:val="4"/>
+        </w:numPr>
+        <w:jc w:val="both"/>
+        <w:rPr>
+          <w:rFonts w:ascii="Arial" w:hAnsi="Arial" w:cs="Arial"/>
+          <w:sz w:val="24"/>
+          <w:szCs w:val="24"/>
+        </w:rPr>
+      </w:pPr>
+      <w:r>
+        <w:rPr>
+          <w:rFonts w:ascii="Arial" w:hAnsi="Arial" w:cs="Arial"/>
+          <w:sz w:val="24"/>
+          <w:szCs w:val="24"/>
+        </w:rPr>
+        <w:t>linguagem abstrata ou metafórica</w:t>
+      </w:r>
+    </w:p>
+    <w:p>
+      <w:pPr>
+        <w:pStyle w:val="PargrafodaLista"/>
+        <w:numPr>
+          <w:ilvl w:val="0"/>
+          <w:numId w:val="4"/>
+        </w:numPr>
+        <w:jc w:val="both"/>
+        <w:rPr>
+          <w:rFonts w:ascii="Arial" w:hAnsi="Arial" w:cs="Arial"/>
+          <w:sz w:val="24"/>
+          <w:szCs w:val="24"/>
+        </w:rPr>
+      </w:pPr>
+      <w:r>
+        <w:rPr>
+          <w:rFonts w:ascii="Arial" w:hAnsi="Arial" w:cs="Arial"/>
+          <w:sz w:val="24"/>
+          <w:szCs w:val="24"/>
+        </w:rPr>
+        <w:t>excesso de informações em um único conteúdo</w:t>
+      </w:r>
+    </w:p>
+    <w:p>
+      <w:pPr>
+        <w:pStyle w:val="PargrafodaLista"/>
+        <w:numPr>
+          <w:ilvl w:val="0"/>
+          <w:numId w:val="4"/>
+        </w:numPr>
+        <w:jc w:val="both"/>
+        <w:rPr>
+          <w:rFonts w:ascii="Arial" w:hAnsi="Arial" w:cs="Arial"/>
+          <w:sz w:val="24"/>
+          <w:szCs w:val="24"/>
+        </w:rPr>
+      </w:pPr>
+      <w:r>
+        <w:rPr>
+          <w:rFonts w:ascii="Arial" w:hAnsi="Arial" w:cs="Arial"/>
+          <w:sz w:val="24"/>
+          <w:szCs w:val="24"/>
+        </w:rPr>
+        <w:t>baixa estruturação visual</w:t>
+      </w:r>
+    </w:p>
+    <w:p>
+      <w:pPr>
+        <w:jc w:val="both"/>
+        <w:rPr>
+          <w:rFonts w:ascii="Arial" w:hAnsi="Arial" w:cs="Arial"/>
+          <w:sz w:val="24"/>
+          <w:szCs w:val="24"/>
+        </w:rPr>
+      </w:pPr>
+      <w:r>
+        <w:rPr>
+          <w:rFonts w:ascii="Arial" w:hAnsi="Arial" w:cs="Arial"/>
+          <w:sz w:val="24"/>
+          <w:szCs w:val="24"/>
+        </w:rPr>
+        <w:t>Além disso, muitos professores relatam dificuldades para adaptar conteúdos porque:</w:t>
+      </w:r>
+    </w:p>
+    <w:p>
+      <w:pPr>
+        <w:pStyle w:val="PargrafodaLista"/>
+        <w:numPr>
+          <w:ilvl w:val="0"/>
+          <w:numId w:val="4"/>
+        </w:numPr>
+        <w:jc w:val="both"/>
+        <w:rPr>
+          <w:rFonts w:ascii="Arial" w:hAnsi="Arial" w:cs="Arial"/>
+          <w:sz w:val="24"/>
+          <w:szCs w:val="24"/>
+        </w:rPr>
+      </w:pPr>
+      <w:r>
+        <w:rPr>
+          <w:rFonts w:ascii="Arial" w:hAnsi="Arial" w:cs="Arial"/>
+          <w:sz w:val="24"/>
+          <w:szCs w:val="24"/>
+        </w:rPr>
+        <w:t>não possuem formação específica em educação inclusiva</w:t>
+      </w:r>
+    </w:p>
+    <w:p>
+      <w:pPr>
+        <w:pStyle w:val="PargrafodaLista"/>
+        <w:numPr>
+          <w:ilvl w:val="0"/>
+          <w:numId w:val="4"/>
+        </w:numPr>
+        <w:jc w:val="both"/>
+        <w:rPr>
+          <w:rFonts w:ascii="Arial" w:hAnsi="Arial" w:cs="Arial"/>
+          <w:sz w:val="24"/>
+          <w:szCs w:val="24"/>
+        </w:rPr>
+      </w:pPr>
+      <w:r>
+        <w:rPr>
+          <w:rFonts w:ascii="Arial" w:hAnsi="Arial" w:cs="Arial"/>
+          <w:sz w:val="24"/>
+          <w:szCs w:val="24"/>
+        </w:rPr>
+        <w:t>não dispõem de tempo para adaptar materiais manualmente</w:t>
+      </w:r>
+    </w:p>
+    <w:p>
+      <w:pPr>
+        <w:pStyle w:val="PargrafodaLista"/>
+        <w:numPr>
+          <w:ilvl w:val="0"/>
+          <w:numId w:val="4"/>
+        </w:numPr>
+        <w:jc w:val="both"/>
+        <w:rPr>
+          <w:rFonts w:ascii="Arial" w:hAnsi="Arial" w:cs="Arial"/>
+          <w:sz w:val="24"/>
+          <w:szCs w:val="24"/>
+        </w:rPr>
+      </w:pPr>
+      <w:r>
+        <w:rPr>
+          <w:rFonts w:ascii="Arial" w:hAnsi="Arial" w:cs="Arial"/>
+          <w:sz w:val="24"/>
+          <w:szCs w:val="24"/>
+        </w:rPr>
+        <w:t>precisam preparar aulas para turmas numerosas</w:t>
+      </w:r>
+    </w:p>
+    <w:p>
+      <w:pPr>
+        <w:jc w:val="both"/>
+        <w:rPr>
+          <w:rFonts w:ascii="Arial" w:hAnsi="Arial" w:cs="Arial"/>
+          <w:sz w:val="24"/>
+          <w:szCs w:val="24"/>
+        </w:rPr>
+      </w:pPr>
+      <w:r>
+        <w:rPr>
+          <w:rFonts w:ascii="Arial" w:hAnsi="Arial" w:cs="Arial"/>
+          <w:sz w:val="24"/>
+          <w:szCs w:val="24"/>
+        </w:rPr>
+        <w:t>Isso pode dificultar a compreensão do conteúdo e a participação desses alunos em sala de aula.</w:t>
       </w:r>
     </w:p>
     <w:p>
@@ -2195,11 +2501,12 @@
           <w:sz w:val="24"/>
           <w:szCs w:val="24"/>
         </w:rPr>
-        <w:t>Metodologia</w:t>
-      </w:r>
-    </w:p>
-    <w:p>
-      <w:pPr>
+        <w:t>Solução</w:t>
+      </w:r>
+    </w:p>
+    <w:p>
+      <w:pPr>
+        <w:ind w:firstLine="708"/>
         <w:jc w:val="both"/>
         <w:rPr>
           <w:rFonts w:ascii="Arial" w:hAnsi="Arial" w:cs="Arial"/>
@@ -2213,7 +2520,7 @@
           <w:sz w:val="24"/>
           <w:szCs w:val="24"/>
         </w:rPr>
-        <w:t xml:space="preserve">ADDIE, DUA, Pesquisas de Campo na Clínica </w:t>
+        <w:t xml:space="preserve">O TEA </w:t>
       </w:r>
       <w:proofErr w:type="spellStart"/>
       <w:r>
@@ -2222,7 +2529,7 @@
           <w:sz w:val="24"/>
           <w:szCs w:val="24"/>
         </w:rPr>
-        <w:t>Movthera</w:t>
+        <w:t>Lean</w:t>
       </w:r>
       <w:proofErr w:type="spellEnd"/>
       <w:r>
@@ -2231,11 +2538,47 @@
           <w:sz w:val="24"/>
           <w:szCs w:val="24"/>
         </w:rPr>
-        <w:t xml:space="preserve">, Pesquisas online (sites e artigos), Scrum </w:t>
-      </w:r>
-    </w:p>
-    <w:p>
-      <w:pPr>
+        <w:t xml:space="preserve"> tem como principal objetivo automatizar a adaptação de conteúdos utilizando Inteligência Artificial. A plataforma transforma materiais didáticos comuns em versões mais acessíveis para estudantes com TEA nível 1. Inicialmente, o nosso foco está em Língua Portuguesa, Literatura, História, Geografia, Sociologia e Filosofia</w:t>
+      </w:r>
+      <w:r>
+        <w:rPr>
+          <w:rFonts w:ascii="Arial" w:hAnsi="Arial" w:cs="Arial"/>
+          <w:sz w:val="24"/>
+          <w:szCs w:val="24"/>
+        </w:rPr>
+        <w:t>.</w:t>
+      </w:r>
+    </w:p>
+    <w:p>
+      <w:pPr>
+        <w:jc w:val="both"/>
+        <w:rPr>
+          <w:rFonts w:ascii="Arial" w:hAnsi="Arial" w:cs="Arial"/>
+          <w:sz w:val="24"/>
+          <w:szCs w:val="24"/>
+        </w:rPr>
+      </w:pPr>
+      <w:r>
+        <w:rPr>
+          <w:rFonts w:ascii="Arial" w:hAnsi="Arial" w:cs="Arial"/>
+          <w:sz w:val="24"/>
+          <w:szCs w:val="24"/>
+        </w:rPr>
+        <w:tab/>
+        <w:t xml:space="preserve">Nessa lógica, o objetivo do sistema </w:t>
+      </w:r>
+      <w:r>
+        <w:rPr>
+          <w:rFonts w:ascii="Arial" w:hAnsi="Arial" w:cs="Arial"/>
+          <w:sz w:val="24"/>
+          <w:szCs w:val="24"/>
+        </w:rPr>
+        <w:t>é adaptar automaticamente conteúdos didáticos do ensino médio para estudantes com TEA nível 1, utilizando Inteligência Artificial, os princípios do Desenho Universal para Aprendizagem (DUA) e o modelo instrucional ADDIE.</w:t>
+      </w:r>
+    </w:p>
+    <w:p>
+      <w:pPr>
+        <w:jc w:val="both"/>
         <w:rPr>
           <w:rFonts w:ascii="Arial" w:hAnsi="Arial" w:cs="Arial"/>
           <w:sz w:val="24"/>
@@ -2264,6 +2607,244 @@
           <w:sz w:val="24"/>
           <w:szCs w:val="24"/>
         </w:rPr>
+        <w:t>Metodologia</w:t>
+      </w:r>
+    </w:p>
+    <w:p>
+      <w:pPr>
+        <w:ind w:firstLine="708"/>
+        <w:jc w:val="both"/>
+        <w:rPr>
+          <w:rFonts w:ascii="Arial" w:hAnsi="Arial" w:cs="Arial"/>
+          <w:sz w:val="24"/>
+          <w:szCs w:val="24"/>
+        </w:rPr>
+      </w:pPr>
+      <w:r>
+        <w:rPr>
+          <w:rFonts w:ascii="Arial" w:hAnsi="Arial" w:cs="Arial"/>
+          <w:sz w:val="24"/>
+          <w:szCs w:val="24"/>
+        </w:rPr>
+        <w:t xml:space="preserve">Utilizamos as seguintes metodologias: </w:t>
+      </w:r>
+    </w:p>
+    <w:p>
+      <w:pPr>
+        <w:pStyle w:val="PargrafodaLista"/>
+        <w:numPr>
+          <w:ilvl w:val="0"/>
+          <w:numId w:val="16"/>
+        </w:numPr>
+        <w:jc w:val="both"/>
+        <w:rPr>
+          <w:rFonts w:ascii="Arial" w:hAnsi="Arial" w:cs="Arial"/>
+          <w:sz w:val="24"/>
+          <w:szCs w:val="24"/>
+        </w:rPr>
+      </w:pPr>
+      <w:r>
+        <w:rPr>
+          <w:rFonts w:ascii="Arial" w:hAnsi="Arial" w:cs="Arial"/>
+          <w:sz w:val="24"/>
+          <w:szCs w:val="24"/>
+        </w:rPr>
+        <w:t xml:space="preserve">Fluxo geral do sistema: </w:t>
+      </w:r>
+      <w:r>
+        <w:rPr>
+          <w:rFonts w:ascii="Arial" w:hAnsi="Arial" w:cs="Arial"/>
+          <w:b/>
+          <w:sz w:val="24"/>
+          <w:szCs w:val="24"/>
+        </w:rPr>
+        <w:t>ADDIE</w:t>
+      </w:r>
+      <w:r>
+        <w:rPr>
+          <w:rFonts w:ascii="Arial" w:hAnsi="Arial" w:cs="Arial"/>
+          <w:sz w:val="24"/>
+          <w:szCs w:val="24"/>
+        </w:rPr>
+        <w:t xml:space="preserve"> (Análise, Design, Desenvolvimento, Implementação e Avaliação)</w:t>
+      </w:r>
+    </w:p>
+    <w:p>
+      <w:pPr>
+        <w:pStyle w:val="PargrafodaLista"/>
+        <w:numPr>
+          <w:ilvl w:val="0"/>
+          <w:numId w:val="16"/>
+        </w:numPr>
+        <w:jc w:val="both"/>
+        <w:rPr>
+          <w:rFonts w:ascii="Arial" w:hAnsi="Arial" w:cs="Arial"/>
+          <w:sz w:val="24"/>
+          <w:szCs w:val="24"/>
+        </w:rPr>
+      </w:pPr>
+      <w:r>
+        <w:rPr>
+          <w:rFonts w:ascii="Arial" w:hAnsi="Arial" w:cs="Arial"/>
+          <w:sz w:val="24"/>
+          <w:szCs w:val="24"/>
+        </w:rPr>
+        <w:t xml:space="preserve">Regras pedagógicas a serem seguidas: </w:t>
+      </w:r>
+      <w:r>
+        <w:rPr>
+          <w:rFonts w:ascii="Arial" w:hAnsi="Arial" w:cs="Arial"/>
+          <w:b/>
+          <w:sz w:val="24"/>
+          <w:szCs w:val="24"/>
+        </w:rPr>
+        <w:t>DUA</w:t>
+      </w:r>
+      <w:r>
+        <w:rPr>
+          <w:rFonts w:ascii="Arial" w:hAnsi="Arial" w:cs="Arial"/>
+          <w:sz w:val="24"/>
+          <w:szCs w:val="24"/>
+        </w:rPr>
+        <w:t xml:space="preserve"> (Desenho Universal para Aprendizagem)</w:t>
+      </w:r>
+    </w:p>
+    <w:p>
+      <w:pPr>
+        <w:pStyle w:val="PargrafodaLista"/>
+        <w:numPr>
+          <w:ilvl w:val="0"/>
+          <w:numId w:val="16"/>
+        </w:numPr>
+        <w:jc w:val="both"/>
+        <w:rPr>
+          <w:rFonts w:ascii="Arial" w:hAnsi="Arial" w:cs="Arial"/>
+          <w:sz w:val="24"/>
+          <w:szCs w:val="24"/>
+        </w:rPr>
+      </w:pPr>
+      <w:r>
+        <w:rPr>
+          <w:rFonts w:ascii="Arial" w:hAnsi="Arial" w:cs="Arial"/>
+          <w:sz w:val="24"/>
+          <w:szCs w:val="24"/>
+        </w:rPr>
+        <w:t>Pesquisas de campo com uma clínica especializada em autismo (</w:t>
+      </w:r>
+      <w:proofErr w:type="spellStart"/>
+      <w:r>
+        <w:rPr>
+          <w:rFonts w:ascii="Arial" w:hAnsi="Arial" w:cs="Arial"/>
+          <w:sz w:val="24"/>
+          <w:szCs w:val="24"/>
+        </w:rPr>
+        <w:t>Movthera</w:t>
+      </w:r>
+      <w:proofErr w:type="spellEnd"/>
+      <w:r>
+        <w:rPr>
+          <w:rFonts w:ascii="Arial" w:hAnsi="Arial" w:cs="Arial"/>
+          <w:sz w:val="24"/>
+          <w:szCs w:val="24"/>
+        </w:rPr>
+        <w:t xml:space="preserve">: </w:t>
+      </w:r>
+      <w:hyperlink r:id="rId9" w:history="1">
+        <w:r>
+          <w:rPr>
+            <w:rStyle w:val="Hyperlink"/>
+            <w:rFonts w:ascii="Arial" w:hAnsi="Arial" w:cs="Arial"/>
+            <w:sz w:val="24"/>
+            <w:szCs w:val="24"/>
+          </w:rPr>
+          <w:t>https://www.movthera.com.br/terapias/</w:t>
+        </w:r>
+      </w:hyperlink>
+      <w:r>
+        <w:rPr>
+          <w:rFonts w:ascii="Arial" w:hAnsi="Arial" w:cs="Arial"/>
+          <w:sz w:val="24"/>
+          <w:szCs w:val="24"/>
+        </w:rPr>
+        <w:t>)</w:t>
+      </w:r>
+    </w:p>
+    <w:p>
+      <w:pPr>
+        <w:pStyle w:val="PargrafodaLista"/>
+        <w:numPr>
+          <w:ilvl w:val="0"/>
+          <w:numId w:val="16"/>
+        </w:numPr>
+        <w:jc w:val="both"/>
+        <w:rPr>
+          <w:rFonts w:ascii="Arial" w:hAnsi="Arial" w:cs="Arial"/>
+          <w:sz w:val="24"/>
+          <w:szCs w:val="24"/>
+        </w:rPr>
+      </w:pPr>
+      <w:r>
+        <w:rPr>
+          <w:rFonts w:ascii="Arial" w:hAnsi="Arial" w:cs="Arial"/>
+          <w:sz w:val="24"/>
+          <w:szCs w:val="24"/>
+        </w:rPr>
+        <w:t>Pesquisas online em sites e artigos</w:t>
+      </w:r>
+    </w:p>
+    <w:p>
+      <w:pPr>
+        <w:pStyle w:val="PargrafodaLista"/>
+        <w:numPr>
+          <w:ilvl w:val="0"/>
+          <w:numId w:val="16"/>
+        </w:numPr>
+        <w:jc w:val="both"/>
+        <w:rPr>
+          <w:rFonts w:ascii="Arial" w:hAnsi="Arial" w:cs="Arial"/>
+          <w:sz w:val="24"/>
+          <w:szCs w:val="24"/>
+        </w:rPr>
+      </w:pPr>
+      <w:r>
+        <w:rPr>
+          <w:rFonts w:ascii="Arial" w:hAnsi="Arial" w:cs="Arial"/>
+          <w:sz w:val="24"/>
+          <w:szCs w:val="24"/>
+        </w:rPr>
+        <w:t xml:space="preserve">Metodologia </w:t>
+      </w:r>
+      <w:r>
+        <w:rPr>
+          <w:rFonts w:ascii="Arial" w:hAnsi="Arial" w:cs="Arial"/>
+          <w:sz w:val="24"/>
+          <w:szCs w:val="24"/>
+        </w:rPr>
+        <w:t>ágil Scrum</w:t>
+      </w:r>
+    </w:p>
+    <w:p>
+      <w:pPr>
+        <w:pStyle w:val="PargrafodaLista"/>
+        <w:numPr>
+          <w:ilvl w:val="0"/>
+          <w:numId w:val="1"/>
+        </w:numPr>
+        <w:rPr>
+          <w:rFonts w:ascii="Arial" w:hAnsi="Arial" w:cs="Arial"/>
+          <w:b/>
+          <w:sz w:val="24"/>
+          <w:szCs w:val="24"/>
+        </w:rPr>
+      </w:pPr>
+      <w:r>
+        <w:rPr>
+          <w:rFonts w:ascii="Arial" w:hAnsi="Arial" w:cs="Arial"/>
+          <w:b/>
+          <w:sz w:val="24"/>
+          <w:szCs w:val="24"/>
+        </w:rPr>
+        <w:lastRenderedPageBreak/>
         <w:t>Pesquisas</w:t>
       </w:r>
     </w:p>
@@ -2297,7 +2878,7 @@
           <w:szCs w:val="24"/>
         </w:rPr>
       </w:pPr>
-      <w:hyperlink r:id="rId9" w:history="1">
+      <w:hyperlink r:id="rId10" w:history="1">
         <w:r>
           <w:rPr>
             <w:rStyle w:val="Hyperlink"/>
@@ -2339,7 +2920,7 @@
           <w:szCs w:val="24"/>
         </w:rPr>
       </w:pPr>
-      <w:hyperlink r:id="rId10" w:history="1">
+      <w:hyperlink r:id="rId11" w:history="1">
         <w:r>
           <w:rPr>
             <w:rStyle w:val="Hyperlink"/>
@@ -2389,7 +2970,7 @@
           <w:szCs w:val="24"/>
         </w:rPr>
       </w:pPr>
-      <w:hyperlink r:id="rId11" w:history="1">
+      <w:hyperlink r:id="rId12" w:history="1">
         <w:r>
           <w:rPr>
             <w:rStyle w:val="Hyperlink"/>
@@ -2447,7 +3028,7 @@
           <w:szCs w:val="24"/>
         </w:rPr>
       </w:pPr>
-      <w:hyperlink r:id="rId12" w:history="1">
+      <w:hyperlink r:id="rId13" w:history="1">
         <w:r>
           <w:rPr>
             <w:rStyle w:val="Hyperlink"/>
@@ -2505,7 +3086,7 @@
           <w:szCs w:val="24"/>
         </w:rPr>
       </w:pPr>
-      <w:hyperlink r:id="rId13" w:history="1">
+      <w:hyperlink r:id="rId14" w:history="1">
         <w:r>
           <w:rPr>
             <w:rStyle w:val="Hyperlink"/>
@@ -2539,7 +3120,17 @@
           <w:sz w:val="24"/>
           <w:szCs w:val="24"/>
         </w:rPr>
-        <w:t>O que é TEA e seus níveis:</w:t>
+        <w:t>O que é TEA e se</w:t>
+      </w:r>
+      <w:bookmarkStart w:id="1" w:name="_GoBack"/>
+      <w:bookmarkEnd w:id="1"/>
+      <w:r>
+        <w:rPr>
+          <w:rFonts w:ascii="Arial" w:hAnsi="Arial" w:cs="Arial"/>
+          <w:sz w:val="24"/>
+          <w:szCs w:val="24"/>
+        </w:rPr>
+        <w:t>us níveis:</w:t>
       </w:r>
     </w:p>
     <w:p>
@@ -2555,7 +3146,7 @@
           <w:szCs w:val="24"/>
         </w:rPr>
       </w:pPr>
-      <w:hyperlink r:id="rId14" w:history="1">
+      <w:hyperlink r:id="rId15" w:history="1">
         <w:r>
           <w:rPr>
             <w:rStyle w:val="Hyperlink"/>
@@ -2588,7 +3179,7 @@
           <w:szCs w:val="24"/>
         </w:rPr>
       </w:pPr>
-      <w:hyperlink r:id="rId15" w:history="1">
+      <w:hyperlink r:id="rId16" w:history="1">
         <w:r>
           <w:rPr>
             <w:rStyle w:val="Hyperlink"/>
@@ -2638,7 +3229,7 @@
           <w:szCs w:val="24"/>
         </w:rPr>
       </w:pPr>
-      <w:hyperlink r:id="rId16" w:history="1">
+      <w:hyperlink r:id="rId17" w:history="1">
         <w:r>
           <w:rPr>
             <w:rStyle w:val="Hyperlink"/>
@@ -2671,7 +3262,7 @@
           <w:szCs w:val="24"/>
         </w:rPr>
       </w:pPr>
-      <w:hyperlink r:id="rId17" w:history="1">
+      <w:hyperlink r:id="rId18" w:history="1">
         <w:r>
           <w:rPr>
             <w:rStyle w:val="Hyperlink"/>
@@ -2705,7 +3296,6 @@
           <w:sz w:val="24"/>
           <w:szCs w:val="24"/>
         </w:rPr>
-        <w:lastRenderedPageBreak/>
         <w:t>DI:</w:t>
       </w:r>
     </w:p>
@@ -2722,7 +3312,7 @@
           <w:szCs w:val="24"/>
         </w:rPr>
       </w:pPr>
-      <w:hyperlink r:id="rId18" w:history="1">
+      <w:hyperlink r:id="rId19" w:history="1">
         <w:r>
           <w:rPr>
             <w:rStyle w:val="Hyperlink"/>
@@ -2740,397 +3330,6 @@
           <w:szCs w:val="24"/>
         </w:rPr>
         <w:t xml:space="preserve"> </w:t>
-      </w:r>
-    </w:p>
-    <w:p>
-      <w:pPr>
-        <w:ind w:left="360"/>
-        <w:rPr>
-          <w:rFonts w:ascii="Arial" w:hAnsi="Arial" w:cs="Arial"/>
-          <w:sz w:val="24"/>
-          <w:szCs w:val="24"/>
-        </w:rPr>
-      </w:pPr>
-    </w:p>
-    <w:p>
-      <w:pPr>
-        <w:pStyle w:val="PargrafodaLista"/>
-        <w:numPr>
-          <w:ilvl w:val="0"/>
-          <w:numId w:val="1"/>
-        </w:numPr>
-        <w:rPr>
-          <w:rFonts w:ascii="Arial" w:hAnsi="Arial" w:cs="Arial"/>
-          <w:b/>
-          <w:sz w:val="24"/>
-          <w:szCs w:val="24"/>
-        </w:rPr>
-      </w:pPr>
-      <w:r>
-        <w:rPr>
-          <w:rFonts w:ascii="Arial" w:hAnsi="Arial" w:cs="Arial"/>
-          <w:b/>
-          <w:sz w:val="24"/>
-          <w:szCs w:val="24"/>
-        </w:rPr>
-        <w:t>Problema</w:t>
-      </w:r>
-    </w:p>
-    <w:p>
-      <w:pPr>
-        <w:jc w:val="both"/>
-        <w:rPr>
-          <w:rFonts w:ascii="Arial" w:hAnsi="Arial" w:cs="Arial"/>
-          <w:sz w:val="24"/>
-          <w:szCs w:val="24"/>
-        </w:rPr>
-      </w:pPr>
-      <w:r>
-        <w:rPr>
-          <w:rFonts w:ascii="Arial" w:hAnsi="Arial" w:cs="Arial"/>
-          <w:sz w:val="24"/>
-          <w:szCs w:val="24"/>
-        </w:rPr>
-        <w:t xml:space="preserve">Com base em pesquisas realizadas com os professores da </w:t>
-      </w:r>
-      <w:proofErr w:type="spellStart"/>
-      <w:r>
-        <w:rPr>
-          <w:rFonts w:ascii="Arial" w:hAnsi="Arial" w:cs="Arial"/>
-          <w:sz w:val="24"/>
-          <w:szCs w:val="24"/>
-        </w:rPr>
-        <w:t>Etec</w:t>
-      </w:r>
-      <w:proofErr w:type="spellEnd"/>
-      <w:r>
-        <w:rPr>
-          <w:rFonts w:ascii="Arial" w:hAnsi="Arial" w:cs="Arial"/>
-          <w:sz w:val="24"/>
-          <w:szCs w:val="24"/>
-        </w:rPr>
-        <w:t xml:space="preserve"> Professor Camargo Aranha (pegar cartas com os professores para comprovar), e com a Clínica </w:t>
-      </w:r>
-      <w:proofErr w:type="spellStart"/>
-      <w:r>
-        <w:rPr>
-          <w:rFonts w:ascii="Arial" w:hAnsi="Arial" w:cs="Arial"/>
-          <w:sz w:val="24"/>
-          <w:szCs w:val="24"/>
-        </w:rPr>
-        <w:t>Movthera</w:t>
-      </w:r>
-      <w:proofErr w:type="spellEnd"/>
-      <w:r>
-        <w:rPr>
-          <w:rFonts w:ascii="Arial" w:hAnsi="Arial" w:cs="Arial"/>
-          <w:sz w:val="24"/>
-          <w:szCs w:val="24"/>
-        </w:rPr>
-        <w:t>, embora a educação busque ser cada vez mais inclusiva, muitos estudantes com TEA nível 1 enfrentam dificuldades ao utilizar materiais didáticos tradicionais.</w:t>
-      </w:r>
-    </w:p>
-    <w:p>
-      <w:pPr>
-        <w:jc w:val="both"/>
-        <w:rPr>
-          <w:rFonts w:ascii="Arial" w:hAnsi="Arial" w:cs="Arial"/>
-          <w:sz w:val="24"/>
-          <w:szCs w:val="24"/>
-        </w:rPr>
-      </w:pPr>
-      <w:r>
-        <w:rPr>
-          <w:rFonts w:ascii="Arial" w:hAnsi="Arial" w:cs="Arial"/>
-          <w:sz w:val="24"/>
-          <w:szCs w:val="24"/>
-        </w:rPr>
-        <w:t>Entre os principais desafios estão:</w:t>
-      </w:r>
-    </w:p>
-    <w:p>
-      <w:pPr>
-        <w:pStyle w:val="PargrafodaLista"/>
-        <w:numPr>
-          <w:ilvl w:val="0"/>
-          <w:numId w:val="4"/>
-        </w:numPr>
-        <w:jc w:val="both"/>
-        <w:rPr>
-          <w:rFonts w:ascii="Arial" w:hAnsi="Arial" w:cs="Arial"/>
-          <w:sz w:val="24"/>
-          <w:szCs w:val="24"/>
-        </w:rPr>
-      </w:pPr>
-      <w:r>
-        <w:rPr>
-          <w:rFonts w:ascii="Arial" w:hAnsi="Arial" w:cs="Arial"/>
-          <w:sz w:val="24"/>
-          <w:szCs w:val="24"/>
-        </w:rPr>
-        <w:t>textos longos e complexos</w:t>
-      </w:r>
-    </w:p>
-    <w:p>
-      <w:pPr>
-        <w:pStyle w:val="PargrafodaLista"/>
-        <w:numPr>
-          <w:ilvl w:val="0"/>
-          <w:numId w:val="4"/>
-        </w:numPr>
-        <w:jc w:val="both"/>
-        <w:rPr>
-          <w:rFonts w:ascii="Arial" w:hAnsi="Arial" w:cs="Arial"/>
-          <w:sz w:val="24"/>
-          <w:szCs w:val="24"/>
-        </w:rPr>
-      </w:pPr>
-      <w:r>
-        <w:rPr>
-          <w:rFonts w:ascii="Arial" w:hAnsi="Arial" w:cs="Arial"/>
-          <w:sz w:val="24"/>
-          <w:szCs w:val="24"/>
-        </w:rPr>
-        <w:t>linguagem abstrata ou metafórica</w:t>
-      </w:r>
-    </w:p>
-    <w:p>
-      <w:pPr>
-        <w:pStyle w:val="PargrafodaLista"/>
-        <w:numPr>
-          <w:ilvl w:val="0"/>
-          <w:numId w:val="4"/>
-        </w:numPr>
-        <w:jc w:val="both"/>
-        <w:rPr>
-          <w:rFonts w:ascii="Arial" w:hAnsi="Arial" w:cs="Arial"/>
-          <w:sz w:val="24"/>
-          <w:szCs w:val="24"/>
-        </w:rPr>
-      </w:pPr>
-      <w:r>
-        <w:rPr>
-          <w:rFonts w:ascii="Arial" w:hAnsi="Arial" w:cs="Arial"/>
-          <w:sz w:val="24"/>
-          <w:szCs w:val="24"/>
-        </w:rPr>
-        <w:t>excesso de informações em um único conteúdo</w:t>
-      </w:r>
-    </w:p>
-    <w:p>
-      <w:pPr>
-        <w:pStyle w:val="PargrafodaLista"/>
-        <w:numPr>
-          <w:ilvl w:val="0"/>
-          <w:numId w:val="4"/>
-        </w:numPr>
-        <w:jc w:val="both"/>
-        <w:rPr>
-          <w:rFonts w:ascii="Arial" w:hAnsi="Arial" w:cs="Arial"/>
-          <w:sz w:val="24"/>
-          <w:szCs w:val="24"/>
-        </w:rPr>
-      </w:pPr>
-      <w:r>
-        <w:rPr>
-          <w:rFonts w:ascii="Arial" w:hAnsi="Arial" w:cs="Arial"/>
-          <w:sz w:val="24"/>
-          <w:szCs w:val="24"/>
-        </w:rPr>
-        <w:t>baixa estruturação visual</w:t>
-      </w:r>
-    </w:p>
-    <w:p>
-      <w:pPr>
-        <w:jc w:val="both"/>
-        <w:rPr>
-          <w:rFonts w:ascii="Arial" w:hAnsi="Arial" w:cs="Arial"/>
-          <w:sz w:val="24"/>
-          <w:szCs w:val="24"/>
-        </w:rPr>
-      </w:pPr>
-      <w:r>
-        <w:rPr>
-          <w:rFonts w:ascii="Arial" w:hAnsi="Arial" w:cs="Arial"/>
-          <w:sz w:val="24"/>
-          <w:szCs w:val="24"/>
-        </w:rPr>
-        <w:t>Além disso, muitos professores relatam dificuldades para adaptar conteúdos porque:</w:t>
-      </w:r>
-    </w:p>
-    <w:p>
-      <w:pPr>
-        <w:pStyle w:val="PargrafodaLista"/>
-        <w:numPr>
-          <w:ilvl w:val="0"/>
-          <w:numId w:val="4"/>
-        </w:numPr>
-        <w:jc w:val="both"/>
-        <w:rPr>
-          <w:rFonts w:ascii="Arial" w:hAnsi="Arial" w:cs="Arial"/>
-          <w:sz w:val="24"/>
-          <w:szCs w:val="24"/>
-        </w:rPr>
-      </w:pPr>
-      <w:r>
-        <w:rPr>
-          <w:rFonts w:ascii="Arial" w:hAnsi="Arial" w:cs="Arial"/>
-          <w:sz w:val="24"/>
-          <w:szCs w:val="24"/>
-        </w:rPr>
-        <w:t>não possuem formação específica em educação inclusiva</w:t>
-      </w:r>
-    </w:p>
-    <w:p>
-      <w:pPr>
-        <w:pStyle w:val="PargrafodaLista"/>
-        <w:numPr>
-          <w:ilvl w:val="0"/>
-          <w:numId w:val="4"/>
-        </w:numPr>
-        <w:jc w:val="both"/>
-        <w:rPr>
-          <w:rFonts w:ascii="Arial" w:hAnsi="Arial" w:cs="Arial"/>
-          <w:sz w:val="24"/>
-          <w:szCs w:val="24"/>
-        </w:rPr>
-      </w:pPr>
-      <w:r>
-        <w:rPr>
-          <w:rFonts w:ascii="Arial" w:hAnsi="Arial" w:cs="Arial"/>
-          <w:sz w:val="24"/>
-          <w:szCs w:val="24"/>
-        </w:rPr>
-        <w:t>não dispõem de tempo para adaptar materiais manualmente</w:t>
-      </w:r>
-    </w:p>
-    <w:p>
-      <w:pPr>
-        <w:pStyle w:val="PargrafodaLista"/>
-        <w:numPr>
-          <w:ilvl w:val="0"/>
-          <w:numId w:val="4"/>
-        </w:numPr>
-        <w:jc w:val="both"/>
-        <w:rPr>
-          <w:rFonts w:ascii="Arial" w:hAnsi="Arial" w:cs="Arial"/>
-          <w:sz w:val="24"/>
-          <w:szCs w:val="24"/>
-        </w:rPr>
-      </w:pPr>
-      <w:r>
-        <w:rPr>
-          <w:rFonts w:ascii="Arial" w:hAnsi="Arial" w:cs="Arial"/>
-          <w:sz w:val="24"/>
-          <w:szCs w:val="24"/>
-        </w:rPr>
-        <w:t>precisam preparar aulas para turmas numerosas</w:t>
-      </w:r>
-    </w:p>
-    <w:p>
-      <w:pPr>
-        <w:jc w:val="both"/>
-        <w:rPr>
-          <w:rFonts w:ascii="Arial" w:hAnsi="Arial" w:cs="Arial"/>
-          <w:sz w:val="24"/>
-          <w:szCs w:val="24"/>
-        </w:rPr>
-      </w:pPr>
-      <w:r>
-        <w:rPr>
-          <w:rFonts w:ascii="Arial" w:hAnsi="Arial" w:cs="Arial"/>
-          <w:sz w:val="24"/>
-          <w:szCs w:val="24"/>
-        </w:rPr>
-        <w:t>Isso pode dificultar a compreensão do conteúdo e a participação desses alunos em sala de aula.</w:t>
-      </w:r>
-    </w:p>
-    <w:p>
-      <w:pPr>
-        <w:rPr>
-          <w:rFonts w:ascii="Arial" w:hAnsi="Arial" w:cs="Arial"/>
-          <w:sz w:val="24"/>
-          <w:szCs w:val="24"/>
-        </w:rPr>
-      </w:pPr>
-    </w:p>
-    <w:p>
-      <w:pPr>
-        <w:pStyle w:val="PargrafodaLista"/>
-        <w:numPr>
-          <w:ilvl w:val="0"/>
-          <w:numId w:val="1"/>
-        </w:numPr>
-        <w:rPr>
-          <w:rFonts w:ascii="Arial" w:hAnsi="Arial" w:cs="Arial"/>
-          <w:b/>
-          <w:sz w:val="24"/>
-          <w:szCs w:val="24"/>
-        </w:rPr>
-      </w:pPr>
-      <w:r>
-        <w:rPr>
-          <w:rFonts w:ascii="Arial" w:hAnsi="Arial" w:cs="Arial"/>
-          <w:b/>
-          <w:sz w:val="24"/>
-          <w:szCs w:val="24"/>
-        </w:rPr>
-        <w:t>Solução</w:t>
-      </w:r>
-    </w:p>
-    <w:p>
-      <w:pPr>
-        <w:jc w:val="both"/>
-        <w:rPr>
-          <w:rFonts w:ascii="Arial" w:hAnsi="Arial" w:cs="Arial"/>
-          <w:sz w:val="24"/>
-          <w:szCs w:val="24"/>
-        </w:rPr>
-      </w:pPr>
-      <w:r>
-        <w:rPr>
-          <w:rFonts w:ascii="Arial" w:hAnsi="Arial" w:cs="Arial"/>
-          <w:sz w:val="24"/>
-          <w:szCs w:val="24"/>
-        </w:rPr>
-        <w:t>O TEA Lean automatiza a adaptação pedagógica utilizando Inteligência Artificial.</w:t>
-      </w:r>
-    </w:p>
-    <w:p>
-      <w:pPr>
-        <w:jc w:val="both"/>
-        <w:rPr>
-          <w:rFonts w:ascii="Arial" w:hAnsi="Arial" w:cs="Arial"/>
-          <w:sz w:val="24"/>
-          <w:szCs w:val="24"/>
-        </w:rPr>
-      </w:pPr>
-      <w:r>
-        <w:rPr>
-          <w:rFonts w:ascii="Arial" w:hAnsi="Arial" w:cs="Arial"/>
-          <w:sz w:val="24"/>
-          <w:szCs w:val="24"/>
-        </w:rPr>
-        <w:t>A plataforma transforma materiais didáticos comuns em versões mais acessíveis para estudantes com TEA.</w:t>
-      </w:r>
-    </w:p>
-    <w:p>
-      <w:pPr>
-        <w:jc w:val="both"/>
-        <w:rPr>
-          <w:rFonts w:ascii="Arial" w:hAnsi="Arial" w:cs="Arial"/>
-          <w:sz w:val="24"/>
-          <w:szCs w:val="24"/>
-          <w:u w:val="single"/>
-        </w:rPr>
-      </w:pPr>
-      <w:r>
-        <w:rPr>
-          <w:rFonts w:ascii="Arial" w:hAnsi="Arial" w:cs="Arial"/>
-          <w:sz w:val="24"/>
-          <w:szCs w:val="24"/>
-        </w:rPr>
-        <w:t>Nosso foco está em Língua Portuguesa, Literatura, História, Geografia, Sociologia e Filosofia</w:t>
       </w:r>
     </w:p>
     <w:sectPr>
@@ -3144,7 +3343,7 @@
 </file>
 
 <file path=word/comments.xml><?xml version="1.0" encoding="utf-8"?>
-<w:comments xmlns:wpc="http://schemas.microsoft.com/office/word/2010/wordprocessingCanvas" xmlns:cx="http://schemas.microsoft.com/office/drawing/2014/chartex" xmlns:cx1="http://schemas.microsoft.com/office/drawing/2015/9/8/chartex" xmlns:cx2="http://schemas.microsoft.com/office/drawing/2015/10/21/chartex" xmlns:cx3="http://schemas.microsoft.com/office/drawing/2016/5/9/chartex" xmlns:cx4="http://schemas.microsoft.com/office/drawing/2016/5/10/chartex" xmlns:cx5="http://schemas.microsoft.com/office/drawing/2016/5/11/chartex" xmlns:cx6="http://schemas.microsoft.com/office/drawing/2016/5/12/chartex" xmlns:cx7="http://schemas.microsoft.com/office/drawing/2016/5/13/chartex" xmlns:cx8="http://schemas.microsoft.com/office/drawing/2016/5/14/chartex" xmlns:mc="http://schemas.openxmlformats.org/markup-compatibility/2006" xmlns:aink="http://schemas.microsoft.com/office/drawing/2016/ink" xmlns:am3d="http://schemas.microsoft.com/office/drawing/2017/model3d" xmlns:o="urn:schemas-microsoft-com:office:office" xmlns:oel="http://schemas.microsoft.com/office/2019/extlst" xmlns:r="http://schemas.openxmlformats.org/officeDocument/2006/relationships" xmlns:m="http://schemas.openxmlformats.org/officeDocument/2006/math" xmlns:v="urn:schemas-microsoft-com:vml" xmlns:wp14="http://schemas.microsoft.com/office/word/2010/wordprocessingDrawing" xmlns:wp="http://schemas.openxmlformats.org/drawingml/2006/wordprocessingDrawing" xmlns:w10="urn:schemas-microsoft-com:office:word" xmlns:w="http://schemas.openxmlformats.org/wordprocessingml/2006/main" xmlns:w14="http://schemas.microsoft.com/office/word/2010/wordml" xmlns:w15="http://schemas.microsoft.com/office/word/2012/wordml" xmlns:w16cex="http://schemas.microsoft.com/office/word/2018/wordml/cex" xmlns:w16cid="http://schemas.microsoft.com/office/word/2016/wordml/cid" xmlns:w16="http://schemas.microsoft.com/office/word/2018/wordml" xmlns:w16sdtdh="http://schemas.microsoft.com/office/word/2020/wordml/sdtdatahash" xmlns:w16se="http://schemas.microsoft.com/office/word/2015/wordml/symex" xmlns:wpg="http://schemas.microsoft.com/office/word/2010/wordprocessingGroup" xmlns:wpi="http://schemas.microsoft.com/office/word/2010/wordprocessingInk" xmlns:wne="http://schemas.microsoft.com/office/word/2006/wordml" xmlns:wps="http://schemas.microsoft.com/office/word/2010/wordprocessingShape" mc:Ignorable="w14 w15 w16se w16cid w16 w16cex w16sdtdh wp14">
+<w:comments xmlns:wpc="http://schemas.microsoft.com/office/word/2010/wordprocessingCanvas" xmlns:cx="http://schemas.microsoft.com/office/drawing/2014/chartex" xmlns:cx1="http://schemas.microsoft.com/office/drawing/2015/9/8/chartex" xmlns:cx2="http://schemas.microsoft.com/office/drawing/2015/10/21/chartex" xmlns:cx3="http://schemas.microsoft.com/office/drawing/2016/5/9/chartex" xmlns:cx4="http://schemas.microsoft.com/office/drawing/2016/5/10/chartex" xmlns:cx5="http://schemas.microsoft.com/office/drawing/2016/5/11/chartex" xmlns:cx6="http://schemas.microsoft.com/office/drawing/2016/5/12/chartex" xmlns:cx7="http://schemas.microsoft.com/office/drawing/2016/5/13/chartex" xmlns:cx8="http://schemas.microsoft.com/office/drawing/2016/5/14/chartex" xmlns:mc="http://schemas.openxmlformats.org/markup-compatibility/2006" xmlns:aink="http://schemas.microsoft.com/office/drawing/2016/ink" xmlns:am3d="http://schemas.microsoft.com/office/drawing/2017/model3d" xmlns:o="urn:schemas-microsoft-com:office:office" xmlns:r="http://schemas.openxmlformats.org/officeDocument/2006/relationships" xmlns:m="http://schemas.openxmlformats.org/officeDocument/2006/math" xmlns:v="urn:schemas-microsoft-com:vml" xmlns:wp14="http://schemas.microsoft.com/office/word/2010/wordprocessingDrawing" xmlns:wp="http://schemas.openxmlformats.org/drawingml/2006/wordprocessingDrawing" xmlns:w10="urn:schemas-microsoft-com:office:word" xmlns:w="http://schemas.openxmlformats.org/wordprocessingml/2006/main" xmlns:w14="http://schemas.microsoft.com/office/word/2010/wordml" xmlns:w15="http://schemas.microsoft.com/office/word/2012/wordml" xmlns:w16cid="http://schemas.microsoft.com/office/word/2016/wordml/cid" xmlns:w16se="http://schemas.microsoft.com/office/word/2015/wordml/symex" xmlns:wpg="http://schemas.microsoft.com/office/word/2010/wordprocessingGroup" xmlns:wpi="http://schemas.microsoft.com/office/word/2010/wordprocessingInk" xmlns:wne="http://schemas.microsoft.com/office/word/2006/wordml" xmlns:wps="http://schemas.microsoft.com/office/word/2010/wordprocessingShape" mc:Ignorable="w14 w15 w16se w16cid wp14">
   <w:comment w:id="0" w:author="CAMARGO" w:date="2026-05-07T09:03:00Z" w:initials="C">
     <w:p>
       <w:pPr>
@@ -3176,20 +3375,133 @@
 </file>
 
 <file path=word/commentsExtended.xml><?xml version="1.0" encoding="utf-8"?>
-<w15:commentsEx xmlns:wpc="http://schemas.microsoft.com/office/word/2010/wordprocessingCanvas" xmlns:cx="http://schemas.microsoft.com/office/drawing/2014/chartex" xmlns:cx1="http://schemas.microsoft.com/office/drawing/2015/9/8/chartex" xmlns:cx2="http://schemas.microsoft.com/office/drawing/2015/10/21/chartex" xmlns:cx3="http://schemas.microsoft.com/office/drawing/2016/5/9/chartex" xmlns:cx4="http://schemas.microsoft.com/office/drawing/2016/5/10/chartex" xmlns:cx5="http://schemas.microsoft.com/office/drawing/2016/5/11/chartex" xmlns:cx6="http://schemas.microsoft.com/office/drawing/2016/5/12/chartex" xmlns:cx7="http://schemas.microsoft.com/office/drawing/2016/5/13/chartex" xmlns:cx8="http://schemas.microsoft.com/office/drawing/2016/5/14/chartex" xmlns:mc="http://schemas.openxmlformats.org/markup-compatibility/2006" xmlns:aink="http://schemas.microsoft.com/office/drawing/2016/ink" xmlns:am3d="http://schemas.microsoft.com/office/drawing/2017/model3d" xmlns:o="urn:schemas-microsoft-com:office:office" xmlns:oel="http://schemas.microsoft.com/office/2019/extlst" xmlns:r="http://schemas.openxmlformats.org/officeDocument/2006/relationships" xmlns:m="http://schemas.openxmlformats.org/officeDocument/2006/math" xmlns:v="urn:schemas-microsoft-com:vml" xmlns:wp14="http://schemas.microsoft.com/office/word/2010/wordprocessingDrawing" xmlns:wp="http://schemas.openxmlformats.org/drawingml/2006/wordprocessingDrawing" xmlns:w10="urn:schemas-microsoft-com:office:word" xmlns:w="http://schemas.openxmlformats.org/wordprocessingml/2006/main" xmlns:w14="http://schemas.microsoft.com/office/word/2010/wordml" xmlns:w15="http://schemas.microsoft.com/office/word/2012/wordml" xmlns:w16cex="http://schemas.microsoft.com/office/word/2018/wordml/cex" xmlns:w16cid="http://schemas.microsoft.com/office/word/2016/wordml/cid" xmlns:w16="http://schemas.microsoft.com/office/word/2018/wordml" xmlns:w16sdtdh="http://schemas.microsoft.com/office/word/2020/wordml/sdtdatahash" xmlns:w16se="http://schemas.microsoft.com/office/word/2015/wordml/symex" xmlns:wpg="http://schemas.microsoft.com/office/word/2010/wordprocessingGroup" xmlns:wpi="http://schemas.microsoft.com/office/word/2010/wordprocessingInk" xmlns:wne="http://schemas.microsoft.com/office/word/2006/wordml" xmlns:wps="http://schemas.microsoft.com/office/word/2010/wordprocessingShape" mc:Ignorable="w14 w15 w16se w16cid w16 w16cex w16sdtdh wp14">
+<w15:commentsEx xmlns:wpc="http://schemas.microsoft.com/office/word/2010/wordprocessingCanvas" xmlns:cx="http://schemas.microsoft.com/office/drawing/2014/chartex" xmlns:cx1="http://schemas.microsoft.com/office/drawing/2015/9/8/chartex" xmlns:cx2="http://schemas.microsoft.com/office/drawing/2015/10/21/chartex" xmlns:cx3="http://schemas.microsoft.com/office/drawing/2016/5/9/chartex" xmlns:cx4="http://schemas.microsoft.com/office/drawing/2016/5/10/chartex" xmlns:cx5="http://schemas.microsoft.com/office/drawing/2016/5/11/chartex" xmlns:cx6="http://schemas.microsoft.com/office/drawing/2016/5/12/chartex" xmlns:cx7="http://schemas.microsoft.com/office/drawing/2016/5/13/chartex" xmlns:cx8="http://schemas.microsoft.com/office/drawing/2016/5/14/chartex" xmlns:mc="http://schemas.openxmlformats.org/markup-compatibility/2006" xmlns:aink="http://schemas.microsoft.com/office/drawing/2016/ink" xmlns:am3d="http://schemas.microsoft.com/office/drawing/2017/model3d" xmlns:o="urn:schemas-microsoft-com:office:office" xmlns:r="http://schemas.openxmlformats.org/officeDocument/2006/relationships" xmlns:m="http://schemas.openxmlformats.org/officeDocument/2006/math" xmlns:v="urn:schemas-microsoft-com:vml" xmlns:wp14="http://schemas.microsoft.com/office/word/2010/wordprocessingDrawing" xmlns:wp="http://schemas.openxmlformats.org/drawingml/2006/wordprocessingDrawing" xmlns:w10="urn:schemas-microsoft-com:office:word" xmlns:w="http://schemas.openxmlformats.org/wordprocessingml/2006/main" xmlns:w14="http://schemas.microsoft.com/office/word/2010/wordml" xmlns:w15="http://schemas.microsoft.com/office/word/2012/wordml" xmlns:w16cid="http://schemas.microsoft.com/office/word/2016/wordml/cid" xmlns:w16se="http://schemas.microsoft.com/office/word/2015/wordml/symex" xmlns:wpg="http://schemas.microsoft.com/office/word/2010/wordprocessingGroup" xmlns:wpi="http://schemas.microsoft.com/office/word/2010/wordprocessingInk" xmlns:wne="http://schemas.microsoft.com/office/word/2006/wordml" xmlns:wps="http://schemas.microsoft.com/office/word/2010/wordprocessingShape" mc:Ignorable="w14 w15 w16se w16cid wp14">
   <w15:commentEx w15:paraId="6A553135" w15:done="0"/>
 </w15:commentsEx>
 </file>
 
 <file path=word/commentsIds.xml><?xml version="1.0" encoding="utf-8"?>
-<w16cid:commentsIds xmlns:wpc="http://schemas.microsoft.com/office/word/2010/wordprocessingCanvas" xmlns:cx="http://schemas.microsoft.com/office/drawing/2014/chartex" xmlns:cx1="http://schemas.microsoft.com/office/drawing/2015/9/8/chartex" xmlns:cx2="http://schemas.microsoft.com/office/drawing/2015/10/21/chartex" xmlns:cx3="http://schemas.microsoft.com/office/drawing/2016/5/9/chartex" xmlns:cx4="http://schemas.microsoft.com/office/drawing/2016/5/10/chartex" xmlns:cx5="http://schemas.microsoft.com/office/drawing/2016/5/11/chartex" xmlns:cx6="http://schemas.microsoft.com/office/drawing/2016/5/12/chartex" xmlns:cx7="http://schemas.microsoft.com/office/drawing/2016/5/13/chartex" xmlns:cx8="http://schemas.microsoft.com/office/drawing/2016/5/14/chartex" xmlns:mc="http://schemas.openxmlformats.org/markup-compatibility/2006" xmlns:aink="http://schemas.microsoft.com/office/drawing/2016/ink" xmlns:am3d="http://schemas.microsoft.com/office/drawing/2017/model3d" xmlns:o="urn:schemas-microsoft-com:office:office" xmlns:oel="http://schemas.microsoft.com/office/2019/extlst" xmlns:r="http://schemas.openxmlformats.org/officeDocument/2006/relationships" xmlns:m="http://schemas.openxmlformats.org/officeDocument/2006/math" xmlns:v="urn:schemas-microsoft-com:vml" xmlns:wp14="http://schemas.microsoft.com/office/word/2010/wordprocessingDrawing" xmlns:wp="http://schemas.openxmlformats.org/drawingml/2006/wordprocessingDrawing" xmlns:w10="urn:schemas-microsoft-com:office:word" xmlns:w="http://schemas.openxmlformats.org/wordprocessingml/2006/main" xmlns:w14="http://schemas.microsoft.com/office/word/2010/wordml" xmlns:w15="http://schemas.microsoft.com/office/word/2012/wordml" xmlns:w16cex="http://schemas.microsoft.com/office/word/2018/wordml/cex" xmlns:w16cid="http://schemas.microsoft.com/office/word/2016/wordml/cid" xmlns:w16="http://schemas.microsoft.com/office/word/2018/wordml" xmlns:w16sdtdh="http://schemas.microsoft.com/office/word/2020/wordml/sdtdatahash" xmlns:w16se="http://schemas.microsoft.com/office/word/2015/wordml/symex" xmlns:wpg="http://schemas.microsoft.com/office/word/2010/wordprocessingGroup" xmlns:wpi="http://schemas.microsoft.com/office/word/2010/wordprocessingInk" xmlns:wne="http://schemas.microsoft.com/office/word/2006/wordml" xmlns:wps="http://schemas.microsoft.com/office/word/2010/wordprocessingShape" mc:Ignorable="w14 w15 w16se w16cid w16 w16cex w16sdtdh wp14">
+<w16cid:commentsIds xmlns:wpc="http://schemas.microsoft.com/office/word/2010/wordprocessingCanvas" xmlns:cx="http://schemas.microsoft.com/office/drawing/2014/chartex" xmlns:cx1="http://schemas.microsoft.com/office/drawing/2015/9/8/chartex" xmlns:cx2="http://schemas.microsoft.com/office/drawing/2015/10/21/chartex" xmlns:cx3="http://schemas.microsoft.com/office/drawing/2016/5/9/chartex" xmlns:cx4="http://schemas.microsoft.com/office/drawing/2016/5/10/chartex" xmlns:cx5="http://schemas.microsoft.com/office/drawing/2016/5/11/chartex" xmlns:cx6="http://schemas.microsoft.com/office/drawing/2016/5/12/chartex" xmlns:cx7="http://schemas.microsoft.com/office/drawing/2016/5/13/chartex" xmlns:cx8="http://schemas.microsoft.com/office/drawing/2016/5/14/chartex" xmlns:mc="http://schemas.openxmlformats.org/markup-compatibility/2006" xmlns:aink="http://schemas.microsoft.com/office/drawing/2016/ink" xmlns:am3d="http://schemas.microsoft.com/office/drawing/2017/model3d" xmlns:o="urn:schemas-microsoft-com:office:office" xmlns:r="http://schemas.openxmlformats.org/officeDocument/2006/relationships" xmlns:m="http://schemas.openxmlformats.org/officeDocument/2006/math" xmlns:v="urn:schemas-microsoft-com:vml" xmlns:wp14="http://schemas.microsoft.com/office/word/2010/wordprocessingDrawing" xmlns:wp="http://schemas.openxmlformats.org/drawingml/2006/wordprocessingDrawing" xmlns:w10="urn:schemas-microsoft-com:office:word" xmlns:w="http://schemas.openxmlformats.org/wordprocessingml/2006/main" xmlns:w14="http://schemas.microsoft.com/office/word/2010/wordml" xmlns:w15="http://schemas.microsoft.com/office/word/2012/wordml" xmlns:w16cid="http://schemas.microsoft.com/office/word/2016/wordml/cid" xmlns:w16se="http://schemas.microsoft.com/office/word/2015/wordml/symex" xmlns:wpg="http://schemas.microsoft.com/office/word/2010/wordprocessingGroup" xmlns:wpi="http://schemas.microsoft.com/office/word/2010/wordprocessingInk" xmlns:wne="http://schemas.microsoft.com/office/word/2006/wordml" xmlns:wps="http://schemas.microsoft.com/office/word/2010/wordprocessingShape" mc:Ignorable="w14 w15 w16se w16cid wp14">
   <w16cid:commentId w16cid:paraId="6A553135" w16cid:durableId="76222916"/>
 </w16cid:commentsIds>
 </file>
 
 <file path=word/numbering.xml><?xml version="1.0" encoding="utf-8"?>
-<w:numbering xmlns:wpc="http://schemas.microsoft.com/office/word/2010/wordprocessingCanvas" xmlns:cx="http://schemas.microsoft.com/office/drawing/2014/chartex" xmlns:cx1="http://schemas.microsoft.com/office/drawing/2015/9/8/chartex" xmlns:cx2="http://schemas.microsoft.com/office/drawing/2015/10/21/chartex" xmlns:cx3="http://schemas.microsoft.com/office/drawing/2016/5/9/chartex" xmlns:cx4="http://schemas.microsoft.com/office/drawing/2016/5/10/chartex" xmlns:cx5="http://schemas.microsoft.com/office/drawing/2016/5/11/chartex" xmlns:cx6="http://schemas.microsoft.com/office/drawing/2016/5/12/chartex" xmlns:cx7="http://schemas.microsoft.com/office/drawing/2016/5/13/chartex" xmlns:cx8="http://schemas.microsoft.com/office/drawing/2016/5/14/chartex" xmlns:mc="http://schemas.openxmlformats.org/markup-compatibility/2006" xmlns:aink="http://schemas.microsoft.com/office/drawing/2016/ink" xmlns:am3d="http://schemas.microsoft.com/office/drawing/2017/model3d" xmlns:o="urn:schemas-microsoft-com:office:office" xmlns:oel="http://schemas.microsoft.com/office/2019/extlst" xmlns:r="http://schemas.openxmlformats.org/officeDocument/2006/relationships" xmlns:m="http://schemas.openxmlformats.org/officeDocument/2006/math" xmlns:v="urn:schemas-microsoft-com:vml" xmlns:wp14="http://schemas.microsoft.com/office/word/2010/wordprocessingDrawing" xmlns:wp="http://schemas.openxmlformats.org/drawingml/2006/wordprocessingDrawing" xmlns:w10="urn:schemas-microsoft-com:office:word" xmlns:w="http://schemas.openxmlformats.org/wordprocessingml/2006/main" xmlns:w14="http://schemas.microsoft.com/office/word/2010/wordml" xmlns:w15="http://schemas.microsoft.com/office/word/2012/wordml" xmlns:w16cex="http://schemas.microsoft.com/office/word/2018/wordml/cex" xmlns:w16cid="http://schemas.microsoft.com/office/word/2016/wordml/cid" xmlns:w16="http://schemas.microsoft.com/office/word/2018/wordml" xmlns:w16sdtdh="http://schemas.microsoft.com/office/word/2020/wordml/sdtdatahash" xmlns:w16se="http://schemas.microsoft.com/office/word/2015/wordml/symex" xmlns:wpg="http://schemas.microsoft.com/office/word/2010/wordprocessingGroup" xmlns:wpi="http://schemas.microsoft.com/office/word/2010/wordprocessingInk" xmlns:wne="http://schemas.microsoft.com/office/word/2006/wordml" xmlns:wps="http://schemas.microsoft.com/office/word/2010/wordprocessingShape" mc:Ignorable="w14 w15 w16se w16cid w16 w16cex w16sdtdh wp14">
+<w:numbering xmlns:wpc="http://schemas.microsoft.com/office/word/2010/wordprocessingCanvas" xmlns:cx="http://schemas.microsoft.com/office/drawing/2014/chartex" xmlns:cx1="http://schemas.microsoft.com/office/drawing/2015/9/8/chartex" xmlns:cx2="http://schemas.microsoft.com/office/drawing/2015/10/21/chartex" xmlns:cx3="http://schemas.microsoft.com/office/drawing/2016/5/9/chartex" xmlns:cx4="http://schemas.microsoft.com/office/drawing/2016/5/10/chartex" xmlns:cx5="http://schemas.microsoft.com/office/drawing/2016/5/11/chartex" xmlns:cx6="http://schemas.microsoft.com/office/drawing/2016/5/12/chartex" xmlns:cx7="http://schemas.microsoft.com/office/drawing/2016/5/13/chartex" xmlns:cx8="http://schemas.microsoft.com/office/drawing/2016/5/14/chartex" xmlns:mc="http://schemas.openxmlformats.org/markup-compatibility/2006" xmlns:aink="http://schemas.microsoft.com/office/drawing/2016/ink" xmlns:am3d="http://schemas.microsoft.com/office/drawing/2017/model3d" xmlns:o="urn:schemas-microsoft-com:office:office" xmlns:r="http://schemas.openxmlformats.org/officeDocument/2006/relationships" xmlns:m="http://schemas.openxmlformats.org/officeDocument/2006/math" xmlns:v="urn:schemas-microsoft-com:vml" xmlns:wp14="http://schemas.microsoft.com/office/word/2010/wordprocessingDrawing" xmlns:wp="http://schemas.openxmlformats.org/drawingml/2006/wordprocessingDrawing" xmlns:w10="urn:schemas-microsoft-com:office:word" xmlns:w="http://schemas.openxmlformats.org/wordprocessingml/2006/main" xmlns:w14="http://schemas.microsoft.com/office/word/2010/wordml" xmlns:w15="http://schemas.microsoft.com/office/word/2012/wordml" xmlns:w16cid="http://schemas.microsoft.com/office/word/2016/wordml/cid" xmlns:w16se="http://schemas.microsoft.com/office/word/2015/wordml/symex" xmlns:wpg="http://schemas.microsoft.com/office/word/2010/wordprocessingGroup" xmlns:wpi="http://schemas.microsoft.com/office/word/2010/wordprocessingInk" xmlns:wne="http://schemas.microsoft.com/office/word/2006/wordml" xmlns:wps="http://schemas.microsoft.com/office/word/2010/wordprocessingShape" mc:Ignorable="w14 w15 w16se w16cid wp14">
   <w:abstractNum w:abstractNumId="0" w15:restartNumberingAfterBreak="0">
+    <w:nsid w:val="05FF2B0A"/>
+    <w:multiLevelType w:val="hybridMultilevel"/>
+    <w:tmpl w:val="F57667FE"/>
+    <w:lvl w:ilvl="0" w:tplc="04160001">
+      <w:start w:val="1"/>
+      <w:numFmt w:val="bullet"/>
+      <w:lvlText w:val=""/>
+      <w:lvlJc w:val="left"/>
+      <w:pPr>
+        <w:ind w:left="2484" w:hanging="360"/>
+      </w:pPr>
+      <w:rPr>
+        <w:rFonts w:ascii="Symbol" w:hAnsi="Symbol" w:hint="default"/>
+      </w:rPr>
+    </w:lvl>
+    <w:lvl w:ilvl="1" w:tplc="04160003" w:tentative="1">
+      <w:start w:val="1"/>
+      <w:numFmt w:val="bullet"/>
+      <w:lvlText w:val="o"/>
+      <w:lvlJc w:val="left"/>
+      <w:pPr>
+        <w:ind w:left="3204" w:hanging="360"/>
+      </w:pPr>
+      <w:rPr>
+        <w:rFonts w:ascii="Courier New" w:hAnsi="Courier New" w:cs="Courier New" w:hint="default"/>
+      </w:rPr>
+    </w:lvl>
+    <w:lvl w:ilvl="2" w:tplc="04160005" w:tentative="1">
+      <w:start w:val="1"/>
+      <w:numFmt w:val="bullet"/>
+      <w:lvlText w:val=""/>
+      <w:lvlJc w:val="left"/>
+      <w:pPr>
+        <w:ind w:left="3924" w:hanging="360"/>
+      </w:pPr>
+      <w:rPr>
+        <w:rFonts w:ascii="Wingdings" w:hAnsi="Wingdings" w:hint="default"/>
+      </w:rPr>
+    </w:lvl>
+    <w:lvl w:ilvl="3" w:tplc="04160001" w:tentative="1">
+      <w:start w:val="1"/>
+      <w:numFmt w:val="bullet"/>
+      <w:lvlText w:val=""/>
+      <w:lvlJc w:val="left"/>
+      <w:pPr>
+        <w:ind w:left="4644" w:hanging="360"/>
+      </w:pPr>
+      <w:rPr>
+        <w:rFonts w:ascii="Symbol" w:hAnsi="Symbol" w:hint="default"/>
+      </w:rPr>
+    </w:lvl>
+    <w:lvl w:ilvl="4" w:tplc="04160003" w:tentative="1">
+      <w:start w:val="1"/>
+      <w:numFmt w:val="bullet"/>
+      <w:lvlText w:val="o"/>
+      <w:lvlJc w:val="left"/>
+      <w:pPr>
+        <w:ind w:left="5364" w:hanging="360"/>
+      </w:pPr>
+      <w:rPr>
+        <w:rFonts w:ascii="Courier New" w:hAnsi="Courier New" w:cs="Courier New" w:hint="default"/>
+      </w:rPr>
+    </w:lvl>
+    <w:lvl w:ilvl="5" w:tplc="04160005" w:tentative="1">
+      <w:start w:val="1"/>
+      <w:numFmt w:val="bullet"/>
+      <w:lvlText w:val=""/>
+      <w:lvlJc w:val="left"/>
+      <w:pPr>
+        <w:ind w:left="6084" w:hanging="360"/>
+      </w:pPr>
+      <w:rPr>
+        <w:rFonts w:ascii="Wingdings" w:hAnsi="Wingdings" w:hint="default"/>
+      </w:rPr>
+    </w:lvl>
+    <w:lvl w:ilvl="6" w:tplc="04160001" w:tentative="1">
+      <w:start w:val="1"/>
+      <w:numFmt w:val="bullet"/>
+      <w:lvlText w:val=""/>
+      <w:lvlJc w:val="left"/>
+      <w:pPr>
+        <w:ind w:left="6804" w:hanging="360"/>
+      </w:pPr>
+      <w:rPr>
+        <w:rFonts w:ascii="Symbol" w:hAnsi="Symbol" w:hint="default"/>
+      </w:rPr>
+    </w:lvl>
+    <w:lvl w:ilvl="7" w:tplc="04160003" w:tentative="1">
+      <w:start w:val="1"/>
+      <w:numFmt w:val="bullet"/>
+      <w:lvlText w:val="o"/>
+      <w:lvlJc w:val="left"/>
+      <w:pPr>
+        <w:ind w:left="7524" w:hanging="360"/>
+      </w:pPr>
+      <w:rPr>
+        <w:rFonts w:ascii="Courier New" w:hAnsi="Courier New" w:cs="Courier New" w:hint="default"/>
+      </w:rPr>
+    </w:lvl>
+    <w:lvl w:ilvl="8" w:tplc="04160005" w:tentative="1">
+      <w:start w:val="1"/>
+      <w:numFmt w:val="bullet"/>
+      <w:lvlText w:val=""/>
+      <w:lvlJc w:val="left"/>
+      <w:pPr>
+        <w:ind w:left="8244" w:hanging="360"/>
+      </w:pPr>
+      <w:rPr>
+        <w:rFonts w:ascii="Wingdings" w:hAnsi="Wingdings" w:hint="default"/>
+      </w:rPr>
+    </w:lvl>
+  </w:abstractNum>
+  <w:abstractNum w:abstractNumId="1" w15:restartNumberingAfterBreak="0">
     <w:nsid w:val="089D108D"/>
     <w:multiLevelType w:val="hybridMultilevel"/>
     <w:tmpl w:val="1A8600BE"/>
@@ -3275,7 +3587,7 @@
       </w:pPr>
     </w:lvl>
   </w:abstractNum>
-  <w:abstractNum w:abstractNumId="1" w15:restartNumberingAfterBreak="0">
+  <w:abstractNum w:abstractNumId="2" w15:restartNumberingAfterBreak="0">
     <w:nsid w:val="0A1A2C29"/>
     <w:multiLevelType w:val="hybridMultilevel"/>
     <w:tmpl w:val="98185F1E"/>
@@ -3388,7 +3700,7 @@
       </w:rPr>
     </w:lvl>
   </w:abstractNum>
-  <w:abstractNum w:abstractNumId="2" w15:restartNumberingAfterBreak="0">
+  <w:abstractNum w:abstractNumId="3" w15:restartNumberingAfterBreak="0">
     <w:nsid w:val="1058421C"/>
     <w:multiLevelType w:val="hybridMultilevel"/>
     <w:tmpl w:val="C54C91CC"/>
@@ -3501,7 +3813,7 @@
       </w:rPr>
     </w:lvl>
   </w:abstractNum>
-  <w:abstractNum w:abstractNumId="3" w15:restartNumberingAfterBreak="0">
+  <w:abstractNum w:abstractNumId="4" w15:restartNumberingAfterBreak="0">
     <w:nsid w:val="10623B9D"/>
     <w:multiLevelType w:val="hybridMultilevel"/>
     <w:tmpl w:val="8D989FA2"/>
@@ -3614,7 +3926,7 @@
       </w:rPr>
     </w:lvl>
   </w:abstractNum>
-  <w:abstractNum w:abstractNumId="4" w15:restartNumberingAfterBreak="0">
+  <w:abstractNum w:abstractNumId="5" w15:restartNumberingAfterBreak="0">
     <w:nsid w:val="1BFC42E1"/>
     <w:multiLevelType w:val="hybridMultilevel"/>
     <w:tmpl w:val="FD1259FA"/>
@@ -3727,7 +4039,7 @@
       </w:rPr>
     </w:lvl>
   </w:abstractNum>
-  <w:abstractNum w:abstractNumId="5" w15:restartNumberingAfterBreak="0">
+  <w:abstractNum w:abstractNumId="6" w15:restartNumberingAfterBreak="0">
     <w:nsid w:val="1EAE2F3B"/>
     <w:multiLevelType w:val="hybridMultilevel"/>
     <w:tmpl w:val="3506852E"/>
@@ -3840,7 +4152,7 @@
       </w:rPr>
     </w:lvl>
   </w:abstractNum>
-  <w:abstractNum w:abstractNumId="6" w15:restartNumberingAfterBreak="0">
+  <w:abstractNum w:abstractNumId="7" w15:restartNumberingAfterBreak="0">
     <w:nsid w:val="2753510E"/>
     <w:multiLevelType w:val="hybridMultilevel"/>
     <w:tmpl w:val="720E1EBE"/>
@@ -3953,7 +4265,7 @@
       </w:rPr>
     </w:lvl>
   </w:abstractNum>
-  <w:abstractNum w:abstractNumId="7" w15:restartNumberingAfterBreak="0">
+  <w:abstractNum w:abstractNumId="8" w15:restartNumberingAfterBreak="0">
     <w:nsid w:val="2AB93503"/>
     <w:multiLevelType w:val="hybridMultilevel"/>
     <w:tmpl w:val="D47C3932"/>
@@ -4066,7 +4378,7 @@
       </w:rPr>
     </w:lvl>
   </w:abstractNum>
-  <w:abstractNum w:abstractNumId="8" w15:restartNumberingAfterBreak="0">
+  <w:abstractNum w:abstractNumId="9" w15:restartNumberingAfterBreak="0">
     <w:nsid w:val="329F3BA7"/>
     <w:multiLevelType w:val="hybridMultilevel"/>
     <w:tmpl w:val="77D48C54"/>
@@ -4179,7 +4491,7 @@
       </w:rPr>
     </w:lvl>
   </w:abstractNum>
-  <w:abstractNum w:abstractNumId="9" w15:restartNumberingAfterBreak="0">
+  <w:abstractNum w:abstractNumId="10" w15:restartNumberingAfterBreak="0">
     <w:nsid w:val="34571A1B"/>
     <w:multiLevelType w:val="hybridMultilevel"/>
     <w:tmpl w:val="522E43AC"/>
@@ -4292,7 +4604,7 @@
       </w:rPr>
     </w:lvl>
   </w:abstractNum>
-  <w:abstractNum w:abstractNumId="10" w15:restartNumberingAfterBreak="0">
+  <w:abstractNum w:abstractNumId="11" w15:restartNumberingAfterBreak="0">
     <w:nsid w:val="551F5949"/>
     <w:multiLevelType w:val="hybridMultilevel"/>
     <w:tmpl w:val="2C10AE98"/>
@@ -4405,7 +4717,7 @@
       </w:rPr>
     </w:lvl>
   </w:abstractNum>
-  <w:abstractNum w:abstractNumId="11" w15:restartNumberingAfterBreak="0">
+  <w:abstractNum w:abstractNumId="12" w15:restartNumberingAfterBreak="0">
     <w:nsid w:val="61FF3F26"/>
     <w:multiLevelType w:val="hybridMultilevel"/>
     <w:tmpl w:val="C43CD392"/>
@@ -4518,7 +4830,7 @@
       </w:rPr>
     </w:lvl>
   </w:abstractNum>
-  <w:abstractNum w:abstractNumId="12" w15:restartNumberingAfterBreak="0">
+  <w:abstractNum w:abstractNumId="13" w15:restartNumberingAfterBreak="0">
     <w:nsid w:val="63161AE0"/>
     <w:multiLevelType w:val="hybridMultilevel"/>
     <w:tmpl w:val="93E65638"/>
@@ -4631,7 +4943,120 @@
       </w:rPr>
     </w:lvl>
   </w:abstractNum>
-  <w:abstractNum w:abstractNumId="13" w15:restartNumberingAfterBreak="0">
+  <w:abstractNum w:abstractNumId="14" w15:restartNumberingAfterBreak="0">
+    <w:nsid w:val="71CD1D6C"/>
+    <w:multiLevelType w:val="hybridMultilevel"/>
+    <w:tmpl w:val="88E4FDAA"/>
+    <w:lvl w:ilvl="0" w:tplc="04160001">
+      <w:start w:val="1"/>
+      <w:numFmt w:val="bullet"/>
+      <w:lvlText w:val=""/>
+      <w:lvlJc w:val="left"/>
+      <w:pPr>
+        <w:ind w:left="1428" w:hanging="360"/>
+      </w:pPr>
+      <w:rPr>
+        <w:rFonts w:ascii="Symbol" w:hAnsi="Symbol" w:hint="default"/>
+      </w:rPr>
+    </w:lvl>
+    <w:lvl w:ilvl="1" w:tplc="04160003" w:tentative="1">
+      <w:start w:val="1"/>
+      <w:numFmt w:val="bullet"/>
+      <w:lvlText w:val="o"/>
+      <w:lvlJc w:val="left"/>
+      <w:pPr>
+        <w:ind w:left="2148" w:hanging="360"/>
+      </w:pPr>
+      <w:rPr>
+        <w:rFonts w:ascii="Courier New" w:hAnsi="Courier New" w:cs="Courier New" w:hint="default"/>
+      </w:rPr>
+    </w:lvl>
+    <w:lvl w:ilvl="2" w:tplc="04160005" w:tentative="1">
+      <w:start w:val="1"/>
+      <w:numFmt w:val="bullet"/>
+      <w:lvlText w:val=""/>
+      <w:lvlJc w:val="left"/>
+      <w:pPr>
+        <w:ind w:left="2868" w:hanging="360"/>
+      </w:pPr>
+      <w:rPr>
+        <w:rFonts w:ascii="Wingdings" w:hAnsi="Wingdings" w:hint="default"/>
+      </w:rPr>
+    </w:lvl>
+    <w:lvl w:ilvl="3" w:tplc="04160001" w:tentative="1">
+      <w:start w:val="1"/>
+      <w:numFmt w:val="bullet"/>
+      <w:lvlText w:val=""/>
+      <w:lvlJc w:val="left"/>
+      <w:pPr>
+        <w:ind w:left="3588" w:hanging="360"/>
+      </w:pPr>
+      <w:rPr>
+        <w:rFonts w:ascii="Symbol" w:hAnsi="Symbol" w:hint="default"/>
+      </w:rPr>
+    </w:lvl>
+    <w:lvl w:ilvl="4" w:tplc="04160003" w:tentative="1">
+      <w:start w:val="1"/>
+      <w:numFmt w:val="bullet"/>
+      <w:lvlText w:val="o"/>
+      <w:lvlJc w:val="left"/>
+      <w:pPr>
+        <w:ind w:left="4308" w:hanging="360"/>
+      </w:pPr>
+      <w:rPr>
+        <w:rFonts w:ascii="Courier New" w:hAnsi="Courier New" w:cs="Courier New" w:hint="default"/>
+      </w:rPr>
+    </w:lvl>
+    <w:lvl w:ilvl="5" w:tplc="04160005" w:tentative="1">
+      <w:start w:val="1"/>
+      <w:numFmt w:val="bullet"/>
+      <w:lvlText w:val=""/>
+      <w:lvlJc w:val="left"/>
+      <w:pPr>
+        <w:ind w:left="5028" w:hanging="360"/>
+      </w:pPr>
+      <w:rPr>
+        <w:rFonts w:ascii="Wingdings" w:hAnsi="Wingdings" w:hint="default"/>
+      </w:rPr>
+    </w:lvl>
+    <w:lvl w:ilvl="6" w:tplc="04160001" w:tentative="1">
+      <w:start w:val="1"/>
+      <w:numFmt w:val="bullet"/>
+      <w:lvlText w:val=""/>
+      <w:lvlJc w:val="left"/>
+      <w:pPr>
+        <w:ind w:left="5748" w:hanging="360"/>
+      </w:pPr>
+      <w:rPr>
+        <w:rFonts w:ascii="Symbol" w:hAnsi="Symbol" w:hint="default"/>
+      </w:rPr>
+    </w:lvl>
+    <w:lvl w:ilvl="7" w:tplc="04160003" w:tentative="1">
+      <w:start w:val="1"/>
+      <w:numFmt w:val="bullet"/>
+      <w:lvlText w:val="o"/>
+      <w:lvlJc w:val="left"/>
+      <w:pPr>
+        <w:ind w:left="6468" w:hanging="360"/>
+      </w:pPr>
+      <w:rPr>
+        <w:rFonts w:ascii="Courier New" w:hAnsi="Courier New" w:cs="Courier New" w:hint="default"/>
+      </w:rPr>
+    </w:lvl>
+    <w:lvl w:ilvl="8" w:tplc="04160005" w:tentative="1">
+      <w:start w:val="1"/>
+      <w:numFmt w:val="bullet"/>
+      <w:lvlText w:val=""/>
+      <w:lvlJc w:val="left"/>
+      <w:pPr>
+        <w:ind w:left="7188" w:hanging="360"/>
+      </w:pPr>
+      <w:rPr>
+        <w:rFonts w:ascii="Wingdings" w:hAnsi="Wingdings" w:hint="default"/>
+      </w:rPr>
+    </w:lvl>
+  </w:abstractNum>
+  <w:abstractNum w:abstractNumId="15" w15:restartNumberingAfterBreak="0">
     <w:nsid w:val="7C522888"/>
     <w:multiLevelType w:val="hybridMultilevel"/>
     <w:tmpl w:val="51AEF66A"/>
@@ -4744,53 +5169,59 @@
       </w:rPr>
     </w:lvl>
   </w:abstractNum>
-  <w:num w:numId="1" w16cid:durableId="1422294349">
+  <w:num w:numId="1">
+    <w:abstractNumId w:val="1"/>
+  </w:num>
+  <w:num w:numId="2">
+    <w:abstractNumId w:val="3"/>
+  </w:num>
+  <w:num w:numId="3">
+    <w:abstractNumId w:val="7"/>
+  </w:num>
+  <w:num w:numId="4">
+    <w:abstractNumId w:val="9"/>
+  </w:num>
+  <w:num w:numId="5">
+    <w:abstractNumId w:val="2"/>
+  </w:num>
+  <w:num w:numId="6">
+    <w:abstractNumId w:val="10"/>
+  </w:num>
+  <w:num w:numId="7">
+    <w:abstractNumId w:val="8"/>
+  </w:num>
+  <w:num w:numId="8">
+    <w:abstractNumId w:val="6"/>
+  </w:num>
+  <w:num w:numId="9">
+    <w:abstractNumId w:val="15"/>
+  </w:num>
+  <w:num w:numId="10">
+    <w:abstractNumId w:val="13"/>
+  </w:num>
+  <w:num w:numId="11">
+    <w:abstractNumId w:val="11"/>
+  </w:num>
+  <w:num w:numId="12">
+    <w:abstractNumId w:val="4"/>
+  </w:num>
+  <w:num w:numId="13">
+    <w:abstractNumId w:val="5"/>
+  </w:num>
+  <w:num w:numId="14">
+    <w:abstractNumId w:val="12"/>
+  </w:num>
+  <w:num w:numId="15">
     <w:abstractNumId w:val="0"/>
   </w:num>
-  <w:num w:numId="2" w16cid:durableId="1601374199">
-    <w:abstractNumId w:val="2"/>
-  </w:num>
-  <w:num w:numId="3" w16cid:durableId="873811162">
-    <w:abstractNumId w:val="6"/>
-  </w:num>
-  <w:num w:numId="4" w16cid:durableId="1330517786">
-    <w:abstractNumId w:val="8"/>
-  </w:num>
-  <w:num w:numId="5" w16cid:durableId="6294332">
-    <w:abstractNumId w:val="1"/>
-  </w:num>
-  <w:num w:numId="6" w16cid:durableId="1523935522">
-    <w:abstractNumId w:val="9"/>
-  </w:num>
-  <w:num w:numId="7" w16cid:durableId="1103260503">
-    <w:abstractNumId w:val="7"/>
-  </w:num>
-  <w:num w:numId="8" w16cid:durableId="585846649">
-    <w:abstractNumId w:val="5"/>
-  </w:num>
-  <w:num w:numId="9" w16cid:durableId="1947813629">
-    <w:abstractNumId w:val="13"/>
-  </w:num>
-  <w:num w:numId="10" w16cid:durableId="763771483">
-    <w:abstractNumId w:val="12"/>
-  </w:num>
-  <w:num w:numId="11" w16cid:durableId="1015812131">
-    <w:abstractNumId w:val="10"/>
-  </w:num>
-  <w:num w:numId="12" w16cid:durableId="550774202">
-    <w:abstractNumId w:val="3"/>
-  </w:num>
-  <w:num w:numId="13" w16cid:durableId="190463341">
-    <w:abstractNumId w:val="4"/>
-  </w:num>
-  <w:num w:numId="14" w16cid:durableId="708188689">
-    <w:abstractNumId w:val="11"/>
+  <w:num w:numId="16">
+    <w:abstractNumId w:val="14"/>
   </w:num>
 </w:numbering>
 </file>
 
 <file path=word/people.xml><?xml version="1.0" encoding="utf-8"?>
-<w15:people xmlns:wpc="http://schemas.microsoft.com/office/word/2010/wordprocessingCanvas" xmlns:cx="http://schemas.microsoft.com/office/drawing/2014/chartex" xmlns:cx1="http://schemas.microsoft.com/office/drawing/2015/9/8/chartex" xmlns:cx2="http://schemas.microsoft.com/office/drawing/2015/10/21/chartex" xmlns:cx3="http://schemas.microsoft.com/office/drawing/2016/5/9/chartex" xmlns:cx4="http://schemas.microsoft.com/office/drawing/2016/5/10/chartex" xmlns:cx5="http://schemas.microsoft.com/office/drawing/2016/5/11/chartex" xmlns:cx6="http://schemas.microsoft.com/office/drawing/2016/5/12/chartex" xmlns:cx7="http://schemas.microsoft.com/office/drawing/2016/5/13/chartex" xmlns:cx8="http://schemas.microsoft.com/office/drawing/2016/5/14/chartex" xmlns:mc="http://schemas.openxmlformats.org/markup-compatibility/2006" xmlns:aink="http://schemas.microsoft.com/office/drawing/2016/ink" xmlns:am3d="http://schemas.microsoft.com/office/drawing/2017/model3d" xmlns:o="urn:schemas-microsoft-com:office:office" xmlns:oel="http://schemas.microsoft.com/office/2019/extlst" xmlns:r="http://schemas.openxmlformats.org/officeDocument/2006/relationships" xmlns:m="http://schemas.openxmlformats.org/officeDocument/2006/math" xmlns:v="urn:schemas-microsoft-com:vml" xmlns:wp14="http://schemas.microsoft.com/office/word/2010/wordprocessingDrawing" xmlns:wp="http://schemas.openxmlformats.org/drawingml/2006/wordprocessingDrawing" xmlns:w10="urn:schemas-microsoft-com:office:word" xmlns:w="http://schemas.openxmlformats.org/wordprocessingml/2006/main" xmlns:w14="http://schemas.microsoft.com/office/word/2010/wordml" xmlns:w15="http://schemas.microsoft.com/office/word/2012/wordml" xmlns:w16cex="http://schemas.microsoft.com/office/word/2018/wordml/cex" xmlns:w16cid="http://schemas.microsoft.com/office/word/2016/wordml/cid" xmlns:w16="http://schemas.microsoft.com/office/word/2018/wordml" xmlns:w16sdtdh="http://schemas.microsoft.com/office/word/2020/wordml/sdtdatahash" xmlns:w16se="http://schemas.microsoft.com/office/word/2015/wordml/symex" xmlns:wpg="http://schemas.microsoft.com/office/word/2010/wordprocessingGroup" xmlns:wpi="http://schemas.microsoft.com/office/word/2010/wordprocessingInk" xmlns:wne="http://schemas.microsoft.com/office/word/2006/wordml" xmlns:wps="http://schemas.microsoft.com/office/word/2010/wordprocessingShape" mc:Ignorable="w14 w15 w16se w16cid w16 w16cex w16sdtdh wp14">
+<w15:people xmlns:wpc="http://schemas.microsoft.com/office/word/2010/wordprocessingCanvas" xmlns:cx="http://schemas.microsoft.com/office/drawing/2014/chartex" xmlns:cx1="http://schemas.microsoft.com/office/drawing/2015/9/8/chartex" xmlns:cx2="http://schemas.microsoft.com/office/drawing/2015/10/21/chartex" xmlns:cx3="http://schemas.microsoft.com/office/drawing/2016/5/9/chartex" xmlns:cx4="http://schemas.microsoft.com/office/drawing/2016/5/10/chartex" xmlns:cx5="http://schemas.microsoft.com/office/drawing/2016/5/11/chartex" xmlns:cx6="http://schemas.microsoft.com/office/drawing/2016/5/12/chartex" xmlns:cx7="http://schemas.microsoft.com/office/drawing/2016/5/13/chartex" xmlns:cx8="http://schemas.microsoft.com/office/drawing/2016/5/14/chartex" xmlns:mc="http://schemas.openxmlformats.org/markup-compatibility/2006" xmlns:aink="http://schemas.microsoft.com/office/drawing/2016/ink" xmlns:am3d="http://schemas.microsoft.com/office/drawing/2017/model3d" xmlns:o="urn:schemas-microsoft-com:office:office" xmlns:r="http://schemas.openxmlformats.org/officeDocument/2006/relationships" xmlns:m="http://schemas.openxmlformats.org/officeDocument/2006/math" xmlns:v="urn:schemas-microsoft-com:vml" xmlns:wp14="http://schemas.microsoft.com/office/word/2010/wordprocessingDrawing" xmlns:wp="http://schemas.openxmlformats.org/drawingml/2006/wordprocessingDrawing" xmlns:w10="urn:schemas-microsoft-com:office:word" xmlns:w="http://schemas.openxmlformats.org/wordprocessingml/2006/main" xmlns:w14="http://schemas.microsoft.com/office/word/2010/wordml" xmlns:w15="http://schemas.microsoft.com/office/word/2012/wordml" xmlns:w16cid="http://schemas.microsoft.com/office/word/2016/wordml/cid" xmlns:w16se="http://schemas.microsoft.com/office/word/2015/wordml/symex" xmlns:wpg="http://schemas.microsoft.com/office/word/2010/wordprocessingGroup" xmlns:wpi="http://schemas.microsoft.com/office/word/2010/wordprocessingInk" xmlns:wne="http://schemas.microsoft.com/office/word/2006/wordml" xmlns:wps="http://schemas.microsoft.com/office/word/2010/wordprocessingShape" mc:Ignorable="w14 w15 w16se w16cid wp14">
   <w15:person w15:author="CAMARGO">
     <w15:presenceInfo w15:providerId="None" w15:userId="CAMARGO"/>
   </w15:person>
@@ -4798,7 +5229,7 @@
 </file>
 
 <file path=word/styles.xml><?xml version="1.0" encoding="utf-8"?>
-<w:styles xmlns:mc="http://schemas.openxmlformats.org/markup-compatibility/2006" xmlns:r="http://schemas.openxmlformats.org/officeDocument/2006/relationships" xmlns:w="http://schemas.openxmlformats.org/wordprocessingml/2006/main" xmlns:w14="http://schemas.microsoft.com/office/word/2010/wordml" xmlns:w15="http://schemas.microsoft.com/office/word/2012/wordml" xmlns:w16cex="http://schemas.microsoft.com/office/word/2018/wordml/cex" xmlns:w16cid="http://schemas.microsoft.com/office/word/2016/wordml/cid" xmlns:w16="http://schemas.microsoft.com/office/word/2018/wordml" xmlns:w16sdtdh="http://schemas.microsoft.com/office/word/2020/wordml/sdtdatahash" xmlns:w16se="http://schemas.microsoft.com/office/word/2015/wordml/symex" mc:Ignorable="w14 w15 w16se w16cid w16 w16cex w16sdtdh">
+<w:styles xmlns:mc="http://schemas.openxmlformats.org/markup-compatibility/2006" xmlns:r="http://schemas.openxmlformats.org/officeDocument/2006/relationships" xmlns:w="http://schemas.openxmlformats.org/wordprocessingml/2006/main" xmlns:w14="http://schemas.microsoft.com/office/word/2010/wordml" xmlns:w15="http://schemas.microsoft.com/office/word/2012/wordml" xmlns:w16cid="http://schemas.microsoft.com/office/word/2016/wordml/cid" xmlns:w16se="http://schemas.microsoft.com/office/word/2015/wordml/symex" mc:Ignorable="w14 w15 w16se w16cid">
   <w:docDefaults>
     <w:rPrDefault>
       <w:rPr>
@@ -4814,7 +5245,7 @@
       </w:pPr>
     </w:pPrDefault>
   </w:docDefaults>
-  <w:latentStyles w:defLockedState="0" w:defUIPriority="99" w:defSemiHidden="0" w:defUnhideWhenUsed="0" w:defQFormat="0" w:count="376">
+  <w:latentStyles w:defLockedState="0" w:defUIPriority="99" w:defSemiHidden="0" w:defUnhideWhenUsed="0" w:defQFormat="0" w:count="375">
     <w:lsdException w:name="Normal" w:uiPriority="0" w:qFormat="1"/>
     <w:lsdException w:name="heading 1" w:uiPriority="9" w:qFormat="1"/>
     <w:lsdException w:name="heading 2" w:semiHidden="1" w:uiPriority="9" w:unhideWhenUsed="1" w:qFormat="1"/>
@@ -5190,7 +5621,6 @@
     <w:lsdException w:name="Smart Hyperlink" w:semiHidden="1" w:unhideWhenUsed="1"/>
     <w:lsdException w:name="Hashtag" w:semiHidden="1" w:unhideWhenUsed="1"/>
     <w:lsdException w:name="Unresolved Mention" w:semiHidden="1" w:unhideWhenUsed="1"/>
-    <w:lsdException w:name="Smart Link" w:semiHidden="1" w:unhideWhenUsed="1"/>
   </w:latentStyles>
   <w:style w:type="paragraph" w:default="1" w:styleId="Normal">
     <w:name w:val="Normal"/>
@@ -5220,6 +5650,7 @@
   <w:style w:type="character" w:default="1" w:styleId="Fontepargpadro">
     <w:name w:val="Default Paragraph Font"/>
     <w:uiPriority w:val="1"/>
+    <w:semiHidden/>
     <w:unhideWhenUsed/>
   </w:style>
   <w:style w:type="table" w:default="1" w:styleId="Tabelanormal">
@@ -5401,6 +5832,18 @@
       <w:rFonts w:ascii="Segoe UI" w:hAnsi="Segoe UI" w:cs="Segoe UI"/>
       <w:sz w:val="18"/>
       <w:szCs w:val="18"/>
+    </w:rPr>
+  </w:style>
+  <w:style w:type="character" w:styleId="MenoPendente">
+    <w:name w:val="Unresolved Mention"/>
+    <w:basedOn w:val="Fontepargpadro"/>
+    <w:uiPriority w:val="99"/>
+    <w:semiHidden/>
+    <w:unhideWhenUsed/>
+    <w:rsid w:val="00AE16E2"/>
+    <w:rPr>
+      <w:color w:val="605E5C"/>
+      <w:shd w:val="clear" w:color="auto" w:fill="E1DFDD"/>
     </w:rPr>
   </w:style>
 </w:styles>
@@ -5706,7 +6149,7 @@
 </file>
 
 <file path=customXml/itemProps1.xml><?xml version="1.0" encoding="utf-8"?>
-<ds:datastoreItem xmlns:ds="http://schemas.openxmlformats.org/officeDocument/2006/customXml" ds:itemID="{1B2514FE-C49B-4682-ACAA-A25B80E63572}">
+<ds:datastoreItem xmlns:ds="http://schemas.openxmlformats.org/officeDocument/2006/customXml" ds:itemID="{4E2DDC06-07C9-4456-A836-D93C8FF1AC03}">
   <ds:schemaRefs>
     <ds:schemaRef ds:uri="http://schemas.openxmlformats.org/officeDocument/2006/bibliography"/>
   </ds:schemaRefs>

</xml_diff>

<commit_message>
feat: adiciona os diagramas na documentação
</commit_message>
<xml_diff>
--- a/Documentação.docx
+++ b/Documentação.docx
@@ -340,8 +340,6 @@
           <w:szCs w:val="24"/>
         </w:rPr>
       </w:pPr>
-      <w:commentRangeStart w:id="0"/>
-      <w:commentRangeEnd w:id="0"/>
     </w:p>
     <w:p>
       <w:pPr>
@@ -3583,69 +3581,6 @@
     </w:p>
     <w:p>
       <w:pPr>
-        <w:jc w:val="both"/>
-        <w:rPr>
-          <w:rFonts w:ascii="Arial" w:hAnsi="Arial" w:cs="Arial"/>
-          <w:sz w:val="24"/>
-        </w:rPr>
-      </w:pPr>
-    </w:p>
-    <w:p>
-      <w:pPr>
-        <w:jc w:val="both"/>
-        <w:rPr>
-          <w:rFonts w:ascii="Arial" w:hAnsi="Arial" w:cs="Arial"/>
-          <w:sz w:val="24"/>
-        </w:rPr>
-      </w:pPr>
-    </w:p>
-    <w:p>
-      <w:pPr>
-        <w:jc w:val="both"/>
-        <w:rPr>
-          <w:rFonts w:ascii="Arial" w:hAnsi="Arial" w:cs="Arial"/>
-          <w:sz w:val="24"/>
-        </w:rPr>
-      </w:pPr>
-    </w:p>
-    <w:p>
-      <w:pPr>
-        <w:jc w:val="both"/>
-        <w:rPr>
-          <w:rFonts w:ascii="Arial" w:hAnsi="Arial" w:cs="Arial"/>
-          <w:sz w:val="24"/>
-        </w:rPr>
-      </w:pPr>
-    </w:p>
-    <w:p>
-      <w:pPr>
-        <w:jc w:val="both"/>
-        <w:rPr>
-          <w:rFonts w:ascii="Arial" w:hAnsi="Arial" w:cs="Arial"/>
-          <w:sz w:val="24"/>
-        </w:rPr>
-      </w:pPr>
-    </w:p>
-    <w:p>
-      <w:pPr>
-        <w:jc w:val="both"/>
-        <w:rPr>
-          <w:rFonts w:ascii="Arial" w:hAnsi="Arial" w:cs="Arial"/>
-          <w:sz w:val="24"/>
-        </w:rPr>
-      </w:pPr>
-    </w:p>
-    <w:p>
-      <w:pPr>
-        <w:jc w:val="both"/>
-        <w:rPr>
-          <w:rFonts w:ascii="Arial" w:hAnsi="Arial" w:cs="Arial"/>
-          <w:sz w:val="24"/>
-        </w:rPr>
-      </w:pPr>
-    </w:p>
-    <w:p>
-      <w:pPr>
         <w:jc w:val="center"/>
         <w:rPr>
           <w:rFonts w:ascii="Arial" w:hAnsi="Arial" w:cs="Arial"/>
@@ -3707,7 +3642,6 @@
           <w:szCs w:val="24"/>
           <w:lang w:eastAsia="pt-BR"/>
         </w:rPr>
-        <w:lastRenderedPageBreak/>
         <w:t>Principais Características e Técnicas do ABA:</w:t>
       </w:r>
     </w:p>
@@ -3878,6 +3812,7 @@
           <w:szCs w:val="24"/>
           <w:lang w:eastAsia="pt-BR"/>
         </w:rPr>
+        <w:lastRenderedPageBreak/>
         <w:t>Análise Funcional:</w:t>
       </w:r>
       <w:r>
@@ -4363,7 +4298,6 @@
           <w:szCs w:val="24"/>
           <w:lang w:eastAsia="pt-BR"/>
         </w:rPr>
-        <w:lastRenderedPageBreak/>
         <w:t xml:space="preserve">Esses níveis não medem inteligência, apenas o </w:t>
       </w:r>
       <w:r>
@@ -4497,6 +4431,7 @@
           <w:szCs w:val="24"/>
           <w:lang w:eastAsia="pt-BR"/>
         </w:rPr>
+        <w:lastRenderedPageBreak/>
         <w:t>Um autista de nível 3 pode não ter DI (pode ser muito inteligente, mas ter dificuldade em se organizar ou se comunicar).</w:t>
       </w:r>
     </w:p>
@@ -4787,87 +4722,79 @@
           <w:sz w:val="24"/>
           <w:szCs w:val="24"/>
         </w:rPr>
-        <w:t xml:space="preserve">, a inteligência artificial aplica essas regras ao material original. O processamento envolve simplificação de texto, </w:t>
-      </w:r>
-      <w:r>
-        <w:rPr>
-          <w:rFonts w:ascii="Arial" w:hAnsi="Arial" w:cs="Arial"/>
+        <w:t>, a inteligência artificial aplica essas regras ao material original. O processamento envolve simplificação de texto, segmentação do conteúdo, reorganização lógica, geração de exemplos e destaque de conceitos-chave. O resultado é o material adaptado.</w:t>
+      </w:r>
+    </w:p>
+    <w:p>
+      <w:pPr>
+        <w:rPr>
+          <w:rFonts w:ascii="Arial" w:hAnsi="Arial" w:cs="Arial"/>
+          <w:sz w:val="24"/>
+          <w:szCs w:val="24"/>
+        </w:rPr>
+      </w:pPr>
+      <w:r>
+        <w:rPr>
+          <w:rFonts w:ascii="Arial" w:hAnsi="Arial" w:cs="Arial"/>
+          <w:sz w:val="24"/>
+          <w:szCs w:val="24"/>
+        </w:rPr>
+        <w:t xml:space="preserve">Por fim, na etapa de </w:t>
+      </w:r>
+      <w:r>
+        <w:rPr>
+          <w:rFonts w:ascii="Arial" w:hAnsi="Arial" w:cs="Arial"/>
+          <w:b/>
+          <w:bCs/>
+          <w:sz w:val="24"/>
+          <w:szCs w:val="24"/>
+        </w:rPr>
+        <w:t>implementação</w:t>
+      </w:r>
+      <w:r>
+        <w:rPr>
+          <w:rFonts w:ascii="Arial" w:hAnsi="Arial" w:cs="Arial"/>
+          <w:sz w:val="24"/>
+          <w:szCs w:val="24"/>
+        </w:rPr>
+        <w:t>, esse material adaptado é disponibilizado na plataforma para uso por professores e alunos, garantindo que o conteúdo seja acessível e aplicado de forma inclusiva.</w:t>
+      </w:r>
+    </w:p>
+    <w:p>
+      <w:pPr>
+        <w:rPr>
+          <w:rFonts w:ascii="Arial" w:hAnsi="Arial" w:cs="Arial"/>
+          <w:sz w:val="24"/>
+          <w:szCs w:val="24"/>
+        </w:rPr>
+      </w:pPr>
+    </w:p>
+    <w:p>
+      <w:pPr>
+        <w:rPr>
+          <w:rFonts w:ascii="Arial" w:hAnsi="Arial" w:cs="Arial"/>
+          <w:sz w:val="24"/>
+          <w:szCs w:val="24"/>
+        </w:rPr>
+      </w:pPr>
+    </w:p>
+    <w:p>
+      <w:pPr>
+        <w:rPr>
+          <w:rFonts w:ascii="Arial" w:hAnsi="Arial" w:cs="Arial"/>
+          <w:b/>
+          <w:sz w:val="24"/>
+          <w:szCs w:val="24"/>
+        </w:rPr>
+      </w:pPr>
+      <w:r>
+        <w:rPr>
+          <w:rFonts w:ascii="Arial" w:hAnsi="Arial" w:cs="Arial"/>
+          <w:b/>
           <w:sz w:val="24"/>
           <w:szCs w:val="24"/>
         </w:rPr>
         <w:lastRenderedPageBreak/>
-        <w:t>segmentação do conteúdo, reorganização lógica, geração de exemplos e destaque de conceitos-chave. O resultado é o material adaptado.</w:t>
-      </w:r>
-    </w:p>
-    <w:p>
-      <w:pPr>
-        <w:rPr>
-          <w:rFonts w:ascii="Arial" w:hAnsi="Arial" w:cs="Arial"/>
-          <w:sz w:val="24"/>
-          <w:szCs w:val="24"/>
-        </w:rPr>
-      </w:pPr>
-      <w:r>
-        <w:rPr>
-          <w:rFonts w:ascii="Arial" w:hAnsi="Arial" w:cs="Arial"/>
-          <w:sz w:val="24"/>
-          <w:szCs w:val="24"/>
-        </w:rPr>
-        <w:t xml:space="preserve">Por fim, na etapa de </w:t>
-      </w:r>
-      <w:r>
-        <w:rPr>
-          <w:rFonts w:ascii="Arial" w:hAnsi="Arial" w:cs="Arial"/>
-          <w:b/>
-          <w:bCs/>
-          <w:sz w:val="24"/>
-          <w:szCs w:val="24"/>
-        </w:rPr>
-        <w:t>implementação</w:t>
-      </w:r>
-      <w:r>
-        <w:rPr>
-          <w:rFonts w:ascii="Arial" w:hAnsi="Arial" w:cs="Arial"/>
-          <w:sz w:val="24"/>
-          <w:szCs w:val="24"/>
-        </w:rPr>
-        <w:t>, esse material adaptado é disponibilizado na plataforma para uso por professores e alunos, garantindo que o conteúdo seja acessível e aplicado de forma inclusiva.</w:t>
-      </w:r>
-    </w:p>
-    <w:p>
-      <w:pPr>
-        <w:rPr>
-          <w:rFonts w:ascii="Arial" w:hAnsi="Arial" w:cs="Arial"/>
-          <w:sz w:val="24"/>
-          <w:szCs w:val="24"/>
-        </w:rPr>
-      </w:pPr>
-    </w:p>
-    <w:p>
-      <w:pPr>
-        <w:rPr>
-          <w:rFonts w:ascii="Arial" w:hAnsi="Arial" w:cs="Arial"/>
-          <w:sz w:val="24"/>
-          <w:szCs w:val="24"/>
-        </w:rPr>
-      </w:pPr>
-    </w:p>
-    <w:p>
-      <w:pPr>
-        <w:rPr>
-          <w:rFonts w:ascii="Arial" w:hAnsi="Arial" w:cs="Arial"/>
-          <w:b/>
-          <w:sz w:val="24"/>
-          <w:szCs w:val="24"/>
-        </w:rPr>
-      </w:pPr>
-      <w:r>
-        <w:rPr>
-          <w:rFonts w:ascii="Arial" w:hAnsi="Arial" w:cs="Arial"/>
-          <w:b/>
-          <w:sz w:val="24"/>
-          <w:szCs w:val="24"/>
-        </w:rPr>
         <w:t>O que é Diagrama de Gantt</w:t>
       </w:r>
     </w:p>
@@ -5227,7 +5154,6 @@
           <w:b/>
           <w:bCs/>
         </w:rPr>
-        <w:lastRenderedPageBreak/>
         <w:t>Inclusão escolar</w:t>
       </w:r>
       <w:r>
@@ -5339,6 +5265,7 @@
         <w:rPr>
           <w:rFonts w:ascii="Arial" w:hAnsi="Arial" w:cs="Arial"/>
         </w:rPr>
+        <w:lastRenderedPageBreak/>
         <w:t xml:space="preserve">O DUA é uma forma de pensar a educação que </w:t>
       </w:r>
       <w:r>
@@ -5390,35 +5317,24 @@
           <w:rFonts w:ascii="Arial" w:hAnsi="Arial" w:cs="Arial"/>
           <w:sz w:val="24"/>
           <w:szCs w:val="24"/>
-          <w:lang w:val="en-US"/>
-        </w:rPr>
-      </w:pPr>
-    </w:p>
-    <w:p>
-      <w:pPr>
-        <w:rPr>
-          <w:rFonts w:ascii="Arial" w:hAnsi="Arial" w:cs="Arial"/>
-          <w:sz w:val="24"/>
-          <w:szCs w:val="24"/>
-        </w:rPr>
-      </w:pPr>
-      <w:r>
-        <w:rPr>
-          <w:rFonts w:ascii="Arial" w:hAnsi="Arial" w:cs="Arial"/>
-          <w:sz w:val="24"/>
-          <w:szCs w:val="24"/>
-        </w:rPr>
-        <w:t>Link uml e</w:t>
-      </w:r>
-      <w:bookmarkStart w:id="1" w:name="_GoBack"/>
-      <w:bookmarkEnd w:id="1"/>
-      <w:r>
-        <w:rPr>
-          <w:rFonts w:ascii="Arial" w:hAnsi="Arial" w:cs="Arial"/>
-          <w:sz w:val="24"/>
-          <w:szCs w:val="24"/>
-        </w:rPr>
-        <w:t xml:space="preserve"> explicar</w:t>
+        </w:rPr>
+      </w:pPr>
+    </w:p>
+    <w:p>
+      <w:pPr>
+        <w:rPr>
+          <w:rFonts w:ascii="Arial" w:hAnsi="Arial" w:cs="Arial"/>
+          <w:sz w:val="24"/>
+          <w:szCs w:val="24"/>
+        </w:rPr>
+      </w:pPr>
+      <w:r>
+        <w:rPr>
+          <w:rFonts w:ascii="Arial" w:hAnsi="Arial" w:cs="Arial"/>
+          <w:sz w:val="24"/>
+          <w:szCs w:val="24"/>
+        </w:rPr>
+        <w:t>Link uml e explicar</w:t>
       </w:r>
     </w:p>
     <w:p>
@@ -5618,12 +5534,67 @@
           <w:szCs w:val="24"/>
         </w:rPr>
       </w:pPr>
-      <w:r>
-        <w:rPr>
-          <w:rFonts w:ascii="Arial" w:hAnsi="Arial" w:cs="Arial"/>
-          <w:sz w:val="24"/>
-          <w:szCs w:val="24"/>
-        </w:rPr>
+    </w:p>
+    <w:p>
+      <w:pPr>
+        <w:rPr>
+          <w:rFonts w:ascii="Arial" w:hAnsi="Arial" w:cs="Arial"/>
+          <w:sz w:val="24"/>
+          <w:szCs w:val="24"/>
+        </w:rPr>
+      </w:pPr>
+    </w:p>
+    <w:p>
+      <w:pPr>
+        <w:rPr>
+          <w:rFonts w:ascii="Arial" w:hAnsi="Arial" w:cs="Arial"/>
+          <w:sz w:val="24"/>
+          <w:szCs w:val="24"/>
+        </w:rPr>
+      </w:pPr>
+    </w:p>
+    <w:p>
+      <w:pPr>
+        <w:rPr>
+          <w:rFonts w:ascii="Arial" w:hAnsi="Arial" w:cs="Arial"/>
+          <w:sz w:val="24"/>
+          <w:szCs w:val="24"/>
+        </w:rPr>
+      </w:pPr>
+    </w:p>
+    <w:p>
+      <w:pPr>
+        <w:rPr>
+          <w:rFonts w:ascii="Arial" w:hAnsi="Arial" w:cs="Arial"/>
+          <w:sz w:val="24"/>
+          <w:szCs w:val="24"/>
+        </w:rPr>
+      </w:pPr>
+    </w:p>
+    <w:p>
+      <w:pPr>
+        <w:rPr>
+          <w:rFonts w:ascii="Arial" w:hAnsi="Arial" w:cs="Arial"/>
+          <w:sz w:val="24"/>
+          <w:szCs w:val="24"/>
+        </w:rPr>
+      </w:pPr>
+    </w:p>
+    <w:p>
+      <w:pPr>
+        <w:rPr>
+          <w:rFonts w:ascii="Arial" w:hAnsi="Arial" w:cs="Arial"/>
+          <w:sz w:val="24"/>
+          <w:szCs w:val="24"/>
+        </w:rPr>
+      </w:pPr>
+      <w:r>
+        <w:rPr>
+          <w:rFonts w:ascii="Arial" w:hAnsi="Arial" w:cs="Arial"/>
+          <w:sz w:val="24"/>
+          <w:szCs w:val="24"/>
+        </w:rPr>
+        <w:lastRenderedPageBreak/>
         <w:t>UML</w:t>
       </w:r>
     </w:p>
@@ -5635,6 +5606,74 @@
           <w:szCs w:val="24"/>
         </w:rPr>
       </w:pPr>
+      <w:r>
+        <w:rPr>
+          <w:rFonts w:ascii="Arial" w:hAnsi="Arial" w:cs="Arial"/>
+          <w:noProof/>
+          <w:sz w:val="24"/>
+          <w:szCs w:val="24"/>
+          <w:lang w:eastAsia="pt-BR"/>
+        </w:rPr>
+        <w:drawing>
+          <wp:inline distT="0" distB="0" distL="0" distR="0" wp14:anchorId="78D5F3F5" wp14:editId="7C333587">
+            <wp:extent cx="5760085" cy="2868295"/>
+            <wp:effectExtent l="0" t="0" r="0" b="8255"/>
+            <wp:docPr id="2" name="Imagem 2"/>
+            <wp:cNvGraphicFramePr>
+              <a:graphicFrameLocks xmlns:a="http://schemas.openxmlformats.org/drawingml/2006/main" noChangeAspect="1"/>
+            </wp:cNvGraphicFramePr>
+            <a:graphic xmlns:a="http://schemas.openxmlformats.org/drawingml/2006/main">
+              <a:graphicData uri="http://schemas.openxmlformats.org/drawingml/2006/picture">
+                <pic:pic xmlns:pic="http://schemas.openxmlformats.org/drawingml/2006/picture">
+                  <pic:nvPicPr>
+                    <pic:cNvPr id="2" name="UML-TCC.jpg"/>
+                    <pic:cNvPicPr/>
+                  </pic:nvPicPr>
+                  <pic:blipFill>
+                    <a:blip r:embed="rId10">
+                      <a:extLst>
+                        <a:ext uri="{28A0092B-C50C-407E-A947-70E740481C1C}">
+                          <a14:useLocalDpi xmlns:a14="http://schemas.microsoft.com/office/drawing/2010/main" val="0"/>
+                        </a:ext>
+                      </a:extLst>
+                    </a:blip>
+                    <a:stretch>
+                      <a:fillRect/>
+                    </a:stretch>
+                  </pic:blipFill>
+                  <pic:spPr>
+                    <a:xfrm>
+                      <a:off x="0" y="0"/>
+                      <a:ext cx="5760085" cy="2868295"/>
+                    </a:xfrm>
+                    <a:prstGeom prst="rect">
+                      <a:avLst/>
+                    </a:prstGeom>
+                  </pic:spPr>
+                </pic:pic>
+              </a:graphicData>
+            </a:graphic>
+          </wp:inline>
+        </w:drawing>
+      </w:r>
+    </w:p>
+    <w:p>
+      <w:pPr>
+        <w:rPr>
+          <w:rFonts w:ascii="Arial" w:hAnsi="Arial" w:cs="Arial"/>
+          <w:sz w:val="24"/>
+          <w:szCs w:val="24"/>
+        </w:rPr>
+      </w:pPr>
+    </w:p>
+    <w:p>
+      <w:pPr>
+        <w:rPr>
+          <w:rFonts w:ascii="Arial" w:hAnsi="Arial" w:cs="Arial"/>
+          <w:sz w:val="24"/>
+          <w:szCs w:val="24"/>
+        </w:rPr>
+      </w:pPr>
     </w:p>
     <w:p>
       <w:pPr>
@@ -5661,21 +5700,81 @@
           <w:szCs w:val="24"/>
         </w:rPr>
       </w:pPr>
-    </w:p>
-    <w:p>
-      <w:pPr>
-        <w:rPr>
-          <w:rFonts w:ascii="Arial" w:hAnsi="Arial" w:cs="Arial"/>
-          <w:sz w:val="24"/>
-          <w:szCs w:val="24"/>
-        </w:rPr>
-      </w:pPr>
-      <w:r>
-        <w:rPr>
-          <w:rFonts w:ascii="Arial" w:hAnsi="Arial" w:cs="Arial"/>
-          <w:sz w:val="24"/>
-          <w:szCs w:val="24"/>
-        </w:rPr>
+      <w:r>
+        <w:rPr>
+          <w:rFonts w:ascii="Arial" w:hAnsi="Arial" w:cs="Arial"/>
+          <w:noProof/>
+          <w:sz w:val="24"/>
+          <w:szCs w:val="24"/>
+          <w:lang w:eastAsia="pt-BR"/>
+        </w:rPr>
+        <w:drawing>
+          <wp:inline distT="0" distB="0" distL="0" distR="0" wp14:anchorId="3FB65342" wp14:editId="65DA457A">
+            <wp:extent cx="5130231" cy="4345228"/>
+            <wp:effectExtent l="0" t="0" r="0" b="0"/>
+            <wp:docPr id="5" name="Imagem 5"/>
+            <wp:cNvGraphicFramePr>
+              <a:graphicFrameLocks xmlns:a="http://schemas.openxmlformats.org/drawingml/2006/main" noChangeAspect="1"/>
+            </wp:cNvGraphicFramePr>
+            <a:graphic xmlns:a="http://schemas.openxmlformats.org/drawingml/2006/main">
+              <a:graphicData uri="http://schemas.openxmlformats.org/drawingml/2006/picture">
+                <pic:pic xmlns:pic="http://schemas.openxmlformats.org/drawingml/2006/picture">
+                  <pic:nvPicPr>
+                    <pic:cNvPr id="5" name="DER-TCC.jpeg"/>
+                    <pic:cNvPicPr/>
+                  </pic:nvPicPr>
+                  <pic:blipFill>
+                    <a:blip r:embed="rId11">
+                      <a:extLst>
+                        <a:ext uri="{28A0092B-C50C-407E-A947-70E740481C1C}">
+                          <a14:useLocalDpi xmlns:a14="http://schemas.microsoft.com/office/drawing/2010/main" val="0"/>
+                        </a:ext>
+                      </a:extLst>
+                    </a:blip>
+                    <a:stretch>
+                      <a:fillRect/>
+                    </a:stretch>
+                  </pic:blipFill>
+                  <pic:spPr>
+                    <a:xfrm>
+                      <a:off x="0" y="0"/>
+                      <a:ext cx="5132759" cy="4347369"/>
+                    </a:xfrm>
+                    <a:prstGeom prst="rect">
+                      <a:avLst/>
+                    </a:prstGeom>
+                  </pic:spPr>
+                </pic:pic>
+              </a:graphicData>
+            </a:graphic>
+          </wp:inline>
+        </w:drawing>
+      </w:r>
+    </w:p>
+    <w:p>
+      <w:pPr>
+        <w:rPr>
+          <w:rFonts w:ascii="Arial" w:hAnsi="Arial" w:cs="Arial"/>
+          <w:sz w:val="24"/>
+          <w:szCs w:val="24"/>
+        </w:rPr>
+      </w:pPr>
+    </w:p>
+    <w:p>
+      <w:pPr>
+        <w:rPr>
+          <w:rFonts w:ascii="Arial" w:hAnsi="Arial" w:cs="Arial"/>
+          <w:sz w:val="24"/>
+          <w:szCs w:val="24"/>
+        </w:rPr>
+      </w:pPr>
+      <w:r>
+        <w:rPr>
+          <w:rFonts w:ascii="Arial" w:hAnsi="Arial" w:cs="Arial"/>
+          <w:sz w:val="24"/>
+          <w:szCs w:val="24"/>
+        </w:rPr>
+        <w:lastRenderedPageBreak/>
         <w:t>MER</w:t>
       </w:r>
     </w:p>
@@ -5687,6 +5786,56 @@
           <w:szCs w:val="24"/>
         </w:rPr>
       </w:pPr>
+      <w:r>
+        <w:rPr>
+          <w:rFonts w:ascii="Arial" w:hAnsi="Arial" w:cs="Arial"/>
+          <w:noProof/>
+          <w:sz w:val="24"/>
+          <w:szCs w:val="24"/>
+          <w:lang w:eastAsia="pt-BR"/>
+        </w:rPr>
+        <w:drawing>
+          <wp:inline distT="0" distB="0" distL="0" distR="0" wp14:anchorId="67CE5B31" wp14:editId="3DDCE975">
+            <wp:extent cx="1152525" cy="4295775"/>
+            <wp:effectExtent l="0" t="0" r="9525" b="9525"/>
+            <wp:docPr id="6" name="Imagem 6"/>
+            <wp:cNvGraphicFramePr>
+              <a:graphicFrameLocks xmlns:a="http://schemas.openxmlformats.org/drawingml/2006/main" noChangeAspect="1"/>
+            </wp:cNvGraphicFramePr>
+            <a:graphic xmlns:a="http://schemas.openxmlformats.org/drawingml/2006/main">
+              <a:graphicData uri="http://schemas.openxmlformats.org/drawingml/2006/picture">
+                <pic:pic xmlns:pic="http://schemas.openxmlformats.org/drawingml/2006/picture">
+                  <pic:nvPicPr>
+                    <pic:cNvPr id="6" name="MER-TCC.jpg"/>
+                    <pic:cNvPicPr/>
+                  </pic:nvPicPr>
+                  <pic:blipFill>
+                    <a:blip r:embed="rId12">
+                      <a:extLst>
+                        <a:ext uri="{28A0092B-C50C-407E-A947-70E740481C1C}">
+                          <a14:useLocalDpi xmlns:a14="http://schemas.microsoft.com/office/drawing/2010/main" val="0"/>
+                        </a:ext>
+                      </a:extLst>
+                    </a:blip>
+                    <a:stretch>
+                      <a:fillRect/>
+                    </a:stretch>
+                  </pic:blipFill>
+                  <pic:spPr>
+                    <a:xfrm>
+                      <a:off x="0" y="0"/>
+                      <a:ext cx="1152525" cy="4295775"/>
+                    </a:xfrm>
+                    <a:prstGeom prst="rect">
+                      <a:avLst/>
+                    </a:prstGeom>
+                  </pic:spPr>
+                </pic:pic>
+              </a:graphicData>
+            </a:graphic>
+          </wp:inline>
+        </w:drawing>
+      </w:r>
     </w:p>
     <w:p>
       <w:pPr>
@@ -5719,7 +5868,17 @@
           <w:sz w:val="24"/>
           <w:szCs w:val="24"/>
         </w:rPr>
-        <w:t>(link para acesso se possível)</w:t>
+        <w:t>(link para acesso se pos</w:t>
+      </w:r>
+      <w:bookmarkStart w:id="0" w:name="_GoBack"/>
+      <w:bookmarkEnd w:id="0"/>
+      <w:r>
+        <w:rPr>
+          <w:rFonts w:ascii="Arial" w:hAnsi="Arial" w:cs="Arial"/>
+          <w:sz w:val="24"/>
+          <w:szCs w:val="24"/>
+        </w:rPr>
+        <w:t>sível)</w:t>
       </w:r>
     </w:p>
     <w:p>
@@ -6029,7 +6188,7 @@
           <w:szCs w:val="24"/>
         </w:rPr>
       </w:pPr>
-      <w:hyperlink r:id="rId10" w:history="1">
+      <w:hyperlink r:id="rId13" w:history="1">
         <w:r>
           <w:rPr>
             <w:rStyle w:val="Hyperlink"/>
@@ -6079,7 +6238,7 @@
           <w:szCs w:val="24"/>
         </w:rPr>
       </w:pPr>
-      <w:hyperlink r:id="rId11" w:history="1">
+      <w:hyperlink r:id="rId14" w:history="1">
         <w:r>
           <w:rPr>
             <w:rStyle w:val="Hyperlink"/>
@@ -6112,7 +6271,7 @@
           <w:szCs w:val="24"/>
         </w:rPr>
       </w:pPr>
-      <w:hyperlink r:id="rId12" w:history="1">
+      <w:hyperlink r:id="rId15" w:history="1">
         <w:r>
           <w:rPr>
             <w:rStyle w:val="Hyperlink"/>
@@ -6162,7 +6321,7 @@
           <w:szCs w:val="24"/>
         </w:rPr>
       </w:pPr>
-      <w:hyperlink r:id="rId13" w:history="1">
+      <w:hyperlink r:id="rId16" w:history="1">
         <w:r>
           <w:rPr>
             <w:rStyle w:val="Hyperlink"/>
@@ -6195,7 +6354,7 @@
           <w:szCs w:val="24"/>
         </w:rPr>
       </w:pPr>
-      <w:hyperlink r:id="rId14" w:history="1">
+      <w:hyperlink r:id="rId17" w:history="1">
         <w:r>
           <w:rPr>
             <w:rStyle w:val="Hyperlink"/>
@@ -6245,7 +6404,7 @@
           <w:szCs w:val="24"/>
         </w:rPr>
       </w:pPr>
-      <w:hyperlink r:id="rId15" w:history="1">
+      <w:hyperlink r:id="rId18" w:history="1">
         <w:r>
           <w:rPr>
             <w:rStyle w:val="Hyperlink"/>
@@ -6302,7 +6461,7 @@
         </w:rPr>
         <w:tab/>
       </w:r>
-      <w:hyperlink r:id="rId16" w:history="1">
+      <w:hyperlink r:id="rId19" w:history="1">
         <w:r>
           <w:rPr>
             <w:rStyle w:val="Hyperlink"/>
@@ -6350,7 +6509,7 @@
         </w:rPr>
         <w:t xml:space="preserve">Diagrama de Gantt: </w:t>
       </w:r>
-      <w:hyperlink r:id="rId17" w:history="1">
+      <w:hyperlink r:id="rId20" w:history="1">
         <w:r>
           <w:rPr>
             <w:rStyle w:val="Hyperlink"/>
@@ -6403,7 +6562,7 @@
         </w:rPr>
         <w:t xml:space="preserve">: </w:t>
       </w:r>
-      <w:hyperlink r:id="rId18" w:history="1">
+      <w:hyperlink r:id="rId21" w:history="1">
         <w:r>
           <w:rPr>
             <w:rStyle w:val="Hyperlink"/>
@@ -6465,7 +6624,7 @@
         </w:rPr>
         <w:tab/>
       </w:r>
-      <w:hyperlink r:id="rId19" w:history="1">
+      <w:hyperlink r:id="rId22" w:history="1">
         <w:r>
           <w:rPr>
             <w:rStyle w:val="Hyperlink"/>
@@ -10797,6 +10956,7 @@
   <w:style w:type="character" w:default="1" w:styleId="Fontepargpadro">
     <w:name w:val="Default Paragraph Font"/>
     <w:uiPriority w:val="1"/>
+    <w:semiHidden/>
     <w:unhideWhenUsed/>
   </w:style>
   <w:style w:type="table" w:default="1" w:styleId="Tabelanormal">
@@ -11378,7 +11538,7 @@
 </file>
 
 <file path=customXml/itemProps1.xml><?xml version="1.0" encoding="utf-8"?>
-<ds:datastoreItem xmlns:ds="http://schemas.openxmlformats.org/officeDocument/2006/customXml" ds:itemID="{D46CE752-D5E4-4FC0-A23D-88E92FE310CC}">
+<ds:datastoreItem xmlns:ds="http://schemas.openxmlformats.org/officeDocument/2006/customXml" ds:itemID="{BA378EDE-0966-4E95-BCE0-0242D326BE68}">
   <ds:schemaRefs>
     <ds:schemaRef ds:uri="http://schemas.openxmlformats.org/officeDocument/2006/bibliography"/>
   </ds:schemaRefs>

</xml_diff>

<commit_message>
feat: adiciona telas do tcc
</commit_message>
<xml_diff>
--- a/Documentação.docx
+++ b/Documentação.docx
@@ -2126,14 +2126,16 @@
         <w:jc w:val="center"/>
         <w:rPr>
           <w:rFonts w:ascii="Arial" w:hAnsi="Arial" w:cs="Arial"/>
-          <w:sz w:val="24"/>
-          <w:szCs w:val="24"/>
-        </w:rPr>
-      </w:pPr>
-      <w:r>
-        <w:rPr>
-          <w:rFonts w:ascii="Arial" w:hAnsi="Arial" w:cs="Arial"/>
-          <w:sz w:val="24"/>
+          <w:b/>
+          <w:sz w:val="32"/>
+          <w:szCs w:val="24"/>
+        </w:rPr>
+      </w:pPr>
+      <w:r>
+        <w:rPr>
+          <w:rFonts w:ascii="Arial" w:hAnsi="Arial" w:cs="Arial"/>
+          <w:b/>
+          <w:sz w:val="32"/>
           <w:szCs w:val="24"/>
         </w:rPr>
         <w:lastRenderedPageBreak/>
@@ -2154,25 +2156,27 @@
     <w:p>
       <w:pPr>
         <w:spacing w:after="0" w:line="360" w:lineRule="auto"/>
-        <w:rPr>
-          <w:rFonts w:ascii="Arial" w:hAnsi="Arial" w:cs="Arial"/>
-          <w:b/>
-          <w:sz w:val="24"/>
-          <w:szCs w:val="24"/>
-        </w:rPr>
-      </w:pPr>
-      <w:r>
-        <w:rPr>
-          <w:rFonts w:ascii="Arial" w:hAnsi="Arial" w:cs="Arial"/>
-          <w:b/>
-          <w:sz w:val="24"/>
-          <w:szCs w:val="24"/>
-        </w:rPr>
-        <w:t>Problema</w:t>
-      </w:r>
-    </w:p>
-    <w:p>
-      <w:pPr>
+        <w:jc w:val="center"/>
+        <w:rPr>
+          <w:rFonts w:ascii="Arial" w:hAnsi="Arial" w:cs="Arial"/>
+          <w:b/>
+          <w:sz w:val="28"/>
+          <w:szCs w:val="24"/>
+        </w:rPr>
+      </w:pPr>
+      <w:r>
+        <w:rPr>
+          <w:rFonts w:ascii="Arial" w:hAnsi="Arial" w:cs="Arial"/>
+          <w:b/>
+          <w:sz w:val="28"/>
+          <w:szCs w:val="24"/>
+        </w:rPr>
+        <w:t>PROBLEMA</w:t>
+      </w:r>
+    </w:p>
+    <w:p>
+      <w:pPr>
+        <w:ind w:firstLine="708"/>
         <w:jc w:val="both"/>
         <w:rPr>
           <w:rFonts w:ascii="Arial" w:hAnsi="Arial" w:cs="Arial"/>
@@ -2349,6 +2353,7 @@
     </w:p>
     <w:p>
       <w:pPr>
+        <w:ind w:firstLine="708"/>
         <w:jc w:val="both"/>
         <w:rPr>
           <w:rFonts w:ascii="Arial" w:hAnsi="Arial" w:cs="Arial"/>
@@ -2465,34 +2470,242 @@
     </w:p>
     <w:p>
       <w:pPr>
-        <w:jc w:val="both"/>
-        <w:rPr>
-          <w:rFonts w:ascii="Arial" w:hAnsi="Arial" w:cs="Arial"/>
-          <w:sz w:val="24"/>
-          <w:szCs w:val="24"/>
-        </w:rPr>
-      </w:pPr>
-      <w:r>
-        <w:rPr>
-          <w:rFonts w:ascii="Arial" w:hAnsi="Arial" w:cs="Arial"/>
-          <w:b/>
-          <w:sz w:val="24"/>
-          <w:szCs w:val="24"/>
-        </w:rPr>
-        <w:t>Objetivo geral</w:t>
-      </w:r>
-      <w:r>
-        <w:rPr>
-          <w:rFonts w:ascii="Arial" w:hAnsi="Arial" w:cs="Arial"/>
-          <w:sz w:val="24"/>
-          <w:szCs w:val="24"/>
-        </w:rPr>
-        <w:t xml:space="preserve"> (formatar como título)</w:t>
-      </w:r>
+        <w:jc w:val="center"/>
+        <w:rPr>
+          <w:rFonts w:ascii="Arial" w:hAnsi="Arial" w:cs="Arial"/>
+          <w:sz w:val="28"/>
+          <w:szCs w:val="24"/>
+        </w:rPr>
+      </w:pPr>
+      <w:r>
+        <w:rPr>
+          <w:rFonts w:ascii="Arial" w:hAnsi="Arial" w:cs="Arial"/>
+          <w:b/>
+          <w:sz w:val="28"/>
+          <w:szCs w:val="24"/>
+        </w:rPr>
+        <w:t>OBJETIVO GERAL</w:t>
+      </w:r>
+    </w:p>
+    <w:p>
+      <w:pPr>
+        <w:ind w:firstLine="708"/>
+        <w:jc w:val="both"/>
+        <w:rPr>
+          <w:rFonts w:ascii="Arial" w:hAnsi="Arial" w:cs="Arial"/>
+          <w:sz w:val="28"/>
+          <w:szCs w:val="24"/>
+        </w:rPr>
+      </w:pPr>
+      <w:r>
+        <w:rPr>
+          <w:rFonts w:ascii="Arial" w:hAnsi="Arial" w:cs="Arial"/>
+          <w:sz w:val="24"/>
+        </w:rPr>
+        <w:t xml:space="preserve">O objetivo geral do projeto </w:t>
+      </w:r>
+      <w:r>
+        <w:rPr>
+          <w:rStyle w:val="Forte"/>
+          <w:rFonts w:ascii="Arial" w:hAnsi="Arial" w:cs="Arial"/>
+          <w:sz w:val="24"/>
+        </w:rPr>
+        <w:t>TEA Learn</w:t>
+      </w:r>
+      <w:r>
+        <w:rPr>
+          <w:rFonts w:ascii="Arial" w:hAnsi="Arial" w:cs="Arial"/>
+          <w:sz w:val="24"/>
+        </w:rPr>
+        <w:t xml:space="preserve"> é apoiar professores do ensino médio na adaptação rápida de materiais pedagógicos para alunos com </w:t>
+      </w:r>
+      <w:r>
+        <w:rPr>
+          <w:rStyle w:val="Forte"/>
+          <w:rFonts w:ascii="Arial" w:hAnsi="Arial" w:cs="Arial"/>
+          <w:sz w:val="24"/>
+        </w:rPr>
+        <w:t>TEA nível 1</w:t>
+      </w:r>
+      <w:r>
+        <w:rPr>
+          <w:rFonts w:ascii="Arial" w:hAnsi="Arial" w:cs="Arial"/>
+          <w:sz w:val="24"/>
+        </w:rPr>
+        <w:t xml:space="preserve">, utilizando </w:t>
+      </w:r>
+      <w:r>
+        <w:rPr>
+          <w:rStyle w:val="Forte"/>
+          <w:rFonts w:ascii="Arial" w:hAnsi="Arial" w:cs="Arial"/>
+          <w:sz w:val="24"/>
+        </w:rPr>
+        <w:t>Inteligência Artificial</w:t>
+      </w:r>
+      <w:r>
+        <w:rPr>
+          <w:rFonts w:ascii="Arial" w:hAnsi="Arial" w:cs="Arial"/>
+          <w:sz w:val="24"/>
+        </w:rPr>
+        <w:t xml:space="preserve">, o modelo </w:t>
+      </w:r>
+      <w:r>
+        <w:rPr>
+          <w:rStyle w:val="Forte"/>
+          <w:rFonts w:ascii="Arial" w:hAnsi="Arial" w:cs="Arial"/>
+          <w:sz w:val="24"/>
+        </w:rPr>
+        <w:t>ADDIE</w:t>
+      </w:r>
+      <w:r>
+        <w:rPr>
+          <w:rFonts w:ascii="Arial" w:hAnsi="Arial" w:cs="Arial"/>
+          <w:sz w:val="24"/>
+        </w:rPr>
+        <w:t xml:space="preserve"> e os princípios do </w:t>
+      </w:r>
+      <w:r>
+        <w:rPr>
+          <w:rStyle w:val="Forte"/>
+          <w:rFonts w:ascii="Arial" w:hAnsi="Arial" w:cs="Arial"/>
+          <w:sz w:val="24"/>
+        </w:rPr>
+        <w:t>Desenho Universal da Aprendizagem</w:t>
+      </w:r>
+      <w:r>
+        <w:rPr>
+          <w:rFonts w:ascii="Arial" w:hAnsi="Arial" w:cs="Arial"/>
+          <w:sz w:val="24"/>
+        </w:rPr>
+        <w:t>. A plataforma recebe conteúdos como textos, PDFs, slides e atividades e gera versões mais acessíveis, com linguagem clara, frases curtas, organização em tópicos, divisão em etapas e estrutura visual simplificada, garantindo maior compreensão e inclusão desses estudantes em sala de aula.</w:t>
+      </w:r>
+    </w:p>
+    <w:p>
+      <w:pPr>
+        <w:jc w:val="both"/>
+        <w:rPr>
+          <w:rFonts w:ascii="Arial" w:hAnsi="Arial" w:cs="Arial"/>
+          <w:sz w:val="24"/>
+          <w:szCs w:val="24"/>
+        </w:rPr>
+      </w:pPr>
     </w:p>
     <w:p>
       <w:pPr>
         <w:ind w:firstLine="360"/>
+        <w:jc w:val="center"/>
+        <w:rPr>
+          <w:rFonts w:ascii="Arial" w:hAnsi="Arial" w:cs="Arial"/>
+          <w:sz w:val="28"/>
+          <w:szCs w:val="24"/>
+        </w:rPr>
+      </w:pPr>
+      <w:r>
+        <w:rPr>
+          <w:rFonts w:ascii="Arial" w:hAnsi="Arial" w:cs="Arial"/>
+          <w:b/>
+          <w:sz w:val="28"/>
+          <w:szCs w:val="24"/>
+        </w:rPr>
+        <w:t>OBJETIVO ESPECÍFICO</w:t>
+      </w:r>
+    </w:p>
+    <w:p>
+      <w:pPr>
+        <w:ind w:firstLine="708"/>
+        <w:jc w:val="both"/>
+        <w:rPr>
+          <w:rFonts w:ascii="Arial" w:hAnsi="Arial" w:cs="Arial"/>
+          <w:sz w:val="28"/>
+          <w:szCs w:val="24"/>
+        </w:rPr>
+      </w:pPr>
+      <w:r>
+        <w:rPr>
+          <w:rFonts w:ascii="Arial" w:hAnsi="Arial" w:cs="Arial"/>
+          <w:sz w:val="24"/>
+        </w:rPr>
+        <w:t xml:space="preserve">Desenvolver uma plataforma chamada </w:t>
+      </w:r>
+      <w:r>
+        <w:rPr>
+          <w:rStyle w:val="Forte"/>
+          <w:rFonts w:ascii="Arial" w:hAnsi="Arial" w:cs="Arial"/>
+          <w:sz w:val="24"/>
+        </w:rPr>
+        <w:t>TEA Learn</w:t>
+      </w:r>
+      <w:r>
+        <w:rPr>
+          <w:rFonts w:ascii="Arial" w:hAnsi="Arial" w:cs="Arial"/>
+          <w:sz w:val="24"/>
+        </w:rPr>
+        <w:t xml:space="preserve"> que utilize </w:t>
+      </w:r>
+      <w:r>
+        <w:rPr>
+          <w:rStyle w:val="Forte"/>
+          <w:rFonts w:ascii="Arial" w:hAnsi="Arial" w:cs="Arial"/>
+          <w:sz w:val="24"/>
+        </w:rPr>
+        <w:t>Inteligência Artificial</w:t>
+      </w:r>
+      <w:r>
+        <w:rPr>
+          <w:rFonts w:ascii="Arial" w:hAnsi="Arial" w:cs="Arial"/>
+          <w:sz w:val="24"/>
+        </w:rPr>
+        <w:t xml:space="preserve"> e os princípios do </w:t>
+      </w:r>
+      <w:r>
+        <w:rPr>
+          <w:rStyle w:val="Forte"/>
+          <w:rFonts w:ascii="Arial" w:hAnsi="Arial" w:cs="Arial"/>
+          <w:sz w:val="24"/>
+        </w:rPr>
+        <w:t>Desenho Universal da Aprendizagem</w:t>
+      </w:r>
+      <w:r>
+        <w:rPr>
+          <w:rFonts w:ascii="Arial" w:hAnsi="Arial" w:cs="Arial"/>
+          <w:sz w:val="24"/>
+        </w:rPr>
+        <w:t xml:space="preserve"> junto ao modelo </w:t>
+      </w:r>
+      <w:r>
+        <w:rPr>
+          <w:rStyle w:val="Forte"/>
+          <w:rFonts w:ascii="Arial" w:hAnsi="Arial" w:cs="Arial"/>
+          <w:sz w:val="24"/>
+        </w:rPr>
+        <w:t>ADDIE</w:t>
+      </w:r>
+      <w:r>
+        <w:rPr>
+          <w:rFonts w:ascii="Arial" w:hAnsi="Arial" w:cs="Arial"/>
+          <w:sz w:val="24"/>
+        </w:rPr>
+        <w:t xml:space="preserve"> para adaptar automaticamente materiais didáticos do ensino médio (como textos, PDFs, slides e atividades) em versões mais acessíveis para alunos com </w:t>
+      </w:r>
+      <w:r>
+        <w:rPr>
+          <w:rStyle w:val="Forte"/>
+          <w:rFonts w:ascii="Arial" w:hAnsi="Arial" w:cs="Arial"/>
+          <w:sz w:val="24"/>
+        </w:rPr>
+        <w:t>TEA nível 1</w:t>
+      </w:r>
+      <w:r>
+        <w:rPr>
+          <w:rFonts w:ascii="Arial" w:hAnsi="Arial" w:cs="Arial"/>
+          <w:sz w:val="24"/>
+        </w:rPr>
+        <w:t>. O foco é simplificar a linguagem, estruturar o conteúdo em etapas, organizar em tópicos e destacar conceitos-chave, garantindo maior compreensão e participação desses estudantes em sala de aula.</w:t>
+      </w:r>
+    </w:p>
+    <w:p>
+      <w:pPr>
+        <w:ind w:firstLine="360"/>
         <w:jc w:val="both"/>
         <w:rPr>
           <w:rFonts w:ascii="Arial" w:hAnsi="Arial" w:cs="Arial"/>
@@ -2508,64 +2721,6 @@
         </w:rPr>
         <w:tab/>
       </w:r>
-      <w:r>
-        <w:t xml:space="preserve">O objetivo geral do projeto </w:t>
-      </w:r>
-      <w:r>
-        <w:rPr>
-          <w:rStyle w:val="Forte"/>
-        </w:rPr>
-        <w:t>TEA Learn</w:t>
-      </w:r>
-      <w:r>
-        <w:t xml:space="preserve"> é apoiar professores do ensino médio na adaptação rápida de materiais pedagógicos para alunos com </w:t>
-      </w:r>
-      <w:r>
-        <w:rPr>
-          <w:rStyle w:val="Forte"/>
-        </w:rPr>
-        <w:t>TEA nível 1</w:t>
-      </w:r>
-      <w:r>
-        <w:t xml:space="preserve">, utilizando </w:t>
-      </w:r>
-      <w:r>
-        <w:rPr>
-          <w:rStyle w:val="Forte"/>
-        </w:rPr>
-        <w:t>Inteligência Artificial</w:t>
-      </w:r>
-      <w:r>
-        <w:t xml:space="preserve">, o modelo </w:t>
-      </w:r>
-      <w:r>
-        <w:rPr>
-          <w:rStyle w:val="Forte"/>
-        </w:rPr>
-        <w:t>ADDIE</w:t>
-      </w:r>
-      <w:r>
-        <w:t xml:space="preserve"> e os princípios do </w:t>
-      </w:r>
-      <w:r>
-        <w:rPr>
-          <w:rStyle w:val="Forte"/>
-        </w:rPr>
-        <w:t>Desenho Universal da Aprendizagem</w:t>
-      </w:r>
-      <w:r>
-        <w:t>. A plataforma recebe conteúdos como textos, PDFs, slides e atividades e gera versões mais acessíveis, com linguagem clara, frases curtas, organização em tópicos, divisão em etapas e estrutura visual simplificada, garantindo maior compreensão e inclusão desses estudantes em sala de aula.</w:t>
-      </w:r>
-    </w:p>
-    <w:p>
-      <w:pPr>
-        <w:jc w:val="both"/>
-        <w:rPr>
-          <w:rFonts w:ascii="Arial" w:hAnsi="Arial" w:cs="Arial"/>
-          <w:sz w:val="24"/>
-          <w:szCs w:val="24"/>
-        </w:rPr>
-      </w:pPr>
     </w:p>
     <w:p>
       <w:pPr>
@@ -2577,130 +2732,25 @@
           <w:szCs w:val="24"/>
         </w:rPr>
       </w:pPr>
-      <w:r>
-        <w:rPr>
-          <w:rFonts w:ascii="Arial" w:hAnsi="Arial" w:cs="Arial"/>
-          <w:b/>
-          <w:sz w:val="24"/>
-          <w:szCs w:val="24"/>
-        </w:rPr>
-        <w:t>Objetivo específico</w:t>
-      </w:r>
-      <w:r>
-        <w:rPr>
-          <w:rFonts w:ascii="Arial" w:hAnsi="Arial" w:cs="Arial"/>
-          <w:sz w:val="24"/>
-          <w:szCs w:val="24"/>
-        </w:rPr>
-        <w:t xml:space="preserve"> (formatar como subtítulo)</w:t>
-      </w:r>
-    </w:p>
-    <w:p>
-      <w:pPr>
-        <w:ind w:firstLine="360"/>
-        <w:jc w:val="both"/>
-        <w:rPr>
-          <w:rFonts w:ascii="Arial" w:hAnsi="Arial" w:cs="Arial"/>
-          <w:sz w:val="24"/>
-          <w:szCs w:val="24"/>
-        </w:rPr>
-      </w:pPr>
-      <w:r>
-        <w:t xml:space="preserve">Desenvolver uma plataforma chamada </w:t>
-      </w:r>
-      <w:r>
-        <w:rPr>
-          <w:rStyle w:val="Forte"/>
-        </w:rPr>
-        <w:t>TEA Learn</w:t>
-      </w:r>
-      <w:r>
-        <w:t xml:space="preserve"> que utilize </w:t>
-      </w:r>
-      <w:r>
-        <w:rPr>
-          <w:rStyle w:val="Forte"/>
-        </w:rPr>
-        <w:t>Inteligência Artificial</w:t>
-      </w:r>
-      <w:r>
-        <w:t xml:space="preserve"> e os princípios do </w:t>
-      </w:r>
-      <w:r>
-        <w:rPr>
-          <w:rStyle w:val="Forte"/>
-        </w:rPr>
-        <w:t>Desenho Universal da Aprendizagem</w:t>
-      </w:r>
-      <w:r>
-        <w:t xml:space="preserve"> junto ao modelo </w:t>
-      </w:r>
-      <w:r>
-        <w:rPr>
-          <w:rStyle w:val="Forte"/>
-        </w:rPr>
-        <w:t>ADDIE</w:t>
-      </w:r>
-      <w:r>
-        <w:t xml:space="preserve"> para adaptar automaticamente materiais didáticos do ensino médio (como textos, PDFs, slides e atividades) em versões mais acessíveis para alunos com </w:t>
-      </w:r>
-      <w:r>
-        <w:rPr>
-          <w:rStyle w:val="Forte"/>
-        </w:rPr>
-        <w:t>TEA nível 1</w:t>
-      </w:r>
-      <w:r>
-        <w:t>. O foco é simplificar a linguagem, estruturar o conteúdo em etapas, organizar em tópicos e destacar conceitos-chave, garantindo maior compreensão e participação desses estudantes em sala de aula.</w:t>
-      </w:r>
-    </w:p>
-    <w:p>
-      <w:pPr>
-        <w:ind w:firstLine="360"/>
-        <w:jc w:val="both"/>
-        <w:rPr>
-          <w:rFonts w:ascii="Arial" w:hAnsi="Arial" w:cs="Arial"/>
-          <w:sz w:val="24"/>
-          <w:szCs w:val="24"/>
-        </w:rPr>
-      </w:pPr>
-      <w:r>
-        <w:rPr>
-          <w:rFonts w:ascii="Arial" w:hAnsi="Arial" w:cs="Arial"/>
-          <w:sz w:val="24"/>
-          <w:szCs w:val="24"/>
-        </w:rPr>
-        <w:tab/>
-      </w:r>
-    </w:p>
-    <w:p>
-      <w:pPr>
-        <w:ind w:firstLine="360"/>
-        <w:jc w:val="both"/>
-        <w:rPr>
-          <w:rFonts w:ascii="Arial" w:hAnsi="Arial" w:cs="Arial"/>
-          <w:sz w:val="24"/>
-          <w:szCs w:val="24"/>
-        </w:rPr>
-      </w:pPr>
-    </w:p>
-    <w:p>
-      <w:pPr>
-        <w:rPr>
-          <w:rFonts w:ascii="Arial" w:hAnsi="Arial" w:cs="Arial"/>
-          <w:b/>
-          <w:sz w:val="24"/>
-          <w:szCs w:val="24"/>
-        </w:rPr>
-      </w:pPr>
-      <w:r>
-        <w:rPr>
-          <w:rFonts w:ascii="Arial" w:hAnsi="Arial" w:cs="Arial"/>
-          <w:b/>
-          <w:sz w:val="24"/>
-          <w:szCs w:val="24"/>
-        </w:rPr>
-        <w:t>Metodologia</w:t>
+    </w:p>
+    <w:p>
+      <w:pPr>
+        <w:jc w:val="center"/>
+        <w:rPr>
+          <w:rFonts w:ascii="Arial" w:hAnsi="Arial" w:cs="Arial"/>
+          <w:b/>
+          <w:sz w:val="24"/>
+          <w:szCs w:val="24"/>
+        </w:rPr>
+      </w:pPr>
+      <w:r>
+        <w:rPr>
+          <w:rFonts w:ascii="Arial" w:hAnsi="Arial" w:cs="Arial"/>
+          <w:b/>
+          <w:sz w:val="24"/>
+          <w:szCs w:val="24"/>
+        </w:rPr>
+        <w:t>METODOLOGIA</w:t>
       </w:r>
     </w:p>
     <w:p>
@@ -2741,7 +2791,6 @@
           <w:sz w:val="24"/>
           <w:szCs w:val="24"/>
         </w:rPr>
-        <w:lastRenderedPageBreak/>
         <w:t xml:space="preserve">Fluxo geral do sistema: </w:t>
       </w:r>
       <w:r>
@@ -2910,25 +2959,27 @@
     </w:p>
     <w:p>
       <w:pPr>
-        <w:rPr>
-          <w:rFonts w:ascii="Arial" w:hAnsi="Arial" w:cs="Arial"/>
-          <w:b/>
-          <w:sz w:val="24"/>
-          <w:szCs w:val="24"/>
-        </w:rPr>
-      </w:pPr>
-      <w:r>
-        <w:rPr>
-          <w:rFonts w:ascii="Arial" w:hAnsi="Arial" w:cs="Arial"/>
-          <w:b/>
-          <w:sz w:val="24"/>
-          <w:szCs w:val="24"/>
-        </w:rPr>
-        <w:t>Solução</w:t>
-      </w:r>
-    </w:p>
-    <w:p>
-      <w:pPr>
+        <w:jc w:val="center"/>
+        <w:rPr>
+          <w:rFonts w:ascii="Arial" w:hAnsi="Arial" w:cs="Arial"/>
+          <w:b/>
+          <w:sz w:val="24"/>
+          <w:szCs w:val="24"/>
+        </w:rPr>
+      </w:pPr>
+      <w:r>
+        <w:rPr>
+          <w:rFonts w:ascii="Arial" w:hAnsi="Arial" w:cs="Arial"/>
+          <w:b/>
+          <w:sz w:val="24"/>
+          <w:szCs w:val="24"/>
+        </w:rPr>
+        <w:t>SOLUÇÃO</w:t>
+      </w:r>
+    </w:p>
+    <w:p>
+      <w:pPr>
+        <w:jc w:val="both"/>
         <w:rPr>
           <w:rFonts w:ascii="Arial" w:hAnsi="Arial" w:cs="Arial"/>
           <w:sz w:val="24"/>
@@ -3183,17 +3234,59 @@
     </w:p>
     <w:p>
       <w:pPr>
-        <w:jc w:val="center"/>
-        <w:rPr>
-          <w:rFonts w:ascii="Arial" w:hAnsi="Arial" w:cs="Arial"/>
-          <w:sz w:val="24"/>
-          <w:szCs w:val="24"/>
-        </w:rPr>
-      </w:pPr>
-      <w:r>
-        <w:rPr>
-          <w:rFonts w:ascii="Arial" w:hAnsi="Arial" w:cs="Arial"/>
-          <w:sz w:val="24"/>
+        <w:jc w:val="both"/>
+        <w:rPr>
+          <w:rFonts w:ascii="Arial" w:hAnsi="Arial" w:cs="Arial"/>
+          <w:sz w:val="24"/>
+          <w:szCs w:val="24"/>
+        </w:rPr>
+      </w:pPr>
+    </w:p>
+    <w:p>
+      <w:pPr>
+        <w:jc w:val="both"/>
+        <w:rPr>
+          <w:rFonts w:ascii="Arial" w:hAnsi="Arial" w:cs="Arial"/>
+          <w:sz w:val="24"/>
+          <w:szCs w:val="24"/>
+        </w:rPr>
+      </w:pPr>
+    </w:p>
+    <w:p>
+      <w:pPr>
+        <w:jc w:val="both"/>
+        <w:rPr>
+          <w:rFonts w:ascii="Arial" w:hAnsi="Arial" w:cs="Arial"/>
+          <w:sz w:val="24"/>
+          <w:szCs w:val="24"/>
+        </w:rPr>
+      </w:pPr>
+    </w:p>
+    <w:p>
+      <w:pPr>
+        <w:jc w:val="both"/>
+        <w:rPr>
+          <w:rFonts w:ascii="Arial" w:hAnsi="Arial" w:cs="Arial"/>
+          <w:sz w:val="24"/>
+          <w:szCs w:val="24"/>
+        </w:rPr>
+      </w:pPr>
+    </w:p>
+    <w:p>
+      <w:pPr>
+        <w:jc w:val="center"/>
+        <w:rPr>
+          <w:rFonts w:ascii="Arial" w:hAnsi="Arial" w:cs="Arial"/>
+          <w:b/>
+          <w:sz w:val="32"/>
+          <w:szCs w:val="24"/>
+        </w:rPr>
+      </w:pPr>
+      <w:r>
+        <w:rPr>
+          <w:rFonts w:ascii="Arial" w:hAnsi="Arial" w:cs="Arial"/>
+          <w:b/>
+          <w:sz w:val="32"/>
           <w:szCs w:val="24"/>
         </w:rPr>
         <w:t>DESENVOLVIMENTO</w:t>
@@ -3204,23 +3297,38 @@
         <w:jc w:val="center"/>
         <w:rPr>
           <w:rFonts w:ascii="Arial" w:hAnsi="Arial" w:cs="Arial"/>
-          <w:sz w:val="32"/>
-        </w:rPr>
-      </w:pPr>
-      <w:r>
-        <w:rPr>
-          <w:rFonts w:ascii="Arial" w:hAnsi="Arial" w:cs="Arial"/>
-          <w:sz w:val="32"/>
+          <w:sz w:val="24"/>
+          <w:szCs w:val="24"/>
+        </w:rPr>
+      </w:pPr>
+    </w:p>
+    <w:p>
+      <w:pPr>
+        <w:jc w:val="center"/>
+        <w:rPr>
+          <w:rFonts w:ascii="Arial" w:hAnsi="Arial" w:cs="Arial"/>
+          <w:b/>
+          <w:sz w:val="28"/>
+        </w:rPr>
+      </w:pPr>
+      <w:r>
+        <w:rPr>
+          <w:rFonts w:ascii="Arial" w:hAnsi="Arial" w:cs="Arial"/>
+          <w:b/>
+          <w:sz w:val="28"/>
         </w:rPr>
         <w:t>TEACCH</w:t>
       </w:r>
     </w:p>
     <w:p>
       <w:pPr>
+        <w:ind w:firstLine="708"/>
         <w:jc w:val="both"/>
         <w:rPr>
           <w:rFonts w:ascii="Arial" w:hAnsi="Arial" w:cs="Arial"/>
           <w:color w:val="0A0A0A"/>
+          <w:sz w:val="24"/>
+          <w:szCs w:val="24"/>
           <w:shd w:val="clear" w:color="auto" w:fill="FFFFFF"/>
         </w:rPr>
       </w:pPr>
@@ -3228,6 +3336,8 @@
         <w:rPr>
           <w:rFonts w:ascii="Arial" w:hAnsi="Arial" w:cs="Arial"/>
           <w:color w:val="0A0A0A"/>
+          <w:sz w:val="24"/>
+          <w:szCs w:val="24"/>
           <w:shd w:val="clear" w:color="auto" w:fill="FFFFFF"/>
         </w:rPr>
         <w:t>Tratamento e Educação para Autistas e Crianças com Déficits Relacionados à Comunicação, é uma abordagem psicoeducacional focada na estruturação física e visual do ambiente para maximizar a autonomia de pessoas com autismo.</w:t>
@@ -3239,6 +3349,8 @@
         <w:rPr>
           <w:rFonts w:ascii="Arial" w:hAnsi="Arial" w:cs="Arial"/>
           <w:color w:val="0A0A0A"/>
+          <w:sz w:val="24"/>
+          <w:szCs w:val="24"/>
           <w:shd w:val="clear" w:color="auto" w:fill="FFFFFF"/>
         </w:rPr>
       </w:pPr>
@@ -3249,14 +3361,16 @@
         <w:rPr>
           <w:rFonts w:ascii="Arial" w:hAnsi="Arial" w:cs="Arial"/>
           <w:b/>
-          <w:sz w:val="28"/>
-        </w:rPr>
-      </w:pPr>
-      <w:r>
-        <w:rPr>
-          <w:rFonts w:ascii="Arial" w:hAnsi="Arial" w:cs="Arial"/>
-          <w:b/>
-          <w:sz w:val="28"/>
+          <w:sz w:val="24"/>
+          <w:szCs w:val="24"/>
+        </w:rPr>
+      </w:pPr>
+      <w:r>
+        <w:rPr>
+          <w:rFonts w:ascii="Arial" w:hAnsi="Arial" w:cs="Arial"/>
+          <w:b/>
+          <w:sz w:val="24"/>
+          <w:szCs w:val="24"/>
         </w:rPr>
         <w:t>Princípios Fundamentais do TEACCH:</w:t>
       </w:r>
@@ -3273,13 +3387,15 @@
         <w:rPr>
           <w:rFonts w:ascii="Arial" w:hAnsi="Arial" w:cs="Arial"/>
           <w:sz w:val="24"/>
-        </w:rPr>
-      </w:pPr>
-      <w:r>
-        <w:rPr>
-          <w:rFonts w:ascii="Arial" w:hAnsi="Arial" w:cs="Arial"/>
-          <w:b/>
-          <w:sz w:val="24"/>
+          <w:szCs w:val="24"/>
+        </w:rPr>
+      </w:pPr>
+      <w:r>
+        <w:rPr>
+          <w:rFonts w:ascii="Arial" w:hAnsi="Arial" w:cs="Arial"/>
+          <w:b/>
+          <w:sz w:val="24"/>
+          <w:szCs w:val="24"/>
         </w:rPr>
         <w:t>Estrutura Física</w:t>
       </w:r>
@@ -3287,6 +3403,7 @@
         <w:rPr>
           <w:rFonts w:ascii="Arial" w:hAnsi="Arial" w:cs="Arial"/>
           <w:sz w:val="24"/>
+          <w:szCs w:val="24"/>
         </w:rPr>
         <w:t>: Organização do espaço para minimizar distrações e destacar o que é importante.</w:t>
       </w:r>
@@ -3303,13 +3420,15 @@
         <w:rPr>
           <w:rFonts w:ascii="Arial" w:hAnsi="Arial" w:cs="Arial"/>
           <w:sz w:val="24"/>
-        </w:rPr>
-      </w:pPr>
-      <w:r>
-        <w:rPr>
-          <w:rFonts w:ascii="Arial" w:hAnsi="Arial" w:cs="Arial"/>
-          <w:b/>
-          <w:sz w:val="24"/>
+          <w:szCs w:val="24"/>
+        </w:rPr>
+      </w:pPr>
+      <w:r>
+        <w:rPr>
+          <w:rFonts w:ascii="Arial" w:hAnsi="Arial" w:cs="Arial"/>
+          <w:b/>
+          <w:sz w:val="24"/>
+          <w:szCs w:val="24"/>
         </w:rPr>
         <w:t>Rotinas e Agendas Visuais</w:t>
       </w:r>
@@ -3317,6 +3436,7 @@
         <w:rPr>
           <w:rFonts w:ascii="Arial" w:hAnsi="Arial" w:cs="Arial"/>
           <w:sz w:val="24"/>
+          <w:szCs w:val="24"/>
         </w:rPr>
         <w:t>: Uso de imagens, símbolos ou textos para antecipar atividades (ex: "primeiro... depois..."), o que reduz ansiedade.</w:t>
       </w:r>
@@ -3333,13 +3453,15 @@
         <w:rPr>
           <w:rFonts w:ascii="Arial" w:hAnsi="Arial" w:cs="Arial"/>
           <w:sz w:val="24"/>
-        </w:rPr>
-      </w:pPr>
-      <w:r>
-        <w:rPr>
-          <w:rFonts w:ascii="Arial" w:hAnsi="Arial" w:cs="Arial"/>
-          <w:b/>
-          <w:sz w:val="24"/>
+          <w:szCs w:val="24"/>
+        </w:rPr>
+      </w:pPr>
+      <w:r>
+        <w:rPr>
+          <w:rFonts w:ascii="Arial" w:hAnsi="Arial" w:cs="Arial"/>
+          <w:b/>
+          <w:sz w:val="24"/>
+          <w:szCs w:val="24"/>
         </w:rPr>
         <w:t>Sistemas de Trabalho</w:t>
       </w:r>
@@ -3347,6 +3469,7 @@
         <w:rPr>
           <w:rFonts w:ascii="Arial" w:hAnsi="Arial" w:cs="Arial"/>
           <w:sz w:val="24"/>
+          <w:szCs w:val="24"/>
         </w:rPr>
         <w:t>: Clareza sobre o que fazer, quanto fazer, como saber se terminou e o que acontece depois.</w:t>
       </w:r>
@@ -3363,13 +3486,15 @@
         <w:rPr>
           <w:rFonts w:ascii="Arial" w:hAnsi="Arial" w:cs="Arial"/>
           <w:sz w:val="24"/>
-        </w:rPr>
-      </w:pPr>
-      <w:r>
-        <w:rPr>
-          <w:rFonts w:ascii="Arial" w:hAnsi="Arial" w:cs="Arial"/>
-          <w:b/>
-          <w:sz w:val="24"/>
+          <w:szCs w:val="24"/>
+        </w:rPr>
+      </w:pPr>
+      <w:r>
+        <w:rPr>
+          <w:rFonts w:ascii="Arial" w:hAnsi="Arial" w:cs="Arial"/>
+          <w:b/>
+          <w:sz w:val="24"/>
+          <w:szCs w:val="24"/>
         </w:rPr>
         <w:t>Organização Visual</w:t>
       </w:r>
@@ -3377,6 +3502,7 @@
         <w:rPr>
           <w:rFonts w:ascii="Arial" w:hAnsi="Arial" w:cs="Arial"/>
           <w:sz w:val="24"/>
+          <w:szCs w:val="24"/>
         </w:rPr>
         <w:t xml:space="preserve">: Materiais de aprendizagem organizados visualmente para indicar como completar tarefas. </w:t>
       </w:r>
@@ -3387,23 +3513,26 @@
         <w:rPr>
           <w:rFonts w:ascii="Arial" w:hAnsi="Arial" w:cs="Arial"/>
           <w:sz w:val="24"/>
-        </w:rPr>
-      </w:pPr>
-    </w:p>
-    <w:p>
-      <w:pPr>
-        <w:jc w:val="both"/>
-        <w:rPr>
-          <w:rFonts w:ascii="Arial" w:hAnsi="Arial" w:cs="Arial"/>
-          <w:b/>
-          <w:sz w:val="28"/>
-        </w:rPr>
-      </w:pPr>
-      <w:r>
-        <w:rPr>
-          <w:rFonts w:ascii="Arial" w:hAnsi="Arial" w:cs="Arial"/>
-          <w:b/>
-          <w:sz w:val="28"/>
+          <w:szCs w:val="24"/>
+        </w:rPr>
+      </w:pPr>
+    </w:p>
+    <w:p>
+      <w:pPr>
+        <w:jc w:val="both"/>
+        <w:rPr>
+          <w:rFonts w:ascii="Arial" w:hAnsi="Arial" w:cs="Arial"/>
+          <w:b/>
+          <w:sz w:val="24"/>
+          <w:szCs w:val="24"/>
+        </w:rPr>
+      </w:pPr>
+      <w:r>
+        <w:rPr>
+          <w:rFonts w:ascii="Arial" w:hAnsi="Arial" w:cs="Arial"/>
+          <w:b/>
+          <w:sz w:val="24"/>
+          <w:szCs w:val="24"/>
         </w:rPr>
         <w:t>Benefícios do TEACCH:</w:t>
       </w:r>
@@ -3420,13 +3549,15 @@
         <w:rPr>
           <w:rFonts w:ascii="Arial" w:hAnsi="Arial" w:cs="Arial"/>
           <w:sz w:val="24"/>
-        </w:rPr>
-      </w:pPr>
-      <w:r>
-        <w:rPr>
-          <w:rFonts w:ascii="Arial" w:hAnsi="Arial" w:cs="Arial"/>
-          <w:b/>
-          <w:sz w:val="24"/>
+          <w:szCs w:val="24"/>
+        </w:rPr>
+      </w:pPr>
+      <w:r>
+        <w:rPr>
+          <w:rFonts w:ascii="Arial" w:hAnsi="Arial" w:cs="Arial"/>
+          <w:b/>
+          <w:sz w:val="24"/>
+          <w:szCs w:val="24"/>
         </w:rPr>
         <w:t>Autonomia</w:t>
       </w:r>
@@ -3434,6 +3565,7 @@
         <w:rPr>
           <w:rFonts w:ascii="Arial" w:hAnsi="Arial" w:cs="Arial"/>
           <w:sz w:val="24"/>
+          <w:szCs w:val="24"/>
         </w:rPr>
         <w:t>: Promove a independência ao ensinar a criança a seguir uma rotina própria.</w:t>
       </w:r>
@@ -3450,13 +3582,15 @@
         <w:rPr>
           <w:rFonts w:ascii="Arial" w:hAnsi="Arial" w:cs="Arial"/>
           <w:sz w:val="24"/>
-        </w:rPr>
-      </w:pPr>
-      <w:r>
-        <w:rPr>
-          <w:rFonts w:ascii="Arial" w:hAnsi="Arial" w:cs="Arial"/>
-          <w:b/>
-          <w:sz w:val="24"/>
+          <w:szCs w:val="24"/>
+        </w:rPr>
+      </w:pPr>
+      <w:r>
+        <w:rPr>
+          <w:rFonts w:ascii="Arial" w:hAnsi="Arial" w:cs="Arial"/>
+          <w:b/>
+          <w:sz w:val="24"/>
+          <w:szCs w:val="24"/>
         </w:rPr>
         <w:t>Comunicação</w:t>
       </w:r>
@@ -3464,6 +3598,7 @@
         <w:rPr>
           <w:rFonts w:ascii="Arial" w:hAnsi="Arial" w:cs="Arial"/>
           <w:sz w:val="24"/>
+          <w:szCs w:val="24"/>
         </w:rPr>
         <w:t>: Facilita a expressão e compreensão através de suporte visual, frequentemente usando PECS ou pranchas de comunicação.</w:t>
       </w:r>
@@ -3480,13 +3615,15 @@
         <w:rPr>
           <w:rFonts w:ascii="Arial" w:hAnsi="Arial" w:cs="Arial"/>
           <w:sz w:val="24"/>
-        </w:rPr>
-      </w:pPr>
-      <w:r>
-        <w:rPr>
-          <w:rFonts w:ascii="Arial" w:hAnsi="Arial" w:cs="Arial"/>
-          <w:b/>
-          <w:sz w:val="24"/>
+          <w:szCs w:val="24"/>
+        </w:rPr>
+      </w:pPr>
+      <w:r>
+        <w:rPr>
+          <w:rFonts w:ascii="Arial" w:hAnsi="Arial" w:cs="Arial"/>
+          <w:b/>
+          <w:sz w:val="24"/>
+          <w:szCs w:val="24"/>
         </w:rPr>
         <w:t>Redução de Comportamentos Desafiadores</w:t>
       </w:r>
@@ -3494,6 +3631,7 @@
         <w:rPr>
           <w:rFonts w:ascii="Arial" w:hAnsi="Arial" w:cs="Arial"/>
           <w:sz w:val="24"/>
+          <w:szCs w:val="24"/>
         </w:rPr>
         <w:t>: A previsibilidade diminui crises causadas por incertezas (agendas, rotinas).</w:t>
       </w:r>
@@ -3510,13 +3648,15 @@
         <w:rPr>
           <w:rFonts w:ascii="Arial" w:hAnsi="Arial" w:cs="Arial"/>
           <w:sz w:val="24"/>
-        </w:rPr>
-      </w:pPr>
-      <w:r>
-        <w:rPr>
-          <w:rFonts w:ascii="Arial" w:hAnsi="Arial" w:cs="Arial"/>
-          <w:b/>
-          <w:sz w:val="24"/>
+          <w:szCs w:val="24"/>
+        </w:rPr>
+      </w:pPr>
+      <w:r>
+        <w:rPr>
+          <w:rFonts w:ascii="Arial" w:hAnsi="Arial" w:cs="Arial"/>
+          <w:b/>
+          <w:sz w:val="24"/>
+          <w:szCs w:val="24"/>
         </w:rPr>
         <w:t>Individualização</w:t>
       </w:r>
@@ -3524,6 +3664,7 @@
         <w:rPr>
           <w:rFonts w:ascii="Arial" w:hAnsi="Arial" w:cs="Arial"/>
           <w:sz w:val="24"/>
+          <w:szCs w:val="24"/>
         </w:rPr>
         <w:t xml:space="preserve">: Adapta-se ao nível de suporte de cada indivíduo. </w:t>
       </w:r>
@@ -3534,22 +3675,25 @@
         <w:rPr>
           <w:rFonts w:ascii="Arial" w:hAnsi="Arial" w:cs="Arial"/>
           <w:sz w:val="24"/>
-        </w:rPr>
-      </w:pPr>
-    </w:p>
-    <w:p>
-      <w:pPr>
-        <w:jc w:val="both"/>
-        <w:rPr>
-          <w:rFonts w:ascii="Arial" w:hAnsi="Arial" w:cs="Arial"/>
-          <w:sz w:val="24"/>
-        </w:rPr>
-      </w:pPr>
-      <w:r>
-        <w:rPr>
-          <w:rFonts w:ascii="Arial" w:hAnsi="Arial" w:cs="Arial"/>
-          <w:b/>
-          <w:sz w:val="24"/>
+          <w:szCs w:val="24"/>
+        </w:rPr>
+      </w:pPr>
+    </w:p>
+    <w:p>
+      <w:pPr>
+        <w:jc w:val="both"/>
+        <w:rPr>
+          <w:rFonts w:ascii="Arial" w:hAnsi="Arial" w:cs="Arial"/>
+          <w:sz w:val="24"/>
+          <w:szCs w:val="24"/>
+        </w:rPr>
+      </w:pPr>
+      <w:r>
+        <w:rPr>
+          <w:rFonts w:ascii="Arial" w:hAnsi="Arial" w:cs="Arial"/>
+          <w:b/>
+          <w:sz w:val="24"/>
+          <w:szCs w:val="24"/>
         </w:rPr>
         <w:t>PEP-R</w:t>
       </w:r>
@@ -3557,6 +3701,7 @@
         <w:rPr>
           <w:rFonts w:ascii="Arial" w:hAnsi="Arial" w:cs="Arial"/>
           <w:sz w:val="24"/>
+          <w:szCs w:val="24"/>
         </w:rPr>
         <w:t>: Perfil Psicoeducacional Revisado, usado para avaliar os pontos fracos e fortes do aluno. Através desse exame, um cronograma/método individual é criado.</w:t>
       </w:r>
@@ -3584,28 +3729,36 @@
         <w:jc w:val="center"/>
         <w:rPr>
           <w:rFonts w:ascii="Arial" w:hAnsi="Arial" w:cs="Arial"/>
-          <w:sz w:val="32"/>
-        </w:rPr>
-      </w:pPr>
-      <w:r>
-        <w:rPr>
-          <w:rFonts w:ascii="Arial" w:hAnsi="Arial" w:cs="Arial"/>
-          <w:sz w:val="32"/>
+          <w:b/>
+          <w:sz w:val="28"/>
+        </w:rPr>
+      </w:pPr>
+      <w:r>
+        <w:rPr>
+          <w:rFonts w:ascii="Arial" w:hAnsi="Arial" w:cs="Arial"/>
+          <w:b/>
+          <w:sz w:val="28"/>
         </w:rPr>
         <w:t>ABA</w:t>
       </w:r>
     </w:p>
     <w:p>
       <w:pPr>
-        <w:jc w:val="both"/>
-        <w:rPr>
-          <w:rFonts w:ascii="Arial" w:hAnsi="Arial" w:cs="Arial"/>
-        </w:rPr>
-      </w:pPr>
-      <w:r>
-        <w:rPr>
-          <w:rFonts w:ascii="Arial" w:hAnsi="Arial" w:cs="Arial"/>
-        </w:rPr>
+        <w:ind w:firstLine="708"/>
+        <w:jc w:val="both"/>
+        <w:rPr>
+          <w:rFonts w:ascii="Arial" w:hAnsi="Arial" w:cs="Arial"/>
+          <w:sz w:val="24"/>
+          <w:szCs w:val="24"/>
+        </w:rPr>
+      </w:pPr>
+      <w:r>
+        <w:rPr>
+          <w:rFonts w:ascii="Arial" w:hAnsi="Arial" w:cs="Arial"/>
+          <w:sz w:val="24"/>
+          <w:szCs w:val="24"/>
+        </w:rPr>
+        <w:lastRenderedPageBreak/>
         <w:t>Análise do Comportamento Aplicada, é uma intervenção científica baseada no reforço positivo para desenvolver habilidades sociais, acadêmicas e de autonomia em autistas</w:t>
       </w:r>
     </w:p>
@@ -3614,6 +3767,8 @@
         <w:jc w:val="both"/>
         <w:rPr>
           <w:rFonts w:ascii="Arial" w:hAnsi="Arial" w:cs="Arial"/>
+          <w:sz w:val="24"/>
+          <w:szCs w:val="24"/>
         </w:rPr>
       </w:pPr>
     </w:p>
@@ -3627,7 +3782,7 @@
           <w:b/>
           <w:bCs/>
           <w:color w:val="0A0A0A"/>
-          <w:sz w:val="28"/>
+          <w:sz w:val="24"/>
           <w:szCs w:val="24"/>
           <w:lang w:eastAsia="pt-BR"/>
         </w:rPr>
@@ -3638,7 +3793,7 @@
           <w:b/>
           <w:bCs/>
           <w:color w:val="0A0A0A"/>
-          <w:sz w:val="28"/>
+          <w:sz w:val="24"/>
           <w:szCs w:val="24"/>
           <w:lang w:eastAsia="pt-BR"/>
         </w:rPr>
@@ -3655,7 +3810,7 @@
           <w:b/>
           <w:bCs/>
           <w:color w:val="0A0A0A"/>
-          <w:sz w:val="28"/>
+          <w:sz w:val="24"/>
           <w:szCs w:val="24"/>
           <w:lang w:eastAsia="pt-BR"/>
         </w:rPr>
@@ -3812,7 +3967,6 @@
           <w:szCs w:val="24"/>
           <w:lang w:eastAsia="pt-BR"/>
         </w:rPr>
-        <w:lastRenderedPageBreak/>
         <w:t>Análise Funcional:</w:t>
       </w:r>
       <w:r>
@@ -3874,8 +4028,8 @@
         <w:rPr>
           <w:rFonts w:ascii="Arial" w:eastAsia="Times New Roman" w:hAnsi="Arial" w:cs="Arial"/>
           <w:color w:val="545D7E"/>
-          <w:sz w:val="17"/>
-          <w:szCs w:val="17"/>
+          <w:sz w:val="24"/>
+          <w:szCs w:val="24"/>
           <w:lang w:eastAsia="pt-BR"/>
         </w:rPr>
       </w:pPr>
@@ -3890,7 +4044,7 @@
           <w:b/>
           <w:bCs/>
           <w:color w:val="0A0A0A"/>
-          <w:sz w:val="28"/>
+          <w:sz w:val="24"/>
           <w:szCs w:val="24"/>
           <w:lang w:eastAsia="pt-BR"/>
         </w:rPr>
@@ -3901,7 +4055,7 @@
           <w:b/>
           <w:bCs/>
           <w:color w:val="0A0A0A"/>
-          <w:sz w:val="28"/>
+          <w:sz w:val="24"/>
           <w:szCs w:val="24"/>
           <w:lang w:eastAsia="pt-BR"/>
         </w:rPr>
@@ -3916,7 +4070,7 @@
         <w:rPr>
           <w:rFonts w:ascii="Arial" w:eastAsia="Times New Roman" w:hAnsi="Arial" w:cs="Arial"/>
           <w:color w:val="0A0A0A"/>
-          <w:sz w:val="28"/>
+          <w:sz w:val="24"/>
           <w:szCs w:val="24"/>
           <w:lang w:eastAsia="pt-BR"/>
         </w:rPr>
@@ -4099,12 +4253,14 @@
       <w:pPr>
         <w:jc w:val="center"/>
         <w:rPr>
+          <w:rFonts w:ascii="Arial" w:hAnsi="Arial" w:cs="Arial"/>
           <w:b/>
           <w:sz w:val="28"/>
         </w:rPr>
       </w:pPr>
       <w:r>
         <w:rPr>
+          <w:rFonts w:ascii="Arial" w:hAnsi="Arial" w:cs="Arial"/>
           <w:b/>
           <w:sz w:val="28"/>
         </w:rPr>
@@ -4114,8 +4270,10 @@
     <w:p>
       <w:pPr>
         <w:spacing w:before="100" w:beforeAutospacing="1" w:after="100" w:afterAutospacing="1" w:line="240" w:lineRule="auto"/>
-        <w:rPr>
-          <w:rFonts w:ascii="Times New Roman" w:eastAsia="Times New Roman" w:hAnsi="Times New Roman" w:cs="Times New Roman"/>
+        <w:ind w:firstLine="708"/>
+        <w:jc w:val="both"/>
+        <w:rPr>
+          <w:rFonts w:ascii="Arial" w:eastAsia="Times New Roman" w:hAnsi="Arial" w:cs="Arial"/>
           <w:sz w:val="24"/>
           <w:szCs w:val="24"/>
           <w:lang w:eastAsia="pt-BR"/>
@@ -4123,7 +4281,7 @@
       </w:pPr>
       <w:r>
         <w:rPr>
-          <w:rFonts w:ascii="Times New Roman" w:eastAsia="Times New Roman" w:hAnsi="Times New Roman" w:cs="Times New Roman"/>
+          <w:rFonts w:ascii="Arial" w:eastAsia="Times New Roman" w:hAnsi="Arial" w:cs="Arial"/>
           <w:sz w:val="24"/>
           <w:szCs w:val="24"/>
           <w:lang w:eastAsia="pt-BR"/>
@@ -4132,7 +4290,7 @@
       </w:r>
       <w:r>
         <w:rPr>
-          <w:rFonts w:ascii="Times New Roman" w:eastAsia="Times New Roman" w:hAnsi="Times New Roman" w:cs="Times New Roman"/>
+          <w:rFonts w:ascii="Arial" w:eastAsia="Times New Roman" w:hAnsi="Arial" w:cs="Arial"/>
           <w:b/>
           <w:bCs/>
           <w:sz w:val="24"/>
@@ -4143,7 +4301,7 @@
       </w:r>
       <w:r>
         <w:rPr>
-          <w:rFonts w:ascii="Times New Roman" w:eastAsia="Times New Roman" w:hAnsi="Times New Roman" w:cs="Times New Roman"/>
+          <w:rFonts w:ascii="Arial" w:eastAsia="Times New Roman" w:hAnsi="Arial" w:cs="Arial"/>
           <w:sz w:val="24"/>
           <w:szCs w:val="24"/>
           <w:lang w:eastAsia="pt-BR"/>
@@ -4154,23 +4312,24 @@
     <w:p>
       <w:pPr>
         <w:spacing w:before="100" w:beforeAutospacing="1" w:after="100" w:afterAutospacing="1" w:line="240" w:lineRule="auto"/>
+        <w:jc w:val="both"/>
         <w:outlineLvl w:val="2"/>
         <w:rPr>
-          <w:rFonts w:ascii="Times New Roman" w:eastAsia="Times New Roman" w:hAnsi="Times New Roman" w:cs="Times New Roman"/>
+          <w:rFonts w:ascii="Arial" w:eastAsia="Times New Roman" w:hAnsi="Arial" w:cs="Arial"/>
           <w:b/>
           <w:bCs/>
-          <w:sz w:val="27"/>
-          <w:szCs w:val="27"/>
+          <w:sz w:val="24"/>
+          <w:szCs w:val="24"/>
           <w:lang w:eastAsia="pt-BR"/>
         </w:rPr>
       </w:pPr>
       <w:r>
         <w:rPr>
-          <w:rFonts w:ascii="Times New Roman" w:eastAsia="Times New Roman" w:hAnsi="Times New Roman" w:cs="Times New Roman"/>
+          <w:rFonts w:ascii="Arial" w:eastAsia="Times New Roman" w:hAnsi="Arial" w:cs="Arial"/>
           <w:b/>
           <w:bCs/>
-          <w:sz w:val="27"/>
-          <w:szCs w:val="27"/>
+          <w:sz w:val="24"/>
+          <w:szCs w:val="24"/>
           <w:lang w:eastAsia="pt-BR"/>
         </w:rPr>
         <w:t>Os 3 níveis de suporte (DSM-5)</w:t>
@@ -4183,8 +4342,9 @@
           <w:numId w:val="29"/>
         </w:numPr>
         <w:spacing w:before="100" w:beforeAutospacing="1" w:after="100" w:afterAutospacing="1" w:line="240" w:lineRule="auto"/>
-        <w:rPr>
-          <w:rFonts w:ascii="Times New Roman" w:eastAsia="Times New Roman" w:hAnsi="Times New Roman" w:cs="Times New Roman"/>
+        <w:jc w:val="both"/>
+        <w:rPr>
+          <w:rFonts w:ascii="Arial" w:eastAsia="Times New Roman" w:hAnsi="Arial" w:cs="Arial"/>
           <w:sz w:val="24"/>
           <w:szCs w:val="24"/>
           <w:lang w:eastAsia="pt-BR"/>
@@ -4192,18 +4352,19 @@
       </w:pPr>
       <w:r>
         <w:rPr>
-          <w:rFonts w:ascii="Times New Roman" w:eastAsia="Times New Roman" w:hAnsi="Times New Roman" w:cs="Times New Roman"/>
+          <w:rFonts w:ascii="Arial" w:eastAsia="Times New Roman" w:hAnsi="Arial" w:cs="Arial"/>
           <w:b/>
           <w:bCs/>
           <w:sz w:val="24"/>
           <w:szCs w:val="24"/>
           <w:lang w:eastAsia="pt-BR"/>
         </w:rPr>
+        <w:lastRenderedPageBreak/>
         <w:t>Nível 1</w:t>
       </w:r>
       <w:r>
         <w:rPr>
-          <w:rFonts w:ascii="Times New Roman" w:eastAsia="Times New Roman" w:hAnsi="Times New Roman" w:cs="Times New Roman"/>
+          <w:rFonts w:ascii="Arial" w:eastAsia="Times New Roman" w:hAnsi="Arial" w:cs="Arial"/>
           <w:sz w:val="24"/>
           <w:szCs w:val="24"/>
           <w:lang w:eastAsia="pt-BR"/>
@@ -4218,8 +4379,9 @@
           <w:numId w:val="29"/>
         </w:numPr>
         <w:spacing w:before="100" w:beforeAutospacing="1" w:after="100" w:afterAutospacing="1" w:line="240" w:lineRule="auto"/>
-        <w:rPr>
-          <w:rFonts w:ascii="Times New Roman" w:eastAsia="Times New Roman" w:hAnsi="Times New Roman" w:cs="Times New Roman"/>
+        <w:jc w:val="both"/>
+        <w:rPr>
+          <w:rFonts w:ascii="Arial" w:eastAsia="Times New Roman" w:hAnsi="Arial" w:cs="Arial"/>
           <w:sz w:val="24"/>
           <w:szCs w:val="24"/>
           <w:lang w:eastAsia="pt-BR"/>
@@ -4227,7 +4389,7 @@
       </w:pPr>
       <w:r>
         <w:rPr>
-          <w:rFonts w:ascii="Times New Roman" w:eastAsia="Times New Roman" w:hAnsi="Times New Roman" w:cs="Times New Roman"/>
+          <w:rFonts w:ascii="Arial" w:eastAsia="Times New Roman" w:hAnsi="Arial" w:cs="Arial"/>
           <w:b/>
           <w:bCs/>
           <w:sz w:val="24"/>
@@ -4238,7 +4400,7 @@
       </w:r>
       <w:r>
         <w:rPr>
-          <w:rFonts w:ascii="Times New Roman" w:eastAsia="Times New Roman" w:hAnsi="Times New Roman" w:cs="Times New Roman"/>
+          <w:rFonts w:ascii="Arial" w:eastAsia="Times New Roman" w:hAnsi="Arial" w:cs="Arial"/>
           <w:sz w:val="24"/>
           <w:szCs w:val="24"/>
           <w:lang w:eastAsia="pt-BR"/>
@@ -4253,8 +4415,9 @@
           <w:numId w:val="29"/>
         </w:numPr>
         <w:spacing w:before="100" w:beforeAutospacing="1" w:after="100" w:afterAutospacing="1" w:line="240" w:lineRule="auto"/>
-        <w:rPr>
-          <w:rFonts w:ascii="Times New Roman" w:eastAsia="Times New Roman" w:hAnsi="Times New Roman" w:cs="Times New Roman"/>
+        <w:jc w:val="both"/>
+        <w:rPr>
+          <w:rFonts w:ascii="Arial" w:eastAsia="Times New Roman" w:hAnsi="Arial" w:cs="Arial"/>
           <w:sz w:val="24"/>
           <w:szCs w:val="24"/>
           <w:lang w:eastAsia="pt-BR"/>
@@ -4262,7 +4425,7 @@
       </w:pPr>
       <w:r>
         <w:rPr>
-          <w:rFonts w:ascii="Times New Roman" w:eastAsia="Times New Roman" w:hAnsi="Times New Roman" w:cs="Times New Roman"/>
+          <w:rFonts w:ascii="Arial" w:eastAsia="Times New Roman" w:hAnsi="Arial" w:cs="Arial"/>
           <w:b/>
           <w:bCs/>
           <w:sz w:val="24"/>
@@ -4273,7 +4436,7 @@
       </w:r>
       <w:r>
         <w:rPr>
-          <w:rFonts w:ascii="Times New Roman" w:eastAsia="Times New Roman" w:hAnsi="Times New Roman" w:cs="Times New Roman"/>
+          <w:rFonts w:ascii="Arial" w:eastAsia="Times New Roman" w:hAnsi="Arial" w:cs="Arial"/>
           <w:sz w:val="24"/>
           <w:szCs w:val="24"/>
           <w:lang w:eastAsia="pt-BR"/>
@@ -4284,8 +4447,10 @@
     <w:p>
       <w:pPr>
         <w:spacing w:before="100" w:beforeAutospacing="1" w:after="100" w:afterAutospacing="1" w:line="240" w:lineRule="auto"/>
-        <w:rPr>
-          <w:rFonts w:ascii="Times New Roman" w:eastAsia="Times New Roman" w:hAnsi="Times New Roman" w:cs="Times New Roman"/>
+        <w:ind w:firstLine="708"/>
+        <w:jc w:val="both"/>
+        <w:rPr>
+          <w:rFonts w:ascii="Arial" w:eastAsia="Times New Roman" w:hAnsi="Arial" w:cs="Arial"/>
           <w:sz w:val="24"/>
           <w:szCs w:val="24"/>
           <w:lang w:eastAsia="pt-BR"/>
@@ -4293,7 +4458,7 @@
       </w:pPr>
       <w:r>
         <w:rPr>
-          <w:rFonts w:ascii="Times New Roman" w:eastAsia="Times New Roman" w:hAnsi="Times New Roman" w:cs="Times New Roman"/>
+          <w:rFonts w:ascii="Arial" w:eastAsia="Times New Roman" w:hAnsi="Arial" w:cs="Arial"/>
           <w:sz w:val="24"/>
           <w:szCs w:val="24"/>
           <w:lang w:eastAsia="pt-BR"/>
@@ -4302,7 +4467,7 @@
       </w:r>
       <w:r>
         <w:rPr>
-          <w:rFonts w:ascii="Times New Roman" w:eastAsia="Times New Roman" w:hAnsi="Times New Roman" w:cs="Times New Roman"/>
+          <w:rFonts w:ascii="Arial" w:eastAsia="Times New Roman" w:hAnsi="Arial" w:cs="Arial"/>
           <w:b/>
           <w:bCs/>
           <w:sz w:val="24"/>
@@ -4313,7 +4478,7 @@
       </w:r>
       <w:r>
         <w:rPr>
-          <w:rFonts w:ascii="Times New Roman" w:eastAsia="Times New Roman" w:hAnsi="Times New Roman" w:cs="Times New Roman"/>
+          <w:rFonts w:ascii="Arial" w:eastAsia="Times New Roman" w:hAnsi="Arial" w:cs="Arial"/>
           <w:sz w:val="24"/>
           <w:szCs w:val="24"/>
           <w:lang w:eastAsia="pt-BR"/>
@@ -4324,23 +4489,24 @@
     <w:p>
       <w:pPr>
         <w:spacing w:before="100" w:beforeAutospacing="1" w:after="100" w:afterAutospacing="1" w:line="240" w:lineRule="auto"/>
+        <w:jc w:val="both"/>
         <w:outlineLvl w:val="2"/>
         <w:rPr>
-          <w:rFonts w:ascii="Times New Roman" w:eastAsia="Times New Roman" w:hAnsi="Times New Roman" w:cs="Times New Roman"/>
+          <w:rFonts w:ascii="Arial" w:eastAsia="Times New Roman" w:hAnsi="Arial" w:cs="Arial"/>
           <w:b/>
           <w:bCs/>
-          <w:sz w:val="27"/>
-          <w:szCs w:val="27"/>
+          <w:sz w:val="24"/>
+          <w:szCs w:val="24"/>
           <w:lang w:eastAsia="pt-BR"/>
         </w:rPr>
       </w:pPr>
       <w:r>
         <w:rPr>
-          <w:rFonts w:ascii="Times New Roman" w:eastAsia="Times New Roman" w:hAnsi="Times New Roman" w:cs="Times New Roman"/>
+          <w:rFonts w:ascii="Arial" w:eastAsia="Times New Roman" w:hAnsi="Arial" w:cs="Arial"/>
           <w:b/>
           <w:bCs/>
-          <w:sz w:val="27"/>
-          <w:szCs w:val="27"/>
+          <w:sz w:val="24"/>
+          <w:szCs w:val="24"/>
           <w:lang w:eastAsia="pt-BR"/>
         </w:rPr>
         <w:t>Deficiência Intelectual (DI) como comorbidade</w:t>
@@ -4349,8 +4515,10 @@
     <w:p>
       <w:pPr>
         <w:spacing w:before="100" w:beforeAutospacing="1" w:after="100" w:afterAutospacing="1" w:line="240" w:lineRule="auto"/>
-        <w:rPr>
-          <w:rFonts w:ascii="Times New Roman" w:eastAsia="Times New Roman" w:hAnsi="Times New Roman" w:cs="Times New Roman"/>
+        <w:ind w:firstLine="708"/>
+        <w:jc w:val="both"/>
+        <w:rPr>
+          <w:rFonts w:ascii="Arial" w:eastAsia="Times New Roman" w:hAnsi="Arial" w:cs="Arial"/>
           <w:sz w:val="24"/>
           <w:szCs w:val="24"/>
           <w:lang w:eastAsia="pt-BR"/>
@@ -4358,7 +4526,7 @@
       </w:pPr>
       <w:r>
         <w:rPr>
-          <w:rFonts w:ascii="Times New Roman" w:eastAsia="Times New Roman" w:hAnsi="Times New Roman" w:cs="Times New Roman"/>
+          <w:rFonts w:ascii="Arial" w:eastAsia="Times New Roman" w:hAnsi="Arial" w:cs="Arial"/>
           <w:sz w:val="24"/>
           <w:szCs w:val="24"/>
           <w:lang w:eastAsia="pt-BR"/>
@@ -4367,7 +4535,7 @@
       </w:r>
       <w:r>
         <w:rPr>
-          <w:rFonts w:ascii="Times New Roman" w:eastAsia="Times New Roman" w:hAnsi="Times New Roman" w:cs="Times New Roman"/>
+          <w:rFonts w:ascii="Arial" w:eastAsia="Times New Roman" w:hAnsi="Arial" w:cs="Arial"/>
           <w:b/>
           <w:bCs/>
           <w:sz w:val="24"/>
@@ -4378,7 +4546,7 @@
       </w:r>
       <w:r>
         <w:rPr>
-          <w:rFonts w:ascii="Times New Roman" w:eastAsia="Times New Roman" w:hAnsi="Times New Roman" w:cs="Times New Roman"/>
+          <w:rFonts w:ascii="Arial" w:eastAsia="Times New Roman" w:hAnsi="Arial" w:cs="Arial"/>
           <w:sz w:val="24"/>
           <w:szCs w:val="24"/>
           <w:lang w:eastAsia="pt-BR"/>
@@ -4393,8 +4561,9 @@
           <w:numId w:val="30"/>
         </w:numPr>
         <w:spacing w:before="100" w:beforeAutospacing="1" w:after="100" w:afterAutospacing="1" w:line="240" w:lineRule="auto"/>
-        <w:rPr>
-          <w:rFonts w:ascii="Times New Roman" w:eastAsia="Times New Roman" w:hAnsi="Times New Roman" w:cs="Times New Roman"/>
+        <w:jc w:val="both"/>
+        <w:rPr>
+          <w:rFonts w:ascii="Arial" w:eastAsia="Times New Roman" w:hAnsi="Arial" w:cs="Arial"/>
           <w:sz w:val="24"/>
           <w:szCs w:val="24"/>
           <w:lang w:eastAsia="pt-BR"/>
@@ -4402,7 +4571,7 @@
       </w:pPr>
       <w:r>
         <w:rPr>
-          <w:rFonts w:ascii="Times New Roman" w:eastAsia="Times New Roman" w:hAnsi="Times New Roman" w:cs="Times New Roman"/>
+          <w:rFonts w:ascii="Arial" w:eastAsia="Times New Roman" w:hAnsi="Arial" w:cs="Arial"/>
           <w:sz w:val="24"/>
           <w:szCs w:val="24"/>
           <w:lang w:eastAsia="pt-BR"/>
@@ -4417,8 +4586,9 @@
           <w:numId w:val="30"/>
         </w:numPr>
         <w:spacing w:before="100" w:beforeAutospacing="1" w:after="100" w:afterAutospacing="1" w:line="240" w:lineRule="auto"/>
-        <w:rPr>
-          <w:rFonts w:ascii="Times New Roman" w:eastAsia="Times New Roman" w:hAnsi="Times New Roman" w:cs="Times New Roman"/>
+        <w:jc w:val="both"/>
+        <w:rPr>
+          <w:rFonts w:ascii="Arial" w:eastAsia="Times New Roman" w:hAnsi="Arial" w:cs="Arial"/>
           <w:sz w:val="24"/>
           <w:szCs w:val="24"/>
           <w:lang w:eastAsia="pt-BR"/>
@@ -4426,20 +4596,21 @@
       </w:pPr>
       <w:r>
         <w:rPr>
-          <w:rFonts w:ascii="Times New Roman" w:eastAsia="Times New Roman" w:hAnsi="Times New Roman" w:cs="Times New Roman"/>
+          <w:rFonts w:ascii="Arial" w:eastAsia="Times New Roman" w:hAnsi="Arial" w:cs="Arial"/>
           <w:sz w:val="24"/>
           <w:szCs w:val="24"/>
           <w:lang w:eastAsia="pt-BR"/>
         </w:rPr>
-        <w:lastRenderedPageBreak/>
         <w:t>Um autista de nível 3 pode não ter DI (pode ser muito inteligente, mas ter dificuldade em se organizar ou se comunicar).</w:t>
       </w:r>
     </w:p>
     <w:p>
       <w:pPr>
         <w:spacing w:before="100" w:beforeAutospacing="1" w:after="100" w:afterAutospacing="1" w:line="240" w:lineRule="auto"/>
-        <w:rPr>
-          <w:rFonts w:ascii="Times New Roman" w:eastAsia="Times New Roman" w:hAnsi="Times New Roman" w:cs="Times New Roman"/>
+        <w:ind w:firstLine="708"/>
+        <w:jc w:val="both"/>
+        <w:rPr>
+          <w:rFonts w:ascii="Arial" w:eastAsia="Times New Roman" w:hAnsi="Arial" w:cs="Arial"/>
           <w:sz w:val="24"/>
           <w:szCs w:val="24"/>
           <w:lang w:eastAsia="pt-BR"/>
@@ -4447,7 +4618,7 @@
       </w:pPr>
       <w:r>
         <w:rPr>
-          <w:rFonts w:ascii="Times New Roman" w:eastAsia="Times New Roman" w:hAnsi="Times New Roman" w:cs="Times New Roman"/>
+          <w:rFonts w:ascii="Arial" w:eastAsia="Times New Roman" w:hAnsi="Arial" w:cs="Arial"/>
           <w:sz w:val="24"/>
           <w:szCs w:val="24"/>
           <w:lang w:eastAsia="pt-BR"/>
@@ -4458,23 +4629,24 @@
     <w:p>
       <w:pPr>
         <w:spacing w:before="100" w:beforeAutospacing="1" w:after="100" w:afterAutospacing="1" w:line="240" w:lineRule="auto"/>
+        <w:jc w:val="both"/>
         <w:outlineLvl w:val="2"/>
         <w:rPr>
-          <w:rFonts w:ascii="Times New Roman" w:eastAsia="Times New Roman" w:hAnsi="Times New Roman" w:cs="Times New Roman"/>
+          <w:rFonts w:ascii="Arial" w:eastAsia="Times New Roman" w:hAnsi="Arial" w:cs="Arial"/>
           <w:b/>
           <w:bCs/>
-          <w:sz w:val="27"/>
-          <w:szCs w:val="27"/>
+          <w:sz w:val="24"/>
+          <w:szCs w:val="24"/>
           <w:lang w:eastAsia="pt-BR"/>
         </w:rPr>
       </w:pPr>
       <w:r>
         <w:rPr>
-          <w:rFonts w:ascii="Times New Roman" w:eastAsia="Times New Roman" w:hAnsi="Times New Roman" w:cs="Times New Roman"/>
+          <w:rFonts w:ascii="Arial" w:eastAsia="Times New Roman" w:hAnsi="Arial" w:cs="Arial"/>
           <w:b/>
           <w:bCs/>
-          <w:sz w:val="27"/>
-          <w:szCs w:val="27"/>
+          <w:sz w:val="24"/>
+          <w:szCs w:val="24"/>
           <w:lang w:eastAsia="pt-BR"/>
         </w:rPr>
         <w:t>Como os profissionais avaliam</w:t>
@@ -4483,8 +4655,9 @@
     <w:p>
       <w:pPr>
         <w:spacing w:before="100" w:beforeAutospacing="1" w:after="100" w:afterAutospacing="1" w:line="240" w:lineRule="auto"/>
-        <w:rPr>
-          <w:rFonts w:ascii="Times New Roman" w:eastAsia="Times New Roman" w:hAnsi="Times New Roman" w:cs="Times New Roman"/>
+        <w:jc w:val="both"/>
+        <w:rPr>
+          <w:rFonts w:ascii="Arial" w:eastAsia="Times New Roman" w:hAnsi="Arial" w:cs="Arial"/>
           <w:sz w:val="24"/>
           <w:szCs w:val="24"/>
           <w:lang w:eastAsia="pt-BR"/>
@@ -4492,7 +4665,7 @@
       </w:pPr>
       <w:r>
         <w:rPr>
-          <w:rFonts w:ascii="Times New Roman" w:eastAsia="Times New Roman" w:hAnsi="Times New Roman" w:cs="Times New Roman"/>
+          <w:rFonts w:ascii="Arial" w:eastAsia="Times New Roman" w:hAnsi="Arial" w:cs="Arial"/>
           <w:sz w:val="24"/>
           <w:szCs w:val="24"/>
           <w:lang w:eastAsia="pt-BR"/>
@@ -4507,8 +4680,9 @@
           <w:numId w:val="31"/>
         </w:numPr>
         <w:spacing w:before="100" w:beforeAutospacing="1" w:after="100" w:afterAutospacing="1" w:line="240" w:lineRule="auto"/>
-        <w:rPr>
-          <w:rFonts w:ascii="Times New Roman" w:eastAsia="Times New Roman" w:hAnsi="Times New Roman" w:cs="Times New Roman"/>
+        <w:jc w:val="both"/>
+        <w:rPr>
+          <w:rFonts w:ascii="Arial" w:eastAsia="Times New Roman" w:hAnsi="Arial" w:cs="Arial"/>
           <w:sz w:val="24"/>
           <w:szCs w:val="24"/>
           <w:lang w:eastAsia="pt-BR"/>
@@ -4516,7 +4690,7 @@
       </w:pPr>
       <w:r>
         <w:rPr>
-          <w:rFonts w:ascii="Times New Roman" w:eastAsia="Times New Roman" w:hAnsi="Times New Roman" w:cs="Times New Roman"/>
+          <w:rFonts w:ascii="Arial" w:eastAsia="Times New Roman" w:hAnsi="Arial" w:cs="Arial"/>
           <w:b/>
           <w:bCs/>
           <w:sz w:val="24"/>
@@ -4527,7 +4701,7 @@
       </w:r>
       <w:r>
         <w:rPr>
-          <w:rFonts w:ascii="Times New Roman" w:eastAsia="Times New Roman" w:hAnsi="Times New Roman" w:cs="Times New Roman"/>
+          <w:rFonts w:ascii="Arial" w:eastAsia="Times New Roman" w:hAnsi="Arial" w:cs="Arial"/>
           <w:sz w:val="24"/>
           <w:szCs w:val="24"/>
           <w:lang w:eastAsia="pt-BR"/>
@@ -4542,8 +4716,9 @@
           <w:numId w:val="31"/>
         </w:numPr>
         <w:spacing w:before="100" w:beforeAutospacing="1" w:after="100" w:afterAutospacing="1" w:line="240" w:lineRule="auto"/>
-        <w:rPr>
-          <w:rFonts w:ascii="Times New Roman" w:eastAsia="Times New Roman" w:hAnsi="Times New Roman" w:cs="Times New Roman"/>
+        <w:jc w:val="both"/>
+        <w:rPr>
+          <w:rFonts w:ascii="Arial" w:eastAsia="Times New Roman" w:hAnsi="Arial" w:cs="Arial"/>
           <w:sz w:val="24"/>
           <w:szCs w:val="24"/>
           <w:lang w:eastAsia="pt-BR"/>
@@ -4551,7 +4726,7 @@
       </w:pPr>
       <w:r>
         <w:rPr>
-          <w:rFonts w:ascii="Times New Roman" w:eastAsia="Times New Roman" w:hAnsi="Times New Roman" w:cs="Times New Roman"/>
+          <w:rFonts w:ascii="Arial" w:eastAsia="Times New Roman" w:hAnsi="Arial" w:cs="Arial"/>
           <w:b/>
           <w:bCs/>
           <w:sz w:val="24"/>
@@ -4562,7 +4737,7 @@
       </w:r>
       <w:r>
         <w:rPr>
-          <w:rFonts w:ascii="Times New Roman" w:eastAsia="Times New Roman" w:hAnsi="Times New Roman" w:cs="Times New Roman"/>
+          <w:rFonts w:ascii="Arial" w:eastAsia="Times New Roman" w:hAnsi="Arial" w:cs="Arial"/>
           <w:sz w:val="24"/>
           <w:szCs w:val="24"/>
           <w:lang w:eastAsia="pt-BR"/>
@@ -4573,8 +4748,10 @@
     <w:p>
       <w:pPr>
         <w:spacing w:before="100" w:beforeAutospacing="1" w:after="100" w:afterAutospacing="1" w:line="240" w:lineRule="auto"/>
-        <w:rPr>
-          <w:rFonts w:ascii="Times New Roman" w:eastAsia="Times New Roman" w:hAnsi="Times New Roman" w:cs="Times New Roman"/>
+        <w:ind w:firstLine="708"/>
+        <w:jc w:val="both"/>
+        <w:rPr>
+          <w:rFonts w:ascii="Arial" w:eastAsia="Times New Roman" w:hAnsi="Arial" w:cs="Arial"/>
           <w:sz w:val="24"/>
           <w:szCs w:val="24"/>
           <w:lang w:eastAsia="pt-BR"/>
@@ -4582,7 +4759,7 @@
       </w:pPr>
       <w:r>
         <w:rPr>
-          <w:rFonts w:ascii="Times New Roman" w:eastAsia="Times New Roman" w:hAnsi="Times New Roman" w:cs="Times New Roman"/>
+          <w:rFonts w:ascii="Arial" w:eastAsia="Times New Roman" w:hAnsi="Arial" w:cs="Arial"/>
           <w:sz w:val="24"/>
           <w:szCs w:val="24"/>
           <w:lang w:eastAsia="pt-BR"/>
@@ -4622,6 +4799,8 @@
     </w:p>
     <w:p>
       <w:pPr>
+        <w:ind w:firstLine="708"/>
+        <w:jc w:val="both"/>
         <w:rPr>
           <w:rFonts w:ascii="Arial" w:hAnsi="Arial" w:cs="Arial"/>
           <w:sz w:val="24"/>
@@ -4657,18 +4836,21 @@
     </w:p>
     <w:p>
       <w:pPr>
-        <w:rPr>
-          <w:rFonts w:ascii="Arial" w:hAnsi="Arial" w:cs="Arial"/>
-          <w:sz w:val="24"/>
-          <w:szCs w:val="24"/>
-        </w:rPr>
-      </w:pPr>
-      <w:r>
-        <w:rPr>
-          <w:rFonts w:ascii="Arial" w:hAnsi="Arial" w:cs="Arial"/>
-          <w:sz w:val="24"/>
-          <w:szCs w:val="24"/>
-        </w:rPr>
+        <w:ind w:firstLine="708"/>
+        <w:jc w:val="both"/>
+        <w:rPr>
+          <w:rFonts w:ascii="Arial" w:hAnsi="Arial" w:cs="Arial"/>
+          <w:sz w:val="24"/>
+          <w:szCs w:val="24"/>
+        </w:rPr>
+      </w:pPr>
+      <w:r>
+        <w:rPr>
+          <w:rFonts w:ascii="Arial" w:hAnsi="Arial" w:cs="Arial"/>
+          <w:sz w:val="24"/>
+          <w:szCs w:val="24"/>
+        </w:rPr>
+        <w:lastRenderedPageBreak/>
         <w:t xml:space="preserve">Na etapa de </w:t>
       </w:r>
       <w:r>
@@ -4692,6 +4874,8 @@
     </w:p>
     <w:p>
       <w:pPr>
+        <w:ind w:firstLine="708"/>
+        <w:jc w:val="both"/>
         <w:rPr>
           <w:rFonts w:ascii="Arial" w:hAnsi="Arial" w:cs="Arial"/>
           <w:sz w:val="24"/>
@@ -4727,6 +4911,8 @@
     </w:p>
     <w:p>
       <w:pPr>
+        <w:ind w:firstLine="708"/>
+        <w:jc w:val="both"/>
         <w:rPr>
           <w:rFonts w:ascii="Arial" w:hAnsi="Arial" w:cs="Arial"/>
           <w:sz w:val="24"/>
@@ -4780,26 +4966,27 @@
     </w:p>
     <w:p>
       <w:pPr>
-        <w:rPr>
-          <w:rFonts w:ascii="Arial" w:hAnsi="Arial" w:cs="Arial"/>
-          <w:b/>
-          <w:sz w:val="24"/>
-          <w:szCs w:val="24"/>
-        </w:rPr>
-      </w:pPr>
-      <w:r>
-        <w:rPr>
-          <w:rFonts w:ascii="Arial" w:hAnsi="Arial" w:cs="Arial"/>
-          <w:b/>
-          <w:sz w:val="24"/>
-          <w:szCs w:val="24"/>
-        </w:rPr>
-        <w:lastRenderedPageBreak/>
-        <w:t>O que é Diagrama de Gantt</w:t>
-      </w:r>
-    </w:p>
-    <w:p>
-      <w:pPr>
+        <w:jc w:val="center"/>
+        <w:rPr>
+          <w:rFonts w:ascii="Arial" w:hAnsi="Arial" w:cs="Arial"/>
+          <w:b/>
+          <w:sz w:val="28"/>
+          <w:szCs w:val="24"/>
+        </w:rPr>
+      </w:pPr>
+      <w:r>
+        <w:rPr>
+          <w:rFonts w:ascii="Arial" w:hAnsi="Arial" w:cs="Arial"/>
+          <w:b/>
+          <w:sz w:val="28"/>
+          <w:szCs w:val="24"/>
+        </w:rPr>
+        <w:t>O QUE É DIAGRAMA DE GANTT</w:t>
+      </w:r>
+    </w:p>
+    <w:p>
+      <w:pPr>
+        <w:jc w:val="both"/>
         <w:rPr>
           <w:rFonts w:ascii="Arial" w:hAnsi="Arial" w:cs="Arial"/>
           <w:sz w:val="24"/>
@@ -4831,15 +5018,15 @@
         <w:rPr>
           <w:rFonts w:ascii="Arial" w:hAnsi="Arial" w:cs="Arial"/>
           <w:b/>
-          <w:sz w:val="24"/>
-          <w:szCs w:val="24"/>
-        </w:rPr>
-      </w:pPr>
-      <w:r>
-        <w:rPr>
-          <w:rFonts w:ascii="Arial" w:hAnsi="Arial" w:cs="Arial"/>
-          <w:b/>
-          <w:sz w:val="24"/>
+          <w:sz w:val="28"/>
+          <w:szCs w:val="24"/>
+        </w:rPr>
+      </w:pPr>
+      <w:r>
+        <w:rPr>
+          <w:rFonts w:ascii="Arial" w:hAnsi="Arial" w:cs="Arial"/>
+          <w:b/>
+          <w:sz w:val="28"/>
           <w:szCs w:val="24"/>
         </w:rPr>
         <w:t>DUA</w:t>
@@ -4847,25 +5034,30 @@
     </w:p>
     <w:p>
       <w:pPr>
-        <w:rPr>
-          <w:rFonts w:ascii="Arial" w:hAnsi="Arial" w:cs="Arial"/>
-        </w:rPr>
-      </w:pPr>
-      <w:r>
-        <w:rPr>
-          <w:rFonts w:ascii="Arial" w:hAnsi="Arial" w:cs="Arial"/>
-          <w:b/>
+        <w:ind w:firstLine="708"/>
+        <w:jc w:val="both"/>
+        <w:rPr>
+          <w:rFonts w:ascii="Arial" w:hAnsi="Arial" w:cs="Arial"/>
+          <w:sz w:val="24"/>
+        </w:rPr>
+      </w:pPr>
+      <w:r>
+        <w:rPr>
+          <w:rFonts w:ascii="Arial" w:hAnsi="Arial" w:cs="Arial"/>
           <w:bCs/>
+          <w:sz w:val="24"/>
         </w:rPr>
         <w:t>O Desenho Universal da Aprendizagem (DUA) é uma proposta que ajuda a tornar a escola mais acessível e inclusiva, especialmente para estudantes com Transtorno do Espectro Autista (TEA). Ele busca reduzir barreiras na aprendizagem oferecendo diferentes formas de ensinar, aprender e se expressar.</w:t>
       </w:r>
     </w:p>
     <w:p>
       <w:pPr>
+        <w:jc w:val="both"/>
         <w:rPr>
           <w:rFonts w:ascii="Arial" w:hAnsi="Arial" w:cs="Arial"/>
           <w:b/>
           <w:bCs/>
+          <w:sz w:val="24"/>
         </w:rPr>
       </w:pPr>
       <w:r>
@@ -4873,6 +5065,7 @@
           <w:rFonts w:ascii="Arial" w:hAnsi="Arial" w:cs="Arial"/>
           <w:b/>
           <w:bCs/>
+          <w:sz w:val="24"/>
         </w:rPr>
         <w:t>O que é o DUA</w:t>
       </w:r>
@@ -4883,8 +5076,10 @@
           <w:ilvl w:val="0"/>
           <w:numId w:val="26"/>
         </w:numPr>
-        <w:rPr>
-          <w:rFonts w:ascii="Arial" w:hAnsi="Arial" w:cs="Arial"/>
+        <w:jc w:val="both"/>
+        <w:rPr>
+          <w:rFonts w:ascii="Arial" w:hAnsi="Arial" w:cs="Arial"/>
+          <w:sz w:val="24"/>
         </w:rPr>
       </w:pPr>
       <w:r>
@@ -4892,12 +5087,14 @@
           <w:rFonts w:ascii="Arial" w:hAnsi="Arial" w:cs="Arial"/>
           <w:b/>
           <w:bCs/>
+          <w:sz w:val="24"/>
         </w:rPr>
         <w:t>DUA</w:t>
       </w:r>
       <w:r>
         <w:rPr>
           <w:rFonts w:ascii="Arial" w:hAnsi="Arial" w:cs="Arial"/>
+          <w:sz w:val="24"/>
         </w:rPr>
         <w:t xml:space="preserve"> significa Desenho Universal da Aprendizagem.</w:t>
       </w:r>
@@ -4908,13 +5105,16 @@
           <w:ilvl w:val="0"/>
           <w:numId w:val="26"/>
         </w:numPr>
-        <w:rPr>
-          <w:rFonts w:ascii="Arial" w:hAnsi="Arial" w:cs="Arial"/>
-        </w:rPr>
-      </w:pPr>
-      <w:r>
-        <w:rPr>
-          <w:rFonts w:ascii="Arial" w:hAnsi="Arial" w:cs="Arial"/>
+        <w:jc w:val="both"/>
+        <w:rPr>
+          <w:rFonts w:ascii="Arial" w:hAnsi="Arial" w:cs="Arial"/>
+          <w:sz w:val="24"/>
+        </w:rPr>
+      </w:pPr>
+      <w:r>
+        <w:rPr>
+          <w:rFonts w:ascii="Arial" w:hAnsi="Arial" w:cs="Arial"/>
+          <w:sz w:val="24"/>
         </w:rPr>
         <w:t xml:space="preserve">Seu objetivo é </w:t>
       </w:r>
@@ -4923,12 +5123,14 @@
           <w:rFonts w:ascii="Arial" w:hAnsi="Arial" w:cs="Arial"/>
           <w:b/>
           <w:bCs/>
+          <w:sz w:val="24"/>
         </w:rPr>
         <w:t>criar ambientes e práticas pedagógicas que funcionem para o maior número possível de alunos</w:t>
       </w:r>
       <w:r>
         <w:rPr>
           <w:rFonts w:ascii="Arial" w:hAnsi="Arial" w:cs="Arial"/>
+          <w:sz w:val="24"/>
         </w:rPr>
         <w:t>, sem precisar de muitas adaptações depois.</w:t>
       </w:r>
@@ -4939,13 +5141,16 @@
           <w:ilvl w:val="0"/>
           <w:numId w:val="26"/>
         </w:numPr>
-        <w:rPr>
-          <w:rFonts w:ascii="Arial" w:hAnsi="Arial" w:cs="Arial"/>
-        </w:rPr>
-      </w:pPr>
-      <w:r>
-        <w:rPr>
-          <w:rFonts w:ascii="Arial" w:hAnsi="Arial" w:cs="Arial"/>
+        <w:jc w:val="both"/>
+        <w:rPr>
+          <w:rFonts w:ascii="Arial" w:hAnsi="Arial" w:cs="Arial"/>
+          <w:sz w:val="24"/>
+        </w:rPr>
+      </w:pPr>
+      <w:r>
+        <w:rPr>
+          <w:rFonts w:ascii="Arial" w:hAnsi="Arial" w:cs="Arial"/>
+          <w:sz w:val="24"/>
         </w:rPr>
         <w:t>Ele se baseia em três princípios principais:</w:t>
       </w:r>
@@ -4956,8 +5161,10 @@
           <w:ilvl w:val="1"/>
           <w:numId w:val="26"/>
         </w:numPr>
-        <w:rPr>
-          <w:rFonts w:ascii="Arial" w:hAnsi="Arial" w:cs="Arial"/>
+        <w:jc w:val="both"/>
+        <w:rPr>
+          <w:rFonts w:ascii="Arial" w:hAnsi="Arial" w:cs="Arial"/>
+          <w:sz w:val="24"/>
         </w:rPr>
       </w:pPr>
       <w:r>
@@ -4965,12 +5172,14 @@
           <w:rFonts w:ascii="Arial" w:hAnsi="Arial" w:cs="Arial"/>
           <w:b/>
           <w:bCs/>
+          <w:sz w:val="24"/>
         </w:rPr>
         <w:t>Múltiplos meios de envolvimento</w:t>
       </w:r>
       <w:r>
         <w:rPr>
           <w:rFonts w:ascii="Arial" w:hAnsi="Arial" w:cs="Arial"/>
+          <w:sz w:val="24"/>
         </w:rPr>
         <w:t>: diferentes formas de motivar e engajar os alunos.</w:t>
       </w:r>
@@ -4981,8 +5190,10 @@
           <w:ilvl w:val="1"/>
           <w:numId w:val="26"/>
         </w:numPr>
-        <w:rPr>
-          <w:rFonts w:ascii="Arial" w:hAnsi="Arial" w:cs="Arial"/>
+        <w:jc w:val="both"/>
+        <w:rPr>
+          <w:rFonts w:ascii="Arial" w:hAnsi="Arial" w:cs="Arial"/>
+          <w:sz w:val="24"/>
         </w:rPr>
       </w:pPr>
       <w:r>
@@ -4990,12 +5201,14 @@
           <w:rFonts w:ascii="Arial" w:hAnsi="Arial" w:cs="Arial"/>
           <w:b/>
           <w:bCs/>
+          <w:sz w:val="24"/>
         </w:rPr>
         <w:t>Múltiplos meios de representação</w:t>
       </w:r>
       <w:r>
         <w:rPr>
           <w:rFonts w:ascii="Arial" w:hAnsi="Arial" w:cs="Arial"/>
+          <w:sz w:val="24"/>
         </w:rPr>
         <w:t>: apresentar os conteúdos de várias maneiras (texto, imagem, áudio, prática).</w:t>
       </w:r>
@@ -5006,8 +5219,10 @@
           <w:ilvl w:val="1"/>
           <w:numId w:val="26"/>
         </w:numPr>
-        <w:rPr>
-          <w:rFonts w:ascii="Arial" w:hAnsi="Arial" w:cs="Arial"/>
+        <w:jc w:val="both"/>
+        <w:rPr>
+          <w:rFonts w:ascii="Arial" w:hAnsi="Arial" w:cs="Arial"/>
+          <w:sz w:val="24"/>
         </w:rPr>
       </w:pPr>
       <w:r>
@@ -5015,22 +5230,27 @@
           <w:rFonts w:ascii="Arial" w:hAnsi="Arial" w:cs="Arial"/>
           <w:b/>
           <w:bCs/>
-        </w:rPr>
+          <w:sz w:val="24"/>
+        </w:rPr>
+        <w:lastRenderedPageBreak/>
         <w:t>Múltiplos meios de ação e expressão</w:t>
       </w:r>
       <w:r>
         <w:rPr>
           <w:rFonts w:ascii="Arial" w:hAnsi="Arial" w:cs="Arial"/>
+          <w:sz w:val="24"/>
         </w:rPr>
         <w:t>: permitir que os alunos mostrem o que aprenderam de formas diversas (fala, escrita, desenho, tecnologia).</w:t>
       </w:r>
     </w:p>
     <w:p>
       <w:pPr>
+        <w:jc w:val="both"/>
         <w:rPr>
           <w:rFonts w:ascii="Arial" w:hAnsi="Arial" w:cs="Arial"/>
           <w:b/>
           <w:bCs/>
+          <w:sz w:val="24"/>
         </w:rPr>
       </w:pPr>
       <w:r>
@@ -5038,6 +5258,7 @@
           <w:rFonts w:ascii="Arial" w:hAnsi="Arial" w:cs="Arial"/>
           <w:b/>
           <w:bCs/>
+          <w:sz w:val="24"/>
         </w:rPr>
         <w:t>Relação com o TEA</w:t>
       </w:r>
@@ -5048,13 +5269,16 @@
           <w:ilvl w:val="0"/>
           <w:numId w:val="27"/>
         </w:numPr>
-        <w:rPr>
-          <w:rFonts w:ascii="Arial" w:hAnsi="Arial" w:cs="Arial"/>
-        </w:rPr>
-      </w:pPr>
-      <w:r>
-        <w:rPr>
-          <w:rFonts w:ascii="Arial" w:hAnsi="Arial" w:cs="Arial"/>
+        <w:jc w:val="both"/>
+        <w:rPr>
+          <w:rFonts w:ascii="Arial" w:hAnsi="Arial" w:cs="Arial"/>
+          <w:sz w:val="24"/>
+        </w:rPr>
+      </w:pPr>
+      <w:r>
+        <w:rPr>
+          <w:rFonts w:ascii="Arial" w:hAnsi="Arial" w:cs="Arial"/>
+          <w:sz w:val="24"/>
         </w:rPr>
         <w:t xml:space="preserve">O </w:t>
       </w:r>
@@ -5063,12 +5287,14 @@
           <w:rFonts w:ascii="Arial" w:hAnsi="Arial" w:cs="Arial"/>
           <w:b/>
           <w:bCs/>
+          <w:sz w:val="24"/>
         </w:rPr>
         <w:t>TEA</w:t>
       </w:r>
       <w:r>
         <w:rPr>
           <w:rFonts w:ascii="Arial" w:hAnsi="Arial" w:cs="Arial"/>
+          <w:sz w:val="24"/>
         </w:rPr>
         <w:t xml:space="preserve"> é caracterizado por dificuldades na comunicação, interação social e comportamentos repetitivos.</w:t>
       </w:r>
@@ -5079,13 +5305,16 @@
           <w:ilvl w:val="0"/>
           <w:numId w:val="27"/>
         </w:numPr>
-        <w:rPr>
-          <w:rFonts w:ascii="Arial" w:hAnsi="Arial" w:cs="Arial"/>
-        </w:rPr>
-      </w:pPr>
-      <w:r>
-        <w:rPr>
-          <w:rFonts w:ascii="Arial" w:hAnsi="Arial" w:cs="Arial"/>
+        <w:jc w:val="both"/>
+        <w:rPr>
+          <w:rFonts w:ascii="Arial" w:hAnsi="Arial" w:cs="Arial"/>
+          <w:sz w:val="24"/>
+        </w:rPr>
+      </w:pPr>
+      <w:r>
+        <w:rPr>
+          <w:rFonts w:ascii="Arial" w:hAnsi="Arial" w:cs="Arial"/>
+          <w:sz w:val="24"/>
         </w:rPr>
         <w:t>Estudantes com TEA podem ter necessidades muito diferentes uns dos outros.</w:t>
       </w:r>
@@ -5096,13 +5325,16 @@
           <w:ilvl w:val="0"/>
           <w:numId w:val="27"/>
         </w:numPr>
-        <w:rPr>
-          <w:rFonts w:ascii="Arial" w:hAnsi="Arial" w:cs="Arial"/>
-        </w:rPr>
-      </w:pPr>
-      <w:r>
-        <w:rPr>
-          <w:rFonts w:ascii="Arial" w:hAnsi="Arial" w:cs="Arial"/>
+        <w:jc w:val="both"/>
+        <w:rPr>
+          <w:rFonts w:ascii="Arial" w:hAnsi="Arial" w:cs="Arial"/>
+          <w:sz w:val="24"/>
+        </w:rPr>
+      </w:pPr>
+      <w:r>
+        <w:rPr>
+          <w:rFonts w:ascii="Arial" w:hAnsi="Arial" w:cs="Arial"/>
+          <w:sz w:val="24"/>
         </w:rPr>
         <w:t xml:space="preserve">O DUA ajuda porque </w:t>
       </w:r>
@@ -5111,22 +5343,26 @@
           <w:rFonts w:ascii="Arial" w:hAnsi="Arial" w:cs="Arial"/>
           <w:b/>
           <w:bCs/>
+          <w:sz w:val="24"/>
         </w:rPr>
         <w:t>oferece alternativas</w:t>
       </w:r>
       <w:r>
         <w:rPr>
           <w:rFonts w:ascii="Arial" w:hAnsi="Arial" w:cs="Arial"/>
+          <w:sz w:val="24"/>
         </w:rPr>
         <w:t>: se um aluno tem dificuldade em se comunicar verbalmente, pode usar imagens ou tecnologia; se não consegue se concentrar em uma atividade longa, pode ter opções mais curtas ou práticas.</w:t>
       </w:r>
     </w:p>
     <w:p>
       <w:pPr>
+        <w:jc w:val="both"/>
         <w:rPr>
           <w:rFonts w:ascii="Arial" w:hAnsi="Arial" w:cs="Arial"/>
           <w:b/>
           <w:bCs/>
+          <w:sz w:val="24"/>
         </w:rPr>
       </w:pPr>
       <w:r>
@@ -5134,6 +5370,7 @@
           <w:rFonts w:ascii="Arial" w:hAnsi="Arial" w:cs="Arial"/>
           <w:b/>
           <w:bCs/>
+          <w:sz w:val="24"/>
         </w:rPr>
         <w:t>Benefícios do DUA para alunos com TEA</w:t>
       </w:r>
@@ -5144,8 +5381,10 @@
           <w:ilvl w:val="0"/>
           <w:numId w:val="28"/>
         </w:numPr>
-        <w:rPr>
-          <w:rFonts w:ascii="Arial" w:hAnsi="Arial" w:cs="Arial"/>
+        <w:jc w:val="both"/>
+        <w:rPr>
+          <w:rFonts w:ascii="Arial" w:hAnsi="Arial" w:cs="Arial"/>
+          <w:sz w:val="24"/>
         </w:rPr>
       </w:pPr>
       <w:r>
@@ -5153,12 +5392,14 @@
           <w:rFonts w:ascii="Arial" w:hAnsi="Arial" w:cs="Arial"/>
           <w:b/>
           <w:bCs/>
+          <w:sz w:val="24"/>
         </w:rPr>
         <w:t>Inclusão escolar</w:t>
       </w:r>
       <w:r>
         <w:rPr>
           <w:rFonts w:ascii="Arial" w:hAnsi="Arial" w:cs="Arial"/>
+          <w:sz w:val="24"/>
         </w:rPr>
         <w:t>: garante que o aluno participe junto com os colegas.</w:t>
       </w:r>
@@ -5169,8 +5410,10 @@
           <w:ilvl w:val="0"/>
           <w:numId w:val="28"/>
         </w:numPr>
-        <w:rPr>
-          <w:rFonts w:ascii="Arial" w:hAnsi="Arial" w:cs="Arial"/>
+        <w:jc w:val="both"/>
+        <w:rPr>
+          <w:rFonts w:ascii="Arial" w:hAnsi="Arial" w:cs="Arial"/>
+          <w:sz w:val="24"/>
         </w:rPr>
       </w:pPr>
       <w:r>
@@ -5178,12 +5421,14 @@
           <w:rFonts w:ascii="Arial" w:hAnsi="Arial" w:cs="Arial"/>
           <w:b/>
           <w:bCs/>
+          <w:sz w:val="24"/>
         </w:rPr>
         <w:t>Acessibilidade pedagógica</w:t>
       </w:r>
       <w:r>
         <w:rPr>
           <w:rFonts w:ascii="Arial" w:hAnsi="Arial" w:cs="Arial"/>
+          <w:sz w:val="24"/>
         </w:rPr>
         <w:t>: diminui barreiras que atrapalham o aprendizado.</w:t>
       </w:r>
@@ -5194,8 +5439,10 @@
           <w:ilvl w:val="0"/>
           <w:numId w:val="28"/>
         </w:numPr>
-        <w:rPr>
-          <w:rFonts w:ascii="Arial" w:hAnsi="Arial" w:cs="Arial"/>
+        <w:jc w:val="both"/>
+        <w:rPr>
+          <w:rFonts w:ascii="Arial" w:hAnsi="Arial" w:cs="Arial"/>
+          <w:sz w:val="24"/>
         </w:rPr>
       </w:pPr>
       <w:r>
@@ -5203,12 +5450,14 @@
           <w:rFonts w:ascii="Arial" w:hAnsi="Arial" w:cs="Arial"/>
           <w:b/>
           <w:bCs/>
+          <w:sz w:val="24"/>
         </w:rPr>
         <w:t>Flexibilidade</w:t>
       </w:r>
       <w:r>
         <w:rPr>
           <w:rFonts w:ascii="Arial" w:hAnsi="Arial" w:cs="Arial"/>
+          <w:sz w:val="24"/>
         </w:rPr>
         <w:t>: adapta o ensino sem precisar criar soluções isoladas para cada aluno.</w:t>
       </w:r>
@@ -5219,8 +5468,10 @@
           <w:ilvl w:val="0"/>
           <w:numId w:val="28"/>
         </w:numPr>
-        <w:rPr>
-          <w:rFonts w:ascii="Arial" w:hAnsi="Arial" w:cs="Arial"/>
+        <w:jc w:val="both"/>
+        <w:rPr>
+          <w:rFonts w:ascii="Arial" w:hAnsi="Arial" w:cs="Arial"/>
+          <w:sz w:val="24"/>
         </w:rPr>
       </w:pPr>
       <w:r>
@@ -5228,22 +5479,26 @@
           <w:rFonts w:ascii="Arial" w:hAnsi="Arial" w:cs="Arial"/>
           <w:b/>
           <w:bCs/>
+          <w:sz w:val="24"/>
         </w:rPr>
         <w:t>Valorização das diferenças</w:t>
       </w:r>
       <w:r>
         <w:rPr>
           <w:rFonts w:ascii="Arial" w:hAnsi="Arial" w:cs="Arial"/>
+          <w:sz w:val="24"/>
         </w:rPr>
         <w:t>: reconhece que cada estudante aprende de forma única.</w:t>
       </w:r>
     </w:p>
     <w:p>
       <w:pPr>
+        <w:jc w:val="both"/>
         <w:rPr>
           <w:rFonts w:ascii="Arial" w:hAnsi="Arial" w:cs="Arial"/>
           <w:b/>
           <w:bCs/>
+          <w:sz w:val="24"/>
         </w:rPr>
       </w:pPr>
       <w:r>
@@ -5251,203 +5506,180 @@
           <w:rFonts w:ascii="Arial" w:hAnsi="Arial" w:cs="Arial"/>
           <w:b/>
           <w:bCs/>
+          <w:sz w:val="24"/>
         </w:rPr>
         <w:t>Conclusão</w:t>
       </w:r>
     </w:p>
     <w:p>
       <w:pPr>
-        <w:rPr>
-          <w:rFonts w:ascii="Arial" w:hAnsi="Arial" w:cs="Arial"/>
-        </w:rPr>
-      </w:pPr>
-      <w:r>
-        <w:rPr>
-          <w:rFonts w:ascii="Arial" w:hAnsi="Arial" w:cs="Arial"/>
+        <w:ind w:firstLine="708"/>
+        <w:jc w:val="both"/>
+        <w:rPr>
+          <w:rFonts w:ascii="Arial" w:hAnsi="Arial" w:cs="Arial"/>
+          <w:sz w:val="24"/>
+        </w:rPr>
+      </w:pPr>
+      <w:r>
+        <w:rPr>
+          <w:rFonts w:ascii="Arial" w:hAnsi="Arial" w:cs="Arial"/>
+          <w:sz w:val="24"/>
+        </w:rPr>
+        <w:t xml:space="preserve">O DUA é uma forma de pensar a educação que </w:t>
+      </w:r>
+      <w:r>
+        <w:rPr>
+          <w:rFonts w:ascii="Arial" w:hAnsi="Arial" w:cs="Arial"/>
+          <w:b/>
+          <w:bCs/>
+          <w:sz w:val="24"/>
+        </w:rPr>
+        <w:t>favorece todos os alunos</w:t>
+      </w:r>
+      <w:r>
+        <w:rPr>
+          <w:rFonts w:ascii="Arial" w:hAnsi="Arial" w:cs="Arial"/>
+          <w:sz w:val="24"/>
+        </w:rPr>
+        <w:t xml:space="preserve">, mas tem impacto especial para quem está no espectro autista. Ele promove </w:t>
+      </w:r>
+      <w:r>
+        <w:rPr>
+          <w:rFonts w:ascii="Arial" w:hAnsi="Arial" w:cs="Arial"/>
+          <w:b/>
+          <w:bCs/>
+          <w:sz w:val="24"/>
+        </w:rPr>
+        <w:t>uma escola mais justa, acessível e inclusiva</w:t>
+      </w:r>
+      <w:r>
+        <w:rPr>
+          <w:rFonts w:ascii="Arial" w:hAnsi="Arial" w:cs="Arial"/>
+          <w:sz w:val="24"/>
+        </w:rPr>
+        <w:t>, onde cada estudante pode aprender e se expressar de acordo com suas possibilidades.</w:t>
+      </w:r>
+    </w:p>
+    <w:p/>
+    <w:p>
+      <w:pPr>
+        <w:jc w:val="center"/>
+        <w:rPr>
+          <w:rFonts w:ascii="Arial" w:hAnsi="Arial" w:cs="Arial"/>
+          <w:b/>
+        </w:rPr>
+      </w:pPr>
+      <w:r>
+        <w:rPr>
+          <w:rFonts w:ascii="Arial" w:hAnsi="Arial" w:cs="Arial"/>
+          <w:b/>
+          <w:sz w:val="28"/>
+        </w:rPr>
+        <w:t>CORES DO FRONT-END</w:t>
+      </w:r>
+    </w:p>
+    <w:p>
+      <w:pPr>
+        <w:ind w:firstLine="708"/>
+        <w:jc w:val="both"/>
+        <w:rPr>
+          <w:rFonts w:ascii="Arial" w:hAnsi="Arial" w:cs="Arial"/>
+          <w:sz w:val="24"/>
+        </w:rPr>
+      </w:pPr>
+      <w:r>
+        <w:rPr>
+          <w:rFonts w:ascii="Arial" w:hAnsi="Arial" w:cs="Arial"/>
+          <w:sz w:val="24"/>
+        </w:rPr>
+        <w:t>O estudo de Valério e Bigoli (2021) indica que o design de interfaces para pessoas com TEA deve priorizar a redução da sobrecarga sensorial através de layouts limpos, previsíveis e com uso de cores suaves ou tons pastéis. A pesquisa enfatiza a necessidade de evitar contrastes agressivos e animações excessivas, optando por padronização visual para facilitar o foco e a navegação.</w:t>
+      </w:r>
+    </w:p>
+    <w:p>
+      <w:pPr>
+        <w:jc w:val="both"/>
+        <w:rPr>
+          <w:rFonts w:ascii="Arial" w:hAnsi="Arial" w:cs="Arial"/>
+          <w:sz w:val="24"/>
+          <w:szCs w:val="24"/>
+        </w:rPr>
+      </w:pPr>
+    </w:p>
+    <w:p>
+      <w:pPr>
+        <w:jc w:val="both"/>
+        <w:rPr>
+          <w:rFonts w:ascii="Arial" w:hAnsi="Arial" w:cs="Arial"/>
+          <w:sz w:val="24"/>
+          <w:szCs w:val="24"/>
+        </w:rPr>
+      </w:pPr>
+    </w:p>
+    <w:p>
+      <w:pPr>
+        <w:jc w:val="center"/>
+        <w:rPr>
+          <w:rFonts w:ascii="Arial" w:hAnsi="Arial" w:cs="Arial"/>
+          <w:sz w:val="24"/>
+          <w:szCs w:val="24"/>
+        </w:rPr>
+      </w:pPr>
+      <w:r>
+        <w:rPr>
+          <w:rFonts w:ascii="Arial" w:hAnsi="Arial" w:cs="Arial"/>
+          <w:sz w:val="24"/>
+          <w:szCs w:val="24"/>
+        </w:rPr>
+        <w:t>CONCLUSÃO</w:t>
+      </w:r>
+    </w:p>
+    <w:p>
+      <w:pPr>
+        <w:jc w:val="center"/>
+        <w:rPr>
+          <w:rFonts w:ascii="Arial" w:hAnsi="Arial" w:cs="Arial"/>
+          <w:sz w:val="24"/>
+          <w:szCs w:val="24"/>
+        </w:rPr>
+      </w:pPr>
+    </w:p>
+    <w:p>
+      <w:pPr>
+        <w:jc w:val="center"/>
+        <w:rPr>
+          <w:rFonts w:ascii="Arial" w:hAnsi="Arial" w:cs="Arial"/>
+          <w:sz w:val="24"/>
+          <w:szCs w:val="24"/>
+        </w:rPr>
+      </w:pPr>
+    </w:p>
+    <w:p>
+      <w:pPr>
+        <w:jc w:val="center"/>
+        <w:rPr>
+          <w:rFonts w:ascii="Arial" w:hAnsi="Arial" w:cs="Arial"/>
+          <w:sz w:val="24"/>
+          <w:szCs w:val="24"/>
+        </w:rPr>
+      </w:pPr>
+    </w:p>
+    <w:p>
+      <w:pPr>
+        <w:rPr>
+          <w:rFonts w:ascii="Arial" w:hAnsi="Arial" w:cs="Arial"/>
+          <w:sz w:val="24"/>
+          <w:szCs w:val="24"/>
+        </w:rPr>
+      </w:pPr>
+      <w:r>
+        <w:rPr>
+          <w:rFonts w:ascii="Arial" w:hAnsi="Arial" w:cs="Arial"/>
+          <w:sz w:val="24"/>
+          <w:szCs w:val="24"/>
         </w:rPr>
         <w:lastRenderedPageBreak/>
-        <w:t xml:space="preserve">O DUA é uma forma de pensar a educação que </w:t>
-      </w:r>
-      <w:r>
-        <w:rPr>
-          <w:rFonts w:ascii="Arial" w:hAnsi="Arial" w:cs="Arial"/>
-          <w:b/>
-          <w:bCs/>
-        </w:rPr>
-        <w:t>favorece todos os alunos</w:t>
-      </w:r>
-      <w:r>
-        <w:rPr>
-          <w:rFonts w:ascii="Arial" w:hAnsi="Arial" w:cs="Arial"/>
-        </w:rPr>
-        <w:t xml:space="preserve">, mas tem impacto especial para quem está no espectro autista. Ele promove </w:t>
-      </w:r>
-      <w:r>
-        <w:rPr>
-          <w:rFonts w:ascii="Arial" w:hAnsi="Arial" w:cs="Arial"/>
-          <w:b/>
-          <w:bCs/>
-        </w:rPr>
-        <w:t>uma escola mais justa, acessível e inclusiva</w:t>
-      </w:r>
-      <w:r>
-        <w:rPr>
-          <w:rFonts w:ascii="Arial" w:hAnsi="Arial" w:cs="Arial"/>
-        </w:rPr>
-        <w:t>, onde cada estudante pode aprender e se expressar de acordo com suas possibilidades.</w:t>
-      </w:r>
-    </w:p>
-    <w:p/>
-    <w:p>
-      <w:r>
-        <w:t>Cores do Front-End</w:t>
-      </w:r>
-      <w:r>
-        <w:tab/>
-      </w:r>
-    </w:p>
-    <w:p>
-      <w:r>
-        <w:t>O estudo de Valério e Bigoli (2021) indica que o design de interfaces para pessoas com TEA deve priorizar a redução da sobrecarga sensorial através de layouts limpos, previsíveis e com uso de cores suaves ou tons pastéis. A pesquisa enfatiza a necessidade de evitar contrastes agressivos e animações excessivas, optando por padronização visual para facilitar o foco e a navegação.</w:t>
-      </w:r>
-    </w:p>
-    <w:p>
-      <w:pPr>
-        <w:rPr>
-          <w:rFonts w:ascii="Arial" w:hAnsi="Arial" w:cs="Arial"/>
-          <w:sz w:val="24"/>
-          <w:szCs w:val="24"/>
-        </w:rPr>
-      </w:pPr>
-    </w:p>
-    <w:p>
-      <w:pPr>
-        <w:rPr>
-          <w:rFonts w:ascii="Arial" w:hAnsi="Arial" w:cs="Arial"/>
-          <w:sz w:val="24"/>
-          <w:szCs w:val="24"/>
-        </w:rPr>
-      </w:pPr>
-      <w:r>
-        <w:rPr>
-          <w:rFonts w:ascii="Arial" w:hAnsi="Arial" w:cs="Arial"/>
-          <w:sz w:val="24"/>
-          <w:szCs w:val="24"/>
-        </w:rPr>
-        <w:t>Link uml e explicar</w:t>
-      </w:r>
-    </w:p>
-    <w:p>
-      <w:pPr>
-        <w:jc w:val="both"/>
-        <w:rPr>
-          <w:rFonts w:ascii="Arial" w:hAnsi="Arial" w:cs="Arial"/>
-          <w:sz w:val="24"/>
-          <w:szCs w:val="24"/>
-        </w:rPr>
-      </w:pPr>
-    </w:p>
-    <w:p>
-      <w:pPr>
-        <w:jc w:val="both"/>
-        <w:rPr>
-          <w:rFonts w:ascii="Arial" w:hAnsi="Arial" w:cs="Arial"/>
-          <w:sz w:val="24"/>
-          <w:szCs w:val="24"/>
-        </w:rPr>
-      </w:pPr>
-      <w:r>
-        <w:rPr>
-          <w:rFonts w:ascii="Arial" w:hAnsi="Arial" w:cs="Arial"/>
-          <w:sz w:val="24"/>
-          <w:szCs w:val="24"/>
-        </w:rPr>
-        <w:t>Pesquisas detalhadas e explicadas devem estar aqui</w:t>
-      </w:r>
-    </w:p>
-    <w:p>
-      <w:pPr>
-        <w:jc w:val="both"/>
-        <w:rPr>
-          <w:rFonts w:ascii="Arial" w:hAnsi="Arial" w:cs="Arial"/>
-          <w:sz w:val="24"/>
-          <w:szCs w:val="24"/>
-        </w:rPr>
-      </w:pPr>
-    </w:p>
-    <w:p>
-      <w:pPr>
-        <w:jc w:val="center"/>
-        <w:rPr>
-          <w:rFonts w:ascii="Arial" w:hAnsi="Arial" w:cs="Arial"/>
-          <w:sz w:val="24"/>
-          <w:szCs w:val="24"/>
-        </w:rPr>
-      </w:pPr>
-      <w:r>
-        <w:rPr>
-          <w:rFonts w:ascii="Arial" w:hAnsi="Arial" w:cs="Arial"/>
-          <w:sz w:val="24"/>
-          <w:szCs w:val="24"/>
-        </w:rPr>
-        <w:t>CONCLUSÃO</w:t>
-      </w:r>
-    </w:p>
-    <w:p>
-      <w:pPr>
-        <w:jc w:val="center"/>
-        <w:rPr>
-          <w:rFonts w:ascii="Arial" w:hAnsi="Arial" w:cs="Arial"/>
-          <w:sz w:val="24"/>
-          <w:szCs w:val="24"/>
-        </w:rPr>
-      </w:pPr>
-    </w:p>
-    <w:p>
-      <w:pPr>
-        <w:jc w:val="center"/>
-        <w:rPr>
-          <w:rFonts w:ascii="Arial" w:hAnsi="Arial" w:cs="Arial"/>
-          <w:sz w:val="24"/>
-          <w:szCs w:val="24"/>
-        </w:rPr>
-      </w:pPr>
-    </w:p>
-    <w:p>
-      <w:pPr>
-        <w:jc w:val="center"/>
-        <w:rPr>
-          <w:rFonts w:ascii="Arial" w:hAnsi="Arial" w:cs="Arial"/>
-          <w:sz w:val="24"/>
-          <w:szCs w:val="24"/>
-        </w:rPr>
-      </w:pPr>
-    </w:p>
-    <w:p>
-      <w:pPr>
-        <w:rPr>
-          <w:rFonts w:ascii="Arial" w:hAnsi="Arial" w:cs="Arial"/>
-          <w:sz w:val="24"/>
-          <w:szCs w:val="24"/>
-        </w:rPr>
-      </w:pPr>
-      <w:r>
-        <w:rPr>
-          <w:rFonts w:ascii="Arial" w:hAnsi="Arial" w:cs="Arial"/>
-          <w:sz w:val="24"/>
-          <w:szCs w:val="24"/>
-        </w:rPr>
         <w:t>DIAGRAMA DE GANTT</w:t>
       </w:r>
-    </w:p>
-    <w:p>
-      <w:pPr>
-        <w:rPr>
-          <w:rFonts w:ascii="Arial" w:hAnsi="Arial" w:cs="Arial"/>
-          <w:sz w:val="24"/>
-          <w:szCs w:val="24"/>
-        </w:rPr>
-      </w:pPr>
     </w:p>
     <w:p>
       <w:pPr>
@@ -5525,76 +5757,12 @@
           <w:szCs w:val="24"/>
         </w:rPr>
       </w:pPr>
-    </w:p>
-    <w:p>
-      <w:pPr>
-        <w:rPr>
-          <w:rFonts w:ascii="Arial" w:hAnsi="Arial" w:cs="Arial"/>
-          <w:sz w:val="24"/>
-          <w:szCs w:val="24"/>
-        </w:rPr>
-      </w:pPr>
-    </w:p>
-    <w:p>
-      <w:pPr>
-        <w:rPr>
-          <w:rFonts w:ascii="Arial" w:hAnsi="Arial" w:cs="Arial"/>
-          <w:sz w:val="24"/>
-          <w:szCs w:val="24"/>
-        </w:rPr>
-      </w:pPr>
-    </w:p>
-    <w:p>
-      <w:pPr>
-        <w:rPr>
-          <w:rFonts w:ascii="Arial" w:hAnsi="Arial" w:cs="Arial"/>
-          <w:sz w:val="24"/>
-          <w:szCs w:val="24"/>
-        </w:rPr>
-      </w:pPr>
-    </w:p>
-    <w:p>
-      <w:pPr>
-        <w:rPr>
-          <w:rFonts w:ascii="Arial" w:hAnsi="Arial" w:cs="Arial"/>
-          <w:sz w:val="24"/>
-          <w:szCs w:val="24"/>
-        </w:rPr>
-      </w:pPr>
-    </w:p>
-    <w:p>
-      <w:pPr>
-        <w:rPr>
-          <w:rFonts w:ascii="Arial" w:hAnsi="Arial" w:cs="Arial"/>
-          <w:sz w:val="24"/>
-          <w:szCs w:val="24"/>
-        </w:rPr>
-      </w:pPr>
-    </w:p>
-    <w:p>
-      <w:pPr>
-        <w:rPr>
-          <w:rFonts w:ascii="Arial" w:hAnsi="Arial" w:cs="Arial"/>
-          <w:sz w:val="24"/>
-          <w:szCs w:val="24"/>
-        </w:rPr>
-      </w:pPr>
-    </w:p>
-    <w:p>
-      <w:pPr>
-        <w:rPr>
-          <w:rFonts w:ascii="Arial" w:hAnsi="Arial" w:cs="Arial"/>
-          <w:sz w:val="24"/>
-          <w:szCs w:val="24"/>
-        </w:rPr>
-      </w:pPr>
-      <w:r>
-        <w:rPr>
-          <w:rFonts w:ascii="Arial" w:hAnsi="Arial" w:cs="Arial"/>
-          <w:sz w:val="24"/>
-          <w:szCs w:val="24"/>
-        </w:rPr>
-        <w:lastRenderedPageBreak/>
+      <w:r>
+        <w:rPr>
+          <w:rFonts w:ascii="Arial" w:hAnsi="Arial" w:cs="Arial"/>
+          <w:sz w:val="24"/>
+          <w:szCs w:val="24"/>
+        </w:rPr>
         <w:t>UML</w:t>
       </w:r>
     </w:p>
@@ -5656,33 +5824,6 @@
           </wp:inline>
         </w:drawing>
       </w:r>
-    </w:p>
-    <w:p>
-      <w:pPr>
-        <w:rPr>
-          <w:rFonts w:ascii="Arial" w:hAnsi="Arial" w:cs="Arial"/>
-          <w:sz w:val="24"/>
-          <w:szCs w:val="24"/>
-        </w:rPr>
-      </w:pPr>
-    </w:p>
-    <w:p>
-      <w:pPr>
-        <w:rPr>
-          <w:rFonts w:ascii="Arial" w:hAnsi="Arial" w:cs="Arial"/>
-          <w:sz w:val="24"/>
-          <w:szCs w:val="24"/>
-        </w:rPr>
-      </w:pPr>
-    </w:p>
-    <w:p>
-      <w:pPr>
-        <w:rPr>
-          <w:rFonts w:ascii="Arial" w:hAnsi="Arial" w:cs="Arial"/>
-          <w:sz w:val="24"/>
-          <w:szCs w:val="24"/>
-        </w:rPr>
-      </w:pPr>
       <w:r>
         <w:rPr>
           <w:rFonts w:ascii="Arial" w:hAnsi="Arial" w:cs="Arial"/>
@@ -5709,9 +5850,9 @@
           <w:lang w:eastAsia="pt-BR"/>
         </w:rPr>
         <w:drawing>
-          <wp:inline distT="0" distB="0" distL="0" distR="0" wp14:anchorId="3FB65342" wp14:editId="65DA457A">
-            <wp:extent cx="5130231" cy="4345228"/>
-            <wp:effectExtent l="0" t="0" r="0" b="0"/>
+          <wp:inline distT="0" distB="0" distL="0" distR="0" wp14:anchorId="3FB65342" wp14:editId="039A0047">
+            <wp:extent cx="4049346" cy="3429735"/>
+            <wp:effectExtent l="0" t="0" r="8890" b="0"/>
             <wp:docPr id="5" name="Imagem 5"/>
             <wp:cNvGraphicFramePr>
               <a:graphicFrameLocks xmlns:a="http://schemas.openxmlformats.org/drawingml/2006/main" noChangeAspect="1"/>
@@ -5738,7 +5879,7 @@
                   <pic:spPr>
                     <a:xfrm>
                       <a:off x="0" y="0"/>
-                      <a:ext cx="5132759" cy="4347369"/>
+                      <a:ext cx="4065147" cy="3443118"/>
                     </a:xfrm>
                     <a:prstGeom prst="rect">
                       <a:avLst/>
@@ -5845,12 +5986,139 @@
           <w:szCs w:val="24"/>
         </w:rPr>
       </w:pPr>
-      <w:r>
-        <w:rPr>
-          <w:rFonts w:ascii="Arial" w:hAnsi="Arial" w:cs="Arial"/>
-          <w:sz w:val="24"/>
-          <w:szCs w:val="24"/>
-        </w:rPr>
+    </w:p>
+    <w:p>
+      <w:pPr>
+        <w:rPr>
+          <w:rFonts w:ascii="Arial" w:hAnsi="Arial" w:cs="Arial"/>
+          <w:sz w:val="24"/>
+          <w:szCs w:val="24"/>
+        </w:rPr>
+      </w:pPr>
+    </w:p>
+    <w:p>
+      <w:pPr>
+        <w:rPr>
+          <w:rFonts w:ascii="Arial" w:hAnsi="Arial" w:cs="Arial"/>
+          <w:sz w:val="24"/>
+          <w:szCs w:val="24"/>
+        </w:rPr>
+      </w:pPr>
+    </w:p>
+    <w:p>
+      <w:pPr>
+        <w:rPr>
+          <w:rFonts w:ascii="Arial" w:hAnsi="Arial" w:cs="Arial"/>
+          <w:sz w:val="24"/>
+          <w:szCs w:val="24"/>
+        </w:rPr>
+      </w:pPr>
+    </w:p>
+    <w:p>
+      <w:pPr>
+        <w:rPr>
+          <w:rFonts w:ascii="Arial" w:hAnsi="Arial" w:cs="Arial"/>
+          <w:sz w:val="24"/>
+          <w:szCs w:val="24"/>
+        </w:rPr>
+      </w:pPr>
+    </w:p>
+    <w:p>
+      <w:pPr>
+        <w:rPr>
+          <w:rFonts w:ascii="Arial" w:hAnsi="Arial" w:cs="Arial"/>
+          <w:sz w:val="24"/>
+          <w:szCs w:val="24"/>
+        </w:rPr>
+      </w:pPr>
+    </w:p>
+    <w:p>
+      <w:pPr>
+        <w:rPr>
+          <w:rFonts w:ascii="Arial" w:hAnsi="Arial" w:cs="Arial"/>
+          <w:sz w:val="24"/>
+          <w:szCs w:val="24"/>
+        </w:rPr>
+      </w:pPr>
+    </w:p>
+    <w:p>
+      <w:pPr>
+        <w:rPr>
+          <w:rFonts w:ascii="Arial" w:hAnsi="Arial" w:cs="Arial"/>
+          <w:sz w:val="24"/>
+          <w:szCs w:val="24"/>
+        </w:rPr>
+      </w:pPr>
+    </w:p>
+    <w:p>
+      <w:pPr>
+        <w:rPr>
+          <w:rFonts w:ascii="Arial" w:hAnsi="Arial" w:cs="Arial"/>
+          <w:sz w:val="24"/>
+          <w:szCs w:val="24"/>
+        </w:rPr>
+      </w:pPr>
+    </w:p>
+    <w:p>
+      <w:pPr>
+        <w:rPr>
+          <w:rFonts w:ascii="Arial" w:hAnsi="Arial" w:cs="Arial"/>
+          <w:sz w:val="24"/>
+          <w:szCs w:val="24"/>
+        </w:rPr>
+      </w:pPr>
+    </w:p>
+    <w:p>
+      <w:pPr>
+        <w:rPr>
+          <w:rFonts w:ascii="Arial" w:hAnsi="Arial" w:cs="Arial"/>
+          <w:sz w:val="24"/>
+          <w:szCs w:val="24"/>
+        </w:rPr>
+      </w:pPr>
+    </w:p>
+    <w:p>
+      <w:pPr>
+        <w:rPr>
+          <w:rFonts w:ascii="Arial" w:hAnsi="Arial" w:cs="Arial"/>
+          <w:sz w:val="24"/>
+          <w:szCs w:val="24"/>
+        </w:rPr>
+      </w:pPr>
+    </w:p>
+    <w:p>
+      <w:pPr>
+        <w:rPr>
+          <w:rFonts w:ascii="Arial" w:hAnsi="Arial" w:cs="Arial"/>
+          <w:sz w:val="24"/>
+          <w:szCs w:val="24"/>
+        </w:rPr>
+      </w:pPr>
+    </w:p>
+    <w:p>
+      <w:pPr>
+        <w:rPr>
+          <w:rFonts w:ascii="Arial" w:hAnsi="Arial" w:cs="Arial"/>
+          <w:sz w:val="24"/>
+          <w:szCs w:val="24"/>
+        </w:rPr>
+      </w:pPr>
+    </w:p>
+    <w:p>
+      <w:pPr>
+        <w:rPr>
+          <w:rFonts w:ascii="Arial" w:hAnsi="Arial" w:cs="Arial"/>
+          <w:sz w:val="24"/>
+          <w:szCs w:val="24"/>
+        </w:rPr>
+      </w:pPr>
+      <w:r>
+        <w:rPr>
+          <w:rFonts w:ascii="Arial" w:hAnsi="Arial" w:cs="Arial"/>
+          <w:sz w:val="24"/>
+          <w:szCs w:val="24"/>
+        </w:rPr>
+        <w:lastRenderedPageBreak/>
         <w:t>ESTRUTURA DO PROTÓTIPO EM TELAS E EXPLICADO</w:t>
       </w:r>
     </w:p>
@@ -5868,285 +6136,395 @@
           <w:sz w:val="24"/>
           <w:szCs w:val="24"/>
         </w:rPr>
-        <w:t>(link para acesso se pos</w:t>
-      </w:r>
+        <w:tab/>
+      </w:r>
+      <w:r>
+        <w:rPr>
+          <w:rFonts w:ascii="Arial" w:hAnsi="Arial" w:cs="Arial"/>
+          <w:noProof/>
+          <w:sz w:val="24"/>
+          <w:szCs w:val="24"/>
+          <w:lang w:eastAsia="pt-BR"/>
+        </w:rPr>
+        <w:drawing>
+          <wp:inline distT="0" distB="0" distL="0" distR="0" wp14:anchorId="00836F1A" wp14:editId="5E409FC1">
+            <wp:extent cx="5760085" cy="2721610"/>
+            <wp:effectExtent l="0" t="0" r="0" b="2540"/>
+            <wp:docPr id="3" name="Imagem 3"/>
+            <wp:cNvGraphicFramePr>
+              <a:graphicFrameLocks xmlns:a="http://schemas.openxmlformats.org/drawingml/2006/main" noChangeAspect="1"/>
+            </wp:cNvGraphicFramePr>
+            <a:graphic xmlns:a="http://schemas.openxmlformats.org/drawingml/2006/main">
+              <a:graphicData uri="http://schemas.openxmlformats.org/drawingml/2006/picture">
+                <pic:pic xmlns:pic="http://schemas.openxmlformats.org/drawingml/2006/picture">
+                  <pic:nvPicPr>
+                    <pic:cNvPr id="3" name="img-3.jpeg"/>
+                    <pic:cNvPicPr/>
+                  </pic:nvPicPr>
+                  <pic:blipFill>
+                    <a:blip r:embed="rId13" cstate="print">
+                      <a:extLst>
+                        <a:ext uri="{28A0092B-C50C-407E-A947-70E740481C1C}">
+                          <a14:useLocalDpi xmlns:a14="http://schemas.microsoft.com/office/drawing/2010/main" val="0"/>
+                        </a:ext>
+                      </a:extLst>
+                    </a:blip>
+                    <a:stretch>
+                      <a:fillRect/>
+                    </a:stretch>
+                  </pic:blipFill>
+                  <pic:spPr>
+                    <a:xfrm>
+                      <a:off x="0" y="0"/>
+                      <a:ext cx="5760085" cy="2721610"/>
+                    </a:xfrm>
+                    <a:prstGeom prst="rect">
+                      <a:avLst/>
+                    </a:prstGeom>
+                  </pic:spPr>
+                </pic:pic>
+              </a:graphicData>
+            </a:graphic>
+          </wp:inline>
+        </w:drawing>
+      </w:r>
+    </w:p>
+    <w:p>
+      <w:pPr>
+        <w:rPr>
+          <w:rFonts w:ascii="Arial" w:hAnsi="Arial" w:cs="Arial"/>
+          <w:sz w:val="24"/>
+          <w:szCs w:val="24"/>
+        </w:rPr>
+      </w:pPr>
+    </w:p>
+    <w:p>
+      <w:pPr>
+        <w:rPr>
+          <w:rFonts w:ascii="Arial" w:hAnsi="Arial" w:cs="Arial"/>
+          <w:sz w:val="24"/>
+          <w:szCs w:val="24"/>
+        </w:rPr>
+      </w:pPr>
+    </w:p>
+    <w:p>
+      <w:pPr>
+        <w:rPr>
+          <w:rFonts w:ascii="Arial" w:hAnsi="Arial" w:cs="Arial"/>
+          <w:sz w:val="24"/>
+          <w:szCs w:val="24"/>
+        </w:rPr>
+      </w:pPr>
+    </w:p>
+    <w:p>
+      <w:pPr>
+        <w:rPr>
+          <w:rFonts w:ascii="Arial" w:hAnsi="Arial" w:cs="Arial"/>
+          <w:sz w:val="24"/>
+          <w:szCs w:val="24"/>
+        </w:rPr>
+      </w:pPr>
+      <w:r>
+        <w:rPr>
+          <w:rFonts w:ascii="Arial" w:hAnsi="Arial" w:cs="Arial"/>
+          <w:noProof/>
+          <w:sz w:val="24"/>
+          <w:szCs w:val="24"/>
+          <w:lang w:eastAsia="pt-BR"/>
+        </w:rPr>
+        <w:drawing>
+          <wp:inline distT="0" distB="0" distL="0" distR="0" wp14:anchorId="3C9ABAEB" wp14:editId="45585ED8">
+            <wp:extent cx="5760085" cy="2739390"/>
+            <wp:effectExtent l="0" t="0" r="0" b="3810"/>
+            <wp:docPr id="4" name="Imagem 4"/>
+            <wp:cNvGraphicFramePr>
+              <a:graphicFrameLocks xmlns:a="http://schemas.openxmlformats.org/drawingml/2006/main" noChangeAspect="1"/>
+            </wp:cNvGraphicFramePr>
+            <a:graphic xmlns:a="http://schemas.openxmlformats.org/drawingml/2006/main">
+              <a:graphicData uri="http://schemas.openxmlformats.org/drawingml/2006/picture">
+                <pic:pic xmlns:pic="http://schemas.openxmlformats.org/drawingml/2006/picture">
+                  <pic:nvPicPr>
+                    <pic:cNvPr id="4" name="img-4.jpeg"/>
+                    <pic:cNvPicPr/>
+                  </pic:nvPicPr>
+                  <pic:blipFill>
+                    <a:blip r:embed="rId14" cstate="print">
+                      <a:extLst>
+                        <a:ext uri="{28A0092B-C50C-407E-A947-70E740481C1C}">
+                          <a14:useLocalDpi xmlns:a14="http://schemas.microsoft.com/office/drawing/2010/main" val="0"/>
+                        </a:ext>
+                      </a:extLst>
+                    </a:blip>
+                    <a:stretch>
+                      <a:fillRect/>
+                    </a:stretch>
+                  </pic:blipFill>
+                  <pic:spPr>
+                    <a:xfrm>
+                      <a:off x="0" y="0"/>
+                      <a:ext cx="5760085" cy="2739390"/>
+                    </a:xfrm>
+                    <a:prstGeom prst="rect">
+                      <a:avLst/>
+                    </a:prstGeom>
+                  </pic:spPr>
+                </pic:pic>
+              </a:graphicData>
+            </a:graphic>
+          </wp:inline>
+        </w:drawing>
+      </w:r>
+    </w:p>
+    <w:p>
+      <w:pPr>
+        <w:rPr>
+          <w:rFonts w:ascii="Arial" w:hAnsi="Arial" w:cs="Arial"/>
+          <w:sz w:val="24"/>
+          <w:szCs w:val="24"/>
+        </w:rPr>
+      </w:pPr>
+      <w:r>
+        <w:rPr>
+          <w:rFonts w:ascii="Arial" w:hAnsi="Arial" w:cs="Arial"/>
+          <w:noProof/>
+          <w:sz w:val="24"/>
+          <w:szCs w:val="24"/>
+          <w:lang w:eastAsia="pt-BR"/>
+        </w:rPr>
+        <w:lastRenderedPageBreak/>
+        <w:drawing>
+          <wp:inline distT="0" distB="0" distL="0" distR="0" wp14:anchorId="4879C6C9" wp14:editId="40DB4BE5">
+            <wp:extent cx="5760085" cy="2732405"/>
+            <wp:effectExtent l="0" t="0" r="0" b="0"/>
+            <wp:docPr id="10" name="Imagem 10"/>
+            <wp:cNvGraphicFramePr>
+              <a:graphicFrameLocks xmlns:a="http://schemas.openxmlformats.org/drawingml/2006/main" noChangeAspect="1"/>
+            </wp:cNvGraphicFramePr>
+            <a:graphic xmlns:a="http://schemas.openxmlformats.org/drawingml/2006/main">
+              <a:graphicData uri="http://schemas.openxmlformats.org/drawingml/2006/picture">
+                <pic:pic xmlns:pic="http://schemas.openxmlformats.org/drawingml/2006/picture">
+                  <pic:nvPicPr>
+                    <pic:cNvPr id="10" name="img-1.jpeg"/>
+                    <pic:cNvPicPr/>
+                  </pic:nvPicPr>
+                  <pic:blipFill>
+                    <a:blip r:embed="rId15" cstate="print">
+                      <a:extLst>
+                        <a:ext uri="{28A0092B-C50C-407E-A947-70E740481C1C}">
+                          <a14:useLocalDpi xmlns:a14="http://schemas.microsoft.com/office/drawing/2010/main" val="0"/>
+                        </a:ext>
+                      </a:extLst>
+                    </a:blip>
+                    <a:stretch>
+                      <a:fillRect/>
+                    </a:stretch>
+                  </pic:blipFill>
+                  <pic:spPr>
+                    <a:xfrm>
+                      <a:off x="0" y="0"/>
+                      <a:ext cx="5760085" cy="2732405"/>
+                    </a:xfrm>
+                    <a:prstGeom prst="rect">
+                      <a:avLst/>
+                    </a:prstGeom>
+                  </pic:spPr>
+                </pic:pic>
+              </a:graphicData>
+            </a:graphic>
+          </wp:inline>
+        </w:drawing>
+      </w:r>
+    </w:p>
+    <w:p>
+      <w:pPr>
+        <w:rPr>
+          <w:rFonts w:ascii="Arial" w:hAnsi="Arial" w:cs="Arial"/>
+          <w:sz w:val="24"/>
+          <w:szCs w:val="24"/>
+        </w:rPr>
+      </w:pPr>
+    </w:p>
+    <w:p>
+      <w:pPr>
+        <w:jc w:val="both"/>
+        <w:rPr>
+          <w:rFonts w:ascii="Arial" w:hAnsi="Arial" w:cs="Arial"/>
+          <w:b/>
+          <w:sz w:val="24"/>
+          <w:szCs w:val="24"/>
+        </w:rPr>
+      </w:pPr>
+      <w:r>
+        <w:rPr>
+          <w:rFonts w:ascii="Arial" w:hAnsi="Arial" w:cs="Arial"/>
+          <w:b/>
+          <w:noProof/>
+          <w:sz w:val="24"/>
+          <w:szCs w:val="24"/>
+          <w:lang w:eastAsia="pt-BR"/>
+        </w:rPr>
+        <w:drawing>
+          <wp:inline distT="0" distB="0" distL="0" distR="0" wp14:anchorId="1DA600AD" wp14:editId="0D0B50F4">
+            <wp:extent cx="5760085" cy="2750185"/>
+            <wp:effectExtent l="0" t="0" r="0" b="0"/>
+            <wp:docPr id="11" name="Imagem 11"/>
+            <wp:cNvGraphicFramePr>
+              <a:graphicFrameLocks xmlns:a="http://schemas.openxmlformats.org/drawingml/2006/main" noChangeAspect="1"/>
+            </wp:cNvGraphicFramePr>
+            <a:graphic xmlns:a="http://schemas.openxmlformats.org/drawingml/2006/main">
+              <a:graphicData uri="http://schemas.openxmlformats.org/drawingml/2006/picture">
+                <pic:pic xmlns:pic="http://schemas.openxmlformats.org/drawingml/2006/picture">
+                  <pic:nvPicPr>
+                    <pic:cNvPr id="11" name="img-2.jpeg"/>
+                    <pic:cNvPicPr/>
+                  </pic:nvPicPr>
+                  <pic:blipFill>
+                    <a:blip r:embed="rId16" cstate="print">
+                      <a:extLst>
+                        <a:ext uri="{28A0092B-C50C-407E-A947-70E740481C1C}">
+                          <a14:useLocalDpi xmlns:a14="http://schemas.microsoft.com/office/drawing/2010/main" val="0"/>
+                        </a:ext>
+                      </a:extLst>
+                    </a:blip>
+                    <a:stretch>
+                      <a:fillRect/>
+                    </a:stretch>
+                  </pic:blipFill>
+                  <pic:spPr>
+                    <a:xfrm>
+                      <a:off x="0" y="0"/>
+                      <a:ext cx="5760085" cy="2750185"/>
+                    </a:xfrm>
+                    <a:prstGeom prst="rect">
+                      <a:avLst/>
+                    </a:prstGeom>
+                  </pic:spPr>
+                </pic:pic>
+              </a:graphicData>
+            </a:graphic>
+          </wp:inline>
+        </w:drawing>
+      </w:r>
+    </w:p>
+    <w:p>
+      <w:pPr>
+        <w:jc w:val="both"/>
+        <w:rPr>
+          <w:rFonts w:ascii="Arial" w:hAnsi="Arial" w:cs="Arial"/>
+          <w:sz w:val="24"/>
+          <w:szCs w:val="24"/>
+        </w:rPr>
+      </w:pPr>
+    </w:p>
+    <w:p>
+      <w:pPr>
+        <w:jc w:val="both"/>
+        <w:rPr>
+          <w:rFonts w:ascii="Arial" w:hAnsi="Arial" w:cs="Arial"/>
+          <w:sz w:val="24"/>
+          <w:szCs w:val="24"/>
+        </w:rPr>
+      </w:pPr>
+    </w:p>
+    <w:p>
+      <w:pPr>
+        <w:rPr>
+          <w:rFonts w:ascii="Arial" w:hAnsi="Arial" w:cs="Arial"/>
+          <w:b/>
+          <w:sz w:val="24"/>
+          <w:szCs w:val="24"/>
+        </w:rPr>
+      </w:pPr>
+    </w:p>
+    <w:p>
+      <w:pPr>
+        <w:rPr>
+          <w:rFonts w:ascii="Arial" w:hAnsi="Arial" w:cs="Arial"/>
+          <w:b/>
+          <w:sz w:val="24"/>
+          <w:szCs w:val="24"/>
+        </w:rPr>
+      </w:pPr>
+    </w:p>
+    <w:p>
+      <w:pPr>
+        <w:rPr>
+          <w:rFonts w:ascii="Arial" w:hAnsi="Arial" w:cs="Arial"/>
+          <w:b/>
+          <w:sz w:val="24"/>
+          <w:szCs w:val="24"/>
+        </w:rPr>
+      </w:pPr>
+    </w:p>
+    <w:p>
+      <w:pPr>
+        <w:rPr>
+          <w:rFonts w:ascii="Arial" w:hAnsi="Arial" w:cs="Arial"/>
+          <w:b/>
+          <w:sz w:val="24"/>
+          <w:szCs w:val="24"/>
+        </w:rPr>
+      </w:pPr>
+    </w:p>
+    <w:p>
+      <w:pPr>
+        <w:rPr>
+          <w:rFonts w:ascii="Arial" w:hAnsi="Arial" w:cs="Arial"/>
+          <w:b/>
+          <w:sz w:val="24"/>
+          <w:szCs w:val="24"/>
+        </w:rPr>
+      </w:pPr>
+    </w:p>
+    <w:p>
+      <w:pPr>
+        <w:rPr>
+          <w:rFonts w:ascii="Arial" w:hAnsi="Arial" w:cs="Arial"/>
+          <w:b/>
+          <w:sz w:val="24"/>
+          <w:szCs w:val="24"/>
+        </w:rPr>
+      </w:pPr>
+    </w:p>
+    <w:p>
+      <w:pPr>
+        <w:rPr>
+          <w:rFonts w:ascii="Arial" w:hAnsi="Arial" w:cs="Arial"/>
+          <w:b/>
+          <w:sz w:val="24"/>
+          <w:szCs w:val="24"/>
+        </w:rPr>
+      </w:pPr>
+    </w:p>
+    <w:p>
+      <w:pPr>
+        <w:rPr>
+          <w:rFonts w:ascii="Arial" w:hAnsi="Arial" w:cs="Arial"/>
+          <w:b/>
+          <w:sz w:val="24"/>
+          <w:szCs w:val="24"/>
+        </w:rPr>
+      </w:pPr>
       <w:bookmarkStart w:id="0" w:name="_GoBack"/>
       <w:bookmarkEnd w:id="0"/>
-      <w:r>
-        <w:rPr>
-          <w:rFonts w:ascii="Arial" w:hAnsi="Arial" w:cs="Arial"/>
-          <w:sz w:val="24"/>
-          <w:szCs w:val="24"/>
-        </w:rPr>
-        <w:t>sível)</w:t>
-      </w:r>
-    </w:p>
-    <w:p>
-      <w:pPr>
-        <w:rPr>
-          <w:rFonts w:ascii="Arial" w:hAnsi="Arial" w:cs="Arial"/>
-          <w:sz w:val="24"/>
-          <w:szCs w:val="24"/>
-        </w:rPr>
-      </w:pPr>
-    </w:p>
-    <w:p>
-      <w:pPr>
-        <w:rPr>
-          <w:rFonts w:ascii="Arial" w:hAnsi="Arial" w:cs="Arial"/>
-          <w:sz w:val="24"/>
-          <w:szCs w:val="24"/>
-        </w:rPr>
-      </w:pPr>
-    </w:p>
-    <w:p>
-      <w:pPr>
-        <w:rPr>
-          <w:rFonts w:ascii="Arial" w:hAnsi="Arial" w:cs="Arial"/>
-          <w:b/>
-          <w:sz w:val="24"/>
-          <w:szCs w:val="24"/>
-        </w:rPr>
-      </w:pPr>
-    </w:p>
-    <w:p>
-      <w:pPr>
-        <w:jc w:val="both"/>
-        <w:rPr>
-          <w:rFonts w:ascii="Arial" w:hAnsi="Arial" w:cs="Arial"/>
-          <w:b/>
-          <w:sz w:val="24"/>
-          <w:szCs w:val="24"/>
-        </w:rPr>
-      </w:pPr>
-    </w:p>
-    <w:p>
-      <w:pPr>
-        <w:jc w:val="both"/>
-        <w:rPr>
-          <w:rFonts w:ascii="Arial" w:hAnsi="Arial" w:cs="Arial"/>
-          <w:b/>
-          <w:sz w:val="24"/>
-          <w:szCs w:val="24"/>
-        </w:rPr>
-      </w:pPr>
-    </w:p>
-    <w:p>
-      <w:pPr>
-        <w:jc w:val="both"/>
-        <w:rPr>
-          <w:rFonts w:ascii="Arial" w:hAnsi="Arial" w:cs="Arial"/>
-          <w:sz w:val="24"/>
-          <w:szCs w:val="24"/>
-        </w:rPr>
-      </w:pPr>
-    </w:p>
-    <w:p>
-      <w:pPr>
-        <w:jc w:val="both"/>
-        <w:rPr>
-          <w:rFonts w:ascii="Arial" w:hAnsi="Arial" w:cs="Arial"/>
-          <w:sz w:val="24"/>
-          <w:szCs w:val="24"/>
-        </w:rPr>
-      </w:pPr>
-    </w:p>
-    <w:p>
-      <w:pPr>
-        <w:rPr>
-          <w:rFonts w:ascii="Arial" w:hAnsi="Arial" w:cs="Arial"/>
-          <w:b/>
-          <w:sz w:val="24"/>
-          <w:szCs w:val="24"/>
-        </w:rPr>
-      </w:pPr>
-    </w:p>
-    <w:p>
-      <w:pPr>
-        <w:rPr>
-          <w:rFonts w:ascii="Arial" w:hAnsi="Arial" w:cs="Arial"/>
-          <w:b/>
-          <w:sz w:val="24"/>
-          <w:szCs w:val="24"/>
-        </w:rPr>
-      </w:pPr>
-    </w:p>
-    <w:p>
-      <w:pPr>
-        <w:rPr>
-          <w:rFonts w:ascii="Arial" w:hAnsi="Arial" w:cs="Arial"/>
-          <w:b/>
-          <w:sz w:val="24"/>
-          <w:szCs w:val="24"/>
-        </w:rPr>
-      </w:pPr>
-    </w:p>
-    <w:p>
-      <w:pPr>
-        <w:rPr>
-          <w:rFonts w:ascii="Arial" w:hAnsi="Arial" w:cs="Arial"/>
-          <w:b/>
-          <w:sz w:val="24"/>
-          <w:szCs w:val="24"/>
-        </w:rPr>
-      </w:pPr>
-    </w:p>
-    <w:p>
-      <w:pPr>
-        <w:rPr>
-          <w:rFonts w:ascii="Arial" w:hAnsi="Arial" w:cs="Arial"/>
-          <w:b/>
-          <w:sz w:val="24"/>
-          <w:szCs w:val="24"/>
-        </w:rPr>
-      </w:pPr>
-    </w:p>
-    <w:p>
-      <w:pPr>
-        <w:rPr>
-          <w:rFonts w:ascii="Arial" w:hAnsi="Arial" w:cs="Arial"/>
-          <w:b/>
-          <w:sz w:val="24"/>
-          <w:szCs w:val="24"/>
-        </w:rPr>
-      </w:pPr>
-    </w:p>
-    <w:p>
-      <w:pPr>
-        <w:rPr>
-          <w:rFonts w:ascii="Arial" w:hAnsi="Arial" w:cs="Arial"/>
-          <w:b/>
-          <w:sz w:val="24"/>
-          <w:szCs w:val="24"/>
-        </w:rPr>
-      </w:pPr>
-    </w:p>
-    <w:p>
-      <w:pPr>
-        <w:rPr>
-          <w:rFonts w:ascii="Arial" w:hAnsi="Arial" w:cs="Arial"/>
-          <w:b/>
-          <w:sz w:val="24"/>
-          <w:szCs w:val="24"/>
-        </w:rPr>
-      </w:pPr>
-    </w:p>
-    <w:p>
-      <w:pPr>
-        <w:rPr>
-          <w:rFonts w:ascii="Arial" w:hAnsi="Arial" w:cs="Arial"/>
-          <w:b/>
-          <w:sz w:val="24"/>
-          <w:szCs w:val="24"/>
-        </w:rPr>
-      </w:pPr>
-    </w:p>
-    <w:p>
-      <w:pPr>
-        <w:rPr>
-          <w:rFonts w:ascii="Arial" w:hAnsi="Arial" w:cs="Arial"/>
-          <w:b/>
-          <w:sz w:val="24"/>
-          <w:szCs w:val="24"/>
-        </w:rPr>
-      </w:pPr>
-    </w:p>
-    <w:p>
-      <w:pPr>
-        <w:rPr>
-          <w:rFonts w:ascii="Arial" w:hAnsi="Arial" w:cs="Arial"/>
-          <w:b/>
-          <w:sz w:val="24"/>
-          <w:szCs w:val="24"/>
-        </w:rPr>
-      </w:pPr>
-    </w:p>
-    <w:p>
-      <w:pPr>
-        <w:rPr>
-          <w:rFonts w:ascii="Arial" w:hAnsi="Arial" w:cs="Arial"/>
-          <w:b/>
-          <w:sz w:val="24"/>
-          <w:szCs w:val="24"/>
-        </w:rPr>
-      </w:pPr>
-    </w:p>
-    <w:p>
-      <w:pPr>
-        <w:rPr>
-          <w:rFonts w:ascii="Arial" w:hAnsi="Arial" w:cs="Arial"/>
-          <w:b/>
-          <w:sz w:val="24"/>
-          <w:szCs w:val="24"/>
-        </w:rPr>
-      </w:pPr>
-    </w:p>
-    <w:p>
-      <w:pPr>
-        <w:rPr>
-          <w:rFonts w:ascii="Arial" w:hAnsi="Arial" w:cs="Arial"/>
-          <w:b/>
-          <w:sz w:val="24"/>
-          <w:szCs w:val="24"/>
-        </w:rPr>
-      </w:pPr>
-    </w:p>
-    <w:p>
-      <w:pPr>
-        <w:rPr>
-          <w:rFonts w:ascii="Arial" w:hAnsi="Arial" w:cs="Arial"/>
-          <w:b/>
-          <w:sz w:val="24"/>
-          <w:szCs w:val="24"/>
-        </w:rPr>
-      </w:pPr>
-    </w:p>
-    <w:p>
-      <w:pPr>
-        <w:rPr>
-          <w:rFonts w:ascii="Arial" w:hAnsi="Arial" w:cs="Arial"/>
-          <w:b/>
-          <w:sz w:val="24"/>
-          <w:szCs w:val="24"/>
-        </w:rPr>
-      </w:pPr>
-    </w:p>
-    <w:p>
-      <w:pPr>
-        <w:rPr>
-          <w:rFonts w:ascii="Arial" w:hAnsi="Arial" w:cs="Arial"/>
-          <w:b/>
-          <w:sz w:val="24"/>
-          <w:szCs w:val="24"/>
-        </w:rPr>
-      </w:pPr>
-    </w:p>
-    <w:p>
-      <w:pPr>
-        <w:rPr>
-          <w:rFonts w:ascii="Arial" w:hAnsi="Arial" w:cs="Arial"/>
-          <w:b/>
-          <w:sz w:val="24"/>
-          <w:szCs w:val="24"/>
-        </w:rPr>
-      </w:pPr>
-    </w:p>
-    <w:p>
-      <w:pPr>
-        <w:rPr>
-          <w:rFonts w:ascii="Arial" w:hAnsi="Arial" w:cs="Arial"/>
-          <w:b/>
-          <w:sz w:val="24"/>
-          <w:szCs w:val="24"/>
-        </w:rPr>
-      </w:pPr>
-      <w:r>
-        <w:rPr>
-          <w:rFonts w:ascii="Arial" w:hAnsi="Arial" w:cs="Arial"/>
-          <w:b/>
-          <w:sz w:val="24"/>
-          <w:szCs w:val="24"/>
-        </w:rPr>
+    </w:p>
+    <w:p>
+      <w:pPr>
+        <w:rPr>
+          <w:rFonts w:ascii="Arial" w:hAnsi="Arial" w:cs="Arial"/>
+          <w:b/>
+          <w:sz w:val="24"/>
+          <w:szCs w:val="24"/>
+        </w:rPr>
+      </w:pPr>
+      <w:r>
+        <w:rPr>
+          <w:rFonts w:ascii="Arial" w:hAnsi="Arial" w:cs="Arial"/>
+          <w:b/>
+          <w:sz w:val="24"/>
+          <w:szCs w:val="24"/>
+        </w:rPr>
+        <w:lastRenderedPageBreak/>
         <w:t>Bibliografia</w:t>
       </w:r>
     </w:p>
@@ -6188,7 +6566,7 @@
           <w:szCs w:val="24"/>
         </w:rPr>
       </w:pPr>
-      <w:hyperlink r:id="rId13" w:history="1">
+      <w:hyperlink r:id="rId17" w:history="1">
         <w:r>
           <w:rPr>
             <w:rStyle w:val="Hyperlink"/>
@@ -6238,7 +6616,7 @@
           <w:szCs w:val="24"/>
         </w:rPr>
       </w:pPr>
-      <w:hyperlink r:id="rId14" w:history="1">
+      <w:hyperlink r:id="rId18" w:history="1">
         <w:r>
           <w:rPr>
             <w:rStyle w:val="Hyperlink"/>
@@ -6271,7 +6649,7 @@
           <w:szCs w:val="24"/>
         </w:rPr>
       </w:pPr>
-      <w:hyperlink r:id="rId15" w:history="1">
+      <w:hyperlink r:id="rId19" w:history="1">
         <w:r>
           <w:rPr>
             <w:rStyle w:val="Hyperlink"/>
@@ -6321,7 +6699,7 @@
           <w:szCs w:val="24"/>
         </w:rPr>
       </w:pPr>
-      <w:hyperlink r:id="rId16" w:history="1">
+      <w:hyperlink r:id="rId20" w:history="1">
         <w:r>
           <w:rPr>
             <w:rStyle w:val="Hyperlink"/>
@@ -6354,7 +6732,7 @@
           <w:szCs w:val="24"/>
         </w:rPr>
       </w:pPr>
-      <w:hyperlink r:id="rId17" w:history="1">
+      <w:hyperlink r:id="rId21" w:history="1">
         <w:r>
           <w:rPr>
             <w:rStyle w:val="Hyperlink"/>
@@ -6404,7 +6782,7 @@
           <w:szCs w:val="24"/>
         </w:rPr>
       </w:pPr>
-      <w:hyperlink r:id="rId18" w:history="1">
+      <w:hyperlink r:id="rId22" w:history="1">
         <w:r>
           <w:rPr>
             <w:rStyle w:val="Hyperlink"/>
@@ -6461,7 +6839,7 @@
         </w:rPr>
         <w:tab/>
       </w:r>
-      <w:hyperlink r:id="rId19" w:history="1">
+      <w:hyperlink r:id="rId23" w:history="1">
         <w:r>
           <w:rPr>
             <w:rStyle w:val="Hyperlink"/>
@@ -6509,7 +6887,7 @@
         </w:rPr>
         <w:t xml:space="preserve">Diagrama de Gantt: </w:t>
       </w:r>
-      <w:hyperlink r:id="rId20" w:history="1">
+      <w:hyperlink r:id="rId24" w:history="1">
         <w:r>
           <w:rPr>
             <w:rStyle w:val="Hyperlink"/>
@@ -6562,7 +6940,7 @@
         </w:rPr>
         <w:t xml:space="preserve">: </w:t>
       </w:r>
-      <w:hyperlink r:id="rId21" w:history="1">
+      <w:hyperlink r:id="rId25" w:history="1">
         <w:r>
           <w:rPr>
             <w:rStyle w:val="Hyperlink"/>
@@ -6624,7 +7002,7 @@
         </w:rPr>
         <w:tab/>
       </w:r>
-      <w:hyperlink r:id="rId22" w:history="1">
+      <w:hyperlink r:id="rId26" w:history="1">
         <w:r>
           <w:rPr>
             <w:rStyle w:val="Hyperlink"/>
@@ -11538,7 +11916,7 @@
 </file>
 
 <file path=customXml/itemProps1.xml><?xml version="1.0" encoding="utf-8"?>
-<ds:datastoreItem xmlns:ds="http://schemas.openxmlformats.org/officeDocument/2006/customXml" ds:itemID="{BA378EDE-0966-4E95-BCE0-0242D326BE68}">
+<ds:datastoreItem xmlns:ds="http://schemas.openxmlformats.org/officeDocument/2006/customXml" ds:itemID="{3E1DC03E-2D50-4B3D-A73F-019C24C3C08F}">
   <ds:schemaRefs>
     <ds:schemaRef ds:uri="http://schemas.openxmlformats.org/officeDocument/2006/bibliography"/>
   </ds:schemaRefs>

</xml_diff>

<commit_message>
feat: adiciona mais informações na introdução da documentação
</commit_message>
<xml_diff>
--- a/Documentação.docx
+++ b/Documentação.docx
@@ -1,6 +1,6 @@
 
 <file path=word/document.xml><?xml version="1.0" encoding="utf-8"?>
-<w:document xmlns:wpc="http://schemas.microsoft.com/office/word/2010/wordprocessingCanvas" xmlns:cx="http://schemas.microsoft.com/office/drawing/2014/chartex" xmlns:mc="http://schemas.openxmlformats.org/markup-compatibility/2006" xmlns:o="urn:schemas-microsoft-com:office:office" xmlns:r="http://schemas.openxmlformats.org/officeDocument/2006/relationships" xmlns:m="http://schemas.openxmlformats.org/officeDocument/2006/math" xmlns:v="urn:schemas-microsoft-com:vml" xmlns:wp14="http://schemas.microsoft.com/office/word/2010/wordprocessingDrawing" xmlns:wp="http://schemas.openxmlformats.org/drawingml/2006/wordprocessingDrawing" xmlns:w10="urn:schemas-microsoft-com:office:word" xmlns:w="http://schemas.openxmlformats.org/wordprocessingml/2006/main" xmlns:w14="http://schemas.microsoft.com/office/word/2010/wordml" xmlns:w15="http://schemas.microsoft.com/office/word/2012/wordml" xmlns:w16se="http://schemas.microsoft.com/office/word/2015/wordml/symex" xmlns:wpg="http://schemas.microsoft.com/office/word/2010/wordprocessingGroup" xmlns:wpi="http://schemas.microsoft.com/office/word/2010/wordprocessingInk" xmlns:wne="http://schemas.microsoft.com/office/word/2006/wordml" xmlns:wps="http://schemas.microsoft.com/office/word/2010/wordprocessingShape" mc:Ignorable="w14 w15 w16se wp14">
+<w:document xmlns:wpc="http://schemas.microsoft.com/office/word/2010/wordprocessingCanvas" xmlns:cx="http://schemas.microsoft.com/office/drawing/2014/chartex" xmlns:cx1="http://schemas.microsoft.com/office/drawing/2015/9/8/chartex" xmlns:cx2="http://schemas.microsoft.com/office/drawing/2015/10/21/chartex" xmlns:cx3="http://schemas.microsoft.com/office/drawing/2016/5/9/chartex" xmlns:cx4="http://schemas.microsoft.com/office/drawing/2016/5/10/chartex" xmlns:cx5="http://schemas.microsoft.com/office/drawing/2016/5/11/chartex" xmlns:cx6="http://schemas.microsoft.com/office/drawing/2016/5/12/chartex" xmlns:cx7="http://schemas.microsoft.com/office/drawing/2016/5/13/chartex" xmlns:cx8="http://schemas.microsoft.com/office/drawing/2016/5/14/chartex" xmlns:mc="http://schemas.openxmlformats.org/markup-compatibility/2006" xmlns:aink="http://schemas.microsoft.com/office/drawing/2016/ink" xmlns:am3d="http://schemas.microsoft.com/office/drawing/2017/model3d" xmlns:o="urn:schemas-microsoft-com:office:office" xmlns:oel="http://schemas.microsoft.com/office/2019/extlst" xmlns:r="http://schemas.openxmlformats.org/officeDocument/2006/relationships" xmlns:m="http://schemas.openxmlformats.org/officeDocument/2006/math" xmlns:v="urn:schemas-microsoft-com:vml" xmlns:wp14="http://schemas.microsoft.com/office/word/2010/wordprocessingDrawing" xmlns:wp="http://schemas.openxmlformats.org/drawingml/2006/wordprocessingDrawing" xmlns:w10="urn:schemas-microsoft-com:office:word" xmlns:w="http://schemas.openxmlformats.org/wordprocessingml/2006/main" xmlns:w14="http://schemas.microsoft.com/office/word/2010/wordml" xmlns:w15="http://schemas.microsoft.com/office/word/2012/wordml" xmlns:w16cex="http://schemas.microsoft.com/office/word/2018/wordml/cex" xmlns:w16cid="http://schemas.microsoft.com/office/word/2016/wordml/cid" xmlns:w16="http://schemas.microsoft.com/office/word/2018/wordml" xmlns:w16sdtdh="http://schemas.microsoft.com/office/word/2020/wordml/sdtdatahash" xmlns:w16se="http://schemas.microsoft.com/office/word/2015/wordml/symex" xmlns:wpg="http://schemas.microsoft.com/office/word/2010/wordprocessingGroup" xmlns:wpi="http://schemas.microsoft.com/office/word/2010/wordprocessingInk" xmlns:wne="http://schemas.microsoft.com/office/word/2006/wordml" xmlns:wps="http://schemas.microsoft.com/office/word/2010/wordprocessingShape" mc:Ignorable="w14 w15 w16se w16cid w16 w16cex w16sdtdh wp14">
   <w:body>
     <w:p>
       <w:pPr>
@@ -161,8 +161,9 @@
           <w:sz w:val="28"/>
           <w:szCs w:val="24"/>
         </w:rPr>
-        <w:t>Bryan Diego Vino Lustri</w:t>
-      </w:r>
+        <w:t xml:space="preserve">Bryan Diego Vino </w:t>
+      </w:r>
+      <w:proofErr w:type="spellStart"/>
       <w:r>
         <w:rPr>
           <w:rFonts w:ascii="Arial" w:hAnsi="Arial" w:cs="Arial"/>
@@ -171,8 +172,9 @@
           <w:sz w:val="28"/>
           <w:szCs w:val="24"/>
         </w:rPr>
-        <w:br/>
-      </w:r>
+        <w:t>Lustri</w:t>
+      </w:r>
+      <w:proofErr w:type="spellEnd"/>
       <w:r>
         <w:rPr>
           <w:rFonts w:ascii="Arial" w:hAnsi="Arial" w:cs="Arial"/>
@@ -181,7 +183,7 @@
           <w:sz w:val="28"/>
           <w:szCs w:val="24"/>
         </w:rPr>
-        <w:t>Davi Tavares Nascimento Bess</w:t>
+        <w:br/>
       </w:r>
       <w:r>
         <w:rPr>
@@ -191,7 +193,7 @@
           <w:sz w:val="28"/>
           <w:szCs w:val="24"/>
         </w:rPr>
-        <w:t>a</w:t>
+        <w:t>Davi Tavares Nascimento Bess</w:t>
       </w:r>
       <w:r>
         <w:rPr>
@@ -201,7 +203,7 @@
           <w:sz w:val="28"/>
           <w:szCs w:val="24"/>
         </w:rPr>
-        <w:br/>
+        <w:t>a</w:t>
       </w:r>
       <w:r>
         <w:rPr>
@@ -211,7 +213,7 @@
           <w:sz w:val="28"/>
           <w:szCs w:val="24"/>
         </w:rPr>
-        <w:t>Felipe Rocha Gomes</w:t>
+        <w:br/>
       </w:r>
       <w:r>
         <w:rPr>
@@ -221,7 +223,7 @@
           <w:sz w:val="28"/>
           <w:szCs w:val="24"/>
         </w:rPr>
-        <w:br/>
+        <w:t>Felipe Rocha Gomes</w:t>
       </w:r>
       <w:r>
         <w:rPr>
@@ -231,7 +233,7 @@
           <w:sz w:val="28"/>
           <w:szCs w:val="24"/>
         </w:rPr>
-        <w:t>Fernando Fiani de Pina Saraiva</w:t>
+        <w:br/>
       </w:r>
       <w:r>
         <w:rPr>
@@ -241,7 +243,7 @@
           <w:sz w:val="28"/>
           <w:szCs w:val="24"/>
         </w:rPr>
-        <w:t xml:space="preserve"> </w:t>
+        <w:t>Fernando Fiani de Pina Saraiva</w:t>
       </w:r>
       <w:r>
         <w:rPr>
@@ -251,7 +253,7 @@
           <w:sz w:val="28"/>
           <w:szCs w:val="24"/>
         </w:rPr>
-        <w:br/>
+        <w:t xml:space="preserve"> </w:t>
       </w:r>
       <w:r>
         <w:rPr>
@@ -261,7 +263,7 @@
           <w:sz w:val="28"/>
           <w:szCs w:val="24"/>
         </w:rPr>
-        <w:t>João Vitor Vale de Jesus</w:t>
+        <w:br/>
       </w:r>
       <w:r>
         <w:rPr>
@@ -271,7 +273,7 @@
           <w:sz w:val="28"/>
           <w:szCs w:val="24"/>
         </w:rPr>
-        <w:br/>
+        <w:t>João Vitor Vale de Jesus</w:t>
       </w:r>
       <w:r>
         <w:rPr>
@@ -281,115 +283,7 @@
           <w:sz w:val="28"/>
           <w:szCs w:val="24"/>
         </w:rPr>
-        <w:t xml:space="preserve">Leonardo Buso de Sousa </w:t>
-      </w:r>
-      <w:r>
-        <w:rPr>
-          <w:rFonts w:ascii="Arial" w:hAnsi="Arial" w:cs="Arial"/>
-          <w:b/>
-          <w:sz w:val="24"/>
-          <w:szCs w:val="24"/>
-        </w:rPr>
         <w:br/>
-      </w:r>
-    </w:p>
-    <w:p>
-      <w:pPr>
-        <w:spacing w:after="0" w:line="360" w:lineRule="auto"/>
-        <w:jc w:val="center"/>
-        <w:rPr>
-          <w:rFonts w:ascii="Arial" w:hAnsi="Arial" w:cs="Arial"/>
-          <w:b/>
-          <w:sz w:val="24"/>
-          <w:szCs w:val="24"/>
-        </w:rPr>
-      </w:pPr>
-    </w:p>
-    <w:p>
-      <w:pPr>
-        <w:spacing w:after="0" w:line="360" w:lineRule="auto"/>
-        <w:jc w:val="center"/>
-        <w:rPr>
-          <w:rFonts w:ascii="Arial" w:hAnsi="Arial" w:cs="Arial"/>
-          <w:b/>
-          <w:sz w:val="24"/>
-          <w:szCs w:val="24"/>
-        </w:rPr>
-      </w:pPr>
-    </w:p>
-    <w:p>
-      <w:pPr>
-        <w:spacing w:after="0" w:line="360" w:lineRule="auto"/>
-        <w:jc w:val="center"/>
-        <w:rPr>
-          <w:rFonts w:ascii="Arial" w:hAnsi="Arial" w:cs="Arial"/>
-          <w:b/>
-          <w:sz w:val="24"/>
-          <w:szCs w:val="24"/>
-        </w:rPr>
-      </w:pPr>
-    </w:p>
-    <w:p>
-      <w:pPr>
-        <w:spacing w:after="0" w:line="360" w:lineRule="auto"/>
-        <w:jc w:val="center"/>
-        <w:rPr>
-          <w:rFonts w:ascii="Arial" w:hAnsi="Arial" w:cs="Arial"/>
-          <w:b/>
-          <w:sz w:val="24"/>
-          <w:szCs w:val="24"/>
-        </w:rPr>
-      </w:pPr>
-    </w:p>
-    <w:p>
-      <w:pPr>
-        <w:spacing w:after="0" w:line="360" w:lineRule="auto"/>
-        <w:jc w:val="center"/>
-        <w:rPr>
-          <w:rFonts w:ascii="Arial" w:hAnsi="Arial" w:cs="Arial"/>
-          <w:b/>
-          <w:sz w:val="24"/>
-          <w:szCs w:val="24"/>
-        </w:rPr>
-      </w:pPr>
-    </w:p>
-    <w:p>
-      <w:pPr>
-        <w:spacing w:after="0" w:line="360" w:lineRule="auto"/>
-        <w:jc w:val="center"/>
-        <w:rPr>
-          <w:rFonts w:ascii="Arial" w:hAnsi="Arial" w:cs="Arial"/>
-          <w:b/>
-          <w:sz w:val="28"/>
-          <w:szCs w:val="24"/>
-        </w:rPr>
-      </w:pPr>
-      <w:r>
-        <w:rPr>
-          <w:rFonts w:ascii="Arial" w:hAnsi="Arial" w:cs="Arial"/>
-          <w:b/>
-          <w:sz w:val="28"/>
-          <w:szCs w:val="24"/>
-        </w:rPr>
-        <w:t xml:space="preserve">TEA </w:t>
-      </w:r>
-      <w:r>
-        <w:rPr>
-          <w:rFonts w:ascii="Arial" w:hAnsi="Arial" w:cs="Arial"/>
-          <w:b/>
-          <w:sz w:val="28"/>
-          <w:szCs w:val="24"/>
-        </w:rPr>
-        <w:t>LEARN</w:t>
-      </w:r>
-      <w:r>
-        <w:rPr>
-          <w:rFonts w:ascii="Arial" w:hAnsi="Arial" w:cs="Arial"/>
-          <w:b/>
-          <w:sz w:val="28"/>
-          <w:szCs w:val="24"/>
-        </w:rPr>
-        <w:t xml:space="preserve">: </w:t>
       </w:r>
       <w:r>
         <w:rPr>
@@ -399,8 +293,9 @@
           <w:sz w:val="28"/>
           <w:szCs w:val="24"/>
         </w:rPr>
-        <w:t>platafo</w:t>
-      </w:r>
+        <w:t xml:space="preserve">Leonardo </w:t>
+      </w:r>
+      <w:proofErr w:type="spellStart"/>
       <w:r>
         <w:rPr>
           <w:rFonts w:ascii="Arial" w:hAnsi="Arial" w:cs="Arial"/>
@@ -409,82 +304,10 @@
           <w:sz w:val="28"/>
           <w:szCs w:val="24"/>
         </w:rPr>
-        <w:t>rma de adaptação didática com IA para alunos com TEA</w:t>
-      </w:r>
-    </w:p>
-    <w:p>
-      <w:pPr>
-        <w:spacing w:after="0" w:line="360" w:lineRule="auto"/>
-        <w:jc w:val="center"/>
-        <w:rPr>
-          <w:rFonts w:ascii="Arial" w:hAnsi="Arial" w:cs="Arial"/>
-          <w:sz w:val="24"/>
-          <w:szCs w:val="24"/>
-        </w:rPr>
-      </w:pPr>
-    </w:p>
-    <w:p>
-      <w:pPr>
-        <w:spacing w:after="0" w:line="360" w:lineRule="auto"/>
-        <w:jc w:val="center"/>
-        <w:rPr>
-          <w:rFonts w:ascii="Arial" w:hAnsi="Arial" w:cs="Arial"/>
-          <w:sz w:val="24"/>
-          <w:szCs w:val="24"/>
-        </w:rPr>
-      </w:pPr>
-    </w:p>
-    <w:p>
-      <w:pPr>
-        <w:spacing w:after="0" w:line="360" w:lineRule="auto"/>
-        <w:jc w:val="center"/>
-        <w:rPr>
-          <w:rFonts w:ascii="Arial" w:hAnsi="Arial" w:cs="Arial"/>
-          <w:sz w:val="24"/>
-          <w:szCs w:val="24"/>
-        </w:rPr>
-      </w:pPr>
-    </w:p>
-    <w:p>
-      <w:pPr>
-        <w:spacing w:after="0" w:line="360" w:lineRule="auto"/>
-        <w:jc w:val="center"/>
-        <w:rPr>
-          <w:rFonts w:ascii="Arial" w:hAnsi="Arial" w:cs="Arial"/>
-          <w:b/>
-          <w:sz w:val="24"/>
-          <w:szCs w:val="24"/>
-        </w:rPr>
-      </w:pPr>
-    </w:p>
-    <w:p>
-      <w:pPr>
-        <w:spacing w:after="0" w:line="360" w:lineRule="auto"/>
-        <w:jc w:val="center"/>
-        <w:rPr>
-          <w:rFonts w:ascii="Arial" w:hAnsi="Arial" w:cs="Arial"/>
-          <w:b/>
-          <w:sz w:val="24"/>
-          <w:szCs w:val="24"/>
-        </w:rPr>
-      </w:pPr>
-    </w:p>
-    <w:p>
-      <w:pPr>
-        <w:spacing w:after="0" w:line="360" w:lineRule="auto"/>
-        <w:jc w:val="center"/>
-        <w:rPr>
-          <w:rFonts w:ascii="Arial" w:hAnsi="Arial" w:cs="Arial"/>
-          <w:b/>
-          <w:sz w:val="24"/>
-          <w:szCs w:val="24"/>
-        </w:rPr>
-      </w:pPr>
-    </w:p>
-    <w:p>
-      <w:pPr>
-        <w:spacing w:after="0" w:line="360" w:lineRule="auto"/>
-        <w:jc w:val="center"/>
+        <w:t>Buso</w:t>
+      </w:r>
+      <w:proofErr w:type="spellEnd"/>
+      <w:r>
         <w:rPr>
           <w:rFonts w:ascii="Arial" w:hAnsi="Arial" w:cs="Arial"/>
           <w:b/>
@@ -492,7 +315,116 @@
           <w:sz w:val="28"/>
           <w:szCs w:val="24"/>
         </w:rPr>
-      </w:pPr>
+        <w:t xml:space="preserve"> de Sousa </w:t>
+      </w:r>
+      <w:r>
+        <w:rPr>
+          <w:rFonts w:ascii="Arial" w:hAnsi="Arial" w:cs="Arial"/>
+          <w:b/>
+          <w:sz w:val="24"/>
+          <w:szCs w:val="24"/>
+        </w:rPr>
+        <w:br/>
+      </w:r>
+    </w:p>
+    <w:p>
+      <w:pPr>
+        <w:spacing w:after="0" w:line="360" w:lineRule="auto"/>
+        <w:jc w:val="center"/>
+        <w:rPr>
+          <w:rFonts w:ascii="Arial" w:hAnsi="Arial" w:cs="Arial"/>
+          <w:b/>
+          <w:sz w:val="24"/>
+          <w:szCs w:val="24"/>
+        </w:rPr>
+      </w:pPr>
+    </w:p>
+    <w:p>
+      <w:pPr>
+        <w:spacing w:after="0" w:line="360" w:lineRule="auto"/>
+        <w:jc w:val="center"/>
+        <w:rPr>
+          <w:rFonts w:ascii="Arial" w:hAnsi="Arial" w:cs="Arial"/>
+          <w:b/>
+          <w:sz w:val="24"/>
+          <w:szCs w:val="24"/>
+        </w:rPr>
+      </w:pPr>
+    </w:p>
+    <w:p>
+      <w:pPr>
+        <w:spacing w:after="0" w:line="360" w:lineRule="auto"/>
+        <w:jc w:val="center"/>
+        <w:rPr>
+          <w:rFonts w:ascii="Arial" w:hAnsi="Arial" w:cs="Arial"/>
+          <w:b/>
+          <w:sz w:val="24"/>
+          <w:szCs w:val="24"/>
+        </w:rPr>
+      </w:pPr>
+    </w:p>
+    <w:p>
+      <w:pPr>
+        <w:spacing w:after="0" w:line="360" w:lineRule="auto"/>
+        <w:jc w:val="center"/>
+        <w:rPr>
+          <w:rFonts w:ascii="Arial" w:hAnsi="Arial" w:cs="Arial"/>
+          <w:b/>
+          <w:sz w:val="24"/>
+          <w:szCs w:val="24"/>
+        </w:rPr>
+      </w:pPr>
+    </w:p>
+    <w:p>
+      <w:pPr>
+        <w:spacing w:after="0" w:line="360" w:lineRule="auto"/>
+        <w:jc w:val="center"/>
+        <w:rPr>
+          <w:rFonts w:ascii="Arial" w:hAnsi="Arial" w:cs="Arial"/>
+          <w:b/>
+          <w:sz w:val="24"/>
+          <w:szCs w:val="24"/>
+        </w:rPr>
+      </w:pPr>
+    </w:p>
+    <w:p>
+      <w:pPr>
+        <w:spacing w:after="0" w:line="360" w:lineRule="auto"/>
+        <w:jc w:val="center"/>
+        <w:rPr>
+          <w:rFonts w:ascii="Arial" w:hAnsi="Arial" w:cs="Arial"/>
+          <w:b/>
+          <w:sz w:val="28"/>
+          <w:szCs w:val="24"/>
+        </w:rPr>
+      </w:pPr>
+      <w:r>
+        <w:rPr>
+          <w:rFonts w:ascii="Arial" w:hAnsi="Arial" w:cs="Arial"/>
+          <w:b/>
+          <w:sz w:val="28"/>
+          <w:szCs w:val="24"/>
+        </w:rPr>
+        <w:t xml:space="preserve">TEA </w:t>
+      </w:r>
+      <w:r>
+        <w:rPr>
+          <w:rFonts w:ascii="Arial" w:hAnsi="Arial" w:cs="Arial"/>
+          <w:b/>
+          <w:sz w:val="28"/>
+          <w:szCs w:val="24"/>
+        </w:rPr>
+        <w:t>LEARN</w:t>
+      </w:r>
+      <w:r>
+        <w:rPr>
+          <w:rFonts w:ascii="Arial" w:hAnsi="Arial" w:cs="Arial"/>
+          <w:b/>
+          <w:sz w:val="28"/>
+          <w:szCs w:val="24"/>
+        </w:rPr>
+        <w:t xml:space="preserve">: </w:t>
+      </w:r>
       <w:r>
         <w:rPr>
           <w:rFonts w:ascii="Arial" w:hAnsi="Arial" w:cs="Arial"/>
@@ -501,7 +433,7 @@
           <w:sz w:val="28"/>
           <w:szCs w:val="24"/>
         </w:rPr>
-        <w:t>S</w:t>
+        <w:t>platafo</w:t>
       </w:r>
       <w:r>
         <w:rPr>
@@ -511,8 +443,77 @@
           <w:sz w:val="28"/>
           <w:szCs w:val="24"/>
         </w:rPr>
-        <w:t>ão Paulo</w:t>
-      </w:r>
+        <w:t>rma de adaptação didática com IA para alunos com TEA</w:t>
+      </w:r>
+    </w:p>
+    <w:p>
+      <w:pPr>
+        <w:spacing w:after="0" w:line="360" w:lineRule="auto"/>
+        <w:jc w:val="center"/>
+        <w:rPr>
+          <w:rFonts w:ascii="Arial" w:hAnsi="Arial" w:cs="Arial"/>
+          <w:sz w:val="24"/>
+          <w:szCs w:val="24"/>
+        </w:rPr>
+      </w:pPr>
+    </w:p>
+    <w:p>
+      <w:pPr>
+        <w:spacing w:after="0" w:line="360" w:lineRule="auto"/>
+        <w:jc w:val="center"/>
+        <w:rPr>
+          <w:rFonts w:ascii="Arial" w:hAnsi="Arial" w:cs="Arial"/>
+          <w:sz w:val="24"/>
+          <w:szCs w:val="24"/>
+        </w:rPr>
+      </w:pPr>
+    </w:p>
+    <w:p>
+      <w:pPr>
+        <w:spacing w:after="0" w:line="360" w:lineRule="auto"/>
+        <w:jc w:val="center"/>
+        <w:rPr>
+          <w:rFonts w:ascii="Arial" w:hAnsi="Arial" w:cs="Arial"/>
+          <w:sz w:val="24"/>
+          <w:szCs w:val="24"/>
+        </w:rPr>
+      </w:pPr>
+    </w:p>
+    <w:p>
+      <w:pPr>
+        <w:spacing w:after="0" w:line="360" w:lineRule="auto"/>
+        <w:jc w:val="center"/>
+        <w:rPr>
+          <w:rFonts w:ascii="Arial" w:hAnsi="Arial" w:cs="Arial"/>
+          <w:b/>
+          <w:sz w:val="24"/>
+          <w:szCs w:val="24"/>
+        </w:rPr>
+      </w:pPr>
+    </w:p>
+    <w:p>
+      <w:pPr>
+        <w:spacing w:after="0" w:line="360" w:lineRule="auto"/>
+        <w:jc w:val="center"/>
+        <w:rPr>
+          <w:rFonts w:ascii="Arial" w:hAnsi="Arial" w:cs="Arial"/>
+          <w:b/>
+          <w:sz w:val="24"/>
+          <w:szCs w:val="24"/>
+        </w:rPr>
+      </w:pPr>
+    </w:p>
+    <w:p>
+      <w:pPr>
+        <w:spacing w:after="0" w:line="360" w:lineRule="auto"/>
+        <w:jc w:val="center"/>
+        <w:rPr>
+          <w:rFonts w:ascii="Arial" w:hAnsi="Arial" w:cs="Arial"/>
+          <w:b/>
+          <w:sz w:val="24"/>
+          <w:szCs w:val="24"/>
+        </w:rPr>
+      </w:pPr>
     </w:p>
     <w:p>
       <w:pPr>
@@ -534,13 +535,9 @@
           <w:sz w:val="28"/>
           <w:szCs w:val="24"/>
         </w:rPr>
-        <w:t>2026</w:t>
-      </w:r>
-    </w:p>
-    <w:p>
-      <w:pPr>
-        <w:spacing w:after="0" w:line="360" w:lineRule="auto"/>
-        <w:jc w:val="center"/>
+        <w:t>S</w:t>
+      </w:r>
+      <w:r>
         <w:rPr>
           <w:rFonts w:ascii="Arial" w:hAnsi="Arial" w:cs="Arial"/>
           <w:b/>
@@ -548,8 +545,13 @@
           <w:sz w:val="28"/>
           <w:szCs w:val="24"/>
         </w:rPr>
-      </w:pPr>
-      <w:r>
+        <w:t>ão Paulo</w:t>
+      </w:r>
+    </w:p>
+    <w:p>
+      <w:pPr>
+        <w:spacing w:after="0" w:line="360" w:lineRule="auto"/>
+        <w:jc w:val="center"/>
         <w:rPr>
           <w:rFonts w:ascii="Arial" w:hAnsi="Arial" w:cs="Arial"/>
           <w:b/>
@@ -557,9 +559,7 @@
           <w:sz w:val="28"/>
           <w:szCs w:val="24"/>
         </w:rPr>
-        <w:lastRenderedPageBreak/>
-        <w:t>Bryan Diego Vino Lustri</w:t>
-      </w:r>
+      </w:pPr>
       <w:r>
         <w:rPr>
           <w:rFonts w:ascii="Arial" w:hAnsi="Arial" w:cs="Arial"/>
@@ -568,6 +568,52 @@
           <w:sz w:val="28"/>
           <w:szCs w:val="24"/>
         </w:rPr>
+        <w:t>2026</w:t>
+      </w:r>
+    </w:p>
+    <w:p>
+      <w:pPr>
+        <w:spacing w:after="0" w:line="360" w:lineRule="auto"/>
+        <w:jc w:val="center"/>
+        <w:rPr>
+          <w:rFonts w:ascii="Arial" w:hAnsi="Arial" w:cs="Arial"/>
+          <w:b/>
+          <w:bCs/>
+          <w:sz w:val="28"/>
+          <w:szCs w:val="24"/>
+        </w:rPr>
+      </w:pPr>
+      <w:r>
+        <w:rPr>
+          <w:rFonts w:ascii="Arial" w:hAnsi="Arial" w:cs="Arial"/>
+          <w:b/>
+          <w:bCs/>
+          <w:sz w:val="28"/>
+          <w:szCs w:val="24"/>
+        </w:rPr>
+        <w:lastRenderedPageBreak/>
+        <w:t xml:space="preserve">Bryan Diego Vino </w:t>
+      </w:r>
+      <w:proofErr w:type="spellStart"/>
+      <w:r>
+        <w:rPr>
+          <w:rFonts w:ascii="Arial" w:hAnsi="Arial" w:cs="Arial"/>
+          <w:b/>
+          <w:bCs/>
+          <w:sz w:val="28"/>
+          <w:szCs w:val="24"/>
+        </w:rPr>
+        <w:t>Lustri</w:t>
+      </w:r>
+      <w:proofErr w:type="spellEnd"/>
+      <w:r>
+        <w:rPr>
+          <w:rFonts w:ascii="Arial" w:hAnsi="Arial" w:cs="Arial"/>
+          <w:b/>
+          <w:bCs/>
+          <w:sz w:val="28"/>
+          <w:szCs w:val="24"/>
+        </w:rPr>
         <w:br/>
         <w:t>Davi Tavares Nascimento Bessa</w:t>
       </w:r>
@@ -613,7 +659,29 @@
           <w:szCs w:val="24"/>
         </w:rPr>
         <w:br/>
-        <w:t>Leonardo Buso de Sousa</w:t>
+        <w:t xml:space="preserve">Leonardo </w:t>
+      </w:r>
+      <w:proofErr w:type="spellStart"/>
+      <w:r>
+        <w:rPr>
+          <w:rFonts w:ascii="Arial" w:hAnsi="Arial" w:cs="Arial"/>
+          <w:b/>
+          <w:bCs/>
+          <w:sz w:val="28"/>
+          <w:szCs w:val="24"/>
+        </w:rPr>
+        <w:t>Buso</w:t>
+      </w:r>
+      <w:proofErr w:type="spellEnd"/>
+      <w:r>
+        <w:rPr>
+          <w:rFonts w:ascii="Arial" w:hAnsi="Arial" w:cs="Arial"/>
+          <w:b/>
+          <w:bCs/>
+          <w:sz w:val="28"/>
+          <w:szCs w:val="24"/>
+        </w:rPr>
+        <w:t xml:space="preserve"> de Sousa</w:t>
       </w:r>
     </w:p>
     <w:p>
@@ -1023,17 +1091,6 @@
     <w:p>
       <w:pPr>
         <w:spacing w:after="0" w:line="360" w:lineRule="auto"/>
-        <w:jc w:val="center"/>
-        <w:rPr>
-          <w:rFonts w:ascii="Arial" w:hAnsi="Arial" w:cs="Arial"/>
-          <w:sz w:val="24"/>
-          <w:szCs w:val="24"/>
-        </w:rPr>
-      </w:pPr>
-    </w:p>
-    <w:p>
-      <w:pPr>
-        <w:spacing w:after="0" w:line="360" w:lineRule="auto"/>
         <w:jc w:val="both"/>
         <w:rPr>
           <w:rFonts w:ascii="Arial" w:hAnsi="Arial" w:cs="Arial"/>
@@ -1047,7 +1104,49 @@
           <w:sz w:val="24"/>
           <w:szCs w:val="24"/>
         </w:rPr>
-        <w:t>Lorem ipsum dolor sit amet, consectetur adipiscing elit. Etiam eget ligula eu lectus lobortis condimentum. Aliquam nonummy auctor massa. Pellentesque habitant morbi tristique senectus et netus et malesuada fames ac turpis egestas. Nulla at risus. Quisque purus magna, auctor et, sagittis ac, posuere eu, lectus. Nam mattis, felis ut adipiscing.</w:t>
+        <w:t xml:space="preserve">O presente trabalho de conclusão de curso, propõe uma análise sobre as dificuldades enfrentadas pelos professores da ETEC Professor Camargo Aranha ao tentarem dar aula para com Transtorno do Espectro Autista, verbais e com foco primeiramente no nível 1. No âmbito de uma pesquisa qualitativa, foi investigado e concretizado, por meio de entrevistas individuais com os mesmos, quais eram os principais entraves, sendo eles: a criação de materiais adaptados, garantir o entendimento desses alunos sobre a matéria, lidar com certas situações em sala de aula e aplicar avaliações para eles. A partir desses problemas, o TEA </w:t>
+      </w:r>
+      <w:proofErr w:type="spellStart"/>
+      <w:r>
+        <w:rPr>
+          <w:rFonts w:ascii="Arial" w:hAnsi="Arial" w:cs="Arial"/>
+          <w:sz w:val="24"/>
+          <w:szCs w:val="24"/>
+        </w:rPr>
+        <w:t>Learn</w:t>
+      </w:r>
+      <w:proofErr w:type="spellEnd"/>
+      <w:r>
+        <w:rPr>
+          <w:rFonts w:ascii="Arial" w:hAnsi="Arial" w:cs="Arial"/>
+          <w:sz w:val="24"/>
+          <w:szCs w:val="24"/>
+        </w:rPr>
+        <w:t xml:space="preserve"> foi criad</w:t>
+      </w:r>
+      <w:r>
+        <w:rPr>
+          <w:rFonts w:ascii="Arial" w:hAnsi="Arial" w:cs="Arial"/>
+          <w:sz w:val="24"/>
+          <w:szCs w:val="24"/>
+        </w:rPr>
+        <w:t>o</w:t>
+      </w:r>
+      <w:r>
+        <w:rPr>
+          <w:rFonts w:ascii="Arial" w:hAnsi="Arial" w:cs="Arial"/>
+          <w:sz w:val="24"/>
+          <w:szCs w:val="24"/>
+        </w:rPr>
+        <w:t xml:space="preserve"> com o objetivo de tentar amenizar esses entraves e ajudar esses lecionadores</w:t>
+      </w:r>
+      <w:r>
+        <w:rPr>
+          <w:rFonts w:ascii="Arial" w:hAnsi="Arial" w:cs="Arial"/>
+          <w:sz w:val="24"/>
+          <w:szCs w:val="24"/>
+        </w:rPr>
+        <w:t xml:space="preserve"> utilizando a IA aplicado a isso.</w:t>
       </w:r>
     </w:p>
     <w:p>
@@ -1075,330 +1174,366 @@
           <w:sz w:val="24"/>
           <w:szCs w:val="24"/>
         </w:rPr>
-        <w:t xml:space="preserve"> Palavra Chave 1. Palavra Chave 2. Palavra Chave 3.</w:t>
-      </w:r>
-    </w:p>
-    <w:p>
-      <w:pPr>
-        <w:spacing w:after="0" w:line="360" w:lineRule="auto"/>
-        <w:jc w:val="center"/>
-        <w:rPr>
-          <w:rFonts w:ascii="Arial" w:hAnsi="Arial" w:cs="Arial"/>
-          <w:sz w:val="24"/>
-          <w:szCs w:val="24"/>
-        </w:rPr>
-      </w:pPr>
-    </w:p>
-    <w:p>
-      <w:pPr>
-        <w:spacing w:after="0" w:line="360" w:lineRule="auto"/>
-        <w:jc w:val="center"/>
-        <w:rPr>
-          <w:rFonts w:ascii="Arial" w:hAnsi="Arial" w:cs="Arial"/>
-          <w:sz w:val="24"/>
-          <w:szCs w:val="24"/>
-        </w:rPr>
-      </w:pPr>
-    </w:p>
-    <w:p>
-      <w:pPr>
-        <w:spacing w:after="0" w:line="360" w:lineRule="auto"/>
-        <w:jc w:val="center"/>
-        <w:rPr>
-          <w:rFonts w:ascii="Arial" w:hAnsi="Arial" w:cs="Arial"/>
-          <w:sz w:val="24"/>
-          <w:szCs w:val="24"/>
-        </w:rPr>
-      </w:pPr>
-    </w:p>
-    <w:p>
-      <w:pPr>
-        <w:spacing w:after="0" w:line="360" w:lineRule="auto"/>
-        <w:jc w:val="center"/>
-        <w:rPr>
-          <w:rFonts w:ascii="Arial" w:hAnsi="Arial" w:cs="Arial"/>
-          <w:sz w:val="24"/>
-          <w:szCs w:val="24"/>
-        </w:rPr>
-      </w:pPr>
-    </w:p>
-    <w:p>
-      <w:pPr>
-        <w:spacing w:after="0" w:line="360" w:lineRule="auto"/>
-        <w:jc w:val="center"/>
-        <w:rPr>
-          <w:rFonts w:ascii="Arial" w:hAnsi="Arial" w:cs="Arial"/>
-          <w:sz w:val="24"/>
-          <w:szCs w:val="24"/>
-        </w:rPr>
-      </w:pPr>
-    </w:p>
-    <w:p>
-      <w:pPr>
-        <w:spacing w:after="0" w:line="360" w:lineRule="auto"/>
-        <w:jc w:val="center"/>
-        <w:rPr>
-          <w:rFonts w:ascii="Arial" w:hAnsi="Arial" w:cs="Arial"/>
-          <w:sz w:val="24"/>
-          <w:szCs w:val="24"/>
-        </w:rPr>
-      </w:pPr>
-    </w:p>
-    <w:p>
-      <w:pPr>
-        <w:spacing w:after="0" w:line="360" w:lineRule="auto"/>
-        <w:jc w:val="center"/>
-        <w:rPr>
-          <w:rFonts w:ascii="Arial" w:hAnsi="Arial" w:cs="Arial"/>
-          <w:sz w:val="24"/>
-          <w:szCs w:val="24"/>
-        </w:rPr>
-      </w:pPr>
-    </w:p>
-    <w:p>
-      <w:pPr>
-        <w:spacing w:after="0" w:line="360" w:lineRule="auto"/>
-        <w:jc w:val="center"/>
-        <w:rPr>
-          <w:rFonts w:ascii="Arial" w:hAnsi="Arial" w:cs="Arial"/>
-          <w:sz w:val="24"/>
-          <w:szCs w:val="24"/>
-        </w:rPr>
-      </w:pPr>
-    </w:p>
-    <w:p>
-      <w:pPr>
-        <w:spacing w:after="0" w:line="360" w:lineRule="auto"/>
-        <w:jc w:val="center"/>
-        <w:rPr>
-          <w:rFonts w:ascii="Arial" w:hAnsi="Arial" w:cs="Arial"/>
-          <w:sz w:val="24"/>
-          <w:szCs w:val="24"/>
-        </w:rPr>
-      </w:pPr>
-    </w:p>
-    <w:p>
-      <w:pPr>
-        <w:spacing w:after="0" w:line="360" w:lineRule="auto"/>
-        <w:jc w:val="center"/>
-        <w:rPr>
-          <w:rFonts w:ascii="Arial" w:hAnsi="Arial" w:cs="Arial"/>
-          <w:sz w:val="24"/>
-          <w:szCs w:val="24"/>
-        </w:rPr>
-      </w:pPr>
-    </w:p>
-    <w:p>
-      <w:pPr>
-        <w:spacing w:after="0" w:line="360" w:lineRule="auto"/>
-        <w:jc w:val="center"/>
-        <w:rPr>
-          <w:rFonts w:ascii="Arial" w:hAnsi="Arial" w:cs="Arial"/>
-          <w:sz w:val="24"/>
-          <w:szCs w:val="24"/>
-        </w:rPr>
-      </w:pPr>
-    </w:p>
-    <w:p>
-      <w:pPr>
-        <w:spacing w:after="0" w:line="360" w:lineRule="auto"/>
-        <w:jc w:val="center"/>
-        <w:rPr>
-          <w:rFonts w:ascii="Arial" w:hAnsi="Arial" w:cs="Arial"/>
-          <w:sz w:val="24"/>
-          <w:szCs w:val="24"/>
-        </w:rPr>
-      </w:pPr>
-    </w:p>
-    <w:p>
-      <w:pPr>
-        <w:spacing w:after="0" w:line="360" w:lineRule="auto"/>
-        <w:jc w:val="center"/>
-        <w:rPr>
-          <w:rFonts w:ascii="Arial" w:hAnsi="Arial" w:cs="Arial"/>
-          <w:sz w:val="24"/>
-          <w:szCs w:val="24"/>
-        </w:rPr>
-      </w:pPr>
-    </w:p>
-    <w:p>
-      <w:pPr>
-        <w:spacing w:after="0" w:line="360" w:lineRule="auto"/>
-        <w:jc w:val="center"/>
-        <w:rPr>
-          <w:rFonts w:ascii="Arial" w:hAnsi="Arial" w:cs="Arial"/>
-          <w:sz w:val="24"/>
-          <w:szCs w:val="24"/>
-        </w:rPr>
-      </w:pPr>
-    </w:p>
-    <w:p>
-      <w:pPr>
-        <w:spacing w:after="0" w:line="360" w:lineRule="auto"/>
-        <w:jc w:val="center"/>
-        <w:rPr>
-          <w:rFonts w:ascii="Arial" w:hAnsi="Arial" w:cs="Arial"/>
-          <w:sz w:val="24"/>
-          <w:szCs w:val="24"/>
-        </w:rPr>
-      </w:pPr>
-    </w:p>
-    <w:p>
-      <w:pPr>
-        <w:spacing w:after="0" w:line="360" w:lineRule="auto"/>
-        <w:jc w:val="center"/>
-        <w:rPr>
-          <w:rFonts w:ascii="Arial" w:hAnsi="Arial" w:cs="Arial"/>
-          <w:sz w:val="24"/>
-          <w:szCs w:val="24"/>
-        </w:rPr>
-      </w:pPr>
-    </w:p>
-    <w:p>
-      <w:pPr>
-        <w:spacing w:after="0" w:line="360" w:lineRule="auto"/>
-        <w:jc w:val="center"/>
-        <w:rPr>
-          <w:rFonts w:ascii="Arial" w:hAnsi="Arial" w:cs="Arial"/>
-          <w:sz w:val="24"/>
-          <w:szCs w:val="24"/>
-        </w:rPr>
-      </w:pPr>
-    </w:p>
-    <w:p>
-      <w:pPr>
-        <w:spacing w:after="0" w:line="360" w:lineRule="auto"/>
-        <w:jc w:val="center"/>
-        <w:rPr>
-          <w:rFonts w:ascii="Arial" w:hAnsi="Arial" w:cs="Arial"/>
-          <w:sz w:val="24"/>
-          <w:szCs w:val="24"/>
-        </w:rPr>
-      </w:pPr>
-    </w:p>
-    <w:p>
-      <w:pPr>
-        <w:spacing w:after="0" w:line="360" w:lineRule="auto"/>
-        <w:jc w:val="center"/>
-        <w:rPr>
-          <w:rFonts w:ascii="Arial" w:hAnsi="Arial" w:cs="Arial"/>
-          <w:sz w:val="24"/>
-          <w:szCs w:val="24"/>
-        </w:rPr>
-      </w:pPr>
-    </w:p>
-    <w:p>
-      <w:pPr>
-        <w:spacing w:after="0" w:line="360" w:lineRule="auto"/>
-        <w:jc w:val="center"/>
-        <w:rPr>
-          <w:rFonts w:ascii="Arial" w:hAnsi="Arial" w:cs="Arial"/>
-          <w:sz w:val="24"/>
-          <w:szCs w:val="24"/>
-        </w:rPr>
-      </w:pPr>
-    </w:p>
-    <w:p>
-      <w:pPr>
-        <w:spacing w:after="0" w:line="360" w:lineRule="auto"/>
-        <w:jc w:val="center"/>
-        <w:rPr>
-          <w:rFonts w:ascii="Arial" w:hAnsi="Arial" w:cs="Arial"/>
-          <w:sz w:val="24"/>
-          <w:szCs w:val="24"/>
-        </w:rPr>
-      </w:pPr>
-    </w:p>
-    <w:p>
-      <w:pPr>
-        <w:spacing w:after="0" w:line="360" w:lineRule="auto"/>
-        <w:jc w:val="center"/>
-        <w:rPr>
-          <w:rFonts w:ascii="Arial" w:hAnsi="Arial" w:cs="Arial"/>
-          <w:sz w:val="24"/>
-          <w:szCs w:val="24"/>
-        </w:rPr>
-      </w:pPr>
-    </w:p>
-    <w:p>
-      <w:pPr>
-        <w:spacing w:after="0" w:line="360" w:lineRule="auto"/>
-        <w:jc w:val="center"/>
-        <w:rPr>
-          <w:rFonts w:ascii="Arial" w:hAnsi="Arial" w:cs="Arial"/>
-          <w:sz w:val="24"/>
-          <w:szCs w:val="24"/>
-        </w:rPr>
-      </w:pPr>
-    </w:p>
-    <w:p>
-      <w:pPr>
-        <w:spacing w:after="0" w:line="360" w:lineRule="auto"/>
-        <w:jc w:val="center"/>
-        <w:rPr>
-          <w:rFonts w:ascii="Arial" w:hAnsi="Arial" w:cs="Arial"/>
-          <w:sz w:val="24"/>
-          <w:szCs w:val="24"/>
-        </w:rPr>
-      </w:pPr>
-    </w:p>
-    <w:p>
-      <w:pPr>
-        <w:spacing w:after="0" w:line="360" w:lineRule="auto"/>
-        <w:jc w:val="center"/>
-        <w:rPr>
-          <w:rFonts w:ascii="Arial" w:hAnsi="Arial" w:cs="Arial"/>
-          <w:sz w:val="24"/>
-          <w:szCs w:val="24"/>
-        </w:rPr>
-      </w:pPr>
-    </w:p>
-    <w:p>
-      <w:pPr>
-        <w:spacing w:after="0" w:line="360" w:lineRule="auto"/>
-        <w:jc w:val="center"/>
-        <w:rPr>
-          <w:rFonts w:ascii="Arial" w:hAnsi="Arial" w:cs="Arial"/>
-          <w:sz w:val="24"/>
-          <w:szCs w:val="24"/>
-        </w:rPr>
-      </w:pPr>
-    </w:p>
-    <w:p>
-      <w:pPr>
-        <w:spacing w:after="0" w:line="360" w:lineRule="auto"/>
-        <w:rPr>
-          <w:rFonts w:ascii="Arial" w:hAnsi="Arial" w:cs="Arial"/>
-          <w:b/>
-          <w:sz w:val="24"/>
-          <w:szCs w:val="24"/>
-        </w:rPr>
-      </w:pPr>
-      <w:r>
-        <w:rPr>
-          <w:rFonts w:ascii="Arial" w:hAnsi="Arial" w:cs="Arial"/>
-          <w:b/>
-          <w:sz w:val="24"/>
-          <w:szCs w:val="24"/>
-        </w:rPr>
-        <w:lastRenderedPageBreak/>
+        <w:t xml:space="preserve"> </w:t>
+      </w:r>
+      <w:r>
+        <w:rPr>
+          <w:rFonts w:ascii="Arial" w:hAnsi="Arial" w:cs="Arial"/>
+          <w:sz w:val="24"/>
+          <w:szCs w:val="24"/>
+        </w:rPr>
+        <w:t>Materiais adaptados</w:t>
+      </w:r>
+      <w:r>
+        <w:rPr>
+          <w:rFonts w:ascii="Arial" w:hAnsi="Arial" w:cs="Arial"/>
+          <w:sz w:val="24"/>
+          <w:szCs w:val="24"/>
+        </w:rPr>
+        <w:t xml:space="preserve">. </w:t>
+      </w:r>
+      <w:r>
+        <w:rPr>
+          <w:rFonts w:ascii="Arial" w:hAnsi="Arial" w:cs="Arial"/>
+          <w:sz w:val="24"/>
+          <w:szCs w:val="24"/>
+        </w:rPr>
+        <w:t>Inteligência Artificial</w:t>
+      </w:r>
+      <w:r>
+        <w:rPr>
+          <w:rFonts w:ascii="Arial" w:hAnsi="Arial" w:cs="Arial"/>
+          <w:sz w:val="24"/>
+          <w:szCs w:val="24"/>
+        </w:rPr>
+        <w:t>.</w:t>
+      </w:r>
+      <w:r>
+        <w:rPr>
+          <w:rFonts w:ascii="Arial" w:hAnsi="Arial" w:cs="Arial"/>
+          <w:sz w:val="24"/>
+          <w:szCs w:val="24"/>
+        </w:rPr>
+        <w:t xml:space="preserve"> Inclusão</w:t>
+      </w:r>
+      <w:r>
+        <w:rPr>
+          <w:rFonts w:ascii="Arial" w:hAnsi="Arial" w:cs="Arial"/>
+          <w:sz w:val="24"/>
+          <w:szCs w:val="24"/>
+        </w:rPr>
+        <w:t>.</w:t>
+      </w:r>
+    </w:p>
+    <w:p>
+      <w:pPr>
+        <w:spacing w:after="0" w:line="360" w:lineRule="auto"/>
+        <w:jc w:val="center"/>
+        <w:rPr>
+          <w:rFonts w:ascii="Arial" w:hAnsi="Arial" w:cs="Arial"/>
+          <w:sz w:val="24"/>
+          <w:szCs w:val="24"/>
+        </w:rPr>
+      </w:pPr>
+    </w:p>
+    <w:p>
+      <w:pPr>
+        <w:spacing w:after="0" w:line="360" w:lineRule="auto"/>
+        <w:jc w:val="center"/>
+        <w:rPr>
+          <w:rFonts w:ascii="Arial" w:hAnsi="Arial" w:cs="Arial"/>
+          <w:sz w:val="24"/>
+          <w:szCs w:val="24"/>
+        </w:rPr>
+      </w:pPr>
+    </w:p>
+    <w:p>
+      <w:pPr>
+        <w:spacing w:after="0" w:line="360" w:lineRule="auto"/>
+        <w:jc w:val="center"/>
+        <w:rPr>
+          <w:rFonts w:ascii="Arial" w:hAnsi="Arial" w:cs="Arial"/>
+          <w:sz w:val="24"/>
+          <w:szCs w:val="24"/>
+        </w:rPr>
+      </w:pPr>
+    </w:p>
+    <w:p>
+      <w:pPr>
+        <w:spacing w:after="0" w:line="360" w:lineRule="auto"/>
+        <w:jc w:val="center"/>
+        <w:rPr>
+          <w:rFonts w:ascii="Arial" w:hAnsi="Arial" w:cs="Arial"/>
+          <w:sz w:val="24"/>
+          <w:szCs w:val="24"/>
+        </w:rPr>
+      </w:pPr>
+    </w:p>
+    <w:p>
+      <w:pPr>
+        <w:spacing w:after="0" w:line="360" w:lineRule="auto"/>
+        <w:jc w:val="center"/>
+        <w:rPr>
+          <w:rFonts w:ascii="Arial" w:hAnsi="Arial" w:cs="Arial"/>
+          <w:sz w:val="24"/>
+          <w:szCs w:val="24"/>
+        </w:rPr>
+      </w:pPr>
+    </w:p>
+    <w:p>
+      <w:pPr>
+        <w:spacing w:after="0" w:line="360" w:lineRule="auto"/>
+        <w:jc w:val="center"/>
+        <w:rPr>
+          <w:rFonts w:ascii="Arial" w:hAnsi="Arial" w:cs="Arial"/>
+          <w:sz w:val="24"/>
+          <w:szCs w:val="24"/>
+        </w:rPr>
+      </w:pPr>
+    </w:p>
+    <w:p>
+      <w:pPr>
+        <w:spacing w:after="0" w:line="360" w:lineRule="auto"/>
+        <w:jc w:val="center"/>
+        <w:rPr>
+          <w:rFonts w:ascii="Arial" w:hAnsi="Arial" w:cs="Arial"/>
+          <w:sz w:val="24"/>
+          <w:szCs w:val="24"/>
+        </w:rPr>
+      </w:pPr>
+    </w:p>
+    <w:p>
+      <w:pPr>
+        <w:spacing w:after="0" w:line="360" w:lineRule="auto"/>
+        <w:jc w:val="center"/>
+        <w:rPr>
+          <w:rFonts w:ascii="Arial" w:hAnsi="Arial" w:cs="Arial"/>
+          <w:sz w:val="24"/>
+          <w:szCs w:val="24"/>
+        </w:rPr>
+      </w:pPr>
+    </w:p>
+    <w:p>
+      <w:pPr>
+        <w:spacing w:after="0" w:line="360" w:lineRule="auto"/>
+        <w:jc w:val="center"/>
+        <w:rPr>
+          <w:rFonts w:ascii="Arial" w:hAnsi="Arial" w:cs="Arial"/>
+          <w:sz w:val="24"/>
+          <w:szCs w:val="24"/>
+        </w:rPr>
+      </w:pPr>
+    </w:p>
+    <w:p>
+      <w:pPr>
+        <w:spacing w:after="0" w:line="360" w:lineRule="auto"/>
+        <w:jc w:val="center"/>
+        <w:rPr>
+          <w:rFonts w:ascii="Arial" w:hAnsi="Arial" w:cs="Arial"/>
+          <w:sz w:val="24"/>
+          <w:szCs w:val="24"/>
+        </w:rPr>
+      </w:pPr>
+    </w:p>
+    <w:p>
+      <w:pPr>
+        <w:spacing w:after="0" w:line="360" w:lineRule="auto"/>
+        <w:jc w:val="center"/>
+        <w:rPr>
+          <w:rFonts w:ascii="Arial" w:hAnsi="Arial" w:cs="Arial"/>
+          <w:sz w:val="24"/>
+          <w:szCs w:val="24"/>
+        </w:rPr>
+      </w:pPr>
+    </w:p>
+    <w:p>
+      <w:pPr>
+        <w:spacing w:after="0" w:line="360" w:lineRule="auto"/>
+        <w:jc w:val="center"/>
+        <w:rPr>
+          <w:rFonts w:ascii="Arial" w:hAnsi="Arial" w:cs="Arial"/>
+          <w:sz w:val="24"/>
+          <w:szCs w:val="24"/>
+        </w:rPr>
+      </w:pPr>
+    </w:p>
+    <w:p>
+      <w:pPr>
+        <w:spacing w:after="0" w:line="360" w:lineRule="auto"/>
+        <w:jc w:val="center"/>
+        <w:rPr>
+          <w:rFonts w:ascii="Arial" w:hAnsi="Arial" w:cs="Arial"/>
+          <w:sz w:val="24"/>
+          <w:szCs w:val="24"/>
+        </w:rPr>
+      </w:pPr>
+    </w:p>
+    <w:p>
+      <w:pPr>
+        <w:spacing w:after="0" w:line="360" w:lineRule="auto"/>
+        <w:jc w:val="center"/>
+        <w:rPr>
+          <w:rFonts w:ascii="Arial" w:hAnsi="Arial" w:cs="Arial"/>
+          <w:sz w:val="24"/>
+          <w:szCs w:val="24"/>
+        </w:rPr>
+      </w:pPr>
+    </w:p>
+    <w:p>
+      <w:pPr>
+        <w:spacing w:after="0" w:line="360" w:lineRule="auto"/>
+        <w:jc w:val="center"/>
+        <w:rPr>
+          <w:rFonts w:ascii="Arial" w:hAnsi="Arial" w:cs="Arial"/>
+          <w:sz w:val="24"/>
+          <w:szCs w:val="24"/>
+        </w:rPr>
+      </w:pPr>
+    </w:p>
+    <w:p>
+      <w:pPr>
+        <w:spacing w:after="0" w:line="360" w:lineRule="auto"/>
+        <w:jc w:val="center"/>
+        <w:rPr>
+          <w:rFonts w:ascii="Arial" w:hAnsi="Arial" w:cs="Arial"/>
+          <w:sz w:val="24"/>
+          <w:szCs w:val="24"/>
+        </w:rPr>
+      </w:pPr>
+    </w:p>
+    <w:p>
+      <w:pPr>
+        <w:spacing w:after="0" w:line="360" w:lineRule="auto"/>
+        <w:jc w:val="center"/>
+        <w:rPr>
+          <w:rFonts w:ascii="Arial" w:hAnsi="Arial" w:cs="Arial"/>
+          <w:sz w:val="24"/>
+          <w:szCs w:val="24"/>
+        </w:rPr>
+      </w:pPr>
+    </w:p>
+    <w:p>
+      <w:pPr>
+        <w:spacing w:after="0" w:line="360" w:lineRule="auto"/>
+        <w:jc w:val="center"/>
+        <w:rPr>
+          <w:rFonts w:ascii="Arial" w:hAnsi="Arial" w:cs="Arial"/>
+          <w:sz w:val="24"/>
+          <w:szCs w:val="24"/>
+        </w:rPr>
+      </w:pPr>
+    </w:p>
+    <w:p>
+      <w:pPr>
+        <w:spacing w:after="0" w:line="360" w:lineRule="auto"/>
+        <w:jc w:val="center"/>
+        <w:rPr>
+          <w:rFonts w:ascii="Arial" w:hAnsi="Arial" w:cs="Arial"/>
+          <w:sz w:val="24"/>
+          <w:szCs w:val="24"/>
+        </w:rPr>
+      </w:pPr>
+    </w:p>
+    <w:p>
+      <w:pPr>
+        <w:spacing w:after="0" w:line="360" w:lineRule="auto"/>
+        <w:jc w:val="center"/>
+        <w:rPr>
+          <w:rFonts w:ascii="Arial" w:hAnsi="Arial" w:cs="Arial"/>
+          <w:sz w:val="24"/>
+          <w:szCs w:val="24"/>
+        </w:rPr>
+      </w:pPr>
+    </w:p>
+    <w:p>
+      <w:pPr>
+        <w:spacing w:after="0" w:line="360" w:lineRule="auto"/>
+        <w:jc w:val="center"/>
+        <w:rPr>
+          <w:rFonts w:ascii="Arial" w:hAnsi="Arial" w:cs="Arial"/>
+          <w:sz w:val="24"/>
+          <w:szCs w:val="24"/>
+        </w:rPr>
+      </w:pPr>
+    </w:p>
+    <w:p>
+      <w:pPr>
+        <w:spacing w:after="0" w:line="360" w:lineRule="auto"/>
+        <w:jc w:val="center"/>
+        <w:rPr>
+          <w:rFonts w:ascii="Arial" w:hAnsi="Arial" w:cs="Arial"/>
+          <w:sz w:val="24"/>
+          <w:szCs w:val="24"/>
+        </w:rPr>
+      </w:pPr>
+    </w:p>
+    <w:p>
+      <w:pPr>
+        <w:spacing w:after="0" w:line="360" w:lineRule="auto"/>
+        <w:jc w:val="center"/>
+        <w:rPr>
+          <w:rFonts w:ascii="Arial" w:hAnsi="Arial" w:cs="Arial"/>
+          <w:sz w:val="24"/>
+          <w:szCs w:val="24"/>
+        </w:rPr>
+      </w:pPr>
+    </w:p>
+    <w:p>
+      <w:pPr>
+        <w:spacing w:after="0" w:line="360" w:lineRule="auto"/>
+        <w:jc w:val="center"/>
+        <w:rPr>
+          <w:rFonts w:ascii="Arial" w:hAnsi="Arial" w:cs="Arial"/>
+          <w:sz w:val="24"/>
+          <w:szCs w:val="24"/>
+        </w:rPr>
+      </w:pPr>
+    </w:p>
+    <w:p>
+      <w:pPr>
+        <w:spacing w:after="0" w:line="360" w:lineRule="auto"/>
+        <w:jc w:val="center"/>
+        <w:rPr>
+          <w:rFonts w:ascii="Arial" w:hAnsi="Arial" w:cs="Arial"/>
+          <w:sz w:val="24"/>
+          <w:szCs w:val="24"/>
+        </w:rPr>
+      </w:pPr>
+    </w:p>
+    <w:p>
+      <w:pPr>
+        <w:spacing w:after="0" w:line="360" w:lineRule="auto"/>
+        <w:jc w:val="center"/>
+        <w:rPr>
+          <w:rFonts w:ascii="Arial" w:hAnsi="Arial" w:cs="Arial"/>
+          <w:sz w:val="24"/>
+          <w:szCs w:val="24"/>
+        </w:rPr>
+      </w:pPr>
+    </w:p>
+    <w:p>
+      <w:pPr>
+        <w:spacing w:after="0" w:line="360" w:lineRule="auto"/>
+        <w:rPr>
+          <w:rFonts w:ascii="Arial" w:hAnsi="Arial" w:cs="Arial"/>
+          <w:b/>
+          <w:sz w:val="24"/>
+          <w:szCs w:val="24"/>
+        </w:rPr>
+      </w:pPr>
+      <w:r>
+        <w:rPr>
+          <w:rFonts w:ascii="Arial" w:hAnsi="Arial" w:cs="Arial"/>
+          <w:b/>
+          <w:sz w:val="24"/>
+          <w:szCs w:val="24"/>
+        </w:rPr>
         <w:t>Abstract</w:t>
       </w:r>
     </w:p>
     <w:p>
       <w:pPr>
         <w:spacing w:after="0" w:line="360" w:lineRule="auto"/>
-        <w:jc w:val="center"/>
-        <w:rPr>
-          <w:rFonts w:ascii="Arial" w:hAnsi="Arial" w:cs="Arial"/>
-          <w:sz w:val="24"/>
-          <w:szCs w:val="24"/>
-        </w:rPr>
-      </w:pPr>
-    </w:p>
-    <w:p>
-      <w:pPr>
-        <w:spacing w:after="0" w:line="360" w:lineRule="auto"/>
         <w:jc w:val="both"/>
         <w:rPr>
           <w:rFonts w:ascii="Arial" w:hAnsi="Arial" w:cs="Arial"/>
@@ -1406,354 +1541,1881 @@
           <w:szCs w:val="24"/>
         </w:rPr>
       </w:pPr>
-      <w:r>
-        <w:rPr>
-          <w:rFonts w:ascii="Arial" w:hAnsi="Arial" w:cs="Arial"/>
-          <w:sz w:val="24"/>
-          <w:szCs w:val="24"/>
-        </w:rPr>
-        <w:t xml:space="preserve">Lorem ipsum dolor sit amet, consectetur adipiscing elit. </w:t>
-      </w:r>
-      <w:r>
-        <w:rPr>
-          <w:rFonts w:ascii="Arial" w:hAnsi="Arial" w:cs="Arial"/>
-          <w:sz w:val="24"/>
-          <w:szCs w:val="24"/>
-        </w:rPr>
-        <w:t>Etiam eget ligula eu lectus lobortis condimentum. Aliquam nonummy auctor massa. Pellentesque habitant morbi tristique senectus et netus et malesuada fames ac turpis egestas. Nulla at risus. Quisque purus magna, auctor et, sagittis ac, posuere eu, lectus. Nam mattis, felis ut adipiscing.</w:t>
-      </w:r>
-    </w:p>
-    <w:p>
-      <w:pPr>
-        <w:spacing w:after="0" w:line="360" w:lineRule="auto"/>
-        <w:jc w:val="both"/>
-        <w:rPr>
-          <w:rFonts w:ascii="Arial" w:hAnsi="Arial" w:cs="Arial"/>
-          <w:sz w:val="24"/>
-          <w:szCs w:val="24"/>
-        </w:rPr>
-      </w:pPr>
-      <w:r>
-        <w:rPr>
-          <w:rFonts w:ascii="Arial" w:hAnsi="Arial" w:cs="Arial"/>
-          <w:b/>
-          <w:sz w:val="24"/>
-          <w:szCs w:val="24"/>
-        </w:rPr>
-        <w:t>Palavras-chave:</w:t>
-      </w:r>
-      <w:r>
-        <w:rPr>
-          <w:rFonts w:ascii="Arial" w:hAnsi="Arial" w:cs="Arial"/>
-          <w:sz w:val="24"/>
-          <w:szCs w:val="24"/>
-        </w:rPr>
-        <w:t xml:space="preserve"> Palavra Chave 1. Palavra Chave 2. Palavra Chave 3.</w:t>
-      </w:r>
-    </w:p>
-    <w:p>
-      <w:pPr>
-        <w:spacing w:after="0" w:line="360" w:lineRule="auto"/>
-        <w:jc w:val="center"/>
-        <w:rPr>
-          <w:rFonts w:ascii="Arial" w:hAnsi="Arial" w:cs="Arial"/>
-          <w:sz w:val="24"/>
-          <w:szCs w:val="24"/>
-        </w:rPr>
-      </w:pPr>
-    </w:p>
-    <w:p>
-      <w:pPr>
-        <w:spacing w:after="0" w:line="360" w:lineRule="auto"/>
-        <w:jc w:val="center"/>
-        <w:rPr>
-          <w:rFonts w:ascii="Arial" w:hAnsi="Arial" w:cs="Arial"/>
-          <w:sz w:val="24"/>
-          <w:szCs w:val="24"/>
-        </w:rPr>
-      </w:pPr>
-    </w:p>
-    <w:p>
-      <w:pPr>
-        <w:spacing w:after="0" w:line="360" w:lineRule="auto"/>
-        <w:jc w:val="center"/>
-        <w:rPr>
-          <w:rFonts w:ascii="Arial" w:hAnsi="Arial" w:cs="Arial"/>
-          <w:sz w:val="24"/>
-          <w:szCs w:val="24"/>
-        </w:rPr>
-      </w:pPr>
-    </w:p>
-    <w:p>
-      <w:pPr>
-        <w:spacing w:after="0" w:line="360" w:lineRule="auto"/>
-        <w:jc w:val="center"/>
-        <w:rPr>
-          <w:rFonts w:ascii="Arial" w:hAnsi="Arial" w:cs="Arial"/>
-          <w:sz w:val="24"/>
-          <w:szCs w:val="24"/>
-        </w:rPr>
-      </w:pPr>
-    </w:p>
-    <w:p>
-      <w:pPr>
-        <w:spacing w:after="0" w:line="360" w:lineRule="auto"/>
-        <w:jc w:val="center"/>
-        <w:rPr>
-          <w:rFonts w:ascii="Arial" w:hAnsi="Arial" w:cs="Arial"/>
-          <w:sz w:val="24"/>
-          <w:szCs w:val="24"/>
-        </w:rPr>
-      </w:pPr>
-    </w:p>
-    <w:p>
-      <w:pPr>
-        <w:spacing w:after="0" w:line="360" w:lineRule="auto"/>
-        <w:jc w:val="center"/>
-        <w:rPr>
-          <w:rFonts w:ascii="Arial" w:hAnsi="Arial" w:cs="Arial"/>
-          <w:sz w:val="24"/>
-          <w:szCs w:val="24"/>
-        </w:rPr>
-      </w:pPr>
-    </w:p>
-    <w:p>
-      <w:pPr>
-        <w:spacing w:after="0" w:line="360" w:lineRule="auto"/>
-        <w:jc w:val="center"/>
-        <w:rPr>
-          <w:rFonts w:ascii="Arial" w:hAnsi="Arial" w:cs="Arial"/>
-          <w:sz w:val="24"/>
-          <w:szCs w:val="24"/>
-        </w:rPr>
-      </w:pPr>
-    </w:p>
-    <w:p>
-      <w:pPr>
-        <w:spacing w:after="0" w:line="360" w:lineRule="auto"/>
-        <w:jc w:val="center"/>
-        <w:rPr>
-          <w:rFonts w:ascii="Arial" w:hAnsi="Arial" w:cs="Arial"/>
-          <w:sz w:val="24"/>
-          <w:szCs w:val="24"/>
-        </w:rPr>
-      </w:pPr>
-    </w:p>
-    <w:p>
-      <w:pPr>
-        <w:spacing w:after="0" w:line="360" w:lineRule="auto"/>
-        <w:jc w:val="center"/>
-        <w:rPr>
-          <w:rFonts w:ascii="Arial" w:hAnsi="Arial" w:cs="Arial"/>
-          <w:sz w:val="24"/>
-          <w:szCs w:val="24"/>
-        </w:rPr>
-      </w:pPr>
-    </w:p>
-    <w:p>
-      <w:pPr>
-        <w:spacing w:after="0" w:line="360" w:lineRule="auto"/>
-        <w:jc w:val="center"/>
-        <w:rPr>
-          <w:rFonts w:ascii="Arial" w:hAnsi="Arial" w:cs="Arial"/>
-          <w:sz w:val="24"/>
-          <w:szCs w:val="24"/>
-        </w:rPr>
-      </w:pPr>
-    </w:p>
-    <w:p>
-      <w:pPr>
-        <w:spacing w:after="0" w:line="360" w:lineRule="auto"/>
-        <w:jc w:val="center"/>
-        <w:rPr>
-          <w:rFonts w:ascii="Arial" w:hAnsi="Arial" w:cs="Arial"/>
-          <w:sz w:val="24"/>
-          <w:szCs w:val="24"/>
-        </w:rPr>
-      </w:pPr>
-    </w:p>
-    <w:p>
-      <w:pPr>
-        <w:spacing w:after="0" w:line="360" w:lineRule="auto"/>
-        <w:jc w:val="center"/>
-        <w:rPr>
-          <w:rFonts w:ascii="Arial" w:hAnsi="Arial" w:cs="Arial"/>
-          <w:sz w:val="24"/>
-          <w:szCs w:val="24"/>
-        </w:rPr>
-      </w:pPr>
-    </w:p>
-    <w:p>
-      <w:pPr>
-        <w:spacing w:after="0" w:line="360" w:lineRule="auto"/>
-        <w:jc w:val="center"/>
-        <w:rPr>
-          <w:rFonts w:ascii="Arial" w:hAnsi="Arial" w:cs="Arial"/>
-          <w:sz w:val="24"/>
-          <w:szCs w:val="24"/>
-        </w:rPr>
-      </w:pPr>
-    </w:p>
-    <w:p>
-      <w:pPr>
-        <w:spacing w:after="0" w:line="360" w:lineRule="auto"/>
-        <w:jc w:val="center"/>
-        <w:rPr>
-          <w:rFonts w:ascii="Arial" w:hAnsi="Arial" w:cs="Arial"/>
-          <w:sz w:val="24"/>
-          <w:szCs w:val="24"/>
-        </w:rPr>
-      </w:pPr>
-    </w:p>
-    <w:p>
-      <w:pPr>
-        <w:spacing w:after="0" w:line="360" w:lineRule="auto"/>
-        <w:jc w:val="center"/>
-        <w:rPr>
-          <w:rFonts w:ascii="Arial" w:hAnsi="Arial" w:cs="Arial"/>
-          <w:sz w:val="24"/>
-          <w:szCs w:val="24"/>
-        </w:rPr>
-      </w:pPr>
-    </w:p>
-    <w:p>
-      <w:pPr>
-        <w:spacing w:after="0" w:line="360" w:lineRule="auto"/>
-        <w:jc w:val="center"/>
-        <w:rPr>
-          <w:rFonts w:ascii="Arial" w:hAnsi="Arial" w:cs="Arial"/>
-          <w:sz w:val="24"/>
-          <w:szCs w:val="24"/>
-        </w:rPr>
-      </w:pPr>
-    </w:p>
-    <w:p>
-      <w:pPr>
-        <w:spacing w:after="0" w:line="360" w:lineRule="auto"/>
-        <w:jc w:val="center"/>
-        <w:rPr>
-          <w:rFonts w:ascii="Arial" w:hAnsi="Arial" w:cs="Arial"/>
-          <w:sz w:val="24"/>
-          <w:szCs w:val="24"/>
-        </w:rPr>
-      </w:pPr>
-    </w:p>
-    <w:p>
-      <w:pPr>
-        <w:spacing w:after="0" w:line="360" w:lineRule="auto"/>
-        <w:jc w:val="center"/>
-        <w:rPr>
-          <w:rFonts w:ascii="Arial" w:hAnsi="Arial" w:cs="Arial"/>
-          <w:sz w:val="24"/>
-          <w:szCs w:val="24"/>
-        </w:rPr>
-      </w:pPr>
-    </w:p>
-    <w:p>
-      <w:pPr>
-        <w:spacing w:after="0" w:line="360" w:lineRule="auto"/>
-        <w:jc w:val="center"/>
-        <w:rPr>
-          <w:rFonts w:ascii="Arial" w:hAnsi="Arial" w:cs="Arial"/>
-          <w:sz w:val="24"/>
-          <w:szCs w:val="24"/>
-        </w:rPr>
-      </w:pPr>
-    </w:p>
-    <w:p>
-      <w:pPr>
-        <w:spacing w:after="0" w:line="360" w:lineRule="auto"/>
-        <w:jc w:val="center"/>
-        <w:rPr>
-          <w:rFonts w:ascii="Arial" w:hAnsi="Arial" w:cs="Arial"/>
-          <w:sz w:val="24"/>
-          <w:szCs w:val="24"/>
-        </w:rPr>
-      </w:pPr>
-    </w:p>
-    <w:p>
-      <w:pPr>
-        <w:spacing w:after="0" w:line="360" w:lineRule="auto"/>
-        <w:jc w:val="center"/>
-        <w:rPr>
-          <w:rFonts w:ascii="Arial" w:hAnsi="Arial" w:cs="Arial"/>
-          <w:sz w:val="24"/>
-          <w:szCs w:val="24"/>
-        </w:rPr>
-      </w:pPr>
-    </w:p>
-    <w:p>
-      <w:pPr>
-        <w:spacing w:after="0" w:line="360" w:lineRule="auto"/>
-        <w:jc w:val="center"/>
-        <w:rPr>
-          <w:rFonts w:ascii="Arial" w:hAnsi="Arial" w:cs="Arial"/>
-          <w:sz w:val="24"/>
-          <w:szCs w:val="24"/>
-        </w:rPr>
-      </w:pPr>
-    </w:p>
-    <w:p>
-      <w:pPr>
-        <w:spacing w:after="0" w:line="360" w:lineRule="auto"/>
-        <w:jc w:val="center"/>
-        <w:rPr>
-          <w:rFonts w:ascii="Arial" w:hAnsi="Arial" w:cs="Arial"/>
-          <w:sz w:val="24"/>
-          <w:szCs w:val="24"/>
-        </w:rPr>
-      </w:pPr>
-    </w:p>
-    <w:p>
-      <w:pPr>
-        <w:spacing w:after="0" w:line="360" w:lineRule="auto"/>
-        <w:jc w:val="center"/>
-        <w:rPr>
-          <w:rFonts w:ascii="Arial" w:hAnsi="Arial" w:cs="Arial"/>
-          <w:sz w:val="24"/>
-          <w:szCs w:val="24"/>
-        </w:rPr>
-      </w:pPr>
-    </w:p>
-    <w:p>
-      <w:pPr>
-        <w:spacing w:after="0" w:line="360" w:lineRule="auto"/>
-        <w:jc w:val="center"/>
-        <w:rPr>
-          <w:rFonts w:ascii="Arial" w:hAnsi="Arial" w:cs="Arial"/>
-          <w:sz w:val="24"/>
-          <w:szCs w:val="24"/>
-        </w:rPr>
-      </w:pPr>
-    </w:p>
-    <w:p>
-      <w:pPr>
-        <w:spacing w:after="0" w:line="360" w:lineRule="auto"/>
-        <w:jc w:val="center"/>
-        <w:rPr>
-          <w:rFonts w:ascii="Arial" w:hAnsi="Arial" w:cs="Arial"/>
-          <w:sz w:val="24"/>
-          <w:szCs w:val="24"/>
-        </w:rPr>
-      </w:pPr>
-    </w:p>
-    <w:p>
-      <w:pPr>
-        <w:spacing w:after="0" w:line="360" w:lineRule="auto"/>
-        <w:jc w:val="center"/>
-        <w:rPr>
-          <w:rFonts w:ascii="Arial" w:hAnsi="Arial" w:cs="Arial"/>
-          <w:sz w:val="24"/>
-          <w:szCs w:val="24"/>
-        </w:rPr>
-      </w:pPr>
-      <w:r>
-        <w:rPr>
-          <w:rFonts w:ascii="Arial" w:hAnsi="Arial" w:cs="Arial"/>
-          <w:sz w:val="24"/>
-          <w:szCs w:val="24"/>
-        </w:rPr>
-        <w:lastRenderedPageBreak/>
+      <w:proofErr w:type="spellStart"/>
+      <w:r>
+        <w:rPr>
+          <w:rFonts w:ascii="Arial" w:hAnsi="Arial" w:cs="Arial"/>
+          <w:sz w:val="24"/>
+          <w:szCs w:val="24"/>
+        </w:rPr>
+        <w:t>This</w:t>
+      </w:r>
+      <w:proofErr w:type="spellEnd"/>
+      <w:r>
+        <w:rPr>
+          <w:rFonts w:ascii="Arial" w:hAnsi="Arial" w:cs="Arial"/>
+          <w:sz w:val="24"/>
+          <w:szCs w:val="24"/>
+        </w:rPr>
+        <w:t xml:space="preserve"> final </w:t>
+      </w:r>
+      <w:proofErr w:type="spellStart"/>
+      <w:r>
+        <w:rPr>
+          <w:rFonts w:ascii="Arial" w:hAnsi="Arial" w:cs="Arial"/>
+          <w:sz w:val="24"/>
+          <w:szCs w:val="24"/>
+        </w:rPr>
+        <w:t>project</w:t>
+      </w:r>
+      <w:proofErr w:type="spellEnd"/>
+      <w:r>
+        <w:rPr>
+          <w:rFonts w:ascii="Arial" w:hAnsi="Arial" w:cs="Arial"/>
+          <w:sz w:val="24"/>
+          <w:szCs w:val="24"/>
+        </w:rPr>
+        <w:t xml:space="preserve"> </w:t>
+      </w:r>
+      <w:proofErr w:type="spellStart"/>
+      <w:r>
+        <w:rPr>
+          <w:rFonts w:ascii="Arial" w:hAnsi="Arial" w:cs="Arial"/>
+          <w:sz w:val="24"/>
+          <w:szCs w:val="24"/>
+        </w:rPr>
+        <w:t>proposes</w:t>
+      </w:r>
+      <w:proofErr w:type="spellEnd"/>
+      <w:r>
+        <w:rPr>
+          <w:rFonts w:ascii="Arial" w:hAnsi="Arial" w:cs="Arial"/>
+          <w:sz w:val="24"/>
+          <w:szCs w:val="24"/>
+        </w:rPr>
+        <w:t xml:space="preserve"> </w:t>
+      </w:r>
+      <w:proofErr w:type="spellStart"/>
+      <w:r>
+        <w:rPr>
+          <w:rFonts w:ascii="Arial" w:hAnsi="Arial" w:cs="Arial"/>
+          <w:sz w:val="24"/>
+          <w:szCs w:val="24"/>
+        </w:rPr>
+        <w:t>an</w:t>
+      </w:r>
+      <w:proofErr w:type="spellEnd"/>
+      <w:r>
+        <w:rPr>
+          <w:rFonts w:ascii="Arial" w:hAnsi="Arial" w:cs="Arial"/>
+          <w:sz w:val="24"/>
+          <w:szCs w:val="24"/>
+        </w:rPr>
+        <w:t xml:space="preserve"> </w:t>
+      </w:r>
+      <w:proofErr w:type="spellStart"/>
+      <w:r>
+        <w:rPr>
+          <w:rFonts w:ascii="Arial" w:hAnsi="Arial" w:cs="Arial"/>
+          <w:sz w:val="24"/>
+          <w:szCs w:val="24"/>
+        </w:rPr>
+        <w:t>analysis</w:t>
+      </w:r>
+      <w:proofErr w:type="spellEnd"/>
+      <w:r>
+        <w:rPr>
+          <w:rFonts w:ascii="Arial" w:hAnsi="Arial" w:cs="Arial"/>
+          <w:sz w:val="24"/>
+          <w:szCs w:val="24"/>
+        </w:rPr>
+        <w:t xml:space="preserve"> </w:t>
+      </w:r>
+      <w:proofErr w:type="spellStart"/>
+      <w:r>
+        <w:rPr>
+          <w:rFonts w:ascii="Arial" w:hAnsi="Arial" w:cs="Arial"/>
+          <w:sz w:val="24"/>
+          <w:szCs w:val="24"/>
+        </w:rPr>
+        <w:t>of</w:t>
+      </w:r>
+      <w:proofErr w:type="spellEnd"/>
+      <w:r>
+        <w:rPr>
+          <w:rFonts w:ascii="Arial" w:hAnsi="Arial" w:cs="Arial"/>
+          <w:sz w:val="24"/>
+          <w:szCs w:val="24"/>
+        </w:rPr>
+        <w:t xml:space="preserve"> </w:t>
+      </w:r>
+      <w:proofErr w:type="spellStart"/>
+      <w:r>
+        <w:rPr>
+          <w:rFonts w:ascii="Arial" w:hAnsi="Arial" w:cs="Arial"/>
+          <w:sz w:val="24"/>
+          <w:szCs w:val="24"/>
+        </w:rPr>
+        <w:t>the</w:t>
+      </w:r>
+      <w:proofErr w:type="spellEnd"/>
+      <w:r>
+        <w:rPr>
+          <w:rFonts w:ascii="Arial" w:hAnsi="Arial" w:cs="Arial"/>
+          <w:sz w:val="24"/>
+          <w:szCs w:val="24"/>
+        </w:rPr>
+        <w:t xml:space="preserve"> </w:t>
+      </w:r>
+      <w:proofErr w:type="spellStart"/>
+      <w:r>
+        <w:rPr>
+          <w:rFonts w:ascii="Arial" w:hAnsi="Arial" w:cs="Arial"/>
+          <w:sz w:val="24"/>
+          <w:szCs w:val="24"/>
+        </w:rPr>
+        <w:t>difficulties</w:t>
+      </w:r>
+      <w:proofErr w:type="spellEnd"/>
+      <w:r>
+        <w:rPr>
+          <w:rFonts w:ascii="Arial" w:hAnsi="Arial" w:cs="Arial"/>
+          <w:sz w:val="24"/>
+          <w:szCs w:val="24"/>
+        </w:rPr>
+        <w:t xml:space="preserve"> </w:t>
+      </w:r>
+      <w:proofErr w:type="spellStart"/>
+      <w:r>
+        <w:rPr>
+          <w:rFonts w:ascii="Arial" w:hAnsi="Arial" w:cs="Arial"/>
+          <w:sz w:val="24"/>
+          <w:szCs w:val="24"/>
+        </w:rPr>
+        <w:t>faced</w:t>
+      </w:r>
+      <w:proofErr w:type="spellEnd"/>
+      <w:r>
+        <w:rPr>
+          <w:rFonts w:ascii="Arial" w:hAnsi="Arial" w:cs="Arial"/>
+          <w:sz w:val="24"/>
+          <w:szCs w:val="24"/>
+        </w:rPr>
+        <w:t xml:space="preserve"> </w:t>
+      </w:r>
+      <w:proofErr w:type="spellStart"/>
+      <w:r>
+        <w:rPr>
+          <w:rFonts w:ascii="Arial" w:hAnsi="Arial" w:cs="Arial"/>
+          <w:sz w:val="24"/>
+          <w:szCs w:val="24"/>
+        </w:rPr>
+        <w:t>by</w:t>
+      </w:r>
+      <w:proofErr w:type="spellEnd"/>
+      <w:r>
+        <w:rPr>
+          <w:rFonts w:ascii="Arial" w:hAnsi="Arial" w:cs="Arial"/>
+          <w:sz w:val="24"/>
+          <w:szCs w:val="24"/>
+        </w:rPr>
+        <w:t xml:space="preserve"> </w:t>
+      </w:r>
+      <w:proofErr w:type="spellStart"/>
+      <w:r>
+        <w:rPr>
+          <w:rFonts w:ascii="Arial" w:hAnsi="Arial" w:cs="Arial"/>
+          <w:sz w:val="24"/>
+          <w:szCs w:val="24"/>
+        </w:rPr>
+        <w:t>teachers</w:t>
+      </w:r>
+      <w:proofErr w:type="spellEnd"/>
+      <w:r>
+        <w:rPr>
+          <w:rFonts w:ascii="Arial" w:hAnsi="Arial" w:cs="Arial"/>
+          <w:sz w:val="24"/>
+          <w:szCs w:val="24"/>
+        </w:rPr>
+        <w:t xml:space="preserve"> </w:t>
+      </w:r>
+      <w:proofErr w:type="spellStart"/>
+      <w:r>
+        <w:rPr>
+          <w:rFonts w:ascii="Arial" w:hAnsi="Arial" w:cs="Arial"/>
+          <w:sz w:val="24"/>
+          <w:szCs w:val="24"/>
+        </w:rPr>
+        <w:t>at</w:t>
+      </w:r>
+      <w:proofErr w:type="spellEnd"/>
+      <w:r>
+        <w:rPr>
+          <w:rFonts w:ascii="Arial" w:hAnsi="Arial" w:cs="Arial"/>
+          <w:sz w:val="24"/>
+          <w:szCs w:val="24"/>
+        </w:rPr>
+        <w:t xml:space="preserve"> ETEC Professor Camargo Aranha </w:t>
+      </w:r>
+      <w:proofErr w:type="spellStart"/>
+      <w:r>
+        <w:rPr>
+          <w:rFonts w:ascii="Arial" w:hAnsi="Arial" w:cs="Arial"/>
+          <w:sz w:val="24"/>
+          <w:szCs w:val="24"/>
+        </w:rPr>
+        <w:t>when</w:t>
+      </w:r>
+      <w:proofErr w:type="spellEnd"/>
+      <w:r>
+        <w:rPr>
+          <w:rFonts w:ascii="Arial" w:hAnsi="Arial" w:cs="Arial"/>
+          <w:sz w:val="24"/>
+          <w:szCs w:val="24"/>
+        </w:rPr>
+        <w:t xml:space="preserve"> </w:t>
+      </w:r>
+      <w:proofErr w:type="spellStart"/>
+      <w:r>
+        <w:rPr>
+          <w:rFonts w:ascii="Arial" w:hAnsi="Arial" w:cs="Arial"/>
+          <w:sz w:val="24"/>
+          <w:szCs w:val="24"/>
+        </w:rPr>
+        <w:t>attempting</w:t>
+      </w:r>
+      <w:proofErr w:type="spellEnd"/>
+      <w:r>
+        <w:rPr>
+          <w:rFonts w:ascii="Arial" w:hAnsi="Arial" w:cs="Arial"/>
+          <w:sz w:val="24"/>
+          <w:szCs w:val="24"/>
+        </w:rPr>
+        <w:t xml:space="preserve"> </w:t>
+      </w:r>
+      <w:proofErr w:type="spellStart"/>
+      <w:r>
+        <w:rPr>
+          <w:rFonts w:ascii="Arial" w:hAnsi="Arial" w:cs="Arial"/>
+          <w:sz w:val="24"/>
+          <w:szCs w:val="24"/>
+        </w:rPr>
+        <w:t>to</w:t>
+      </w:r>
+      <w:proofErr w:type="spellEnd"/>
+      <w:r>
+        <w:rPr>
+          <w:rFonts w:ascii="Arial" w:hAnsi="Arial" w:cs="Arial"/>
+          <w:sz w:val="24"/>
+          <w:szCs w:val="24"/>
+        </w:rPr>
+        <w:t xml:space="preserve"> </w:t>
+      </w:r>
+      <w:proofErr w:type="spellStart"/>
+      <w:r>
+        <w:rPr>
+          <w:rFonts w:ascii="Arial" w:hAnsi="Arial" w:cs="Arial"/>
+          <w:sz w:val="24"/>
+          <w:szCs w:val="24"/>
+        </w:rPr>
+        <w:t>teach</w:t>
+      </w:r>
+      <w:proofErr w:type="spellEnd"/>
+      <w:r>
+        <w:rPr>
+          <w:rFonts w:ascii="Arial" w:hAnsi="Arial" w:cs="Arial"/>
+          <w:sz w:val="24"/>
+          <w:szCs w:val="24"/>
+        </w:rPr>
+        <w:t xml:space="preserve"> </w:t>
+      </w:r>
+      <w:proofErr w:type="spellStart"/>
+      <w:r>
+        <w:rPr>
+          <w:rFonts w:ascii="Arial" w:hAnsi="Arial" w:cs="Arial"/>
+          <w:sz w:val="24"/>
+          <w:szCs w:val="24"/>
+        </w:rPr>
+        <w:t>students</w:t>
+      </w:r>
+      <w:proofErr w:type="spellEnd"/>
+      <w:r>
+        <w:rPr>
+          <w:rFonts w:ascii="Arial" w:hAnsi="Arial" w:cs="Arial"/>
+          <w:sz w:val="24"/>
+          <w:szCs w:val="24"/>
+        </w:rPr>
+        <w:t xml:space="preserve"> </w:t>
+      </w:r>
+      <w:proofErr w:type="spellStart"/>
+      <w:r>
+        <w:rPr>
+          <w:rFonts w:ascii="Arial" w:hAnsi="Arial" w:cs="Arial"/>
+          <w:sz w:val="24"/>
+          <w:szCs w:val="24"/>
+        </w:rPr>
+        <w:t>with</w:t>
+      </w:r>
+      <w:proofErr w:type="spellEnd"/>
+      <w:r>
+        <w:rPr>
+          <w:rFonts w:ascii="Arial" w:hAnsi="Arial" w:cs="Arial"/>
+          <w:sz w:val="24"/>
+          <w:szCs w:val="24"/>
+        </w:rPr>
+        <w:t xml:space="preserve"> </w:t>
+      </w:r>
+      <w:proofErr w:type="spellStart"/>
+      <w:r>
+        <w:rPr>
+          <w:rFonts w:ascii="Arial" w:hAnsi="Arial" w:cs="Arial"/>
+          <w:sz w:val="24"/>
+          <w:szCs w:val="24"/>
+        </w:rPr>
+        <w:t>Autism</w:t>
+      </w:r>
+      <w:proofErr w:type="spellEnd"/>
+      <w:r>
+        <w:rPr>
+          <w:rFonts w:ascii="Arial" w:hAnsi="Arial" w:cs="Arial"/>
+          <w:sz w:val="24"/>
+          <w:szCs w:val="24"/>
+        </w:rPr>
+        <w:t xml:space="preserve"> Spectrum </w:t>
+      </w:r>
+      <w:proofErr w:type="spellStart"/>
+      <w:r>
+        <w:rPr>
+          <w:rFonts w:ascii="Arial" w:hAnsi="Arial" w:cs="Arial"/>
+          <w:sz w:val="24"/>
+          <w:szCs w:val="24"/>
+        </w:rPr>
+        <w:t>Disorder</w:t>
+      </w:r>
+      <w:proofErr w:type="spellEnd"/>
+      <w:r>
+        <w:rPr>
+          <w:rFonts w:ascii="Arial" w:hAnsi="Arial" w:cs="Arial"/>
+          <w:sz w:val="24"/>
+          <w:szCs w:val="24"/>
+        </w:rPr>
+        <w:t xml:space="preserve"> </w:t>
+      </w:r>
+      <w:proofErr w:type="spellStart"/>
+      <w:r>
+        <w:rPr>
+          <w:rFonts w:ascii="Arial" w:hAnsi="Arial" w:cs="Arial"/>
+          <w:sz w:val="24"/>
+          <w:szCs w:val="24"/>
+        </w:rPr>
+        <w:t>who</w:t>
+      </w:r>
+      <w:proofErr w:type="spellEnd"/>
+      <w:r>
+        <w:rPr>
+          <w:rFonts w:ascii="Arial" w:hAnsi="Arial" w:cs="Arial"/>
+          <w:sz w:val="24"/>
+          <w:szCs w:val="24"/>
+        </w:rPr>
+        <w:t xml:space="preserve"> are verbal, </w:t>
+      </w:r>
+      <w:proofErr w:type="spellStart"/>
+      <w:r>
+        <w:rPr>
+          <w:rFonts w:ascii="Arial" w:hAnsi="Arial" w:cs="Arial"/>
+          <w:sz w:val="24"/>
+          <w:szCs w:val="24"/>
+        </w:rPr>
+        <w:t>focusing</w:t>
+      </w:r>
+      <w:proofErr w:type="spellEnd"/>
+      <w:r>
+        <w:rPr>
+          <w:rFonts w:ascii="Arial" w:hAnsi="Arial" w:cs="Arial"/>
+          <w:sz w:val="24"/>
+          <w:szCs w:val="24"/>
+        </w:rPr>
+        <w:t xml:space="preserve"> </w:t>
+      </w:r>
+      <w:proofErr w:type="spellStart"/>
+      <w:r>
+        <w:rPr>
+          <w:rFonts w:ascii="Arial" w:hAnsi="Arial" w:cs="Arial"/>
+          <w:sz w:val="24"/>
+          <w:szCs w:val="24"/>
+        </w:rPr>
+        <w:t>primarily</w:t>
+      </w:r>
+      <w:proofErr w:type="spellEnd"/>
+      <w:r>
+        <w:rPr>
+          <w:rFonts w:ascii="Arial" w:hAnsi="Arial" w:cs="Arial"/>
+          <w:sz w:val="24"/>
+          <w:szCs w:val="24"/>
+        </w:rPr>
+        <w:t xml:space="preserve"> </w:t>
+      </w:r>
+      <w:proofErr w:type="spellStart"/>
+      <w:r>
+        <w:rPr>
+          <w:rFonts w:ascii="Arial" w:hAnsi="Arial" w:cs="Arial"/>
+          <w:sz w:val="24"/>
+          <w:szCs w:val="24"/>
+        </w:rPr>
+        <w:t>on</w:t>
+      </w:r>
+      <w:proofErr w:type="spellEnd"/>
+      <w:r>
+        <w:rPr>
+          <w:rFonts w:ascii="Arial" w:hAnsi="Arial" w:cs="Arial"/>
+          <w:sz w:val="24"/>
+          <w:szCs w:val="24"/>
+        </w:rPr>
+        <w:t xml:space="preserve"> </w:t>
+      </w:r>
+      <w:proofErr w:type="spellStart"/>
+      <w:r>
+        <w:rPr>
+          <w:rFonts w:ascii="Arial" w:hAnsi="Arial" w:cs="Arial"/>
+          <w:sz w:val="24"/>
+          <w:szCs w:val="24"/>
+        </w:rPr>
+        <w:t>Level</w:t>
+      </w:r>
+      <w:proofErr w:type="spellEnd"/>
+      <w:r>
+        <w:rPr>
+          <w:rFonts w:ascii="Arial" w:hAnsi="Arial" w:cs="Arial"/>
+          <w:sz w:val="24"/>
+          <w:szCs w:val="24"/>
+        </w:rPr>
+        <w:t xml:space="preserve"> 1. As </w:t>
+      </w:r>
+      <w:proofErr w:type="spellStart"/>
+      <w:r>
+        <w:rPr>
+          <w:rFonts w:ascii="Arial" w:hAnsi="Arial" w:cs="Arial"/>
+          <w:sz w:val="24"/>
+          <w:szCs w:val="24"/>
+        </w:rPr>
+        <w:t>part</w:t>
+      </w:r>
+      <w:proofErr w:type="spellEnd"/>
+      <w:r>
+        <w:rPr>
+          <w:rFonts w:ascii="Arial" w:hAnsi="Arial" w:cs="Arial"/>
+          <w:sz w:val="24"/>
+          <w:szCs w:val="24"/>
+        </w:rPr>
+        <w:t xml:space="preserve"> </w:t>
+      </w:r>
+      <w:proofErr w:type="spellStart"/>
+      <w:r>
+        <w:rPr>
+          <w:rFonts w:ascii="Arial" w:hAnsi="Arial" w:cs="Arial"/>
+          <w:sz w:val="24"/>
+          <w:szCs w:val="24"/>
+        </w:rPr>
+        <w:t>of</w:t>
+      </w:r>
+      <w:proofErr w:type="spellEnd"/>
+      <w:r>
+        <w:rPr>
+          <w:rFonts w:ascii="Arial" w:hAnsi="Arial" w:cs="Arial"/>
+          <w:sz w:val="24"/>
+          <w:szCs w:val="24"/>
+        </w:rPr>
+        <w:t xml:space="preserve"> a </w:t>
+      </w:r>
+      <w:proofErr w:type="spellStart"/>
+      <w:r>
+        <w:rPr>
+          <w:rFonts w:ascii="Arial" w:hAnsi="Arial" w:cs="Arial"/>
+          <w:sz w:val="24"/>
+          <w:szCs w:val="24"/>
+        </w:rPr>
+        <w:t>qualitative</w:t>
+      </w:r>
+      <w:proofErr w:type="spellEnd"/>
+      <w:r>
+        <w:rPr>
+          <w:rFonts w:ascii="Arial" w:hAnsi="Arial" w:cs="Arial"/>
+          <w:sz w:val="24"/>
+          <w:szCs w:val="24"/>
+        </w:rPr>
+        <w:t xml:space="preserve"> </w:t>
+      </w:r>
+      <w:proofErr w:type="spellStart"/>
+      <w:r>
+        <w:rPr>
+          <w:rFonts w:ascii="Arial" w:hAnsi="Arial" w:cs="Arial"/>
+          <w:sz w:val="24"/>
+          <w:szCs w:val="24"/>
+        </w:rPr>
+        <w:t>study</w:t>
+      </w:r>
+      <w:proofErr w:type="spellEnd"/>
+      <w:r>
+        <w:rPr>
+          <w:rFonts w:ascii="Arial" w:hAnsi="Arial" w:cs="Arial"/>
+          <w:sz w:val="24"/>
+          <w:szCs w:val="24"/>
+        </w:rPr>
+        <w:t xml:space="preserve">, individual interviews </w:t>
+      </w:r>
+      <w:proofErr w:type="spellStart"/>
+      <w:r>
+        <w:rPr>
+          <w:rFonts w:ascii="Arial" w:hAnsi="Arial" w:cs="Arial"/>
+          <w:sz w:val="24"/>
+          <w:szCs w:val="24"/>
+        </w:rPr>
+        <w:t>with</w:t>
+      </w:r>
+      <w:proofErr w:type="spellEnd"/>
+      <w:r>
+        <w:rPr>
+          <w:rFonts w:ascii="Arial" w:hAnsi="Arial" w:cs="Arial"/>
+          <w:sz w:val="24"/>
+          <w:szCs w:val="24"/>
+        </w:rPr>
+        <w:t xml:space="preserve"> </w:t>
+      </w:r>
+      <w:proofErr w:type="spellStart"/>
+      <w:r>
+        <w:rPr>
+          <w:rFonts w:ascii="Arial" w:hAnsi="Arial" w:cs="Arial"/>
+          <w:sz w:val="24"/>
+          <w:szCs w:val="24"/>
+        </w:rPr>
+        <w:t>these</w:t>
+      </w:r>
+      <w:proofErr w:type="spellEnd"/>
+      <w:r>
+        <w:rPr>
+          <w:rFonts w:ascii="Arial" w:hAnsi="Arial" w:cs="Arial"/>
+          <w:sz w:val="24"/>
+          <w:szCs w:val="24"/>
+        </w:rPr>
+        <w:t xml:space="preserve"> </w:t>
+      </w:r>
+      <w:proofErr w:type="spellStart"/>
+      <w:r>
+        <w:rPr>
+          <w:rFonts w:ascii="Arial" w:hAnsi="Arial" w:cs="Arial"/>
+          <w:sz w:val="24"/>
+          <w:szCs w:val="24"/>
+        </w:rPr>
+        <w:t>teachers</w:t>
+      </w:r>
+      <w:proofErr w:type="spellEnd"/>
+      <w:r>
+        <w:rPr>
+          <w:rFonts w:ascii="Arial" w:hAnsi="Arial" w:cs="Arial"/>
+          <w:sz w:val="24"/>
+          <w:szCs w:val="24"/>
+        </w:rPr>
+        <w:t xml:space="preserve"> </w:t>
+      </w:r>
+      <w:proofErr w:type="spellStart"/>
+      <w:r>
+        <w:rPr>
+          <w:rFonts w:ascii="Arial" w:hAnsi="Arial" w:cs="Arial"/>
+          <w:sz w:val="24"/>
+          <w:szCs w:val="24"/>
+        </w:rPr>
+        <w:t>were</w:t>
+      </w:r>
+      <w:proofErr w:type="spellEnd"/>
+      <w:r>
+        <w:rPr>
+          <w:rFonts w:ascii="Arial" w:hAnsi="Arial" w:cs="Arial"/>
+          <w:sz w:val="24"/>
+          <w:szCs w:val="24"/>
+        </w:rPr>
+        <w:t xml:space="preserve"> </w:t>
+      </w:r>
+      <w:proofErr w:type="spellStart"/>
+      <w:r>
+        <w:rPr>
+          <w:rFonts w:ascii="Arial" w:hAnsi="Arial" w:cs="Arial"/>
+          <w:sz w:val="24"/>
+          <w:szCs w:val="24"/>
+        </w:rPr>
+        <w:t>conducted</w:t>
+      </w:r>
+      <w:proofErr w:type="spellEnd"/>
+      <w:r>
+        <w:rPr>
+          <w:rFonts w:ascii="Arial" w:hAnsi="Arial" w:cs="Arial"/>
+          <w:sz w:val="24"/>
+          <w:szCs w:val="24"/>
+        </w:rPr>
+        <w:t xml:space="preserve"> </w:t>
+      </w:r>
+      <w:proofErr w:type="spellStart"/>
+      <w:r>
+        <w:rPr>
+          <w:rFonts w:ascii="Arial" w:hAnsi="Arial" w:cs="Arial"/>
+          <w:sz w:val="24"/>
+          <w:szCs w:val="24"/>
+        </w:rPr>
+        <w:t>to</w:t>
+      </w:r>
+      <w:proofErr w:type="spellEnd"/>
+      <w:r>
+        <w:rPr>
+          <w:rFonts w:ascii="Arial" w:hAnsi="Arial" w:cs="Arial"/>
+          <w:sz w:val="24"/>
+          <w:szCs w:val="24"/>
+        </w:rPr>
+        <w:t xml:space="preserve"> </w:t>
+      </w:r>
+      <w:proofErr w:type="spellStart"/>
+      <w:r>
+        <w:rPr>
+          <w:rFonts w:ascii="Arial" w:hAnsi="Arial" w:cs="Arial"/>
+          <w:sz w:val="24"/>
+          <w:szCs w:val="24"/>
+        </w:rPr>
+        <w:t>identify</w:t>
+      </w:r>
+      <w:proofErr w:type="spellEnd"/>
+      <w:r>
+        <w:rPr>
+          <w:rFonts w:ascii="Arial" w:hAnsi="Arial" w:cs="Arial"/>
+          <w:sz w:val="24"/>
+          <w:szCs w:val="24"/>
+        </w:rPr>
+        <w:t xml:space="preserve"> </w:t>
+      </w:r>
+      <w:proofErr w:type="spellStart"/>
+      <w:r>
+        <w:rPr>
+          <w:rFonts w:ascii="Arial" w:hAnsi="Arial" w:cs="Arial"/>
+          <w:sz w:val="24"/>
+          <w:szCs w:val="24"/>
+        </w:rPr>
+        <w:t>the</w:t>
+      </w:r>
+      <w:proofErr w:type="spellEnd"/>
+      <w:r>
+        <w:rPr>
+          <w:rFonts w:ascii="Arial" w:hAnsi="Arial" w:cs="Arial"/>
+          <w:sz w:val="24"/>
+          <w:szCs w:val="24"/>
+        </w:rPr>
+        <w:t xml:space="preserve"> </w:t>
+      </w:r>
+      <w:proofErr w:type="spellStart"/>
+      <w:r>
+        <w:rPr>
+          <w:rFonts w:ascii="Arial" w:hAnsi="Arial" w:cs="Arial"/>
+          <w:sz w:val="24"/>
+          <w:szCs w:val="24"/>
+        </w:rPr>
+        <w:t>main</w:t>
+      </w:r>
+      <w:proofErr w:type="spellEnd"/>
+      <w:r>
+        <w:rPr>
+          <w:rFonts w:ascii="Arial" w:hAnsi="Arial" w:cs="Arial"/>
+          <w:sz w:val="24"/>
+          <w:szCs w:val="24"/>
+        </w:rPr>
+        <w:t xml:space="preserve"> </w:t>
+      </w:r>
+      <w:proofErr w:type="spellStart"/>
+      <w:r>
+        <w:rPr>
+          <w:rFonts w:ascii="Arial" w:hAnsi="Arial" w:cs="Arial"/>
+          <w:sz w:val="24"/>
+          <w:szCs w:val="24"/>
+        </w:rPr>
+        <w:t>challenges</w:t>
+      </w:r>
+      <w:proofErr w:type="spellEnd"/>
+      <w:r>
+        <w:rPr>
+          <w:rFonts w:ascii="Arial" w:hAnsi="Arial" w:cs="Arial"/>
+          <w:sz w:val="24"/>
+          <w:szCs w:val="24"/>
+        </w:rPr>
+        <w:t xml:space="preserve">, </w:t>
+      </w:r>
+      <w:proofErr w:type="spellStart"/>
+      <w:r>
+        <w:rPr>
+          <w:rFonts w:ascii="Arial" w:hAnsi="Arial" w:cs="Arial"/>
+          <w:sz w:val="24"/>
+          <w:szCs w:val="24"/>
+        </w:rPr>
+        <w:t>which</w:t>
+      </w:r>
+      <w:proofErr w:type="spellEnd"/>
+      <w:r>
+        <w:rPr>
+          <w:rFonts w:ascii="Arial" w:hAnsi="Arial" w:cs="Arial"/>
+          <w:sz w:val="24"/>
+          <w:szCs w:val="24"/>
+        </w:rPr>
+        <w:t xml:space="preserve"> </w:t>
+      </w:r>
+      <w:proofErr w:type="spellStart"/>
+      <w:r>
+        <w:rPr>
+          <w:rFonts w:ascii="Arial" w:hAnsi="Arial" w:cs="Arial"/>
+          <w:sz w:val="24"/>
+          <w:szCs w:val="24"/>
+        </w:rPr>
+        <w:t>were</w:t>
+      </w:r>
+      <w:proofErr w:type="spellEnd"/>
+      <w:r>
+        <w:rPr>
+          <w:rFonts w:ascii="Arial" w:hAnsi="Arial" w:cs="Arial"/>
+          <w:sz w:val="24"/>
+          <w:szCs w:val="24"/>
+        </w:rPr>
+        <w:t xml:space="preserve">: </w:t>
+      </w:r>
+      <w:proofErr w:type="spellStart"/>
+      <w:r>
+        <w:rPr>
+          <w:rFonts w:ascii="Arial" w:hAnsi="Arial" w:cs="Arial"/>
+          <w:sz w:val="24"/>
+          <w:szCs w:val="24"/>
+        </w:rPr>
+        <w:t>creating</w:t>
+      </w:r>
+      <w:proofErr w:type="spellEnd"/>
+      <w:r>
+        <w:rPr>
+          <w:rFonts w:ascii="Arial" w:hAnsi="Arial" w:cs="Arial"/>
+          <w:sz w:val="24"/>
+          <w:szCs w:val="24"/>
+        </w:rPr>
+        <w:t xml:space="preserve"> </w:t>
+      </w:r>
+      <w:proofErr w:type="spellStart"/>
+      <w:r>
+        <w:rPr>
+          <w:rFonts w:ascii="Arial" w:hAnsi="Arial" w:cs="Arial"/>
+          <w:sz w:val="24"/>
+          <w:szCs w:val="24"/>
+        </w:rPr>
+        <w:t>adapted</w:t>
+      </w:r>
+      <w:proofErr w:type="spellEnd"/>
+      <w:r>
+        <w:rPr>
+          <w:rFonts w:ascii="Arial" w:hAnsi="Arial" w:cs="Arial"/>
+          <w:sz w:val="24"/>
+          <w:szCs w:val="24"/>
+        </w:rPr>
+        <w:t xml:space="preserve"> </w:t>
+      </w:r>
+      <w:proofErr w:type="spellStart"/>
+      <w:r>
+        <w:rPr>
+          <w:rFonts w:ascii="Arial" w:hAnsi="Arial" w:cs="Arial"/>
+          <w:sz w:val="24"/>
+          <w:szCs w:val="24"/>
+        </w:rPr>
+        <w:t>materials</w:t>
+      </w:r>
+      <w:proofErr w:type="spellEnd"/>
+      <w:r>
+        <w:rPr>
+          <w:rFonts w:ascii="Arial" w:hAnsi="Arial" w:cs="Arial"/>
+          <w:sz w:val="24"/>
+          <w:szCs w:val="24"/>
+        </w:rPr>
+        <w:t xml:space="preserve">, </w:t>
+      </w:r>
+      <w:proofErr w:type="spellStart"/>
+      <w:r>
+        <w:rPr>
+          <w:rFonts w:ascii="Arial" w:hAnsi="Arial" w:cs="Arial"/>
+          <w:sz w:val="24"/>
+          <w:szCs w:val="24"/>
+        </w:rPr>
+        <w:t>ensuring</w:t>
+      </w:r>
+      <w:proofErr w:type="spellEnd"/>
+      <w:r>
+        <w:rPr>
+          <w:rFonts w:ascii="Arial" w:hAnsi="Arial" w:cs="Arial"/>
+          <w:sz w:val="24"/>
+          <w:szCs w:val="24"/>
+        </w:rPr>
+        <w:t xml:space="preserve"> </w:t>
+      </w:r>
+      <w:proofErr w:type="spellStart"/>
+      <w:r>
+        <w:rPr>
+          <w:rFonts w:ascii="Arial" w:hAnsi="Arial" w:cs="Arial"/>
+          <w:sz w:val="24"/>
+          <w:szCs w:val="24"/>
+        </w:rPr>
+        <w:t>these</w:t>
+      </w:r>
+      <w:proofErr w:type="spellEnd"/>
+      <w:r>
+        <w:rPr>
+          <w:rFonts w:ascii="Arial" w:hAnsi="Arial" w:cs="Arial"/>
+          <w:sz w:val="24"/>
+          <w:szCs w:val="24"/>
+        </w:rPr>
+        <w:t xml:space="preserve"> </w:t>
+      </w:r>
+      <w:proofErr w:type="spellStart"/>
+      <w:r>
+        <w:rPr>
+          <w:rFonts w:ascii="Arial" w:hAnsi="Arial" w:cs="Arial"/>
+          <w:sz w:val="24"/>
+          <w:szCs w:val="24"/>
+        </w:rPr>
+        <w:t>students</w:t>
+      </w:r>
+      <w:proofErr w:type="spellEnd"/>
+      <w:r>
+        <w:rPr>
+          <w:rFonts w:ascii="Arial" w:hAnsi="Arial" w:cs="Arial"/>
+          <w:sz w:val="24"/>
+          <w:szCs w:val="24"/>
+        </w:rPr>
+        <w:t xml:space="preserve">’ </w:t>
+      </w:r>
+      <w:proofErr w:type="spellStart"/>
+      <w:r>
+        <w:rPr>
+          <w:rFonts w:ascii="Arial" w:hAnsi="Arial" w:cs="Arial"/>
+          <w:sz w:val="24"/>
+          <w:szCs w:val="24"/>
+        </w:rPr>
+        <w:t>understanding</w:t>
+      </w:r>
+      <w:proofErr w:type="spellEnd"/>
+      <w:r>
+        <w:rPr>
+          <w:rFonts w:ascii="Arial" w:hAnsi="Arial" w:cs="Arial"/>
+          <w:sz w:val="24"/>
+          <w:szCs w:val="24"/>
+        </w:rPr>
+        <w:t xml:space="preserve"> </w:t>
+      </w:r>
+      <w:proofErr w:type="spellStart"/>
+      <w:r>
+        <w:rPr>
+          <w:rFonts w:ascii="Arial" w:hAnsi="Arial" w:cs="Arial"/>
+          <w:sz w:val="24"/>
+          <w:szCs w:val="24"/>
+        </w:rPr>
+        <w:t>of</w:t>
+      </w:r>
+      <w:proofErr w:type="spellEnd"/>
+      <w:r>
+        <w:rPr>
+          <w:rFonts w:ascii="Arial" w:hAnsi="Arial" w:cs="Arial"/>
+          <w:sz w:val="24"/>
+          <w:szCs w:val="24"/>
+        </w:rPr>
+        <w:t xml:space="preserve"> </w:t>
+      </w:r>
+      <w:proofErr w:type="spellStart"/>
+      <w:r>
+        <w:rPr>
+          <w:rFonts w:ascii="Arial" w:hAnsi="Arial" w:cs="Arial"/>
+          <w:sz w:val="24"/>
+          <w:szCs w:val="24"/>
+        </w:rPr>
+        <w:t>the</w:t>
+      </w:r>
+      <w:proofErr w:type="spellEnd"/>
+      <w:r>
+        <w:rPr>
+          <w:rFonts w:ascii="Arial" w:hAnsi="Arial" w:cs="Arial"/>
+          <w:sz w:val="24"/>
+          <w:szCs w:val="24"/>
+        </w:rPr>
+        <w:t xml:space="preserve"> </w:t>
+      </w:r>
+      <w:proofErr w:type="spellStart"/>
+      <w:r>
+        <w:rPr>
+          <w:rFonts w:ascii="Arial" w:hAnsi="Arial" w:cs="Arial"/>
+          <w:sz w:val="24"/>
+          <w:szCs w:val="24"/>
+        </w:rPr>
+        <w:t>subject</w:t>
+      </w:r>
+      <w:proofErr w:type="spellEnd"/>
+      <w:r>
+        <w:rPr>
+          <w:rFonts w:ascii="Arial" w:hAnsi="Arial" w:cs="Arial"/>
+          <w:sz w:val="24"/>
+          <w:szCs w:val="24"/>
+        </w:rPr>
+        <w:t xml:space="preserve"> </w:t>
+      </w:r>
+      <w:proofErr w:type="spellStart"/>
+      <w:r>
+        <w:rPr>
+          <w:rFonts w:ascii="Arial" w:hAnsi="Arial" w:cs="Arial"/>
+          <w:sz w:val="24"/>
+          <w:szCs w:val="24"/>
+        </w:rPr>
+        <w:t>matter</w:t>
+      </w:r>
+      <w:proofErr w:type="spellEnd"/>
+      <w:r>
+        <w:rPr>
+          <w:rFonts w:ascii="Arial" w:hAnsi="Arial" w:cs="Arial"/>
+          <w:sz w:val="24"/>
+          <w:szCs w:val="24"/>
+        </w:rPr>
+        <w:t xml:space="preserve">, </w:t>
+      </w:r>
+      <w:proofErr w:type="spellStart"/>
+      <w:r>
+        <w:rPr>
+          <w:rFonts w:ascii="Arial" w:hAnsi="Arial" w:cs="Arial"/>
+          <w:sz w:val="24"/>
+          <w:szCs w:val="24"/>
+        </w:rPr>
+        <w:t>handling</w:t>
+      </w:r>
+      <w:proofErr w:type="spellEnd"/>
+      <w:r>
+        <w:rPr>
+          <w:rFonts w:ascii="Arial" w:hAnsi="Arial" w:cs="Arial"/>
+          <w:sz w:val="24"/>
+          <w:szCs w:val="24"/>
+        </w:rPr>
+        <w:t xml:space="preserve"> </w:t>
+      </w:r>
+      <w:proofErr w:type="spellStart"/>
+      <w:r>
+        <w:rPr>
+          <w:rFonts w:ascii="Arial" w:hAnsi="Arial" w:cs="Arial"/>
+          <w:sz w:val="24"/>
+          <w:szCs w:val="24"/>
+        </w:rPr>
+        <w:t>certain</w:t>
+      </w:r>
+      <w:proofErr w:type="spellEnd"/>
+      <w:r>
+        <w:rPr>
+          <w:rFonts w:ascii="Arial" w:hAnsi="Arial" w:cs="Arial"/>
+          <w:sz w:val="24"/>
+          <w:szCs w:val="24"/>
+        </w:rPr>
+        <w:t xml:space="preserve"> </w:t>
+      </w:r>
+      <w:proofErr w:type="spellStart"/>
+      <w:r>
+        <w:rPr>
+          <w:rFonts w:ascii="Arial" w:hAnsi="Arial" w:cs="Arial"/>
+          <w:sz w:val="24"/>
+          <w:szCs w:val="24"/>
+        </w:rPr>
+        <w:t>classroom</w:t>
+      </w:r>
+      <w:proofErr w:type="spellEnd"/>
+      <w:r>
+        <w:rPr>
+          <w:rFonts w:ascii="Arial" w:hAnsi="Arial" w:cs="Arial"/>
+          <w:sz w:val="24"/>
+          <w:szCs w:val="24"/>
+        </w:rPr>
+        <w:t xml:space="preserve"> </w:t>
+      </w:r>
+      <w:proofErr w:type="spellStart"/>
+      <w:r>
+        <w:rPr>
+          <w:rFonts w:ascii="Arial" w:hAnsi="Arial" w:cs="Arial"/>
+          <w:sz w:val="24"/>
+          <w:szCs w:val="24"/>
+        </w:rPr>
+        <w:t>situations</w:t>
+      </w:r>
+      <w:proofErr w:type="spellEnd"/>
+      <w:r>
+        <w:rPr>
+          <w:rFonts w:ascii="Arial" w:hAnsi="Arial" w:cs="Arial"/>
+          <w:sz w:val="24"/>
+          <w:szCs w:val="24"/>
+        </w:rPr>
+        <w:t xml:space="preserve">, </w:t>
+      </w:r>
+      <w:proofErr w:type="spellStart"/>
+      <w:r>
+        <w:rPr>
+          <w:rFonts w:ascii="Arial" w:hAnsi="Arial" w:cs="Arial"/>
+          <w:sz w:val="24"/>
+          <w:szCs w:val="24"/>
+        </w:rPr>
+        <w:t>and</w:t>
+      </w:r>
+      <w:proofErr w:type="spellEnd"/>
+      <w:r>
+        <w:rPr>
+          <w:rFonts w:ascii="Arial" w:hAnsi="Arial" w:cs="Arial"/>
+          <w:sz w:val="24"/>
+          <w:szCs w:val="24"/>
+        </w:rPr>
+        <w:t xml:space="preserve"> </w:t>
+      </w:r>
+      <w:proofErr w:type="spellStart"/>
+      <w:r>
+        <w:rPr>
+          <w:rFonts w:ascii="Arial" w:hAnsi="Arial" w:cs="Arial"/>
+          <w:sz w:val="24"/>
+          <w:szCs w:val="24"/>
+        </w:rPr>
+        <w:t>administering</w:t>
+      </w:r>
+      <w:proofErr w:type="spellEnd"/>
+      <w:r>
+        <w:rPr>
+          <w:rFonts w:ascii="Arial" w:hAnsi="Arial" w:cs="Arial"/>
+          <w:sz w:val="24"/>
+          <w:szCs w:val="24"/>
+        </w:rPr>
+        <w:t xml:space="preserve"> assessments </w:t>
+      </w:r>
+      <w:proofErr w:type="spellStart"/>
+      <w:r>
+        <w:rPr>
+          <w:rFonts w:ascii="Arial" w:hAnsi="Arial" w:cs="Arial"/>
+          <w:sz w:val="24"/>
+          <w:szCs w:val="24"/>
+        </w:rPr>
+        <w:t>to</w:t>
+      </w:r>
+      <w:proofErr w:type="spellEnd"/>
+      <w:r>
+        <w:rPr>
+          <w:rFonts w:ascii="Arial" w:hAnsi="Arial" w:cs="Arial"/>
+          <w:sz w:val="24"/>
+          <w:szCs w:val="24"/>
+        </w:rPr>
+        <w:t xml:space="preserve"> </w:t>
+      </w:r>
+      <w:proofErr w:type="spellStart"/>
+      <w:r>
+        <w:rPr>
+          <w:rFonts w:ascii="Arial" w:hAnsi="Arial" w:cs="Arial"/>
+          <w:sz w:val="24"/>
+          <w:szCs w:val="24"/>
+        </w:rPr>
+        <w:t>them</w:t>
+      </w:r>
+      <w:proofErr w:type="spellEnd"/>
+      <w:r>
+        <w:rPr>
+          <w:rFonts w:ascii="Arial" w:hAnsi="Arial" w:cs="Arial"/>
+          <w:sz w:val="24"/>
+          <w:szCs w:val="24"/>
+        </w:rPr>
+        <w:t xml:space="preserve">. </w:t>
+      </w:r>
+      <w:proofErr w:type="spellStart"/>
+      <w:r>
+        <w:rPr>
+          <w:rFonts w:ascii="Arial" w:hAnsi="Arial" w:cs="Arial"/>
+          <w:sz w:val="24"/>
+          <w:szCs w:val="24"/>
+        </w:rPr>
+        <w:t>Based</w:t>
+      </w:r>
+      <w:proofErr w:type="spellEnd"/>
+      <w:r>
+        <w:rPr>
+          <w:rFonts w:ascii="Arial" w:hAnsi="Arial" w:cs="Arial"/>
+          <w:sz w:val="24"/>
+          <w:szCs w:val="24"/>
+        </w:rPr>
+        <w:t xml:space="preserve"> </w:t>
+      </w:r>
+      <w:proofErr w:type="spellStart"/>
+      <w:r>
+        <w:rPr>
+          <w:rFonts w:ascii="Arial" w:hAnsi="Arial" w:cs="Arial"/>
+          <w:sz w:val="24"/>
+          <w:szCs w:val="24"/>
+        </w:rPr>
+        <w:t>on</w:t>
+      </w:r>
+      <w:proofErr w:type="spellEnd"/>
+      <w:r>
+        <w:rPr>
+          <w:rFonts w:ascii="Arial" w:hAnsi="Arial" w:cs="Arial"/>
+          <w:sz w:val="24"/>
+          <w:szCs w:val="24"/>
+        </w:rPr>
+        <w:t xml:space="preserve"> </w:t>
+      </w:r>
+      <w:proofErr w:type="spellStart"/>
+      <w:r>
+        <w:rPr>
+          <w:rFonts w:ascii="Arial" w:hAnsi="Arial" w:cs="Arial"/>
+          <w:sz w:val="24"/>
+          <w:szCs w:val="24"/>
+        </w:rPr>
+        <w:t>these</w:t>
+      </w:r>
+      <w:proofErr w:type="spellEnd"/>
+      <w:r>
+        <w:rPr>
+          <w:rFonts w:ascii="Arial" w:hAnsi="Arial" w:cs="Arial"/>
+          <w:sz w:val="24"/>
+          <w:szCs w:val="24"/>
+        </w:rPr>
+        <w:t xml:space="preserve"> </w:t>
+      </w:r>
+      <w:proofErr w:type="spellStart"/>
+      <w:r>
+        <w:rPr>
+          <w:rFonts w:ascii="Arial" w:hAnsi="Arial" w:cs="Arial"/>
+          <w:sz w:val="24"/>
+          <w:szCs w:val="24"/>
+        </w:rPr>
+        <w:t>challenges</w:t>
+      </w:r>
+      <w:proofErr w:type="spellEnd"/>
+      <w:r>
+        <w:rPr>
+          <w:rFonts w:ascii="Arial" w:hAnsi="Arial" w:cs="Arial"/>
+          <w:sz w:val="24"/>
+          <w:szCs w:val="24"/>
+        </w:rPr>
+        <w:t xml:space="preserve">, TEA </w:t>
+      </w:r>
+      <w:proofErr w:type="spellStart"/>
+      <w:r>
+        <w:rPr>
+          <w:rFonts w:ascii="Arial" w:hAnsi="Arial" w:cs="Arial"/>
+          <w:sz w:val="24"/>
+          <w:szCs w:val="24"/>
+        </w:rPr>
+        <w:t>Learn</w:t>
+      </w:r>
+      <w:proofErr w:type="spellEnd"/>
+      <w:r>
+        <w:rPr>
+          <w:rFonts w:ascii="Arial" w:hAnsi="Arial" w:cs="Arial"/>
+          <w:sz w:val="24"/>
+          <w:szCs w:val="24"/>
+        </w:rPr>
+        <w:t xml:space="preserve"> </w:t>
+      </w:r>
+      <w:proofErr w:type="spellStart"/>
+      <w:r>
+        <w:rPr>
+          <w:rFonts w:ascii="Arial" w:hAnsi="Arial" w:cs="Arial"/>
+          <w:sz w:val="24"/>
+          <w:szCs w:val="24"/>
+        </w:rPr>
+        <w:t>was</w:t>
+      </w:r>
+      <w:proofErr w:type="spellEnd"/>
+      <w:r>
+        <w:rPr>
+          <w:rFonts w:ascii="Arial" w:hAnsi="Arial" w:cs="Arial"/>
+          <w:sz w:val="24"/>
+          <w:szCs w:val="24"/>
+        </w:rPr>
+        <w:t xml:space="preserve"> </w:t>
+      </w:r>
+      <w:proofErr w:type="spellStart"/>
+      <w:r>
+        <w:rPr>
+          <w:rFonts w:ascii="Arial" w:hAnsi="Arial" w:cs="Arial"/>
+          <w:sz w:val="24"/>
+          <w:szCs w:val="24"/>
+        </w:rPr>
+        <w:t>created</w:t>
+      </w:r>
+      <w:proofErr w:type="spellEnd"/>
+      <w:r>
+        <w:rPr>
+          <w:rFonts w:ascii="Arial" w:hAnsi="Arial" w:cs="Arial"/>
+          <w:sz w:val="24"/>
+          <w:szCs w:val="24"/>
+        </w:rPr>
+        <w:t xml:space="preserve"> </w:t>
+      </w:r>
+      <w:proofErr w:type="spellStart"/>
+      <w:r>
+        <w:rPr>
+          <w:rFonts w:ascii="Arial" w:hAnsi="Arial" w:cs="Arial"/>
+          <w:sz w:val="24"/>
+          <w:szCs w:val="24"/>
+        </w:rPr>
+        <w:t>with</w:t>
+      </w:r>
+      <w:proofErr w:type="spellEnd"/>
+      <w:r>
+        <w:rPr>
+          <w:rFonts w:ascii="Arial" w:hAnsi="Arial" w:cs="Arial"/>
+          <w:sz w:val="24"/>
+          <w:szCs w:val="24"/>
+        </w:rPr>
+        <w:t xml:space="preserve"> </w:t>
+      </w:r>
+      <w:proofErr w:type="spellStart"/>
+      <w:r>
+        <w:rPr>
+          <w:rFonts w:ascii="Arial" w:hAnsi="Arial" w:cs="Arial"/>
+          <w:sz w:val="24"/>
+          <w:szCs w:val="24"/>
+        </w:rPr>
+        <w:t>the</w:t>
+      </w:r>
+      <w:proofErr w:type="spellEnd"/>
+      <w:r>
+        <w:rPr>
+          <w:rFonts w:ascii="Arial" w:hAnsi="Arial" w:cs="Arial"/>
+          <w:sz w:val="24"/>
+          <w:szCs w:val="24"/>
+        </w:rPr>
+        <w:t xml:space="preserve"> </w:t>
+      </w:r>
+      <w:proofErr w:type="spellStart"/>
+      <w:r>
+        <w:rPr>
+          <w:rFonts w:ascii="Arial" w:hAnsi="Arial" w:cs="Arial"/>
+          <w:sz w:val="24"/>
+          <w:szCs w:val="24"/>
+        </w:rPr>
+        <w:t>goal</w:t>
+      </w:r>
+      <w:proofErr w:type="spellEnd"/>
+      <w:r>
+        <w:rPr>
+          <w:rFonts w:ascii="Arial" w:hAnsi="Arial" w:cs="Arial"/>
+          <w:sz w:val="24"/>
+          <w:szCs w:val="24"/>
+        </w:rPr>
+        <w:t xml:space="preserve"> </w:t>
+      </w:r>
+      <w:proofErr w:type="spellStart"/>
+      <w:r>
+        <w:rPr>
+          <w:rFonts w:ascii="Arial" w:hAnsi="Arial" w:cs="Arial"/>
+          <w:sz w:val="24"/>
+          <w:szCs w:val="24"/>
+        </w:rPr>
+        <w:t>of</w:t>
+      </w:r>
+      <w:proofErr w:type="spellEnd"/>
+      <w:r>
+        <w:rPr>
+          <w:rFonts w:ascii="Arial" w:hAnsi="Arial" w:cs="Arial"/>
+          <w:sz w:val="24"/>
+          <w:szCs w:val="24"/>
+        </w:rPr>
+        <w:t xml:space="preserve"> </w:t>
+      </w:r>
+      <w:proofErr w:type="spellStart"/>
+      <w:r>
+        <w:rPr>
+          <w:rFonts w:ascii="Arial" w:hAnsi="Arial" w:cs="Arial"/>
+          <w:sz w:val="24"/>
+          <w:szCs w:val="24"/>
+        </w:rPr>
+        <w:t>mitigating</w:t>
+      </w:r>
+      <w:proofErr w:type="spellEnd"/>
+      <w:r>
+        <w:rPr>
+          <w:rFonts w:ascii="Arial" w:hAnsi="Arial" w:cs="Arial"/>
+          <w:sz w:val="24"/>
+          <w:szCs w:val="24"/>
+        </w:rPr>
+        <w:t xml:space="preserve"> </w:t>
+      </w:r>
+      <w:proofErr w:type="spellStart"/>
+      <w:r>
+        <w:rPr>
+          <w:rFonts w:ascii="Arial" w:hAnsi="Arial" w:cs="Arial"/>
+          <w:sz w:val="24"/>
+          <w:szCs w:val="24"/>
+        </w:rPr>
+        <w:t>these</w:t>
+      </w:r>
+      <w:proofErr w:type="spellEnd"/>
+      <w:r>
+        <w:rPr>
+          <w:rFonts w:ascii="Arial" w:hAnsi="Arial" w:cs="Arial"/>
+          <w:sz w:val="24"/>
+          <w:szCs w:val="24"/>
+        </w:rPr>
+        <w:t xml:space="preserve"> </w:t>
+      </w:r>
+      <w:proofErr w:type="spellStart"/>
+      <w:r>
+        <w:rPr>
+          <w:rFonts w:ascii="Arial" w:hAnsi="Arial" w:cs="Arial"/>
+          <w:sz w:val="24"/>
+          <w:szCs w:val="24"/>
+        </w:rPr>
+        <w:t>obstacles</w:t>
+      </w:r>
+      <w:proofErr w:type="spellEnd"/>
+      <w:r>
+        <w:rPr>
+          <w:rFonts w:ascii="Arial" w:hAnsi="Arial" w:cs="Arial"/>
+          <w:sz w:val="24"/>
+          <w:szCs w:val="24"/>
+        </w:rPr>
+        <w:t xml:space="preserve"> </w:t>
+      </w:r>
+      <w:proofErr w:type="spellStart"/>
+      <w:r>
+        <w:rPr>
+          <w:rFonts w:ascii="Arial" w:hAnsi="Arial" w:cs="Arial"/>
+          <w:sz w:val="24"/>
+          <w:szCs w:val="24"/>
+        </w:rPr>
+        <w:t>and</w:t>
+      </w:r>
+      <w:proofErr w:type="spellEnd"/>
+      <w:r>
+        <w:rPr>
+          <w:rFonts w:ascii="Arial" w:hAnsi="Arial" w:cs="Arial"/>
+          <w:sz w:val="24"/>
+          <w:szCs w:val="24"/>
+        </w:rPr>
+        <w:t xml:space="preserve"> </w:t>
+      </w:r>
+      <w:proofErr w:type="spellStart"/>
+      <w:r>
+        <w:rPr>
+          <w:rFonts w:ascii="Arial" w:hAnsi="Arial" w:cs="Arial"/>
+          <w:sz w:val="24"/>
+          <w:szCs w:val="24"/>
+        </w:rPr>
+        <w:t>assisting</w:t>
+      </w:r>
+      <w:proofErr w:type="spellEnd"/>
+      <w:r>
+        <w:rPr>
+          <w:rFonts w:ascii="Arial" w:hAnsi="Arial" w:cs="Arial"/>
+          <w:sz w:val="24"/>
+          <w:szCs w:val="24"/>
+        </w:rPr>
+        <w:t xml:space="preserve"> </w:t>
+      </w:r>
+      <w:proofErr w:type="spellStart"/>
+      <w:r>
+        <w:rPr>
+          <w:rFonts w:ascii="Arial" w:hAnsi="Arial" w:cs="Arial"/>
+          <w:sz w:val="24"/>
+          <w:szCs w:val="24"/>
+        </w:rPr>
+        <w:t>these</w:t>
+      </w:r>
+      <w:proofErr w:type="spellEnd"/>
+      <w:r>
+        <w:rPr>
+          <w:rFonts w:ascii="Arial" w:hAnsi="Arial" w:cs="Arial"/>
+          <w:sz w:val="24"/>
+          <w:szCs w:val="24"/>
+        </w:rPr>
+        <w:t xml:space="preserve"> </w:t>
+      </w:r>
+      <w:proofErr w:type="spellStart"/>
+      <w:r>
+        <w:rPr>
+          <w:rFonts w:ascii="Arial" w:hAnsi="Arial" w:cs="Arial"/>
+          <w:sz w:val="24"/>
+          <w:szCs w:val="24"/>
+        </w:rPr>
+        <w:t>teachers</w:t>
+      </w:r>
+      <w:proofErr w:type="spellEnd"/>
+      <w:r>
+        <w:rPr>
+          <w:rFonts w:ascii="Arial" w:hAnsi="Arial" w:cs="Arial"/>
+          <w:sz w:val="24"/>
+          <w:szCs w:val="24"/>
+        </w:rPr>
+        <w:t xml:space="preserve"> </w:t>
+      </w:r>
+      <w:proofErr w:type="spellStart"/>
+      <w:r>
+        <w:rPr>
+          <w:rFonts w:ascii="Arial" w:hAnsi="Arial" w:cs="Arial"/>
+          <w:sz w:val="24"/>
+          <w:szCs w:val="24"/>
+        </w:rPr>
+        <w:t>by</w:t>
+      </w:r>
+      <w:proofErr w:type="spellEnd"/>
+      <w:r>
+        <w:rPr>
+          <w:rFonts w:ascii="Arial" w:hAnsi="Arial" w:cs="Arial"/>
+          <w:sz w:val="24"/>
+          <w:szCs w:val="24"/>
+        </w:rPr>
+        <w:t xml:space="preserve"> </w:t>
+      </w:r>
+      <w:proofErr w:type="spellStart"/>
+      <w:r>
+        <w:rPr>
+          <w:rFonts w:ascii="Arial" w:hAnsi="Arial" w:cs="Arial"/>
+          <w:sz w:val="24"/>
+          <w:szCs w:val="24"/>
+        </w:rPr>
+        <w:t>applying</w:t>
+      </w:r>
+      <w:proofErr w:type="spellEnd"/>
+      <w:r>
+        <w:rPr>
+          <w:rFonts w:ascii="Arial" w:hAnsi="Arial" w:cs="Arial"/>
+          <w:sz w:val="24"/>
+          <w:szCs w:val="24"/>
+        </w:rPr>
+        <w:t xml:space="preserve"> AI </w:t>
+      </w:r>
+      <w:proofErr w:type="spellStart"/>
+      <w:r>
+        <w:rPr>
+          <w:rFonts w:ascii="Arial" w:hAnsi="Arial" w:cs="Arial"/>
+          <w:sz w:val="24"/>
+          <w:szCs w:val="24"/>
+        </w:rPr>
+        <w:t>to</w:t>
+      </w:r>
+      <w:proofErr w:type="spellEnd"/>
+      <w:r>
+        <w:rPr>
+          <w:rFonts w:ascii="Arial" w:hAnsi="Arial" w:cs="Arial"/>
+          <w:sz w:val="24"/>
+          <w:szCs w:val="24"/>
+        </w:rPr>
+        <w:t xml:space="preserve"> </w:t>
+      </w:r>
+      <w:proofErr w:type="spellStart"/>
+      <w:r>
+        <w:rPr>
+          <w:rFonts w:ascii="Arial" w:hAnsi="Arial" w:cs="Arial"/>
+          <w:sz w:val="24"/>
+          <w:szCs w:val="24"/>
+        </w:rPr>
+        <w:t>this</w:t>
+      </w:r>
+      <w:proofErr w:type="spellEnd"/>
+      <w:r>
+        <w:rPr>
+          <w:rFonts w:ascii="Arial" w:hAnsi="Arial" w:cs="Arial"/>
+          <w:sz w:val="24"/>
+          <w:szCs w:val="24"/>
+        </w:rPr>
+        <w:t xml:space="preserve"> </w:t>
+      </w:r>
+      <w:proofErr w:type="spellStart"/>
+      <w:r>
+        <w:rPr>
+          <w:rFonts w:ascii="Arial" w:hAnsi="Arial" w:cs="Arial"/>
+          <w:sz w:val="24"/>
+          <w:szCs w:val="24"/>
+        </w:rPr>
+        <w:t>field</w:t>
+      </w:r>
+      <w:proofErr w:type="spellEnd"/>
+      <w:r>
+        <w:rPr>
+          <w:rFonts w:ascii="Arial" w:hAnsi="Arial" w:cs="Arial"/>
+          <w:sz w:val="24"/>
+          <w:szCs w:val="24"/>
+        </w:rPr>
+        <w:t>.</w:t>
+      </w:r>
+    </w:p>
+    <w:p>
+      <w:pPr>
+        <w:spacing w:after="0" w:line="360" w:lineRule="auto"/>
+        <w:rPr>
+          <w:rFonts w:ascii="Arial" w:hAnsi="Arial" w:cs="Arial"/>
+          <w:sz w:val="24"/>
+          <w:szCs w:val="24"/>
+        </w:rPr>
+      </w:pPr>
+      <w:r>
+        <w:rPr>
+          <w:rFonts w:ascii="Arial" w:hAnsi="Arial" w:cs="Arial"/>
+          <w:b/>
+          <w:bCs/>
+          <w:sz w:val="24"/>
+          <w:szCs w:val="24"/>
+        </w:rPr>
+        <w:t>Keywords</w:t>
+      </w:r>
+      <w:r>
+        <w:rPr>
+          <w:rFonts w:ascii="Arial" w:hAnsi="Arial" w:cs="Arial"/>
+          <w:sz w:val="24"/>
+          <w:szCs w:val="24"/>
+        </w:rPr>
+        <w:t xml:space="preserve">: </w:t>
+      </w:r>
+      <w:proofErr w:type="spellStart"/>
+      <w:r>
+        <w:rPr>
+          <w:rFonts w:ascii="Arial" w:hAnsi="Arial" w:cs="Arial"/>
+          <w:sz w:val="24"/>
+          <w:szCs w:val="24"/>
+        </w:rPr>
+        <w:t>Adapted</w:t>
+      </w:r>
+      <w:proofErr w:type="spellEnd"/>
+      <w:r>
+        <w:rPr>
+          <w:rFonts w:ascii="Arial" w:hAnsi="Arial" w:cs="Arial"/>
+          <w:sz w:val="24"/>
+          <w:szCs w:val="24"/>
+        </w:rPr>
+        <w:t xml:space="preserve"> </w:t>
+      </w:r>
+      <w:proofErr w:type="spellStart"/>
+      <w:r>
+        <w:rPr>
+          <w:rFonts w:ascii="Arial" w:hAnsi="Arial" w:cs="Arial"/>
+          <w:sz w:val="24"/>
+          <w:szCs w:val="24"/>
+        </w:rPr>
+        <w:t>materials</w:t>
+      </w:r>
+      <w:proofErr w:type="spellEnd"/>
+      <w:r>
+        <w:rPr>
+          <w:rFonts w:ascii="Arial" w:hAnsi="Arial" w:cs="Arial"/>
+          <w:sz w:val="24"/>
+          <w:szCs w:val="24"/>
+        </w:rPr>
+        <w:t xml:space="preserve">. Artificial </w:t>
+      </w:r>
+      <w:proofErr w:type="spellStart"/>
+      <w:r>
+        <w:rPr>
+          <w:rFonts w:ascii="Arial" w:hAnsi="Arial" w:cs="Arial"/>
+          <w:sz w:val="24"/>
+          <w:szCs w:val="24"/>
+        </w:rPr>
+        <w:t>Intelligence</w:t>
+      </w:r>
+      <w:proofErr w:type="spellEnd"/>
+      <w:r>
+        <w:rPr>
+          <w:rFonts w:ascii="Arial" w:hAnsi="Arial" w:cs="Arial"/>
+          <w:sz w:val="24"/>
+          <w:szCs w:val="24"/>
+        </w:rPr>
+        <w:t xml:space="preserve">. </w:t>
+      </w:r>
+      <w:proofErr w:type="spellStart"/>
+      <w:r>
+        <w:rPr>
+          <w:rFonts w:ascii="Arial" w:hAnsi="Arial" w:cs="Arial"/>
+          <w:sz w:val="24"/>
+          <w:szCs w:val="24"/>
+        </w:rPr>
+        <w:t>Inclusion</w:t>
+      </w:r>
+      <w:proofErr w:type="spellEnd"/>
+      <w:r>
+        <w:rPr>
+          <w:rFonts w:ascii="Arial" w:hAnsi="Arial" w:cs="Arial"/>
+          <w:sz w:val="24"/>
+          <w:szCs w:val="24"/>
+        </w:rPr>
+        <w:t>.</w:t>
+      </w:r>
+    </w:p>
+    <w:p>
+      <w:pPr>
+        <w:spacing w:after="0" w:line="360" w:lineRule="auto"/>
+        <w:jc w:val="center"/>
+        <w:rPr>
+          <w:rFonts w:ascii="Arial" w:hAnsi="Arial" w:cs="Arial"/>
+          <w:sz w:val="24"/>
+          <w:szCs w:val="24"/>
+        </w:rPr>
+      </w:pPr>
+    </w:p>
+    <w:p>
+      <w:pPr>
+        <w:spacing w:after="0" w:line="360" w:lineRule="auto"/>
+        <w:jc w:val="center"/>
+        <w:rPr>
+          <w:rFonts w:ascii="Arial" w:hAnsi="Arial" w:cs="Arial"/>
+          <w:sz w:val="24"/>
+          <w:szCs w:val="24"/>
+        </w:rPr>
+      </w:pPr>
+    </w:p>
+    <w:p>
+      <w:pPr>
+        <w:spacing w:after="0" w:line="360" w:lineRule="auto"/>
+        <w:jc w:val="center"/>
+        <w:rPr>
+          <w:rFonts w:ascii="Arial" w:hAnsi="Arial" w:cs="Arial"/>
+          <w:sz w:val="24"/>
+          <w:szCs w:val="24"/>
+        </w:rPr>
+      </w:pPr>
+    </w:p>
+    <w:p>
+      <w:pPr>
+        <w:spacing w:after="0" w:line="360" w:lineRule="auto"/>
+        <w:jc w:val="center"/>
+        <w:rPr>
+          <w:rFonts w:ascii="Arial" w:hAnsi="Arial" w:cs="Arial"/>
+          <w:sz w:val="24"/>
+          <w:szCs w:val="24"/>
+        </w:rPr>
+      </w:pPr>
+    </w:p>
+    <w:p>
+      <w:pPr>
+        <w:spacing w:after="0" w:line="360" w:lineRule="auto"/>
+        <w:jc w:val="center"/>
+        <w:rPr>
+          <w:rFonts w:ascii="Arial" w:hAnsi="Arial" w:cs="Arial"/>
+          <w:sz w:val="24"/>
+          <w:szCs w:val="24"/>
+        </w:rPr>
+      </w:pPr>
+    </w:p>
+    <w:p>
+      <w:pPr>
+        <w:spacing w:after="0" w:line="360" w:lineRule="auto"/>
+        <w:jc w:val="center"/>
+        <w:rPr>
+          <w:rFonts w:ascii="Arial" w:hAnsi="Arial" w:cs="Arial"/>
+          <w:sz w:val="24"/>
+          <w:szCs w:val="24"/>
+        </w:rPr>
+      </w:pPr>
+    </w:p>
+    <w:p>
+      <w:pPr>
+        <w:spacing w:after="0" w:line="360" w:lineRule="auto"/>
+        <w:jc w:val="center"/>
+        <w:rPr>
+          <w:rFonts w:ascii="Arial" w:hAnsi="Arial" w:cs="Arial"/>
+          <w:sz w:val="24"/>
+          <w:szCs w:val="24"/>
+        </w:rPr>
+      </w:pPr>
+    </w:p>
+    <w:p>
+      <w:pPr>
+        <w:spacing w:after="0" w:line="360" w:lineRule="auto"/>
+        <w:jc w:val="center"/>
+        <w:rPr>
+          <w:rFonts w:ascii="Arial" w:hAnsi="Arial" w:cs="Arial"/>
+          <w:sz w:val="24"/>
+          <w:szCs w:val="24"/>
+        </w:rPr>
+      </w:pPr>
+    </w:p>
+    <w:p>
+      <w:pPr>
+        <w:spacing w:after="0" w:line="360" w:lineRule="auto"/>
+        <w:jc w:val="center"/>
+        <w:rPr>
+          <w:rFonts w:ascii="Arial" w:hAnsi="Arial" w:cs="Arial"/>
+          <w:sz w:val="24"/>
+          <w:szCs w:val="24"/>
+        </w:rPr>
+      </w:pPr>
+    </w:p>
+    <w:p>
+      <w:pPr>
+        <w:spacing w:after="0" w:line="360" w:lineRule="auto"/>
+        <w:jc w:val="center"/>
+        <w:rPr>
+          <w:rFonts w:ascii="Arial" w:hAnsi="Arial" w:cs="Arial"/>
+          <w:sz w:val="24"/>
+          <w:szCs w:val="24"/>
+        </w:rPr>
+      </w:pPr>
+    </w:p>
+    <w:p>
+      <w:pPr>
+        <w:spacing w:after="0" w:line="360" w:lineRule="auto"/>
+        <w:jc w:val="center"/>
+        <w:rPr>
+          <w:rFonts w:ascii="Arial" w:hAnsi="Arial" w:cs="Arial"/>
+          <w:sz w:val="24"/>
+          <w:szCs w:val="24"/>
+        </w:rPr>
+      </w:pPr>
+    </w:p>
+    <w:p>
+      <w:pPr>
+        <w:spacing w:after="0" w:line="360" w:lineRule="auto"/>
+        <w:jc w:val="center"/>
+        <w:rPr>
+          <w:rFonts w:ascii="Arial" w:hAnsi="Arial" w:cs="Arial"/>
+          <w:sz w:val="24"/>
+          <w:szCs w:val="24"/>
+        </w:rPr>
+      </w:pPr>
+    </w:p>
+    <w:p>
+      <w:pPr>
+        <w:spacing w:after="0" w:line="360" w:lineRule="auto"/>
+        <w:jc w:val="center"/>
+        <w:rPr>
+          <w:rFonts w:ascii="Arial" w:hAnsi="Arial" w:cs="Arial"/>
+          <w:sz w:val="24"/>
+          <w:szCs w:val="24"/>
+        </w:rPr>
+      </w:pPr>
+    </w:p>
+    <w:p>
+      <w:pPr>
+        <w:spacing w:after="0" w:line="360" w:lineRule="auto"/>
+        <w:jc w:val="center"/>
+        <w:rPr>
+          <w:rFonts w:ascii="Arial" w:hAnsi="Arial" w:cs="Arial"/>
+          <w:sz w:val="24"/>
+          <w:szCs w:val="24"/>
+        </w:rPr>
+      </w:pPr>
+    </w:p>
+    <w:p>
+      <w:pPr>
+        <w:spacing w:after="0" w:line="360" w:lineRule="auto"/>
+        <w:jc w:val="center"/>
+        <w:rPr>
+          <w:rFonts w:ascii="Arial" w:hAnsi="Arial" w:cs="Arial"/>
+          <w:sz w:val="24"/>
+          <w:szCs w:val="24"/>
+        </w:rPr>
+      </w:pPr>
+    </w:p>
+    <w:p>
+      <w:pPr>
+        <w:spacing w:after="0" w:line="360" w:lineRule="auto"/>
+        <w:jc w:val="center"/>
+        <w:rPr>
+          <w:rFonts w:ascii="Arial" w:hAnsi="Arial" w:cs="Arial"/>
+          <w:sz w:val="24"/>
+          <w:szCs w:val="24"/>
+        </w:rPr>
+      </w:pPr>
+    </w:p>
+    <w:p>
+      <w:pPr>
+        <w:spacing w:after="0" w:line="360" w:lineRule="auto"/>
+        <w:jc w:val="center"/>
+        <w:rPr>
+          <w:rFonts w:ascii="Arial" w:hAnsi="Arial" w:cs="Arial"/>
+          <w:sz w:val="24"/>
+          <w:szCs w:val="24"/>
+        </w:rPr>
+      </w:pPr>
+    </w:p>
+    <w:p>
+      <w:pPr>
+        <w:spacing w:after="0" w:line="360" w:lineRule="auto"/>
+        <w:jc w:val="center"/>
+        <w:rPr>
+          <w:rFonts w:ascii="Arial" w:hAnsi="Arial" w:cs="Arial"/>
+          <w:sz w:val="24"/>
+          <w:szCs w:val="24"/>
+        </w:rPr>
+      </w:pPr>
+    </w:p>
+    <w:p>
+      <w:pPr>
+        <w:spacing w:after="0" w:line="360" w:lineRule="auto"/>
+        <w:jc w:val="center"/>
+        <w:rPr>
+          <w:rFonts w:ascii="Arial" w:hAnsi="Arial" w:cs="Arial"/>
+          <w:sz w:val="24"/>
+          <w:szCs w:val="24"/>
+        </w:rPr>
+      </w:pPr>
+    </w:p>
+    <w:p>
+      <w:pPr>
+        <w:spacing w:after="0" w:line="360" w:lineRule="auto"/>
+        <w:jc w:val="center"/>
+        <w:rPr>
+          <w:rFonts w:ascii="Arial" w:hAnsi="Arial" w:cs="Arial"/>
+          <w:sz w:val="24"/>
+          <w:szCs w:val="24"/>
+        </w:rPr>
+      </w:pPr>
+    </w:p>
+    <w:p>
+      <w:pPr>
+        <w:spacing w:after="0" w:line="360" w:lineRule="auto"/>
+        <w:jc w:val="center"/>
+        <w:rPr>
+          <w:rFonts w:ascii="Arial" w:hAnsi="Arial" w:cs="Arial"/>
+          <w:sz w:val="24"/>
+          <w:szCs w:val="24"/>
+        </w:rPr>
+      </w:pPr>
+    </w:p>
+    <w:p>
+      <w:pPr>
+        <w:spacing w:after="0" w:line="360" w:lineRule="auto"/>
+        <w:jc w:val="center"/>
+        <w:rPr>
+          <w:rFonts w:ascii="Arial" w:hAnsi="Arial" w:cs="Arial"/>
+          <w:sz w:val="24"/>
+          <w:szCs w:val="24"/>
+        </w:rPr>
+      </w:pPr>
+    </w:p>
+    <w:p>
+      <w:pPr>
+        <w:spacing w:after="0" w:line="360" w:lineRule="auto"/>
+        <w:jc w:val="center"/>
+        <w:rPr>
+          <w:rFonts w:ascii="Arial" w:hAnsi="Arial" w:cs="Arial"/>
+          <w:sz w:val="24"/>
+          <w:szCs w:val="24"/>
+        </w:rPr>
+      </w:pPr>
+    </w:p>
+    <w:p>
+      <w:pPr>
+        <w:spacing w:after="0" w:line="360" w:lineRule="auto"/>
+        <w:jc w:val="center"/>
+        <w:rPr>
+          <w:rFonts w:ascii="Arial" w:hAnsi="Arial" w:cs="Arial"/>
+          <w:sz w:val="24"/>
+          <w:szCs w:val="24"/>
+        </w:rPr>
+      </w:pPr>
+    </w:p>
+    <w:p>
+      <w:pPr>
+        <w:spacing w:after="0" w:line="360" w:lineRule="auto"/>
+        <w:jc w:val="center"/>
+        <w:rPr>
+          <w:rFonts w:ascii="Arial" w:hAnsi="Arial" w:cs="Arial"/>
+          <w:sz w:val="24"/>
+          <w:szCs w:val="24"/>
+        </w:rPr>
+      </w:pPr>
+      <w:r>
+        <w:rPr>
+          <w:rFonts w:ascii="Arial" w:hAnsi="Arial" w:cs="Arial"/>
+          <w:sz w:val="24"/>
+          <w:szCs w:val="24"/>
+        </w:rPr>
         <w:t>SUMÁRIO</w:t>
       </w:r>
     </w:p>
@@ -2138,7 +3800,6 @@
           <w:sz w:val="32"/>
           <w:szCs w:val="24"/>
         </w:rPr>
-        <w:lastRenderedPageBreak/>
         <w:t>INTRODUÇÃO</w:t>
       </w:r>
     </w:p>
@@ -2187,6 +3848,62 @@
       <w:r>
         <w:rPr>
           <w:rFonts w:ascii="Arial" w:hAnsi="Arial" w:cs="Arial"/>
+          <w:b/>
+          <w:bCs/>
+          <w:sz w:val="24"/>
+          <w:szCs w:val="24"/>
+        </w:rPr>
+        <w:t>“ESTOU ESCREVENDO, ENTÃO ESSA PARTE NÃO ESTÁ CONTANDO AINDA”</w:t>
+      </w:r>
+      <w:r>
+        <w:rPr>
+          <w:rFonts w:ascii="Arial" w:hAnsi="Arial" w:cs="Arial"/>
+          <w:sz w:val="24"/>
+          <w:szCs w:val="24"/>
+        </w:rPr>
+        <w:t xml:space="preserve">: </w:t>
+      </w:r>
+      <w:r>
+        <w:rPr>
+          <w:rFonts w:ascii="Arial" w:hAnsi="Arial" w:cs="Arial"/>
+          <w:sz w:val="24"/>
+          <w:szCs w:val="24"/>
+        </w:rPr>
+        <w:t>Durante o período do terceiro ano do ensino médio, nós identificamos que a ETEC Professor Camargo Aranha liberou vagas para alunos com TEA (não sei se são apenas nível 1) no processo seletivo (vestibulinho), do ano de 2025 para 2026. A partir desse</w:t>
+      </w:r>
+    </w:p>
+    <w:p>
+      <w:pPr>
+        <w:ind w:firstLine="708"/>
+        <w:jc w:val="both"/>
+        <w:rPr>
+          <w:rFonts w:ascii="Arial" w:hAnsi="Arial" w:cs="Arial"/>
+          <w:sz w:val="24"/>
+          <w:szCs w:val="24"/>
+        </w:rPr>
+      </w:pPr>
+      <w:r>
+        <w:rPr>
+          <w:rFonts w:ascii="Arial" w:hAnsi="Arial" w:cs="Arial"/>
+          <w:sz w:val="24"/>
+          <w:szCs w:val="24"/>
+        </w:rPr>
+        <w:t>-----------------------------------------------------------------------------------------------------</w:t>
+      </w:r>
+    </w:p>
+    <w:p>
+      <w:pPr>
+        <w:ind w:firstLine="708"/>
+        <w:jc w:val="both"/>
+        <w:rPr>
+          <w:rFonts w:ascii="Arial" w:hAnsi="Arial" w:cs="Arial"/>
+          <w:sz w:val="24"/>
+          <w:szCs w:val="24"/>
+        </w:rPr>
+      </w:pPr>
+      <w:r>
+        <w:rPr>
+          <w:rFonts w:ascii="Arial" w:hAnsi="Arial" w:cs="Arial"/>
           <w:sz w:val="24"/>
           <w:szCs w:val="24"/>
         </w:rPr>
@@ -2222,7 +3939,25 @@
           <w:sz w:val="24"/>
           <w:szCs w:val="24"/>
         </w:rPr>
-        <w:t xml:space="preserve"> Professor Camargo Aranha, e com a Clínica Movthera, embora a educação busque ser cada vez mais inclusiva, muitos estudantes com TEA nível 1 enfrentam dificuldades ao utilizar materiais didáticos tradicionais</w:t>
+        <w:t xml:space="preserve"> Professor Camargo Aranha, e com a Clínica </w:t>
+      </w:r>
+      <w:proofErr w:type="spellStart"/>
+      <w:r>
+        <w:rPr>
+          <w:rFonts w:ascii="Arial" w:hAnsi="Arial" w:cs="Arial"/>
+          <w:sz w:val="24"/>
+          <w:szCs w:val="24"/>
+        </w:rPr>
+        <w:t>Movthera</w:t>
+      </w:r>
+      <w:proofErr w:type="spellEnd"/>
+      <w:r>
+        <w:rPr>
+          <w:rFonts w:ascii="Arial" w:hAnsi="Arial" w:cs="Arial"/>
+          <w:sz w:val="24"/>
+          <w:szCs w:val="24"/>
+        </w:rPr>
+        <w:t>, embora a educação busque ser cada vez mais inclusiva, muitos estudantes com TEA nível 1 enfrentam dificuldades ao utilizar materiais didáticos tradicionais</w:t>
       </w:r>
       <w:r>
         <w:rPr>
@@ -2238,7 +3973,25 @@
           <w:sz w:val="24"/>
           <w:szCs w:val="24"/>
         </w:rPr>
-        <w:t>eram nenhum tipo de treinamento de capacitação para transformar esses conteúdos.</w:t>
+        <w:t xml:space="preserve">eram nenhum tipo de treinamento de capacitação para transformar esses </w:t>
+      </w:r>
+      <w:proofErr w:type="spellStart"/>
+      <w:r>
+        <w:rPr>
+          <w:rFonts w:ascii="Arial" w:hAnsi="Arial" w:cs="Arial"/>
+          <w:sz w:val="24"/>
+          <w:szCs w:val="24"/>
+        </w:rPr>
+        <w:t>conteúdos</w:t>
+      </w:r>
+      <w:proofErr w:type="spellEnd"/>
+      <w:r>
+        <w:rPr>
+          <w:rFonts w:ascii="Arial" w:hAnsi="Arial" w:cs="Arial"/>
+          <w:sz w:val="24"/>
+          <w:szCs w:val="24"/>
+        </w:rPr>
+        <w:t>.</w:t>
       </w:r>
     </w:p>
     <w:p>
@@ -2510,8 +4263,18 @@
           <w:rFonts w:ascii="Arial" w:hAnsi="Arial" w:cs="Arial"/>
           <w:sz w:val="24"/>
         </w:rPr>
-        <w:t>TEA Learn</w:t>
-      </w:r>
+        <w:t xml:space="preserve">TEA </w:t>
+      </w:r>
+      <w:proofErr w:type="spellStart"/>
+      <w:r>
+        <w:rPr>
+          <w:rStyle w:val="Forte"/>
+          <w:rFonts w:ascii="Arial" w:hAnsi="Arial" w:cs="Arial"/>
+          <w:sz w:val="24"/>
+        </w:rPr>
+        <w:t>Learn</w:t>
+      </w:r>
+      <w:proofErr w:type="spellEnd"/>
       <w:r>
         <w:rPr>
           <w:rFonts w:ascii="Arial" w:hAnsi="Arial" w:cs="Arial"/>
@@ -2577,7 +4340,31 @@
           <w:rFonts w:ascii="Arial" w:hAnsi="Arial" w:cs="Arial"/>
           <w:sz w:val="24"/>
         </w:rPr>
-        <w:t>. A plataforma recebe conteúdos como textos, PDFs, slides e atividades e gera versões mais acessíveis, com linguagem clara, frases curtas, organização em tópicos, divisão em etapas e estrutura visual simplificada, garantindo maior compreensão e inclusão desses estudantes em sala de aula.</w:t>
+        <w:t xml:space="preserve">. A plataforma recebe conteúdos como textos, </w:t>
+      </w:r>
+      <w:proofErr w:type="spellStart"/>
+      <w:r>
+        <w:rPr>
+          <w:rFonts w:ascii="Arial" w:hAnsi="Arial" w:cs="Arial"/>
+          <w:sz w:val="24"/>
+        </w:rPr>
+        <w:t>PDFs</w:t>
+      </w:r>
+      <w:proofErr w:type="spellEnd"/>
+      <w:r>
+        <w:rPr>
+          <w:rFonts w:ascii="Arial" w:hAnsi="Arial" w:cs="Arial"/>
+          <w:sz w:val="24"/>
+        </w:rPr>
+        <w:t xml:space="preserve">, slides e atividades e gera versões mais acessíveis, com linguagem clara, frases </w:t>
+      </w:r>
+      <w:r>
+        <w:rPr>
+          <w:rFonts w:ascii="Arial" w:hAnsi="Arial" w:cs="Arial"/>
+          <w:sz w:val="24"/>
+        </w:rPr>
+        <w:lastRenderedPageBreak/>
+        <w:t>curtas, organização em tópicos, divisão em etapas e estrutura visual simplificada, garantindo maior compreensão e inclusão desses estudantes em sala de aula.</w:t>
       </w:r>
     </w:p>
     <w:p>
@@ -2633,8 +4420,18 @@
           <w:rFonts w:ascii="Arial" w:hAnsi="Arial" w:cs="Arial"/>
           <w:sz w:val="24"/>
         </w:rPr>
-        <w:t>TEA Learn</w:t>
-      </w:r>
+        <w:t xml:space="preserve">TEA </w:t>
+      </w:r>
+      <w:proofErr w:type="spellStart"/>
+      <w:r>
+        <w:rPr>
+          <w:rStyle w:val="Forte"/>
+          <w:rFonts w:ascii="Arial" w:hAnsi="Arial" w:cs="Arial"/>
+          <w:sz w:val="24"/>
+        </w:rPr>
+        <w:t>Learn</w:t>
+      </w:r>
+      <w:proofErr w:type="spellEnd"/>
       <w:r>
         <w:rPr>
           <w:rFonts w:ascii="Arial" w:hAnsi="Arial" w:cs="Arial"/>
@@ -2685,7 +4482,23 @@
           <w:rFonts w:ascii="Arial" w:hAnsi="Arial" w:cs="Arial"/>
           <w:sz w:val="24"/>
         </w:rPr>
-        <w:t xml:space="preserve"> para adaptar automaticamente materiais didáticos do ensino médio (como textos, PDFs, slides e atividades) em versões mais acessíveis para alunos com </w:t>
+        <w:t xml:space="preserve"> para adaptar automaticamente materiais didáticos do ensino médio (como textos, </w:t>
+      </w:r>
+      <w:proofErr w:type="spellStart"/>
+      <w:r>
+        <w:rPr>
+          <w:rFonts w:ascii="Arial" w:hAnsi="Arial" w:cs="Arial"/>
+          <w:sz w:val="24"/>
+        </w:rPr>
+        <w:t>PDFs</w:t>
+      </w:r>
+      <w:proofErr w:type="spellEnd"/>
+      <w:r>
+        <w:rPr>
+          <w:rFonts w:ascii="Arial" w:hAnsi="Arial" w:cs="Arial"/>
+          <w:sz w:val="24"/>
+        </w:rPr>
+        <w:t xml:space="preserve">, slides e atividades) em versões mais acessíveis para alunos com </w:t>
       </w:r>
       <w:r>
         <w:rPr>
@@ -2871,7 +4684,25 @@
           <w:sz w:val="24"/>
           <w:szCs w:val="24"/>
         </w:rPr>
-        <w:t xml:space="preserve">Pesquisas de campo com uma clínica especializada em autismo (Movthera: </w:t>
+        <w:t>Pesquisas de campo com uma clínica especializada em autismo (</w:t>
+      </w:r>
+      <w:proofErr w:type="spellStart"/>
+      <w:r>
+        <w:rPr>
+          <w:rFonts w:ascii="Arial" w:hAnsi="Arial" w:cs="Arial"/>
+          <w:sz w:val="24"/>
+          <w:szCs w:val="24"/>
+        </w:rPr>
+        <w:t>Movthera</w:t>
+      </w:r>
+      <w:proofErr w:type="spellEnd"/>
+      <w:r>
+        <w:rPr>
+          <w:rFonts w:ascii="Arial" w:hAnsi="Arial" w:cs="Arial"/>
+          <w:sz w:val="24"/>
+          <w:szCs w:val="24"/>
+        </w:rPr>
+        <w:t xml:space="preserve">: </w:t>
       </w:r>
       <w:hyperlink r:id="rId8" w:history="1">
         <w:r>
@@ -3044,7 +4875,16 @@
           <w:sz w:val="24"/>
           <w:szCs w:val="24"/>
         </w:rPr>
-        <w:t xml:space="preserve"> TEA Lea</w:t>
+        <w:t xml:space="preserve"> TEA </w:t>
+      </w:r>
+      <w:proofErr w:type="spellStart"/>
+      <w:r>
+        <w:rPr>
+          <w:rFonts w:ascii="Arial" w:hAnsi="Arial" w:cs="Arial"/>
+          <w:sz w:val="24"/>
+          <w:szCs w:val="24"/>
+        </w:rPr>
+        <w:t>Lea</w:t>
       </w:r>
       <w:r>
         <w:rPr>
@@ -3060,7 +4900,16 @@
           <w:sz w:val="24"/>
           <w:szCs w:val="24"/>
         </w:rPr>
-        <w:t>n tem como principal objetivo automatizar a adaptação de conteúdos utilizando Inteligência Artificial. A plataforma transforma materiais didáticos comuns em versões mais acessíveis para estudantes com TEA nív</w:t>
+        <w:t>n</w:t>
+      </w:r>
+      <w:proofErr w:type="spellEnd"/>
+      <w:r>
+        <w:rPr>
+          <w:rFonts w:ascii="Arial" w:hAnsi="Arial" w:cs="Arial"/>
+          <w:sz w:val="24"/>
+          <w:szCs w:val="24"/>
+        </w:rPr>
+        <w:t xml:space="preserve"> tem como principal objetivo automatizar a adaptação de conteúdos utilizando Inteligência Artificial. A plataforma transforma materiais didáticos comuns em versões mais acessíveis para estudantes com TEA nív</w:t>
       </w:r>
       <w:r>
         <w:rPr>
@@ -3340,7 +5189,29 @@
           <w:szCs w:val="24"/>
           <w:shd w:val="clear" w:color="auto" w:fill="FFFFFF"/>
         </w:rPr>
-        <w:t>Tratamento e Educação para Autistas e Crianças com Déficits Relacionados à Comunicação, é uma abordagem psicoeducacional focada na estruturação física e visual do ambiente para maximizar a autonomia de pessoas com autismo.</w:t>
+        <w:t xml:space="preserve">Tratamento e Educação para Autistas e Crianças com Déficits Relacionados à Comunicação, é uma abordagem </w:t>
+      </w:r>
+      <w:proofErr w:type="spellStart"/>
+      <w:r>
+        <w:rPr>
+          <w:rFonts w:ascii="Arial" w:hAnsi="Arial" w:cs="Arial"/>
+          <w:color w:val="0A0A0A"/>
+          <w:sz w:val="24"/>
+          <w:szCs w:val="24"/>
+          <w:shd w:val="clear" w:color="auto" w:fill="FFFFFF"/>
+        </w:rPr>
+        <w:t>psicoeducacional</w:t>
+      </w:r>
+      <w:proofErr w:type="spellEnd"/>
+      <w:r>
+        <w:rPr>
+          <w:rFonts w:ascii="Arial" w:hAnsi="Arial" w:cs="Arial"/>
+          <w:color w:val="0A0A0A"/>
+          <w:sz w:val="24"/>
+          <w:szCs w:val="24"/>
+          <w:shd w:val="clear" w:color="auto" w:fill="FFFFFF"/>
+        </w:rPr>
+        <w:t xml:space="preserve"> focada na estruturação física e visual do ambiente para maximizar a autonomia de pessoas com autismo.</w:t>
       </w:r>
     </w:p>
     <w:p>
@@ -3438,7 +5309,25 @@
           <w:sz w:val="24"/>
           <w:szCs w:val="24"/>
         </w:rPr>
-        <w:t>: Uso de imagens, símbolos ou textos para antecipar atividades (ex: "primeiro... depois..."), o que reduz ansiedade.</w:t>
+        <w:t>: Uso de imagens, símbolos ou textos para antecipar atividades (</w:t>
+      </w:r>
+      <w:proofErr w:type="spellStart"/>
+      <w:r>
+        <w:rPr>
+          <w:rFonts w:ascii="Arial" w:hAnsi="Arial" w:cs="Arial"/>
+          <w:sz w:val="24"/>
+          <w:szCs w:val="24"/>
+        </w:rPr>
+        <w:t>ex</w:t>
+      </w:r>
+      <w:proofErr w:type="spellEnd"/>
+      <w:r>
+        <w:rPr>
+          <w:rFonts w:ascii="Arial" w:hAnsi="Arial" w:cs="Arial"/>
+          <w:sz w:val="24"/>
+          <w:szCs w:val="24"/>
+        </w:rPr>
+        <w:t>: "primeiro... depois..."), o que reduz ansiedade.</w:t>
       </w:r>
     </w:p>
     <w:p>
@@ -3625,6 +5514,7 @@
           <w:sz w:val="24"/>
           <w:szCs w:val="24"/>
         </w:rPr>
+        <w:lastRenderedPageBreak/>
         <w:t>Redução de Comportamentos Desafiadores</w:t>
       </w:r>
       <w:r>
@@ -3703,7 +5593,25 @@
           <w:sz w:val="24"/>
           <w:szCs w:val="24"/>
         </w:rPr>
-        <w:t>: Perfil Psicoeducacional Revisado, usado para avaliar os pontos fracos e fortes do aluno. Através desse exame, um cronograma/método individual é criado.</w:t>
+        <w:t xml:space="preserve">: Perfil </w:t>
+      </w:r>
+      <w:proofErr w:type="spellStart"/>
+      <w:r>
+        <w:rPr>
+          <w:rFonts w:ascii="Arial" w:hAnsi="Arial" w:cs="Arial"/>
+          <w:sz w:val="24"/>
+          <w:szCs w:val="24"/>
+        </w:rPr>
+        <w:t>Psicoeducacional</w:t>
+      </w:r>
+      <w:proofErr w:type="spellEnd"/>
+      <w:r>
+        <w:rPr>
+          <w:rFonts w:ascii="Arial" w:hAnsi="Arial" w:cs="Arial"/>
+          <w:sz w:val="24"/>
+          <w:szCs w:val="24"/>
+        </w:rPr>
+        <w:t xml:space="preserve"> Revisado, usado para avaliar os pontos fracos e fortes do aluno. Através desse exame, um cronograma/método individual é criado.</w:t>
       </w:r>
     </w:p>
     <w:p>
@@ -3758,7 +5666,6 @@
           <w:sz w:val="24"/>
           <w:szCs w:val="24"/>
         </w:rPr>
-        <w:lastRenderedPageBreak/>
         <w:t>Análise do Comportamento Aplicada, é uma intervenção científica baseada no reforço positivo para desenvolver habilidades sociais, acadêmicas e de autonomia em autistas</w:t>
       </w:r>
     </w:p>
@@ -4359,7 +6266,6 @@
           <w:szCs w:val="24"/>
           <w:lang w:eastAsia="pt-BR"/>
         </w:rPr>
-        <w:lastRenderedPageBreak/>
         <w:t>Nível 1</w:t>
       </w:r>
       <w:r>
@@ -4850,7 +6756,6 @@
           <w:sz w:val="24"/>
           <w:szCs w:val="24"/>
         </w:rPr>
-        <w:lastRenderedPageBreak/>
         <w:t xml:space="preserve">Na etapa de </w:t>
       </w:r>
       <w:r>
@@ -5116,6 +7021,7 @@
           <w:rFonts w:ascii="Arial" w:hAnsi="Arial" w:cs="Arial"/>
           <w:sz w:val="24"/>
         </w:rPr>
+        <w:lastRenderedPageBreak/>
         <w:t xml:space="preserve">Seu objetivo é </w:t>
       </w:r>
       <w:r>
@@ -5232,7 +7138,6 @@
           <w:bCs/>
           <w:sz w:val="24"/>
         </w:rPr>
-        <w:lastRenderedPageBreak/>
         <w:t>Múltiplos meios de ação e expressão</w:t>
       </w:r>
       <w:r>
@@ -5592,7 +7497,23 @@
           <w:rFonts w:ascii="Arial" w:hAnsi="Arial" w:cs="Arial"/>
           <w:sz w:val="24"/>
         </w:rPr>
-        <w:t>O estudo de Valério e Bigoli (2021) indica que o design de interfaces para pessoas com TEA deve priorizar a redução da sobrecarga sensorial através de layouts limpos, previsíveis e com uso de cores suaves ou tons pastéis. A pesquisa enfatiza a necessidade de evitar contrastes agressivos e animações excessivas, optando por padronização visual para facilitar o foco e a navegação.</w:t>
+        <w:t xml:space="preserve">O estudo de Valério e </w:t>
+      </w:r>
+      <w:proofErr w:type="spellStart"/>
+      <w:r>
+        <w:rPr>
+          <w:rFonts w:ascii="Arial" w:hAnsi="Arial" w:cs="Arial"/>
+          <w:sz w:val="24"/>
+        </w:rPr>
+        <w:t>Bigoli</w:t>
+      </w:r>
+      <w:proofErr w:type="spellEnd"/>
+      <w:r>
+        <w:rPr>
+          <w:rFonts w:ascii="Arial" w:hAnsi="Arial" w:cs="Arial"/>
+          <w:sz w:val="24"/>
+        </w:rPr>
+        <w:t xml:space="preserve"> (2021) indica que o design de interfaces para pessoas com TEA deve priorizar a redução da sobrecarga sensorial através de layouts limpos, previsíveis e com uso de cores suaves ou tons pastéis. A pesquisa enfatiza a necessidade de evitar contrastes agressivos e animações excessivas, optando por padronização visual para facilitar o foco e a navegação.</w:t>
       </w:r>
     </w:p>
     <w:p>
@@ -5677,7 +7598,6 @@
           <w:sz w:val="24"/>
           <w:szCs w:val="24"/>
         </w:rPr>
-        <w:lastRenderedPageBreak/>
         <w:t>DIAGRAMA DE GANTT</w:t>
       </w:r>
     </w:p>
@@ -5849,6 +7769,7 @@
           <w:szCs w:val="24"/>
           <w:lang w:eastAsia="pt-BR"/>
         </w:rPr>
+        <w:lastRenderedPageBreak/>
         <w:drawing>
           <wp:inline distT="0" distB="0" distL="0" distR="0" wp14:anchorId="3FB65342" wp14:editId="039A0047">
             <wp:extent cx="4049346" cy="3429735"/>
@@ -5915,7 +7836,6 @@
           <w:sz w:val="24"/>
           <w:szCs w:val="24"/>
         </w:rPr>
-        <w:lastRenderedPageBreak/>
         <w:t>MER</w:t>
       </w:r>
     </w:p>
@@ -6118,7 +8038,6 @@
           <w:sz w:val="24"/>
           <w:szCs w:val="24"/>
         </w:rPr>
-        <w:lastRenderedPageBreak/>
         <w:t>ESTRUTURA DO PROTÓTIPO EM TELAS E EXPLICADO</w:t>
       </w:r>
     </w:p>
@@ -6147,7 +8066,7 @@
           <w:lang w:eastAsia="pt-BR"/>
         </w:rPr>
         <w:drawing>
-          <wp:inline distT="0" distB="0" distL="0" distR="0" wp14:anchorId="00836F1A" wp14:editId="5E409FC1">
+          <wp:inline distT="0" distB="0" distL="0" distR="0" wp14:anchorId="00836F1A" wp14:editId="07AFEB7F">
             <wp:extent cx="5760085" cy="2721610"/>
             <wp:effectExtent l="0" t="0" r="0" b="2540"/>
             <wp:docPr id="3" name="Imagem 3"/>
@@ -6232,8 +8151,9 @@
           <w:szCs w:val="24"/>
           <w:lang w:eastAsia="pt-BR"/>
         </w:rPr>
+        <w:lastRenderedPageBreak/>
         <w:drawing>
-          <wp:inline distT="0" distB="0" distL="0" distR="0" wp14:anchorId="3C9ABAEB" wp14:editId="45585ED8">
+          <wp:inline distT="0" distB="0" distL="0" distR="0" wp14:anchorId="3C9ABAEB" wp14:editId="642F5A81">
             <wp:extent cx="5760085" cy="2739390"/>
             <wp:effectExtent l="0" t="0" r="0" b="3810"/>
             <wp:docPr id="4" name="Imagem 4"/>
@@ -6291,9 +8211,8 @@
           <w:szCs w:val="24"/>
           <w:lang w:eastAsia="pt-BR"/>
         </w:rPr>
-        <w:lastRenderedPageBreak/>
         <w:drawing>
-          <wp:inline distT="0" distB="0" distL="0" distR="0" wp14:anchorId="4879C6C9" wp14:editId="40DB4BE5">
+          <wp:inline distT="0" distB="0" distL="0" distR="0" wp14:anchorId="4879C6C9" wp14:editId="3AF500E0">
             <wp:extent cx="5760085" cy="2732405"/>
             <wp:effectExtent l="0" t="0" r="0" b="0"/>
             <wp:docPr id="10" name="Imagem 10"/>
@@ -6364,7 +8283,7 @@
           <w:lang w:eastAsia="pt-BR"/>
         </w:rPr>
         <w:drawing>
-          <wp:inline distT="0" distB="0" distL="0" distR="0" wp14:anchorId="1DA600AD" wp14:editId="0D0B50F4">
+          <wp:inline distT="0" distB="0" distL="0" distR="0" wp14:anchorId="1DA600AD" wp14:editId="041BD632">
             <wp:extent cx="5760085" cy="2750185"/>
             <wp:effectExtent l="0" t="0" r="0" b="0"/>
             <wp:docPr id="11" name="Imagem 11"/>
@@ -6505,26 +8424,23 @@
           <w:szCs w:val="24"/>
         </w:rPr>
       </w:pPr>
-      <w:bookmarkStart w:id="0" w:name="_GoBack"/>
-      <w:bookmarkEnd w:id="0"/>
-    </w:p>
-    <w:p>
-      <w:pPr>
-        <w:rPr>
-          <w:rFonts w:ascii="Arial" w:hAnsi="Arial" w:cs="Arial"/>
-          <w:b/>
-          <w:sz w:val="24"/>
-          <w:szCs w:val="24"/>
-        </w:rPr>
-      </w:pPr>
-      <w:r>
-        <w:rPr>
-          <w:rFonts w:ascii="Arial" w:hAnsi="Arial" w:cs="Arial"/>
-          <w:b/>
-          <w:sz w:val="24"/>
-          <w:szCs w:val="24"/>
-        </w:rPr>
-        <w:lastRenderedPageBreak/>
+    </w:p>
+    <w:p>
+      <w:pPr>
+        <w:rPr>
+          <w:rFonts w:ascii="Arial" w:hAnsi="Arial" w:cs="Arial"/>
+          <w:b/>
+          <w:sz w:val="24"/>
+          <w:szCs w:val="24"/>
+        </w:rPr>
+      </w:pPr>
+      <w:r>
+        <w:rPr>
+          <w:rFonts w:ascii="Arial" w:hAnsi="Arial" w:cs="Arial"/>
+          <w:b/>
+          <w:sz w:val="24"/>
+          <w:szCs w:val="24"/>
+        </w:rPr>
         <w:t>Bibliografia</w:t>
       </w:r>
     </w:p>
@@ -6885,7 +8801,25 @@
           <w:sz w:val="24"/>
           <w:szCs w:val="24"/>
         </w:rPr>
-        <w:t xml:space="preserve">Diagrama de Gantt: </w:t>
+        <w:t xml:space="preserve">Diagrama de </w:t>
+      </w:r>
+      <w:proofErr w:type="spellStart"/>
+      <w:r>
+        <w:rPr>
+          <w:rFonts w:ascii="Arial" w:hAnsi="Arial" w:cs="Arial"/>
+          <w:sz w:val="24"/>
+          <w:szCs w:val="24"/>
+        </w:rPr>
+        <w:t>Gantt</w:t>
+      </w:r>
+      <w:proofErr w:type="spellEnd"/>
+      <w:r>
+        <w:rPr>
+          <w:rFonts w:ascii="Arial" w:hAnsi="Arial" w:cs="Arial"/>
+          <w:sz w:val="24"/>
+          <w:szCs w:val="24"/>
+        </w:rPr>
+        <w:t xml:space="preserve">: </w:t>
       </w:r>
       <w:hyperlink r:id="rId24" w:history="1">
         <w:r>
@@ -6983,7 +8917,25 @@
           <w:sz w:val="24"/>
           <w:szCs w:val="24"/>
         </w:rPr>
-        <w:t>Cores do Front-End:</w:t>
+        <w:t>Cores do Front-</w:t>
+      </w:r>
+      <w:proofErr w:type="spellStart"/>
+      <w:r>
+        <w:rPr>
+          <w:rFonts w:ascii="Arial" w:hAnsi="Arial" w:cs="Arial"/>
+          <w:sz w:val="24"/>
+          <w:szCs w:val="24"/>
+        </w:rPr>
+        <w:t>End</w:t>
+      </w:r>
+      <w:proofErr w:type="spellEnd"/>
+      <w:r>
+        <w:rPr>
+          <w:rFonts w:ascii="Arial" w:hAnsi="Arial" w:cs="Arial"/>
+          <w:sz w:val="24"/>
+          <w:szCs w:val="24"/>
+        </w:rPr>
+        <w:t>:</w:t>
       </w:r>
     </w:p>
     <w:p>
@@ -7024,14 +8976,8 @@
 </w:document>
 </file>
 
-<file path=word/commentsIds.xml><?xml version="1.0" encoding="utf-8"?>
-<w16cid:commentsIds xmlns:wpc="http://schemas.microsoft.com/office/word/2010/wordprocessingCanvas" xmlns:cx="http://schemas.microsoft.com/office/drawing/2014/chartex" xmlns:cx1="http://schemas.microsoft.com/office/drawing/2015/9/8/chartex" xmlns:cx2="http://schemas.microsoft.com/office/drawing/2015/10/21/chartex" xmlns:cx3="http://schemas.microsoft.com/office/drawing/2016/5/9/chartex" xmlns:cx4="http://schemas.microsoft.com/office/drawing/2016/5/10/chartex" xmlns:cx5="http://schemas.microsoft.com/office/drawing/2016/5/11/chartex" xmlns:cx6="http://schemas.microsoft.com/office/drawing/2016/5/12/chartex" xmlns:cx7="http://schemas.microsoft.com/office/drawing/2016/5/13/chartex" xmlns:cx8="http://schemas.microsoft.com/office/drawing/2016/5/14/chartex" xmlns:mc="http://schemas.openxmlformats.org/markup-compatibility/2006" xmlns:aink="http://schemas.microsoft.com/office/drawing/2016/ink" xmlns:am3d="http://schemas.microsoft.com/office/drawing/2017/model3d" xmlns:o="urn:schemas-microsoft-com:office:office" xmlns:r="http://schemas.openxmlformats.org/officeDocument/2006/relationships" xmlns:m="http://schemas.openxmlformats.org/officeDocument/2006/math" xmlns:v="urn:schemas-microsoft-com:vml" xmlns:wp14="http://schemas.microsoft.com/office/word/2010/wordprocessingDrawing" xmlns:wp="http://schemas.openxmlformats.org/drawingml/2006/wordprocessingDrawing" xmlns:w10="urn:schemas-microsoft-com:office:word" xmlns:w="http://schemas.openxmlformats.org/wordprocessingml/2006/main" xmlns:w14="http://schemas.microsoft.com/office/word/2010/wordml" xmlns:w15="http://schemas.microsoft.com/office/word/2012/wordml" xmlns:w16cid="http://schemas.microsoft.com/office/word/2016/wordml/cid" xmlns:w16se="http://schemas.microsoft.com/office/word/2015/wordml/symex" xmlns:wpg="http://schemas.microsoft.com/office/word/2010/wordprocessingGroup" xmlns:wpi="http://schemas.microsoft.com/office/word/2010/wordprocessingInk" xmlns:wne="http://schemas.microsoft.com/office/word/2006/wordml" xmlns:wps="http://schemas.microsoft.com/office/word/2010/wordprocessingShape" mc:Ignorable="w14 w15 w16se w16cid wp14">
-  <w16cid:commentId w16cid:paraId="6A553135" w16cid:durableId="76222916"/>
-</w16cid:commentsIds>
-</file>
-
 <file path=word/endnotes.xml><?xml version="1.0" encoding="utf-8"?>
-<w:endnotes xmlns:wpc="http://schemas.microsoft.com/office/word/2010/wordprocessingCanvas" xmlns:cx="http://schemas.microsoft.com/office/drawing/2014/chartex" xmlns:mc="http://schemas.openxmlformats.org/markup-compatibility/2006" xmlns:o="urn:schemas-microsoft-com:office:office" xmlns:r="http://schemas.openxmlformats.org/officeDocument/2006/relationships" xmlns:m="http://schemas.openxmlformats.org/officeDocument/2006/math" xmlns:v="urn:schemas-microsoft-com:vml" xmlns:wp14="http://schemas.microsoft.com/office/word/2010/wordprocessingDrawing" xmlns:wp="http://schemas.openxmlformats.org/drawingml/2006/wordprocessingDrawing" xmlns:w10="urn:schemas-microsoft-com:office:word" xmlns:w="http://schemas.openxmlformats.org/wordprocessingml/2006/main" xmlns:w14="http://schemas.microsoft.com/office/word/2010/wordml" xmlns:w15="http://schemas.microsoft.com/office/word/2012/wordml" xmlns:w16se="http://schemas.microsoft.com/office/word/2015/wordml/symex" xmlns:wpg="http://schemas.microsoft.com/office/word/2010/wordprocessingGroup" xmlns:wpi="http://schemas.microsoft.com/office/word/2010/wordprocessingInk" xmlns:wne="http://schemas.microsoft.com/office/word/2006/wordml" xmlns:wps="http://schemas.microsoft.com/office/word/2010/wordprocessingShape" mc:Ignorable="w14 w15 w16se wp14">
+<w:endnotes xmlns:wpc="http://schemas.microsoft.com/office/word/2010/wordprocessingCanvas" xmlns:cx="http://schemas.microsoft.com/office/drawing/2014/chartex" xmlns:cx1="http://schemas.microsoft.com/office/drawing/2015/9/8/chartex" xmlns:cx2="http://schemas.microsoft.com/office/drawing/2015/10/21/chartex" xmlns:cx3="http://schemas.microsoft.com/office/drawing/2016/5/9/chartex" xmlns:cx4="http://schemas.microsoft.com/office/drawing/2016/5/10/chartex" xmlns:cx5="http://schemas.microsoft.com/office/drawing/2016/5/11/chartex" xmlns:cx6="http://schemas.microsoft.com/office/drawing/2016/5/12/chartex" xmlns:cx7="http://schemas.microsoft.com/office/drawing/2016/5/13/chartex" xmlns:cx8="http://schemas.microsoft.com/office/drawing/2016/5/14/chartex" xmlns:mc="http://schemas.openxmlformats.org/markup-compatibility/2006" xmlns:aink="http://schemas.microsoft.com/office/drawing/2016/ink" xmlns:am3d="http://schemas.microsoft.com/office/drawing/2017/model3d" xmlns:o="urn:schemas-microsoft-com:office:office" xmlns:oel="http://schemas.microsoft.com/office/2019/extlst" xmlns:r="http://schemas.openxmlformats.org/officeDocument/2006/relationships" xmlns:m="http://schemas.openxmlformats.org/officeDocument/2006/math" xmlns:v="urn:schemas-microsoft-com:vml" xmlns:wp14="http://schemas.microsoft.com/office/word/2010/wordprocessingDrawing" xmlns:wp="http://schemas.openxmlformats.org/drawingml/2006/wordprocessingDrawing" xmlns:w10="urn:schemas-microsoft-com:office:word" xmlns:w="http://schemas.openxmlformats.org/wordprocessingml/2006/main" xmlns:w14="http://schemas.microsoft.com/office/word/2010/wordml" xmlns:w15="http://schemas.microsoft.com/office/word/2012/wordml" xmlns:w16cex="http://schemas.microsoft.com/office/word/2018/wordml/cex" xmlns:w16cid="http://schemas.microsoft.com/office/word/2016/wordml/cid" xmlns:w16="http://schemas.microsoft.com/office/word/2018/wordml" xmlns:w16sdtdh="http://schemas.microsoft.com/office/word/2020/wordml/sdtdatahash" xmlns:w16se="http://schemas.microsoft.com/office/word/2015/wordml/symex" xmlns:wpg="http://schemas.microsoft.com/office/word/2010/wordprocessingGroup" xmlns:wpi="http://schemas.microsoft.com/office/word/2010/wordprocessingInk" xmlns:wne="http://schemas.microsoft.com/office/word/2006/wordml" xmlns:wps="http://schemas.microsoft.com/office/word/2010/wordprocessingShape" mc:Ignorable="w14 w15 w16se w16cid w16 w16cex w16sdtdh wp14">
   <w:endnote w:type="separator" w:id="-1">
     <w:p>
       <w:pPr>
@@ -7056,7 +9002,7 @@
 </file>
 
 <file path=word/footnotes.xml><?xml version="1.0" encoding="utf-8"?>
-<w:footnotes xmlns:wpc="http://schemas.microsoft.com/office/word/2010/wordprocessingCanvas" xmlns:cx="http://schemas.microsoft.com/office/drawing/2014/chartex" xmlns:mc="http://schemas.openxmlformats.org/markup-compatibility/2006" xmlns:o="urn:schemas-microsoft-com:office:office" xmlns:r="http://schemas.openxmlformats.org/officeDocument/2006/relationships" xmlns:m="http://schemas.openxmlformats.org/officeDocument/2006/math" xmlns:v="urn:schemas-microsoft-com:vml" xmlns:wp14="http://schemas.microsoft.com/office/word/2010/wordprocessingDrawing" xmlns:wp="http://schemas.openxmlformats.org/drawingml/2006/wordprocessingDrawing" xmlns:w10="urn:schemas-microsoft-com:office:word" xmlns:w="http://schemas.openxmlformats.org/wordprocessingml/2006/main" xmlns:w14="http://schemas.microsoft.com/office/word/2010/wordml" xmlns:w15="http://schemas.microsoft.com/office/word/2012/wordml" xmlns:w16se="http://schemas.microsoft.com/office/word/2015/wordml/symex" xmlns:wpg="http://schemas.microsoft.com/office/word/2010/wordprocessingGroup" xmlns:wpi="http://schemas.microsoft.com/office/word/2010/wordprocessingInk" xmlns:wne="http://schemas.microsoft.com/office/word/2006/wordml" xmlns:wps="http://schemas.microsoft.com/office/word/2010/wordprocessingShape" mc:Ignorable="w14 w15 w16se wp14">
+<w:footnotes xmlns:wpc="http://schemas.microsoft.com/office/word/2010/wordprocessingCanvas" xmlns:cx="http://schemas.microsoft.com/office/drawing/2014/chartex" xmlns:cx1="http://schemas.microsoft.com/office/drawing/2015/9/8/chartex" xmlns:cx2="http://schemas.microsoft.com/office/drawing/2015/10/21/chartex" xmlns:cx3="http://schemas.microsoft.com/office/drawing/2016/5/9/chartex" xmlns:cx4="http://schemas.microsoft.com/office/drawing/2016/5/10/chartex" xmlns:cx5="http://schemas.microsoft.com/office/drawing/2016/5/11/chartex" xmlns:cx6="http://schemas.microsoft.com/office/drawing/2016/5/12/chartex" xmlns:cx7="http://schemas.microsoft.com/office/drawing/2016/5/13/chartex" xmlns:cx8="http://schemas.microsoft.com/office/drawing/2016/5/14/chartex" xmlns:mc="http://schemas.openxmlformats.org/markup-compatibility/2006" xmlns:aink="http://schemas.microsoft.com/office/drawing/2016/ink" xmlns:am3d="http://schemas.microsoft.com/office/drawing/2017/model3d" xmlns:o="urn:schemas-microsoft-com:office:office" xmlns:oel="http://schemas.microsoft.com/office/2019/extlst" xmlns:r="http://schemas.openxmlformats.org/officeDocument/2006/relationships" xmlns:m="http://schemas.openxmlformats.org/officeDocument/2006/math" xmlns:v="urn:schemas-microsoft-com:vml" xmlns:wp14="http://schemas.microsoft.com/office/word/2010/wordprocessingDrawing" xmlns:wp="http://schemas.openxmlformats.org/drawingml/2006/wordprocessingDrawing" xmlns:w10="urn:schemas-microsoft-com:office:word" xmlns:w="http://schemas.openxmlformats.org/wordprocessingml/2006/main" xmlns:w14="http://schemas.microsoft.com/office/word/2010/wordml" xmlns:w15="http://schemas.microsoft.com/office/word/2012/wordml" xmlns:w16cex="http://schemas.microsoft.com/office/word/2018/wordml/cex" xmlns:w16cid="http://schemas.microsoft.com/office/word/2016/wordml/cid" xmlns:w16="http://schemas.microsoft.com/office/word/2018/wordml" xmlns:w16sdtdh="http://schemas.microsoft.com/office/word/2020/wordml/sdtdatahash" xmlns:w16se="http://schemas.microsoft.com/office/word/2015/wordml/symex" xmlns:wpg="http://schemas.microsoft.com/office/word/2010/wordprocessingGroup" xmlns:wpi="http://schemas.microsoft.com/office/word/2010/wordprocessingInk" xmlns:wne="http://schemas.microsoft.com/office/word/2006/wordml" xmlns:wps="http://schemas.microsoft.com/office/word/2010/wordprocessingShape" mc:Ignorable="w14 w15 w16se w16cid w16 w16cex w16sdtdh wp14">
   <w:footnote w:type="separator" w:id="-1">
     <w:p>
       <w:pPr>
@@ -7081,7 +9027,7 @@
 </file>
 
 <file path=word/numbering.xml><?xml version="1.0" encoding="utf-8"?>
-<w:numbering xmlns:wpc="http://schemas.microsoft.com/office/word/2010/wordprocessingCanvas" xmlns:cx="http://schemas.microsoft.com/office/drawing/2014/chartex" xmlns:mc="http://schemas.openxmlformats.org/markup-compatibility/2006" xmlns:o="urn:schemas-microsoft-com:office:office" xmlns:r="http://schemas.openxmlformats.org/officeDocument/2006/relationships" xmlns:m="http://schemas.openxmlformats.org/officeDocument/2006/math" xmlns:v="urn:schemas-microsoft-com:vml" xmlns:wp14="http://schemas.microsoft.com/office/word/2010/wordprocessingDrawing" xmlns:wp="http://schemas.openxmlformats.org/drawingml/2006/wordprocessingDrawing" xmlns:w10="urn:schemas-microsoft-com:office:word" xmlns:w="http://schemas.openxmlformats.org/wordprocessingml/2006/main" xmlns:w14="http://schemas.microsoft.com/office/word/2010/wordml" xmlns:w15="http://schemas.microsoft.com/office/word/2012/wordml" xmlns:w16se="http://schemas.microsoft.com/office/word/2015/wordml/symex" xmlns:wpg="http://schemas.microsoft.com/office/word/2010/wordprocessingGroup" xmlns:wpi="http://schemas.microsoft.com/office/word/2010/wordprocessingInk" xmlns:wne="http://schemas.microsoft.com/office/word/2006/wordml" xmlns:wps="http://schemas.microsoft.com/office/word/2010/wordprocessingShape" mc:Ignorable="w14 w15 w16se wp14">
+<w:numbering xmlns:wpc="http://schemas.microsoft.com/office/word/2010/wordprocessingCanvas" xmlns:cx="http://schemas.microsoft.com/office/drawing/2014/chartex" xmlns:cx1="http://schemas.microsoft.com/office/drawing/2015/9/8/chartex" xmlns:cx2="http://schemas.microsoft.com/office/drawing/2015/10/21/chartex" xmlns:cx3="http://schemas.microsoft.com/office/drawing/2016/5/9/chartex" xmlns:cx4="http://schemas.microsoft.com/office/drawing/2016/5/10/chartex" xmlns:cx5="http://schemas.microsoft.com/office/drawing/2016/5/11/chartex" xmlns:cx6="http://schemas.microsoft.com/office/drawing/2016/5/12/chartex" xmlns:cx7="http://schemas.microsoft.com/office/drawing/2016/5/13/chartex" xmlns:cx8="http://schemas.microsoft.com/office/drawing/2016/5/14/chartex" xmlns:mc="http://schemas.openxmlformats.org/markup-compatibility/2006" xmlns:aink="http://schemas.microsoft.com/office/drawing/2016/ink" xmlns:am3d="http://schemas.microsoft.com/office/drawing/2017/model3d" xmlns:o="urn:schemas-microsoft-com:office:office" xmlns:oel="http://schemas.microsoft.com/office/2019/extlst" xmlns:r="http://schemas.openxmlformats.org/officeDocument/2006/relationships" xmlns:m="http://schemas.openxmlformats.org/officeDocument/2006/math" xmlns:v="urn:schemas-microsoft-com:vml" xmlns:wp14="http://schemas.microsoft.com/office/word/2010/wordprocessingDrawing" xmlns:wp="http://schemas.openxmlformats.org/drawingml/2006/wordprocessingDrawing" xmlns:w10="urn:schemas-microsoft-com:office:word" xmlns:w="http://schemas.openxmlformats.org/wordprocessingml/2006/main" xmlns:w14="http://schemas.microsoft.com/office/word/2010/wordml" xmlns:w15="http://schemas.microsoft.com/office/word/2012/wordml" xmlns:w16cex="http://schemas.microsoft.com/office/word/2018/wordml/cex" xmlns:w16cid="http://schemas.microsoft.com/office/word/2016/wordml/cid" xmlns:w16="http://schemas.microsoft.com/office/word/2018/wordml" xmlns:w16sdtdh="http://schemas.microsoft.com/office/word/2020/wordml/sdtdatahash" xmlns:w16se="http://schemas.microsoft.com/office/word/2015/wordml/symex" xmlns:wpg="http://schemas.microsoft.com/office/word/2010/wordprocessingGroup" xmlns:wpi="http://schemas.microsoft.com/office/word/2010/wordprocessingInk" xmlns:wne="http://schemas.microsoft.com/office/word/2006/wordml" xmlns:wps="http://schemas.microsoft.com/office/word/2010/wordprocessingShape" mc:Ignorable="w14 w15 w16se w16cid w16 w16cex w16sdtdh wp14">
   <w:abstractNum w:abstractNumId="0" w15:restartNumberingAfterBreak="0">
     <w:nsid w:val="03691490"/>
     <w:multiLevelType w:val="multilevel"/>
@@ -10774,104 +12720,104 @@
       </w:rPr>
     </w:lvl>
   </w:abstractNum>
-  <w:num w:numId="1">
+  <w:num w:numId="1" w16cid:durableId="1721594921">
     <w:abstractNumId w:val="3"/>
   </w:num>
-  <w:num w:numId="2">
+  <w:num w:numId="2" w16cid:durableId="1993440099">
     <w:abstractNumId w:val="9"/>
   </w:num>
-  <w:num w:numId="3">
+  <w:num w:numId="3" w16cid:durableId="323364347">
     <w:abstractNumId w:val="15"/>
   </w:num>
-  <w:num w:numId="4">
+  <w:num w:numId="4" w16cid:durableId="398214983">
     <w:abstractNumId w:val="19"/>
   </w:num>
-  <w:num w:numId="5">
+  <w:num w:numId="5" w16cid:durableId="448162349">
     <w:abstractNumId w:val="4"/>
   </w:num>
-  <w:num w:numId="6">
+  <w:num w:numId="6" w16cid:durableId="1494024326">
     <w:abstractNumId w:val="20"/>
   </w:num>
-  <w:num w:numId="7">
+  <w:num w:numId="7" w16cid:durableId="23333480">
     <w:abstractNumId w:val="17"/>
   </w:num>
-  <w:num w:numId="8">
+  <w:num w:numId="8" w16cid:durableId="112528278">
     <w:abstractNumId w:val="13"/>
   </w:num>
-  <w:num w:numId="9">
+  <w:num w:numId="9" w16cid:durableId="760875548">
     <w:abstractNumId w:val="30"/>
   </w:num>
-  <w:num w:numId="10">
+  <w:num w:numId="10" w16cid:durableId="646789287">
     <w:abstractNumId w:val="25"/>
   </w:num>
-  <w:num w:numId="11">
+  <w:num w:numId="11" w16cid:durableId="509837042">
     <w:abstractNumId w:val="22"/>
   </w:num>
-  <w:num w:numId="12">
+  <w:num w:numId="12" w16cid:durableId="639572464">
     <w:abstractNumId w:val="10"/>
   </w:num>
-  <w:num w:numId="13">
+  <w:num w:numId="13" w16cid:durableId="982081786">
     <w:abstractNumId w:val="12"/>
   </w:num>
-  <w:num w:numId="14">
+  <w:num w:numId="14" w16cid:durableId="1444617469">
     <w:abstractNumId w:val="24"/>
   </w:num>
-  <w:num w:numId="15">
+  <w:num w:numId="15" w16cid:durableId="2083748788">
     <w:abstractNumId w:val="1"/>
   </w:num>
-  <w:num w:numId="16">
+  <w:num w:numId="16" w16cid:durableId="1437677601">
     <w:abstractNumId w:val="27"/>
   </w:num>
-  <w:num w:numId="17">
+  <w:num w:numId="17" w16cid:durableId="7145012">
     <w:abstractNumId w:val="7"/>
   </w:num>
-  <w:num w:numId="18">
+  <w:num w:numId="18" w16cid:durableId="411196190">
     <w:abstractNumId w:val="28"/>
   </w:num>
-  <w:num w:numId="19">
+  <w:num w:numId="19" w16cid:durableId="434642736">
     <w:abstractNumId w:val="14"/>
   </w:num>
-  <w:num w:numId="20">
+  <w:num w:numId="20" w16cid:durableId="1436556457">
     <w:abstractNumId w:val="8"/>
   </w:num>
-  <w:num w:numId="21">
+  <w:num w:numId="21" w16cid:durableId="1588534698">
     <w:abstractNumId w:val="23"/>
   </w:num>
-  <w:num w:numId="22">
+  <w:num w:numId="22" w16cid:durableId="1492873035">
     <w:abstractNumId w:val="26"/>
   </w:num>
-  <w:num w:numId="23">
+  <w:num w:numId="23" w16cid:durableId="1043597172">
     <w:abstractNumId w:val="18"/>
   </w:num>
-  <w:num w:numId="24">
+  <w:num w:numId="24" w16cid:durableId="1980185154">
     <w:abstractNumId w:val="21"/>
   </w:num>
-  <w:num w:numId="25">
+  <w:num w:numId="25" w16cid:durableId="1041789231">
     <w:abstractNumId w:val="29"/>
   </w:num>
-  <w:num w:numId="26">
+  <w:num w:numId="26" w16cid:durableId="1554073723">
     <w:abstractNumId w:val="6"/>
   </w:num>
-  <w:num w:numId="27">
+  <w:num w:numId="27" w16cid:durableId="954948479">
     <w:abstractNumId w:val="0"/>
   </w:num>
-  <w:num w:numId="28">
+  <w:num w:numId="28" w16cid:durableId="445199118">
     <w:abstractNumId w:val="5"/>
   </w:num>
-  <w:num w:numId="29">
+  <w:num w:numId="29" w16cid:durableId="1388996554">
     <w:abstractNumId w:val="11"/>
   </w:num>
-  <w:num w:numId="30">
+  <w:num w:numId="30" w16cid:durableId="541748589">
     <w:abstractNumId w:val="16"/>
   </w:num>
-  <w:num w:numId="31">
+  <w:num w:numId="31" w16cid:durableId="798034843">
     <w:abstractNumId w:val="2"/>
   </w:num>
 </w:numbering>
 </file>
 
 <file path=word/styles.xml><?xml version="1.0" encoding="utf-8"?>
-<w:styles xmlns:mc="http://schemas.openxmlformats.org/markup-compatibility/2006" xmlns:r="http://schemas.openxmlformats.org/officeDocument/2006/relationships" xmlns:w="http://schemas.openxmlformats.org/wordprocessingml/2006/main" xmlns:w14="http://schemas.microsoft.com/office/word/2010/wordml" xmlns:w15="http://schemas.microsoft.com/office/word/2012/wordml" xmlns:w16se="http://schemas.microsoft.com/office/word/2015/wordml/symex" mc:Ignorable="w14 w15 w16se">
+<w:styles xmlns:mc="http://schemas.openxmlformats.org/markup-compatibility/2006" xmlns:r="http://schemas.openxmlformats.org/officeDocument/2006/relationships" xmlns:w="http://schemas.openxmlformats.org/wordprocessingml/2006/main" xmlns:w14="http://schemas.microsoft.com/office/word/2010/wordml" xmlns:w15="http://schemas.microsoft.com/office/word/2012/wordml" xmlns:w16cex="http://schemas.microsoft.com/office/word/2018/wordml/cex" xmlns:w16cid="http://schemas.microsoft.com/office/word/2016/wordml/cid" xmlns:w16="http://schemas.microsoft.com/office/word/2018/wordml" xmlns:w16sdtdh="http://schemas.microsoft.com/office/word/2020/wordml/sdtdatahash" xmlns:w16se="http://schemas.microsoft.com/office/word/2015/wordml/symex" mc:Ignorable="w14 w15 w16se w16cid w16 w16cex w16sdtdh">
   <w:docDefaults>
     <w:rPrDefault>
       <w:rPr>
@@ -10887,7 +12833,7 @@
       </w:pPr>
     </w:pPrDefault>
   </w:docDefaults>
-  <w:latentStyles w:defLockedState="0" w:defUIPriority="99" w:defSemiHidden="0" w:defUnhideWhenUsed="0" w:defQFormat="0" w:count="371">
+  <w:latentStyles w:defLockedState="0" w:defUIPriority="99" w:defSemiHidden="0" w:defUnhideWhenUsed="0" w:defQFormat="0" w:count="376">
     <w:lsdException w:name="Normal" w:uiPriority="0" w:qFormat="1"/>
     <w:lsdException w:name="heading 1" w:uiPriority="9" w:qFormat="1"/>
     <w:lsdException w:name="heading 2" w:semiHidden="1" w:uiPriority="9" w:unhideWhenUsed="1" w:qFormat="1"/>
@@ -11259,6 +13205,11 @@
     <w:lsdException w:name="List Table 5 Dark Accent 6" w:uiPriority="50"/>
     <w:lsdException w:name="List Table 6 Colorful Accent 6" w:uiPriority="51"/>
     <w:lsdException w:name="List Table 7 Colorful Accent 6" w:uiPriority="52"/>
+    <w:lsdException w:name="Mention" w:semiHidden="1" w:unhideWhenUsed="1"/>
+    <w:lsdException w:name="Smart Hyperlink" w:semiHidden="1" w:unhideWhenUsed="1"/>
+    <w:lsdException w:name="Hashtag" w:semiHidden="1" w:unhideWhenUsed="1"/>
+    <w:lsdException w:name="Unresolved Mention" w:semiHidden="1" w:unhideWhenUsed="1"/>
+    <w:lsdException w:name="Smart Link" w:semiHidden="1" w:unhideWhenUsed="1"/>
   </w:latentStyles>
   <w:style w:type="paragraph" w:default="1" w:styleId="Normal">
     <w:name w:val="Normal"/>
@@ -11518,8 +13469,8 @@
       <w:szCs w:val="18"/>
     </w:rPr>
   </w:style>
-  <w:style w:type="character" w:customStyle="1" w:styleId="UnresolvedMention">
-    <w:name w:val="Unresolved Mention"/>
+  <w:style w:type="character" w:customStyle="1" w:styleId="MenoPendente2">
+    <w:name w:val="Menção Pendente2"/>
     <w:basedOn w:val="Fontepargpadro"/>
     <w:uiPriority w:val="99"/>
     <w:semiHidden/>

</xml_diff>